<commit_message>
Remove entry for "und" from vocabulary files and update related metadata in `vocab.manifest.json` to reflect changes. Set `lektion` to 1 for existing entries and updated timestamps accordingly.
</commit_message>
<xml_diff>
--- a/vocab.docx
+++ b/vocab.docx
@@ -13,57 +13,6 @@
         </w:rPr>
         <w:t>daf — vocabulary</w:t>
       </w:r>
-    </w:p>
-    <w:p>
-      <w:pPr>
-        <w:spacing w:after="120"/>
-      </w:pPr>
-      <w:r>
-        <w:rPr>
-          <w:b/>
-        </w:rPr>
-        <w:t>und</w:t>
-      </w:r>
-      <w:r>
-        <w:t xml:space="preserve"> /ʊnt/</w:t>
-      </w:r>
-    </w:p>
-    <w:p>
-      <w:pPr>
-        <w:spacing w:after="80"/>
-        <w:ind w:left="576"/>
-      </w:pPr>
-      <w:r>
-        <w:t>And (links clauses or items).</w:t>
-      </w:r>
-    </w:p>
-    <w:p>
-      <w:pPr>
-        <w:spacing w:before="40" w:after="120"/>
-        <w:ind w:left="576"/>
-      </w:pPr>
-      <w:r/>
-      <w:r>
-        <w:rPr>
-          <w:i/>
-          <w:color w:val="30608C"/>
-          <w:sz w:val="21"/>
-        </w:rPr>
-        <w:t xml:space="preserve">› </w:t>
-      </w:r>
-      <w:r>
-        <w:rPr>
-          <w:i/>
-          <w:color w:val="30608C"/>
-          <w:sz w:val="21"/>
-        </w:rPr>
-        <w:t>Und ich bin Frau Lange, die Sekretärin. (And I am Ms. Lange, the secretary.) / Kaffee und Kuchen (coffee and cake) / Und wie geht es Ihnen? (And how are you?)</w:t>
-      </w:r>
-    </w:p>
-    <w:p>
-      <w:pPr>
-        <w:spacing w:before="0" w:after="0"/>
-      </w:pPr>
     </w:p>
     <w:p>
       <w:pPr>

</xml_diff>

<commit_message>
Add new vocabulary entries and examples to `vocab.docx` and `vocab.manifest.json`
- Introduced multiple vocabulary terms including "sammeln," "die Tabelle," and "die Grammatik" with their respective definitions and example sentences.
- Updated `vocab.manifest.json` to include new entries, ensuring consistency with the Word document.
- Enhanced the `gloss_heuristic` function in `docx_cards.py` to accommodate new vocabulary terms.
</commit_message>
<xml_diff>
--- a/vocab.docx
+++ b/vocab.docx
@@ -13,6 +13,479 @@
         </w:rPr>
         <w:t>daf — vocabulary</w:t>
       </w:r>
+    </w:p>
+    <w:p>
+      <w:pPr>
+        <w:spacing w:after="120"/>
+      </w:pPr>
+      <w:r>
+        <w:rPr>
+          <w:b/>
+        </w:rPr>
+        <w:t>sammeln</w:t>
+      </w:r>
+      <w:r>
+        <w:t xml:space="preserve"> /ˈzaməln/</w:t>
+      </w:r>
+    </w:p>
+    <w:p>
+      <w:pPr>
+        <w:spacing w:after="80"/>
+        <w:ind w:left="576"/>
+      </w:pPr>
+      <w:r>
+        <w:t>To collect; gather (+ acc.).</w:t>
+      </w:r>
+    </w:p>
+    <w:p>
+      <w:pPr>
+        <w:spacing w:before="40" w:after="120"/>
+        <w:ind w:left="576"/>
+      </w:pPr>
+      <w:r/>
+      <w:r>
+        <w:rPr>
+          <w:i/>
+          <w:color w:val="30608C"/>
+          <w:sz w:val="21"/>
+        </w:rPr>
+        <w:t xml:space="preserve">› </w:t>
+      </w:r>
+      <w:r>
+        <w:rPr>
+          <w:i/>
+          <w:color w:val="30608C"/>
+          <w:sz w:val="21"/>
+        </w:rPr>
+        <w:t>Sammeln Sie die Verbformen in die Tabelle. (Collect the verb forms into the table [class instruction].) / Wir sammeln Daten. (We collect data.)</w:t>
+      </w:r>
+    </w:p>
+    <w:p>
+      <w:pPr>
+        <w:spacing w:before="0" w:after="0"/>
+      </w:pPr>
+    </w:p>
+    <w:p>
+      <w:pPr>
+        <w:spacing w:after="120"/>
+      </w:pPr>
+      <w:r>
+        <w:rPr>
+          <w:b/>
+        </w:rPr>
+        <w:t>die Tabelle</w:t>
+      </w:r>
+      <w:r>
+        <w:t xml:space="preserve"> /taˈbɛlə/</w:t>
+      </w:r>
+    </w:p>
+    <w:p>
+      <w:pPr>
+        <w:spacing w:after="80"/>
+        <w:ind w:left="576"/>
+      </w:pPr>
+      <w:r>
+        <w:t>Table (grid for answers; worksheet).</w:t>
+      </w:r>
+    </w:p>
+    <w:p>
+      <w:pPr>
+        <w:spacing w:before="40" w:after="120"/>
+        <w:ind w:left="576"/>
+      </w:pPr>
+      <w:r/>
+      <w:r>
+        <w:rPr>
+          <w:i/>
+          <w:color w:val="30608C"/>
+          <w:sz w:val="21"/>
+        </w:rPr>
+        <w:t xml:space="preserve">› </w:t>
+      </w:r>
+      <w:r>
+        <w:rPr>
+          <w:i/>
+          <w:color w:val="30608C"/>
+          <w:sz w:val="21"/>
+        </w:rPr>
+        <w:t>Sammeln Sie die Verbformen in die Tabelle. (Collect the verb forms into the table.) / Schreiben Sie das in die Tabelle. (Write that in the table.)</w:t>
+      </w:r>
+    </w:p>
+    <w:p>
+      <w:pPr>
+        <w:spacing w:before="0" w:after="0"/>
+      </w:pPr>
+    </w:p>
+    <w:p>
+      <w:pPr>
+        <w:spacing w:after="120"/>
+      </w:pPr>
+      <w:r>
+        <w:rPr>
+          <w:b/>
+        </w:rPr>
+        <w:t>die Verbform</w:t>
+      </w:r>
+      <w:r>
+        <w:t xml:space="preserve"> /ˈfɔʁm/</w:t>
+      </w:r>
+    </w:p>
+    <w:p>
+      <w:pPr>
+        <w:spacing w:after="80"/>
+        <w:ind w:left="576"/>
+      </w:pPr>
+      <w:r>
+        <w:t>Verb form; pl. die Verbformen (inflected shapes).</w:t>
+      </w:r>
+    </w:p>
+    <w:p>
+      <w:pPr>
+        <w:spacing w:after="80"/>
+        <w:ind w:left="576"/>
+      </w:pPr>
+      <w:r>
+        <w:rPr>
+          <w:i/>
+          <w:color w:val="404040"/>
+          <w:sz w:val="20"/>
+        </w:rPr>
+        <w:t>• Misread Verbendung: the word is Verbformen.</w:t>
+      </w:r>
+    </w:p>
+    <w:p>
+      <w:pPr>
+        <w:spacing w:before="40" w:after="120"/>
+        <w:ind w:left="576"/>
+      </w:pPr>
+      <w:r/>
+      <w:r>
+        <w:rPr>
+          <w:i/>
+          <w:color w:val="30608C"/>
+          <w:sz w:val="21"/>
+        </w:rPr>
+        <w:t xml:space="preserve">› </w:t>
+      </w:r>
+      <w:r>
+        <w:rPr>
+          <w:i/>
+          <w:color w:val="30608C"/>
+          <w:sz w:val="21"/>
+        </w:rPr>
+        <w:t>Sammeln Sie die Verbformen in die Tabelle. (Collect the verb forms into the table.) / die Verbform von essen (the verb form of essen)</w:t>
+      </w:r>
+    </w:p>
+    <w:p>
+      <w:pPr>
+        <w:spacing w:before="0" w:after="0"/>
+      </w:pPr>
+    </w:p>
+    <w:p>
+      <w:pPr>
+        <w:spacing w:after="120"/>
+      </w:pPr>
+      <w:r>
+        <w:rPr>
+          <w:b/>
+        </w:rPr>
+        <w:t>die Grammatik</w:t>
+      </w:r>
+      <w:r>
+        <w:t xml:space="preserve"> /ɡʁaˈmaːtɪk/</w:t>
+      </w:r>
+    </w:p>
+    <w:p>
+      <w:pPr>
+        <w:spacing w:after="80"/>
+        <w:ind w:left="576"/>
+      </w:pPr>
+      <w:r>
+        <w:t>Grammar (rules of the language).</w:t>
+      </w:r>
+    </w:p>
+    <w:p>
+      <w:pPr>
+        <w:spacing w:before="40" w:after="120"/>
+        <w:ind w:left="576"/>
+      </w:pPr>
+      <w:r/>
+      <w:r>
+        <w:rPr>
+          <w:i/>
+          <w:color w:val="30608C"/>
+          <w:sz w:val="21"/>
+        </w:rPr>
+        <w:t xml:space="preserve">› </w:t>
+      </w:r>
+      <w:r>
+        <w:rPr>
+          <w:i/>
+          <w:color w:val="30608C"/>
+          <w:sz w:val="21"/>
+        </w:rPr>
+        <w:t>Grammatik auf einen Blick: Verben (Grammar at a glance: verbs) / Ich lerne Grammatik. (I'm learning grammar.)</w:t>
+      </w:r>
+    </w:p>
+    <w:p>
+      <w:pPr>
+        <w:spacing w:before="0" w:after="0"/>
+      </w:pPr>
+    </w:p>
+    <w:p>
+      <w:pPr>
+        <w:spacing w:after="120"/>
+      </w:pPr>
+      <w:r>
+        <w:rPr>
+          <w:b/>
+        </w:rPr>
+        <w:t>auf einen Blick</w:t>
+      </w:r>
+      <w:r>
+        <w:t xml:space="preserve"> /aʊ̯f ˈaɪ̯nən ˈblɪk/</w:t>
+      </w:r>
+    </w:p>
+    <w:p>
+      <w:pPr>
+        <w:spacing w:after="80"/>
+        <w:ind w:left="576"/>
+      </w:pPr>
+      <w:r>
+        <w:t>At a glance (overview; textbook headings).</w:t>
+      </w:r>
+    </w:p>
+    <w:p>
+      <w:pPr>
+        <w:spacing w:before="40" w:after="120"/>
+        <w:ind w:left="576"/>
+      </w:pPr>
+      <w:r/>
+      <w:r>
+        <w:rPr>
+          <w:i/>
+          <w:color w:val="30608C"/>
+          <w:sz w:val="21"/>
+        </w:rPr>
+        <w:t xml:space="preserve">› </w:t>
+      </w:r>
+      <w:r>
+        <w:rPr>
+          <w:i/>
+          <w:color w:val="30608C"/>
+          <w:sz w:val="21"/>
+        </w:rPr>
+        <w:t>Grammatik auf einen Blick: Verben (Grammar at a glance: verbs) / Das ist die Übersicht auf einen Blick. (That's the overview at a glance.)</w:t>
+      </w:r>
+    </w:p>
+    <w:p>
+      <w:pPr>
+        <w:spacing w:before="0" w:after="0"/>
+      </w:pPr>
+    </w:p>
+    <w:p>
+      <w:pPr>
+        <w:spacing w:after="120"/>
+      </w:pPr>
+      <w:r>
+        <w:rPr>
+          <w:b/>
+        </w:rPr>
+        <w:t>der Blick</w:t>
+      </w:r>
+      <w:r>
+        <w:t xml:space="preserve"> /blɪk/</w:t>
+      </w:r>
+    </w:p>
+    <w:p>
+      <w:pPr>
+        <w:spacing w:after="80"/>
+        <w:ind w:left="576"/>
+      </w:pPr>
+      <w:r>
+        <w:t>Glance; look (masculine).</w:t>
+      </w:r>
+    </w:p>
+    <w:p>
+      <w:pPr>
+        <w:spacing w:before="40" w:after="120"/>
+        <w:ind w:left="576"/>
+      </w:pPr>
+      <w:r/>
+      <w:r>
+        <w:rPr>
+          <w:i/>
+          <w:color w:val="30608C"/>
+          <w:sz w:val="21"/>
+        </w:rPr>
+        <w:t xml:space="preserve">› </w:t>
+      </w:r>
+      <w:r>
+        <w:rPr>
+          <w:i/>
+          <w:color w:val="30608C"/>
+          <w:sz w:val="21"/>
+        </w:rPr>
+        <w:t>auf einen Blick (at a glance) / einen Blick werfen (to cast a glance) / Der erste Blick (the first glance)</w:t>
+      </w:r>
+    </w:p>
+    <w:p>
+      <w:pPr>
+        <w:spacing w:before="0" w:after="0"/>
+      </w:pPr>
+    </w:p>
+    <w:p>
+      <w:pPr>
+        <w:spacing w:after="120"/>
+      </w:pPr>
+      <w:r>
+        <w:rPr>
+          <w:b/>
+        </w:rPr>
+        <w:t>das Verb</w:t>
+      </w:r>
+      <w:r>
+        <w:t xml:space="preserve"> /vɛʁp/</w:t>
+      </w:r>
+    </w:p>
+    <w:p>
+      <w:pPr>
+        <w:spacing w:after="80"/>
+        <w:ind w:left="576"/>
+      </w:pPr>
+      <w:r>
+        <w:t>Verb; plural die Verben.</w:t>
+      </w:r>
+    </w:p>
+    <w:p>
+      <w:pPr>
+        <w:spacing w:before="40" w:after="120"/>
+        <w:ind w:left="576"/>
+      </w:pPr>
+      <w:r/>
+      <w:r>
+        <w:rPr>
+          <w:i/>
+          <w:color w:val="30608C"/>
+          <w:sz w:val="21"/>
+        </w:rPr>
+        <w:t xml:space="preserve">› </w:t>
+      </w:r>
+      <w:r>
+        <w:rPr>
+          <w:i/>
+          <w:color w:val="30608C"/>
+          <w:sz w:val="21"/>
+        </w:rPr>
+        <w:t>Grammatik auf einen Blick: Verben (Grammar at a glance: verbs) / essen ist ein Verb. (essen is a verb.) / starke und schwache Verben (strong and weak verbs)</w:t>
+      </w:r>
+    </w:p>
+    <w:p>
+      <w:pPr>
+        <w:spacing w:before="0" w:after="0"/>
+      </w:pPr>
+    </w:p>
+    <w:p>
+      <w:pPr>
+        <w:spacing w:after="120"/>
+      </w:pPr>
+      <w:r>
+        <w:rPr>
+          <w:b/>
+        </w:rPr>
+        <w:t>alles</w:t>
+      </w:r>
+      <w:r>
+        <w:t xml:space="preserve"> /ˈaləs/</w:t>
+      </w:r>
+    </w:p>
+    <w:p>
+      <w:pPr>
+        <w:spacing w:after="80"/>
+        <w:ind w:left="576"/>
+      </w:pPr>
+      <w:r>
+        <w:t>Everything (pronoun; all of it).</w:t>
+      </w:r>
+    </w:p>
+    <w:p>
+      <w:pPr>
+        <w:spacing w:before="40" w:after="120"/>
+        <w:ind w:left="576"/>
+      </w:pPr>
+      <w:r/>
+      <w:r>
+        <w:rPr>
+          <w:i/>
+          <w:color w:val="30608C"/>
+          <w:sz w:val="21"/>
+        </w:rPr>
+        <w:t xml:space="preserve">› </w:t>
+      </w:r>
+      <w:r>
+        <w:rPr>
+          <w:i/>
+          <w:color w:val="30608C"/>
+          <w:sz w:val="21"/>
+        </w:rPr>
+        <w:t>Ist alles richtig? (Is everything correct?) / Alles klar? (All clear? / OK?) / Ich verstehe alles. (I understand everything.)</w:t>
+      </w:r>
+    </w:p>
+    <w:p>
+      <w:pPr>
+        <w:spacing w:before="0" w:after="0"/>
+      </w:pPr>
+    </w:p>
+    <w:p>
+      <w:pPr>
+        <w:spacing w:after="120"/>
+      </w:pPr>
+      <w:r>
+        <w:rPr>
+          <w:b/>
+        </w:rPr>
+        <w:t>richtig</w:t>
+      </w:r>
+      <w:r>
+        <w:t xml:space="preserve"> /ˈʁɪçtɪç/</w:t>
+      </w:r>
+    </w:p>
+    <w:p>
+      <w:pPr>
+        <w:spacing w:after="80"/>
+        <w:ind w:left="576"/>
+      </w:pPr>
+      <w:r>
+        <w:t>Correct; right; true.</w:t>
+      </w:r>
+    </w:p>
+    <w:p>
+      <w:pPr>
+        <w:spacing w:before="40" w:after="120"/>
+        <w:ind w:left="576"/>
+      </w:pPr>
+      <w:r/>
+      <w:r>
+        <w:rPr>
+          <w:i/>
+          <w:color w:val="30608C"/>
+          <w:sz w:val="21"/>
+        </w:rPr>
+        <w:t xml:space="preserve">› </w:t>
+      </w:r>
+      <w:r>
+        <w:rPr>
+          <w:i/>
+          <w:color w:val="30608C"/>
+          <w:sz w:val="21"/>
+        </w:rPr>
+        <w:t>Ist alles richtig? (Is everything correct?) / Das ist richtig. (That's right.) / Die richtige Antwort (the correct answer)</w:t>
+      </w:r>
+    </w:p>
+    <w:p>
+      <w:pPr>
+        <w:spacing w:before="0" w:after="0"/>
+      </w:pPr>
     </w:p>
     <w:p>
       <w:pPr>
@@ -234,24 +707,10 @@
     </w:p>
     <w:p>
       <w:pPr>
-        <w:spacing w:before="40" w:after="120"/>
+        <w:spacing w:after="80"/>
         <w:ind w:left="576"/>
       </w:pPr>
-      <w:r/>
       <w:r>
-        <w:rPr>
-          <w:i/>
-          <w:color w:val="30608C"/>
-          <w:sz w:val="21"/>
-        </w:rPr>
-        <w:t xml:space="preserve">› </w:t>
-      </w:r>
-      <w:r>
-        <w:rPr>
-          <w:i/>
-          <w:color w:val="30608C"/>
-          <w:sz w:val="21"/>
-        </w:rPr>
         <w:t>From where (origin).</w:t>
       </w:r>
     </w:p>
@@ -1096,7 +1555,7 @@
           <w:color w:val="30608C"/>
           <w:sz w:val="21"/>
         </w:rPr>
-        <w:t>Ich bin der neue Praktikant. (I'm the new intern.) / Er ist Arzt. (He's a doctor.) / Und ich bin Frau Lange, die Sekretärin. (And I am Ms. Lange, the secretary.) / Wir sind müde. (We're tired.)</w:t>
+        <w:t>Ich bin der neue Praktikant. (I'm the new intern.) / Er ist Arzt. (He's a doctor.) / Ist alles richtig? (Is everything correct?) / Und ich bin Frau Lange, die Sekretärin. (And I am Ms. Lange, the secretary.) / Wir sind müde. (We're tired.)</w:t>
       </w:r>
     </w:p>
     <w:p>

</xml_diff>

<commit_message>
Refactor vocabulary examples in `vocab.docx` for clarity and consistency
- Updated example formatting in `vocab.docx` to ensure each German sentence is followed by its English translation in parentheses, enhancing readability.
- Adjusted the rules in `.cursor/rules/daf-vocab.mdc` to reflect new formatting guidelines for example lines.
- Modified `daf_vocab/docx_cards.py` to support the new example structure, ensuring proper styling and indentation for German and English translations.
</commit_message>
<xml_diff>
--- a/vocab.docx
+++ b/vocab.docx
@@ -39,10 +39,9 @@
     </w:p>
     <w:p>
       <w:pPr>
-        <w:spacing w:before="40" w:after="120"/>
+        <w:spacing w:before="40" w:after="60"/>
         <w:ind w:left="576"/>
       </w:pPr>
-      <w:r/>
       <w:r>
         <w:rPr>
           <w:i/>
@@ -57,43 +56,22 @@
           <w:color w:val="30608C"/>
           <w:sz w:val="21"/>
         </w:rPr>
-        <w:t>Sammeln Sie die Verbformen in die Tabelle. (Collect the verb forms into the table [class instruction].) / Wir sammeln Daten. (We collect data.)</w:t>
+        <w:t>Sammeln Sie die Verbformen in die Tabelle.</w:t>
+      </w:r>
+      <w:r>
+        <w:rPr>
+          <w:i/>
+          <w:color w:val="404040"/>
+          <w:sz w:val="21"/>
+        </w:rPr>
+        <w:t xml:space="preserve"> (Collect the verb forms into the table [class instruction].)</w:t>
       </w:r>
     </w:p>
     <w:p>
       <w:pPr>
-        <w:spacing w:before="0" w:after="0"/>
-      </w:pPr>
-    </w:p>
-    <w:p>
-      <w:pPr>
-        <w:spacing w:after="120"/>
-      </w:pPr>
-      <w:r>
-        <w:rPr>
-          <w:b/>
-        </w:rPr>
-        <w:t>die Tabelle</w:t>
-      </w:r>
-      <w:r>
-        <w:t xml:space="preserve"> /taˈbɛlə/</w:t>
-      </w:r>
-    </w:p>
-    <w:p>
-      <w:pPr>
-        <w:spacing w:after="80"/>
+        <w:spacing w:before="0" w:after="120"/>
         <w:ind w:left="576"/>
       </w:pPr>
-      <w:r>
-        <w:t>Table (grid for answers; worksheet).</w:t>
-      </w:r>
-    </w:p>
-    <w:p>
-      <w:pPr>
-        <w:spacing w:before="40" w:after="120"/>
-        <w:ind w:left="576"/>
-      </w:pPr>
-      <w:r/>
       <w:r>
         <w:rPr>
           <w:i/>
@@ -108,7 +86,103 @@
           <w:color w:val="30608C"/>
           <w:sz w:val="21"/>
         </w:rPr>
-        <w:t>Sammeln Sie die Verbformen in die Tabelle. (Collect the verb forms into the table.) / Schreiben Sie das in die Tabelle. (Write that in the table.)</w:t>
+        <w:t>Wir sammeln Daten.</w:t>
+      </w:r>
+      <w:r>
+        <w:rPr>
+          <w:i/>
+          <w:color w:val="404040"/>
+          <w:sz w:val="21"/>
+        </w:rPr>
+        <w:t xml:space="preserve"> (We collect data.)</w:t>
+      </w:r>
+    </w:p>
+    <w:p>
+      <w:pPr>
+        <w:spacing w:before="0" w:after="0"/>
+      </w:pPr>
+    </w:p>
+    <w:p>
+      <w:pPr>
+        <w:spacing w:after="120"/>
+      </w:pPr>
+      <w:r>
+        <w:rPr>
+          <w:b/>
+        </w:rPr>
+        <w:t>die Tabelle</w:t>
+      </w:r>
+      <w:r>
+        <w:t xml:space="preserve"> /taˈbɛlə/</w:t>
+      </w:r>
+    </w:p>
+    <w:p>
+      <w:pPr>
+        <w:spacing w:after="80"/>
+        <w:ind w:left="576"/>
+      </w:pPr>
+      <w:r>
+        <w:t>Table (grid for answers; worksheet).</w:t>
+      </w:r>
+    </w:p>
+    <w:p>
+      <w:pPr>
+        <w:spacing w:before="40" w:after="60"/>
+        <w:ind w:left="576"/>
+      </w:pPr>
+      <w:r>
+        <w:rPr>
+          <w:i/>
+          <w:color w:val="30608C"/>
+          <w:sz w:val="21"/>
+        </w:rPr>
+        <w:t xml:space="preserve">› </w:t>
+      </w:r>
+      <w:r>
+        <w:rPr>
+          <w:i/>
+          <w:color w:val="30608C"/>
+          <w:sz w:val="21"/>
+        </w:rPr>
+        <w:t>Sammeln Sie die Verbformen in die Tabelle.</w:t>
+      </w:r>
+      <w:r>
+        <w:rPr>
+          <w:i/>
+          <w:color w:val="404040"/>
+          <w:sz w:val="21"/>
+        </w:rPr>
+        <w:t xml:space="preserve"> (Collect the verb forms into the table.)</w:t>
+      </w:r>
+    </w:p>
+    <w:p>
+      <w:pPr>
+        <w:spacing w:before="0" w:after="120"/>
+        <w:ind w:left="576"/>
+      </w:pPr>
+      <w:r>
+        <w:rPr>
+          <w:i/>
+          <w:color w:val="30608C"/>
+          <w:sz w:val="21"/>
+        </w:rPr>
+        <w:t xml:space="preserve">› </w:t>
+      </w:r>
+      <w:r>
+        <w:rPr>
+          <w:i/>
+          <w:color w:val="30608C"/>
+          <w:sz w:val="21"/>
+        </w:rPr>
+        <w:t>Schreiben Sie das in die Tabelle.</w:t>
+      </w:r>
+      <w:r>
+        <w:rPr>
+          <w:i/>
+          <w:color w:val="404040"/>
+          <w:sz w:val="21"/>
+        </w:rPr>
+        <w:t xml:space="preserve"> (Write that in the table.)</w:t>
       </w:r>
     </w:p>
     <w:p>
@@ -155,10 +229,9 @@
     </w:p>
     <w:p>
       <w:pPr>
-        <w:spacing w:before="40" w:after="120"/>
+        <w:spacing w:before="40" w:after="60"/>
         <w:ind w:left="576"/>
       </w:pPr>
-      <w:r/>
       <w:r>
         <w:rPr>
           <w:i/>
@@ -173,43 +246,22 @@
           <w:color w:val="30608C"/>
           <w:sz w:val="21"/>
         </w:rPr>
-        <w:t>Sammeln Sie die Verbformen in die Tabelle. (Collect the verb forms into the table.) / die Verbform von essen (the verb form of essen)</w:t>
+        <w:t>Sammeln Sie die Verbformen in die Tabelle.</w:t>
+      </w:r>
+      <w:r>
+        <w:rPr>
+          <w:i/>
+          <w:color w:val="404040"/>
+          <w:sz w:val="21"/>
+        </w:rPr>
+        <w:t xml:space="preserve"> (Collect the verb forms into the table.)</w:t>
       </w:r>
     </w:p>
     <w:p>
       <w:pPr>
-        <w:spacing w:before="0" w:after="0"/>
-      </w:pPr>
-    </w:p>
-    <w:p>
-      <w:pPr>
-        <w:spacing w:after="120"/>
-      </w:pPr>
-      <w:r>
-        <w:rPr>
-          <w:b/>
-        </w:rPr>
-        <w:t>die Grammatik</w:t>
-      </w:r>
-      <w:r>
-        <w:t xml:space="preserve"> /ɡʁaˈmaːtɪk/</w:t>
-      </w:r>
-    </w:p>
-    <w:p>
-      <w:pPr>
-        <w:spacing w:after="80"/>
+        <w:spacing w:before="0" w:after="120"/>
         <w:ind w:left="576"/>
       </w:pPr>
-      <w:r>
-        <w:t>Grammar (rules of the language).</w:t>
-      </w:r>
-    </w:p>
-    <w:p>
-      <w:pPr>
-        <w:spacing w:before="40" w:after="120"/>
-        <w:ind w:left="576"/>
-      </w:pPr>
-      <w:r/>
       <w:r>
         <w:rPr>
           <w:i/>
@@ -224,7 +276,15 @@
           <w:color w:val="30608C"/>
           <w:sz w:val="21"/>
         </w:rPr>
-        <w:t>Grammatik auf einen Blick: Verben (Grammar at a glance: verbs) / Ich lerne Grammatik. (I'm learning grammar.)</w:t>
+        <w:t>die Verbform von essen</w:t>
+      </w:r>
+      <w:r>
+        <w:rPr>
+          <w:i/>
+          <w:color w:val="404040"/>
+          <w:sz w:val="21"/>
+        </w:rPr>
+        <w:t xml:space="preserve"> (the verb form of essen)</w:t>
       </w:r>
     </w:p>
     <w:p>
@@ -240,10 +300,10 @@
         <w:rPr>
           <w:b/>
         </w:rPr>
-        <w:t>auf einen Blick</w:t>
-      </w:r>
-      <w:r>
-        <w:t xml:space="preserve"> /aʊ̯f ˈaɪ̯nən ˈblɪk/</w:t>
+        <w:t>die Grammatik</w:t>
+      </w:r>
+      <w:r>
+        <w:t xml:space="preserve"> /ɡʁaˈmaːtɪk/</w:t>
       </w:r>
     </w:p>
     <w:p>
@@ -252,15 +312,14 @@
         <w:ind w:left="576"/>
       </w:pPr>
       <w:r>
-        <w:t>At a glance (overview; textbook headings).</w:t>
+        <w:t>Grammar (rules of the language).</w:t>
       </w:r>
     </w:p>
     <w:p>
       <w:pPr>
-        <w:spacing w:before="40" w:after="120"/>
+        <w:spacing w:before="40" w:after="60"/>
         <w:ind w:left="576"/>
       </w:pPr>
-      <w:r/>
       <w:r>
         <w:rPr>
           <w:i/>
@@ -275,43 +334,22 @@
           <w:color w:val="30608C"/>
           <w:sz w:val="21"/>
         </w:rPr>
-        <w:t>Grammatik auf einen Blick: Verben (Grammar at a glance: verbs) / Das ist die Übersicht auf einen Blick. (That's the overview at a glance.)</w:t>
+        <w:t>Grammatik auf einen Blick: Verben</w:t>
+      </w:r>
+      <w:r>
+        <w:rPr>
+          <w:i/>
+          <w:color w:val="404040"/>
+          <w:sz w:val="21"/>
+        </w:rPr>
+        <w:t xml:space="preserve"> (Grammar at a glance: verbs)</w:t>
       </w:r>
     </w:p>
     <w:p>
       <w:pPr>
-        <w:spacing w:before="0" w:after="0"/>
-      </w:pPr>
-    </w:p>
-    <w:p>
-      <w:pPr>
-        <w:spacing w:after="120"/>
-      </w:pPr>
-      <w:r>
-        <w:rPr>
-          <w:b/>
-        </w:rPr>
-        <w:t>der Blick</w:t>
-      </w:r>
-      <w:r>
-        <w:t xml:space="preserve"> /blɪk/</w:t>
-      </w:r>
-    </w:p>
-    <w:p>
-      <w:pPr>
-        <w:spacing w:after="80"/>
+        <w:spacing w:before="0" w:after="120"/>
         <w:ind w:left="576"/>
       </w:pPr>
-      <w:r>
-        <w:t>Glance; look (masculine).</w:t>
-      </w:r>
-    </w:p>
-    <w:p>
-      <w:pPr>
-        <w:spacing w:before="40" w:after="120"/>
-        <w:ind w:left="576"/>
-      </w:pPr>
-      <w:r/>
       <w:r>
         <w:rPr>
           <w:i/>
@@ -326,7 +364,15 @@
           <w:color w:val="30608C"/>
           <w:sz w:val="21"/>
         </w:rPr>
-        <w:t>auf einen Blick (at a glance) / einen Blick werfen (to cast a glance) / Der erste Blick (the first glance)</w:t>
+        <w:t>Ich lerne Grammatik.</w:t>
+      </w:r>
+      <w:r>
+        <w:rPr>
+          <w:i/>
+          <w:color w:val="404040"/>
+          <w:sz w:val="21"/>
+        </w:rPr>
+        <w:t xml:space="preserve"> (I'm learning grammar.)</w:t>
       </w:r>
     </w:p>
     <w:p>
@@ -342,10 +388,10 @@
         <w:rPr>
           <w:b/>
         </w:rPr>
-        <w:t>das Verb</w:t>
-      </w:r>
-      <w:r>
-        <w:t xml:space="preserve"> /vɛʁp/</w:t>
+        <w:t>auf einen Blick</w:t>
+      </w:r>
+      <w:r>
+        <w:t xml:space="preserve"> /aʊ̯f ˈaɪ̯nən ˈblɪk/</w:t>
       </w:r>
     </w:p>
     <w:p>
@@ -354,15 +400,14 @@
         <w:ind w:left="576"/>
       </w:pPr>
       <w:r>
-        <w:t>Verb; plural die Verben.</w:t>
+        <w:t>At a glance (overview; textbook headings).</w:t>
       </w:r>
     </w:p>
     <w:p>
       <w:pPr>
-        <w:spacing w:before="40" w:after="120"/>
+        <w:spacing w:before="40" w:after="60"/>
         <w:ind w:left="576"/>
       </w:pPr>
-      <w:r/>
       <w:r>
         <w:rPr>
           <w:i/>
@@ -377,43 +422,22 @@
           <w:color w:val="30608C"/>
           <w:sz w:val="21"/>
         </w:rPr>
-        <w:t>Grammatik auf einen Blick: Verben (Grammar at a glance: verbs) / essen ist ein Verb. (essen is a verb.) / starke und schwache Verben (strong and weak verbs)</w:t>
+        <w:t>Grammatik auf einen Blick: Verben</w:t>
+      </w:r>
+      <w:r>
+        <w:rPr>
+          <w:i/>
+          <w:color w:val="404040"/>
+          <w:sz w:val="21"/>
+        </w:rPr>
+        <w:t xml:space="preserve"> (Grammar at a glance: verbs)</w:t>
       </w:r>
     </w:p>
     <w:p>
       <w:pPr>
-        <w:spacing w:before="0" w:after="0"/>
-      </w:pPr>
-    </w:p>
-    <w:p>
-      <w:pPr>
-        <w:spacing w:after="120"/>
-      </w:pPr>
-      <w:r>
-        <w:rPr>
-          <w:b/>
-        </w:rPr>
-        <w:t>alles</w:t>
-      </w:r>
-      <w:r>
-        <w:t xml:space="preserve"> /ˈaləs/</w:t>
-      </w:r>
-    </w:p>
-    <w:p>
-      <w:pPr>
-        <w:spacing w:after="80"/>
+        <w:spacing w:before="0" w:after="120"/>
         <w:ind w:left="576"/>
       </w:pPr>
-      <w:r>
-        <w:t>Everything (pronoun; all of it).</w:t>
-      </w:r>
-    </w:p>
-    <w:p>
-      <w:pPr>
-        <w:spacing w:before="40" w:after="120"/>
-        <w:ind w:left="576"/>
-      </w:pPr>
-      <w:r/>
       <w:r>
         <w:rPr>
           <w:i/>
@@ -428,7 +452,15 @@
           <w:color w:val="30608C"/>
           <w:sz w:val="21"/>
         </w:rPr>
-        <w:t>Ist alles richtig? (Is everything correct?) / Alles klar? (All clear? / OK?) / Ich verstehe alles. (I understand everything.)</w:t>
+        <w:t>Das ist die Übersicht auf einen Blick.</w:t>
+      </w:r>
+      <w:r>
+        <w:rPr>
+          <w:i/>
+          <w:color w:val="404040"/>
+          <w:sz w:val="21"/>
+        </w:rPr>
+        <w:t xml:space="preserve"> (That's the overview at a glance.)</w:t>
       </w:r>
     </w:p>
     <w:p>
@@ -444,10 +476,10 @@
         <w:rPr>
           <w:b/>
         </w:rPr>
-        <w:t>richtig</w:t>
-      </w:r>
-      <w:r>
-        <w:t xml:space="preserve"> /ˈʁɪçtɪç/</w:t>
+        <w:t>der Blick</w:t>
+      </w:r>
+      <w:r>
+        <w:t xml:space="preserve"> /blɪk/</w:t>
       </w:r>
     </w:p>
     <w:p>
@@ -456,15 +488,14 @@
         <w:ind w:left="576"/>
       </w:pPr>
       <w:r>
-        <w:t>Correct; right; true.</w:t>
+        <w:t>Glance; look (masculine).</w:t>
       </w:r>
     </w:p>
     <w:p>
       <w:pPr>
-        <w:spacing w:before="40" w:after="120"/>
+        <w:spacing w:before="40" w:after="60"/>
         <w:ind w:left="576"/>
       </w:pPr>
-      <w:r/>
       <w:r>
         <w:rPr>
           <w:i/>
@@ -479,43 +510,22 @@
           <w:color w:val="30608C"/>
           <w:sz w:val="21"/>
         </w:rPr>
-        <w:t>Ist alles richtig? (Is everything correct?) / Das ist richtig. (That's right.) / Die richtige Antwort (the correct answer)</w:t>
+        <w:t>auf einen Blick</w:t>
+      </w:r>
+      <w:r>
+        <w:rPr>
+          <w:i/>
+          <w:color w:val="404040"/>
+          <w:sz w:val="21"/>
+        </w:rPr>
+        <w:t xml:space="preserve"> (at a glance)</w:t>
       </w:r>
     </w:p>
     <w:p>
       <w:pPr>
-        <w:spacing w:before="0" w:after="0"/>
-      </w:pPr>
-    </w:p>
-    <w:p>
-      <w:pPr>
-        <w:spacing w:after="120"/>
-      </w:pPr>
-      <w:r>
-        <w:rPr>
-          <w:b/>
-        </w:rPr>
-        <w:t>die Sekretärin</w:t>
-      </w:r>
-      <w:r>
-        <w:t xml:space="preserve"> /zekʁeˈtɛːʁɪn/</w:t>
-      </w:r>
-    </w:p>
-    <w:p>
-      <w:pPr>
-        <w:spacing w:after="80"/>
+        <w:spacing w:before="0" w:after="60"/>
         <w:ind w:left="576"/>
       </w:pPr>
-      <w:r>
-        <w:t>Secretary (feminine job title).</w:t>
-      </w:r>
-    </w:p>
-    <w:p>
-      <w:pPr>
-        <w:spacing w:before="40" w:after="120"/>
-        <w:ind w:left="576"/>
-      </w:pPr>
-      <w:r/>
       <w:r>
         <w:rPr>
           <w:i/>
@@ -530,43 +540,22 @@
           <w:color w:val="30608C"/>
           <w:sz w:val="21"/>
         </w:rPr>
-        <w:t>Und ich bin Frau Lange, die Sekretärin. (And I am Ms. Lange, the secretary.) / Sie ist Sekretärin. (She is a secretary.) / der Sekretär (male secretary)</w:t>
+        <w:t>einen Blick werfen</w:t>
+      </w:r>
+      <w:r>
+        <w:rPr>
+          <w:i/>
+          <w:color w:val="404040"/>
+          <w:sz w:val="21"/>
+        </w:rPr>
+        <w:t xml:space="preserve"> (to cast a glance)</w:t>
       </w:r>
     </w:p>
     <w:p>
       <w:pPr>
-        <w:spacing w:before="0" w:after="0"/>
-      </w:pPr>
-    </w:p>
-    <w:p>
-      <w:pPr>
-        <w:spacing w:after="120"/>
-      </w:pPr>
-      <w:r>
-        <w:rPr>
-          <w:b/>
-        </w:rPr>
-        <w:t>Frau</w:t>
-      </w:r>
-      <w:r>
-        <w:t xml:space="preserve"> /fraʊ̯/</w:t>
-      </w:r>
-    </w:p>
-    <w:p>
-      <w:pPr>
-        <w:spacing w:after="80"/>
+        <w:spacing w:before="0" w:after="120"/>
         <w:ind w:left="576"/>
       </w:pPr>
-      <w:r>
-        <w:t>Ms. or Mrs. before a surname.</w:t>
-      </w:r>
-    </w:p>
-    <w:p>
-      <w:pPr>
-        <w:spacing w:before="40" w:after="120"/>
-        <w:ind w:left="576"/>
-      </w:pPr>
-      <w:r/>
       <w:r>
         <w:rPr>
           <w:i/>
@@ -581,7 +570,15 @@
           <w:color w:val="30608C"/>
           <w:sz w:val="21"/>
         </w:rPr>
-        <w:t>Frau Lange (Ms. Lange) / Und ich bin Frau Lange, die Sekretärin. (And I am Ms. Lange, the secretary.) / Guten Tag, Frau Schulz! (Good day, Ms. Schulz!)</w:t>
+        <w:t>Der erste Blick</w:t>
+      </w:r>
+      <w:r>
+        <w:rPr>
+          <w:i/>
+          <w:color w:val="404040"/>
+          <w:sz w:val="21"/>
+        </w:rPr>
+        <w:t xml:space="preserve"> (the first glance)</w:t>
       </w:r>
     </w:p>
     <w:p>
@@ -597,10 +594,10 @@
         <w:rPr>
           <w:b/>
         </w:rPr>
-        <w:t>aus</w:t>
-      </w:r>
-      <w:r>
-        <w:t xml:space="preserve"> /aʊ̯s/</w:t>
+        <w:t>das Verb</w:t>
+      </w:r>
+      <w:r>
+        <w:t xml:space="preserve"> /vɛʁp/</w:t>
       </w:r>
     </w:p>
     <w:p>
@@ -609,15 +606,14 @@
         <w:ind w:left="576"/>
       </w:pPr>
       <w:r>
-        <w:t>From; out of (+ dative for origin).</w:t>
+        <w:t>Verb; plural die Verben.</w:t>
       </w:r>
     </w:p>
     <w:p>
       <w:pPr>
-        <w:spacing w:before="40" w:after="120"/>
+        <w:spacing w:before="40" w:after="60"/>
         <w:ind w:left="576"/>
       </w:pPr>
-      <w:r/>
       <w:r>
         <w:rPr>
           <w:i/>
@@ -632,43 +628,22 @@
           <w:color w:val="30608C"/>
           <w:sz w:val="21"/>
         </w:rPr>
-        <w:t>Ich komme aus Argentinien. (I'm from Argentina.) / Er kommt aus dem Urlaub. (He's back from vacation.) / aus Berlin (from Berlin)</w:t>
+        <w:t>Grammatik auf einen Blick: Verben</w:t>
+      </w:r>
+      <w:r>
+        <w:rPr>
+          <w:i/>
+          <w:color w:val="404040"/>
+          <w:sz w:val="21"/>
+        </w:rPr>
+        <w:t xml:space="preserve"> (Grammar at a glance: verbs)</w:t>
       </w:r>
     </w:p>
     <w:p>
       <w:pPr>
-        <w:spacing w:before="0" w:after="0"/>
-      </w:pPr>
-    </w:p>
-    <w:p>
-      <w:pPr>
-        <w:spacing w:after="120"/>
-      </w:pPr>
-      <w:r>
-        <w:rPr>
-          <w:b/>
-        </w:rPr>
-        <w:t>Argentinien</w:t>
-      </w:r>
-      <w:r>
-        <w:t xml:space="preserve"> /aʁɡɛnˈtiːni̯ən/</w:t>
-      </w:r>
-    </w:p>
-    <w:p>
-      <w:pPr>
-        <w:spacing w:after="80"/>
+        <w:spacing w:before="0" w:after="60"/>
         <w:ind w:left="576"/>
       </w:pPr>
-      <w:r>
-        <w:t>Argentina (country).</w:t>
-      </w:r>
-    </w:p>
-    <w:p>
-      <w:pPr>
-        <w:spacing w:before="40" w:after="120"/>
-        <w:ind w:left="576"/>
-      </w:pPr>
-      <w:r/>
       <w:r>
         <w:rPr>
           <w:i/>
@@ -683,43 +658,22 @@
           <w:color w:val="30608C"/>
           <w:sz w:val="21"/>
         </w:rPr>
-        <w:t>Ich komme aus Argentinien. (I'm from Argentina.) / Buenos Aires liegt in Argentinien. (Buenos Aires is in Argentina.)</w:t>
+        <w:t>essen ist ein Verb.</w:t>
+      </w:r>
+      <w:r>
+        <w:rPr>
+          <w:i/>
+          <w:color w:val="404040"/>
+          <w:sz w:val="21"/>
+        </w:rPr>
+        <w:t xml:space="preserve"> (essen is a verb.)</w:t>
       </w:r>
     </w:p>
     <w:p>
       <w:pPr>
-        <w:spacing w:before="0" w:after="0"/>
-      </w:pPr>
-    </w:p>
-    <w:p>
-      <w:pPr>
-        <w:spacing w:after="120"/>
-      </w:pPr>
-      <w:r>
-        <w:rPr>
-          <w:b/>
-        </w:rPr>
-        <w:t>woher</w:t>
-      </w:r>
-      <w:r>
-        <w:t xml:space="preserve"> /ˈvoheːɐ̯/</w:t>
-      </w:r>
-    </w:p>
-    <w:p>
-      <w:pPr>
-        <w:spacing w:after="80"/>
+        <w:spacing w:before="0" w:after="120"/>
         <w:ind w:left="576"/>
       </w:pPr>
-      <w:r>
-        <w:t>From where (origin).</w:t>
-      </w:r>
-    </w:p>
-    <w:p>
-      <w:pPr>
-        <w:spacing w:before="40" w:after="120"/>
-        <w:ind w:left="576"/>
-      </w:pPr>
-      <w:r/>
       <w:r>
         <w:rPr>
           <w:i/>
@@ -734,7 +688,15 @@
           <w:color w:val="30608C"/>
           <w:sz w:val="21"/>
         </w:rPr>
-        <w:t>Woher kommen Sie? (Where are you from [formal]?) / Ich komme aus Österreich. (I'm from Austria.) / Woher kommt er? (Where does he come from?)</w:t>
+        <w:t>starke und schwache Verben</w:t>
+      </w:r>
+      <w:r>
+        <w:rPr>
+          <w:i/>
+          <w:color w:val="404040"/>
+          <w:sz w:val="21"/>
+        </w:rPr>
+        <w:t xml:space="preserve"> (strong and weak verbs)</w:t>
       </w:r>
     </w:p>
     <w:p>
@@ -750,10 +712,10 @@
         <w:rPr>
           <w:b/>
         </w:rPr>
-        <w:t>kommen</w:t>
-      </w:r>
-      <w:r>
-        <w:t xml:space="preserve"> /ˈkɔmən/</w:t>
+        <w:t>alles</w:t>
+      </w:r>
+      <w:r>
+        <w:t xml:space="preserve"> /ˈaləs/</w:t>
       </w:r>
     </w:p>
     <w:p>
@@ -762,15 +724,14 @@
         <w:ind w:left="576"/>
       </w:pPr>
       <w:r>
-        <w:t>To come; aus … = from (a place).</w:t>
+        <w:t>Everything (pronoun; all of it).</w:t>
       </w:r>
     </w:p>
     <w:p>
       <w:pPr>
-        <w:spacing w:before="40" w:after="120"/>
+        <w:spacing w:before="40" w:after="60"/>
         <w:ind w:left="576"/>
       </w:pPr>
-      <w:r/>
       <w:r>
         <w:rPr>
           <w:i/>
@@ -785,7 +746,915 @@
           <w:color w:val="30608C"/>
           <w:sz w:val="21"/>
         </w:rPr>
-        <w:t>Woher kommen Sie? (Where do you come from [formal]?) / Sie kommen aus München. (You come from Munich.) / Ich komme aus Argentinien. (I'm from Argentina.) / Kommst du mit? (Are you coming along?)</w:t>
+        <w:t>Ist alles richtig?</w:t>
+      </w:r>
+      <w:r>
+        <w:rPr>
+          <w:i/>
+          <w:color w:val="404040"/>
+          <w:sz w:val="21"/>
+        </w:rPr>
+        <w:t xml:space="preserve"> (Is everything correct?)</w:t>
+      </w:r>
+    </w:p>
+    <w:p>
+      <w:pPr>
+        <w:spacing w:before="0" w:after="60"/>
+        <w:ind w:left="576"/>
+      </w:pPr>
+      <w:r>
+        <w:rPr>
+          <w:i/>
+          <w:color w:val="30608C"/>
+          <w:sz w:val="21"/>
+        </w:rPr>
+        <w:t xml:space="preserve">› </w:t>
+      </w:r>
+      <w:r>
+        <w:rPr>
+          <w:i/>
+          <w:color w:val="30608C"/>
+          <w:sz w:val="21"/>
+        </w:rPr>
+        <w:t>Alles klar? (All clear?</w:t>
+      </w:r>
+    </w:p>
+    <w:p>
+      <w:pPr>
+        <w:spacing w:before="0" w:after="60"/>
+        <w:ind w:left="576"/>
+      </w:pPr>
+      <w:r>
+        <w:rPr>
+          <w:i/>
+          <w:color w:val="30608C"/>
+          <w:sz w:val="21"/>
+        </w:rPr>
+        <w:t xml:space="preserve">› </w:t>
+      </w:r>
+      <w:r>
+        <w:rPr>
+          <w:i/>
+          <w:color w:val="30608C"/>
+          <w:sz w:val="21"/>
+        </w:rPr>
+        <w:t>OK?)</w:t>
+      </w:r>
+    </w:p>
+    <w:p>
+      <w:pPr>
+        <w:spacing w:before="0" w:after="120"/>
+        <w:ind w:left="576"/>
+      </w:pPr>
+      <w:r>
+        <w:rPr>
+          <w:i/>
+          <w:color w:val="30608C"/>
+          <w:sz w:val="21"/>
+        </w:rPr>
+        <w:t xml:space="preserve">› </w:t>
+      </w:r>
+      <w:r>
+        <w:rPr>
+          <w:i/>
+          <w:color w:val="30608C"/>
+          <w:sz w:val="21"/>
+        </w:rPr>
+        <w:t>Ich verstehe alles.</w:t>
+      </w:r>
+      <w:r>
+        <w:rPr>
+          <w:i/>
+          <w:color w:val="404040"/>
+          <w:sz w:val="21"/>
+        </w:rPr>
+        <w:t xml:space="preserve"> (I understand everything.)</w:t>
+      </w:r>
+    </w:p>
+    <w:p>
+      <w:pPr>
+        <w:spacing w:before="0" w:after="0"/>
+      </w:pPr>
+    </w:p>
+    <w:p>
+      <w:pPr>
+        <w:spacing w:after="120"/>
+      </w:pPr>
+      <w:r>
+        <w:rPr>
+          <w:b/>
+        </w:rPr>
+        <w:t>richtig</w:t>
+      </w:r>
+      <w:r>
+        <w:t xml:space="preserve"> /ˈʁɪçtɪç/</w:t>
+      </w:r>
+    </w:p>
+    <w:p>
+      <w:pPr>
+        <w:spacing w:after="80"/>
+        <w:ind w:left="576"/>
+      </w:pPr>
+      <w:r>
+        <w:t>Correct; right; true.</w:t>
+      </w:r>
+    </w:p>
+    <w:p>
+      <w:pPr>
+        <w:spacing w:before="40" w:after="60"/>
+        <w:ind w:left="576"/>
+      </w:pPr>
+      <w:r>
+        <w:rPr>
+          <w:i/>
+          <w:color w:val="30608C"/>
+          <w:sz w:val="21"/>
+        </w:rPr>
+        <w:t xml:space="preserve">› </w:t>
+      </w:r>
+      <w:r>
+        <w:rPr>
+          <w:i/>
+          <w:color w:val="30608C"/>
+          <w:sz w:val="21"/>
+        </w:rPr>
+        <w:t>Ist alles richtig?</w:t>
+      </w:r>
+      <w:r>
+        <w:rPr>
+          <w:i/>
+          <w:color w:val="404040"/>
+          <w:sz w:val="21"/>
+        </w:rPr>
+        <w:t xml:space="preserve"> (Is everything correct?)</w:t>
+      </w:r>
+    </w:p>
+    <w:p>
+      <w:pPr>
+        <w:spacing w:before="0" w:after="60"/>
+        <w:ind w:left="576"/>
+      </w:pPr>
+      <w:r>
+        <w:rPr>
+          <w:i/>
+          <w:color w:val="30608C"/>
+          <w:sz w:val="21"/>
+        </w:rPr>
+        <w:t xml:space="preserve">› </w:t>
+      </w:r>
+      <w:r>
+        <w:rPr>
+          <w:i/>
+          <w:color w:val="30608C"/>
+          <w:sz w:val="21"/>
+        </w:rPr>
+        <w:t>Das ist richtig.</w:t>
+      </w:r>
+      <w:r>
+        <w:rPr>
+          <w:i/>
+          <w:color w:val="404040"/>
+          <w:sz w:val="21"/>
+        </w:rPr>
+        <w:t xml:space="preserve"> (That's right.)</w:t>
+      </w:r>
+    </w:p>
+    <w:p>
+      <w:pPr>
+        <w:spacing w:before="0" w:after="120"/>
+        <w:ind w:left="576"/>
+      </w:pPr>
+      <w:r>
+        <w:rPr>
+          <w:i/>
+          <w:color w:val="30608C"/>
+          <w:sz w:val="21"/>
+        </w:rPr>
+        <w:t xml:space="preserve">› </w:t>
+      </w:r>
+      <w:r>
+        <w:rPr>
+          <w:i/>
+          <w:color w:val="30608C"/>
+          <w:sz w:val="21"/>
+        </w:rPr>
+        <w:t>Die richtige Antwort</w:t>
+      </w:r>
+      <w:r>
+        <w:rPr>
+          <w:i/>
+          <w:color w:val="404040"/>
+          <w:sz w:val="21"/>
+        </w:rPr>
+        <w:t xml:space="preserve"> (the correct answer)</w:t>
+      </w:r>
+    </w:p>
+    <w:p>
+      <w:pPr>
+        <w:spacing w:before="0" w:after="0"/>
+      </w:pPr>
+    </w:p>
+    <w:p>
+      <w:pPr>
+        <w:spacing w:after="120"/>
+      </w:pPr>
+      <w:r>
+        <w:rPr>
+          <w:b/>
+        </w:rPr>
+        <w:t>die Sekretärin</w:t>
+      </w:r>
+      <w:r>
+        <w:t xml:space="preserve"> /zekʁeˈtɛːʁɪn/</w:t>
+      </w:r>
+    </w:p>
+    <w:p>
+      <w:pPr>
+        <w:spacing w:after="80"/>
+        <w:ind w:left="576"/>
+      </w:pPr>
+      <w:r>
+        <w:t>Secretary (feminine job title).</w:t>
+      </w:r>
+    </w:p>
+    <w:p>
+      <w:pPr>
+        <w:spacing w:before="40" w:after="60"/>
+        <w:ind w:left="576"/>
+      </w:pPr>
+      <w:r>
+        <w:rPr>
+          <w:i/>
+          <w:color w:val="30608C"/>
+          <w:sz w:val="21"/>
+        </w:rPr>
+        <w:t xml:space="preserve">› </w:t>
+      </w:r>
+      <w:r>
+        <w:rPr>
+          <w:i/>
+          <w:color w:val="30608C"/>
+          <w:sz w:val="21"/>
+        </w:rPr>
+        <w:t>Und ich bin Frau Lange, die Sekretärin.</w:t>
+      </w:r>
+      <w:r>
+        <w:rPr>
+          <w:i/>
+          <w:color w:val="404040"/>
+          <w:sz w:val="21"/>
+        </w:rPr>
+        <w:t xml:space="preserve"> (And I am Ms. Lange, the secretary.)</w:t>
+      </w:r>
+    </w:p>
+    <w:p>
+      <w:pPr>
+        <w:spacing w:before="0" w:after="60"/>
+        <w:ind w:left="576"/>
+      </w:pPr>
+      <w:r>
+        <w:rPr>
+          <w:i/>
+          <w:color w:val="30608C"/>
+          <w:sz w:val="21"/>
+        </w:rPr>
+        <w:t xml:space="preserve">› </w:t>
+      </w:r>
+      <w:r>
+        <w:rPr>
+          <w:i/>
+          <w:color w:val="30608C"/>
+          <w:sz w:val="21"/>
+        </w:rPr>
+        <w:t>Sie ist Sekretärin.</w:t>
+      </w:r>
+      <w:r>
+        <w:rPr>
+          <w:i/>
+          <w:color w:val="404040"/>
+          <w:sz w:val="21"/>
+        </w:rPr>
+        <w:t xml:space="preserve"> (She is a secretary.)</w:t>
+      </w:r>
+    </w:p>
+    <w:p>
+      <w:pPr>
+        <w:spacing w:before="0" w:after="120"/>
+        <w:ind w:left="576"/>
+      </w:pPr>
+      <w:r>
+        <w:rPr>
+          <w:i/>
+          <w:color w:val="30608C"/>
+          <w:sz w:val="21"/>
+        </w:rPr>
+        <w:t xml:space="preserve">› </w:t>
+      </w:r>
+      <w:r>
+        <w:rPr>
+          <w:i/>
+          <w:color w:val="30608C"/>
+          <w:sz w:val="21"/>
+        </w:rPr>
+        <w:t>der Sekretär</w:t>
+      </w:r>
+      <w:r>
+        <w:rPr>
+          <w:i/>
+          <w:color w:val="404040"/>
+          <w:sz w:val="21"/>
+        </w:rPr>
+        <w:t xml:space="preserve"> (male secretary)</w:t>
+      </w:r>
+    </w:p>
+    <w:p>
+      <w:pPr>
+        <w:spacing w:before="0" w:after="0"/>
+      </w:pPr>
+    </w:p>
+    <w:p>
+      <w:pPr>
+        <w:spacing w:after="120"/>
+      </w:pPr>
+      <w:r>
+        <w:rPr>
+          <w:b/>
+        </w:rPr>
+        <w:t>Frau</w:t>
+      </w:r>
+      <w:r>
+        <w:t xml:space="preserve"> /fraʊ̯/</w:t>
+      </w:r>
+    </w:p>
+    <w:p>
+      <w:pPr>
+        <w:spacing w:after="80"/>
+        <w:ind w:left="576"/>
+      </w:pPr>
+      <w:r>
+        <w:t>Ms. or Mrs. before a surname.</w:t>
+      </w:r>
+    </w:p>
+    <w:p>
+      <w:pPr>
+        <w:spacing w:before="40" w:after="60"/>
+        <w:ind w:left="576"/>
+      </w:pPr>
+      <w:r>
+        <w:rPr>
+          <w:i/>
+          <w:color w:val="30608C"/>
+          <w:sz w:val="21"/>
+        </w:rPr>
+        <w:t xml:space="preserve">› </w:t>
+      </w:r>
+      <w:r>
+        <w:rPr>
+          <w:i/>
+          <w:color w:val="30608C"/>
+          <w:sz w:val="21"/>
+        </w:rPr>
+        <w:t>Frau Lange</w:t>
+      </w:r>
+      <w:r>
+        <w:rPr>
+          <w:i/>
+          <w:color w:val="404040"/>
+          <w:sz w:val="21"/>
+        </w:rPr>
+        <w:t xml:space="preserve"> (Ms. Lange)</w:t>
+      </w:r>
+    </w:p>
+    <w:p>
+      <w:pPr>
+        <w:spacing w:before="0" w:after="60"/>
+        <w:ind w:left="576"/>
+      </w:pPr>
+      <w:r>
+        <w:rPr>
+          <w:i/>
+          <w:color w:val="30608C"/>
+          <w:sz w:val="21"/>
+        </w:rPr>
+        <w:t xml:space="preserve">› </w:t>
+      </w:r>
+      <w:r>
+        <w:rPr>
+          <w:i/>
+          <w:color w:val="30608C"/>
+          <w:sz w:val="21"/>
+        </w:rPr>
+        <w:t>Und ich bin Frau Lange, die Sekretärin.</w:t>
+      </w:r>
+      <w:r>
+        <w:rPr>
+          <w:i/>
+          <w:color w:val="404040"/>
+          <w:sz w:val="21"/>
+        </w:rPr>
+        <w:t xml:space="preserve"> (And I am Ms. Lange, the secretary.)</w:t>
+      </w:r>
+    </w:p>
+    <w:p>
+      <w:pPr>
+        <w:spacing w:before="0" w:after="120"/>
+        <w:ind w:left="576"/>
+      </w:pPr>
+      <w:r>
+        <w:rPr>
+          <w:i/>
+          <w:color w:val="30608C"/>
+          <w:sz w:val="21"/>
+        </w:rPr>
+        <w:t xml:space="preserve">› </w:t>
+      </w:r>
+      <w:r>
+        <w:rPr>
+          <w:i/>
+          <w:color w:val="30608C"/>
+          <w:sz w:val="21"/>
+        </w:rPr>
+        <w:t>Guten Tag, Frau Schulz!</w:t>
+      </w:r>
+      <w:r>
+        <w:rPr>
+          <w:i/>
+          <w:color w:val="404040"/>
+          <w:sz w:val="21"/>
+        </w:rPr>
+        <w:t xml:space="preserve"> (Good day, Ms. Schulz!)</w:t>
+      </w:r>
+    </w:p>
+    <w:p>
+      <w:pPr>
+        <w:spacing w:before="0" w:after="0"/>
+      </w:pPr>
+    </w:p>
+    <w:p>
+      <w:pPr>
+        <w:spacing w:after="120"/>
+      </w:pPr>
+      <w:r>
+        <w:rPr>
+          <w:b/>
+        </w:rPr>
+        <w:t>aus</w:t>
+      </w:r>
+      <w:r>
+        <w:t xml:space="preserve"> /aʊ̯s/</w:t>
+      </w:r>
+    </w:p>
+    <w:p>
+      <w:pPr>
+        <w:spacing w:after="80"/>
+        <w:ind w:left="576"/>
+      </w:pPr>
+      <w:r>
+        <w:t>From; out of (+ dative for origin).</w:t>
+      </w:r>
+    </w:p>
+    <w:p>
+      <w:pPr>
+        <w:spacing w:before="40" w:after="60"/>
+        <w:ind w:left="576"/>
+      </w:pPr>
+      <w:r>
+        <w:rPr>
+          <w:i/>
+          <w:color w:val="30608C"/>
+          <w:sz w:val="21"/>
+        </w:rPr>
+        <w:t xml:space="preserve">› </w:t>
+      </w:r>
+      <w:r>
+        <w:rPr>
+          <w:i/>
+          <w:color w:val="30608C"/>
+          <w:sz w:val="21"/>
+        </w:rPr>
+        <w:t>Ich komme aus Argentinien.</w:t>
+      </w:r>
+      <w:r>
+        <w:rPr>
+          <w:i/>
+          <w:color w:val="404040"/>
+          <w:sz w:val="21"/>
+        </w:rPr>
+        <w:t xml:space="preserve"> (I'm from Argentina.)</w:t>
+      </w:r>
+    </w:p>
+    <w:p>
+      <w:pPr>
+        <w:spacing w:before="0" w:after="60"/>
+        <w:ind w:left="576"/>
+      </w:pPr>
+      <w:r>
+        <w:rPr>
+          <w:i/>
+          <w:color w:val="30608C"/>
+          <w:sz w:val="21"/>
+        </w:rPr>
+        <w:t xml:space="preserve">› </w:t>
+      </w:r>
+      <w:r>
+        <w:rPr>
+          <w:i/>
+          <w:color w:val="30608C"/>
+          <w:sz w:val="21"/>
+        </w:rPr>
+        <w:t>Er kommt aus dem Urlaub.</w:t>
+      </w:r>
+      <w:r>
+        <w:rPr>
+          <w:i/>
+          <w:color w:val="404040"/>
+          <w:sz w:val="21"/>
+        </w:rPr>
+        <w:t xml:space="preserve"> (He's back from vacation.)</w:t>
+      </w:r>
+    </w:p>
+    <w:p>
+      <w:pPr>
+        <w:spacing w:before="0" w:after="120"/>
+        <w:ind w:left="576"/>
+      </w:pPr>
+      <w:r>
+        <w:rPr>
+          <w:i/>
+          <w:color w:val="30608C"/>
+          <w:sz w:val="21"/>
+        </w:rPr>
+        <w:t xml:space="preserve">› </w:t>
+      </w:r>
+      <w:r>
+        <w:rPr>
+          <w:i/>
+          <w:color w:val="30608C"/>
+          <w:sz w:val="21"/>
+        </w:rPr>
+        <w:t>aus Berlin</w:t>
+      </w:r>
+      <w:r>
+        <w:rPr>
+          <w:i/>
+          <w:color w:val="404040"/>
+          <w:sz w:val="21"/>
+        </w:rPr>
+        <w:t xml:space="preserve"> (from Berlin)</w:t>
+      </w:r>
+    </w:p>
+    <w:p>
+      <w:pPr>
+        <w:spacing w:before="0" w:after="0"/>
+      </w:pPr>
+    </w:p>
+    <w:p>
+      <w:pPr>
+        <w:spacing w:after="120"/>
+      </w:pPr>
+      <w:r>
+        <w:rPr>
+          <w:b/>
+        </w:rPr>
+        <w:t>Argentinien</w:t>
+      </w:r>
+      <w:r>
+        <w:t xml:space="preserve"> /aʁɡɛnˈtiːni̯ən/</w:t>
+      </w:r>
+    </w:p>
+    <w:p>
+      <w:pPr>
+        <w:spacing w:after="80"/>
+        <w:ind w:left="576"/>
+      </w:pPr>
+      <w:r>
+        <w:t>Argentina (country).</w:t>
+      </w:r>
+    </w:p>
+    <w:p>
+      <w:pPr>
+        <w:spacing w:before="40" w:after="60"/>
+        <w:ind w:left="576"/>
+      </w:pPr>
+      <w:r>
+        <w:rPr>
+          <w:i/>
+          <w:color w:val="30608C"/>
+          <w:sz w:val="21"/>
+        </w:rPr>
+        <w:t xml:space="preserve">› </w:t>
+      </w:r>
+      <w:r>
+        <w:rPr>
+          <w:i/>
+          <w:color w:val="30608C"/>
+          <w:sz w:val="21"/>
+        </w:rPr>
+        <w:t>Ich komme aus Argentinien.</w:t>
+      </w:r>
+      <w:r>
+        <w:rPr>
+          <w:i/>
+          <w:color w:val="404040"/>
+          <w:sz w:val="21"/>
+        </w:rPr>
+        <w:t xml:space="preserve"> (I'm from Argentina.)</w:t>
+      </w:r>
+    </w:p>
+    <w:p>
+      <w:pPr>
+        <w:spacing w:before="0" w:after="120"/>
+        <w:ind w:left="576"/>
+      </w:pPr>
+      <w:r>
+        <w:rPr>
+          <w:i/>
+          <w:color w:val="30608C"/>
+          <w:sz w:val="21"/>
+        </w:rPr>
+        <w:t xml:space="preserve">› </w:t>
+      </w:r>
+      <w:r>
+        <w:rPr>
+          <w:i/>
+          <w:color w:val="30608C"/>
+          <w:sz w:val="21"/>
+        </w:rPr>
+        <w:t>Buenos Aires liegt in Argentinien.</w:t>
+      </w:r>
+      <w:r>
+        <w:rPr>
+          <w:i/>
+          <w:color w:val="404040"/>
+          <w:sz w:val="21"/>
+        </w:rPr>
+        <w:t xml:space="preserve"> (Buenos Aires is in Argentina.)</w:t>
+      </w:r>
+    </w:p>
+    <w:p>
+      <w:pPr>
+        <w:spacing w:before="0" w:after="0"/>
+      </w:pPr>
+    </w:p>
+    <w:p>
+      <w:pPr>
+        <w:spacing w:after="120"/>
+      </w:pPr>
+      <w:r>
+        <w:rPr>
+          <w:b/>
+        </w:rPr>
+        <w:t>woher</w:t>
+      </w:r>
+      <w:r>
+        <w:t xml:space="preserve"> /ˈvoheːɐ̯/</w:t>
+      </w:r>
+    </w:p>
+    <w:p>
+      <w:pPr>
+        <w:spacing w:after="80"/>
+        <w:ind w:left="576"/>
+      </w:pPr>
+      <w:r>
+        <w:t>From where (origin).</w:t>
+      </w:r>
+    </w:p>
+    <w:p>
+      <w:pPr>
+        <w:spacing w:before="40" w:after="60"/>
+        <w:ind w:left="576"/>
+      </w:pPr>
+      <w:r>
+        <w:rPr>
+          <w:i/>
+          <w:color w:val="30608C"/>
+          <w:sz w:val="21"/>
+        </w:rPr>
+        <w:t xml:space="preserve">› </w:t>
+      </w:r>
+      <w:r>
+        <w:rPr>
+          <w:i/>
+          <w:color w:val="30608C"/>
+          <w:sz w:val="21"/>
+        </w:rPr>
+        <w:t>Woher kommen Sie?</w:t>
+      </w:r>
+      <w:r>
+        <w:rPr>
+          <w:i/>
+          <w:color w:val="404040"/>
+          <w:sz w:val="21"/>
+        </w:rPr>
+        <w:t xml:space="preserve"> (Where are you from [formal]?)</w:t>
+      </w:r>
+    </w:p>
+    <w:p>
+      <w:pPr>
+        <w:spacing w:before="0" w:after="60"/>
+        <w:ind w:left="576"/>
+      </w:pPr>
+      <w:r>
+        <w:rPr>
+          <w:i/>
+          <w:color w:val="30608C"/>
+          <w:sz w:val="21"/>
+        </w:rPr>
+        <w:t xml:space="preserve">› </w:t>
+      </w:r>
+      <w:r>
+        <w:rPr>
+          <w:i/>
+          <w:color w:val="30608C"/>
+          <w:sz w:val="21"/>
+        </w:rPr>
+        <w:t>Ich komme aus Österreich.</w:t>
+      </w:r>
+      <w:r>
+        <w:rPr>
+          <w:i/>
+          <w:color w:val="404040"/>
+          <w:sz w:val="21"/>
+        </w:rPr>
+        <w:t xml:space="preserve"> (I'm from Austria.)</w:t>
+      </w:r>
+    </w:p>
+    <w:p>
+      <w:pPr>
+        <w:spacing w:before="0" w:after="120"/>
+        <w:ind w:left="576"/>
+      </w:pPr>
+      <w:r>
+        <w:rPr>
+          <w:i/>
+          <w:color w:val="30608C"/>
+          <w:sz w:val="21"/>
+        </w:rPr>
+        <w:t xml:space="preserve">› </w:t>
+      </w:r>
+      <w:r>
+        <w:rPr>
+          <w:i/>
+          <w:color w:val="30608C"/>
+          <w:sz w:val="21"/>
+        </w:rPr>
+        <w:t>Woher kommt er?</w:t>
+      </w:r>
+      <w:r>
+        <w:rPr>
+          <w:i/>
+          <w:color w:val="404040"/>
+          <w:sz w:val="21"/>
+        </w:rPr>
+        <w:t xml:space="preserve"> (Where does he come from?)</w:t>
+      </w:r>
+    </w:p>
+    <w:p>
+      <w:pPr>
+        <w:spacing w:before="0" w:after="0"/>
+      </w:pPr>
+    </w:p>
+    <w:p>
+      <w:pPr>
+        <w:spacing w:after="120"/>
+      </w:pPr>
+      <w:r>
+        <w:rPr>
+          <w:b/>
+        </w:rPr>
+        <w:t>kommen</w:t>
+      </w:r>
+      <w:r>
+        <w:t xml:space="preserve"> /ˈkɔmən/</w:t>
+      </w:r>
+    </w:p>
+    <w:p>
+      <w:pPr>
+        <w:spacing w:after="80"/>
+        <w:ind w:left="576"/>
+      </w:pPr>
+      <w:r>
+        <w:t>To come; aus … = from (a place).</w:t>
+      </w:r>
+    </w:p>
+    <w:p>
+      <w:pPr>
+        <w:spacing w:before="40" w:after="60"/>
+        <w:ind w:left="576"/>
+      </w:pPr>
+      <w:r>
+        <w:rPr>
+          <w:i/>
+          <w:color w:val="30608C"/>
+          <w:sz w:val="21"/>
+        </w:rPr>
+        <w:t xml:space="preserve">› </w:t>
+      </w:r>
+      <w:r>
+        <w:rPr>
+          <w:i/>
+          <w:color w:val="30608C"/>
+          <w:sz w:val="21"/>
+        </w:rPr>
+        <w:t>Woher kommen Sie?</w:t>
+      </w:r>
+      <w:r>
+        <w:rPr>
+          <w:i/>
+          <w:color w:val="404040"/>
+          <w:sz w:val="21"/>
+        </w:rPr>
+        <w:t xml:space="preserve"> (Where do you come from [formal]?)</w:t>
+      </w:r>
+    </w:p>
+    <w:p>
+      <w:pPr>
+        <w:spacing w:before="0" w:after="60"/>
+        <w:ind w:left="576"/>
+      </w:pPr>
+      <w:r>
+        <w:rPr>
+          <w:i/>
+          <w:color w:val="30608C"/>
+          <w:sz w:val="21"/>
+        </w:rPr>
+        <w:t xml:space="preserve">› </w:t>
+      </w:r>
+      <w:r>
+        <w:rPr>
+          <w:i/>
+          <w:color w:val="30608C"/>
+          <w:sz w:val="21"/>
+        </w:rPr>
+        <w:t>Sie kommen aus München.</w:t>
+      </w:r>
+      <w:r>
+        <w:rPr>
+          <w:i/>
+          <w:color w:val="404040"/>
+          <w:sz w:val="21"/>
+        </w:rPr>
+        <w:t xml:space="preserve"> (You come from Munich.)</w:t>
+      </w:r>
+    </w:p>
+    <w:p>
+      <w:pPr>
+        <w:spacing w:before="0" w:after="60"/>
+        <w:ind w:left="576"/>
+      </w:pPr>
+      <w:r>
+        <w:rPr>
+          <w:i/>
+          <w:color w:val="30608C"/>
+          <w:sz w:val="21"/>
+        </w:rPr>
+        <w:t xml:space="preserve">› </w:t>
+      </w:r>
+      <w:r>
+        <w:rPr>
+          <w:i/>
+          <w:color w:val="30608C"/>
+          <w:sz w:val="21"/>
+        </w:rPr>
+        <w:t>Ich komme aus Argentinien.</w:t>
+      </w:r>
+      <w:r>
+        <w:rPr>
+          <w:i/>
+          <w:color w:val="404040"/>
+          <w:sz w:val="21"/>
+        </w:rPr>
+        <w:t xml:space="preserve"> (I'm from Argentina.)</w:t>
+      </w:r>
+    </w:p>
+    <w:p>
+      <w:pPr>
+        <w:spacing w:before="0" w:after="120"/>
+        <w:ind w:left="576"/>
+      </w:pPr>
+      <w:r>
+        <w:rPr>
+          <w:i/>
+          <w:color w:val="30608C"/>
+          <w:sz w:val="21"/>
+        </w:rPr>
+        <w:t xml:space="preserve">› </w:t>
+      </w:r>
+      <w:r>
+        <w:rPr>
+          <w:i/>
+          <w:color w:val="30608C"/>
+          <w:sz w:val="21"/>
+        </w:rPr>
+        <w:t>Kommst du mit?</w:t>
+      </w:r>
+      <w:r>
+        <w:rPr>
+          <w:i/>
+          <w:color w:val="404040"/>
+          <w:sz w:val="21"/>
+        </w:rPr>
+        <w:t xml:space="preserve"> (Are you coming along?)</w:t>
       </w:r>
     </w:p>
     <w:p>
@@ -832,10 +1701,9 @@
     </w:p>
     <w:p>
       <w:pPr>
-        <w:spacing w:before="40" w:after="120"/>
+        <w:spacing w:before="40" w:after="60"/>
         <w:ind w:left="576"/>
       </w:pPr>
-      <w:r/>
       <w:r>
         <w:rPr>
           <w:i/>
@@ -850,43 +1718,22 @@
           <w:color w:val="30608C"/>
           <w:sz w:val="21"/>
         </w:rPr>
-        <w:t>Grüß Gott! (Good day — hello!) / Grüß Gott, Frau Schmid! (Hello, Ms. Schmid!)</w:t>
+        <w:t>Grüß Gott!</w:t>
+      </w:r>
+      <w:r>
+        <w:rPr>
+          <w:i/>
+          <w:color w:val="404040"/>
+          <w:sz w:val="21"/>
+        </w:rPr>
+        <w:t xml:space="preserve"> (Good day — hello!)</w:t>
       </w:r>
     </w:p>
     <w:p>
       <w:pPr>
-        <w:spacing w:before="0" w:after="0"/>
-      </w:pPr>
-    </w:p>
-    <w:p>
-      <w:pPr>
-        <w:spacing w:after="120"/>
-      </w:pPr>
-      <w:r>
-        <w:rPr>
-          <w:b/>
-        </w:rPr>
-        <w:t>ergänzen</w:t>
-      </w:r>
-      <w:r>
-        <w:t xml:space="preserve"> /ˈʔɛʁɡɛntsən/</w:t>
-      </w:r>
-    </w:p>
-    <w:p>
-      <w:pPr>
-        <w:spacing w:after="80"/>
+        <w:spacing w:before="0" w:after="120"/>
         <w:ind w:left="576"/>
       </w:pPr>
-      <w:r>
-        <w:t>To complete / fill in blanks.</w:t>
-      </w:r>
-    </w:p>
-    <w:p>
-      <w:pPr>
-        <w:spacing w:before="40" w:after="120"/>
-        <w:ind w:left="576"/>
-      </w:pPr>
-      <w:r/>
       <w:r>
         <w:rPr>
           <w:i/>
@@ -901,7 +1748,15 @@
           <w:color w:val="30608C"/>
           <w:sz w:val="21"/>
         </w:rPr>
-        <w:t>Lesen Sie das Gespräch und ergänzen Sie. (Read the dialogue, then supply the missing parts / fill everything in.) / Ergänzen Sie die Lücken mit den passenden Wörtern. (Fill in the gaps with suitable words.)</w:t>
+        <w:t>Grüß Gott, Frau Schmid!</w:t>
+      </w:r>
+      <w:r>
+        <w:rPr>
+          <w:i/>
+          <w:color w:val="404040"/>
+          <w:sz w:val="21"/>
+        </w:rPr>
+        <w:t xml:space="preserve"> (Hello, Ms. Schmid!)</w:t>
       </w:r>
     </w:p>
     <w:p>
@@ -917,10 +1772,10 @@
         <w:rPr>
           <w:b/>
         </w:rPr>
-        <w:t>lesen</w:t>
-      </w:r>
-      <w:r>
-        <w:t xml:space="preserve"> /ˈleːzən/</w:t>
+        <w:t>ergänzen</w:t>
+      </w:r>
+      <w:r>
+        <w:t xml:space="preserve"> /ˈʔɛʁɡɛntsən/</w:t>
       </w:r>
     </w:p>
     <w:p>
@@ -929,15 +1784,14 @@
         <w:ind w:left="576"/>
       </w:pPr>
       <w:r>
-        <w:t>To read (+ object in accusative).</w:t>
+        <w:t>To complete / fill in blanks.</w:t>
       </w:r>
     </w:p>
     <w:p>
       <w:pPr>
-        <w:spacing w:before="40" w:after="120"/>
+        <w:spacing w:before="40" w:after="60"/>
         <w:ind w:left="576"/>
       </w:pPr>
-      <w:r/>
       <w:r>
         <w:rPr>
           <w:i/>
@@ -952,43 +1806,14 @@
           <w:color w:val="30608C"/>
           <w:sz w:val="21"/>
         </w:rPr>
-        <w:t>Lesen Sie das Gespräch und ergänzen Sie. (Read the dialogue [aloud/on the page], then finish / fill it in.) / Lesen Sie die Überschrift zu Beginn der Übung. (Read the headline at the start of the exercise.)</w:t>
+        <w:t>Lesen Sie das Gespräch und ergänzen Sie. (Read the dialogue, then supply the missing parts</w:t>
       </w:r>
     </w:p>
     <w:p>
       <w:pPr>
-        <w:spacing w:before="0" w:after="0"/>
-      </w:pPr>
-    </w:p>
-    <w:p>
-      <w:pPr>
-        <w:spacing w:after="120"/>
-      </w:pPr>
-      <w:r>
-        <w:rPr>
-          <w:b/>
-        </w:rPr>
-        <w:t>sagen</w:t>
-      </w:r>
-      <w:r>
-        <w:t xml:space="preserve"> /ˈzaːɡən/</w:t>
-      </w:r>
-    </w:p>
-    <w:p>
-      <w:pPr>
-        <w:spacing w:after="80"/>
+        <w:spacing w:before="0" w:after="60"/>
         <w:ind w:left="576"/>
       </w:pPr>
-      <w:r>
-        <w:t>To say or tell.</w:t>
-      </w:r>
-    </w:p>
-    <w:p>
-      <w:pPr>
-        <w:spacing w:before="40" w:after="120"/>
-        <w:ind w:left="576"/>
-      </w:pPr>
-      <w:r/>
       <w:r>
         <w:rPr>
           <w:i/>
@@ -1003,43 +1828,14 @@
           <w:color w:val="30608C"/>
           <w:sz w:val="21"/>
         </w:rPr>
-        <w:t>Was sagen die Personen? (What are the people saying?) / Er sagt kurz „Nein“. (He briefly says “no”.)</w:t>
+        <w:t>fill everything in.)</w:t>
       </w:r>
     </w:p>
     <w:p>
       <w:pPr>
-        <w:spacing w:before="0" w:after="0"/>
-      </w:pPr>
-    </w:p>
-    <w:p>
-      <w:pPr>
-        <w:spacing w:after="120"/>
-      </w:pPr>
-      <w:r>
-        <w:rPr>
-          <w:b/>
-        </w:rPr>
-        <w:t>die Person</w:t>
-      </w:r>
-      <w:r>
-        <w:t xml:space="preserve"> /pɛʁˈzoːn/</w:t>
-      </w:r>
-    </w:p>
-    <w:p>
-      <w:pPr>
-        <w:spacing w:after="80"/>
+        <w:spacing w:before="0" w:after="120"/>
         <w:ind w:left="576"/>
       </w:pPr>
-      <w:r>
-        <w:t>Feminine singular: person (pl. Personen).</w:t>
-      </w:r>
-    </w:p>
-    <w:p>
-      <w:pPr>
-        <w:spacing w:before="40" w:after="120"/>
-        <w:ind w:left="576"/>
-      </w:pPr>
-      <w:r/>
       <w:r>
         <w:rPr>
           <w:i/>
@@ -1054,7 +1850,15 @@
           <w:color w:val="30608C"/>
           <w:sz w:val="21"/>
         </w:rPr>
-        <w:t>Viele Personen warten. (Many people are waiting.) / Zwei Kinder hören das Gespräch. (Two children listen to the dialogue.)</w:t>
+        <w:t>Ergänzen Sie die Lücken mit den passenden Wörtern.</w:t>
+      </w:r>
+      <w:r>
+        <w:rPr>
+          <w:i/>
+          <w:color w:val="404040"/>
+          <w:sz w:val="21"/>
+        </w:rPr>
+        <w:t xml:space="preserve"> (Fill in the gaps with suitable words.)</w:t>
       </w:r>
     </w:p>
     <w:p>
@@ -1070,10 +1874,10 @@
         <w:rPr>
           <w:b/>
         </w:rPr>
-        <w:t>was</w:t>
-      </w:r>
-      <w:r>
-        <w:t xml:space="preserve"> /vas/</w:t>
+        <w:t>lesen</w:t>
+      </w:r>
+      <w:r>
+        <w:t xml:space="preserve"> /ˈleːzən/</w:t>
       </w:r>
     </w:p>
     <w:p>
@@ -1082,15 +1886,14 @@
         <w:ind w:left="576"/>
       </w:pPr>
       <w:r>
-        <w:t>Interrogative “what” (Was …?).</w:t>
+        <w:t>To read (+ object in accusative).</w:t>
       </w:r>
     </w:p>
     <w:p>
       <w:pPr>
-        <w:spacing w:before="40" w:after="120"/>
+        <w:spacing w:before="40" w:after="60"/>
         <w:ind w:left="576"/>
       </w:pPr>
-      <w:r/>
       <w:r>
         <w:rPr>
           <w:i/>
@@ -1105,43 +1908,14 @@
           <w:color w:val="30608C"/>
           <w:sz w:val="21"/>
         </w:rPr>
-        <w:t>Was sagen die Personen? (What are the people saying?) / Was trinken die Kinder? (What are the children drinking?)</w:t>
+        <w:t>Lesen Sie das Gespräch und ergänzen Sie. (Read the dialogue [aloud/on the page], then finish</w:t>
       </w:r>
     </w:p>
     <w:p>
       <w:pPr>
-        <w:spacing w:before="0" w:after="0"/>
-      </w:pPr>
-    </w:p>
-    <w:p>
-      <w:pPr>
-        <w:spacing w:after="120"/>
-      </w:pPr>
-      <w:r>
-        <w:rPr>
-          <w:b/>
-        </w:rPr>
-        <w:t>passen</w:t>
-      </w:r>
-      <w:r>
-        <w:t xml:space="preserve"> /ˈpasən/</w:t>
-      </w:r>
-    </w:p>
-    <w:p>
-      <w:pPr>
-        <w:spacing w:after="80"/>
+        <w:spacing w:before="0" w:after="60"/>
         <w:ind w:left="576"/>
       </w:pPr>
-      <w:r>
-        <w:t>To fit; match; suit.</w:t>
-      </w:r>
-    </w:p>
-    <w:p>
-      <w:pPr>
-        <w:spacing w:before="40" w:after="120"/>
-        <w:ind w:left="576"/>
-      </w:pPr>
-      <w:r/>
       <w:r>
         <w:rPr>
           <w:i/>
@@ -1156,43 +1930,14 @@
           <w:color w:val="30608C"/>
           <w:sz w:val="21"/>
         </w:rPr>
-        <w:t>Welches Foto passt? (Which photo fits / matches?) / Das Bild passt zu diesem Text. (The picture goes with / fits this text passage.) / Das zweite Foto passt nicht. (The second photo does not fit / is wrong.)</w:t>
+        <w:t>fill it in.)</w:t>
       </w:r>
     </w:p>
     <w:p>
       <w:pPr>
-        <w:spacing w:before="0" w:after="0"/>
-      </w:pPr>
-    </w:p>
-    <w:p>
-      <w:pPr>
-        <w:spacing w:after="120"/>
-      </w:pPr>
-      <w:r>
-        <w:rPr>
-          <w:b/>
-        </w:rPr>
-        <w:t>welcher · welche · welches</w:t>
-      </w:r>
-      <w:r>
-        <w:t xml:space="preserve"> /ˈvɛlçɐ | ˈvɛlçə | ˈvɛlçəs/</w:t>
-      </w:r>
-    </w:p>
-    <w:p>
-      <w:pPr>
-        <w:spacing w:after="80"/>
+        <w:spacing w:before="0" w:after="120"/>
         <w:ind w:left="576"/>
       </w:pPr>
-      <w:r>
-        <w:t>Which (pick by gender: m./f./n.).</w:t>
-      </w:r>
-    </w:p>
-    <w:p>
-      <w:pPr>
-        <w:spacing w:before="40" w:after="120"/>
-        <w:ind w:left="576"/>
-      </w:pPr>
-      <w:r/>
       <w:r>
         <w:rPr>
           <w:i/>
@@ -1207,7 +1952,15 @@
           <w:color w:val="30608C"/>
           <w:sz w:val="21"/>
         </w:rPr>
-        <w:t>Welches Foto passt? (Which photo fits / matches?) / Welche Farbe ist das? (What / which color is that?) / Welche Antwort passt? (Which answer fits / is correct?)</w:t>
+        <w:t>Lesen Sie die Überschrift zu Beginn der Übung.</w:t>
+      </w:r>
+      <w:r>
+        <w:rPr>
+          <w:i/>
+          <w:color w:val="404040"/>
+          <w:sz w:val="21"/>
+        </w:rPr>
+        <w:t xml:space="preserve"> (Read the headline at the start of the exercise.)</w:t>
       </w:r>
     </w:p>
     <w:p>
@@ -1223,10 +1976,10 @@
         <w:rPr>
           <w:b/>
         </w:rPr>
-        <w:t>das Foto</w:t>
-      </w:r>
-      <w:r>
-        <w:t xml:space="preserve"> /ˈfoːto/</w:t>
+        <w:t>sagen</w:t>
+      </w:r>
+      <w:r>
+        <w:t xml:space="preserve"> /ˈzaːɡən/</w:t>
       </w:r>
     </w:p>
     <w:p>
@@ -1235,15 +1988,14 @@
         <w:ind w:left="576"/>
       </w:pPr>
       <w:r>
-        <w:t>Photo; picture (neuter; pl. Fotos).</w:t>
+        <w:t>To say or tell.</w:t>
       </w:r>
     </w:p>
     <w:p>
       <w:pPr>
-        <w:spacing w:before="40" w:after="120"/>
+        <w:spacing w:before="40" w:after="60"/>
         <w:ind w:left="576"/>
       </w:pPr>
-      <w:r/>
       <w:r>
         <w:rPr>
           <w:i/>
@@ -1258,7 +2010,687 @@
           <w:color w:val="30608C"/>
           <w:sz w:val="21"/>
         </w:rPr>
-        <w:t>Welches Foto passt? (Which photo fits / matches?) / Das Foto ist scharf. (The photo is sharp / in focus.) / Ich sehe drei Fotos. (I see three photos.)</w:t>
+        <w:t>Was sagen die Personen?</w:t>
+      </w:r>
+      <w:r>
+        <w:rPr>
+          <w:i/>
+          <w:color w:val="404040"/>
+          <w:sz w:val="21"/>
+        </w:rPr>
+        <w:t xml:space="preserve"> (What are the people saying?)</w:t>
+      </w:r>
+    </w:p>
+    <w:p>
+      <w:pPr>
+        <w:spacing w:before="0" w:after="120"/>
+        <w:ind w:left="576"/>
+      </w:pPr>
+      <w:r>
+        <w:rPr>
+          <w:i/>
+          <w:color w:val="30608C"/>
+          <w:sz w:val="21"/>
+        </w:rPr>
+        <w:t xml:space="preserve">› </w:t>
+      </w:r>
+      <w:r>
+        <w:rPr>
+          <w:i/>
+          <w:color w:val="30608C"/>
+          <w:sz w:val="21"/>
+        </w:rPr>
+        <w:t>Er sagt kurz „Nein“.</w:t>
+      </w:r>
+      <w:r>
+        <w:rPr>
+          <w:i/>
+          <w:color w:val="404040"/>
+          <w:sz w:val="21"/>
+        </w:rPr>
+        <w:t xml:space="preserve"> (He briefly says “no”.)</w:t>
+      </w:r>
+    </w:p>
+    <w:p>
+      <w:pPr>
+        <w:spacing w:before="0" w:after="0"/>
+      </w:pPr>
+    </w:p>
+    <w:p>
+      <w:pPr>
+        <w:spacing w:after="120"/>
+      </w:pPr>
+      <w:r>
+        <w:rPr>
+          <w:b/>
+        </w:rPr>
+        <w:t>die Person</w:t>
+      </w:r>
+      <w:r>
+        <w:t xml:space="preserve"> /pɛʁˈzoːn/</w:t>
+      </w:r>
+    </w:p>
+    <w:p>
+      <w:pPr>
+        <w:spacing w:after="80"/>
+        <w:ind w:left="576"/>
+      </w:pPr>
+      <w:r>
+        <w:t>Feminine singular: person (pl. Personen).</w:t>
+      </w:r>
+    </w:p>
+    <w:p>
+      <w:pPr>
+        <w:spacing w:before="40" w:after="60"/>
+        <w:ind w:left="576"/>
+      </w:pPr>
+      <w:r>
+        <w:rPr>
+          <w:i/>
+          <w:color w:val="30608C"/>
+          <w:sz w:val="21"/>
+        </w:rPr>
+        <w:t xml:space="preserve">› </w:t>
+      </w:r>
+      <w:r>
+        <w:rPr>
+          <w:i/>
+          <w:color w:val="30608C"/>
+          <w:sz w:val="21"/>
+        </w:rPr>
+        <w:t>Viele Personen warten.</w:t>
+      </w:r>
+      <w:r>
+        <w:rPr>
+          <w:i/>
+          <w:color w:val="404040"/>
+          <w:sz w:val="21"/>
+        </w:rPr>
+        <w:t xml:space="preserve"> (Many people are waiting.)</w:t>
+      </w:r>
+    </w:p>
+    <w:p>
+      <w:pPr>
+        <w:spacing w:before="0" w:after="120"/>
+        <w:ind w:left="576"/>
+      </w:pPr>
+      <w:r>
+        <w:rPr>
+          <w:i/>
+          <w:color w:val="30608C"/>
+          <w:sz w:val="21"/>
+        </w:rPr>
+        <w:t xml:space="preserve">› </w:t>
+      </w:r>
+      <w:r>
+        <w:rPr>
+          <w:i/>
+          <w:color w:val="30608C"/>
+          <w:sz w:val="21"/>
+        </w:rPr>
+        <w:t>Zwei Kinder hören das Gespräch.</w:t>
+      </w:r>
+      <w:r>
+        <w:rPr>
+          <w:i/>
+          <w:color w:val="404040"/>
+          <w:sz w:val="21"/>
+        </w:rPr>
+        <w:t xml:space="preserve"> (Two children listen to the dialogue.)</w:t>
+      </w:r>
+    </w:p>
+    <w:p>
+      <w:pPr>
+        <w:spacing w:before="0" w:after="0"/>
+      </w:pPr>
+    </w:p>
+    <w:p>
+      <w:pPr>
+        <w:spacing w:after="120"/>
+      </w:pPr>
+      <w:r>
+        <w:rPr>
+          <w:b/>
+        </w:rPr>
+        <w:t>was</w:t>
+      </w:r>
+      <w:r>
+        <w:t xml:space="preserve"> /vas/</w:t>
+      </w:r>
+    </w:p>
+    <w:p>
+      <w:pPr>
+        <w:spacing w:after="80"/>
+        <w:ind w:left="576"/>
+      </w:pPr>
+      <w:r>
+        <w:t>Interrogative “what” (Was …?).</w:t>
+      </w:r>
+    </w:p>
+    <w:p>
+      <w:pPr>
+        <w:spacing w:before="40" w:after="60"/>
+        <w:ind w:left="576"/>
+      </w:pPr>
+      <w:r>
+        <w:rPr>
+          <w:i/>
+          <w:color w:val="30608C"/>
+          <w:sz w:val="21"/>
+        </w:rPr>
+        <w:t xml:space="preserve">› </w:t>
+      </w:r>
+      <w:r>
+        <w:rPr>
+          <w:i/>
+          <w:color w:val="30608C"/>
+          <w:sz w:val="21"/>
+        </w:rPr>
+        <w:t>Was sagen die Personen?</w:t>
+      </w:r>
+      <w:r>
+        <w:rPr>
+          <w:i/>
+          <w:color w:val="404040"/>
+          <w:sz w:val="21"/>
+        </w:rPr>
+        <w:t xml:space="preserve"> (What are the people saying?)</w:t>
+      </w:r>
+    </w:p>
+    <w:p>
+      <w:pPr>
+        <w:spacing w:before="0" w:after="120"/>
+        <w:ind w:left="576"/>
+      </w:pPr>
+      <w:r>
+        <w:rPr>
+          <w:i/>
+          <w:color w:val="30608C"/>
+          <w:sz w:val="21"/>
+        </w:rPr>
+        <w:t xml:space="preserve">› </w:t>
+      </w:r>
+      <w:r>
+        <w:rPr>
+          <w:i/>
+          <w:color w:val="30608C"/>
+          <w:sz w:val="21"/>
+        </w:rPr>
+        <w:t>Was trinken die Kinder?</w:t>
+      </w:r>
+      <w:r>
+        <w:rPr>
+          <w:i/>
+          <w:color w:val="404040"/>
+          <w:sz w:val="21"/>
+        </w:rPr>
+        <w:t xml:space="preserve"> (What are the children drinking?)</w:t>
+      </w:r>
+    </w:p>
+    <w:p>
+      <w:pPr>
+        <w:spacing w:before="0" w:after="0"/>
+      </w:pPr>
+    </w:p>
+    <w:p>
+      <w:pPr>
+        <w:spacing w:after="120"/>
+      </w:pPr>
+      <w:r>
+        <w:rPr>
+          <w:b/>
+        </w:rPr>
+        <w:t>passen</w:t>
+      </w:r>
+      <w:r>
+        <w:t xml:space="preserve"> /ˈpasən/</w:t>
+      </w:r>
+    </w:p>
+    <w:p>
+      <w:pPr>
+        <w:spacing w:after="80"/>
+        <w:ind w:left="576"/>
+      </w:pPr>
+      <w:r>
+        <w:t>To fit; match; suit.</w:t>
+      </w:r>
+    </w:p>
+    <w:p>
+      <w:pPr>
+        <w:spacing w:before="40" w:after="60"/>
+        <w:ind w:left="576"/>
+      </w:pPr>
+      <w:r>
+        <w:rPr>
+          <w:i/>
+          <w:color w:val="30608C"/>
+          <w:sz w:val="21"/>
+        </w:rPr>
+        <w:t xml:space="preserve">› </w:t>
+      </w:r>
+      <w:r>
+        <w:rPr>
+          <w:i/>
+          <w:color w:val="30608C"/>
+          <w:sz w:val="21"/>
+        </w:rPr>
+        <w:t>Welches Foto passt? (Which photo fits</w:t>
+      </w:r>
+    </w:p>
+    <w:p>
+      <w:pPr>
+        <w:spacing w:before="0" w:after="60"/>
+        <w:ind w:left="576"/>
+      </w:pPr>
+      <w:r>
+        <w:rPr>
+          <w:i/>
+          <w:color w:val="30608C"/>
+          <w:sz w:val="21"/>
+        </w:rPr>
+        <w:t xml:space="preserve">› </w:t>
+      </w:r>
+      <w:r>
+        <w:rPr>
+          <w:i/>
+          <w:color w:val="30608C"/>
+          <w:sz w:val="21"/>
+        </w:rPr>
+        <w:t>matches?)</w:t>
+      </w:r>
+    </w:p>
+    <w:p>
+      <w:pPr>
+        <w:spacing w:before="0" w:after="60"/>
+        <w:ind w:left="576"/>
+      </w:pPr>
+      <w:r>
+        <w:rPr>
+          <w:i/>
+          <w:color w:val="30608C"/>
+          <w:sz w:val="21"/>
+        </w:rPr>
+        <w:t xml:space="preserve">› </w:t>
+      </w:r>
+      <w:r>
+        <w:rPr>
+          <w:i/>
+          <w:color w:val="30608C"/>
+          <w:sz w:val="21"/>
+        </w:rPr>
+        <w:t>Das Bild passt zu diesem Text. (The picture goes with</w:t>
+      </w:r>
+    </w:p>
+    <w:p>
+      <w:pPr>
+        <w:spacing w:before="0" w:after="60"/>
+        <w:ind w:left="576"/>
+      </w:pPr>
+      <w:r>
+        <w:rPr>
+          <w:i/>
+          <w:color w:val="30608C"/>
+          <w:sz w:val="21"/>
+        </w:rPr>
+        <w:t xml:space="preserve">› </w:t>
+      </w:r>
+      <w:r>
+        <w:rPr>
+          <w:i/>
+          <w:color w:val="30608C"/>
+          <w:sz w:val="21"/>
+        </w:rPr>
+        <w:t>fits this text passage.)</w:t>
+      </w:r>
+    </w:p>
+    <w:p>
+      <w:pPr>
+        <w:spacing w:before="0" w:after="60"/>
+        <w:ind w:left="576"/>
+      </w:pPr>
+      <w:r>
+        <w:rPr>
+          <w:i/>
+          <w:color w:val="30608C"/>
+          <w:sz w:val="21"/>
+        </w:rPr>
+        <w:t xml:space="preserve">› </w:t>
+      </w:r>
+      <w:r>
+        <w:rPr>
+          <w:i/>
+          <w:color w:val="30608C"/>
+          <w:sz w:val="21"/>
+        </w:rPr>
+        <w:t>Das zweite Foto passt nicht. (The second photo does not fit</w:t>
+      </w:r>
+    </w:p>
+    <w:p>
+      <w:pPr>
+        <w:spacing w:before="0" w:after="120"/>
+        <w:ind w:left="576"/>
+      </w:pPr>
+      <w:r>
+        <w:rPr>
+          <w:i/>
+          <w:color w:val="30608C"/>
+          <w:sz w:val="21"/>
+        </w:rPr>
+        <w:t xml:space="preserve">› </w:t>
+      </w:r>
+      <w:r>
+        <w:rPr>
+          <w:i/>
+          <w:color w:val="30608C"/>
+          <w:sz w:val="21"/>
+        </w:rPr>
+        <w:t>is wrong.)</w:t>
+      </w:r>
+    </w:p>
+    <w:p>
+      <w:pPr>
+        <w:spacing w:before="0" w:after="0"/>
+      </w:pPr>
+    </w:p>
+    <w:p>
+      <w:pPr>
+        <w:spacing w:after="120"/>
+      </w:pPr>
+      <w:r>
+        <w:rPr>
+          <w:b/>
+        </w:rPr>
+        <w:t>welcher · welche · welches</w:t>
+      </w:r>
+      <w:r>
+        <w:t xml:space="preserve"> /ˈvɛlçɐ | ˈvɛlçə | ˈvɛlçəs/</w:t>
+      </w:r>
+    </w:p>
+    <w:p>
+      <w:pPr>
+        <w:spacing w:after="80"/>
+        <w:ind w:left="576"/>
+      </w:pPr>
+      <w:r>
+        <w:t>Which (pick by gender: m./f./n.).</w:t>
+      </w:r>
+    </w:p>
+    <w:p>
+      <w:pPr>
+        <w:spacing w:before="40" w:after="60"/>
+        <w:ind w:left="576"/>
+      </w:pPr>
+      <w:r>
+        <w:rPr>
+          <w:i/>
+          <w:color w:val="30608C"/>
+          <w:sz w:val="21"/>
+        </w:rPr>
+        <w:t xml:space="preserve">› </w:t>
+      </w:r>
+      <w:r>
+        <w:rPr>
+          <w:i/>
+          <w:color w:val="30608C"/>
+          <w:sz w:val="21"/>
+        </w:rPr>
+        <w:t>Welches Foto passt? (Which photo fits</w:t>
+      </w:r>
+    </w:p>
+    <w:p>
+      <w:pPr>
+        <w:spacing w:before="0" w:after="60"/>
+        <w:ind w:left="576"/>
+      </w:pPr>
+      <w:r>
+        <w:rPr>
+          <w:i/>
+          <w:color w:val="30608C"/>
+          <w:sz w:val="21"/>
+        </w:rPr>
+        <w:t xml:space="preserve">› </w:t>
+      </w:r>
+      <w:r>
+        <w:rPr>
+          <w:i/>
+          <w:color w:val="30608C"/>
+          <w:sz w:val="21"/>
+        </w:rPr>
+        <w:t>matches?)</w:t>
+      </w:r>
+    </w:p>
+    <w:p>
+      <w:pPr>
+        <w:spacing w:before="0" w:after="60"/>
+        <w:ind w:left="576"/>
+      </w:pPr>
+      <w:r>
+        <w:rPr>
+          <w:i/>
+          <w:color w:val="30608C"/>
+          <w:sz w:val="21"/>
+        </w:rPr>
+        <w:t xml:space="preserve">› </w:t>
+      </w:r>
+      <w:r>
+        <w:rPr>
+          <w:i/>
+          <w:color w:val="30608C"/>
+          <w:sz w:val="21"/>
+        </w:rPr>
+        <w:t>Welche Farbe ist das? (What</w:t>
+      </w:r>
+    </w:p>
+    <w:p>
+      <w:pPr>
+        <w:spacing w:before="0" w:after="60"/>
+        <w:ind w:left="576"/>
+      </w:pPr>
+      <w:r>
+        <w:rPr>
+          <w:i/>
+          <w:color w:val="30608C"/>
+          <w:sz w:val="21"/>
+        </w:rPr>
+        <w:t xml:space="preserve">› </w:t>
+      </w:r>
+      <w:r>
+        <w:rPr>
+          <w:i/>
+          <w:color w:val="30608C"/>
+          <w:sz w:val="21"/>
+        </w:rPr>
+        <w:t>which color is that?)</w:t>
+      </w:r>
+    </w:p>
+    <w:p>
+      <w:pPr>
+        <w:spacing w:before="0" w:after="60"/>
+        <w:ind w:left="576"/>
+      </w:pPr>
+      <w:r>
+        <w:rPr>
+          <w:i/>
+          <w:color w:val="30608C"/>
+          <w:sz w:val="21"/>
+        </w:rPr>
+        <w:t xml:space="preserve">› </w:t>
+      </w:r>
+      <w:r>
+        <w:rPr>
+          <w:i/>
+          <w:color w:val="30608C"/>
+          <w:sz w:val="21"/>
+        </w:rPr>
+        <w:t>Welche Antwort passt? (Which answer fits</w:t>
+      </w:r>
+    </w:p>
+    <w:p>
+      <w:pPr>
+        <w:spacing w:before="0" w:after="120"/>
+        <w:ind w:left="576"/>
+      </w:pPr>
+      <w:r>
+        <w:rPr>
+          <w:i/>
+          <w:color w:val="30608C"/>
+          <w:sz w:val="21"/>
+        </w:rPr>
+        <w:t xml:space="preserve">› </w:t>
+      </w:r>
+      <w:r>
+        <w:rPr>
+          <w:i/>
+          <w:color w:val="30608C"/>
+          <w:sz w:val="21"/>
+        </w:rPr>
+        <w:t>is correct?)</w:t>
+      </w:r>
+    </w:p>
+    <w:p>
+      <w:pPr>
+        <w:spacing w:before="0" w:after="0"/>
+      </w:pPr>
+    </w:p>
+    <w:p>
+      <w:pPr>
+        <w:spacing w:after="120"/>
+      </w:pPr>
+      <w:r>
+        <w:rPr>
+          <w:b/>
+        </w:rPr>
+        <w:t>das Foto</w:t>
+      </w:r>
+      <w:r>
+        <w:t xml:space="preserve"> /ˈfoːto/</w:t>
+      </w:r>
+    </w:p>
+    <w:p>
+      <w:pPr>
+        <w:spacing w:after="80"/>
+        <w:ind w:left="576"/>
+      </w:pPr>
+      <w:r>
+        <w:t>Photo; picture (neuter; pl. Fotos).</w:t>
+      </w:r>
+    </w:p>
+    <w:p>
+      <w:pPr>
+        <w:spacing w:before="40" w:after="60"/>
+        <w:ind w:left="576"/>
+      </w:pPr>
+      <w:r>
+        <w:rPr>
+          <w:i/>
+          <w:color w:val="30608C"/>
+          <w:sz w:val="21"/>
+        </w:rPr>
+        <w:t xml:space="preserve">› </w:t>
+      </w:r>
+      <w:r>
+        <w:rPr>
+          <w:i/>
+          <w:color w:val="30608C"/>
+          <w:sz w:val="21"/>
+        </w:rPr>
+        <w:t>Welches Foto passt? (Which photo fits</w:t>
+      </w:r>
+    </w:p>
+    <w:p>
+      <w:pPr>
+        <w:spacing w:before="0" w:after="60"/>
+        <w:ind w:left="576"/>
+      </w:pPr>
+      <w:r>
+        <w:rPr>
+          <w:i/>
+          <w:color w:val="30608C"/>
+          <w:sz w:val="21"/>
+        </w:rPr>
+        <w:t xml:space="preserve">› </w:t>
+      </w:r>
+      <w:r>
+        <w:rPr>
+          <w:i/>
+          <w:color w:val="30608C"/>
+          <w:sz w:val="21"/>
+        </w:rPr>
+        <w:t>matches?)</w:t>
+      </w:r>
+    </w:p>
+    <w:p>
+      <w:pPr>
+        <w:spacing w:before="0" w:after="60"/>
+        <w:ind w:left="576"/>
+      </w:pPr>
+      <w:r>
+        <w:rPr>
+          <w:i/>
+          <w:color w:val="30608C"/>
+          <w:sz w:val="21"/>
+        </w:rPr>
+        <w:t xml:space="preserve">› </w:t>
+      </w:r>
+      <w:r>
+        <w:rPr>
+          <w:i/>
+          <w:color w:val="30608C"/>
+          <w:sz w:val="21"/>
+        </w:rPr>
+        <w:t>Das Foto ist scharf. (The photo is sharp</w:t>
+      </w:r>
+    </w:p>
+    <w:p>
+      <w:pPr>
+        <w:spacing w:before="0" w:after="60"/>
+        <w:ind w:left="576"/>
+      </w:pPr>
+      <w:r>
+        <w:rPr>
+          <w:i/>
+          <w:color w:val="30608C"/>
+          <w:sz w:val="21"/>
+        </w:rPr>
+        <w:t xml:space="preserve">› </w:t>
+      </w:r>
+      <w:r>
+        <w:rPr>
+          <w:i/>
+          <w:color w:val="30608C"/>
+          <w:sz w:val="21"/>
+        </w:rPr>
+        <w:t>in focus.)</w:t>
+      </w:r>
+    </w:p>
+    <w:p>
+      <w:pPr>
+        <w:spacing w:before="0" w:after="120"/>
+        <w:ind w:left="576"/>
+      </w:pPr>
+      <w:r>
+        <w:rPr>
+          <w:i/>
+          <w:color w:val="30608C"/>
+          <w:sz w:val="21"/>
+        </w:rPr>
+        <w:t xml:space="preserve">› </w:t>
+      </w:r>
+      <w:r>
+        <w:rPr>
+          <w:i/>
+          <w:color w:val="30608C"/>
+          <w:sz w:val="21"/>
+        </w:rPr>
+        <w:t>Ich sehe drei Fotos.</w:t>
+      </w:r>
+      <w:r>
+        <w:rPr>
+          <w:i/>
+          <w:color w:val="404040"/>
+          <w:sz w:val="21"/>
+        </w:rPr>
+        <w:t xml:space="preserve"> (I see three photos.)</w:t>
       </w:r>
     </w:p>
     <w:p>
@@ -1319,10 +2751,9 @@
     </w:p>
     <w:p>
       <w:pPr>
-        <w:spacing w:before="40" w:after="120"/>
+        <w:spacing w:before="40" w:after="60"/>
         <w:ind w:left="576"/>
       </w:pPr>
-      <w:r/>
       <w:r>
         <w:rPr>
           <w:i/>
@@ -1337,43 +2768,14 @@
           <w:color w:val="30608C"/>
           <w:sz w:val="21"/>
         </w:rPr>
-        <w:t>Kreuzen Sie die richtige Lösung an. (Please tick the correct answer / solution.) / Kreuzen Sie an, was stimmt. (Tick / mark what is correct.)</w:t>
+        <w:t>Kreuzen Sie die richtige Lösung an. (Please tick the correct answer</w:t>
       </w:r>
     </w:p>
     <w:p>
       <w:pPr>
-        <w:spacing w:before="0" w:after="0"/>
-      </w:pPr>
-    </w:p>
-    <w:p>
-      <w:pPr>
-        <w:spacing w:after="120"/>
-      </w:pPr>
-      <w:r>
-        <w:rPr>
-          <w:b/>
-        </w:rPr>
-        <w:t>hören</w:t>
-      </w:r>
-      <w:r>
-        <w:t xml:space="preserve"> /ˈhøːʁən/</w:t>
-      </w:r>
-    </w:p>
-    <w:p>
-      <w:pPr>
-        <w:spacing w:after="80"/>
+        <w:spacing w:before="0" w:after="60"/>
         <w:ind w:left="576"/>
       </w:pPr>
-      <w:r>
-        <w:t>To hear; listen to (+ acc.).</w:t>
-      </w:r>
-    </w:p>
-    <w:p>
-      <w:pPr>
-        <w:spacing w:before="40" w:after="120"/>
-        <w:ind w:left="576"/>
-      </w:pPr>
-      <w:r/>
       <w:r>
         <w:rPr>
           <w:i/>
@@ -1388,43 +2790,14 @@
           <w:color w:val="30608C"/>
           <w:sz w:val="21"/>
         </w:rPr>
-        <w:t>Hören Sie das Gespräch. (Listen to the dialogue [polite / formal “you”].) / Ich höre morgens Radio. (I listen to the radio in the mornings.)</w:t>
+        <w:t>solution.)</w:t>
       </w:r>
     </w:p>
     <w:p>
       <w:pPr>
-        <w:spacing w:before="0" w:after="0"/>
-      </w:pPr>
-    </w:p>
-    <w:p>
-      <w:pPr>
-        <w:spacing w:after="120"/>
-      </w:pPr>
-      <w:r>
-        <w:rPr>
-          <w:b/>
-        </w:rPr>
-        <w:t>das Gespräch</w:t>
-      </w:r>
-      <w:r>
-        <w:t xml:space="preserve"> /ɡəˈʃpʁɛːç/</w:t>
-      </w:r>
-    </w:p>
-    <w:p>
-      <w:pPr>
-        <w:spacing w:after="80"/>
+        <w:spacing w:before="0" w:after="60"/>
         <w:ind w:left="576"/>
       </w:pPr>
-      <w:r>
-        <w:t>Conversation; spoken dialogue.</w:t>
-      </w:r>
-    </w:p>
-    <w:p>
-      <w:pPr>
-        <w:spacing w:before="40" w:after="120"/>
-        <w:ind w:left="576"/>
-      </w:pPr>
-      <w:r/>
       <w:r>
         <w:rPr>
           <w:i/>
@@ -1439,43 +2812,14 @@
           <w:color w:val="30608C"/>
           <w:sz w:val="21"/>
         </w:rPr>
-        <w:t>Das Gespräch ist kurz. (The dialogue is short.) / Hören Sie bitte noch einmal das Gespräch. (Please listen to the dialogue one more time.)</w:t>
+        <w:t>Kreuzen Sie an, was stimmt. (Tick</w:t>
       </w:r>
     </w:p>
     <w:p>
       <w:pPr>
-        <w:spacing w:before="0" w:after="0"/>
-      </w:pPr>
-    </w:p>
-    <w:p>
-      <w:pPr>
-        <w:spacing w:after="120"/>
-      </w:pPr>
-      <w:r>
-        <w:rPr>
-          <w:b/>
-        </w:rPr>
-        <w:t>neu</w:t>
-      </w:r>
-      <w:r>
-        <w:t xml:space="preserve"> /nɔʏ/</w:t>
-      </w:r>
-    </w:p>
-    <w:p>
-      <w:pPr>
-        <w:spacing w:after="80"/>
+        <w:spacing w:before="0" w:after="120"/>
         <w:ind w:left="576"/>
       </w:pPr>
-      <w:r>
-        <w:t>New (opposite alt); before a noun, add an ending.</w:t>
-      </w:r>
-    </w:p>
-    <w:p>
-      <w:pPr>
-        <w:spacing w:before="40" w:after="120"/>
-        <w:ind w:left="576"/>
-      </w:pPr>
-      <w:r/>
       <w:r>
         <w:rPr>
           <w:i/>
@@ -1490,7 +2834,285 @@
           <w:color w:val="30608C"/>
           <w:sz w:val="21"/>
         </w:rPr>
-        <w:t>der neue Praktikant (the new intern) / Ein neues Auto steht da. (A new car is parked there.)</w:t>
+        <w:t>mark what is correct.)</w:t>
+      </w:r>
+    </w:p>
+    <w:p>
+      <w:pPr>
+        <w:spacing w:before="0" w:after="0"/>
+      </w:pPr>
+    </w:p>
+    <w:p>
+      <w:pPr>
+        <w:spacing w:after="120"/>
+      </w:pPr>
+      <w:r>
+        <w:rPr>
+          <w:b/>
+        </w:rPr>
+        <w:t>hören</w:t>
+      </w:r>
+      <w:r>
+        <w:t xml:space="preserve"> /ˈhøːʁən/</w:t>
+      </w:r>
+    </w:p>
+    <w:p>
+      <w:pPr>
+        <w:spacing w:after="80"/>
+        <w:ind w:left="576"/>
+      </w:pPr>
+      <w:r>
+        <w:t>To hear; listen to (+ acc.).</w:t>
+      </w:r>
+    </w:p>
+    <w:p>
+      <w:pPr>
+        <w:spacing w:before="40" w:after="60"/>
+        <w:ind w:left="576"/>
+      </w:pPr>
+      <w:r>
+        <w:rPr>
+          <w:i/>
+          <w:color w:val="30608C"/>
+          <w:sz w:val="21"/>
+        </w:rPr>
+        <w:t xml:space="preserve">› </w:t>
+      </w:r>
+      <w:r>
+        <w:rPr>
+          <w:i/>
+          <w:color w:val="30608C"/>
+          <w:sz w:val="21"/>
+        </w:rPr>
+        <w:t>Hören Sie das Gespräch. (Listen to the dialogue [polite</w:t>
+      </w:r>
+    </w:p>
+    <w:p>
+      <w:pPr>
+        <w:spacing w:before="0" w:after="60"/>
+        <w:ind w:left="576"/>
+      </w:pPr>
+      <w:r>
+        <w:rPr>
+          <w:i/>
+          <w:color w:val="30608C"/>
+          <w:sz w:val="21"/>
+        </w:rPr>
+        <w:t xml:space="preserve">› </w:t>
+      </w:r>
+      <w:r>
+        <w:rPr>
+          <w:i/>
+          <w:color w:val="30608C"/>
+          <w:sz w:val="21"/>
+        </w:rPr>
+        <w:t>formal “you”].)</w:t>
+      </w:r>
+    </w:p>
+    <w:p>
+      <w:pPr>
+        <w:spacing w:before="0" w:after="120"/>
+        <w:ind w:left="576"/>
+      </w:pPr>
+      <w:r>
+        <w:rPr>
+          <w:i/>
+          <w:color w:val="30608C"/>
+          <w:sz w:val="21"/>
+        </w:rPr>
+        <w:t xml:space="preserve">› </w:t>
+      </w:r>
+      <w:r>
+        <w:rPr>
+          <w:i/>
+          <w:color w:val="30608C"/>
+          <w:sz w:val="21"/>
+        </w:rPr>
+        <w:t>Ich höre morgens Radio.</w:t>
+      </w:r>
+      <w:r>
+        <w:rPr>
+          <w:i/>
+          <w:color w:val="404040"/>
+          <w:sz w:val="21"/>
+        </w:rPr>
+        <w:t xml:space="preserve"> (I listen to the radio in the mornings.)</w:t>
+      </w:r>
+    </w:p>
+    <w:p>
+      <w:pPr>
+        <w:spacing w:before="0" w:after="0"/>
+      </w:pPr>
+    </w:p>
+    <w:p>
+      <w:pPr>
+        <w:spacing w:after="120"/>
+      </w:pPr>
+      <w:r>
+        <w:rPr>
+          <w:b/>
+        </w:rPr>
+        <w:t>das Gespräch</w:t>
+      </w:r>
+      <w:r>
+        <w:t xml:space="preserve"> /ɡəˈʃpʁɛːç/</w:t>
+      </w:r>
+    </w:p>
+    <w:p>
+      <w:pPr>
+        <w:spacing w:after="80"/>
+        <w:ind w:left="576"/>
+      </w:pPr>
+      <w:r>
+        <w:t>Conversation; spoken dialogue.</w:t>
+      </w:r>
+    </w:p>
+    <w:p>
+      <w:pPr>
+        <w:spacing w:before="40" w:after="60"/>
+        <w:ind w:left="576"/>
+      </w:pPr>
+      <w:r>
+        <w:rPr>
+          <w:i/>
+          <w:color w:val="30608C"/>
+          <w:sz w:val="21"/>
+        </w:rPr>
+        <w:t xml:space="preserve">› </w:t>
+      </w:r>
+      <w:r>
+        <w:rPr>
+          <w:i/>
+          <w:color w:val="30608C"/>
+          <w:sz w:val="21"/>
+        </w:rPr>
+        <w:t>Das Gespräch ist kurz.</w:t>
+      </w:r>
+      <w:r>
+        <w:rPr>
+          <w:i/>
+          <w:color w:val="404040"/>
+          <w:sz w:val="21"/>
+        </w:rPr>
+        <w:t xml:space="preserve"> (The dialogue is short.)</w:t>
+      </w:r>
+    </w:p>
+    <w:p>
+      <w:pPr>
+        <w:spacing w:before="0" w:after="120"/>
+        <w:ind w:left="576"/>
+      </w:pPr>
+      <w:r>
+        <w:rPr>
+          <w:i/>
+          <w:color w:val="30608C"/>
+          <w:sz w:val="21"/>
+        </w:rPr>
+        <w:t xml:space="preserve">› </w:t>
+      </w:r>
+      <w:r>
+        <w:rPr>
+          <w:i/>
+          <w:color w:val="30608C"/>
+          <w:sz w:val="21"/>
+        </w:rPr>
+        <w:t>Hören Sie bitte noch einmal das Gespräch.</w:t>
+      </w:r>
+      <w:r>
+        <w:rPr>
+          <w:i/>
+          <w:color w:val="404040"/>
+          <w:sz w:val="21"/>
+        </w:rPr>
+        <w:t xml:space="preserve"> (Please listen to the dialogue one more time.)</w:t>
+      </w:r>
+    </w:p>
+    <w:p>
+      <w:pPr>
+        <w:spacing w:before="0" w:after="0"/>
+      </w:pPr>
+    </w:p>
+    <w:p>
+      <w:pPr>
+        <w:spacing w:after="120"/>
+      </w:pPr>
+      <w:r>
+        <w:rPr>
+          <w:b/>
+        </w:rPr>
+        <w:t>neu</w:t>
+      </w:r>
+      <w:r>
+        <w:t xml:space="preserve"> /nɔʏ/</w:t>
+      </w:r>
+    </w:p>
+    <w:p>
+      <w:pPr>
+        <w:spacing w:after="80"/>
+        <w:ind w:left="576"/>
+      </w:pPr>
+      <w:r>
+        <w:t>New (opposite alt); before a noun, add an ending.</w:t>
+      </w:r>
+    </w:p>
+    <w:p>
+      <w:pPr>
+        <w:spacing w:before="40" w:after="60"/>
+        <w:ind w:left="576"/>
+      </w:pPr>
+      <w:r>
+        <w:rPr>
+          <w:i/>
+          <w:color w:val="30608C"/>
+          <w:sz w:val="21"/>
+        </w:rPr>
+        <w:t xml:space="preserve">› </w:t>
+      </w:r>
+      <w:r>
+        <w:rPr>
+          <w:i/>
+          <w:color w:val="30608C"/>
+          <w:sz w:val="21"/>
+        </w:rPr>
+        <w:t>der neue Praktikant</w:t>
+      </w:r>
+      <w:r>
+        <w:rPr>
+          <w:i/>
+          <w:color w:val="404040"/>
+          <w:sz w:val="21"/>
+        </w:rPr>
+        <w:t xml:space="preserve"> (the new intern)</w:t>
+      </w:r>
+    </w:p>
+    <w:p>
+      <w:pPr>
+        <w:spacing w:before="0" w:after="120"/>
+        <w:ind w:left="576"/>
+      </w:pPr>
+      <w:r>
+        <w:rPr>
+          <w:i/>
+          <w:color w:val="30608C"/>
+          <w:sz w:val="21"/>
+        </w:rPr>
+        <w:t xml:space="preserve">› </w:t>
+      </w:r>
+      <w:r>
+        <w:rPr>
+          <w:i/>
+          <w:color w:val="30608C"/>
+          <w:sz w:val="21"/>
+        </w:rPr>
+        <w:t>Ein neues Auto steht da.</w:t>
+      </w:r>
+      <w:r>
+        <w:rPr>
+          <w:i/>
+          <w:color w:val="404040"/>
+          <w:sz w:val="21"/>
+        </w:rPr>
+        <w:t xml:space="preserve"> (A new car is parked there.)</w:t>
       </w:r>
     </w:p>
     <w:p>
@@ -1537,10 +3159,9 @@
     </w:p>
     <w:p>
       <w:pPr>
-        <w:spacing w:before="40" w:after="120"/>
+        <w:spacing w:before="40" w:after="60"/>
         <w:ind w:left="576"/>
       </w:pPr>
-      <w:r/>
       <w:r>
         <w:rPr>
           <w:i/>
@@ -1555,43 +3176,22 @@
           <w:color w:val="30608C"/>
           <w:sz w:val="21"/>
         </w:rPr>
-        <w:t>Ich bin der neue Praktikant. (I'm the new intern.) / Er ist Arzt. (He's a doctor.) / Ist alles richtig? (Is everything correct?) / Und ich bin Frau Lange, die Sekretärin. (And I am Ms. Lange, the secretary.) / Wir sind müde. (We're tired.)</w:t>
+        <w:t>Ich bin der neue Praktikant.</w:t>
+      </w:r>
+      <w:r>
+        <w:rPr>
+          <w:i/>
+          <w:color w:val="404040"/>
+          <w:sz w:val="21"/>
+        </w:rPr>
+        <w:t xml:space="preserve"> (I'm the new intern.)</w:t>
       </w:r>
     </w:p>
     <w:p>
       <w:pPr>
-        <w:spacing w:before="0" w:after="0"/>
-      </w:pPr>
-    </w:p>
-    <w:p>
-      <w:pPr>
-        <w:spacing w:after="120"/>
-      </w:pPr>
-      <w:r>
-        <w:rPr>
-          <w:b/>
-        </w:rPr>
-        <w:t>der Praktikant</w:t>
-      </w:r>
-      <w:r>
-        <w:t xml:space="preserve"> /pʁaktiˈkant/</w:t>
-      </w:r>
-    </w:p>
-    <w:p>
-      <w:pPr>
-        <w:spacing w:after="80"/>
+        <w:spacing w:before="0" w:after="60"/>
         <w:ind w:left="576"/>
       </w:pPr>
-      <w:r>
-        <w:t>Intern; Praktikantin is the feminine form.</w:t>
-      </w:r>
-    </w:p>
-    <w:p>
-      <w:pPr>
-        <w:spacing w:before="40" w:after="120"/>
-        <w:ind w:left="576"/>
-      </w:pPr>
-      <w:r/>
       <w:r>
         <w:rPr>
           <w:i/>
@@ -1606,7 +3206,253 @@
           <w:color w:val="30608C"/>
           <w:sz w:val="21"/>
         </w:rPr>
-        <w:t>Ich mache ein Praktikum in Deutschland. (I am doing an internship in Germany.) / Er ist Praktikant bei dieser Firma. (He is an intern at this company.) / Anna ist Praktikantin. (Anna is an intern [female form].) / Ich bin der neue Praktikant. (I'm the new intern.)</w:t>
+        <w:t>Er ist Arzt.</w:t>
+      </w:r>
+      <w:r>
+        <w:rPr>
+          <w:i/>
+          <w:color w:val="404040"/>
+          <w:sz w:val="21"/>
+        </w:rPr>
+        <w:t xml:space="preserve"> (He's a doctor.)</w:t>
+      </w:r>
+    </w:p>
+    <w:p>
+      <w:pPr>
+        <w:spacing w:before="0" w:after="60"/>
+        <w:ind w:left="576"/>
+      </w:pPr>
+      <w:r>
+        <w:rPr>
+          <w:i/>
+          <w:color w:val="30608C"/>
+          <w:sz w:val="21"/>
+        </w:rPr>
+        <w:t xml:space="preserve">› </w:t>
+      </w:r>
+      <w:r>
+        <w:rPr>
+          <w:i/>
+          <w:color w:val="30608C"/>
+          <w:sz w:val="21"/>
+        </w:rPr>
+        <w:t>Ist alles richtig?</w:t>
+      </w:r>
+      <w:r>
+        <w:rPr>
+          <w:i/>
+          <w:color w:val="404040"/>
+          <w:sz w:val="21"/>
+        </w:rPr>
+        <w:t xml:space="preserve"> (Is everything correct?)</w:t>
+      </w:r>
+    </w:p>
+    <w:p>
+      <w:pPr>
+        <w:spacing w:before="0" w:after="60"/>
+        <w:ind w:left="576"/>
+      </w:pPr>
+      <w:r>
+        <w:rPr>
+          <w:i/>
+          <w:color w:val="30608C"/>
+          <w:sz w:val="21"/>
+        </w:rPr>
+        <w:t xml:space="preserve">› </w:t>
+      </w:r>
+      <w:r>
+        <w:rPr>
+          <w:i/>
+          <w:color w:val="30608C"/>
+          <w:sz w:val="21"/>
+        </w:rPr>
+        <w:t>Und ich bin Frau Lange, die Sekretärin.</w:t>
+      </w:r>
+      <w:r>
+        <w:rPr>
+          <w:i/>
+          <w:color w:val="404040"/>
+          <w:sz w:val="21"/>
+        </w:rPr>
+        <w:t xml:space="preserve"> (And I am Ms. Lange, the secretary.)</w:t>
+      </w:r>
+    </w:p>
+    <w:p>
+      <w:pPr>
+        <w:spacing w:before="0" w:after="120"/>
+        <w:ind w:left="576"/>
+      </w:pPr>
+      <w:r>
+        <w:rPr>
+          <w:i/>
+          <w:color w:val="30608C"/>
+          <w:sz w:val="21"/>
+        </w:rPr>
+        <w:t xml:space="preserve">› </w:t>
+      </w:r>
+      <w:r>
+        <w:rPr>
+          <w:i/>
+          <w:color w:val="30608C"/>
+          <w:sz w:val="21"/>
+        </w:rPr>
+        <w:t>Wir sind müde.</w:t>
+      </w:r>
+      <w:r>
+        <w:rPr>
+          <w:i/>
+          <w:color w:val="404040"/>
+          <w:sz w:val="21"/>
+        </w:rPr>
+        <w:t xml:space="preserve"> (We're tired.)</w:t>
+      </w:r>
+    </w:p>
+    <w:p>
+      <w:pPr>
+        <w:spacing w:before="0" w:after="0"/>
+      </w:pPr>
+    </w:p>
+    <w:p>
+      <w:pPr>
+        <w:spacing w:after="120"/>
+      </w:pPr>
+      <w:r>
+        <w:rPr>
+          <w:b/>
+        </w:rPr>
+        <w:t>der Praktikant</w:t>
+      </w:r>
+      <w:r>
+        <w:t xml:space="preserve"> /pʁaktiˈkant/</w:t>
+      </w:r>
+    </w:p>
+    <w:p>
+      <w:pPr>
+        <w:spacing w:after="80"/>
+        <w:ind w:left="576"/>
+      </w:pPr>
+      <w:r>
+        <w:t>Intern; Praktikantin is the feminine form.</w:t>
+      </w:r>
+    </w:p>
+    <w:p>
+      <w:pPr>
+        <w:spacing w:before="40" w:after="60"/>
+        <w:ind w:left="576"/>
+      </w:pPr>
+      <w:r>
+        <w:rPr>
+          <w:i/>
+          <w:color w:val="30608C"/>
+          <w:sz w:val="21"/>
+        </w:rPr>
+        <w:t xml:space="preserve">› </w:t>
+      </w:r>
+      <w:r>
+        <w:rPr>
+          <w:i/>
+          <w:color w:val="30608C"/>
+          <w:sz w:val="21"/>
+        </w:rPr>
+        <w:t>Ich mache ein Praktikum in Deutschland.</w:t>
+      </w:r>
+      <w:r>
+        <w:rPr>
+          <w:i/>
+          <w:color w:val="404040"/>
+          <w:sz w:val="21"/>
+        </w:rPr>
+        <w:t xml:space="preserve"> (I am doing an internship in Germany.)</w:t>
+      </w:r>
+    </w:p>
+    <w:p>
+      <w:pPr>
+        <w:spacing w:before="0" w:after="60"/>
+        <w:ind w:left="576"/>
+      </w:pPr>
+      <w:r>
+        <w:rPr>
+          <w:i/>
+          <w:color w:val="30608C"/>
+          <w:sz w:val="21"/>
+        </w:rPr>
+        <w:t xml:space="preserve">› </w:t>
+      </w:r>
+      <w:r>
+        <w:rPr>
+          <w:i/>
+          <w:color w:val="30608C"/>
+          <w:sz w:val="21"/>
+        </w:rPr>
+        <w:t>Er ist Praktikant bei dieser Firma.</w:t>
+      </w:r>
+      <w:r>
+        <w:rPr>
+          <w:i/>
+          <w:color w:val="404040"/>
+          <w:sz w:val="21"/>
+        </w:rPr>
+        <w:t xml:space="preserve"> (He is an intern at this company.)</w:t>
+      </w:r>
+    </w:p>
+    <w:p>
+      <w:pPr>
+        <w:spacing w:before="0" w:after="60"/>
+        <w:ind w:left="576"/>
+      </w:pPr>
+      <w:r>
+        <w:rPr>
+          <w:i/>
+          <w:color w:val="30608C"/>
+          <w:sz w:val="21"/>
+        </w:rPr>
+        <w:t xml:space="preserve">› </w:t>
+      </w:r>
+      <w:r>
+        <w:rPr>
+          <w:i/>
+          <w:color w:val="30608C"/>
+          <w:sz w:val="21"/>
+        </w:rPr>
+        <w:t>Anna ist Praktikantin.</w:t>
+      </w:r>
+      <w:r>
+        <w:rPr>
+          <w:i/>
+          <w:color w:val="404040"/>
+          <w:sz w:val="21"/>
+        </w:rPr>
+        <w:t xml:space="preserve"> (Anna is an intern [female form].)</w:t>
+      </w:r>
+    </w:p>
+    <w:p>
+      <w:pPr>
+        <w:spacing w:before="0" w:after="120"/>
+        <w:ind w:left="576"/>
+      </w:pPr>
+      <w:r>
+        <w:rPr>
+          <w:i/>
+          <w:color w:val="30608C"/>
+          <w:sz w:val="21"/>
+        </w:rPr>
+        <w:t xml:space="preserve">› </w:t>
+      </w:r>
+      <w:r>
+        <w:rPr>
+          <w:i/>
+          <w:color w:val="30608C"/>
+          <w:sz w:val="21"/>
+        </w:rPr>
+        <w:t>Ich bin der neue Praktikant.</w:t>
+      </w:r>
+      <w:r>
+        <w:rPr>
+          <w:i/>
+          <w:color w:val="404040"/>
+          <w:sz w:val="21"/>
+        </w:rPr>
+        <w:t xml:space="preserve"> (I'm the new intern.)</w:t>
       </w:r>
     </w:p>
     <w:p>
@@ -1653,10 +3499,9 @@
     </w:p>
     <w:p>
       <w:pPr>
-        <w:spacing w:before="40" w:after="120"/>
+        <w:spacing w:before="40" w:after="60"/>
         <w:ind w:left="576"/>
       </w:pPr>
-      <w:r/>
       <w:r>
         <w:rPr>
           <w:i/>
@@ -1671,7 +3516,73 @@
           <w:color w:val="30608C"/>
           <w:sz w:val="21"/>
         </w:rPr>
-        <w:t>Guten Tag, Frau Lange! (Good afternoon / hello, Ms. Lange!) / Guten Tag, wie geht es Ihnen? (Hello / good day — how are you [formal]?)</w:t>
+        <w:t>Guten Tag, Frau Lange! (Good afternoon</w:t>
+      </w:r>
+    </w:p>
+    <w:p>
+      <w:pPr>
+        <w:spacing w:before="0" w:after="60"/>
+        <w:ind w:left="576"/>
+      </w:pPr>
+      <w:r>
+        <w:rPr>
+          <w:i/>
+          <w:color w:val="30608C"/>
+          <w:sz w:val="21"/>
+        </w:rPr>
+        <w:t xml:space="preserve">› </w:t>
+      </w:r>
+      <w:r>
+        <w:rPr>
+          <w:i/>
+          <w:color w:val="30608C"/>
+          <w:sz w:val="21"/>
+        </w:rPr>
+        <w:t>hello, Ms. Lange!)</w:t>
+      </w:r>
+    </w:p>
+    <w:p>
+      <w:pPr>
+        <w:spacing w:before="0" w:after="60"/>
+        <w:ind w:left="576"/>
+      </w:pPr>
+      <w:r>
+        <w:rPr>
+          <w:i/>
+          <w:color w:val="30608C"/>
+          <w:sz w:val="21"/>
+        </w:rPr>
+        <w:t xml:space="preserve">› </w:t>
+      </w:r>
+      <w:r>
+        <w:rPr>
+          <w:i/>
+          <w:color w:val="30608C"/>
+          <w:sz w:val="21"/>
+        </w:rPr>
+        <w:t>Guten Tag, wie geht es Ihnen? (Hello</w:t>
+      </w:r>
+    </w:p>
+    <w:p>
+      <w:pPr>
+        <w:spacing w:before="0" w:after="120"/>
+        <w:ind w:left="576"/>
+      </w:pPr>
+      <w:r>
+        <w:rPr>
+          <w:i/>
+          <w:color w:val="30608C"/>
+          <w:sz w:val="21"/>
+        </w:rPr>
+        <w:t xml:space="preserve">› </w:t>
+      </w:r>
+      <w:r>
+        <w:rPr>
+          <w:i/>
+          <w:color w:val="30608C"/>
+          <w:sz w:val="21"/>
+        </w:rPr>
+        <w:t>good day — how are you [formal]?)</w:t>
       </w:r>
     </w:p>
     <w:sectPr>

</xml_diff>

<commit_message>
Refactor vocabulary example handling and update documentation
- Enhanced `vocab.docx` to unify example formatting, ensuring each German sentence is followed by its English translation in a consistent manner.
- Updated `vocab.manifest.json` to reflect the new structure of examples, transitioning to an array of objects for better clarity and maintainability.
- Modified `WIKI.md` to clarify the new example format and provide guidance on the JSON structure for examples.
- Refactored functions in `daf_vocab/docx_cards.py` to support the new example handling, ensuring proper parsing and rendering in both Word and HTML outputs.
</commit_message>
<xml_diff>
--- a/vocab.docx
+++ b/vocab.docx
@@ -776,12 +776,20 @@
           <w:color w:val="30608C"/>
           <w:sz w:val="21"/>
         </w:rPr>
-        <w:t>Alles klar? (All clear?</w:t>
+        <w:t>Alles klar?</w:t>
+      </w:r>
+      <w:r>
+        <w:rPr>
+          <w:i/>
+          <w:color w:val="404040"/>
+          <w:sz w:val="21"/>
+        </w:rPr>
+        <w:t xml:space="preserve"> (All clear? / OK?)</w:t>
       </w:r>
     </w:p>
     <w:p>
       <w:pPr>
-        <w:spacing w:before="0" w:after="60"/>
+        <w:spacing w:before="0" w:after="120"/>
         <w:ind w:left="576"/>
       </w:pPr>
       <w:r>
@@ -798,12 +806,48 @@
           <w:color w:val="30608C"/>
           <w:sz w:val="21"/>
         </w:rPr>
-        <w:t>OK?)</w:t>
+        <w:t>Ich verstehe alles.</w:t>
+      </w:r>
+      <w:r>
+        <w:rPr>
+          <w:i/>
+          <w:color w:val="404040"/>
+          <w:sz w:val="21"/>
+        </w:rPr>
+        <w:t xml:space="preserve"> (I understand everything.)</w:t>
       </w:r>
     </w:p>
     <w:p>
       <w:pPr>
-        <w:spacing w:before="0" w:after="120"/>
+        <w:spacing w:before="0" w:after="0"/>
+      </w:pPr>
+    </w:p>
+    <w:p>
+      <w:pPr>
+        <w:spacing w:after="120"/>
+      </w:pPr>
+      <w:r>
+        <w:rPr>
+          <w:b/>
+        </w:rPr>
+        <w:t>richtig</w:t>
+      </w:r>
+      <w:r>
+        <w:t xml:space="preserve"> /ˈʁɪçtɪç/</w:t>
+      </w:r>
+    </w:p>
+    <w:p>
+      <w:pPr>
+        <w:spacing w:after="80"/>
+        <w:ind w:left="576"/>
+      </w:pPr>
+      <w:r>
+        <w:t>Correct; right; true.</w:t>
+      </w:r>
+    </w:p>
+    <w:p>
+      <w:pPr>
+        <w:spacing w:before="40" w:after="60"/>
         <w:ind w:left="576"/>
       </w:pPr>
       <w:r>
@@ -820,7 +864,7 @@
           <w:color w:val="30608C"/>
           <w:sz w:val="21"/>
         </w:rPr>
-        <w:t>Ich verstehe alles.</w:t>
+        <w:t>Ist alles richtig?</w:t>
       </w:r>
       <w:r>
         <w:rPr>
@@ -828,40 +872,12 @@
           <w:color w:val="404040"/>
           <w:sz w:val="21"/>
         </w:rPr>
-        <w:t xml:space="preserve"> (I understand everything.)</w:t>
+        <w:t xml:space="preserve"> (Is everything correct?)</w:t>
       </w:r>
     </w:p>
     <w:p>
       <w:pPr>
-        <w:spacing w:before="0" w:after="0"/>
-      </w:pPr>
-    </w:p>
-    <w:p>
-      <w:pPr>
-        <w:spacing w:after="120"/>
-      </w:pPr>
-      <w:r>
-        <w:rPr>
-          <w:b/>
-        </w:rPr>
-        <w:t>richtig</w:t>
-      </w:r>
-      <w:r>
-        <w:t xml:space="preserve"> /ˈʁɪçtɪç/</w:t>
-      </w:r>
-    </w:p>
-    <w:p>
-      <w:pPr>
-        <w:spacing w:after="80"/>
-        <w:ind w:left="576"/>
-      </w:pPr>
-      <w:r>
-        <w:t>Correct; right; true.</w:t>
-      </w:r>
-    </w:p>
-    <w:p>
-      <w:pPr>
-        <w:spacing w:before="40" w:after="60"/>
+        <w:spacing w:before="0" w:after="60"/>
         <w:ind w:left="576"/>
       </w:pPr>
       <w:r>
@@ -878,7 +894,7 @@
           <w:color w:val="30608C"/>
           <w:sz w:val="21"/>
         </w:rPr>
-        <w:t>Ist alles richtig?</w:t>
+        <w:t>Das ist richtig.</w:t>
       </w:r>
       <w:r>
         <w:rPr>
@@ -886,12 +902,12 @@
           <w:color w:val="404040"/>
           <w:sz w:val="21"/>
         </w:rPr>
-        <w:t xml:space="preserve"> (Is everything correct?)</w:t>
+        <w:t xml:space="preserve"> (That's right.)</w:t>
       </w:r>
     </w:p>
     <w:p>
       <w:pPr>
-        <w:spacing w:before="0" w:after="60"/>
+        <w:spacing w:before="0" w:after="120"/>
         <w:ind w:left="576"/>
       </w:pPr>
       <w:r>
@@ -908,7 +924,7 @@
           <w:color w:val="30608C"/>
           <w:sz w:val="21"/>
         </w:rPr>
-        <w:t>Das ist richtig.</w:t>
+        <w:t>Die richtige Antwort</w:t>
       </w:r>
       <w:r>
         <w:rPr>
@@ -916,12 +932,40 @@
           <w:color w:val="404040"/>
           <w:sz w:val="21"/>
         </w:rPr>
-        <w:t xml:space="preserve"> (That's right.)</w:t>
+        <w:t xml:space="preserve"> (the correct answer)</w:t>
       </w:r>
     </w:p>
     <w:p>
       <w:pPr>
-        <w:spacing w:before="0" w:after="120"/>
+        <w:spacing w:before="0" w:after="0"/>
+      </w:pPr>
+    </w:p>
+    <w:p>
+      <w:pPr>
+        <w:spacing w:after="120"/>
+      </w:pPr>
+      <w:r>
+        <w:rPr>
+          <w:b/>
+        </w:rPr>
+        <w:t>die Sekretärin</w:t>
+      </w:r>
+      <w:r>
+        <w:t xml:space="preserve"> /zekʁeˈtɛːʁɪn/</w:t>
+      </w:r>
+    </w:p>
+    <w:p>
+      <w:pPr>
+        <w:spacing w:after="80"/>
+        <w:ind w:left="576"/>
+      </w:pPr>
+      <w:r>
+        <w:t>Secretary (feminine job title).</w:t>
+      </w:r>
+    </w:p>
+    <w:p>
+      <w:pPr>
+        <w:spacing w:before="40" w:after="60"/>
         <w:ind w:left="576"/>
       </w:pPr>
       <w:r>
@@ -938,7 +982,7 @@
           <w:color w:val="30608C"/>
           <w:sz w:val="21"/>
         </w:rPr>
-        <w:t>Die richtige Antwort</w:t>
+        <w:t>Und ich bin Frau Lange, die Sekretärin.</w:t>
       </w:r>
       <w:r>
         <w:rPr>
@@ -946,40 +990,12 @@
           <w:color w:val="404040"/>
           <w:sz w:val="21"/>
         </w:rPr>
-        <w:t xml:space="preserve"> (the correct answer)</w:t>
+        <w:t xml:space="preserve"> (And I am Ms. Lange, the secretary.)</w:t>
       </w:r>
     </w:p>
     <w:p>
       <w:pPr>
-        <w:spacing w:before="0" w:after="0"/>
-      </w:pPr>
-    </w:p>
-    <w:p>
-      <w:pPr>
-        <w:spacing w:after="120"/>
-      </w:pPr>
-      <w:r>
-        <w:rPr>
-          <w:b/>
-        </w:rPr>
-        <w:t>die Sekretärin</w:t>
-      </w:r>
-      <w:r>
-        <w:t xml:space="preserve"> /zekʁeˈtɛːʁɪn/</w:t>
-      </w:r>
-    </w:p>
-    <w:p>
-      <w:pPr>
-        <w:spacing w:after="80"/>
-        <w:ind w:left="576"/>
-      </w:pPr>
-      <w:r>
-        <w:t>Secretary (feminine job title).</w:t>
-      </w:r>
-    </w:p>
-    <w:p>
-      <w:pPr>
-        <w:spacing w:before="40" w:after="60"/>
+        <w:spacing w:before="0" w:after="60"/>
         <w:ind w:left="576"/>
       </w:pPr>
       <w:r>
@@ -996,7 +1012,7 @@
           <w:color w:val="30608C"/>
           <w:sz w:val="21"/>
         </w:rPr>
-        <w:t>Und ich bin Frau Lange, die Sekretärin.</w:t>
+        <w:t>Sie ist Sekretärin.</w:t>
       </w:r>
       <w:r>
         <w:rPr>
@@ -1004,12 +1020,12 @@
           <w:color w:val="404040"/>
           <w:sz w:val="21"/>
         </w:rPr>
-        <w:t xml:space="preserve"> (And I am Ms. Lange, the secretary.)</w:t>
+        <w:t xml:space="preserve"> (She is a secretary.)</w:t>
       </w:r>
     </w:p>
     <w:p>
       <w:pPr>
-        <w:spacing w:before="0" w:after="60"/>
+        <w:spacing w:before="0" w:after="120"/>
         <w:ind w:left="576"/>
       </w:pPr>
       <w:r>
@@ -1026,7 +1042,7 @@
           <w:color w:val="30608C"/>
           <w:sz w:val="21"/>
         </w:rPr>
-        <w:t>Sie ist Sekretärin.</w:t>
+        <w:t>der Sekretär</w:t>
       </w:r>
       <w:r>
         <w:rPr>
@@ -1034,12 +1050,40 @@
           <w:color w:val="404040"/>
           <w:sz w:val="21"/>
         </w:rPr>
-        <w:t xml:space="preserve"> (She is a secretary.)</w:t>
+        <w:t xml:space="preserve"> (male secretary)</w:t>
       </w:r>
     </w:p>
     <w:p>
       <w:pPr>
-        <w:spacing w:before="0" w:after="120"/>
+        <w:spacing w:before="0" w:after="0"/>
+      </w:pPr>
+    </w:p>
+    <w:p>
+      <w:pPr>
+        <w:spacing w:after="120"/>
+      </w:pPr>
+      <w:r>
+        <w:rPr>
+          <w:b/>
+        </w:rPr>
+        <w:t>Frau</w:t>
+      </w:r>
+      <w:r>
+        <w:t xml:space="preserve"> /fraʊ̯/</w:t>
+      </w:r>
+    </w:p>
+    <w:p>
+      <w:pPr>
+        <w:spacing w:after="80"/>
+        <w:ind w:left="576"/>
+      </w:pPr>
+      <w:r>
+        <w:t>Ms. or Mrs. before a surname.</w:t>
+      </w:r>
+    </w:p>
+    <w:p>
+      <w:pPr>
+        <w:spacing w:before="40" w:after="60"/>
         <w:ind w:left="576"/>
       </w:pPr>
       <w:r>
@@ -1056,7 +1100,7 @@
           <w:color w:val="30608C"/>
           <w:sz w:val="21"/>
         </w:rPr>
-        <w:t>der Sekretär</w:t>
+        <w:t>Frau Lange</w:t>
       </w:r>
       <w:r>
         <w:rPr>
@@ -1064,40 +1108,12 @@
           <w:color w:val="404040"/>
           <w:sz w:val="21"/>
         </w:rPr>
-        <w:t xml:space="preserve"> (male secretary)</w:t>
+        <w:t xml:space="preserve"> (Ms. Lange)</w:t>
       </w:r>
     </w:p>
     <w:p>
       <w:pPr>
-        <w:spacing w:before="0" w:after="0"/>
-      </w:pPr>
-    </w:p>
-    <w:p>
-      <w:pPr>
-        <w:spacing w:after="120"/>
-      </w:pPr>
-      <w:r>
-        <w:rPr>
-          <w:b/>
-        </w:rPr>
-        <w:t>Frau</w:t>
-      </w:r>
-      <w:r>
-        <w:t xml:space="preserve"> /fraʊ̯/</w:t>
-      </w:r>
-    </w:p>
-    <w:p>
-      <w:pPr>
-        <w:spacing w:after="80"/>
-        <w:ind w:left="576"/>
-      </w:pPr>
-      <w:r>
-        <w:t>Ms. or Mrs. before a surname.</w:t>
-      </w:r>
-    </w:p>
-    <w:p>
-      <w:pPr>
-        <w:spacing w:before="40" w:after="60"/>
+        <w:spacing w:before="0" w:after="60"/>
         <w:ind w:left="576"/>
       </w:pPr>
       <w:r>
@@ -1114,7 +1130,7 @@
           <w:color w:val="30608C"/>
           <w:sz w:val="21"/>
         </w:rPr>
-        <w:t>Frau Lange</w:t>
+        <w:t>Und ich bin Frau Lange, die Sekretärin.</w:t>
       </w:r>
       <w:r>
         <w:rPr>
@@ -1122,12 +1138,12 @@
           <w:color w:val="404040"/>
           <w:sz w:val="21"/>
         </w:rPr>
-        <w:t xml:space="preserve"> (Ms. Lange)</w:t>
+        <w:t xml:space="preserve"> (And I am Ms. Lange, the secretary.)</w:t>
       </w:r>
     </w:p>
     <w:p>
       <w:pPr>
-        <w:spacing w:before="0" w:after="60"/>
+        <w:spacing w:before="0" w:after="120"/>
         <w:ind w:left="576"/>
       </w:pPr>
       <w:r>
@@ -1144,7 +1160,7 @@
           <w:color w:val="30608C"/>
           <w:sz w:val="21"/>
         </w:rPr>
-        <w:t>Und ich bin Frau Lange, die Sekretärin.</w:t>
+        <w:t>Guten Tag, Frau Schulz!</w:t>
       </w:r>
       <w:r>
         <w:rPr>
@@ -1152,12 +1168,40 @@
           <w:color w:val="404040"/>
           <w:sz w:val="21"/>
         </w:rPr>
-        <w:t xml:space="preserve"> (And I am Ms. Lange, the secretary.)</w:t>
+        <w:t xml:space="preserve"> (Good day, Ms. Schulz!)</w:t>
       </w:r>
     </w:p>
     <w:p>
       <w:pPr>
-        <w:spacing w:before="0" w:after="120"/>
+        <w:spacing w:before="0" w:after="0"/>
+      </w:pPr>
+    </w:p>
+    <w:p>
+      <w:pPr>
+        <w:spacing w:after="120"/>
+      </w:pPr>
+      <w:r>
+        <w:rPr>
+          <w:b/>
+        </w:rPr>
+        <w:t>aus</w:t>
+      </w:r>
+      <w:r>
+        <w:t xml:space="preserve"> /aʊ̯s/</w:t>
+      </w:r>
+    </w:p>
+    <w:p>
+      <w:pPr>
+        <w:spacing w:after="80"/>
+        <w:ind w:left="576"/>
+      </w:pPr>
+      <w:r>
+        <w:t>From; out of (+ dative for origin).</w:t>
+      </w:r>
+    </w:p>
+    <w:p>
+      <w:pPr>
+        <w:spacing w:before="40" w:after="60"/>
         <w:ind w:left="576"/>
       </w:pPr>
       <w:r>
@@ -1174,7 +1218,7 @@
           <w:color w:val="30608C"/>
           <w:sz w:val="21"/>
         </w:rPr>
-        <w:t>Guten Tag, Frau Schulz!</w:t>
+        <w:t>Ich komme aus Argentinien.</w:t>
       </w:r>
       <w:r>
         <w:rPr>
@@ -1182,40 +1226,12 @@
           <w:color w:val="404040"/>
           <w:sz w:val="21"/>
         </w:rPr>
-        <w:t xml:space="preserve"> (Good day, Ms. Schulz!)</w:t>
+        <w:t xml:space="preserve"> (I'm from Argentina.)</w:t>
       </w:r>
     </w:p>
     <w:p>
       <w:pPr>
-        <w:spacing w:before="0" w:after="0"/>
-      </w:pPr>
-    </w:p>
-    <w:p>
-      <w:pPr>
-        <w:spacing w:after="120"/>
-      </w:pPr>
-      <w:r>
-        <w:rPr>
-          <w:b/>
-        </w:rPr>
-        <w:t>aus</w:t>
-      </w:r>
-      <w:r>
-        <w:t xml:space="preserve"> /aʊ̯s/</w:t>
-      </w:r>
-    </w:p>
-    <w:p>
-      <w:pPr>
-        <w:spacing w:after="80"/>
-        <w:ind w:left="576"/>
-      </w:pPr>
-      <w:r>
-        <w:t>From; out of (+ dative for origin).</w:t>
-      </w:r>
-    </w:p>
-    <w:p>
-      <w:pPr>
-        <w:spacing w:before="40" w:after="60"/>
+        <w:spacing w:before="0" w:after="60"/>
         <w:ind w:left="576"/>
       </w:pPr>
       <w:r>
@@ -1232,7 +1248,7 @@
           <w:color w:val="30608C"/>
           <w:sz w:val="21"/>
         </w:rPr>
-        <w:t>Ich komme aus Argentinien.</w:t>
+        <w:t>Er kommt aus dem Urlaub.</w:t>
       </w:r>
       <w:r>
         <w:rPr>
@@ -1240,12 +1256,12 @@
           <w:color w:val="404040"/>
           <w:sz w:val="21"/>
         </w:rPr>
-        <w:t xml:space="preserve"> (I'm from Argentina.)</w:t>
+        <w:t xml:space="preserve"> (He's back from vacation.)</w:t>
       </w:r>
     </w:p>
     <w:p>
       <w:pPr>
-        <w:spacing w:before="0" w:after="60"/>
+        <w:spacing w:before="0" w:after="120"/>
         <w:ind w:left="576"/>
       </w:pPr>
       <w:r>
@@ -1262,7 +1278,7 @@
           <w:color w:val="30608C"/>
           <w:sz w:val="21"/>
         </w:rPr>
-        <w:t>Er kommt aus dem Urlaub.</w:t>
+        <w:t>aus Berlin</w:t>
       </w:r>
       <w:r>
         <w:rPr>
@@ -1270,12 +1286,40 @@
           <w:color w:val="404040"/>
           <w:sz w:val="21"/>
         </w:rPr>
-        <w:t xml:space="preserve"> (He's back from vacation.)</w:t>
+        <w:t xml:space="preserve"> (from Berlin)</w:t>
       </w:r>
     </w:p>
     <w:p>
       <w:pPr>
-        <w:spacing w:before="0" w:after="120"/>
+        <w:spacing w:before="0" w:after="0"/>
+      </w:pPr>
+    </w:p>
+    <w:p>
+      <w:pPr>
+        <w:spacing w:after="120"/>
+      </w:pPr>
+      <w:r>
+        <w:rPr>
+          <w:b/>
+        </w:rPr>
+        <w:t>Argentinien</w:t>
+      </w:r>
+      <w:r>
+        <w:t xml:space="preserve"> /aʁɡɛnˈtiːni̯ən/</w:t>
+      </w:r>
+    </w:p>
+    <w:p>
+      <w:pPr>
+        <w:spacing w:after="80"/>
+        <w:ind w:left="576"/>
+      </w:pPr>
+      <w:r>
+        <w:t>Argentina (country).</w:t>
+      </w:r>
+    </w:p>
+    <w:p>
+      <w:pPr>
+        <w:spacing w:before="40" w:after="60"/>
         <w:ind w:left="576"/>
       </w:pPr>
       <w:r>
@@ -1292,7 +1336,7 @@
           <w:color w:val="30608C"/>
           <w:sz w:val="21"/>
         </w:rPr>
-        <w:t>aus Berlin</w:t>
+        <w:t>Ich komme aus Argentinien.</w:t>
       </w:r>
       <w:r>
         <w:rPr>
@@ -1300,40 +1344,12 @@
           <w:color w:val="404040"/>
           <w:sz w:val="21"/>
         </w:rPr>
-        <w:t xml:space="preserve"> (from Berlin)</w:t>
+        <w:t xml:space="preserve"> (I'm from Argentina.)</w:t>
       </w:r>
     </w:p>
     <w:p>
       <w:pPr>
-        <w:spacing w:before="0" w:after="0"/>
-      </w:pPr>
-    </w:p>
-    <w:p>
-      <w:pPr>
-        <w:spacing w:after="120"/>
-      </w:pPr>
-      <w:r>
-        <w:rPr>
-          <w:b/>
-        </w:rPr>
-        <w:t>Argentinien</w:t>
-      </w:r>
-      <w:r>
-        <w:t xml:space="preserve"> /aʁɡɛnˈtiːni̯ən/</w:t>
-      </w:r>
-    </w:p>
-    <w:p>
-      <w:pPr>
-        <w:spacing w:after="80"/>
-        <w:ind w:left="576"/>
-      </w:pPr>
-      <w:r>
-        <w:t>Argentina (country).</w:t>
-      </w:r>
-    </w:p>
-    <w:p>
-      <w:pPr>
-        <w:spacing w:before="40" w:after="60"/>
+        <w:spacing w:before="0" w:after="120"/>
         <w:ind w:left="576"/>
       </w:pPr>
       <w:r>
@@ -1350,7 +1366,7 @@
           <w:color w:val="30608C"/>
           <w:sz w:val="21"/>
         </w:rPr>
-        <w:t>Ich komme aus Argentinien.</w:t>
+        <w:t>Buenos Aires liegt in Argentinien.</w:t>
       </w:r>
       <w:r>
         <w:rPr>
@@ -1358,12 +1374,40 @@
           <w:color w:val="404040"/>
           <w:sz w:val="21"/>
         </w:rPr>
-        <w:t xml:space="preserve"> (I'm from Argentina.)</w:t>
+        <w:t xml:space="preserve"> (Buenos Aires is in Argentina.)</w:t>
       </w:r>
     </w:p>
     <w:p>
       <w:pPr>
-        <w:spacing w:before="0" w:after="120"/>
+        <w:spacing w:before="0" w:after="0"/>
+      </w:pPr>
+    </w:p>
+    <w:p>
+      <w:pPr>
+        <w:spacing w:after="120"/>
+      </w:pPr>
+      <w:r>
+        <w:rPr>
+          <w:b/>
+        </w:rPr>
+        <w:t>woher</w:t>
+      </w:r>
+      <w:r>
+        <w:t xml:space="preserve"> /ˈvoheːɐ̯/</w:t>
+      </w:r>
+    </w:p>
+    <w:p>
+      <w:pPr>
+        <w:spacing w:after="80"/>
+        <w:ind w:left="576"/>
+      </w:pPr>
+      <w:r>
+        <w:t>From where (origin).</w:t>
+      </w:r>
+    </w:p>
+    <w:p>
+      <w:pPr>
+        <w:spacing w:before="40" w:after="60"/>
         <w:ind w:left="576"/>
       </w:pPr>
       <w:r>
@@ -1380,7 +1424,7 @@
           <w:color w:val="30608C"/>
           <w:sz w:val="21"/>
         </w:rPr>
-        <w:t>Buenos Aires liegt in Argentinien.</w:t>
+        <w:t>Woher kommen Sie?</w:t>
       </w:r>
       <w:r>
         <w:rPr>
@@ -1388,40 +1432,12 @@
           <w:color w:val="404040"/>
           <w:sz w:val="21"/>
         </w:rPr>
-        <w:t xml:space="preserve"> (Buenos Aires is in Argentina.)</w:t>
+        <w:t xml:space="preserve"> (Where are you from [formal]?)</w:t>
       </w:r>
     </w:p>
     <w:p>
       <w:pPr>
-        <w:spacing w:before="0" w:after="0"/>
-      </w:pPr>
-    </w:p>
-    <w:p>
-      <w:pPr>
-        <w:spacing w:after="120"/>
-      </w:pPr>
-      <w:r>
-        <w:rPr>
-          <w:b/>
-        </w:rPr>
-        <w:t>woher</w:t>
-      </w:r>
-      <w:r>
-        <w:t xml:space="preserve"> /ˈvoheːɐ̯/</w:t>
-      </w:r>
-    </w:p>
-    <w:p>
-      <w:pPr>
-        <w:spacing w:after="80"/>
-        <w:ind w:left="576"/>
-      </w:pPr>
-      <w:r>
-        <w:t>From where (origin).</w:t>
-      </w:r>
-    </w:p>
-    <w:p>
-      <w:pPr>
-        <w:spacing w:before="40" w:after="60"/>
+        <w:spacing w:before="0" w:after="60"/>
         <w:ind w:left="576"/>
       </w:pPr>
       <w:r>
@@ -1438,7 +1454,7 @@
           <w:color w:val="30608C"/>
           <w:sz w:val="21"/>
         </w:rPr>
-        <w:t>Woher kommen Sie?</w:t>
+        <w:t>Ich komme aus Österreich.</w:t>
       </w:r>
       <w:r>
         <w:rPr>
@@ -1446,12 +1462,12 @@
           <w:color w:val="404040"/>
           <w:sz w:val="21"/>
         </w:rPr>
-        <w:t xml:space="preserve"> (Where are you from [formal]?)</w:t>
+        <w:t xml:space="preserve"> (I'm from Austria.)</w:t>
       </w:r>
     </w:p>
     <w:p>
       <w:pPr>
-        <w:spacing w:before="0" w:after="60"/>
+        <w:spacing w:before="0" w:after="120"/>
         <w:ind w:left="576"/>
       </w:pPr>
       <w:r>
@@ -1468,7 +1484,7 @@
           <w:color w:val="30608C"/>
           <w:sz w:val="21"/>
         </w:rPr>
-        <w:t>Ich komme aus Österreich.</w:t>
+        <w:t>Woher kommt er?</w:t>
       </w:r>
       <w:r>
         <w:rPr>
@@ -1476,12 +1492,40 @@
           <w:color w:val="404040"/>
           <w:sz w:val="21"/>
         </w:rPr>
-        <w:t xml:space="preserve"> (I'm from Austria.)</w:t>
+        <w:t xml:space="preserve"> (Where does he come from?)</w:t>
       </w:r>
     </w:p>
     <w:p>
       <w:pPr>
-        <w:spacing w:before="0" w:after="120"/>
+        <w:spacing w:before="0" w:after="0"/>
+      </w:pPr>
+    </w:p>
+    <w:p>
+      <w:pPr>
+        <w:spacing w:after="120"/>
+      </w:pPr>
+      <w:r>
+        <w:rPr>
+          <w:b/>
+        </w:rPr>
+        <w:t>kommen</w:t>
+      </w:r>
+      <w:r>
+        <w:t xml:space="preserve"> /ˈkɔmən/</w:t>
+      </w:r>
+    </w:p>
+    <w:p>
+      <w:pPr>
+        <w:spacing w:after="80"/>
+        <w:ind w:left="576"/>
+      </w:pPr>
+      <w:r>
+        <w:t>To come; aus … = from (a place).</w:t>
+      </w:r>
+    </w:p>
+    <w:p>
+      <w:pPr>
+        <w:spacing w:before="40" w:after="60"/>
         <w:ind w:left="576"/>
       </w:pPr>
       <w:r>
@@ -1498,7 +1542,7 @@
           <w:color w:val="30608C"/>
           <w:sz w:val="21"/>
         </w:rPr>
-        <w:t>Woher kommt er?</w:t>
+        <w:t>Woher kommen Sie?</w:t>
       </w:r>
       <w:r>
         <w:rPr>
@@ -1506,40 +1550,12 @@
           <w:color w:val="404040"/>
           <w:sz w:val="21"/>
         </w:rPr>
-        <w:t xml:space="preserve"> (Where does he come from?)</w:t>
+        <w:t xml:space="preserve"> (Where do you come from [formal]?)</w:t>
       </w:r>
     </w:p>
     <w:p>
       <w:pPr>
-        <w:spacing w:before="0" w:after="0"/>
-      </w:pPr>
-    </w:p>
-    <w:p>
-      <w:pPr>
-        <w:spacing w:after="120"/>
-      </w:pPr>
-      <w:r>
-        <w:rPr>
-          <w:b/>
-        </w:rPr>
-        <w:t>kommen</w:t>
-      </w:r>
-      <w:r>
-        <w:t xml:space="preserve"> /ˈkɔmən/</w:t>
-      </w:r>
-    </w:p>
-    <w:p>
-      <w:pPr>
-        <w:spacing w:after="80"/>
-        <w:ind w:left="576"/>
-      </w:pPr>
-      <w:r>
-        <w:t>To come; aus … = from (a place).</w:t>
-      </w:r>
-    </w:p>
-    <w:p>
-      <w:pPr>
-        <w:spacing w:before="40" w:after="60"/>
+        <w:spacing w:before="0" w:after="60"/>
         <w:ind w:left="576"/>
       </w:pPr>
       <w:r>
@@ -1556,7 +1572,7 @@
           <w:color w:val="30608C"/>
           <w:sz w:val="21"/>
         </w:rPr>
-        <w:t>Woher kommen Sie?</w:t>
+        <w:t>Sie kommen aus München.</w:t>
       </w:r>
       <w:r>
         <w:rPr>
@@ -1564,7 +1580,7 @@
           <w:color w:val="404040"/>
           <w:sz w:val="21"/>
         </w:rPr>
-        <w:t xml:space="preserve"> (Where do you come from [formal]?)</w:t>
+        <w:t xml:space="preserve"> (You come from Munich.)</w:t>
       </w:r>
     </w:p>
     <w:p>
@@ -1586,7 +1602,7 @@
           <w:color w:val="30608C"/>
           <w:sz w:val="21"/>
         </w:rPr>
-        <w:t>Sie kommen aus München.</w:t>
+        <w:t>Ich komme aus Argentinien.</w:t>
       </w:r>
       <w:r>
         <w:rPr>
@@ -1594,12 +1610,12 @@
           <w:color w:val="404040"/>
           <w:sz w:val="21"/>
         </w:rPr>
-        <w:t xml:space="preserve"> (You come from Munich.)</w:t>
+        <w:t xml:space="preserve"> (I'm from Argentina.)</w:t>
       </w:r>
     </w:p>
     <w:p>
       <w:pPr>
-        <w:spacing w:before="0" w:after="60"/>
+        <w:spacing w:before="0" w:after="120"/>
         <w:ind w:left="576"/>
       </w:pPr>
       <w:r>
@@ -1616,7 +1632,7 @@
           <w:color w:val="30608C"/>
           <w:sz w:val="21"/>
         </w:rPr>
-        <w:t>Ich komme aus Argentinien.</w:t>
+        <w:t>Kommst du mit?</w:t>
       </w:r>
       <w:r>
         <w:rPr>
@@ -1624,12 +1640,54 @@
           <w:color w:val="404040"/>
           <w:sz w:val="21"/>
         </w:rPr>
-        <w:t xml:space="preserve"> (I'm from Argentina.)</w:t>
+        <w:t xml:space="preserve"> (Are you coming along?)</w:t>
       </w:r>
     </w:p>
     <w:p>
       <w:pPr>
-        <w:spacing w:before="0" w:after="120"/>
+        <w:spacing w:before="0" w:after="0"/>
+      </w:pPr>
+    </w:p>
+    <w:p>
+      <w:pPr>
+        <w:spacing w:after="120"/>
+      </w:pPr>
+      <w:r>
+        <w:rPr>
+          <w:b/>
+        </w:rPr>
+        <w:t>Grüß Gott!</w:t>
+      </w:r>
+      <w:r>
+        <w:t xml:space="preserve"> /ˈɡʁʏs ˈɡɔt/</w:t>
+      </w:r>
+    </w:p>
+    <w:p>
+      <w:pPr>
+        <w:spacing w:after="80"/>
+        <w:ind w:left="576"/>
+      </w:pPr>
+      <w:r>
+        <w:t>Polite daytime hello—typical in Austria and southern Germany.</w:t>
+      </w:r>
+    </w:p>
+    <w:p>
+      <w:pPr>
+        <w:spacing w:after="80"/>
+        <w:ind w:left="576"/>
+      </w:pPr>
+      <w:r>
+        <w:rPr>
+          <w:i/>
+          <w:color w:val="404040"/>
+          <w:sz w:val="20"/>
+        </w:rPr>
+        <w:t>• Elsewhere Guten Tag is often the default; Hallo is informal.</w:t>
+      </w:r>
+    </w:p>
+    <w:p>
+      <w:pPr>
+        <w:spacing w:before="40" w:after="60"/>
         <w:ind w:left="576"/>
       </w:pPr>
       <w:r>
@@ -1646,7 +1704,7 @@
           <w:color w:val="30608C"/>
           <w:sz w:val="21"/>
         </w:rPr>
-        <w:t>Kommst du mit?</w:t>
+        <w:t>Grüß Gott!</w:t>
       </w:r>
       <w:r>
         <w:rPr>
@@ -1654,35 +1712,859 @@
           <w:color w:val="404040"/>
           <w:sz w:val="21"/>
         </w:rPr>
-        <w:t xml:space="preserve"> (Are you coming along?)</w:t>
+        <w:t xml:space="preserve"> (Good day — hello!)</w:t>
       </w:r>
     </w:p>
     <w:p>
       <w:pPr>
-        <w:spacing w:before="0" w:after="0"/>
-      </w:pPr>
+        <w:spacing w:before="0" w:after="120"/>
+        <w:ind w:left="576"/>
+      </w:pPr>
+      <w:r>
+        <w:rPr>
+          <w:i/>
+          <w:color w:val="30608C"/>
+          <w:sz w:val="21"/>
+        </w:rPr>
+        <w:t xml:space="preserve">› </w:t>
+      </w:r>
+      <w:r>
+        <w:rPr>
+          <w:i/>
+          <w:color w:val="30608C"/>
+          <w:sz w:val="21"/>
+        </w:rPr>
+        <w:t>Grüß Gott, Frau Schmid!</w:t>
+      </w:r>
+      <w:r>
+        <w:rPr>
+          <w:i/>
+          <w:color w:val="404040"/>
+          <w:sz w:val="21"/>
+        </w:rPr>
+        <w:t xml:space="preserve"> (Hello, Ms. Schmid!)</w:t>
+      </w:r>
     </w:p>
     <w:p>
       <w:pPr>
-        <w:spacing w:after="120"/>
-      </w:pPr>
-      <w:r>
-        <w:rPr>
-          <w:b/>
-        </w:rPr>
-        <w:t>Grüß Gott!</w:t>
-      </w:r>
-      <w:r>
-        <w:t xml:space="preserve"> /ˈɡʁʏs ˈɡɔt/</w:t>
-      </w:r>
+        <w:spacing w:before="0" w:after="0"/>
+      </w:pPr>
     </w:p>
     <w:p>
       <w:pPr>
+        <w:spacing w:after="120"/>
+      </w:pPr>
+      <w:r>
+        <w:rPr>
+          <w:b/>
+        </w:rPr>
+        <w:t>ergänzen</w:t>
+      </w:r>
+      <w:r>
+        <w:t xml:space="preserve"> /ˈʔɛʁɡɛntsən/</w:t>
+      </w:r>
+    </w:p>
+    <w:p>
+      <w:pPr>
         <w:spacing w:after="80"/>
         <w:ind w:left="576"/>
       </w:pPr>
       <w:r>
-        <w:t>Polite daytime hello—typical in Austria and southern Germany.</w:t>
+        <w:t>To complete / fill in blanks.</w:t>
+      </w:r>
+    </w:p>
+    <w:p>
+      <w:pPr>
+        <w:spacing w:before="40" w:after="60"/>
+        <w:ind w:left="576"/>
+      </w:pPr>
+      <w:r>
+        <w:rPr>
+          <w:i/>
+          <w:color w:val="30608C"/>
+          <w:sz w:val="21"/>
+        </w:rPr>
+        <w:t xml:space="preserve">› </w:t>
+      </w:r>
+      <w:r>
+        <w:rPr>
+          <w:i/>
+          <w:color w:val="30608C"/>
+          <w:sz w:val="21"/>
+        </w:rPr>
+        <w:t>Lesen Sie das Gespräch und ergänzen Sie.</w:t>
+      </w:r>
+      <w:r>
+        <w:rPr>
+          <w:i/>
+          <w:color w:val="404040"/>
+          <w:sz w:val="21"/>
+        </w:rPr>
+        <w:t xml:space="preserve"> (Read the dialogue, then supply the missing parts / fill everything in.)</w:t>
+      </w:r>
+    </w:p>
+    <w:p>
+      <w:pPr>
+        <w:spacing w:before="0" w:after="120"/>
+        <w:ind w:left="576"/>
+      </w:pPr>
+      <w:r>
+        <w:rPr>
+          <w:i/>
+          <w:color w:val="30608C"/>
+          <w:sz w:val="21"/>
+        </w:rPr>
+        <w:t xml:space="preserve">› </w:t>
+      </w:r>
+      <w:r>
+        <w:rPr>
+          <w:i/>
+          <w:color w:val="30608C"/>
+          <w:sz w:val="21"/>
+        </w:rPr>
+        <w:t>Ergänzen Sie die Lücken mit den passenden Wörtern.</w:t>
+      </w:r>
+      <w:r>
+        <w:rPr>
+          <w:i/>
+          <w:color w:val="404040"/>
+          <w:sz w:val="21"/>
+        </w:rPr>
+        <w:t xml:space="preserve"> (Fill in the gaps with suitable words.)</w:t>
+      </w:r>
+    </w:p>
+    <w:p>
+      <w:pPr>
+        <w:spacing w:before="0" w:after="0"/>
+      </w:pPr>
+    </w:p>
+    <w:p>
+      <w:pPr>
+        <w:spacing w:after="120"/>
+      </w:pPr>
+      <w:r>
+        <w:rPr>
+          <w:b/>
+        </w:rPr>
+        <w:t>lesen</w:t>
+      </w:r>
+      <w:r>
+        <w:t xml:space="preserve"> /ˈleːzən/</w:t>
+      </w:r>
+    </w:p>
+    <w:p>
+      <w:pPr>
+        <w:spacing w:after="80"/>
+        <w:ind w:left="576"/>
+      </w:pPr>
+      <w:r>
+        <w:t>To read (+ object in accusative).</w:t>
+      </w:r>
+    </w:p>
+    <w:p>
+      <w:pPr>
+        <w:spacing w:before="40" w:after="60"/>
+        <w:ind w:left="576"/>
+      </w:pPr>
+      <w:r>
+        <w:rPr>
+          <w:i/>
+          <w:color w:val="30608C"/>
+          <w:sz w:val="21"/>
+        </w:rPr>
+        <w:t xml:space="preserve">› </w:t>
+      </w:r>
+      <w:r>
+        <w:rPr>
+          <w:i/>
+          <w:color w:val="30608C"/>
+          <w:sz w:val="21"/>
+        </w:rPr>
+        <w:t>Lesen Sie das Gespräch und ergänzen Sie.</w:t>
+      </w:r>
+      <w:r>
+        <w:rPr>
+          <w:i/>
+          <w:color w:val="404040"/>
+          <w:sz w:val="21"/>
+        </w:rPr>
+        <w:t xml:space="preserve"> (Read the dialogue [aloud/on the page], then finish / fill it in.)</w:t>
+      </w:r>
+    </w:p>
+    <w:p>
+      <w:pPr>
+        <w:spacing w:before="0" w:after="120"/>
+        <w:ind w:left="576"/>
+      </w:pPr>
+      <w:r>
+        <w:rPr>
+          <w:i/>
+          <w:color w:val="30608C"/>
+          <w:sz w:val="21"/>
+        </w:rPr>
+        <w:t xml:space="preserve">› </w:t>
+      </w:r>
+      <w:r>
+        <w:rPr>
+          <w:i/>
+          <w:color w:val="30608C"/>
+          <w:sz w:val="21"/>
+        </w:rPr>
+        <w:t>Lesen Sie die Überschrift zu Beginn der Übung.</w:t>
+      </w:r>
+      <w:r>
+        <w:rPr>
+          <w:i/>
+          <w:color w:val="404040"/>
+          <w:sz w:val="21"/>
+        </w:rPr>
+        <w:t xml:space="preserve"> (Read the headline at the start of the exercise.)</w:t>
+      </w:r>
+    </w:p>
+    <w:p>
+      <w:pPr>
+        <w:spacing w:before="0" w:after="0"/>
+      </w:pPr>
+    </w:p>
+    <w:p>
+      <w:pPr>
+        <w:spacing w:after="120"/>
+      </w:pPr>
+      <w:r>
+        <w:rPr>
+          <w:b/>
+        </w:rPr>
+        <w:t>sagen</w:t>
+      </w:r>
+      <w:r>
+        <w:t xml:space="preserve"> /ˈzaːɡən/</w:t>
+      </w:r>
+    </w:p>
+    <w:p>
+      <w:pPr>
+        <w:spacing w:after="80"/>
+        <w:ind w:left="576"/>
+      </w:pPr>
+      <w:r>
+        <w:t>To say or tell.</w:t>
+      </w:r>
+    </w:p>
+    <w:p>
+      <w:pPr>
+        <w:spacing w:before="40" w:after="60"/>
+        <w:ind w:left="576"/>
+      </w:pPr>
+      <w:r>
+        <w:rPr>
+          <w:i/>
+          <w:color w:val="30608C"/>
+          <w:sz w:val="21"/>
+        </w:rPr>
+        <w:t xml:space="preserve">› </w:t>
+      </w:r>
+      <w:r>
+        <w:rPr>
+          <w:i/>
+          <w:color w:val="30608C"/>
+          <w:sz w:val="21"/>
+        </w:rPr>
+        <w:t>Was sagen die Personen?</w:t>
+      </w:r>
+      <w:r>
+        <w:rPr>
+          <w:i/>
+          <w:color w:val="404040"/>
+          <w:sz w:val="21"/>
+        </w:rPr>
+        <w:t xml:space="preserve"> (What are the people saying?)</w:t>
+      </w:r>
+    </w:p>
+    <w:p>
+      <w:pPr>
+        <w:spacing w:before="0" w:after="120"/>
+        <w:ind w:left="576"/>
+      </w:pPr>
+      <w:r>
+        <w:rPr>
+          <w:i/>
+          <w:color w:val="30608C"/>
+          <w:sz w:val="21"/>
+        </w:rPr>
+        <w:t xml:space="preserve">› </w:t>
+      </w:r>
+      <w:r>
+        <w:rPr>
+          <w:i/>
+          <w:color w:val="30608C"/>
+          <w:sz w:val="21"/>
+        </w:rPr>
+        <w:t>Er sagt kurz „Nein“.</w:t>
+      </w:r>
+      <w:r>
+        <w:rPr>
+          <w:i/>
+          <w:color w:val="404040"/>
+          <w:sz w:val="21"/>
+        </w:rPr>
+        <w:t xml:space="preserve"> (He briefly says “no”.)</w:t>
+      </w:r>
+    </w:p>
+    <w:p>
+      <w:pPr>
+        <w:spacing w:before="0" w:after="0"/>
+      </w:pPr>
+    </w:p>
+    <w:p>
+      <w:pPr>
+        <w:spacing w:after="120"/>
+      </w:pPr>
+      <w:r>
+        <w:rPr>
+          <w:b/>
+        </w:rPr>
+        <w:t>die Person</w:t>
+      </w:r>
+      <w:r>
+        <w:t xml:space="preserve"> /pɛʁˈzoːn/</w:t>
+      </w:r>
+    </w:p>
+    <w:p>
+      <w:pPr>
+        <w:spacing w:after="80"/>
+        <w:ind w:left="576"/>
+      </w:pPr>
+      <w:r>
+        <w:t>Feminine singular: person (pl. Personen).</w:t>
+      </w:r>
+    </w:p>
+    <w:p>
+      <w:pPr>
+        <w:spacing w:before="40" w:after="60"/>
+        <w:ind w:left="576"/>
+      </w:pPr>
+      <w:r>
+        <w:rPr>
+          <w:i/>
+          <w:color w:val="30608C"/>
+          <w:sz w:val="21"/>
+        </w:rPr>
+        <w:t xml:space="preserve">› </w:t>
+      </w:r>
+      <w:r>
+        <w:rPr>
+          <w:i/>
+          <w:color w:val="30608C"/>
+          <w:sz w:val="21"/>
+        </w:rPr>
+        <w:t>Viele Personen warten.</w:t>
+      </w:r>
+      <w:r>
+        <w:rPr>
+          <w:i/>
+          <w:color w:val="404040"/>
+          <w:sz w:val="21"/>
+        </w:rPr>
+        <w:t xml:space="preserve"> (Many people are waiting.)</w:t>
+      </w:r>
+    </w:p>
+    <w:p>
+      <w:pPr>
+        <w:spacing w:before="0" w:after="120"/>
+        <w:ind w:left="576"/>
+      </w:pPr>
+      <w:r>
+        <w:rPr>
+          <w:i/>
+          <w:color w:val="30608C"/>
+          <w:sz w:val="21"/>
+        </w:rPr>
+        <w:t xml:space="preserve">› </w:t>
+      </w:r>
+      <w:r>
+        <w:rPr>
+          <w:i/>
+          <w:color w:val="30608C"/>
+          <w:sz w:val="21"/>
+        </w:rPr>
+        <w:t>Zwei Kinder hören das Gespräch.</w:t>
+      </w:r>
+      <w:r>
+        <w:rPr>
+          <w:i/>
+          <w:color w:val="404040"/>
+          <w:sz w:val="21"/>
+        </w:rPr>
+        <w:t xml:space="preserve"> (Two children listen to the dialogue.)</w:t>
+      </w:r>
+    </w:p>
+    <w:p>
+      <w:pPr>
+        <w:spacing w:before="0" w:after="0"/>
+      </w:pPr>
+    </w:p>
+    <w:p>
+      <w:pPr>
+        <w:spacing w:after="120"/>
+      </w:pPr>
+      <w:r>
+        <w:rPr>
+          <w:b/>
+        </w:rPr>
+        <w:t>was</w:t>
+      </w:r>
+      <w:r>
+        <w:t xml:space="preserve"> /vas/</w:t>
+      </w:r>
+    </w:p>
+    <w:p>
+      <w:pPr>
+        <w:spacing w:after="80"/>
+        <w:ind w:left="576"/>
+      </w:pPr>
+      <w:r>
+        <w:t>Interrogative “what” (Was …?).</w:t>
+      </w:r>
+    </w:p>
+    <w:p>
+      <w:pPr>
+        <w:spacing w:before="40" w:after="60"/>
+        <w:ind w:left="576"/>
+      </w:pPr>
+      <w:r>
+        <w:rPr>
+          <w:i/>
+          <w:color w:val="30608C"/>
+          <w:sz w:val="21"/>
+        </w:rPr>
+        <w:t xml:space="preserve">› </w:t>
+      </w:r>
+      <w:r>
+        <w:rPr>
+          <w:i/>
+          <w:color w:val="30608C"/>
+          <w:sz w:val="21"/>
+        </w:rPr>
+        <w:t>Was sagen die Personen?</w:t>
+      </w:r>
+      <w:r>
+        <w:rPr>
+          <w:i/>
+          <w:color w:val="404040"/>
+          <w:sz w:val="21"/>
+        </w:rPr>
+        <w:t xml:space="preserve"> (What are the people saying?)</w:t>
+      </w:r>
+    </w:p>
+    <w:p>
+      <w:pPr>
+        <w:spacing w:before="0" w:after="120"/>
+        <w:ind w:left="576"/>
+      </w:pPr>
+      <w:r>
+        <w:rPr>
+          <w:i/>
+          <w:color w:val="30608C"/>
+          <w:sz w:val="21"/>
+        </w:rPr>
+        <w:t xml:space="preserve">› </w:t>
+      </w:r>
+      <w:r>
+        <w:rPr>
+          <w:i/>
+          <w:color w:val="30608C"/>
+          <w:sz w:val="21"/>
+        </w:rPr>
+        <w:t>Was trinken die Kinder?</w:t>
+      </w:r>
+      <w:r>
+        <w:rPr>
+          <w:i/>
+          <w:color w:val="404040"/>
+          <w:sz w:val="21"/>
+        </w:rPr>
+        <w:t xml:space="preserve"> (What are the children drinking?)</w:t>
+      </w:r>
+    </w:p>
+    <w:p>
+      <w:pPr>
+        <w:spacing w:before="0" w:after="0"/>
+      </w:pPr>
+    </w:p>
+    <w:p>
+      <w:pPr>
+        <w:spacing w:after="120"/>
+      </w:pPr>
+      <w:r>
+        <w:rPr>
+          <w:b/>
+        </w:rPr>
+        <w:t>passen</w:t>
+      </w:r>
+      <w:r>
+        <w:t xml:space="preserve"> /ˈpasən/</w:t>
+      </w:r>
+    </w:p>
+    <w:p>
+      <w:pPr>
+        <w:spacing w:after="80"/>
+        <w:ind w:left="576"/>
+      </w:pPr>
+      <w:r>
+        <w:t>To fit; match; suit.</w:t>
+      </w:r>
+    </w:p>
+    <w:p>
+      <w:pPr>
+        <w:spacing w:before="40" w:after="60"/>
+        <w:ind w:left="576"/>
+      </w:pPr>
+      <w:r>
+        <w:rPr>
+          <w:i/>
+          <w:color w:val="30608C"/>
+          <w:sz w:val="21"/>
+        </w:rPr>
+        <w:t xml:space="preserve">› </w:t>
+      </w:r>
+      <w:r>
+        <w:rPr>
+          <w:i/>
+          <w:color w:val="30608C"/>
+          <w:sz w:val="21"/>
+        </w:rPr>
+        <w:t>Welches Foto passt?</w:t>
+      </w:r>
+      <w:r>
+        <w:rPr>
+          <w:i/>
+          <w:color w:val="404040"/>
+          <w:sz w:val="21"/>
+        </w:rPr>
+        <w:t xml:space="preserve"> (Which photo fits / matches?)</w:t>
+      </w:r>
+    </w:p>
+    <w:p>
+      <w:pPr>
+        <w:spacing w:before="0" w:after="60"/>
+        <w:ind w:left="576"/>
+      </w:pPr>
+      <w:r>
+        <w:rPr>
+          <w:i/>
+          <w:color w:val="30608C"/>
+          <w:sz w:val="21"/>
+        </w:rPr>
+        <w:t xml:space="preserve">› </w:t>
+      </w:r>
+      <w:r>
+        <w:rPr>
+          <w:i/>
+          <w:color w:val="30608C"/>
+          <w:sz w:val="21"/>
+        </w:rPr>
+        <w:t>Das Bild passt zu diesem Text.</w:t>
+      </w:r>
+      <w:r>
+        <w:rPr>
+          <w:i/>
+          <w:color w:val="404040"/>
+          <w:sz w:val="21"/>
+        </w:rPr>
+        <w:t xml:space="preserve"> (The picture goes with / fits this text passage.)</w:t>
+      </w:r>
+    </w:p>
+    <w:p>
+      <w:pPr>
+        <w:spacing w:before="0" w:after="120"/>
+        <w:ind w:left="576"/>
+      </w:pPr>
+      <w:r>
+        <w:rPr>
+          <w:i/>
+          <w:color w:val="30608C"/>
+          <w:sz w:val="21"/>
+        </w:rPr>
+        <w:t xml:space="preserve">› </w:t>
+      </w:r>
+      <w:r>
+        <w:rPr>
+          <w:i/>
+          <w:color w:val="30608C"/>
+          <w:sz w:val="21"/>
+        </w:rPr>
+        <w:t>Das zweite Foto passt nicht.</w:t>
+      </w:r>
+      <w:r>
+        <w:rPr>
+          <w:i/>
+          <w:color w:val="404040"/>
+          <w:sz w:val="21"/>
+        </w:rPr>
+        <w:t xml:space="preserve"> (The second photo does not fit / is wrong.)</w:t>
+      </w:r>
+    </w:p>
+    <w:p>
+      <w:pPr>
+        <w:spacing w:before="0" w:after="0"/>
+      </w:pPr>
+    </w:p>
+    <w:p>
+      <w:pPr>
+        <w:spacing w:after="120"/>
+      </w:pPr>
+      <w:r>
+        <w:rPr>
+          <w:b/>
+        </w:rPr>
+        <w:t>welcher · welche · welches</w:t>
+      </w:r>
+      <w:r>
+        <w:t xml:space="preserve"> /ˈvɛlçɐ | ˈvɛlçə | ˈvɛlçəs/</w:t>
+      </w:r>
+    </w:p>
+    <w:p>
+      <w:pPr>
+        <w:spacing w:after="80"/>
+        <w:ind w:left="576"/>
+      </w:pPr>
+      <w:r>
+        <w:t>Which (pick by gender: m./f./n.).</w:t>
+      </w:r>
+    </w:p>
+    <w:p>
+      <w:pPr>
+        <w:spacing w:before="40" w:after="60"/>
+        <w:ind w:left="576"/>
+      </w:pPr>
+      <w:r>
+        <w:rPr>
+          <w:i/>
+          <w:color w:val="30608C"/>
+          <w:sz w:val="21"/>
+        </w:rPr>
+        <w:t xml:space="preserve">› </w:t>
+      </w:r>
+      <w:r>
+        <w:rPr>
+          <w:i/>
+          <w:color w:val="30608C"/>
+          <w:sz w:val="21"/>
+        </w:rPr>
+        <w:t>Welches Foto passt?</w:t>
+      </w:r>
+      <w:r>
+        <w:rPr>
+          <w:i/>
+          <w:color w:val="404040"/>
+          <w:sz w:val="21"/>
+        </w:rPr>
+        <w:t xml:space="preserve"> (Which photo fits / matches?)</w:t>
+      </w:r>
+    </w:p>
+    <w:p>
+      <w:pPr>
+        <w:spacing w:before="0" w:after="60"/>
+        <w:ind w:left="576"/>
+      </w:pPr>
+      <w:r>
+        <w:rPr>
+          <w:i/>
+          <w:color w:val="30608C"/>
+          <w:sz w:val="21"/>
+        </w:rPr>
+        <w:t xml:space="preserve">› </w:t>
+      </w:r>
+      <w:r>
+        <w:rPr>
+          <w:i/>
+          <w:color w:val="30608C"/>
+          <w:sz w:val="21"/>
+        </w:rPr>
+        <w:t>Welche Farbe ist das?</w:t>
+      </w:r>
+      <w:r>
+        <w:rPr>
+          <w:i/>
+          <w:color w:val="404040"/>
+          <w:sz w:val="21"/>
+        </w:rPr>
+        <w:t xml:space="preserve"> (What / which color is that?)</w:t>
+      </w:r>
+    </w:p>
+    <w:p>
+      <w:pPr>
+        <w:spacing w:before="0" w:after="120"/>
+        <w:ind w:left="576"/>
+      </w:pPr>
+      <w:r>
+        <w:rPr>
+          <w:i/>
+          <w:color w:val="30608C"/>
+          <w:sz w:val="21"/>
+        </w:rPr>
+        <w:t xml:space="preserve">› </w:t>
+      </w:r>
+      <w:r>
+        <w:rPr>
+          <w:i/>
+          <w:color w:val="30608C"/>
+          <w:sz w:val="21"/>
+        </w:rPr>
+        <w:t>Welche Antwort passt?</w:t>
+      </w:r>
+      <w:r>
+        <w:rPr>
+          <w:i/>
+          <w:color w:val="404040"/>
+          <w:sz w:val="21"/>
+        </w:rPr>
+        <w:t xml:space="preserve"> (Which answer fits / is correct?)</w:t>
+      </w:r>
+    </w:p>
+    <w:p>
+      <w:pPr>
+        <w:spacing w:before="0" w:after="0"/>
+      </w:pPr>
+    </w:p>
+    <w:p>
+      <w:pPr>
+        <w:spacing w:after="120"/>
+      </w:pPr>
+      <w:r>
+        <w:rPr>
+          <w:b/>
+        </w:rPr>
+        <w:t>das Foto</w:t>
+      </w:r>
+      <w:r>
+        <w:t xml:space="preserve"> /ˈfoːto/</w:t>
+      </w:r>
+    </w:p>
+    <w:p>
+      <w:pPr>
+        <w:spacing w:after="80"/>
+        <w:ind w:left="576"/>
+      </w:pPr>
+      <w:r>
+        <w:t>Photo; picture (neuter; pl. Fotos).</w:t>
+      </w:r>
+    </w:p>
+    <w:p>
+      <w:pPr>
+        <w:spacing w:before="40" w:after="60"/>
+        <w:ind w:left="576"/>
+      </w:pPr>
+      <w:r>
+        <w:rPr>
+          <w:i/>
+          <w:color w:val="30608C"/>
+          <w:sz w:val="21"/>
+        </w:rPr>
+        <w:t xml:space="preserve">› </w:t>
+      </w:r>
+      <w:r>
+        <w:rPr>
+          <w:i/>
+          <w:color w:val="30608C"/>
+          <w:sz w:val="21"/>
+        </w:rPr>
+        <w:t>Welches Foto passt?</w:t>
+      </w:r>
+      <w:r>
+        <w:rPr>
+          <w:i/>
+          <w:color w:val="404040"/>
+          <w:sz w:val="21"/>
+        </w:rPr>
+        <w:t xml:space="preserve"> (Which photo fits / matches?)</w:t>
+      </w:r>
+    </w:p>
+    <w:p>
+      <w:pPr>
+        <w:spacing w:before="0" w:after="60"/>
+        <w:ind w:left="576"/>
+      </w:pPr>
+      <w:r>
+        <w:rPr>
+          <w:i/>
+          <w:color w:val="30608C"/>
+          <w:sz w:val="21"/>
+        </w:rPr>
+        <w:t xml:space="preserve">› </w:t>
+      </w:r>
+      <w:r>
+        <w:rPr>
+          <w:i/>
+          <w:color w:val="30608C"/>
+          <w:sz w:val="21"/>
+        </w:rPr>
+        <w:t>Das Foto ist scharf.</w:t>
+      </w:r>
+      <w:r>
+        <w:rPr>
+          <w:i/>
+          <w:color w:val="404040"/>
+          <w:sz w:val="21"/>
+        </w:rPr>
+        <w:t xml:space="preserve"> (The photo is sharp / in focus.)</w:t>
+      </w:r>
+    </w:p>
+    <w:p>
+      <w:pPr>
+        <w:spacing w:before="0" w:after="120"/>
+        <w:ind w:left="576"/>
+      </w:pPr>
+      <w:r>
+        <w:rPr>
+          <w:i/>
+          <w:color w:val="30608C"/>
+          <w:sz w:val="21"/>
+        </w:rPr>
+        <w:t xml:space="preserve">› </w:t>
+      </w:r>
+      <w:r>
+        <w:rPr>
+          <w:i/>
+          <w:color w:val="30608C"/>
+          <w:sz w:val="21"/>
+        </w:rPr>
+        <w:t>Ich sehe drei Fotos.</w:t>
+      </w:r>
+      <w:r>
+        <w:rPr>
+          <w:i/>
+          <w:color w:val="404040"/>
+          <w:sz w:val="21"/>
+        </w:rPr>
+        <w:t xml:space="preserve"> (I see three photos.)</w:t>
+      </w:r>
+    </w:p>
+    <w:p>
+      <w:pPr>
+        <w:spacing w:before="0" w:after="0"/>
+      </w:pPr>
+    </w:p>
+    <w:p>
+      <w:pPr>
+        <w:spacing w:after="120"/>
+      </w:pPr>
+      <w:r>
+        <w:rPr>
+          <w:b/>
+        </w:rPr>
+        <w:t>ankreuzen</w:t>
+      </w:r>
+      <w:r>
+        <w:t xml:space="preserve"> /ˈankʁɔʏtsən/</w:t>
+      </w:r>
+    </w:p>
+    <w:p>
+      <w:pPr>
+        <w:spacing w:after="80"/>
+        <w:ind w:left="576"/>
+      </w:pPr>
+      <w:r>
+        <w:t>Separable: tick a box (… an).</w:t>
       </w:r>
     </w:p>
     <w:p>
@@ -1696,7 +2578,21 @@
           <w:color w:val="404040"/>
           <w:sz w:val="20"/>
         </w:rPr>
-        <w:t>• Elsewhere Guten Tag is often the default; Hallo is informal.</w:t>
+        <w:t>• The prefix an- moves to the end of the clause: Kreuzen Sie die richtige Lösung an.</w:t>
+      </w:r>
+    </w:p>
+    <w:p>
+      <w:pPr>
+        <w:spacing w:after="80"/>
+        <w:ind w:left="576"/>
+      </w:pPr>
+      <w:r>
+        <w:rPr>
+          <w:i/>
+          <w:color w:val="404040"/>
+          <w:sz w:val="20"/>
+        </w:rPr>
+        <w:t>• Participle angekreuzt (perfect often: habe … angekreuzt).</w:t>
       </w:r>
     </w:p>
     <w:p>
@@ -1718,7 +2614,7 @@
           <w:color w:val="30608C"/>
           <w:sz w:val="21"/>
         </w:rPr>
-        <w:t>Grüß Gott!</w:t>
+        <w:t>Kreuzen Sie die richtige Lösung an.</w:t>
       </w:r>
       <w:r>
         <w:rPr>
@@ -1726,7 +2622,7 @@
           <w:color w:val="404040"/>
           <w:sz w:val="21"/>
         </w:rPr>
-        <w:t xml:space="preserve"> (Good day — hello!)</w:t>
+        <w:t xml:space="preserve"> (Please tick the correct answer / solution.)</w:t>
       </w:r>
     </w:p>
     <w:p>
@@ -1748,7 +2644,7 @@
           <w:color w:val="30608C"/>
           <w:sz w:val="21"/>
         </w:rPr>
-        <w:t>Grüß Gott, Frau Schmid!</w:t>
+        <w:t>Kreuzen Sie an, was stimmt.</w:t>
       </w:r>
       <w:r>
         <w:rPr>
@@ -1756,7 +2652,7 @@
           <w:color w:val="404040"/>
           <w:sz w:val="21"/>
         </w:rPr>
-        <w:t xml:space="preserve"> (Hello, Ms. Schmid!)</w:t>
+        <w:t xml:space="preserve"> (Tick / mark what is correct.)</w:t>
       </w:r>
     </w:p>
     <w:p>
@@ -1772,10 +2668,10 @@
         <w:rPr>
           <w:b/>
         </w:rPr>
-        <w:t>ergänzen</w:t>
-      </w:r>
-      <w:r>
-        <w:t xml:space="preserve"> /ˈʔɛʁɡɛntsən/</w:t>
+        <w:t>hören</w:t>
+      </w:r>
+      <w:r>
+        <w:t xml:space="preserve"> /ˈhøːʁən/</w:t>
       </w:r>
     </w:p>
     <w:p>
@@ -1784,7 +2680,7 @@
         <w:ind w:left="576"/>
       </w:pPr>
       <w:r>
-        <w:t>To complete / fill in blanks.</w:t>
+        <w:t>To hear; listen to (+ acc.).</w:t>
       </w:r>
     </w:p>
     <w:p>
@@ -1806,12 +2702,20 @@
           <w:color w:val="30608C"/>
           <w:sz w:val="21"/>
         </w:rPr>
-        <w:t>Lesen Sie das Gespräch und ergänzen Sie. (Read the dialogue, then supply the missing parts</w:t>
+        <w:t>Hören Sie das Gespräch.</w:t>
+      </w:r>
+      <w:r>
+        <w:rPr>
+          <w:i/>
+          <w:color w:val="404040"/>
+          <w:sz w:val="21"/>
+        </w:rPr>
+        <w:t xml:space="preserve"> (Listen to the dialogue [polite / formal “you”].)</w:t>
       </w:r>
     </w:p>
     <w:p>
       <w:pPr>
-        <w:spacing w:before="0" w:after="60"/>
+        <w:spacing w:before="0" w:after="120"/>
         <w:ind w:left="576"/>
       </w:pPr>
       <w:r>
@@ -1828,12 +2732,48 @@
           <w:color w:val="30608C"/>
           <w:sz w:val="21"/>
         </w:rPr>
-        <w:t>fill everything in.)</w:t>
+        <w:t>Ich höre morgens Radio.</w:t>
+      </w:r>
+      <w:r>
+        <w:rPr>
+          <w:i/>
+          <w:color w:val="404040"/>
+          <w:sz w:val="21"/>
+        </w:rPr>
+        <w:t xml:space="preserve"> (I listen to the radio in the mornings.)</w:t>
       </w:r>
     </w:p>
     <w:p>
       <w:pPr>
-        <w:spacing w:before="0" w:after="120"/>
+        <w:spacing w:before="0" w:after="0"/>
+      </w:pPr>
+    </w:p>
+    <w:p>
+      <w:pPr>
+        <w:spacing w:after="120"/>
+      </w:pPr>
+      <w:r>
+        <w:rPr>
+          <w:b/>
+        </w:rPr>
+        <w:t>das Gespräch</w:t>
+      </w:r>
+      <w:r>
+        <w:t xml:space="preserve"> /ɡəˈʃpʁɛːç/</w:t>
+      </w:r>
+    </w:p>
+    <w:p>
+      <w:pPr>
+        <w:spacing w:after="80"/>
+        <w:ind w:left="576"/>
+      </w:pPr>
+      <w:r>
+        <w:t>Conversation; spoken dialogue.</w:t>
+      </w:r>
+    </w:p>
+    <w:p>
+      <w:pPr>
+        <w:spacing w:before="40" w:after="60"/>
         <w:ind w:left="576"/>
       </w:pPr>
       <w:r>
@@ -1850,7 +2790,7 @@
           <w:color w:val="30608C"/>
           <w:sz w:val="21"/>
         </w:rPr>
-        <w:t>Ergänzen Sie die Lücken mit den passenden Wörtern.</w:t>
+        <w:t>Das Gespräch ist kurz.</w:t>
       </w:r>
       <w:r>
         <w:rPr>
@@ -1858,40 +2798,12 @@
           <w:color w:val="404040"/>
           <w:sz w:val="21"/>
         </w:rPr>
-        <w:t xml:space="preserve"> (Fill in the gaps with suitable words.)</w:t>
+        <w:t xml:space="preserve"> (The dialogue is short.)</w:t>
       </w:r>
     </w:p>
     <w:p>
       <w:pPr>
-        <w:spacing w:before="0" w:after="0"/>
-      </w:pPr>
-    </w:p>
-    <w:p>
-      <w:pPr>
-        <w:spacing w:after="120"/>
-      </w:pPr>
-      <w:r>
-        <w:rPr>
-          <w:b/>
-        </w:rPr>
-        <w:t>lesen</w:t>
-      </w:r>
-      <w:r>
-        <w:t xml:space="preserve"> /ˈleːzən/</w:t>
-      </w:r>
-    </w:p>
-    <w:p>
-      <w:pPr>
-        <w:spacing w:after="80"/>
-        <w:ind w:left="576"/>
-      </w:pPr>
-      <w:r>
-        <w:t>To read (+ object in accusative).</w:t>
-      </w:r>
-    </w:p>
-    <w:p>
-      <w:pPr>
-        <w:spacing w:before="40" w:after="60"/>
+        <w:spacing w:before="0" w:after="120"/>
         <w:ind w:left="576"/>
       </w:pPr>
       <w:r>
@@ -1908,12 +2820,48 @@
           <w:color w:val="30608C"/>
           <w:sz w:val="21"/>
         </w:rPr>
-        <w:t>Lesen Sie das Gespräch und ergänzen Sie. (Read the dialogue [aloud/on the page], then finish</w:t>
+        <w:t>Hören Sie bitte noch einmal das Gespräch.</w:t>
+      </w:r>
+      <w:r>
+        <w:rPr>
+          <w:i/>
+          <w:color w:val="404040"/>
+          <w:sz w:val="21"/>
+        </w:rPr>
+        <w:t xml:space="preserve"> (Please listen to the dialogue one more time.)</w:t>
       </w:r>
     </w:p>
     <w:p>
       <w:pPr>
-        <w:spacing w:before="0" w:after="60"/>
+        <w:spacing w:before="0" w:after="0"/>
+      </w:pPr>
+    </w:p>
+    <w:p>
+      <w:pPr>
+        <w:spacing w:after="120"/>
+      </w:pPr>
+      <w:r>
+        <w:rPr>
+          <w:b/>
+        </w:rPr>
+        <w:t>neu</w:t>
+      </w:r>
+      <w:r>
+        <w:t xml:space="preserve"> /nɔʏ/</w:t>
+      </w:r>
+    </w:p>
+    <w:p>
+      <w:pPr>
+        <w:spacing w:after="80"/>
+        <w:ind w:left="576"/>
+      </w:pPr>
+      <w:r>
+        <w:t>New (opposite alt); before a noun, add an ending.</w:t>
+      </w:r>
+    </w:p>
+    <w:p>
+      <w:pPr>
+        <w:spacing w:before="40" w:after="60"/>
         <w:ind w:left="576"/>
       </w:pPr>
       <w:r>
@@ -1930,7 +2878,15 @@
           <w:color w:val="30608C"/>
           <w:sz w:val="21"/>
         </w:rPr>
-        <w:t>fill it in.)</w:t>
+        <w:t>der neue Praktikant</w:t>
+      </w:r>
+      <w:r>
+        <w:rPr>
+          <w:i/>
+          <w:color w:val="404040"/>
+          <w:sz w:val="21"/>
+        </w:rPr>
+        <w:t xml:space="preserve"> (the new intern)</w:t>
       </w:r>
     </w:p>
     <w:p>
@@ -1952,7 +2908,7 @@
           <w:color w:val="30608C"/>
           <w:sz w:val="21"/>
         </w:rPr>
-        <w:t>Lesen Sie die Überschrift zu Beginn der Übung.</w:t>
+        <w:t>Ein neues Auto steht da.</w:t>
       </w:r>
       <w:r>
         <w:rPr>
@@ -1960,7 +2916,7 @@
           <w:color w:val="404040"/>
           <w:sz w:val="21"/>
         </w:rPr>
-        <w:t xml:space="preserve"> (Read the headline at the start of the exercise.)</w:t>
+        <w:t xml:space="preserve"> (A new car is parked there.)</w:t>
       </w:r>
     </w:p>
     <w:p>
@@ -1976,10 +2932,10 @@
         <w:rPr>
           <w:b/>
         </w:rPr>
-        <w:t>sagen</w:t>
-      </w:r>
-      <w:r>
-        <w:t xml:space="preserve"> /ˈzaːɡən/</w:t>
+        <w:t>sein</w:t>
+      </w:r>
+      <w:r>
+        <w:t xml:space="preserve"> /zaɪn/</w:t>
       </w:r>
     </w:p>
     <w:p>
@@ -1988,7 +2944,21 @@
         <w:ind w:left="576"/>
       </w:pPr>
       <w:r>
-        <w:t>To say or tell.</w:t>
+        <w:t>To be (am / is / are).</w:t>
+      </w:r>
+    </w:p>
+    <w:p>
+      <w:pPr>
+        <w:spacing w:after="80"/>
+        <w:ind w:left="576"/>
+      </w:pPr>
+      <w:r>
+        <w:rPr>
+          <w:i/>
+          <w:color w:val="404040"/>
+          <w:sz w:val="20"/>
+        </w:rPr>
+        <w:t>• Complement after sein is usually nominative. Present: ich bin · du bist · ist · wir/sie/Sie sind.</w:t>
       </w:r>
     </w:p>
     <w:p>
@@ -2010,7 +2980,7 @@
           <w:color w:val="30608C"/>
           <w:sz w:val="21"/>
         </w:rPr>
-        <w:t>Was sagen die Personen?</w:t>
+        <w:t>Ich bin der neue Praktikant.</w:t>
       </w:r>
       <w:r>
         <w:rPr>
@@ -2018,12 +2988,12 @@
           <w:color w:val="404040"/>
           <w:sz w:val="21"/>
         </w:rPr>
-        <w:t xml:space="preserve"> (What are the people saying?)</w:t>
+        <w:t xml:space="preserve"> (I'm the new intern.)</w:t>
       </w:r>
     </w:p>
     <w:p>
       <w:pPr>
-        <w:spacing w:before="0" w:after="120"/>
+        <w:spacing w:before="0" w:after="60"/>
         <w:ind w:left="576"/>
       </w:pPr>
       <w:r>
@@ -2040,7 +3010,7 @@
           <w:color w:val="30608C"/>
           <w:sz w:val="21"/>
         </w:rPr>
-        <w:t>Er sagt kurz „Nein“.</w:t>
+        <w:t>Er ist Arzt.</w:t>
       </w:r>
       <w:r>
         <w:rPr>
@@ -2048,40 +3018,12 @@
           <w:color w:val="404040"/>
           <w:sz w:val="21"/>
         </w:rPr>
-        <w:t xml:space="preserve"> (He briefly says “no”.)</w:t>
+        <w:t xml:space="preserve"> (He's a doctor.)</w:t>
       </w:r>
     </w:p>
     <w:p>
       <w:pPr>
-        <w:spacing w:before="0" w:after="0"/>
-      </w:pPr>
-    </w:p>
-    <w:p>
-      <w:pPr>
-        <w:spacing w:after="120"/>
-      </w:pPr>
-      <w:r>
-        <w:rPr>
-          <w:b/>
-        </w:rPr>
-        <w:t>die Person</w:t>
-      </w:r>
-      <w:r>
-        <w:t xml:space="preserve"> /pɛʁˈzoːn/</w:t>
-      </w:r>
-    </w:p>
-    <w:p>
-      <w:pPr>
-        <w:spacing w:after="80"/>
-        <w:ind w:left="576"/>
-      </w:pPr>
-      <w:r>
-        <w:t>Feminine singular: person (pl. Personen).</w:t>
-      </w:r>
-    </w:p>
-    <w:p>
-      <w:pPr>
-        <w:spacing w:before="40" w:after="60"/>
+        <w:spacing w:before="0" w:after="60"/>
         <w:ind w:left="576"/>
       </w:pPr>
       <w:r>
@@ -2098,7 +3040,7 @@
           <w:color w:val="30608C"/>
           <w:sz w:val="21"/>
         </w:rPr>
-        <w:t>Viele Personen warten.</w:t>
+        <w:t>Ist alles richtig?</w:t>
       </w:r>
       <w:r>
         <w:rPr>
@@ -2106,12 +3048,12 @@
           <w:color w:val="404040"/>
           <w:sz w:val="21"/>
         </w:rPr>
-        <w:t xml:space="preserve"> (Many people are waiting.)</w:t>
+        <w:t xml:space="preserve"> (Is everything correct?)</w:t>
       </w:r>
     </w:p>
     <w:p>
       <w:pPr>
-        <w:spacing w:before="0" w:after="120"/>
+        <w:spacing w:before="0" w:after="60"/>
         <w:ind w:left="576"/>
       </w:pPr>
       <w:r>
@@ -2128,7 +3070,7 @@
           <w:color w:val="30608C"/>
           <w:sz w:val="21"/>
         </w:rPr>
-        <w:t>Zwei Kinder hören das Gespräch.</w:t>
+        <w:t>Und ich bin Frau Lange, die Sekretärin.</w:t>
       </w:r>
       <w:r>
         <w:rPr>
@@ -2136,40 +3078,12 @@
           <w:color w:val="404040"/>
           <w:sz w:val="21"/>
         </w:rPr>
-        <w:t xml:space="preserve"> (Two children listen to the dialogue.)</w:t>
+        <w:t xml:space="preserve"> (And I am Ms. Lange, the secretary.)</w:t>
       </w:r>
     </w:p>
     <w:p>
       <w:pPr>
-        <w:spacing w:before="0" w:after="0"/>
-      </w:pPr>
-    </w:p>
-    <w:p>
-      <w:pPr>
-        <w:spacing w:after="120"/>
-      </w:pPr>
-      <w:r>
-        <w:rPr>
-          <w:b/>
-        </w:rPr>
-        <w:t>was</w:t>
-      </w:r>
-      <w:r>
-        <w:t xml:space="preserve"> /vas/</w:t>
-      </w:r>
-    </w:p>
-    <w:p>
-      <w:pPr>
-        <w:spacing w:after="80"/>
-        <w:ind w:left="576"/>
-      </w:pPr>
-      <w:r>
-        <w:t>Interrogative “what” (Was …?).</w:t>
-      </w:r>
-    </w:p>
-    <w:p>
-      <w:pPr>
-        <w:spacing w:before="40" w:after="60"/>
+        <w:spacing w:before="0" w:after="120"/>
         <w:ind w:left="576"/>
       </w:pPr>
       <w:r>
@@ -2186,7 +3100,7 @@
           <w:color w:val="30608C"/>
           <w:sz w:val="21"/>
         </w:rPr>
-        <w:t>Was sagen die Personen?</w:t>
+        <w:t>Wir sind müde.</w:t>
       </w:r>
       <w:r>
         <w:rPr>
@@ -2194,12 +3108,40 @@
           <w:color w:val="404040"/>
           <w:sz w:val="21"/>
         </w:rPr>
-        <w:t xml:space="preserve"> (What are the people saying?)</w:t>
+        <w:t xml:space="preserve"> (We're tired.)</w:t>
       </w:r>
     </w:p>
     <w:p>
       <w:pPr>
-        <w:spacing w:before="0" w:after="120"/>
+        <w:spacing w:before="0" w:after="0"/>
+      </w:pPr>
+    </w:p>
+    <w:p>
+      <w:pPr>
+        <w:spacing w:after="120"/>
+      </w:pPr>
+      <w:r>
+        <w:rPr>
+          <w:b/>
+        </w:rPr>
+        <w:t>der Praktikant</w:t>
+      </w:r>
+      <w:r>
+        <w:t xml:space="preserve"> /pʁaktiˈkant/</w:t>
+      </w:r>
+    </w:p>
+    <w:p>
+      <w:pPr>
+        <w:spacing w:after="80"/>
+        <w:ind w:left="576"/>
+      </w:pPr>
+      <w:r>
+        <w:t>Intern; Praktikantin is the feminine form.</w:t>
+      </w:r>
+    </w:p>
+    <w:p>
+      <w:pPr>
+        <w:spacing w:before="40" w:after="60"/>
         <w:ind w:left="576"/>
       </w:pPr>
       <w:r>
@@ -2216,7 +3158,7 @@
           <w:color w:val="30608C"/>
           <w:sz w:val="21"/>
         </w:rPr>
-        <w:t>Was trinken die Kinder?</w:t>
+        <w:t>Ich mache ein Praktikum in Deutschland.</w:t>
       </w:r>
       <w:r>
         <w:rPr>
@@ -2224,40 +3166,12 @@
           <w:color w:val="404040"/>
           <w:sz w:val="21"/>
         </w:rPr>
-        <w:t xml:space="preserve"> (What are the children drinking?)</w:t>
+        <w:t xml:space="preserve"> (I am doing an internship in Germany.)</w:t>
       </w:r>
     </w:p>
     <w:p>
       <w:pPr>
-        <w:spacing w:before="0" w:after="0"/>
-      </w:pPr>
-    </w:p>
-    <w:p>
-      <w:pPr>
-        <w:spacing w:after="120"/>
-      </w:pPr>
-      <w:r>
-        <w:rPr>
-          <w:b/>
-        </w:rPr>
-        <w:t>passen</w:t>
-      </w:r>
-      <w:r>
-        <w:t xml:space="preserve"> /ˈpasən/</w:t>
-      </w:r>
-    </w:p>
-    <w:p>
-      <w:pPr>
-        <w:spacing w:after="80"/>
-        <w:ind w:left="576"/>
-      </w:pPr>
-      <w:r>
-        <w:t>To fit; match; suit.</w:t>
-      </w:r>
-    </w:p>
-    <w:p>
-      <w:pPr>
-        <w:spacing w:before="40" w:after="60"/>
+        <w:spacing w:before="0" w:after="60"/>
         <w:ind w:left="576"/>
       </w:pPr>
       <w:r>
@@ -2274,7 +3188,15 @@
           <w:color w:val="30608C"/>
           <w:sz w:val="21"/>
         </w:rPr>
-        <w:t>Welches Foto passt? (Which photo fits</w:t>
+        <w:t>Er ist Praktikant bei dieser Firma.</w:t>
+      </w:r>
+      <w:r>
+        <w:rPr>
+          <w:i/>
+          <w:color w:val="404040"/>
+          <w:sz w:val="21"/>
+        </w:rPr>
+        <w:t xml:space="preserve"> (He is an intern at this company.)</w:t>
       </w:r>
     </w:p>
     <w:p>
@@ -2296,12 +3218,20 @@
           <w:color w:val="30608C"/>
           <w:sz w:val="21"/>
         </w:rPr>
-        <w:t>matches?)</w:t>
+        <w:t>Anna ist Praktikantin.</w:t>
+      </w:r>
+      <w:r>
+        <w:rPr>
+          <w:i/>
+          <w:color w:val="404040"/>
+          <w:sz w:val="21"/>
+        </w:rPr>
+        <w:t xml:space="preserve"> (Anna is an intern [female form].)</w:t>
       </w:r>
     </w:p>
     <w:p>
       <w:pPr>
-        <w:spacing w:before="0" w:after="60"/>
+        <w:spacing w:before="0" w:after="120"/>
         <w:ind w:left="576"/>
       </w:pPr>
       <w:r>
@@ -2318,12 +3248,62 @@
           <w:color w:val="30608C"/>
           <w:sz w:val="21"/>
         </w:rPr>
-        <w:t>Das Bild passt zu diesem Text. (The picture goes with</w:t>
+        <w:t>Ich bin der neue Praktikant.</w:t>
+      </w:r>
+      <w:r>
+        <w:rPr>
+          <w:i/>
+          <w:color w:val="404040"/>
+          <w:sz w:val="21"/>
+        </w:rPr>
+        <w:t xml:space="preserve"> (I'm the new intern.)</w:t>
       </w:r>
     </w:p>
     <w:p>
       <w:pPr>
-        <w:spacing w:before="0" w:after="60"/>
+        <w:spacing w:before="0" w:after="0"/>
+      </w:pPr>
+    </w:p>
+    <w:p>
+      <w:pPr>
+        <w:spacing w:after="120"/>
+      </w:pPr>
+      <w:r>
+        <w:rPr>
+          <w:b/>
+        </w:rPr>
+        <w:t>Guten Tag!</w:t>
+      </w:r>
+      <w:r>
+        <w:t xml:space="preserve"> /ˈɡuːtən ˈtaːk/</w:t>
+      </w:r>
+    </w:p>
+    <w:p>
+      <w:pPr>
+        <w:spacing w:after="80"/>
+        <w:ind w:left="576"/>
+      </w:pPr>
+      <w:r>
+        <w:t>Good day; hello (formal daytime).</w:t>
+      </w:r>
+    </w:p>
+    <w:p>
+      <w:pPr>
+        <w:spacing w:after="80"/>
+        <w:ind w:left="576"/>
+      </w:pPr>
+      <w:r>
+        <w:rPr>
+          <w:i/>
+          <w:color w:val="404040"/>
+          <w:sz w:val="20"/>
+        </w:rPr>
+        <w:t>• Compare Guten Tag (masculine) vs Gute Nacht (feminine).</w:t>
+      </w:r>
+    </w:p>
+    <w:p>
+      <w:pPr>
+        <w:spacing w:before="40" w:after="60"/>
         <w:ind w:left="576"/>
       </w:pPr>
       <w:r>
@@ -2340,12 +3320,20 @@
           <w:color w:val="30608C"/>
           <w:sz w:val="21"/>
         </w:rPr>
-        <w:t>fits this text passage.)</w:t>
+        <w:t>Guten Tag, Frau Lange!</w:t>
+      </w:r>
+      <w:r>
+        <w:rPr>
+          <w:i/>
+          <w:color w:val="404040"/>
+          <w:sz w:val="21"/>
+        </w:rPr>
+        <w:t xml:space="preserve"> (Good afternoon / hello, Ms. Lange!)</w:t>
       </w:r>
     </w:p>
     <w:p>
       <w:pPr>
-        <w:spacing w:before="0" w:after="60"/>
+        <w:spacing w:before="0" w:after="120"/>
         <w:ind w:left="576"/>
       </w:pPr>
       <w:r>
@@ -2362,327 +3350,7 @@
           <w:color w:val="30608C"/>
           <w:sz w:val="21"/>
         </w:rPr>
-        <w:t>Das zweite Foto passt nicht. (The second photo does not fit</w:t>
-      </w:r>
-    </w:p>
-    <w:p>
-      <w:pPr>
-        <w:spacing w:before="0" w:after="120"/>
-        <w:ind w:left="576"/>
-      </w:pPr>
-      <w:r>
-        <w:rPr>
-          <w:i/>
-          <w:color w:val="30608C"/>
-          <w:sz w:val="21"/>
-        </w:rPr>
-        <w:t xml:space="preserve">› </w:t>
-      </w:r>
-      <w:r>
-        <w:rPr>
-          <w:i/>
-          <w:color w:val="30608C"/>
-          <w:sz w:val="21"/>
-        </w:rPr>
-        <w:t>is wrong.)</w:t>
-      </w:r>
-    </w:p>
-    <w:p>
-      <w:pPr>
-        <w:spacing w:before="0" w:after="0"/>
-      </w:pPr>
-    </w:p>
-    <w:p>
-      <w:pPr>
-        <w:spacing w:after="120"/>
-      </w:pPr>
-      <w:r>
-        <w:rPr>
-          <w:b/>
-        </w:rPr>
-        <w:t>welcher · welche · welches</w:t>
-      </w:r>
-      <w:r>
-        <w:t xml:space="preserve"> /ˈvɛlçɐ | ˈvɛlçə | ˈvɛlçəs/</w:t>
-      </w:r>
-    </w:p>
-    <w:p>
-      <w:pPr>
-        <w:spacing w:after="80"/>
-        <w:ind w:left="576"/>
-      </w:pPr>
-      <w:r>
-        <w:t>Which (pick by gender: m./f./n.).</w:t>
-      </w:r>
-    </w:p>
-    <w:p>
-      <w:pPr>
-        <w:spacing w:before="40" w:after="60"/>
-        <w:ind w:left="576"/>
-      </w:pPr>
-      <w:r>
-        <w:rPr>
-          <w:i/>
-          <w:color w:val="30608C"/>
-          <w:sz w:val="21"/>
-        </w:rPr>
-        <w:t xml:space="preserve">› </w:t>
-      </w:r>
-      <w:r>
-        <w:rPr>
-          <w:i/>
-          <w:color w:val="30608C"/>
-          <w:sz w:val="21"/>
-        </w:rPr>
-        <w:t>Welches Foto passt? (Which photo fits</w:t>
-      </w:r>
-    </w:p>
-    <w:p>
-      <w:pPr>
-        <w:spacing w:before="0" w:after="60"/>
-        <w:ind w:left="576"/>
-      </w:pPr>
-      <w:r>
-        <w:rPr>
-          <w:i/>
-          <w:color w:val="30608C"/>
-          <w:sz w:val="21"/>
-        </w:rPr>
-        <w:t xml:space="preserve">› </w:t>
-      </w:r>
-      <w:r>
-        <w:rPr>
-          <w:i/>
-          <w:color w:val="30608C"/>
-          <w:sz w:val="21"/>
-        </w:rPr>
-        <w:t>matches?)</w:t>
-      </w:r>
-    </w:p>
-    <w:p>
-      <w:pPr>
-        <w:spacing w:before="0" w:after="60"/>
-        <w:ind w:left="576"/>
-      </w:pPr>
-      <w:r>
-        <w:rPr>
-          <w:i/>
-          <w:color w:val="30608C"/>
-          <w:sz w:val="21"/>
-        </w:rPr>
-        <w:t xml:space="preserve">› </w:t>
-      </w:r>
-      <w:r>
-        <w:rPr>
-          <w:i/>
-          <w:color w:val="30608C"/>
-          <w:sz w:val="21"/>
-        </w:rPr>
-        <w:t>Welche Farbe ist das? (What</w:t>
-      </w:r>
-    </w:p>
-    <w:p>
-      <w:pPr>
-        <w:spacing w:before="0" w:after="60"/>
-        <w:ind w:left="576"/>
-      </w:pPr>
-      <w:r>
-        <w:rPr>
-          <w:i/>
-          <w:color w:val="30608C"/>
-          <w:sz w:val="21"/>
-        </w:rPr>
-        <w:t xml:space="preserve">› </w:t>
-      </w:r>
-      <w:r>
-        <w:rPr>
-          <w:i/>
-          <w:color w:val="30608C"/>
-          <w:sz w:val="21"/>
-        </w:rPr>
-        <w:t>which color is that?)</w:t>
-      </w:r>
-    </w:p>
-    <w:p>
-      <w:pPr>
-        <w:spacing w:before="0" w:after="60"/>
-        <w:ind w:left="576"/>
-      </w:pPr>
-      <w:r>
-        <w:rPr>
-          <w:i/>
-          <w:color w:val="30608C"/>
-          <w:sz w:val="21"/>
-        </w:rPr>
-        <w:t xml:space="preserve">› </w:t>
-      </w:r>
-      <w:r>
-        <w:rPr>
-          <w:i/>
-          <w:color w:val="30608C"/>
-          <w:sz w:val="21"/>
-        </w:rPr>
-        <w:t>Welche Antwort passt? (Which answer fits</w:t>
-      </w:r>
-    </w:p>
-    <w:p>
-      <w:pPr>
-        <w:spacing w:before="0" w:after="120"/>
-        <w:ind w:left="576"/>
-      </w:pPr>
-      <w:r>
-        <w:rPr>
-          <w:i/>
-          <w:color w:val="30608C"/>
-          <w:sz w:val="21"/>
-        </w:rPr>
-        <w:t xml:space="preserve">› </w:t>
-      </w:r>
-      <w:r>
-        <w:rPr>
-          <w:i/>
-          <w:color w:val="30608C"/>
-          <w:sz w:val="21"/>
-        </w:rPr>
-        <w:t>is correct?)</w:t>
-      </w:r>
-    </w:p>
-    <w:p>
-      <w:pPr>
-        <w:spacing w:before="0" w:after="0"/>
-      </w:pPr>
-    </w:p>
-    <w:p>
-      <w:pPr>
-        <w:spacing w:after="120"/>
-      </w:pPr>
-      <w:r>
-        <w:rPr>
-          <w:b/>
-        </w:rPr>
-        <w:t>das Foto</w:t>
-      </w:r>
-      <w:r>
-        <w:t xml:space="preserve"> /ˈfoːto/</w:t>
-      </w:r>
-    </w:p>
-    <w:p>
-      <w:pPr>
-        <w:spacing w:after="80"/>
-        <w:ind w:left="576"/>
-      </w:pPr>
-      <w:r>
-        <w:t>Photo; picture (neuter; pl. Fotos).</w:t>
-      </w:r>
-    </w:p>
-    <w:p>
-      <w:pPr>
-        <w:spacing w:before="40" w:after="60"/>
-        <w:ind w:left="576"/>
-      </w:pPr>
-      <w:r>
-        <w:rPr>
-          <w:i/>
-          <w:color w:val="30608C"/>
-          <w:sz w:val="21"/>
-        </w:rPr>
-        <w:t xml:space="preserve">› </w:t>
-      </w:r>
-      <w:r>
-        <w:rPr>
-          <w:i/>
-          <w:color w:val="30608C"/>
-          <w:sz w:val="21"/>
-        </w:rPr>
-        <w:t>Welches Foto passt? (Which photo fits</w:t>
-      </w:r>
-    </w:p>
-    <w:p>
-      <w:pPr>
-        <w:spacing w:before="0" w:after="60"/>
-        <w:ind w:left="576"/>
-      </w:pPr>
-      <w:r>
-        <w:rPr>
-          <w:i/>
-          <w:color w:val="30608C"/>
-          <w:sz w:val="21"/>
-        </w:rPr>
-        <w:t xml:space="preserve">› </w:t>
-      </w:r>
-      <w:r>
-        <w:rPr>
-          <w:i/>
-          <w:color w:val="30608C"/>
-          <w:sz w:val="21"/>
-        </w:rPr>
-        <w:t>matches?)</w:t>
-      </w:r>
-    </w:p>
-    <w:p>
-      <w:pPr>
-        <w:spacing w:before="0" w:after="60"/>
-        <w:ind w:left="576"/>
-      </w:pPr>
-      <w:r>
-        <w:rPr>
-          <w:i/>
-          <w:color w:val="30608C"/>
-          <w:sz w:val="21"/>
-        </w:rPr>
-        <w:t xml:space="preserve">› </w:t>
-      </w:r>
-      <w:r>
-        <w:rPr>
-          <w:i/>
-          <w:color w:val="30608C"/>
-          <w:sz w:val="21"/>
-        </w:rPr>
-        <w:t>Das Foto ist scharf. (The photo is sharp</w:t>
-      </w:r>
-    </w:p>
-    <w:p>
-      <w:pPr>
-        <w:spacing w:before="0" w:after="60"/>
-        <w:ind w:left="576"/>
-      </w:pPr>
-      <w:r>
-        <w:rPr>
-          <w:i/>
-          <w:color w:val="30608C"/>
-          <w:sz w:val="21"/>
-        </w:rPr>
-        <w:t xml:space="preserve">› </w:t>
-      </w:r>
-      <w:r>
-        <w:rPr>
-          <w:i/>
-          <w:color w:val="30608C"/>
-          <w:sz w:val="21"/>
-        </w:rPr>
-        <w:t>in focus.)</w:t>
-      </w:r>
-    </w:p>
-    <w:p>
-      <w:pPr>
-        <w:spacing w:before="0" w:after="120"/>
-        <w:ind w:left="576"/>
-      </w:pPr>
-      <w:r>
-        <w:rPr>
-          <w:i/>
-          <w:color w:val="30608C"/>
-          <w:sz w:val="21"/>
-        </w:rPr>
-        <w:t xml:space="preserve">› </w:t>
-      </w:r>
-      <w:r>
-        <w:rPr>
-          <w:i/>
-          <w:color w:val="30608C"/>
-          <w:sz w:val="21"/>
-        </w:rPr>
-        <w:t>Ich sehe drei Fotos.</w:t>
+        <w:t>Guten Tag, wie geht es Ihnen?</w:t>
       </w:r>
       <w:r>
         <w:rPr>
@@ -2690,899 +3358,7 @@
           <w:color w:val="404040"/>
           <w:sz w:val="21"/>
         </w:rPr>
-        <w:t xml:space="preserve"> (I see three photos.)</w:t>
-      </w:r>
-    </w:p>
-    <w:p>
-      <w:pPr>
-        <w:spacing w:before="0" w:after="0"/>
-      </w:pPr>
-    </w:p>
-    <w:p>
-      <w:pPr>
-        <w:spacing w:after="120"/>
-      </w:pPr>
-      <w:r>
-        <w:rPr>
-          <w:b/>
-        </w:rPr>
-        <w:t>ankreuzen</w:t>
-      </w:r>
-      <w:r>
-        <w:t xml:space="preserve"> /ˈankʁɔʏtsən/</w:t>
-      </w:r>
-    </w:p>
-    <w:p>
-      <w:pPr>
-        <w:spacing w:after="80"/>
-        <w:ind w:left="576"/>
-      </w:pPr>
-      <w:r>
-        <w:t>Separable: tick a box (… an).</w:t>
-      </w:r>
-    </w:p>
-    <w:p>
-      <w:pPr>
-        <w:spacing w:after="80"/>
-        <w:ind w:left="576"/>
-      </w:pPr>
-      <w:r>
-        <w:rPr>
-          <w:i/>
-          <w:color w:val="404040"/>
-          <w:sz w:val="20"/>
-        </w:rPr>
-        <w:t>• The prefix an- moves to the end of the clause: Kreuzen Sie die richtige Lösung an.</w:t>
-      </w:r>
-    </w:p>
-    <w:p>
-      <w:pPr>
-        <w:spacing w:after="80"/>
-        <w:ind w:left="576"/>
-      </w:pPr>
-      <w:r>
-        <w:rPr>
-          <w:i/>
-          <w:color w:val="404040"/>
-          <w:sz w:val="20"/>
-        </w:rPr>
-        <w:t>• Participle angekreuzt (perfect often: habe … angekreuzt).</w:t>
-      </w:r>
-    </w:p>
-    <w:p>
-      <w:pPr>
-        <w:spacing w:before="40" w:after="60"/>
-        <w:ind w:left="576"/>
-      </w:pPr>
-      <w:r>
-        <w:rPr>
-          <w:i/>
-          <w:color w:val="30608C"/>
-          <w:sz w:val="21"/>
-        </w:rPr>
-        <w:t xml:space="preserve">› </w:t>
-      </w:r>
-      <w:r>
-        <w:rPr>
-          <w:i/>
-          <w:color w:val="30608C"/>
-          <w:sz w:val="21"/>
-        </w:rPr>
-        <w:t>Kreuzen Sie die richtige Lösung an. (Please tick the correct answer</w:t>
-      </w:r>
-    </w:p>
-    <w:p>
-      <w:pPr>
-        <w:spacing w:before="0" w:after="60"/>
-        <w:ind w:left="576"/>
-      </w:pPr>
-      <w:r>
-        <w:rPr>
-          <w:i/>
-          <w:color w:val="30608C"/>
-          <w:sz w:val="21"/>
-        </w:rPr>
-        <w:t xml:space="preserve">› </w:t>
-      </w:r>
-      <w:r>
-        <w:rPr>
-          <w:i/>
-          <w:color w:val="30608C"/>
-          <w:sz w:val="21"/>
-        </w:rPr>
-        <w:t>solution.)</w:t>
-      </w:r>
-    </w:p>
-    <w:p>
-      <w:pPr>
-        <w:spacing w:before="0" w:after="60"/>
-        <w:ind w:left="576"/>
-      </w:pPr>
-      <w:r>
-        <w:rPr>
-          <w:i/>
-          <w:color w:val="30608C"/>
-          <w:sz w:val="21"/>
-        </w:rPr>
-        <w:t xml:space="preserve">› </w:t>
-      </w:r>
-      <w:r>
-        <w:rPr>
-          <w:i/>
-          <w:color w:val="30608C"/>
-          <w:sz w:val="21"/>
-        </w:rPr>
-        <w:t>Kreuzen Sie an, was stimmt. (Tick</w:t>
-      </w:r>
-    </w:p>
-    <w:p>
-      <w:pPr>
-        <w:spacing w:before="0" w:after="120"/>
-        <w:ind w:left="576"/>
-      </w:pPr>
-      <w:r>
-        <w:rPr>
-          <w:i/>
-          <w:color w:val="30608C"/>
-          <w:sz w:val="21"/>
-        </w:rPr>
-        <w:t xml:space="preserve">› </w:t>
-      </w:r>
-      <w:r>
-        <w:rPr>
-          <w:i/>
-          <w:color w:val="30608C"/>
-          <w:sz w:val="21"/>
-        </w:rPr>
-        <w:t>mark what is correct.)</w:t>
-      </w:r>
-    </w:p>
-    <w:p>
-      <w:pPr>
-        <w:spacing w:before="0" w:after="0"/>
-      </w:pPr>
-    </w:p>
-    <w:p>
-      <w:pPr>
-        <w:spacing w:after="120"/>
-      </w:pPr>
-      <w:r>
-        <w:rPr>
-          <w:b/>
-        </w:rPr>
-        <w:t>hören</w:t>
-      </w:r>
-      <w:r>
-        <w:t xml:space="preserve"> /ˈhøːʁən/</w:t>
-      </w:r>
-    </w:p>
-    <w:p>
-      <w:pPr>
-        <w:spacing w:after="80"/>
-        <w:ind w:left="576"/>
-      </w:pPr>
-      <w:r>
-        <w:t>To hear; listen to (+ acc.).</w:t>
-      </w:r>
-    </w:p>
-    <w:p>
-      <w:pPr>
-        <w:spacing w:before="40" w:after="60"/>
-        <w:ind w:left="576"/>
-      </w:pPr>
-      <w:r>
-        <w:rPr>
-          <w:i/>
-          <w:color w:val="30608C"/>
-          <w:sz w:val="21"/>
-        </w:rPr>
-        <w:t xml:space="preserve">› </w:t>
-      </w:r>
-      <w:r>
-        <w:rPr>
-          <w:i/>
-          <w:color w:val="30608C"/>
-          <w:sz w:val="21"/>
-        </w:rPr>
-        <w:t>Hören Sie das Gespräch. (Listen to the dialogue [polite</w:t>
-      </w:r>
-    </w:p>
-    <w:p>
-      <w:pPr>
-        <w:spacing w:before="0" w:after="60"/>
-        <w:ind w:left="576"/>
-      </w:pPr>
-      <w:r>
-        <w:rPr>
-          <w:i/>
-          <w:color w:val="30608C"/>
-          <w:sz w:val="21"/>
-        </w:rPr>
-        <w:t xml:space="preserve">› </w:t>
-      </w:r>
-      <w:r>
-        <w:rPr>
-          <w:i/>
-          <w:color w:val="30608C"/>
-          <w:sz w:val="21"/>
-        </w:rPr>
-        <w:t>formal “you”].)</w:t>
-      </w:r>
-    </w:p>
-    <w:p>
-      <w:pPr>
-        <w:spacing w:before="0" w:after="120"/>
-        <w:ind w:left="576"/>
-      </w:pPr>
-      <w:r>
-        <w:rPr>
-          <w:i/>
-          <w:color w:val="30608C"/>
-          <w:sz w:val="21"/>
-        </w:rPr>
-        <w:t xml:space="preserve">› </w:t>
-      </w:r>
-      <w:r>
-        <w:rPr>
-          <w:i/>
-          <w:color w:val="30608C"/>
-          <w:sz w:val="21"/>
-        </w:rPr>
-        <w:t>Ich höre morgens Radio.</w:t>
-      </w:r>
-      <w:r>
-        <w:rPr>
-          <w:i/>
-          <w:color w:val="404040"/>
-          <w:sz w:val="21"/>
-        </w:rPr>
-        <w:t xml:space="preserve"> (I listen to the radio in the mornings.)</w:t>
-      </w:r>
-    </w:p>
-    <w:p>
-      <w:pPr>
-        <w:spacing w:before="0" w:after="0"/>
-      </w:pPr>
-    </w:p>
-    <w:p>
-      <w:pPr>
-        <w:spacing w:after="120"/>
-      </w:pPr>
-      <w:r>
-        <w:rPr>
-          <w:b/>
-        </w:rPr>
-        <w:t>das Gespräch</w:t>
-      </w:r>
-      <w:r>
-        <w:t xml:space="preserve"> /ɡəˈʃpʁɛːç/</w:t>
-      </w:r>
-    </w:p>
-    <w:p>
-      <w:pPr>
-        <w:spacing w:after="80"/>
-        <w:ind w:left="576"/>
-      </w:pPr>
-      <w:r>
-        <w:t>Conversation; spoken dialogue.</w:t>
-      </w:r>
-    </w:p>
-    <w:p>
-      <w:pPr>
-        <w:spacing w:before="40" w:after="60"/>
-        <w:ind w:left="576"/>
-      </w:pPr>
-      <w:r>
-        <w:rPr>
-          <w:i/>
-          <w:color w:val="30608C"/>
-          <w:sz w:val="21"/>
-        </w:rPr>
-        <w:t xml:space="preserve">› </w:t>
-      </w:r>
-      <w:r>
-        <w:rPr>
-          <w:i/>
-          <w:color w:val="30608C"/>
-          <w:sz w:val="21"/>
-        </w:rPr>
-        <w:t>Das Gespräch ist kurz.</w:t>
-      </w:r>
-      <w:r>
-        <w:rPr>
-          <w:i/>
-          <w:color w:val="404040"/>
-          <w:sz w:val="21"/>
-        </w:rPr>
-        <w:t xml:space="preserve"> (The dialogue is short.)</w:t>
-      </w:r>
-    </w:p>
-    <w:p>
-      <w:pPr>
-        <w:spacing w:before="0" w:after="120"/>
-        <w:ind w:left="576"/>
-      </w:pPr>
-      <w:r>
-        <w:rPr>
-          <w:i/>
-          <w:color w:val="30608C"/>
-          <w:sz w:val="21"/>
-        </w:rPr>
-        <w:t xml:space="preserve">› </w:t>
-      </w:r>
-      <w:r>
-        <w:rPr>
-          <w:i/>
-          <w:color w:val="30608C"/>
-          <w:sz w:val="21"/>
-        </w:rPr>
-        <w:t>Hören Sie bitte noch einmal das Gespräch.</w:t>
-      </w:r>
-      <w:r>
-        <w:rPr>
-          <w:i/>
-          <w:color w:val="404040"/>
-          <w:sz w:val="21"/>
-        </w:rPr>
-        <w:t xml:space="preserve"> (Please listen to the dialogue one more time.)</w:t>
-      </w:r>
-    </w:p>
-    <w:p>
-      <w:pPr>
-        <w:spacing w:before="0" w:after="0"/>
-      </w:pPr>
-    </w:p>
-    <w:p>
-      <w:pPr>
-        <w:spacing w:after="120"/>
-      </w:pPr>
-      <w:r>
-        <w:rPr>
-          <w:b/>
-        </w:rPr>
-        <w:t>neu</w:t>
-      </w:r>
-      <w:r>
-        <w:t xml:space="preserve"> /nɔʏ/</w:t>
-      </w:r>
-    </w:p>
-    <w:p>
-      <w:pPr>
-        <w:spacing w:after="80"/>
-        <w:ind w:left="576"/>
-      </w:pPr>
-      <w:r>
-        <w:t>New (opposite alt); before a noun, add an ending.</w:t>
-      </w:r>
-    </w:p>
-    <w:p>
-      <w:pPr>
-        <w:spacing w:before="40" w:after="60"/>
-        <w:ind w:left="576"/>
-      </w:pPr>
-      <w:r>
-        <w:rPr>
-          <w:i/>
-          <w:color w:val="30608C"/>
-          <w:sz w:val="21"/>
-        </w:rPr>
-        <w:t xml:space="preserve">› </w:t>
-      </w:r>
-      <w:r>
-        <w:rPr>
-          <w:i/>
-          <w:color w:val="30608C"/>
-          <w:sz w:val="21"/>
-        </w:rPr>
-        <w:t>der neue Praktikant</w:t>
-      </w:r>
-      <w:r>
-        <w:rPr>
-          <w:i/>
-          <w:color w:val="404040"/>
-          <w:sz w:val="21"/>
-        </w:rPr>
-        <w:t xml:space="preserve"> (the new intern)</w:t>
-      </w:r>
-    </w:p>
-    <w:p>
-      <w:pPr>
-        <w:spacing w:before="0" w:after="120"/>
-        <w:ind w:left="576"/>
-      </w:pPr>
-      <w:r>
-        <w:rPr>
-          <w:i/>
-          <w:color w:val="30608C"/>
-          <w:sz w:val="21"/>
-        </w:rPr>
-        <w:t xml:space="preserve">› </w:t>
-      </w:r>
-      <w:r>
-        <w:rPr>
-          <w:i/>
-          <w:color w:val="30608C"/>
-          <w:sz w:val="21"/>
-        </w:rPr>
-        <w:t>Ein neues Auto steht da.</w:t>
-      </w:r>
-      <w:r>
-        <w:rPr>
-          <w:i/>
-          <w:color w:val="404040"/>
-          <w:sz w:val="21"/>
-        </w:rPr>
-        <w:t xml:space="preserve"> (A new car is parked there.)</w:t>
-      </w:r>
-    </w:p>
-    <w:p>
-      <w:pPr>
-        <w:spacing w:before="0" w:after="0"/>
-      </w:pPr>
-    </w:p>
-    <w:p>
-      <w:pPr>
-        <w:spacing w:after="120"/>
-      </w:pPr>
-      <w:r>
-        <w:rPr>
-          <w:b/>
-        </w:rPr>
-        <w:t>sein</w:t>
-      </w:r>
-      <w:r>
-        <w:t xml:space="preserve"> /zaɪn/</w:t>
-      </w:r>
-    </w:p>
-    <w:p>
-      <w:pPr>
-        <w:spacing w:after="80"/>
-        <w:ind w:left="576"/>
-      </w:pPr>
-      <w:r>
-        <w:t>To be (am / is / are).</w:t>
-      </w:r>
-    </w:p>
-    <w:p>
-      <w:pPr>
-        <w:spacing w:after="80"/>
-        <w:ind w:left="576"/>
-      </w:pPr>
-      <w:r>
-        <w:rPr>
-          <w:i/>
-          <w:color w:val="404040"/>
-          <w:sz w:val="20"/>
-        </w:rPr>
-        <w:t>• Complement after sein is usually nominative. Present: ich bin · du bist · ist · wir/sie/Sie sind.</w:t>
-      </w:r>
-    </w:p>
-    <w:p>
-      <w:pPr>
-        <w:spacing w:before="40" w:after="60"/>
-        <w:ind w:left="576"/>
-      </w:pPr>
-      <w:r>
-        <w:rPr>
-          <w:i/>
-          <w:color w:val="30608C"/>
-          <w:sz w:val="21"/>
-        </w:rPr>
-        <w:t xml:space="preserve">› </w:t>
-      </w:r>
-      <w:r>
-        <w:rPr>
-          <w:i/>
-          <w:color w:val="30608C"/>
-          <w:sz w:val="21"/>
-        </w:rPr>
-        <w:t>Ich bin der neue Praktikant.</w:t>
-      </w:r>
-      <w:r>
-        <w:rPr>
-          <w:i/>
-          <w:color w:val="404040"/>
-          <w:sz w:val="21"/>
-        </w:rPr>
-        <w:t xml:space="preserve"> (I'm the new intern.)</w:t>
-      </w:r>
-    </w:p>
-    <w:p>
-      <w:pPr>
-        <w:spacing w:before="0" w:after="60"/>
-        <w:ind w:left="576"/>
-      </w:pPr>
-      <w:r>
-        <w:rPr>
-          <w:i/>
-          <w:color w:val="30608C"/>
-          <w:sz w:val="21"/>
-        </w:rPr>
-        <w:t xml:space="preserve">› </w:t>
-      </w:r>
-      <w:r>
-        <w:rPr>
-          <w:i/>
-          <w:color w:val="30608C"/>
-          <w:sz w:val="21"/>
-        </w:rPr>
-        <w:t>Er ist Arzt.</w:t>
-      </w:r>
-      <w:r>
-        <w:rPr>
-          <w:i/>
-          <w:color w:val="404040"/>
-          <w:sz w:val="21"/>
-        </w:rPr>
-        <w:t xml:space="preserve"> (He's a doctor.)</w:t>
-      </w:r>
-    </w:p>
-    <w:p>
-      <w:pPr>
-        <w:spacing w:before="0" w:after="60"/>
-        <w:ind w:left="576"/>
-      </w:pPr>
-      <w:r>
-        <w:rPr>
-          <w:i/>
-          <w:color w:val="30608C"/>
-          <w:sz w:val="21"/>
-        </w:rPr>
-        <w:t xml:space="preserve">› </w:t>
-      </w:r>
-      <w:r>
-        <w:rPr>
-          <w:i/>
-          <w:color w:val="30608C"/>
-          <w:sz w:val="21"/>
-        </w:rPr>
-        <w:t>Ist alles richtig?</w:t>
-      </w:r>
-      <w:r>
-        <w:rPr>
-          <w:i/>
-          <w:color w:val="404040"/>
-          <w:sz w:val="21"/>
-        </w:rPr>
-        <w:t xml:space="preserve"> (Is everything correct?)</w:t>
-      </w:r>
-    </w:p>
-    <w:p>
-      <w:pPr>
-        <w:spacing w:before="0" w:after="60"/>
-        <w:ind w:left="576"/>
-      </w:pPr>
-      <w:r>
-        <w:rPr>
-          <w:i/>
-          <w:color w:val="30608C"/>
-          <w:sz w:val="21"/>
-        </w:rPr>
-        <w:t xml:space="preserve">› </w:t>
-      </w:r>
-      <w:r>
-        <w:rPr>
-          <w:i/>
-          <w:color w:val="30608C"/>
-          <w:sz w:val="21"/>
-        </w:rPr>
-        <w:t>Und ich bin Frau Lange, die Sekretärin.</w:t>
-      </w:r>
-      <w:r>
-        <w:rPr>
-          <w:i/>
-          <w:color w:val="404040"/>
-          <w:sz w:val="21"/>
-        </w:rPr>
-        <w:t xml:space="preserve"> (And I am Ms. Lange, the secretary.)</w:t>
-      </w:r>
-    </w:p>
-    <w:p>
-      <w:pPr>
-        <w:spacing w:before="0" w:after="120"/>
-        <w:ind w:left="576"/>
-      </w:pPr>
-      <w:r>
-        <w:rPr>
-          <w:i/>
-          <w:color w:val="30608C"/>
-          <w:sz w:val="21"/>
-        </w:rPr>
-        <w:t xml:space="preserve">› </w:t>
-      </w:r>
-      <w:r>
-        <w:rPr>
-          <w:i/>
-          <w:color w:val="30608C"/>
-          <w:sz w:val="21"/>
-        </w:rPr>
-        <w:t>Wir sind müde.</w:t>
-      </w:r>
-      <w:r>
-        <w:rPr>
-          <w:i/>
-          <w:color w:val="404040"/>
-          <w:sz w:val="21"/>
-        </w:rPr>
-        <w:t xml:space="preserve"> (We're tired.)</w:t>
-      </w:r>
-    </w:p>
-    <w:p>
-      <w:pPr>
-        <w:spacing w:before="0" w:after="0"/>
-      </w:pPr>
-    </w:p>
-    <w:p>
-      <w:pPr>
-        <w:spacing w:after="120"/>
-      </w:pPr>
-      <w:r>
-        <w:rPr>
-          <w:b/>
-        </w:rPr>
-        <w:t>der Praktikant</w:t>
-      </w:r>
-      <w:r>
-        <w:t xml:space="preserve"> /pʁaktiˈkant/</w:t>
-      </w:r>
-    </w:p>
-    <w:p>
-      <w:pPr>
-        <w:spacing w:after="80"/>
-        <w:ind w:left="576"/>
-      </w:pPr>
-      <w:r>
-        <w:t>Intern; Praktikantin is the feminine form.</w:t>
-      </w:r>
-    </w:p>
-    <w:p>
-      <w:pPr>
-        <w:spacing w:before="40" w:after="60"/>
-        <w:ind w:left="576"/>
-      </w:pPr>
-      <w:r>
-        <w:rPr>
-          <w:i/>
-          <w:color w:val="30608C"/>
-          <w:sz w:val="21"/>
-        </w:rPr>
-        <w:t xml:space="preserve">› </w:t>
-      </w:r>
-      <w:r>
-        <w:rPr>
-          <w:i/>
-          <w:color w:val="30608C"/>
-          <w:sz w:val="21"/>
-        </w:rPr>
-        <w:t>Ich mache ein Praktikum in Deutschland.</w:t>
-      </w:r>
-      <w:r>
-        <w:rPr>
-          <w:i/>
-          <w:color w:val="404040"/>
-          <w:sz w:val="21"/>
-        </w:rPr>
-        <w:t xml:space="preserve"> (I am doing an internship in Germany.)</w:t>
-      </w:r>
-    </w:p>
-    <w:p>
-      <w:pPr>
-        <w:spacing w:before="0" w:after="60"/>
-        <w:ind w:left="576"/>
-      </w:pPr>
-      <w:r>
-        <w:rPr>
-          <w:i/>
-          <w:color w:val="30608C"/>
-          <w:sz w:val="21"/>
-        </w:rPr>
-        <w:t xml:space="preserve">› </w:t>
-      </w:r>
-      <w:r>
-        <w:rPr>
-          <w:i/>
-          <w:color w:val="30608C"/>
-          <w:sz w:val="21"/>
-        </w:rPr>
-        <w:t>Er ist Praktikant bei dieser Firma.</w:t>
-      </w:r>
-      <w:r>
-        <w:rPr>
-          <w:i/>
-          <w:color w:val="404040"/>
-          <w:sz w:val="21"/>
-        </w:rPr>
-        <w:t xml:space="preserve"> (He is an intern at this company.)</w:t>
-      </w:r>
-    </w:p>
-    <w:p>
-      <w:pPr>
-        <w:spacing w:before="0" w:after="60"/>
-        <w:ind w:left="576"/>
-      </w:pPr>
-      <w:r>
-        <w:rPr>
-          <w:i/>
-          <w:color w:val="30608C"/>
-          <w:sz w:val="21"/>
-        </w:rPr>
-        <w:t xml:space="preserve">› </w:t>
-      </w:r>
-      <w:r>
-        <w:rPr>
-          <w:i/>
-          <w:color w:val="30608C"/>
-          <w:sz w:val="21"/>
-        </w:rPr>
-        <w:t>Anna ist Praktikantin.</w:t>
-      </w:r>
-      <w:r>
-        <w:rPr>
-          <w:i/>
-          <w:color w:val="404040"/>
-          <w:sz w:val="21"/>
-        </w:rPr>
-        <w:t xml:space="preserve"> (Anna is an intern [female form].)</w:t>
-      </w:r>
-    </w:p>
-    <w:p>
-      <w:pPr>
-        <w:spacing w:before="0" w:after="120"/>
-        <w:ind w:left="576"/>
-      </w:pPr>
-      <w:r>
-        <w:rPr>
-          <w:i/>
-          <w:color w:val="30608C"/>
-          <w:sz w:val="21"/>
-        </w:rPr>
-        <w:t xml:space="preserve">› </w:t>
-      </w:r>
-      <w:r>
-        <w:rPr>
-          <w:i/>
-          <w:color w:val="30608C"/>
-          <w:sz w:val="21"/>
-        </w:rPr>
-        <w:t>Ich bin der neue Praktikant.</w:t>
-      </w:r>
-      <w:r>
-        <w:rPr>
-          <w:i/>
-          <w:color w:val="404040"/>
-          <w:sz w:val="21"/>
-        </w:rPr>
-        <w:t xml:space="preserve"> (I'm the new intern.)</w:t>
-      </w:r>
-    </w:p>
-    <w:p>
-      <w:pPr>
-        <w:spacing w:before="0" w:after="0"/>
-      </w:pPr>
-    </w:p>
-    <w:p>
-      <w:pPr>
-        <w:spacing w:after="120"/>
-      </w:pPr>
-      <w:r>
-        <w:rPr>
-          <w:b/>
-        </w:rPr>
-        <w:t>Guten Tag!</w:t>
-      </w:r>
-      <w:r>
-        <w:t xml:space="preserve"> /ˈɡuːtən ˈtaːk/</w:t>
-      </w:r>
-    </w:p>
-    <w:p>
-      <w:pPr>
-        <w:spacing w:after="80"/>
-        <w:ind w:left="576"/>
-      </w:pPr>
-      <w:r>
-        <w:t>Good day; hello (formal daytime).</w:t>
-      </w:r>
-    </w:p>
-    <w:p>
-      <w:pPr>
-        <w:spacing w:after="80"/>
-        <w:ind w:left="576"/>
-      </w:pPr>
-      <w:r>
-        <w:rPr>
-          <w:i/>
-          <w:color w:val="404040"/>
-          <w:sz w:val="20"/>
-        </w:rPr>
-        <w:t>• Compare Guten Tag (masculine) vs Gute Nacht (feminine).</w:t>
-      </w:r>
-    </w:p>
-    <w:p>
-      <w:pPr>
-        <w:spacing w:before="40" w:after="60"/>
-        <w:ind w:left="576"/>
-      </w:pPr>
-      <w:r>
-        <w:rPr>
-          <w:i/>
-          <w:color w:val="30608C"/>
-          <w:sz w:val="21"/>
-        </w:rPr>
-        <w:t xml:space="preserve">› </w:t>
-      </w:r>
-      <w:r>
-        <w:rPr>
-          <w:i/>
-          <w:color w:val="30608C"/>
-          <w:sz w:val="21"/>
-        </w:rPr>
-        <w:t>Guten Tag, Frau Lange! (Good afternoon</w:t>
-      </w:r>
-    </w:p>
-    <w:p>
-      <w:pPr>
-        <w:spacing w:before="0" w:after="60"/>
-        <w:ind w:left="576"/>
-      </w:pPr>
-      <w:r>
-        <w:rPr>
-          <w:i/>
-          <w:color w:val="30608C"/>
-          <w:sz w:val="21"/>
-        </w:rPr>
-        <w:t xml:space="preserve">› </w:t>
-      </w:r>
-      <w:r>
-        <w:rPr>
-          <w:i/>
-          <w:color w:val="30608C"/>
-          <w:sz w:val="21"/>
-        </w:rPr>
-        <w:t>hello, Ms. Lange!)</w:t>
-      </w:r>
-    </w:p>
-    <w:p>
-      <w:pPr>
-        <w:spacing w:before="0" w:after="60"/>
-        <w:ind w:left="576"/>
-      </w:pPr>
-      <w:r>
-        <w:rPr>
-          <w:i/>
-          <w:color w:val="30608C"/>
-          <w:sz w:val="21"/>
-        </w:rPr>
-        <w:t xml:space="preserve">› </w:t>
-      </w:r>
-      <w:r>
-        <w:rPr>
-          <w:i/>
-          <w:color w:val="30608C"/>
-          <w:sz w:val="21"/>
-        </w:rPr>
-        <w:t>Guten Tag, wie geht es Ihnen? (Hello</w:t>
-      </w:r>
-    </w:p>
-    <w:p>
-      <w:pPr>
-        <w:spacing w:before="0" w:after="120"/>
-        <w:ind w:left="576"/>
-      </w:pPr>
-      <w:r>
-        <w:rPr>
-          <w:i/>
-          <w:color w:val="30608C"/>
-          <w:sz w:val="21"/>
-        </w:rPr>
-        <w:t xml:space="preserve">› </w:t>
-      </w:r>
-      <w:r>
-        <w:rPr>
-          <w:i/>
-          <w:color w:val="30608C"/>
-          <w:sz w:val="21"/>
-        </w:rPr>
-        <w:t>good day — how are you [formal]?)</w:t>
+        <w:t xml:space="preserve"> (Hello / good day — how are you [formal]?)</w:t>
       </w:r>
     </w:p>
     <w:sectPr>

</xml_diff>

<commit_message>
Update vocabulary formatting and sync instructions across files
- Revised the docstring in `sync_manifest_from_docx.py` to clarify the purpose of the script and its usage after saving changes in `vocab.docx`.
- Reformatted entries in `vocab.docx` for consistency, ensuring definitions and examples are clearly presented with proper indentation.
- Updated `vocab.manifest.json` to reflect the new formatting of gloss entries, ensuring they are presented as arrays for better clarity.
- Enhanced documentation in `WIKI.md` to provide clearer instructions on the workflow for syncing and building between Word and JSON files.
</commit_message>
<xml_diff>
--- a/vocab.docx
+++ b/vocab.docx
@@ -1377,19 +1377,7 @@
           <w:sz w:val="21"/>
           <w:shd w:fill="auto" w:val="clear"/>
         </w:rPr>
-        <w:t xml:space="preserve">Das ist die </w:t>
-      </w:r>
-      <w:r>
-        <w:rPr>
-          <w:rFonts w:ascii="Calibri" w:hAnsi="Calibri" w:cs="Calibri" w:eastAsia="Calibri"/>
-          <w:i/>
-          <w:color w:val="30608C"/>
-          <w:spacing w:val="0"/>
-          <w:position w:val="0"/>
-          <w:sz w:val="21"/>
-          <w:shd w:fill="auto" w:val="clear"/>
-        </w:rPr>
-        <w:t xml:space="preserve">Übersicht auf einen Blick.</w:t>
+        <w:t xml:space="preserve">Das ist die Übersicht auf einen Blick.</w:t>
       </w:r>
       <w:r>
         <w:rPr>
@@ -2645,19 +2633,7 @@
           <w:sz w:val="21"/>
           <w:shd w:fill="auto" w:val="clear"/>
         </w:rPr>
-        <w:t xml:space="preserve">Und ich bin Frau Lange, die Sekret</w:t>
-      </w:r>
-      <w:r>
-        <w:rPr>
-          <w:rFonts w:ascii="Calibri" w:hAnsi="Calibri" w:cs="Calibri" w:eastAsia="Calibri"/>
-          <w:i/>
-          <w:color w:val="30608C"/>
-          <w:spacing w:val="0"/>
-          <w:position w:val="0"/>
-          <w:sz w:val="21"/>
-          <w:shd w:fill="auto" w:val="clear"/>
-        </w:rPr>
-        <w:t xml:space="preserve">ärin.</w:t>
+        <w:t xml:space="preserve">Und ich bin Frau Lange, die Sekretärin.</w:t>
       </w:r>
       <w:r>
         <w:rPr>
@@ -2708,19 +2684,7 @@
           <w:sz w:val="21"/>
           <w:shd w:fill="auto" w:val="clear"/>
         </w:rPr>
-        <w:t xml:space="preserve">Sie ist Sekret</w:t>
-      </w:r>
-      <w:r>
-        <w:rPr>
-          <w:rFonts w:ascii="Calibri" w:hAnsi="Calibri" w:cs="Calibri" w:eastAsia="Calibri"/>
-          <w:i/>
-          <w:color w:val="30608C"/>
-          <w:spacing w:val="0"/>
-          <w:position w:val="0"/>
-          <w:sz w:val="21"/>
-          <w:shd w:fill="auto" w:val="clear"/>
-        </w:rPr>
-        <w:t xml:space="preserve">ärin.</w:t>
+        <w:t xml:space="preserve">Sie ist Sekretärin.</w:t>
       </w:r>
       <w:r>
         <w:rPr>
@@ -2771,19 +2735,7 @@
           <w:sz w:val="21"/>
           <w:shd w:fill="auto" w:val="clear"/>
         </w:rPr>
-        <w:t xml:space="preserve">der Sekret</w:t>
-      </w:r>
-      <w:r>
-        <w:rPr>
-          <w:rFonts w:ascii="Calibri" w:hAnsi="Calibri" w:cs="Calibri" w:eastAsia="Calibri"/>
-          <w:i/>
-          <w:color w:val="30608C"/>
-          <w:spacing w:val="0"/>
-          <w:position w:val="0"/>
-          <w:sz w:val="21"/>
-          <w:shd w:fill="auto" w:val="clear"/>
-        </w:rPr>
-        <w:t xml:space="preserve">är</w:t>
+        <w:t xml:space="preserve">der Sekretär</w:t>
       </w:r>
       <w:r>
         <w:rPr>
@@ -3008,19 +2960,7 @@
           <w:sz w:val="21"/>
           <w:shd w:fill="auto" w:val="clear"/>
         </w:rPr>
-        <w:t xml:space="preserve">Und ich bin Frau Lange, die Sekret</w:t>
-      </w:r>
-      <w:r>
-        <w:rPr>
-          <w:rFonts w:ascii="Calibri" w:hAnsi="Calibri" w:cs="Calibri" w:eastAsia="Calibri"/>
-          <w:i/>
-          <w:color w:val="30608C"/>
-          <w:spacing w:val="0"/>
-          <w:position w:val="0"/>
-          <w:sz w:val="21"/>
-          <w:shd w:fill="auto" w:val="clear"/>
-        </w:rPr>
-        <w:t xml:space="preserve">ärin.</w:t>
+        <w:t xml:space="preserve">Und ich bin Frau Lange, die Sekretärin.</w:t>
       </w:r>
       <w:r>
         <w:rPr>
@@ -3863,19 +3803,7 @@
           <w:sz w:val="21"/>
           <w:shd w:fill="auto" w:val="clear"/>
         </w:rPr>
-        <w:t xml:space="preserve">Ich komme aus </w:t>
-      </w:r>
-      <w:r>
-        <w:rPr>
-          <w:rFonts w:ascii="Calibri" w:hAnsi="Calibri" w:cs="Calibri" w:eastAsia="Calibri"/>
-          <w:i/>
-          <w:color w:val="30608C"/>
-          <w:spacing w:val="0"/>
-          <w:position w:val="0"/>
-          <w:sz w:val="21"/>
-          <w:shd w:fill="auto" w:val="clear"/>
-        </w:rPr>
-        <w:t xml:space="preserve">Österreich.</w:t>
+        <w:t xml:space="preserve">Ich komme aus Österreich.</w:t>
       </w:r>
       <w:r>
         <w:rPr>
@@ -4195,19 +4123,7 @@
           <w:sz w:val="21"/>
           <w:shd w:fill="auto" w:val="clear"/>
         </w:rPr>
-        <w:t xml:space="preserve">Sie kommen aus M</w:t>
-      </w:r>
-      <w:r>
-        <w:rPr>
-          <w:rFonts w:ascii="Calibri" w:hAnsi="Calibri" w:cs="Calibri" w:eastAsia="Calibri"/>
-          <w:i/>
-          <w:color w:val="30608C"/>
-          <w:spacing w:val="0"/>
-          <w:position w:val="0"/>
-          <w:sz w:val="21"/>
-          <w:shd w:fill="auto" w:val="clear"/>
-        </w:rPr>
-        <w:t xml:space="preserve">ünchen.</w:t>
+        <w:t xml:space="preserve">Sie kommen aus München.</w:t>
       </w:r>
       <w:r>
         <w:rPr>
@@ -4544,19 +4460,7 @@
           <w:sz w:val="21"/>
           <w:shd w:fill="auto" w:val="clear"/>
         </w:rPr>
-        <w:t xml:space="preserve">Gr</w:t>
-      </w:r>
-      <w:r>
-        <w:rPr>
-          <w:rFonts w:ascii="Calibri" w:hAnsi="Calibri" w:cs="Calibri" w:eastAsia="Calibri"/>
-          <w:i/>
-          <w:color w:val="30608C"/>
-          <w:spacing w:val="0"/>
-          <w:position w:val="0"/>
-          <w:sz w:val="21"/>
-          <w:shd w:fill="auto" w:val="clear"/>
-        </w:rPr>
-        <w:t xml:space="preserve">üß Gott!</w:t>
+        <w:t xml:space="preserve">Grüß Gott!</w:t>
       </w:r>
       <w:r>
         <w:rPr>
@@ -4631,19 +4535,7 @@
           <w:sz w:val="21"/>
           <w:shd w:fill="auto" w:val="clear"/>
         </w:rPr>
-        <w:t xml:space="preserve">Gr</w:t>
-      </w:r>
-      <w:r>
-        <w:rPr>
-          <w:rFonts w:ascii="Calibri" w:hAnsi="Calibri" w:cs="Calibri" w:eastAsia="Calibri"/>
-          <w:i/>
-          <w:color w:val="30608C"/>
-          <w:spacing w:val="0"/>
-          <w:position w:val="0"/>
-          <w:sz w:val="21"/>
-          <w:shd w:fill="auto" w:val="clear"/>
-        </w:rPr>
-        <w:t xml:space="preserve">üß Gott, Frau Schmid!</w:t>
+        <w:t xml:space="preserve">Grüß Gott, Frau Schmid!</w:t>
       </w:r>
       <w:r>
         <w:rPr>
@@ -4817,19 +4709,7 @@
           <w:sz w:val="21"/>
           <w:shd w:fill="auto" w:val="clear"/>
         </w:rPr>
-        <w:t xml:space="preserve">Lesen Sie das Gespr</w:t>
-      </w:r>
-      <w:r>
-        <w:rPr>
-          <w:rFonts w:ascii="Calibri" w:hAnsi="Calibri" w:cs="Calibri" w:eastAsia="Calibri"/>
-          <w:i/>
-          <w:color w:val="30608C"/>
-          <w:spacing w:val="0"/>
-          <w:position w:val="0"/>
-          <w:sz w:val="21"/>
-          <w:shd w:fill="auto" w:val="clear"/>
-        </w:rPr>
-        <w:t xml:space="preserve">äch und ergänzen Sie.</w:t>
+        <w:t xml:space="preserve">Lesen Sie das Gespräch und ergänzen Sie.</w:t>
       </w:r>
       <w:r>
         <w:rPr>
@@ -4880,19 +4760,7 @@
           <w:sz w:val="21"/>
           <w:shd w:fill="auto" w:val="clear"/>
         </w:rPr>
-        <w:t xml:space="preserve">Erg</w:t>
-      </w:r>
-      <w:r>
-        <w:rPr>
-          <w:rFonts w:ascii="Calibri" w:hAnsi="Calibri" w:cs="Calibri" w:eastAsia="Calibri"/>
-          <w:i/>
-          <w:color w:val="30608C"/>
-          <w:spacing w:val="0"/>
-          <w:position w:val="0"/>
-          <w:sz w:val="21"/>
-          <w:shd w:fill="auto" w:val="clear"/>
-        </w:rPr>
-        <w:t xml:space="preserve">änzen Sie die Lücken mit den passenden Wörtern.</w:t>
+        <w:t xml:space="preserve">Ergänzen Sie die Lücken mit den passenden Wörtern.</w:t>
       </w:r>
       <w:r>
         <w:rPr>
@@ -5088,19 +4956,7 @@
           <w:sz w:val="21"/>
           <w:shd w:fill="auto" w:val="clear"/>
         </w:rPr>
-        <w:t xml:space="preserve">Lesen Sie das Gespr</w:t>
-      </w:r>
-      <w:r>
-        <w:rPr>
-          <w:rFonts w:ascii="Calibri" w:hAnsi="Calibri" w:cs="Calibri" w:eastAsia="Calibri"/>
-          <w:i/>
-          <w:color w:val="30608C"/>
-          <w:spacing w:val="0"/>
-          <w:position w:val="0"/>
-          <w:sz w:val="21"/>
-          <w:shd w:fill="auto" w:val="clear"/>
-        </w:rPr>
-        <w:t xml:space="preserve">äch und ergänzen Sie.</w:t>
+        <w:t xml:space="preserve">Lesen Sie das Gespräch und ergänzen Sie.</w:t>
       </w:r>
       <w:r>
         <w:rPr>
@@ -5151,19 +5007,7 @@
           <w:sz w:val="21"/>
           <w:shd w:fill="auto" w:val="clear"/>
         </w:rPr>
-        <w:t xml:space="preserve">Lesen Sie die </w:t>
-      </w:r>
-      <w:r>
-        <w:rPr>
-          <w:rFonts w:ascii="Calibri" w:hAnsi="Calibri" w:cs="Calibri" w:eastAsia="Calibri"/>
-          <w:i/>
-          <w:color w:val="30608C"/>
-          <w:spacing w:val="0"/>
-          <w:position w:val="0"/>
-          <w:sz w:val="21"/>
-          <w:shd w:fill="auto" w:val="clear"/>
-        </w:rPr>
-        <w:t xml:space="preserve">Überschrift zu Beginn der Übung.</w:t>
+        <w:t xml:space="preserve">Lesen Sie die Überschrift zu Beginn der Übung.</w:t>
       </w:r>
       <w:r>
         <w:rPr>
@@ -5709,19 +5553,7 @@
           <w:sz w:val="21"/>
           <w:shd w:fill="auto" w:val="clear"/>
         </w:rPr>
-        <w:t xml:space="preserve">Zwei Kinder h</w:t>
-      </w:r>
-      <w:r>
-        <w:rPr>
-          <w:rFonts w:ascii="Calibri" w:hAnsi="Calibri" w:cs="Calibri" w:eastAsia="Calibri"/>
-          <w:i/>
-          <w:color w:val="30608C"/>
-          <w:spacing w:val="0"/>
-          <w:position w:val="0"/>
-          <w:sz w:val="21"/>
-          <w:shd w:fill="auto" w:val="clear"/>
-        </w:rPr>
-        <w:t xml:space="preserve">ören das Gespräch.</w:t>
+        <w:t xml:space="preserve">Zwei Kinder hören das Gespräch.</w:t>
       </w:r>
       <w:r>
         <w:rPr>
@@ -6353,18 +6185,7 @@
           <w:sz w:val="22"/>
           <w:shd w:fill="auto" w:val="clear"/>
         </w:rPr>
-        <w:t xml:space="preserve">l</w:t>
-      </w:r>
-      <w:r>
-        <w:rPr>
-          <w:rFonts w:ascii="Calibri" w:hAnsi="Calibri" w:cs="Calibri" w:eastAsia="Calibri"/>
-          <w:color w:val="auto"/>
-          <w:spacing w:val="0"/>
-          <w:position w:val="0"/>
-          <w:sz w:val="22"/>
-          <w:shd w:fill="auto" w:val="clear"/>
-        </w:rPr>
-        <w:t xml:space="preserve">ç</w:t>
+        <w:t xml:space="preserve">lç</w:t>
       </w:r>
       <w:r>
         <w:rPr>
@@ -6430,18 +6251,7 @@
           <w:sz w:val="22"/>
           <w:shd w:fill="auto" w:val="clear"/>
         </w:rPr>
-        <w:t xml:space="preserve">l</w:t>
-      </w:r>
-      <w:r>
-        <w:rPr>
-          <w:rFonts w:ascii="Calibri" w:hAnsi="Calibri" w:cs="Calibri" w:eastAsia="Calibri"/>
-          <w:color w:val="auto"/>
-          <w:spacing w:val="0"/>
-          <w:position w:val="0"/>
-          <w:sz w:val="22"/>
-          <w:shd w:fill="auto" w:val="clear"/>
-        </w:rPr>
-        <w:t xml:space="preserve">ç</w:t>
+        <w:t xml:space="preserve">lç</w:t>
       </w:r>
       <w:r>
         <w:rPr>
@@ -6507,18 +6317,7 @@
           <w:sz w:val="22"/>
           <w:shd w:fill="auto" w:val="clear"/>
         </w:rPr>
-        <w:t xml:space="preserve">l</w:t>
-      </w:r>
-      <w:r>
-        <w:rPr>
-          <w:rFonts w:ascii="Calibri" w:hAnsi="Calibri" w:cs="Calibri" w:eastAsia="Calibri"/>
-          <w:color w:val="auto"/>
-          <w:spacing w:val="0"/>
-          <w:position w:val="0"/>
-          <w:sz w:val="22"/>
-          <w:shd w:fill="auto" w:val="clear"/>
-        </w:rPr>
-        <w:t xml:space="preserve">ç</w:t>
+        <w:t xml:space="preserve">lç</w:t>
       </w:r>
       <w:r>
         <w:rPr>
@@ -7201,8 +7000,23 @@
           <w:sz w:val="20"/>
           <w:shd w:fill="auto" w:val="clear"/>
         </w:rPr>
-        <w:t xml:space="preserve">The prefix an- moves to the end of the clause: Kreuzen Sie die richtige L</w:t>
-      </w:r>
+        <w:t xml:space="preserve">The prefix an- moves to the end of the clause: Kreuzen Sie die richtige Lösung an.</w:t>
+      </w:r>
+    </w:p>
+    <w:p>
+      <w:pPr>
+        <w:spacing w:before="0" w:after="80" w:line="276"/>
+        <w:ind w:right="0" w:left="576" w:firstLine="0"/>
+        <w:jc w:val="left"/>
+        <w:rPr>
+          <w:rFonts w:ascii="Calibri" w:hAnsi="Calibri" w:cs="Calibri" w:eastAsia="Calibri"/>
+          <w:color w:val="auto"/>
+          <w:spacing w:val="0"/>
+          <w:position w:val="0"/>
+          <w:sz w:val="22"/>
+          <w:shd w:fill="auto" w:val="clear"/>
+        </w:rPr>
+      </w:pPr>
       <w:r>
         <w:rPr>
           <w:rFonts w:ascii="Calibri" w:hAnsi="Calibri" w:cs="Calibri" w:eastAsia="Calibri"/>
@@ -7213,23 +7027,8 @@
           <w:sz w:val="20"/>
           <w:shd w:fill="auto" w:val="clear"/>
         </w:rPr>
-        <w:t xml:space="preserve">ösung an.</w:t>
-      </w:r>
-    </w:p>
-    <w:p>
-      <w:pPr>
-        <w:spacing w:before="0" w:after="80" w:line="276"/>
-        <w:ind w:right="0" w:left="576" w:firstLine="0"/>
-        <w:jc w:val="left"/>
-        <w:rPr>
-          <w:rFonts w:ascii="Calibri" w:hAnsi="Calibri" w:cs="Calibri" w:eastAsia="Calibri"/>
-          <w:color w:val="auto"/>
-          <w:spacing w:val="0"/>
-          <w:position w:val="0"/>
-          <w:sz w:val="22"/>
-          <w:shd w:fill="auto" w:val="clear"/>
-        </w:rPr>
-      </w:pPr>
+        <w:t xml:space="preserve">• </w:t>
+      </w:r>
       <w:r>
         <w:rPr>
           <w:rFonts w:ascii="Calibri" w:hAnsi="Calibri" w:cs="Calibri" w:eastAsia="Calibri"/>
@@ -7240,7 +7039,7 @@
           <w:sz w:val="20"/>
           <w:shd w:fill="auto" w:val="clear"/>
         </w:rPr>
-        <w:t xml:space="preserve">• </w:t>
+        <w:t xml:space="preserve">Participle angekreuzt (perfect often: habe </w:t>
       </w:r>
       <w:r>
         <w:rPr>
@@ -7252,7 +7051,7 @@
           <w:sz w:val="20"/>
           <w:shd w:fill="auto" w:val="clear"/>
         </w:rPr>
-        <w:t xml:space="preserve">Participle angekreuzt (perfect often: habe </w:t>
+        <w:t xml:space="preserve">… </w:t>
       </w:r>
       <w:r>
         <w:rPr>
@@ -7264,18 +7063,6 @@
           <w:sz w:val="20"/>
           <w:shd w:fill="auto" w:val="clear"/>
         </w:rPr>
-        <w:t xml:space="preserve">… </w:t>
-      </w:r>
-      <w:r>
-        <w:rPr>
-          <w:rFonts w:ascii="Calibri" w:hAnsi="Calibri" w:cs="Calibri" w:eastAsia="Calibri"/>
-          <w:i/>
-          <w:color w:val="404040"/>
-          <w:spacing w:val="0"/>
-          <w:position w:val="0"/>
-          <w:sz w:val="20"/>
-          <w:shd w:fill="auto" w:val="clear"/>
-        </w:rPr>
         <w:t xml:space="preserve">angekreuzt).</w:t>
       </w:r>
     </w:p>
@@ -7315,19 +7102,7 @@
           <w:sz w:val="21"/>
           <w:shd w:fill="auto" w:val="clear"/>
         </w:rPr>
-        <w:t xml:space="preserve">Kreuzen Sie die richtige L</w:t>
-      </w:r>
-      <w:r>
-        <w:rPr>
-          <w:rFonts w:ascii="Calibri" w:hAnsi="Calibri" w:cs="Calibri" w:eastAsia="Calibri"/>
-          <w:i/>
-          <w:color w:val="30608C"/>
-          <w:spacing w:val="0"/>
-          <w:position w:val="0"/>
-          <w:sz w:val="21"/>
-          <w:shd w:fill="auto" w:val="clear"/>
-        </w:rPr>
-        <w:t xml:space="preserve">ösung an.</w:t>
+        <w:t xml:space="preserve">Kreuzen Sie die richtige Lösung an.</w:t>
       </w:r>
       <w:r>
         <w:rPr>
@@ -7465,18 +7240,7 @@
           <w:sz w:val="22"/>
           <w:shd w:fill="auto" w:val="clear"/>
         </w:rPr>
-        <w:t xml:space="preserve">h</w:t>
-      </w:r>
-      <w:r>
-        <w:rPr>
-          <w:rFonts w:ascii="Calibri" w:hAnsi="Calibri" w:cs="Calibri" w:eastAsia="Calibri"/>
-          <w:color w:val="auto"/>
-          <w:spacing w:val="0"/>
-          <w:position w:val="0"/>
-          <w:sz w:val="22"/>
-          <w:shd w:fill="auto" w:val="clear"/>
-        </w:rPr>
-        <w:t xml:space="preserve">ø</w:t>
+        <w:t xml:space="preserve">hø</w:t>
       </w:r>
       <w:r>
         <w:rPr>
@@ -7563,19 +7327,7 @@
           <w:sz w:val="21"/>
           <w:shd w:fill="auto" w:val="clear"/>
         </w:rPr>
-        <w:t xml:space="preserve">H</w:t>
-      </w:r>
-      <w:r>
-        <w:rPr>
-          <w:rFonts w:ascii="Calibri" w:hAnsi="Calibri" w:cs="Calibri" w:eastAsia="Calibri"/>
-          <w:i/>
-          <w:color w:val="30608C"/>
-          <w:spacing w:val="0"/>
-          <w:position w:val="0"/>
-          <w:sz w:val="21"/>
-          <w:shd w:fill="auto" w:val="clear"/>
-        </w:rPr>
-        <w:t xml:space="preserve">ören Sie das Gespräch.</w:t>
+        <w:t xml:space="preserve">Hören Sie das Gespräch.</w:t>
       </w:r>
       <w:r>
         <w:rPr>
@@ -7674,19 +7426,7 @@
           <w:sz w:val="21"/>
           <w:shd w:fill="auto" w:val="clear"/>
         </w:rPr>
-        <w:t xml:space="preserve">Ich h</w:t>
-      </w:r>
-      <w:r>
-        <w:rPr>
-          <w:rFonts w:ascii="Calibri" w:hAnsi="Calibri" w:cs="Calibri" w:eastAsia="Calibri"/>
-          <w:i/>
-          <w:color w:val="30608C"/>
-          <w:spacing w:val="0"/>
-          <w:position w:val="0"/>
-          <w:sz w:val="21"/>
-          <w:shd w:fill="auto" w:val="clear"/>
-        </w:rPr>
-        <w:t xml:space="preserve">öre morgens Radio.</w:t>
+        <w:t xml:space="preserve">Ich höre morgens Radio.</w:t>
       </w:r>
       <w:r>
         <w:rPr>
@@ -7860,19 +7600,7 @@
           <w:sz w:val="21"/>
           <w:shd w:fill="auto" w:val="clear"/>
         </w:rPr>
-        <w:t xml:space="preserve">Das Gespr</w:t>
-      </w:r>
-      <w:r>
-        <w:rPr>
-          <w:rFonts w:ascii="Calibri" w:hAnsi="Calibri" w:cs="Calibri" w:eastAsia="Calibri"/>
-          <w:i/>
-          <w:color w:val="30608C"/>
-          <w:spacing w:val="0"/>
-          <w:position w:val="0"/>
-          <w:sz w:val="21"/>
-          <w:shd w:fill="auto" w:val="clear"/>
-        </w:rPr>
-        <w:t xml:space="preserve">äch ist kurz.</w:t>
+        <w:t xml:space="preserve">Das Gespräch ist kurz.</w:t>
       </w:r>
       <w:r>
         <w:rPr>
@@ -7923,19 +7651,7 @@
           <w:sz w:val="21"/>
           <w:shd w:fill="auto" w:val="clear"/>
         </w:rPr>
-        <w:t xml:space="preserve">H</w:t>
-      </w:r>
-      <w:r>
-        <w:rPr>
-          <w:rFonts w:ascii="Calibri" w:hAnsi="Calibri" w:cs="Calibri" w:eastAsia="Calibri"/>
-          <w:i/>
-          <w:color w:val="30608C"/>
-          <w:spacing w:val="0"/>
-          <w:position w:val="0"/>
-          <w:sz w:val="21"/>
-          <w:shd w:fill="auto" w:val="clear"/>
-        </w:rPr>
-        <w:t xml:space="preserve">ören Sie bitte noch einmal das Gespräch.</w:t>
+        <w:t xml:space="preserve">Hören Sie bitte noch einmal das Gespräch.</w:t>
       </w:r>
       <w:r>
         <w:rPr>
@@ -8290,19 +8006,7 @@
           <w:sz w:val="20"/>
           <w:shd w:fill="auto" w:val="clear"/>
         </w:rPr>
-        <w:t xml:space="preserve">Complement after sein is usually nominative. Present: ich bin </w:t>
-      </w:r>
-      <w:r>
-        <w:rPr>
-          <w:rFonts w:ascii="Calibri" w:hAnsi="Calibri" w:cs="Calibri" w:eastAsia="Calibri"/>
-          <w:i/>
-          <w:color w:val="404040"/>
-          <w:spacing w:val="0"/>
-          <w:position w:val="0"/>
-          <w:sz w:val="20"/>
-          <w:shd w:fill="auto" w:val="clear"/>
-        </w:rPr>
-        <w:t xml:space="preserve">· du bist · ist · wir/sie/Sie sind.</w:t>
+        <w:t xml:space="preserve">Complement after sein is usually nominative. Present: ich bin · du bist · ist · wir/sie/Sie sind.</w:t>
       </w:r>
     </w:p>
     <w:p>
@@ -8494,19 +8198,7 @@
           <w:sz w:val="21"/>
           <w:shd w:fill="auto" w:val="clear"/>
         </w:rPr>
-        <w:t xml:space="preserve">Und ich bin Frau Lange, die Sekret</w:t>
-      </w:r>
-      <w:r>
-        <w:rPr>
-          <w:rFonts w:ascii="Calibri" w:hAnsi="Calibri" w:cs="Calibri" w:eastAsia="Calibri"/>
-          <w:i/>
-          <w:color w:val="30608C"/>
-          <w:spacing w:val="0"/>
-          <w:position w:val="0"/>
-          <w:sz w:val="21"/>
-          <w:shd w:fill="auto" w:val="clear"/>
-        </w:rPr>
-        <w:t xml:space="preserve">ärin.</w:t>
+        <w:t xml:space="preserve">Und ich bin Frau Lange, die Sekretärin.</w:t>
       </w:r>
       <w:r>
         <w:rPr>
@@ -8557,19 +8249,7 @@
           <w:sz w:val="21"/>
           <w:shd w:fill="auto" w:val="clear"/>
         </w:rPr>
-        <w:t xml:space="preserve">Wir sind m</w:t>
-      </w:r>
-      <w:r>
-        <w:rPr>
-          <w:rFonts w:ascii="Calibri" w:hAnsi="Calibri" w:cs="Calibri" w:eastAsia="Calibri"/>
-          <w:i/>
-          <w:color w:val="30608C"/>
-          <w:spacing w:val="0"/>
-          <w:position w:val="0"/>
-          <w:sz w:val="21"/>
-          <w:shd w:fill="auto" w:val="clear"/>
-        </w:rPr>
-        <w:t xml:space="preserve">üde.</w:t>
+        <w:t xml:space="preserve">Wir sind müde.</w:t>
       </w:r>
       <w:r>
         <w:rPr>

</xml_diff>

<commit_message>
Add new vocabulary entry for "auffallen" and update existing entry for "markieren" in vocab files
</commit_message>
<xml_diff>
--- a/vocab.docx
+++ b/vocab.docx
@@ -13,6 +13,108 @@
         </w:rPr>
         <w:t>daf — vocabulary</w:t>
       </w:r>
+    </w:p>
+    <w:p>
+      <w:pPr>
+        <w:spacing w:after="120"/>
+      </w:pPr>
+      <w:r>
+        <w:rPr>
+          <w:b/>
+        </w:rPr>
+        <w:t>auffallen</w:t>
+      </w:r>
+      <w:r>
+        <w:t xml:space="preserve"> /ˈaʊ̯fˌfalən/</w:t>
+      </w:r>
+    </w:p>
+    <w:p>
+      <w:pPr>
+        <w:spacing w:after="80"/>
+        <w:ind w:left="576"/>
+      </w:pPr>
+      <w:r>
+        <w:t>To stand out; be noticeable / catch the eye.</w:t>
+      </w:r>
+    </w:p>
+    <w:p>
+      <w:pPr>
+        <w:spacing w:after="80"/>
+        <w:ind w:left="576"/>
+      </w:pPr>
+      <w:r>
+        <w:rPr>
+          <w:i/>
+          <w:color w:val="404040"/>
+          <w:sz w:val="20"/>
+        </w:rPr>
+        <w:t>• Separable: auf sits at the end of the clause (Was fällt auf?). Spell fällt with ä, like er schläft—not fallt.</w:t>
+      </w:r>
+    </w:p>
+    <w:p>
+      <w:pPr>
+        <w:spacing w:before="40" w:after="60"/>
+        <w:ind w:left="576"/>
+      </w:pPr>
+      <w:r>
+        <w:rPr>
+          <w:i/>
+          <w:color w:val="30608C"/>
+          <w:sz w:val="21"/>
+        </w:rPr>
+        <w:t xml:space="preserve">› </w:t>
+      </w:r>
+      <w:r>
+        <w:rPr>
+          <w:i/>
+          <w:color w:val="30608C"/>
+          <w:sz w:val="21"/>
+        </w:rPr>
+        <w:t>Was fällt auf?</w:t>
+      </w:r>
+      <w:r>
+        <w:rPr>
+          <w:i/>
+          <w:color w:val="404040"/>
+          <w:sz w:val="21"/>
+        </w:rPr>
+        <w:t xml:space="preserve"> (What do you notice? / What stands out? [reflection question])</w:t>
+      </w:r>
+    </w:p>
+    <w:p>
+      <w:pPr>
+        <w:spacing w:before="0" w:after="120"/>
+        <w:ind w:left="576"/>
+      </w:pPr>
+      <w:r>
+        <w:rPr>
+          <w:i/>
+          <w:color w:val="30608C"/>
+          <w:sz w:val="21"/>
+        </w:rPr>
+        <w:t xml:space="preserve">› </w:t>
+      </w:r>
+      <w:r>
+        <w:rPr>
+          <w:i/>
+          <w:color w:val="30608C"/>
+          <w:sz w:val="21"/>
+        </w:rPr>
+        <w:t>Das Foto fällt auf.</w:t>
+      </w:r>
+      <w:r>
+        <w:rPr>
+          <w:i/>
+          <w:color w:val="404040"/>
+          <w:sz w:val="21"/>
+        </w:rPr>
+        <w:t xml:space="preserve"> (The photo stands out; it catches your eye.)</w:t>
+      </w:r>
+    </w:p>
+    <w:p>
+      <w:pPr>
+        <w:spacing w:before="0" w:after="0"/>
+      </w:pPr>
     </w:p>
     <w:p>
       <w:pPr>

</xml_diff>

<commit_message>
Add DaF transcript and update vocabulary deck.
Exclude the oversized coursebook PDF from git so the branch can be pushed to GitHub.

Co-authored-by: Cursor <cursoragent@cursor.com>
</commit_message>
<xml_diff>
--- a/vocab.docx
+++ b/vocab.docx
@@ -22,10 +22,10 @@
         <w:rPr>
           <w:b/>
         </w:rPr>
-        <w:t>auffallen</w:t>
-      </w:r>
-      <w:r>
-        <w:t xml:space="preserve"> /ˈaʊ̯fˌfalən/</w:t>
+        <w:t>Wie geht’s?</w:t>
+      </w:r>
+      <w:r>
+        <w:t xml:space="preserve"> /viː ɡeːts/</w:t>
       </w:r>
     </w:p>
     <w:p>
@@ -34,7 +34,7 @@
         <w:ind w:left="576"/>
       </w:pPr>
       <w:r>
-        <w:t>To stand out; be noticeable / catch the eye.</w:t>
+        <w:t>How’s it going? / How are you?</w:t>
       </w:r>
     </w:p>
     <w:p>
@@ -48,7 +48,273 @@
           <w:color w:val="404040"/>
           <w:sz w:val="20"/>
         </w:rPr>
-        <w:t>• Separable: auf sits at the end of the clause (Was fällt auf?). Spell fällt with ä, like er schläft—not fallt.</w:t>
+        <w:t>• Short for Wie geht es? Full informal form: Wie geht es dir?</w:t>
+      </w:r>
+    </w:p>
+    <w:p>
+      <w:pPr>
+        <w:spacing w:after="80"/>
+        <w:ind w:left="576"/>
+      </w:pPr>
+      <w:r>
+        <w:rPr>
+          <w:i/>
+          <w:color w:val="404040"/>
+          <w:sz w:val="20"/>
+        </w:rPr>
+        <w:t>• Und dir? means And you? Dir is dative of du: literally, And to you?</w:t>
+      </w:r>
+    </w:p>
+    <w:p>
+      <w:pPr>
+        <w:spacing w:before="40" w:after="60"/>
+        <w:ind w:left="576"/>
+      </w:pPr>
+      <w:r>
+        <w:rPr>
+          <w:i/>
+          <w:color w:val="30608C"/>
+          <w:sz w:val="21"/>
+        </w:rPr>
+        <w:t xml:space="preserve">› </w:t>
+      </w:r>
+      <w:r>
+        <w:rPr>
+          <w:i/>
+          <w:color w:val="30608C"/>
+          <w:sz w:val="21"/>
+        </w:rPr>
+        <w:t>Wie geht’s?</w:t>
+      </w:r>
+      <w:r>
+        <w:rPr>
+          <w:i/>
+          <w:color w:val="404040"/>
+          <w:sz w:val="21"/>
+        </w:rPr>
+        <w:t xml:space="preserve"> (How’s it going? / How are you?)</w:t>
+      </w:r>
+    </w:p>
+    <w:p>
+      <w:pPr>
+        <w:spacing w:before="0" w:after="60"/>
+        <w:ind w:left="576"/>
+      </w:pPr>
+      <w:r>
+        <w:rPr>
+          <w:i/>
+          <w:color w:val="30608C"/>
+          <w:sz w:val="21"/>
+        </w:rPr>
+        <w:t xml:space="preserve">› </w:t>
+      </w:r>
+      <w:r>
+        <w:rPr>
+          <w:i/>
+          <w:color w:val="30608C"/>
+          <w:sz w:val="21"/>
+        </w:rPr>
+        <w:t>Gut, danke. Und dir?</w:t>
+      </w:r>
+      <w:r>
+        <w:rPr>
+          <w:i/>
+          <w:color w:val="404040"/>
+          <w:sz w:val="21"/>
+        </w:rPr>
+        <w:t xml:space="preserve"> (Good, thanks. And you?)</w:t>
+      </w:r>
+    </w:p>
+    <w:p>
+      <w:pPr>
+        <w:spacing w:before="0" w:after="60"/>
+        <w:ind w:left="576"/>
+      </w:pPr>
+      <w:r>
+        <w:rPr>
+          <w:i/>
+          <w:color w:val="30608C"/>
+          <w:sz w:val="21"/>
+        </w:rPr>
+        <w:t xml:space="preserve">› </w:t>
+      </w:r>
+      <w:r>
+        <w:rPr>
+          <w:i/>
+          <w:color w:val="30608C"/>
+          <w:sz w:val="21"/>
+        </w:rPr>
+        <w:t>Mir geht’s gut.</w:t>
+      </w:r>
+      <w:r>
+        <w:rPr>
+          <w:i/>
+          <w:color w:val="404040"/>
+          <w:sz w:val="21"/>
+        </w:rPr>
+        <w:t xml:space="preserve"> (I’m doing well.)</w:t>
+      </w:r>
+    </w:p>
+    <w:p>
+      <w:pPr>
+        <w:spacing w:before="0" w:after="60"/>
+        <w:ind w:left="576"/>
+      </w:pPr>
+      <w:r>
+        <w:rPr>
+          <w:i/>
+          <w:color w:val="30608C"/>
+          <w:sz w:val="21"/>
+        </w:rPr>
+        <w:t xml:space="preserve">› </w:t>
+      </w:r>
+      <w:r>
+        <w:rPr>
+          <w:i/>
+          <w:color w:val="30608C"/>
+          <w:sz w:val="21"/>
+        </w:rPr>
+        <w:t>Sehr gut.</w:t>
+      </w:r>
+      <w:r>
+        <w:rPr>
+          <w:i/>
+          <w:color w:val="404040"/>
+          <w:sz w:val="21"/>
+        </w:rPr>
+        <w:t xml:space="preserve"> (Very well.)</w:t>
+      </w:r>
+    </w:p>
+    <w:p>
+      <w:pPr>
+        <w:spacing w:before="0" w:after="60"/>
+        <w:ind w:left="576"/>
+      </w:pPr>
+      <w:r>
+        <w:rPr>
+          <w:i/>
+          <w:color w:val="30608C"/>
+          <w:sz w:val="21"/>
+        </w:rPr>
+        <w:t xml:space="preserve">› </w:t>
+      </w:r>
+      <w:r>
+        <w:rPr>
+          <w:i/>
+          <w:color w:val="30608C"/>
+          <w:sz w:val="21"/>
+        </w:rPr>
+        <w:t>Es geht.</w:t>
+      </w:r>
+      <w:r>
+        <w:rPr>
+          <w:i/>
+          <w:color w:val="404040"/>
+          <w:sz w:val="21"/>
+        </w:rPr>
+        <w:t xml:space="preserve"> (It’s okay / so-so.)</w:t>
+      </w:r>
+    </w:p>
+    <w:p>
+      <w:pPr>
+        <w:spacing w:before="0" w:after="60"/>
+        <w:ind w:left="576"/>
+      </w:pPr>
+      <w:r>
+        <w:rPr>
+          <w:i/>
+          <w:color w:val="30608C"/>
+          <w:sz w:val="21"/>
+        </w:rPr>
+        <w:t xml:space="preserve">› </w:t>
+      </w:r>
+      <w:r>
+        <w:rPr>
+          <w:i/>
+          <w:color w:val="30608C"/>
+          <w:sz w:val="21"/>
+        </w:rPr>
+        <w:t>Nicht so gut.</w:t>
+      </w:r>
+      <w:r>
+        <w:rPr>
+          <w:i/>
+          <w:color w:val="404040"/>
+          <w:sz w:val="21"/>
+        </w:rPr>
+        <w:t xml:space="preserve"> (Not so well.)</w:t>
+      </w:r>
+    </w:p>
+    <w:p>
+      <w:pPr>
+        <w:spacing w:before="0" w:after="120"/>
+        <w:ind w:left="576"/>
+      </w:pPr>
+      <w:r>
+        <w:rPr>
+          <w:i/>
+          <w:color w:val="30608C"/>
+          <w:sz w:val="21"/>
+        </w:rPr>
+        <w:t xml:space="preserve">› </w:t>
+      </w:r>
+      <w:r>
+        <w:rPr>
+          <w:i/>
+          <w:color w:val="30608C"/>
+          <w:sz w:val="21"/>
+        </w:rPr>
+        <w:t>Schlecht.</w:t>
+      </w:r>
+      <w:r>
+        <w:rPr>
+          <w:i/>
+          <w:color w:val="404040"/>
+          <w:sz w:val="21"/>
+        </w:rPr>
+        <w:t xml:space="preserve"> (Bad / not well.)</w:t>
+      </w:r>
+    </w:p>
+    <w:p>
+      <w:pPr>
+        <w:spacing w:before="0" w:after="0"/>
+      </w:pPr>
+    </w:p>
+    <w:p>
+      <w:pPr>
+        <w:spacing w:after="120"/>
+      </w:pPr>
+      <w:r>
+        <w:rPr>
+          <w:b/>
+        </w:rPr>
+        <w:t>auffallen</w:t>
+      </w:r>
+      <w:r>
+        <w:t xml:space="preserve"> /ˈaʊ̯fˌfalən/</w:t>
+      </w:r>
+    </w:p>
+    <w:p>
+      <w:pPr>
+        <w:spacing w:after="80"/>
+        <w:ind w:left="576"/>
+      </w:pPr>
+      <w:r>
+        <w:t>To stand out; be noticeable / catch the eye.</w:t>
+      </w:r>
+    </w:p>
+    <w:p>
+      <w:pPr>
+        <w:spacing w:after="80"/>
+        <w:ind w:left="576"/>
+      </w:pPr>
+      <w:r>
+        <w:rPr>
+          <w:i/>
+          <w:color w:val="404040"/>
+          <w:sz w:val="20"/>
+        </w:rPr>
+        <w:t>• Separable: auf sits at the end of the clause (Was fällt auf?).</w:t>
       </w:r>
     </w:p>
     <w:p>

</xml_diff>

<commit_message>
Add new vocabulary entries in vocab.docx and vocab.manifest.json
- Introduced multiple new entries including "auch," "Freut mich," "Reflexivpronomen," "Personalpronomen," "sich vorstellen," "begrüßen," "der Partner / die Partnerin," "Wie heißt ...?", "das Land," "die Sprache," "Ihr-," "fliegen," "reisen," "fahren," and "gehen."
- Each entry includes glosses, notes, and examples in both German and English, categorized under lesson 1 and level A1 for language learners.
- Updated existing entries for consistency and clarity.
</commit_message>
<xml_diff>
--- a/vocab.docx
+++ b/vocab.docx
@@ -22,10 +22,10 @@
         <w:rPr>
           <w:b/>
         </w:rPr>
-        <w:t>Wie geht’s?</w:t>
-      </w:r>
-      <w:r>
-        <w:t xml:space="preserve"> /viː ɡeːts/</w:t>
+        <w:t>auch</w:t>
+      </w:r>
+      <w:r>
+        <w:t xml:space="preserve"> /aʊ̯x/</w:t>
       </w:r>
     </w:p>
     <w:p>
@@ -34,7 +34,7 @@
         <w:ind w:left="576"/>
       </w:pPr>
       <w:r>
-        <w:t>How’s it going? / How are you?</w:t>
+        <w:t>Also; too; as well.</w:t>
       </w:r>
     </w:p>
     <w:p>
@@ -48,7 +48,116 @@
           <w:color w:val="404040"/>
           <w:sz w:val="20"/>
         </w:rPr>
-        <w:t>• Short for Wie geht es? Full informal form: Wie geht es dir?</w:t>
+        <w:t>• Often comes near what it adds: Ich auch = me too; auch ich = I too / even I.</w:t>
+      </w:r>
+    </w:p>
+    <w:p>
+      <w:pPr>
+        <w:spacing w:before="40" w:after="60"/>
+        <w:ind w:left="576"/>
+      </w:pPr>
+      <w:r>
+        <w:rPr>
+          <w:i/>
+          <w:color w:val="30608C"/>
+          <w:sz w:val="21"/>
+        </w:rPr>
+        <w:t xml:space="preserve">› </w:t>
+      </w:r>
+      <w:r>
+        <w:rPr>
+          <w:i/>
+          <w:color w:val="30608C"/>
+          <w:sz w:val="21"/>
+        </w:rPr>
+        <w:t>Ich auch.</w:t>
+      </w:r>
+      <w:r>
+        <w:rPr>
+          <w:i/>
+          <w:color w:val="404040"/>
+          <w:sz w:val="21"/>
+        </w:rPr>
+        <w:t xml:space="preserve"> (Me too.)</w:t>
+      </w:r>
+    </w:p>
+    <w:p>
+      <w:pPr>
+        <w:spacing w:before="0" w:after="60"/>
+        <w:ind w:left="576"/>
+      </w:pPr>
+      <w:r>
+        <w:rPr>
+          <w:i/>
+          <w:color w:val="30608C"/>
+          <w:sz w:val="21"/>
+        </w:rPr>
+        <w:t xml:space="preserve">› </w:t>
+      </w:r>
+      <w:r>
+        <w:rPr>
+          <w:i/>
+          <w:color w:val="30608C"/>
+          <w:sz w:val="21"/>
+        </w:rPr>
+        <w:t>Mir geht’s auch gut.</w:t>
+      </w:r>
+      <w:r>
+        <w:rPr>
+          <w:i/>
+          <w:color w:val="404040"/>
+          <w:sz w:val="21"/>
+        </w:rPr>
+        <w:t xml:space="preserve"> (I’m also doing well.)</w:t>
+      </w:r>
+    </w:p>
+    <w:p>
+      <w:pPr>
+        <w:spacing w:before="0" w:after="120"/>
+        <w:ind w:left="576"/>
+      </w:pPr>
+      <w:r>
+        <w:rPr>
+          <w:i/>
+          <w:color w:val="30608C"/>
+          <w:sz w:val="21"/>
+        </w:rPr>
+        <w:t xml:space="preserve">› </w:t>
+      </w:r>
+      <w:r>
+        <w:rPr>
+          <w:i/>
+          <w:color w:val="30608C"/>
+          <w:sz w:val="21"/>
+        </w:rPr>
+        <w:t>Er kommt auch aus Berlin.</w:t>
+      </w:r>
+      <w:r>
+        <w:rPr>
+          <w:i/>
+          <w:color w:val="404040"/>
+          <w:sz w:val="21"/>
+        </w:rPr>
+        <w:t xml:space="preserve"> (He also comes from Berlin.)</w:t>
+      </w:r>
+    </w:p>
+    <w:p>
+      <w:pPr>
+        <w:spacing w:before="0" w:after="0"/>
+      </w:pPr>
+    </w:p>
+    <w:p>
+      <w:pPr>
+        <w:spacing w:after="120"/>
+      </w:pPr>
+      <w:r>
+        <w:rPr>
+          <w:b/>
+        </w:rPr>
+        <w:t>Wie geht’s?</w:t>
+      </w:r>
+      <w:r>
+        <w:t xml:space="preserve"> /viː ɡeːts/</w:t>
       </w:r>
     </w:p>
     <w:p>
@@ -57,12 +166,63 @@
         <w:ind w:left="576"/>
       </w:pPr>
       <w:r>
+        <w:t>How’s it going? / How are you?</w:t>
+      </w:r>
+    </w:p>
+    <w:p>
+      <w:pPr>
+        <w:spacing w:after="80"/>
+        <w:ind w:left="576"/>
+      </w:pPr>
+      <w:r>
         <w:rPr>
           <w:i/>
           <w:color w:val="404040"/>
           <w:sz w:val="20"/>
         </w:rPr>
-        <w:t>• Und dir? means And you? Dir is dative of du: literally, And to you?</w:t>
+        <w:t>• Short for: Wie geht es? Full informal form: Wie geht es dir?</w:t>
+      </w:r>
+    </w:p>
+    <w:p>
+      <w:pPr>
+        <w:spacing w:after="80"/>
+        <w:ind w:left="576"/>
+      </w:pPr>
+      <w:r>
+        <w:rPr>
+          <w:i/>
+          <w:color w:val="404040"/>
+          <w:sz w:val="20"/>
+        </w:rPr>
+        <w:t>• Common response: Und dir? (= Und wie geht es dir?)</w:t>
+      </w:r>
+    </w:p>
+    <w:p>
+      <w:pPr>
+        <w:spacing w:after="80"/>
+        <w:ind w:left="576"/>
+      </w:pPr>
+      <w:r>
+        <w:rPr>
+          <w:i/>
+          <w:color w:val="404040"/>
+          <w:sz w:val="20"/>
+        </w:rPr>
+        <w:t>• Another common response: Mir geht’s gut. (= I’m doing well.)</w:t>
+      </w:r>
+    </w:p>
+    <w:p>
+      <w:pPr>
+        <w:spacing w:after="80"/>
+        <w:ind w:left="576"/>
+      </w:pPr>
+      <w:r>
+        <w:rPr>
+          <w:i/>
+          <w:color w:val="404040"/>
+          <w:sz w:val="20"/>
+        </w:rPr>
+        <w:t>• Formally: Wie geht es Ihnen?</w:t>
       </w:r>
     </w:p>
     <w:p>
@@ -273,6 +433,3004 @@
           <w:sz w:val="21"/>
         </w:rPr>
         <w:t xml:space="preserve"> (Bad / not well.)</w:t>
+      </w:r>
+    </w:p>
+    <w:p>
+      <w:pPr>
+        <w:spacing w:before="0" w:after="0"/>
+      </w:pPr>
+    </w:p>
+    <w:p>
+      <w:pPr>
+        <w:spacing w:after="120"/>
+      </w:pPr>
+      <w:r>
+        <w:rPr>
+          <w:b/>
+        </w:rPr>
+        <w:t>Freut mich</w:t>
+      </w:r>
+      <w:r>
+        <w:t xml:space="preserve"> /fʁɔʏ̯t mɪç/</w:t>
+      </w:r>
+    </w:p>
+    <w:p>
+      <w:pPr>
+        <w:spacing w:after="80"/>
+        <w:ind w:left="576"/>
+      </w:pPr>
+      <w:r>
+        <w:t>Nice to meet you; pleased to meet you.</w:t>
+      </w:r>
+    </w:p>
+    <w:p>
+      <w:pPr>
+        <w:spacing w:after="80"/>
+        <w:ind w:left="576"/>
+      </w:pPr>
+      <w:r>
+        <w:rPr>
+          <w:i/>
+          <w:color w:val="404040"/>
+          <w:sz w:val="20"/>
+        </w:rPr>
+        <w:t>• Short for Es freut mich: literally, it pleases me.</w:t>
+      </w:r>
+    </w:p>
+    <w:p>
+      <w:pPr>
+        <w:spacing w:after="80"/>
+        <w:ind w:left="576"/>
+      </w:pPr>
+      <w:r>
+        <w:rPr>
+          <w:i/>
+          <w:color w:val="404040"/>
+          <w:sz w:val="20"/>
+        </w:rPr>
+        <w:t>• mich is a personal pronoun in the accusative here, not reflexive; the hidden subject is es.</w:t>
+      </w:r>
+    </w:p>
+    <w:p>
+      <w:pPr>
+        <w:spacing w:after="80"/>
+        <w:ind w:left="576"/>
+      </w:pPr>
+      <w:r>
+        <w:rPr>
+          <w:i/>
+          <w:color w:val="404040"/>
+          <w:sz w:val="20"/>
+        </w:rPr>
+        <w:t>• Contrast: Ich freue mich means I am happy / pleased; there mich is reflexive because ich and mich refer to the same person.</w:t>
+      </w:r>
+    </w:p>
+    <w:p>
+      <w:pPr>
+        <w:spacing w:before="40" w:after="60"/>
+        <w:ind w:left="576"/>
+      </w:pPr>
+      <w:r>
+        <w:rPr>
+          <w:i/>
+          <w:color w:val="30608C"/>
+          <w:sz w:val="21"/>
+        </w:rPr>
+        <w:t xml:space="preserve">› </w:t>
+      </w:r>
+      <w:r>
+        <w:rPr>
+          <w:i/>
+          <w:color w:val="30608C"/>
+          <w:sz w:val="21"/>
+        </w:rPr>
+        <w:t>Freut mich.</w:t>
+      </w:r>
+      <w:r>
+        <w:rPr>
+          <w:i/>
+          <w:color w:val="404040"/>
+          <w:sz w:val="21"/>
+        </w:rPr>
+        <w:t xml:space="preserve"> (Nice to meet you. [personal-pronoun mich, accusative])</w:t>
+      </w:r>
+    </w:p>
+    <w:p>
+      <w:pPr>
+        <w:spacing w:before="0" w:after="60"/>
+        <w:ind w:left="576"/>
+      </w:pPr>
+      <w:r>
+        <w:rPr>
+          <w:i/>
+          <w:color w:val="30608C"/>
+          <w:sz w:val="21"/>
+        </w:rPr>
+        <w:t xml:space="preserve">› </w:t>
+      </w:r>
+      <w:r>
+        <w:rPr>
+          <w:i/>
+          <w:color w:val="30608C"/>
+          <w:sz w:val="21"/>
+        </w:rPr>
+        <w:t>Ich freue mich.</w:t>
+      </w:r>
+      <w:r>
+        <w:rPr>
+          <w:i/>
+          <w:color w:val="404040"/>
+          <w:sz w:val="21"/>
+        </w:rPr>
+        <w:t xml:space="preserve"> (I am happy / pleased. [reflexive mich])</w:t>
+      </w:r>
+    </w:p>
+    <w:p>
+      <w:pPr>
+        <w:spacing w:before="0" w:after="120"/>
+        <w:ind w:left="576"/>
+      </w:pPr>
+      <w:r>
+        <w:rPr>
+          <w:i/>
+          <w:color w:val="30608C"/>
+          <w:sz w:val="21"/>
+        </w:rPr>
+        <w:t xml:space="preserve">› </w:t>
+      </w:r>
+      <w:r>
+        <w:rPr>
+          <w:i/>
+          <w:color w:val="30608C"/>
+          <w:sz w:val="21"/>
+        </w:rPr>
+        <w:t>Guten Tag, ich heiße Ali. Freut mich.</w:t>
+      </w:r>
+      <w:r>
+        <w:rPr>
+          <w:i/>
+          <w:color w:val="404040"/>
+          <w:sz w:val="21"/>
+        </w:rPr>
+        <w:t xml:space="preserve"> (Good day, my name is Ali. Nice to meet you.)</w:t>
+      </w:r>
+    </w:p>
+    <w:p>
+      <w:pPr>
+        <w:spacing w:before="0" w:after="0"/>
+      </w:pPr>
+    </w:p>
+    <w:p>
+      <w:pPr>
+        <w:spacing w:after="120"/>
+      </w:pPr>
+      <w:r>
+        <w:rPr>
+          <w:b/>
+        </w:rPr>
+        <w:t>Reflexivpronomen</w:t>
+      </w:r>
+      <w:r>
+        <w:t xml:space="preserve"> /ʁeflɛˈksiːfˌpʁoːnoːmən/</w:t>
+      </w:r>
+    </w:p>
+    <w:p>
+      <w:pPr>
+        <w:spacing w:after="80"/>
+        <w:ind w:left="576"/>
+      </w:pPr>
+      <w:r>
+        <w:t>Reflexive pronouns: myself, yourself, himself, etc.</w:t>
+      </w:r>
+    </w:p>
+    <w:p>
+      <w:pPr>
+        <w:spacing w:after="80"/>
+        <w:ind w:left="576"/>
+      </w:pPr>
+      <w:r>
+        <w:rPr>
+          <w:i/>
+          <w:color w:val="404040"/>
+          <w:sz w:val="20"/>
+        </w:rPr>
+        <w:t>• Reflexive means the subject and object are the same person: Ich wasche mich.</w:t>
+      </w:r>
+    </w:p>
+    <w:p>
+      <w:pPr>
+        <w:spacing w:after="80"/>
+        <w:ind w:left="576"/>
+      </w:pPr>
+      <w:r>
+        <w:rPr>
+          <w:i/>
+          <w:color w:val="404040"/>
+          <w:sz w:val="20"/>
+        </w:rPr>
+        <w:t>• They follow person and case, not grammatical gender: er/sie/es all use sich.</w:t>
+      </w:r>
+    </w:p>
+    <w:p>
+      <w:pPr>
+        <w:spacing w:after="80"/>
+        <w:ind w:left="576"/>
+      </w:pPr>
+      <w:r>
+        <w:rPr>
+          <w:i/>
+          <w:color w:val="404040"/>
+          <w:sz w:val="20"/>
+        </w:rPr>
+        <w:t>• Akkusativ forms: mich, dich, sich, sich, sich, uns, euch, sich, sich.</w:t>
+      </w:r>
+    </w:p>
+    <w:p>
+      <w:pPr>
+        <w:spacing w:after="80"/>
+        <w:ind w:left="576"/>
+      </w:pPr>
+      <w:r>
+        <w:rPr>
+          <w:i/>
+          <w:color w:val="404040"/>
+          <w:sz w:val="20"/>
+        </w:rPr>
+        <w:t>• Dativ forms: mir, dir, sich, sich, sich, uns, euch, sich, sich.</w:t>
+      </w:r>
+    </w:p>
+    <w:p>
+      <w:pPr>
+        <w:spacing w:after="80"/>
+        <w:ind w:left="576"/>
+      </w:pPr>
+      <w:r>
+        <w:rPr>
+          <w:i/>
+          <w:color w:val="404040"/>
+          <w:sz w:val="20"/>
+        </w:rPr>
+        <w:t>• Use accusative when the reflexive pronoun is the direct object; use dative when another accusative object is present: Ich wasche mich vs. Ich wasche mir die Hände.</w:t>
+      </w:r>
+    </w:p>
+    <w:p>
+      <w:pPr>
+        <w:spacing w:before="40" w:after="60"/>
+        <w:ind w:left="576"/>
+      </w:pPr>
+      <w:r>
+        <w:rPr>
+          <w:i/>
+          <w:color w:val="30608C"/>
+          <w:sz w:val="21"/>
+        </w:rPr>
+        <w:t xml:space="preserve">› </w:t>
+      </w:r>
+      <w:r>
+        <w:rPr>
+          <w:i/>
+          <w:color w:val="30608C"/>
+          <w:sz w:val="21"/>
+        </w:rPr>
+        <w:t>Ich wasche mich.</w:t>
+      </w:r>
+      <w:r>
+        <w:rPr>
+          <w:i/>
+          <w:color w:val="404040"/>
+          <w:sz w:val="21"/>
+        </w:rPr>
+        <w:t xml:space="preserve"> (I wash myself. [mich; accusative reflexive])</w:t>
+      </w:r>
+    </w:p>
+    <w:p>
+      <w:pPr>
+        <w:spacing w:before="0" w:after="60"/>
+        <w:ind w:left="576"/>
+      </w:pPr>
+      <w:r>
+        <w:rPr>
+          <w:i/>
+          <w:color w:val="30608C"/>
+          <w:sz w:val="21"/>
+        </w:rPr>
+        <w:t xml:space="preserve">› </w:t>
+      </w:r>
+      <w:r>
+        <w:rPr>
+          <w:i/>
+          <w:color w:val="30608C"/>
+          <w:sz w:val="21"/>
+        </w:rPr>
+        <w:t>Du wäschst dich.</w:t>
+      </w:r>
+      <w:r>
+        <w:rPr>
+          <w:i/>
+          <w:color w:val="404040"/>
+          <w:sz w:val="21"/>
+        </w:rPr>
+        <w:t xml:space="preserve"> (You wash yourself. [dich; accusative reflexive])</w:t>
+      </w:r>
+    </w:p>
+    <w:p>
+      <w:pPr>
+        <w:spacing w:before="0" w:after="60"/>
+        <w:ind w:left="576"/>
+      </w:pPr>
+      <w:r>
+        <w:rPr>
+          <w:i/>
+          <w:color w:val="30608C"/>
+          <w:sz w:val="21"/>
+        </w:rPr>
+        <w:t xml:space="preserve">› </w:t>
+      </w:r>
+      <w:r>
+        <w:rPr>
+          <w:i/>
+          <w:color w:val="30608C"/>
+          <w:sz w:val="21"/>
+        </w:rPr>
+        <w:t>Er stellt sich vor.</w:t>
+      </w:r>
+      <w:r>
+        <w:rPr>
+          <w:i/>
+          <w:color w:val="404040"/>
+          <w:sz w:val="21"/>
+        </w:rPr>
+        <w:t xml:space="preserve"> (He introduces himself. [sich; accusative reflexive])</w:t>
+      </w:r>
+    </w:p>
+    <w:p>
+      <w:pPr>
+        <w:spacing w:before="0" w:after="60"/>
+        <w:ind w:left="576"/>
+      </w:pPr>
+      <w:r>
+        <w:rPr>
+          <w:i/>
+          <w:color w:val="30608C"/>
+          <w:sz w:val="21"/>
+        </w:rPr>
+        <w:t xml:space="preserve">› </w:t>
+      </w:r>
+      <w:r>
+        <w:rPr>
+          <w:i/>
+          <w:color w:val="30608C"/>
+          <w:sz w:val="21"/>
+        </w:rPr>
+        <w:t>Sie stellt sich vor.</w:t>
+      </w:r>
+      <w:r>
+        <w:rPr>
+          <w:i/>
+          <w:color w:val="404040"/>
+          <w:sz w:val="21"/>
+        </w:rPr>
+        <w:t xml:space="preserve"> (She introduces herself. [sich; accusative reflexive])</w:t>
+      </w:r>
+    </w:p>
+    <w:p>
+      <w:pPr>
+        <w:spacing w:before="0" w:after="60"/>
+        <w:ind w:left="576"/>
+      </w:pPr>
+      <w:r>
+        <w:rPr>
+          <w:i/>
+          <w:color w:val="30608C"/>
+          <w:sz w:val="21"/>
+        </w:rPr>
+        <w:t xml:space="preserve">› </w:t>
+      </w:r>
+      <w:r>
+        <w:rPr>
+          <w:i/>
+          <w:color w:val="30608C"/>
+          <w:sz w:val="21"/>
+        </w:rPr>
+        <w:t>Es bewegt sich.</w:t>
+      </w:r>
+      <w:r>
+        <w:rPr>
+          <w:i/>
+          <w:color w:val="404040"/>
+          <w:sz w:val="21"/>
+        </w:rPr>
+        <w:t xml:space="preserve"> (It moves itself. [sich; accusative reflexive])</w:t>
+      </w:r>
+    </w:p>
+    <w:p>
+      <w:pPr>
+        <w:spacing w:before="0" w:after="60"/>
+        <w:ind w:left="576"/>
+      </w:pPr>
+      <w:r>
+        <w:rPr>
+          <w:i/>
+          <w:color w:val="30608C"/>
+          <w:sz w:val="21"/>
+        </w:rPr>
+        <w:t xml:space="preserve">› </w:t>
+      </w:r>
+      <w:r>
+        <w:rPr>
+          <w:i/>
+          <w:color w:val="30608C"/>
+          <w:sz w:val="21"/>
+        </w:rPr>
+        <w:t>Wir stellen uns vor.</w:t>
+      </w:r>
+      <w:r>
+        <w:rPr>
+          <w:i/>
+          <w:color w:val="404040"/>
+          <w:sz w:val="21"/>
+        </w:rPr>
+        <w:t xml:space="preserve"> (We introduce ourselves. [uns; accusative reflexive])</w:t>
+      </w:r>
+    </w:p>
+    <w:p>
+      <w:pPr>
+        <w:spacing w:before="0" w:after="60"/>
+        <w:ind w:left="576"/>
+      </w:pPr>
+      <w:r>
+        <w:rPr>
+          <w:i/>
+          <w:color w:val="30608C"/>
+          <w:sz w:val="21"/>
+        </w:rPr>
+        <w:t xml:space="preserve">› </w:t>
+      </w:r>
+      <w:r>
+        <w:rPr>
+          <w:i/>
+          <w:color w:val="30608C"/>
+          <w:sz w:val="21"/>
+        </w:rPr>
+        <w:t>Ihr stellt euch vor.</w:t>
+      </w:r>
+      <w:r>
+        <w:rPr>
+          <w:i/>
+          <w:color w:val="404040"/>
+          <w:sz w:val="21"/>
+        </w:rPr>
+        <w:t xml:space="preserve"> (You all introduce yourselves. [euch; accusative reflexive])</w:t>
+      </w:r>
+    </w:p>
+    <w:p>
+      <w:pPr>
+        <w:spacing w:before="0" w:after="60"/>
+        <w:ind w:left="576"/>
+      </w:pPr>
+      <w:r>
+        <w:rPr>
+          <w:i/>
+          <w:color w:val="30608C"/>
+          <w:sz w:val="21"/>
+        </w:rPr>
+        <w:t xml:space="preserve">› </w:t>
+      </w:r>
+      <w:r>
+        <w:rPr>
+          <w:i/>
+          <w:color w:val="30608C"/>
+          <w:sz w:val="21"/>
+        </w:rPr>
+        <w:t>Sie stellen sich vor.</w:t>
+      </w:r>
+      <w:r>
+        <w:rPr>
+          <w:i/>
+          <w:color w:val="404040"/>
+          <w:sz w:val="21"/>
+        </w:rPr>
+        <w:t xml:space="preserve"> (They introduce themselves. [sich; accusative reflexive])</w:t>
+      </w:r>
+    </w:p>
+    <w:p>
+      <w:pPr>
+        <w:spacing w:before="0" w:after="60"/>
+        <w:ind w:left="576"/>
+      </w:pPr>
+      <w:r>
+        <w:rPr>
+          <w:i/>
+          <w:color w:val="30608C"/>
+          <w:sz w:val="21"/>
+        </w:rPr>
+        <w:t xml:space="preserve">› </w:t>
+      </w:r>
+      <w:r>
+        <w:rPr>
+          <w:i/>
+          <w:color w:val="30608C"/>
+          <w:sz w:val="21"/>
+        </w:rPr>
+        <w:t>Stellen Sie sich vor.</w:t>
+      </w:r>
+      <w:r>
+        <w:rPr>
+          <w:i/>
+          <w:color w:val="404040"/>
+          <w:sz w:val="21"/>
+        </w:rPr>
+        <w:t xml:space="preserve"> (Introduce yourself. [sich; formal accusative reflexive])</w:t>
+      </w:r>
+    </w:p>
+    <w:p>
+      <w:pPr>
+        <w:spacing w:before="0" w:after="60"/>
+        <w:ind w:left="576"/>
+      </w:pPr>
+      <w:r>
+        <w:rPr>
+          <w:i/>
+          <w:color w:val="30608C"/>
+          <w:sz w:val="21"/>
+        </w:rPr>
+        <w:t xml:space="preserve">› </w:t>
+      </w:r>
+      <w:r>
+        <w:rPr>
+          <w:i/>
+          <w:color w:val="30608C"/>
+          <w:sz w:val="21"/>
+        </w:rPr>
+        <w:t>Ich wasche mir die Hände.</w:t>
+      </w:r>
+      <w:r>
+        <w:rPr>
+          <w:i/>
+          <w:color w:val="404040"/>
+          <w:sz w:val="21"/>
+        </w:rPr>
+        <w:t xml:space="preserve"> (I wash my hands. [mir; dative reflexive])</w:t>
+      </w:r>
+    </w:p>
+    <w:p>
+      <w:pPr>
+        <w:spacing w:before="0" w:after="60"/>
+        <w:ind w:left="576"/>
+      </w:pPr>
+      <w:r>
+        <w:rPr>
+          <w:i/>
+          <w:color w:val="30608C"/>
+          <w:sz w:val="21"/>
+        </w:rPr>
+        <w:t xml:space="preserve">› </w:t>
+      </w:r>
+      <w:r>
+        <w:rPr>
+          <w:i/>
+          <w:color w:val="30608C"/>
+          <w:sz w:val="21"/>
+        </w:rPr>
+        <w:t>Du kaufst dir ein Buch.</w:t>
+      </w:r>
+      <w:r>
+        <w:rPr>
+          <w:i/>
+          <w:color w:val="404040"/>
+          <w:sz w:val="21"/>
+        </w:rPr>
+        <w:t xml:space="preserve"> (You buy yourself a book. [dir; dative reflexive])</w:t>
+      </w:r>
+    </w:p>
+    <w:p>
+      <w:pPr>
+        <w:spacing w:before="0" w:after="60"/>
+        <w:ind w:left="576"/>
+      </w:pPr>
+      <w:r>
+        <w:rPr>
+          <w:i/>
+          <w:color w:val="30608C"/>
+          <w:sz w:val="21"/>
+        </w:rPr>
+        <w:t xml:space="preserve">› </w:t>
+      </w:r>
+      <w:r>
+        <w:rPr>
+          <w:i/>
+          <w:color w:val="30608C"/>
+          <w:sz w:val="21"/>
+        </w:rPr>
+        <w:t>Er stellt sich Berlin vor.</w:t>
+      </w:r>
+      <w:r>
+        <w:rPr>
+          <w:i/>
+          <w:color w:val="404040"/>
+          <w:sz w:val="21"/>
+        </w:rPr>
+        <w:t xml:space="preserve"> (He imagines Berlin. [sich; dative reflexive])</w:t>
+      </w:r>
+    </w:p>
+    <w:p>
+      <w:pPr>
+        <w:spacing w:before="0" w:after="60"/>
+        <w:ind w:left="576"/>
+      </w:pPr>
+      <w:r>
+        <w:rPr>
+          <w:i/>
+          <w:color w:val="30608C"/>
+          <w:sz w:val="21"/>
+        </w:rPr>
+        <w:t xml:space="preserve">› </w:t>
+      </w:r>
+      <w:r>
+        <w:rPr>
+          <w:i/>
+          <w:color w:val="30608C"/>
+          <w:sz w:val="21"/>
+        </w:rPr>
+        <w:t>Sie kauft sich einen Kaffee.</w:t>
+      </w:r>
+      <w:r>
+        <w:rPr>
+          <w:i/>
+          <w:color w:val="404040"/>
+          <w:sz w:val="21"/>
+        </w:rPr>
+        <w:t xml:space="preserve"> (She buys herself a coffee. [sich; dative reflexive])</w:t>
+      </w:r>
+    </w:p>
+    <w:p>
+      <w:pPr>
+        <w:spacing w:before="0" w:after="60"/>
+        <w:ind w:left="576"/>
+      </w:pPr>
+      <w:r>
+        <w:rPr>
+          <w:i/>
+          <w:color w:val="30608C"/>
+          <w:sz w:val="21"/>
+        </w:rPr>
+        <w:t xml:space="preserve">› </w:t>
+      </w:r>
+      <w:r>
+        <w:rPr>
+          <w:i/>
+          <w:color w:val="30608C"/>
+          <w:sz w:val="21"/>
+        </w:rPr>
+        <w:t>Es wäscht sich die Hände.</w:t>
+      </w:r>
+      <w:r>
+        <w:rPr>
+          <w:i/>
+          <w:color w:val="404040"/>
+          <w:sz w:val="21"/>
+        </w:rPr>
+        <w:t xml:space="preserve"> (It washes its hands. [sich; dative reflexive])</w:t>
+      </w:r>
+    </w:p>
+    <w:p>
+      <w:pPr>
+        <w:spacing w:before="0" w:after="60"/>
+        <w:ind w:left="576"/>
+      </w:pPr>
+      <w:r>
+        <w:rPr>
+          <w:i/>
+          <w:color w:val="30608C"/>
+          <w:sz w:val="21"/>
+        </w:rPr>
+        <w:t xml:space="preserve">› </w:t>
+      </w:r>
+      <w:r>
+        <w:rPr>
+          <w:i/>
+          <w:color w:val="30608C"/>
+          <w:sz w:val="21"/>
+        </w:rPr>
+        <w:t>Wir stellen uns eine Reise vor.</w:t>
+      </w:r>
+      <w:r>
+        <w:rPr>
+          <w:i/>
+          <w:color w:val="404040"/>
+          <w:sz w:val="21"/>
+        </w:rPr>
+        <w:t xml:space="preserve"> (We imagine a trip. [uns; dative reflexive])</w:t>
+      </w:r>
+    </w:p>
+    <w:p>
+      <w:pPr>
+        <w:spacing w:before="0" w:after="60"/>
+        <w:ind w:left="576"/>
+      </w:pPr>
+      <w:r>
+        <w:rPr>
+          <w:i/>
+          <w:color w:val="30608C"/>
+          <w:sz w:val="21"/>
+        </w:rPr>
+        <w:t xml:space="preserve">› </w:t>
+      </w:r>
+      <w:r>
+        <w:rPr>
+          <w:i/>
+          <w:color w:val="30608C"/>
+          <w:sz w:val="21"/>
+        </w:rPr>
+        <w:t>Ihr kauft euch Tickets.</w:t>
+      </w:r>
+      <w:r>
+        <w:rPr>
+          <w:i/>
+          <w:color w:val="404040"/>
+          <w:sz w:val="21"/>
+        </w:rPr>
+        <w:t xml:space="preserve"> (You all buy yourselves tickets. [euch; dative reflexive])</w:t>
+      </w:r>
+    </w:p>
+    <w:p>
+      <w:pPr>
+        <w:spacing w:before="0" w:after="60"/>
+        <w:ind w:left="576"/>
+      </w:pPr>
+      <w:r>
+        <w:rPr>
+          <w:i/>
+          <w:color w:val="30608C"/>
+          <w:sz w:val="21"/>
+        </w:rPr>
+        <w:t xml:space="preserve">› </w:t>
+      </w:r>
+      <w:r>
+        <w:rPr>
+          <w:i/>
+          <w:color w:val="30608C"/>
+          <w:sz w:val="21"/>
+        </w:rPr>
+        <w:t>Sie kaufen sich Tickets.</w:t>
+      </w:r>
+      <w:r>
+        <w:rPr>
+          <w:i/>
+          <w:color w:val="404040"/>
+          <w:sz w:val="21"/>
+        </w:rPr>
+        <w:t xml:space="preserve"> (They buy themselves tickets. [sich; dative reflexive])</w:t>
+      </w:r>
+    </w:p>
+    <w:p>
+      <w:pPr>
+        <w:spacing w:before="0" w:after="120"/>
+        <w:ind w:left="576"/>
+      </w:pPr>
+      <w:r>
+        <w:rPr>
+          <w:i/>
+          <w:color w:val="30608C"/>
+          <w:sz w:val="21"/>
+        </w:rPr>
+        <w:t xml:space="preserve">› </w:t>
+      </w:r>
+      <w:r>
+        <w:rPr>
+          <w:i/>
+          <w:color w:val="30608C"/>
+          <w:sz w:val="21"/>
+        </w:rPr>
+        <w:t>Stellen Sie sich eine Stadt vor.</w:t>
+      </w:r>
+      <w:r>
+        <w:rPr>
+          <w:i/>
+          <w:color w:val="404040"/>
+          <w:sz w:val="21"/>
+        </w:rPr>
+        <w:t xml:space="preserve"> (Imagine a city. [sich; formal dative reflexive])</w:t>
+      </w:r>
+    </w:p>
+    <w:p>
+      <w:pPr>
+        <w:spacing w:before="0" w:after="0"/>
+      </w:pPr>
+    </w:p>
+    <w:p>
+      <w:pPr>
+        <w:spacing w:after="120"/>
+      </w:pPr>
+      <w:r>
+        <w:rPr>
+          <w:b/>
+        </w:rPr>
+        <w:t>Personalpronomen</w:t>
+      </w:r>
+      <w:r>
+        <w:t xml:space="preserve"> /pɛʁzoˈnaːlˌpʁoːnoːmən/</w:t>
+      </w:r>
+    </w:p>
+    <w:p>
+      <w:pPr>
+        <w:spacing w:after="80"/>
+        <w:ind w:left="576"/>
+      </w:pPr>
+      <w:r>
+        <w:t>Personal pronouns: ich, mich, mir; du, dich, dir; etc.</w:t>
+      </w:r>
+    </w:p>
+    <w:p>
+      <w:pPr>
+        <w:spacing w:after="80"/>
+        <w:ind w:left="576"/>
+      </w:pPr>
+      <w:r>
+        <w:rPr>
+          <w:i/>
+          <w:color w:val="404040"/>
+          <w:sz w:val="20"/>
+        </w:rPr>
+        <w:t>• Pronouns replace nouns: der Mann → er; die Frau → sie; das Kind → es.</w:t>
+      </w:r>
+    </w:p>
+    <w:p>
+      <w:pPr>
+        <w:spacing w:after="80"/>
+        <w:ind w:left="576"/>
+      </w:pPr>
+      <w:r>
+        <w:rPr>
+          <w:i/>
+          <w:color w:val="404040"/>
+          <w:sz w:val="20"/>
+        </w:rPr>
+        <w:t>• Nominativ marks the subject: ich, du, er, sie, es, wir, ihr, sie.</w:t>
+      </w:r>
+    </w:p>
+    <w:p>
+      <w:pPr>
+        <w:spacing w:after="80"/>
+        <w:ind w:left="576"/>
+      </w:pPr>
+      <w:r>
+        <w:rPr>
+          <w:i/>
+          <w:color w:val="404040"/>
+          <w:sz w:val="20"/>
+        </w:rPr>
+        <w:t>• Akkusativ marks the direct object: mich, dich, ihn, sie, es, uns, euch, sie.</w:t>
+      </w:r>
+    </w:p>
+    <w:p>
+      <w:pPr>
+        <w:spacing w:after="80"/>
+        <w:ind w:left="576"/>
+      </w:pPr>
+      <w:r>
+        <w:rPr>
+          <w:i/>
+          <w:color w:val="404040"/>
+          <w:sz w:val="20"/>
+        </w:rPr>
+        <w:t>• Dativ marks the indirect object or object after dative verbs/prepositions: mir, dir, ihm, ihr, ihm, uns, euch, ihnen.</w:t>
+      </w:r>
+    </w:p>
+    <w:p>
+      <w:pPr>
+        <w:spacing w:after="80"/>
+        <w:ind w:left="576"/>
+      </w:pPr>
+      <w:r>
+        <w:rPr>
+          <w:i/>
+          <w:color w:val="404040"/>
+          <w:sz w:val="20"/>
+        </w:rPr>
+        <w:t>• Reflexive pronouns can look the same as personal pronouns, but the subject and object are the same person: Ich liebe dich vs. Du liebst dich.</w:t>
+      </w:r>
+    </w:p>
+    <w:p>
+      <w:pPr>
+        <w:spacing w:before="40" w:after="60"/>
+        <w:ind w:left="576"/>
+      </w:pPr>
+      <w:r>
+        <w:rPr>
+          <w:i/>
+          <w:color w:val="30608C"/>
+          <w:sz w:val="21"/>
+        </w:rPr>
+        <w:t xml:space="preserve">› </w:t>
+      </w:r>
+      <w:r>
+        <w:rPr>
+          <w:i/>
+          <w:color w:val="30608C"/>
+          <w:sz w:val="21"/>
+        </w:rPr>
+        <w:t>Ich komme aus dem Iran.</w:t>
+      </w:r>
+      <w:r>
+        <w:rPr>
+          <w:i/>
+          <w:color w:val="404040"/>
+          <w:sz w:val="21"/>
+        </w:rPr>
+        <w:t xml:space="preserve"> (I come from Iran. [ich; nominative])</w:t>
+      </w:r>
+    </w:p>
+    <w:p>
+      <w:pPr>
+        <w:spacing w:before="0" w:after="60"/>
+        <w:ind w:left="576"/>
+      </w:pPr>
+      <w:r>
+        <w:rPr>
+          <w:i/>
+          <w:color w:val="30608C"/>
+          <w:sz w:val="21"/>
+        </w:rPr>
+        <w:t xml:space="preserve">› </w:t>
+      </w:r>
+      <w:r>
+        <w:rPr>
+          <w:i/>
+          <w:color w:val="30608C"/>
+          <w:sz w:val="21"/>
+        </w:rPr>
+        <w:t>Er sieht mich.</w:t>
+      </w:r>
+      <w:r>
+        <w:rPr>
+          <w:i/>
+          <w:color w:val="404040"/>
+          <w:sz w:val="21"/>
+        </w:rPr>
+        <w:t xml:space="preserve"> (He sees me. [mich; accusative])</w:t>
+      </w:r>
+    </w:p>
+    <w:p>
+      <w:pPr>
+        <w:spacing w:before="0" w:after="60"/>
+        <w:ind w:left="576"/>
+      </w:pPr>
+      <w:r>
+        <w:rPr>
+          <w:i/>
+          <w:color w:val="30608C"/>
+          <w:sz w:val="21"/>
+        </w:rPr>
+        <w:t xml:space="preserve">› </w:t>
+      </w:r>
+      <w:r>
+        <w:rPr>
+          <w:i/>
+          <w:color w:val="30608C"/>
+          <w:sz w:val="21"/>
+        </w:rPr>
+        <w:t>Er hilft mir.</w:t>
+      </w:r>
+      <w:r>
+        <w:rPr>
+          <w:i/>
+          <w:color w:val="404040"/>
+          <w:sz w:val="21"/>
+        </w:rPr>
+        <w:t xml:space="preserve"> (He helps me. [mir; dative])</w:t>
+      </w:r>
+    </w:p>
+    <w:p>
+      <w:pPr>
+        <w:spacing w:before="0" w:after="60"/>
+        <w:ind w:left="576"/>
+      </w:pPr>
+      <w:r>
+        <w:rPr>
+          <w:i/>
+          <w:color w:val="30608C"/>
+          <w:sz w:val="21"/>
+        </w:rPr>
+        <w:t xml:space="preserve">› </w:t>
+      </w:r>
+      <w:r>
+        <w:rPr>
+          <w:i/>
+          <w:color w:val="30608C"/>
+          <w:sz w:val="21"/>
+        </w:rPr>
+        <w:t>Du lernst Deutsch.</w:t>
+      </w:r>
+      <w:r>
+        <w:rPr>
+          <w:i/>
+          <w:color w:val="404040"/>
+          <w:sz w:val="21"/>
+        </w:rPr>
+        <w:t xml:space="preserve"> (You learn German. [du; nominative])</w:t>
+      </w:r>
+    </w:p>
+    <w:p>
+      <w:pPr>
+        <w:spacing w:before="0" w:after="60"/>
+        <w:ind w:left="576"/>
+      </w:pPr>
+      <w:r>
+        <w:rPr>
+          <w:i/>
+          <w:color w:val="30608C"/>
+          <w:sz w:val="21"/>
+        </w:rPr>
+        <w:t xml:space="preserve">› </w:t>
+      </w:r>
+      <w:r>
+        <w:rPr>
+          <w:i/>
+          <w:color w:val="30608C"/>
+          <w:sz w:val="21"/>
+        </w:rPr>
+        <w:t>Ich sehe dich.</w:t>
+      </w:r>
+      <w:r>
+        <w:rPr>
+          <w:i/>
+          <w:color w:val="404040"/>
+          <w:sz w:val="21"/>
+        </w:rPr>
+        <w:t xml:space="preserve"> (I see you. [dich; accusative])</w:t>
+      </w:r>
+    </w:p>
+    <w:p>
+      <w:pPr>
+        <w:spacing w:before="0" w:after="60"/>
+        <w:ind w:left="576"/>
+      </w:pPr>
+      <w:r>
+        <w:rPr>
+          <w:i/>
+          <w:color w:val="30608C"/>
+          <w:sz w:val="21"/>
+        </w:rPr>
+        <w:t xml:space="preserve">› </w:t>
+      </w:r>
+      <w:r>
+        <w:rPr>
+          <w:i/>
+          <w:color w:val="30608C"/>
+          <w:sz w:val="21"/>
+        </w:rPr>
+        <w:t>Ich helfe dir.</w:t>
+      </w:r>
+      <w:r>
+        <w:rPr>
+          <w:i/>
+          <w:color w:val="404040"/>
+          <w:sz w:val="21"/>
+        </w:rPr>
+        <w:t xml:space="preserve"> (I help you. [dir; dative])</w:t>
+      </w:r>
+    </w:p>
+    <w:p>
+      <w:pPr>
+        <w:spacing w:before="0" w:after="60"/>
+        <w:ind w:left="576"/>
+      </w:pPr>
+      <w:r>
+        <w:rPr>
+          <w:i/>
+          <w:color w:val="30608C"/>
+          <w:sz w:val="21"/>
+        </w:rPr>
+        <w:t xml:space="preserve">› </w:t>
+      </w:r>
+      <w:r>
+        <w:rPr>
+          <w:i/>
+          <w:color w:val="30608C"/>
+          <w:sz w:val="21"/>
+        </w:rPr>
+        <w:t>Er wohnt in Berlin.</w:t>
+      </w:r>
+      <w:r>
+        <w:rPr>
+          <w:i/>
+          <w:color w:val="404040"/>
+          <w:sz w:val="21"/>
+        </w:rPr>
+        <w:t xml:space="preserve"> (He lives in Berlin. [er; nominative])</w:t>
+      </w:r>
+    </w:p>
+    <w:p>
+      <w:pPr>
+        <w:spacing w:before="0" w:after="60"/>
+        <w:ind w:left="576"/>
+      </w:pPr>
+      <w:r>
+        <w:rPr>
+          <w:i/>
+          <w:color w:val="30608C"/>
+          <w:sz w:val="21"/>
+        </w:rPr>
+        <w:t xml:space="preserve">› </w:t>
+      </w:r>
+      <w:r>
+        <w:rPr>
+          <w:i/>
+          <w:color w:val="30608C"/>
+          <w:sz w:val="21"/>
+        </w:rPr>
+        <w:t>Ich kenne ihn.</w:t>
+      </w:r>
+      <w:r>
+        <w:rPr>
+          <w:i/>
+          <w:color w:val="404040"/>
+          <w:sz w:val="21"/>
+        </w:rPr>
+        <w:t xml:space="preserve"> (I know him. [ihn; accusative])</w:t>
+      </w:r>
+    </w:p>
+    <w:p>
+      <w:pPr>
+        <w:spacing w:before="0" w:after="60"/>
+        <w:ind w:left="576"/>
+      </w:pPr>
+      <w:r>
+        <w:rPr>
+          <w:i/>
+          <w:color w:val="30608C"/>
+          <w:sz w:val="21"/>
+        </w:rPr>
+        <w:t xml:space="preserve">› </w:t>
+      </w:r>
+      <w:r>
+        <w:rPr>
+          <w:i/>
+          <w:color w:val="30608C"/>
+          <w:sz w:val="21"/>
+        </w:rPr>
+        <w:t>Ich helfe ihm.</w:t>
+      </w:r>
+      <w:r>
+        <w:rPr>
+          <w:i/>
+          <w:color w:val="404040"/>
+          <w:sz w:val="21"/>
+        </w:rPr>
+        <w:t xml:space="preserve"> (I help him. [ihm; dative])</w:t>
+      </w:r>
+    </w:p>
+    <w:p>
+      <w:pPr>
+        <w:spacing w:before="0" w:after="60"/>
+        <w:ind w:left="576"/>
+      </w:pPr>
+      <w:r>
+        <w:rPr>
+          <w:i/>
+          <w:color w:val="30608C"/>
+          <w:sz w:val="21"/>
+        </w:rPr>
+        <w:t xml:space="preserve">› </w:t>
+      </w:r>
+      <w:r>
+        <w:rPr>
+          <w:i/>
+          <w:color w:val="30608C"/>
+          <w:sz w:val="21"/>
+        </w:rPr>
+        <w:t>Sie spricht Deutsch.</w:t>
+      </w:r>
+      <w:r>
+        <w:rPr>
+          <w:i/>
+          <w:color w:val="404040"/>
+          <w:sz w:val="21"/>
+        </w:rPr>
+        <w:t xml:space="preserve"> (She speaks German. [sie; nominative])</w:t>
+      </w:r>
+    </w:p>
+    <w:p>
+      <w:pPr>
+        <w:spacing w:before="0" w:after="60"/>
+        <w:ind w:left="576"/>
+      </w:pPr>
+      <w:r>
+        <w:rPr>
+          <w:i/>
+          <w:color w:val="30608C"/>
+          <w:sz w:val="21"/>
+        </w:rPr>
+        <w:t xml:space="preserve">› </w:t>
+      </w:r>
+      <w:r>
+        <w:rPr>
+          <w:i/>
+          <w:color w:val="30608C"/>
+          <w:sz w:val="21"/>
+        </w:rPr>
+        <w:t>Ich sehe sie.</w:t>
+      </w:r>
+      <w:r>
+        <w:rPr>
+          <w:i/>
+          <w:color w:val="404040"/>
+          <w:sz w:val="21"/>
+        </w:rPr>
+        <w:t xml:space="preserve"> (I see her. [sie; accusative])</w:t>
+      </w:r>
+    </w:p>
+    <w:p>
+      <w:pPr>
+        <w:spacing w:before="0" w:after="60"/>
+        <w:ind w:left="576"/>
+      </w:pPr>
+      <w:r>
+        <w:rPr>
+          <w:i/>
+          <w:color w:val="30608C"/>
+          <w:sz w:val="21"/>
+        </w:rPr>
+        <w:t xml:space="preserve">› </w:t>
+      </w:r>
+      <w:r>
+        <w:rPr>
+          <w:i/>
+          <w:color w:val="30608C"/>
+          <w:sz w:val="21"/>
+        </w:rPr>
+        <w:t>Ich helfe ihr.</w:t>
+      </w:r>
+      <w:r>
+        <w:rPr>
+          <w:i/>
+          <w:color w:val="404040"/>
+          <w:sz w:val="21"/>
+        </w:rPr>
+        <w:t xml:space="preserve"> (I help her. [ihr; dative])</w:t>
+      </w:r>
+    </w:p>
+    <w:p>
+      <w:pPr>
+        <w:spacing w:before="0" w:after="60"/>
+        <w:ind w:left="576"/>
+      </w:pPr>
+      <w:r>
+        <w:rPr>
+          <w:i/>
+          <w:color w:val="30608C"/>
+          <w:sz w:val="21"/>
+        </w:rPr>
+        <w:t xml:space="preserve">› </w:t>
+      </w:r>
+      <w:r>
+        <w:rPr>
+          <w:i/>
+          <w:color w:val="30608C"/>
+          <w:sz w:val="21"/>
+        </w:rPr>
+        <w:t>Es ist schön.</w:t>
+      </w:r>
+      <w:r>
+        <w:rPr>
+          <w:i/>
+          <w:color w:val="404040"/>
+          <w:sz w:val="21"/>
+        </w:rPr>
+        <w:t xml:space="preserve"> (It is beautiful. [es; nominative])</w:t>
+      </w:r>
+    </w:p>
+    <w:p>
+      <w:pPr>
+        <w:spacing w:before="0" w:after="60"/>
+        <w:ind w:left="576"/>
+      </w:pPr>
+      <w:r>
+        <w:rPr>
+          <w:i/>
+          <w:color w:val="30608C"/>
+          <w:sz w:val="21"/>
+        </w:rPr>
+        <w:t xml:space="preserve">› </w:t>
+      </w:r>
+      <w:r>
+        <w:rPr>
+          <w:i/>
+          <w:color w:val="30608C"/>
+          <w:sz w:val="21"/>
+        </w:rPr>
+        <w:t>Ich sehe es.</w:t>
+      </w:r>
+      <w:r>
+        <w:rPr>
+          <w:i/>
+          <w:color w:val="404040"/>
+          <w:sz w:val="21"/>
+        </w:rPr>
+        <w:t xml:space="preserve"> (I see it. [es; accusative])</w:t>
+      </w:r>
+    </w:p>
+    <w:p>
+      <w:pPr>
+        <w:spacing w:before="0" w:after="60"/>
+        <w:ind w:left="576"/>
+      </w:pPr>
+      <w:r>
+        <w:rPr>
+          <w:i/>
+          <w:color w:val="30608C"/>
+          <w:sz w:val="21"/>
+        </w:rPr>
+        <w:t xml:space="preserve">› </w:t>
+      </w:r>
+      <w:r>
+        <w:rPr>
+          <w:i/>
+          <w:color w:val="30608C"/>
+          <w:sz w:val="21"/>
+        </w:rPr>
+        <w:t>Ich helfe ihm.</w:t>
+      </w:r>
+      <w:r>
+        <w:rPr>
+          <w:i/>
+          <w:color w:val="404040"/>
+          <w:sz w:val="21"/>
+        </w:rPr>
+        <w:t xml:space="preserve"> (I help it. [ihm; dative for a neuter noun])</w:t>
+      </w:r>
+    </w:p>
+    <w:p>
+      <w:pPr>
+        <w:spacing w:before="0" w:after="60"/>
+        <w:ind w:left="576"/>
+      </w:pPr>
+      <w:r>
+        <w:rPr>
+          <w:i/>
+          <w:color w:val="30608C"/>
+          <w:sz w:val="21"/>
+        </w:rPr>
+        <w:t xml:space="preserve">› </w:t>
+      </w:r>
+      <w:r>
+        <w:rPr>
+          <w:i/>
+          <w:color w:val="30608C"/>
+          <w:sz w:val="21"/>
+        </w:rPr>
+        <w:t>Wir lernen Deutsch.</w:t>
+      </w:r>
+      <w:r>
+        <w:rPr>
+          <w:i/>
+          <w:color w:val="404040"/>
+          <w:sz w:val="21"/>
+        </w:rPr>
+        <w:t xml:space="preserve"> (We learn German. [wir; nominative])</w:t>
+      </w:r>
+    </w:p>
+    <w:p>
+      <w:pPr>
+        <w:spacing w:before="0" w:after="60"/>
+        <w:ind w:left="576"/>
+      </w:pPr>
+      <w:r>
+        <w:rPr>
+          <w:i/>
+          <w:color w:val="30608C"/>
+          <w:sz w:val="21"/>
+        </w:rPr>
+        <w:t xml:space="preserve">› </w:t>
+      </w:r>
+      <w:r>
+        <w:rPr>
+          <w:i/>
+          <w:color w:val="30608C"/>
+          <w:sz w:val="21"/>
+        </w:rPr>
+        <w:t>Er sieht uns.</w:t>
+      </w:r>
+      <w:r>
+        <w:rPr>
+          <w:i/>
+          <w:color w:val="404040"/>
+          <w:sz w:val="21"/>
+        </w:rPr>
+        <w:t xml:space="preserve"> (He sees us. [uns; accusative])</w:t>
+      </w:r>
+    </w:p>
+    <w:p>
+      <w:pPr>
+        <w:spacing w:before="0" w:after="60"/>
+        <w:ind w:left="576"/>
+      </w:pPr>
+      <w:r>
+        <w:rPr>
+          <w:i/>
+          <w:color w:val="30608C"/>
+          <w:sz w:val="21"/>
+        </w:rPr>
+        <w:t xml:space="preserve">› </w:t>
+      </w:r>
+      <w:r>
+        <w:rPr>
+          <w:i/>
+          <w:color w:val="30608C"/>
+          <w:sz w:val="21"/>
+        </w:rPr>
+        <w:t>Er hilft uns.</w:t>
+      </w:r>
+      <w:r>
+        <w:rPr>
+          <w:i/>
+          <w:color w:val="404040"/>
+          <w:sz w:val="21"/>
+        </w:rPr>
+        <w:t xml:space="preserve"> (He helps us. [uns; dative])</w:t>
+      </w:r>
+    </w:p>
+    <w:p>
+      <w:pPr>
+        <w:spacing w:before="0" w:after="60"/>
+        <w:ind w:left="576"/>
+      </w:pPr>
+      <w:r>
+        <w:rPr>
+          <w:i/>
+          <w:color w:val="30608C"/>
+          <w:sz w:val="21"/>
+        </w:rPr>
+        <w:t xml:space="preserve">› </w:t>
+      </w:r>
+      <w:r>
+        <w:rPr>
+          <w:i/>
+          <w:color w:val="30608C"/>
+          <w:sz w:val="21"/>
+        </w:rPr>
+        <w:t>Ihr seid hier.</w:t>
+      </w:r>
+      <w:r>
+        <w:rPr>
+          <w:i/>
+          <w:color w:val="404040"/>
+          <w:sz w:val="21"/>
+        </w:rPr>
+        <w:t xml:space="preserve"> (You all are here. [ihr; nominative])</w:t>
+      </w:r>
+    </w:p>
+    <w:p>
+      <w:pPr>
+        <w:spacing w:before="0" w:after="60"/>
+        <w:ind w:left="576"/>
+      </w:pPr>
+      <w:r>
+        <w:rPr>
+          <w:i/>
+          <w:color w:val="30608C"/>
+          <w:sz w:val="21"/>
+        </w:rPr>
+        <w:t xml:space="preserve">› </w:t>
+      </w:r>
+      <w:r>
+        <w:rPr>
+          <w:i/>
+          <w:color w:val="30608C"/>
+          <w:sz w:val="21"/>
+        </w:rPr>
+        <w:t>Ich sehe euch.</w:t>
+      </w:r>
+      <w:r>
+        <w:rPr>
+          <w:i/>
+          <w:color w:val="404040"/>
+          <w:sz w:val="21"/>
+        </w:rPr>
+        <w:t xml:space="preserve"> (I see you all. [euch; accusative])</w:t>
+      </w:r>
+    </w:p>
+    <w:p>
+      <w:pPr>
+        <w:spacing w:before="0" w:after="60"/>
+        <w:ind w:left="576"/>
+      </w:pPr>
+      <w:r>
+        <w:rPr>
+          <w:i/>
+          <w:color w:val="30608C"/>
+          <w:sz w:val="21"/>
+        </w:rPr>
+        <w:t xml:space="preserve">› </w:t>
+      </w:r>
+      <w:r>
+        <w:rPr>
+          <w:i/>
+          <w:color w:val="30608C"/>
+          <w:sz w:val="21"/>
+        </w:rPr>
+        <w:t>Ich helfe euch.</w:t>
+      </w:r>
+      <w:r>
+        <w:rPr>
+          <w:i/>
+          <w:color w:val="404040"/>
+          <w:sz w:val="21"/>
+        </w:rPr>
+        <w:t xml:space="preserve"> (I help you all. [euch; dative])</w:t>
+      </w:r>
+    </w:p>
+    <w:p>
+      <w:pPr>
+        <w:spacing w:before="0" w:after="60"/>
+        <w:ind w:left="576"/>
+      </w:pPr>
+      <w:r>
+        <w:rPr>
+          <w:i/>
+          <w:color w:val="30608C"/>
+          <w:sz w:val="21"/>
+        </w:rPr>
+        <w:t xml:space="preserve">› </w:t>
+      </w:r>
+      <w:r>
+        <w:rPr>
+          <w:i/>
+          <w:color w:val="30608C"/>
+          <w:sz w:val="21"/>
+        </w:rPr>
+        <w:t>Sie kommen aus Deutschland.</w:t>
+      </w:r>
+      <w:r>
+        <w:rPr>
+          <w:i/>
+          <w:color w:val="404040"/>
+          <w:sz w:val="21"/>
+        </w:rPr>
+        <w:t xml:space="preserve"> (They come from Germany. [sie; nominative plural])</w:t>
+      </w:r>
+    </w:p>
+    <w:p>
+      <w:pPr>
+        <w:spacing w:before="0" w:after="60"/>
+        <w:ind w:left="576"/>
+      </w:pPr>
+      <w:r>
+        <w:rPr>
+          <w:i/>
+          <w:color w:val="30608C"/>
+          <w:sz w:val="21"/>
+        </w:rPr>
+        <w:t xml:space="preserve">› </w:t>
+      </w:r>
+      <w:r>
+        <w:rPr>
+          <w:i/>
+          <w:color w:val="30608C"/>
+          <w:sz w:val="21"/>
+        </w:rPr>
+        <w:t>Ich sehe sie.</w:t>
+      </w:r>
+      <w:r>
+        <w:rPr>
+          <w:i/>
+          <w:color w:val="404040"/>
+          <w:sz w:val="21"/>
+        </w:rPr>
+        <w:t xml:space="preserve"> (I see them. [sie; accusative plural])</w:t>
+      </w:r>
+    </w:p>
+    <w:p>
+      <w:pPr>
+        <w:spacing w:before="0" w:after="120"/>
+        <w:ind w:left="576"/>
+      </w:pPr>
+      <w:r>
+        <w:rPr>
+          <w:i/>
+          <w:color w:val="30608C"/>
+          <w:sz w:val="21"/>
+        </w:rPr>
+        <w:t xml:space="preserve">› </w:t>
+      </w:r>
+      <w:r>
+        <w:rPr>
+          <w:i/>
+          <w:color w:val="30608C"/>
+          <w:sz w:val="21"/>
+        </w:rPr>
+        <w:t>Ich helfe ihnen.</w:t>
+      </w:r>
+      <w:r>
+        <w:rPr>
+          <w:i/>
+          <w:color w:val="404040"/>
+          <w:sz w:val="21"/>
+        </w:rPr>
+        <w:t xml:space="preserve"> (I help them. [ihnen; dative plural])</w:t>
+      </w:r>
+    </w:p>
+    <w:p>
+      <w:pPr>
+        <w:spacing w:before="0" w:after="0"/>
+      </w:pPr>
+    </w:p>
+    <w:p>
+      <w:pPr>
+        <w:spacing w:after="120"/>
+      </w:pPr>
+      <w:r>
+        <w:rPr>
+          <w:b/>
+        </w:rPr>
+        <w:t>sich vorstellen</w:t>
+      </w:r>
+      <w:r>
+        <w:t xml:space="preserve"> /zɪç ˈfoːɐ̯ˌʃtɛlən/</w:t>
+      </w:r>
+    </w:p>
+    <w:p>
+      <w:pPr>
+        <w:spacing w:after="80"/>
+        <w:ind w:left="576"/>
+      </w:pPr>
+      <w:r>
+        <w:t>To introduce oneself; to imagine something.</w:t>
+      </w:r>
+    </w:p>
+    <w:p>
+      <w:pPr>
+        <w:spacing w:after="80"/>
+        <w:ind w:left="576"/>
+      </w:pPr>
+      <w:r>
+        <w:rPr>
+          <w:i/>
+          <w:color w:val="404040"/>
+          <w:sz w:val="20"/>
+        </w:rPr>
+        <w:t>• Separable reflexive verb: vor moves to the end (Ich stelle mich vor.).</w:t>
+      </w:r>
+    </w:p>
+    <w:p>
+      <w:pPr>
+        <w:spacing w:after="80"/>
+        <w:ind w:left="576"/>
+      </w:pPr>
+      <w:r>
+        <w:rPr>
+          <w:i/>
+          <w:color w:val="404040"/>
+          <w:sz w:val="20"/>
+        </w:rPr>
+        <w:t>• Introduce oneself uses accusative reflexive pronouns: mich, dich, sich, uns, euch, sich.</w:t>
+      </w:r>
+    </w:p>
+    <w:p>
+      <w:pPr>
+        <w:spacing w:after="80"/>
+        <w:ind w:left="576"/>
+      </w:pPr>
+      <w:r>
+        <w:rPr>
+          <w:i/>
+          <w:color w:val="404040"/>
+          <w:sz w:val="20"/>
+        </w:rPr>
+        <w:t>• Imagine something uses dative reflexive pronouns with an object: mir, dir, sich, uns, euch, sich.</w:t>
+      </w:r>
+    </w:p>
+    <w:p>
+      <w:pPr>
+        <w:spacing w:before="40" w:after="60"/>
+        <w:ind w:left="576"/>
+      </w:pPr>
+      <w:r>
+        <w:rPr>
+          <w:i/>
+          <w:color w:val="30608C"/>
+          <w:sz w:val="21"/>
+        </w:rPr>
+        <w:t xml:space="preserve">› </w:t>
+      </w:r>
+      <w:r>
+        <w:rPr>
+          <w:i/>
+          <w:color w:val="30608C"/>
+          <w:sz w:val="21"/>
+        </w:rPr>
+        <w:t>Ich stelle mich vor.</w:t>
+      </w:r>
+      <w:r>
+        <w:rPr>
+          <w:i/>
+          <w:color w:val="404040"/>
+          <w:sz w:val="21"/>
+        </w:rPr>
+        <w:t xml:space="preserve"> (I introduce myself. [accusative reflexive])</w:t>
+      </w:r>
+    </w:p>
+    <w:p>
+      <w:pPr>
+        <w:spacing w:before="0" w:after="60"/>
+        <w:ind w:left="576"/>
+      </w:pPr>
+      <w:r>
+        <w:rPr>
+          <w:i/>
+          <w:color w:val="30608C"/>
+          <w:sz w:val="21"/>
+        </w:rPr>
+        <w:t xml:space="preserve">› </w:t>
+      </w:r>
+      <w:r>
+        <w:rPr>
+          <w:i/>
+          <w:color w:val="30608C"/>
+          <w:sz w:val="21"/>
+        </w:rPr>
+        <w:t>Stellen Sie sich vor.</w:t>
+      </w:r>
+      <w:r>
+        <w:rPr>
+          <w:i/>
+          <w:color w:val="404040"/>
+          <w:sz w:val="21"/>
+        </w:rPr>
+        <w:t xml:space="preserve"> (Introduce yourself. [formal instruction])</w:t>
+      </w:r>
+    </w:p>
+    <w:p>
+      <w:pPr>
+        <w:spacing w:before="0" w:after="60"/>
+        <w:ind w:left="576"/>
+      </w:pPr>
+      <w:r>
+        <w:rPr>
+          <w:i/>
+          <w:color w:val="30608C"/>
+          <w:sz w:val="21"/>
+        </w:rPr>
+        <w:t xml:space="preserve">› </w:t>
+      </w:r>
+      <w:r>
+        <w:rPr>
+          <w:i/>
+          <w:color w:val="30608C"/>
+          <w:sz w:val="21"/>
+        </w:rPr>
+        <w:t>Wir stellen uns im Kurs vor.</w:t>
+      </w:r>
+      <w:r>
+        <w:rPr>
+          <w:i/>
+          <w:color w:val="404040"/>
+          <w:sz w:val="21"/>
+        </w:rPr>
+        <w:t xml:space="preserve"> (We introduce ourselves in class.)</w:t>
+      </w:r>
+    </w:p>
+    <w:p>
+      <w:pPr>
+        <w:spacing w:before="0" w:after="60"/>
+        <w:ind w:left="576"/>
+      </w:pPr>
+      <w:r>
+        <w:rPr>
+          <w:i/>
+          <w:color w:val="30608C"/>
+          <w:sz w:val="21"/>
+        </w:rPr>
+        <w:t xml:space="preserve">› </w:t>
+      </w:r>
+      <w:r>
+        <w:rPr>
+          <w:i/>
+          <w:color w:val="30608C"/>
+          <w:sz w:val="21"/>
+        </w:rPr>
+        <w:t>Ich stelle mir Berlin vor.</w:t>
+      </w:r>
+      <w:r>
+        <w:rPr>
+          <w:i/>
+          <w:color w:val="404040"/>
+          <w:sz w:val="21"/>
+        </w:rPr>
+        <w:t xml:space="preserve"> (I imagine Berlin. [dative reflexive])</w:t>
+      </w:r>
+    </w:p>
+    <w:p>
+      <w:pPr>
+        <w:spacing w:before="0" w:after="120"/>
+        <w:ind w:left="576"/>
+      </w:pPr>
+      <w:r>
+        <w:rPr>
+          <w:i/>
+          <w:color w:val="30608C"/>
+          <w:sz w:val="21"/>
+        </w:rPr>
+        <w:t xml:space="preserve">› </w:t>
+      </w:r>
+      <w:r>
+        <w:rPr>
+          <w:i/>
+          <w:color w:val="30608C"/>
+          <w:sz w:val="21"/>
+        </w:rPr>
+        <w:t>Stellen Sie sich eine Stadt vor.</w:t>
+      </w:r>
+      <w:r>
+        <w:rPr>
+          <w:i/>
+          <w:color w:val="404040"/>
+          <w:sz w:val="21"/>
+        </w:rPr>
+        <w:t xml:space="preserve"> (Imagine a city. [formal instruction])</w:t>
+      </w:r>
+    </w:p>
+    <w:p>
+      <w:pPr>
+        <w:spacing w:before="0" w:after="0"/>
+      </w:pPr>
+    </w:p>
+    <w:p>
+      <w:pPr>
+        <w:spacing w:after="120"/>
+      </w:pPr>
+      <w:r>
+        <w:rPr>
+          <w:b/>
+        </w:rPr>
+        <w:t>begrüßen</w:t>
+      </w:r>
+      <w:r>
+        <w:t xml:space="preserve"> /bəˈɡʁyːsn̩/</w:t>
+      </w:r>
+    </w:p>
+    <w:p>
+      <w:pPr>
+        <w:spacing w:after="80"/>
+        <w:ind w:left="576"/>
+      </w:pPr>
+      <w:r>
+        <w:t>To greet; say hello to someone.</w:t>
+      </w:r>
+    </w:p>
+    <w:p>
+      <w:pPr>
+        <w:spacing w:after="80"/>
+        <w:ind w:left="576"/>
+      </w:pPr>
+      <w:r>
+        <w:rPr>
+          <w:i/>
+          <w:color w:val="404040"/>
+          <w:sz w:val="20"/>
+        </w:rPr>
+        <w:t>• Takes an accusative object: Begrüßen Sie Ihren Partner / Ihre Partnerin.</w:t>
+      </w:r>
+    </w:p>
+    <w:p>
+      <w:pPr>
+        <w:spacing w:before="40" w:after="60"/>
+        <w:ind w:left="576"/>
+      </w:pPr>
+      <w:r>
+        <w:rPr>
+          <w:i/>
+          <w:color w:val="30608C"/>
+          <w:sz w:val="21"/>
+        </w:rPr>
+        <w:t xml:space="preserve">› </w:t>
+      </w:r>
+      <w:r>
+        <w:rPr>
+          <w:i/>
+          <w:color w:val="30608C"/>
+          <w:sz w:val="21"/>
+        </w:rPr>
+        <w:t>Begrüßen Sie Ihren Partner.</w:t>
+      </w:r>
+      <w:r>
+        <w:rPr>
+          <w:i/>
+          <w:color w:val="404040"/>
+          <w:sz w:val="21"/>
+        </w:rPr>
+        <w:t xml:space="preserve"> (Greet your partner. [male partner; formal instruction])</w:t>
+      </w:r>
+    </w:p>
+    <w:p>
+      <w:pPr>
+        <w:spacing w:before="0" w:after="120"/>
+        <w:ind w:left="576"/>
+      </w:pPr>
+      <w:r>
+        <w:rPr>
+          <w:i/>
+          <w:color w:val="30608C"/>
+          <w:sz w:val="21"/>
+        </w:rPr>
+        <w:t xml:space="preserve">› </w:t>
+      </w:r>
+      <w:r>
+        <w:rPr>
+          <w:i/>
+          <w:color w:val="30608C"/>
+          <w:sz w:val="21"/>
+        </w:rPr>
+        <w:t>Begrüßen Sie Ihre Partnerin.</w:t>
+      </w:r>
+      <w:r>
+        <w:rPr>
+          <w:i/>
+          <w:color w:val="404040"/>
+          <w:sz w:val="21"/>
+        </w:rPr>
+        <w:t xml:space="preserve"> (Greet your partner. [female partner; formal instruction])</w:t>
+      </w:r>
+    </w:p>
+    <w:p>
+      <w:pPr>
+        <w:spacing w:before="0" w:after="0"/>
+      </w:pPr>
+    </w:p>
+    <w:p>
+      <w:pPr>
+        <w:spacing w:after="120"/>
+      </w:pPr>
+      <w:r>
+        <w:rPr>
+          <w:b/>
+        </w:rPr>
+        <w:t>der Partner</w:t>
+      </w:r>
+      <w:r>
+        <w:t xml:space="preserve"> / die Partnerin /ˈpaʁtnɐ/ /ˈpaʁtnəʁɪn/</w:t>
+      </w:r>
+    </w:p>
+    <w:p>
+      <w:pPr>
+        <w:spacing w:after="80"/>
+        <w:ind w:left="576"/>
+      </w:pPr>
+      <w:r>
+        <w:rPr>
+          <w:sz w:val="22"/>
+        </w:rPr>
+        <w:t>der Partner, - / die Partnerin, -nen</w:t>
+      </w:r>
+    </w:p>
+    <w:p>
+      <w:pPr>
+        <w:spacing w:after="80"/>
+        <w:ind w:left="576"/>
+      </w:pPr>
+      <w:r>
+        <w:t>Partner; classroom speaking partner.</w:t>
+      </w:r>
+    </w:p>
+    <w:p>
+      <w:pPr>
+        <w:spacing w:before="40" w:after="60"/>
+        <w:ind w:left="576"/>
+      </w:pPr>
+      <w:r>
+        <w:rPr>
+          <w:i/>
+          <w:color w:val="30608C"/>
+          <w:sz w:val="21"/>
+        </w:rPr>
+        <w:t xml:space="preserve">› </w:t>
+      </w:r>
+      <w:r>
+        <w:rPr>
+          <w:i/>
+          <w:color w:val="30608C"/>
+          <w:sz w:val="21"/>
+        </w:rPr>
+        <w:t>Ihr Partner ist hier.</w:t>
+      </w:r>
+      <w:r>
+        <w:rPr>
+          <w:i/>
+          <w:color w:val="404040"/>
+          <w:sz w:val="21"/>
+        </w:rPr>
+        <w:t xml:space="preserve"> (Your partner is here. [male partner; nominative])</w:t>
+      </w:r>
+    </w:p>
+    <w:p>
+      <w:pPr>
+        <w:spacing w:before="0" w:after="60"/>
+        <w:ind w:left="576"/>
+      </w:pPr>
+      <w:r>
+        <w:rPr>
+          <w:i/>
+          <w:color w:val="30608C"/>
+          <w:sz w:val="21"/>
+        </w:rPr>
+        <w:t xml:space="preserve">› </w:t>
+      </w:r>
+      <w:r>
+        <w:rPr>
+          <w:i/>
+          <w:color w:val="30608C"/>
+          <w:sz w:val="21"/>
+        </w:rPr>
+        <w:t>Begrüßen Sie Ihren Partner.</w:t>
+      </w:r>
+      <w:r>
+        <w:rPr>
+          <w:i/>
+          <w:color w:val="404040"/>
+          <w:sz w:val="21"/>
+        </w:rPr>
+        <w:t xml:space="preserve"> (Greet your partner. [male partner; accusative])</w:t>
+      </w:r>
+    </w:p>
+    <w:p>
+      <w:pPr>
+        <w:spacing w:before="0" w:after="120"/>
+        <w:ind w:left="576"/>
+      </w:pPr>
+      <w:r>
+        <w:rPr>
+          <w:i/>
+          <w:color w:val="30608C"/>
+          <w:sz w:val="21"/>
+        </w:rPr>
+        <w:t xml:space="preserve">› </w:t>
+      </w:r>
+      <w:r>
+        <w:rPr>
+          <w:i/>
+          <w:color w:val="30608C"/>
+          <w:sz w:val="21"/>
+        </w:rPr>
+        <w:t>Begrüßen Sie Ihre Partnerin.</w:t>
+      </w:r>
+      <w:r>
+        <w:rPr>
+          <w:i/>
+          <w:color w:val="404040"/>
+          <w:sz w:val="21"/>
+        </w:rPr>
+        <w:t xml:space="preserve"> (Greet your partner. [female partner; accusative])</w:t>
+      </w:r>
+    </w:p>
+    <w:p>
+      <w:pPr>
+        <w:spacing w:before="0" w:after="0"/>
+      </w:pPr>
+    </w:p>
+    <w:p>
+      <w:pPr>
+        <w:spacing w:after="120"/>
+      </w:pPr>
+      <w:r>
+        <w:rPr>
+          <w:b/>
+        </w:rPr>
+        <w:t>Wie heißt ...?</w:t>
+      </w:r>
+      <w:r>
+        <w:t xml:space="preserve"> /viː haɪ̯st/</w:t>
+      </w:r>
+    </w:p>
+    <w:p>
+      <w:pPr>
+        <w:spacing w:after="80"/>
+        <w:ind w:left="576"/>
+      </w:pPr>
+      <w:r>
+        <w:t>What is ... called?</w:t>
+      </w:r>
+    </w:p>
+    <w:p>
+      <w:pPr>
+        <w:spacing w:after="80"/>
+        <w:ind w:left="576"/>
+      </w:pPr>
+      <w:r>
+        <w:rPr>
+          <w:i/>
+          <w:color w:val="404040"/>
+          <w:sz w:val="20"/>
+        </w:rPr>
+        <w:t>• W-question pattern: Wie is position 1, the finite verb heißt is position 2.</w:t>
+      </w:r>
+    </w:p>
+    <w:p>
+      <w:pPr>
+        <w:spacing w:before="40" w:after="60"/>
+        <w:ind w:left="576"/>
+      </w:pPr>
+      <w:r>
+        <w:rPr>
+          <w:i/>
+          <w:color w:val="30608C"/>
+          <w:sz w:val="21"/>
+        </w:rPr>
+        <w:t xml:space="preserve">› </w:t>
+      </w:r>
+      <w:r>
+        <w:rPr>
+          <w:i/>
+          <w:color w:val="30608C"/>
+          <w:sz w:val="21"/>
+        </w:rPr>
+        <w:t>Wie heißt Ihr Land in Ihrer Sprache?</w:t>
+      </w:r>
+      <w:r>
+        <w:rPr>
+          <w:i/>
+          <w:color w:val="404040"/>
+          <w:sz w:val="21"/>
+        </w:rPr>
+        <w:t xml:space="preserve"> (What is your country called in your language? [formal])</w:t>
+      </w:r>
+    </w:p>
+    <w:p>
+      <w:pPr>
+        <w:spacing w:before="0" w:after="120"/>
+        <w:ind w:left="576"/>
+      </w:pPr>
+      <w:r>
+        <w:rPr>
+          <w:i/>
+          <w:color w:val="30608C"/>
+          <w:sz w:val="21"/>
+        </w:rPr>
+        <w:t xml:space="preserve">› </w:t>
+      </w:r>
+      <w:r>
+        <w:rPr>
+          <w:i/>
+          <w:color w:val="30608C"/>
+          <w:sz w:val="21"/>
+        </w:rPr>
+        <w:t>Wie heißt das auf Deutsch?</w:t>
+      </w:r>
+      <w:r>
+        <w:rPr>
+          <w:i/>
+          <w:color w:val="404040"/>
+          <w:sz w:val="21"/>
+        </w:rPr>
+        <w:t xml:space="preserve"> (What is that called in German?)</w:t>
+      </w:r>
+    </w:p>
+    <w:p>
+      <w:pPr>
+        <w:spacing w:before="0" w:after="0"/>
+      </w:pPr>
+    </w:p>
+    <w:p>
+      <w:pPr>
+        <w:spacing w:after="120"/>
+      </w:pPr>
+      <w:r>
+        <w:rPr>
+          <w:b/>
+        </w:rPr>
+        <w:t>das Land</w:t>
+      </w:r>
+      <w:r>
+        <w:t xml:space="preserve"> /lant/</w:t>
+      </w:r>
+    </w:p>
+    <w:p>
+      <w:pPr>
+        <w:spacing w:after="80"/>
+        <w:ind w:left="576"/>
+      </w:pPr>
+      <w:r>
+        <w:rPr>
+          <w:sz w:val="22"/>
+        </w:rPr>
+        <w:t>das Land, Länder</w:t>
+      </w:r>
+    </w:p>
+    <w:p>
+      <w:pPr>
+        <w:spacing w:after="80"/>
+        <w:ind w:left="576"/>
+      </w:pPr>
+      <w:r>
+        <w:t>Country; land.</w:t>
+      </w:r>
+    </w:p>
+    <w:p>
+      <w:pPr>
+        <w:spacing w:before="40" w:after="60"/>
+        <w:ind w:left="576"/>
+      </w:pPr>
+      <w:r>
+        <w:rPr>
+          <w:i/>
+          <w:color w:val="30608C"/>
+          <w:sz w:val="21"/>
+        </w:rPr>
+        <w:t xml:space="preserve">› </w:t>
+      </w:r>
+      <w:r>
+        <w:rPr>
+          <w:i/>
+          <w:color w:val="30608C"/>
+          <w:sz w:val="21"/>
+        </w:rPr>
+        <w:t>Ihr Land heißt Iran.</w:t>
+      </w:r>
+      <w:r>
+        <w:rPr>
+          <w:i/>
+          <w:color w:val="404040"/>
+          <w:sz w:val="21"/>
+        </w:rPr>
+        <w:t xml:space="preserve"> (Your country is called Iran. [formal])</w:t>
+      </w:r>
+    </w:p>
+    <w:p>
+      <w:pPr>
+        <w:spacing w:before="0" w:after="120"/>
+        <w:ind w:left="576"/>
+      </w:pPr>
+      <w:r>
+        <w:rPr>
+          <w:i/>
+          <w:color w:val="30608C"/>
+          <w:sz w:val="21"/>
+        </w:rPr>
+        <w:t xml:space="preserve">› </w:t>
+      </w:r>
+      <w:r>
+        <w:rPr>
+          <w:i/>
+          <w:color w:val="30608C"/>
+          <w:sz w:val="21"/>
+        </w:rPr>
+        <w:t>Wie heißt Ihr Land?</w:t>
+      </w:r>
+      <w:r>
+        <w:rPr>
+          <w:i/>
+          <w:color w:val="404040"/>
+          <w:sz w:val="21"/>
+        </w:rPr>
+        <w:t xml:space="preserve"> (What is your country called? [formal])</w:t>
+      </w:r>
+    </w:p>
+    <w:p>
+      <w:pPr>
+        <w:spacing w:before="0" w:after="0"/>
+      </w:pPr>
+    </w:p>
+    <w:p>
+      <w:pPr>
+        <w:spacing w:after="120"/>
+      </w:pPr>
+      <w:r>
+        <w:rPr>
+          <w:b/>
+        </w:rPr>
+        <w:t>die Sprache</w:t>
+      </w:r>
+      <w:r>
+        <w:t xml:space="preserve"> /ˈʃpʁaːxə/</w:t>
+      </w:r>
+    </w:p>
+    <w:p>
+      <w:pPr>
+        <w:spacing w:after="80"/>
+        <w:ind w:left="576"/>
+      </w:pPr>
+      <w:r>
+        <w:rPr>
+          <w:sz w:val="22"/>
+        </w:rPr>
+        <w:t>die Sprache, -n</w:t>
+      </w:r>
+    </w:p>
+    <w:p>
+      <w:pPr>
+        <w:spacing w:after="80"/>
+        <w:ind w:left="576"/>
+      </w:pPr>
+      <w:r>
+        <w:t>Language.</w:t>
+      </w:r>
+    </w:p>
+    <w:p>
+      <w:pPr>
+        <w:spacing w:after="80"/>
+        <w:ind w:left="576"/>
+      </w:pPr>
+      <w:r>
+        <w:rPr>
+          <w:i/>
+          <w:color w:val="404040"/>
+          <w:sz w:val="20"/>
+        </w:rPr>
+        <w:t>• Feminine noun: die Sprache; after static in, use dative: in der Sprache / in Ihrer Sprache.</w:t>
+      </w:r>
+    </w:p>
+    <w:p>
+      <w:pPr>
+        <w:spacing w:before="40" w:after="60"/>
+        <w:ind w:left="576"/>
+      </w:pPr>
+      <w:r>
+        <w:rPr>
+          <w:i/>
+          <w:color w:val="30608C"/>
+          <w:sz w:val="21"/>
+        </w:rPr>
+        <w:t xml:space="preserve">› </w:t>
+      </w:r>
+      <w:r>
+        <w:rPr>
+          <w:i/>
+          <w:color w:val="30608C"/>
+          <w:sz w:val="21"/>
+        </w:rPr>
+        <w:t>In Ihrer Sprache heißt das anders.</w:t>
+      </w:r>
+      <w:r>
+        <w:rPr>
+          <w:i/>
+          <w:color w:val="404040"/>
+          <w:sz w:val="21"/>
+        </w:rPr>
+        <w:t xml:space="preserve"> (In your language, that is called something different. [formal])</w:t>
+      </w:r>
+    </w:p>
+    <w:p>
+      <w:pPr>
+        <w:spacing w:before="0" w:after="120"/>
+        <w:ind w:left="576"/>
+      </w:pPr>
+      <w:r>
+        <w:rPr>
+          <w:i/>
+          <w:color w:val="30608C"/>
+          <w:sz w:val="21"/>
+        </w:rPr>
+        <w:t xml:space="preserve">› </w:t>
+      </w:r>
+      <w:r>
+        <w:rPr>
+          <w:i/>
+          <w:color w:val="30608C"/>
+          <w:sz w:val="21"/>
+        </w:rPr>
+        <w:t>Ich lerne die deutsche Sprache.</w:t>
+      </w:r>
+      <w:r>
+        <w:rPr>
+          <w:i/>
+          <w:color w:val="404040"/>
+          <w:sz w:val="21"/>
+        </w:rPr>
+        <w:t xml:space="preserve"> (I am learning the German language.)</w:t>
+      </w:r>
+    </w:p>
+    <w:p>
+      <w:pPr>
+        <w:spacing w:before="0" w:after="0"/>
+      </w:pPr>
+    </w:p>
+    <w:p>
+      <w:pPr>
+        <w:spacing w:after="120"/>
+      </w:pPr>
+      <w:r>
+        <w:rPr>
+          <w:b/>
+        </w:rPr>
+        <w:t>Ihr-</w:t>
+      </w:r>
+      <w:r>
+        <w:t xml:space="preserve"> /iːɐ̯/</w:t>
+      </w:r>
+    </w:p>
+    <w:p>
+      <w:pPr>
+        <w:spacing w:after="80"/>
+        <w:ind w:left="576"/>
+      </w:pPr>
+      <w:r>
+        <w:t>Your; formal possessive stem.</w:t>
+      </w:r>
+    </w:p>
+    <w:p>
+      <w:pPr>
+        <w:spacing w:after="80"/>
+        <w:ind w:left="576"/>
+      </w:pPr>
+      <w:r>
+        <w:rPr>
+          <w:i/>
+          <w:color w:val="404040"/>
+          <w:sz w:val="20"/>
+        </w:rPr>
+        <w:t>• Capitalized Ihr- means formal your. Endings follow ein-words: Ihr Land, Ihre Sprache, in Ihrer Sprache.</w:t>
+      </w:r>
+    </w:p>
+    <w:p>
+      <w:pPr>
+        <w:spacing w:before="40" w:after="60"/>
+        <w:ind w:left="576"/>
+      </w:pPr>
+      <w:r>
+        <w:rPr>
+          <w:i/>
+          <w:color w:val="30608C"/>
+          <w:sz w:val="21"/>
+        </w:rPr>
+        <w:t xml:space="preserve">› </w:t>
+      </w:r>
+      <w:r>
+        <w:rPr>
+          <w:i/>
+          <w:color w:val="30608C"/>
+          <w:sz w:val="21"/>
+        </w:rPr>
+        <w:t>Ihre Sprache ist schön.</w:t>
+      </w:r>
+      <w:r>
+        <w:rPr>
+          <w:i/>
+          <w:color w:val="404040"/>
+          <w:sz w:val="21"/>
+        </w:rPr>
+        <w:t xml:space="preserve"> (Your language is beautiful. [formal; nominative])</w:t>
+      </w:r>
+    </w:p>
+    <w:p>
+      <w:pPr>
+        <w:spacing w:before="0" w:after="60"/>
+        <w:ind w:left="576"/>
+      </w:pPr>
+      <w:r>
+        <w:rPr>
+          <w:i/>
+          <w:color w:val="30608C"/>
+          <w:sz w:val="21"/>
+        </w:rPr>
+        <w:t xml:space="preserve">› </w:t>
+      </w:r>
+      <w:r>
+        <w:rPr>
+          <w:i/>
+          <w:color w:val="30608C"/>
+          <w:sz w:val="21"/>
+        </w:rPr>
+        <w:t>Ich lerne Ihre Sprache.</w:t>
+      </w:r>
+      <w:r>
+        <w:rPr>
+          <w:i/>
+          <w:color w:val="404040"/>
+          <w:sz w:val="21"/>
+        </w:rPr>
+        <w:t xml:space="preserve"> (I am learning your language. [formal; accusative])</w:t>
+      </w:r>
+    </w:p>
+    <w:p>
+      <w:pPr>
+        <w:spacing w:before="0" w:after="120"/>
+        <w:ind w:left="576"/>
+      </w:pPr>
+      <w:r>
+        <w:rPr>
+          <w:i/>
+          <w:color w:val="30608C"/>
+          <w:sz w:val="21"/>
+        </w:rPr>
+        <w:t xml:space="preserve">› </w:t>
+      </w:r>
+      <w:r>
+        <w:rPr>
+          <w:i/>
+          <w:color w:val="30608C"/>
+          <w:sz w:val="21"/>
+        </w:rPr>
+        <w:t>Ich spreche in Ihrer Sprache.</w:t>
+      </w:r>
+      <w:r>
+        <w:rPr>
+          <w:i/>
+          <w:color w:val="404040"/>
+          <w:sz w:val="21"/>
+        </w:rPr>
+        <w:t xml:space="preserve"> (I speak in your language. [formal; dative])</w:t>
+      </w:r>
+    </w:p>
+    <w:p>
+      <w:pPr>
+        <w:spacing w:before="0" w:after="0"/>
+      </w:pPr>
+    </w:p>
+    <w:p>
+      <w:pPr>
+        <w:spacing w:after="120"/>
+      </w:pPr>
+      <w:r>
+        <w:rPr>
+          <w:b/>
+        </w:rPr>
+        <w:t>fliegen</w:t>
+      </w:r>
+      <w:r>
+        <w:t xml:space="preserve"> /ˈfliːɡən/</w:t>
+      </w:r>
+    </w:p>
+    <w:p>
+      <w:pPr>
+        <w:spacing w:after="80"/>
+        <w:ind w:left="576"/>
+      </w:pPr>
+      <w:r>
+        <w:t>To fly; travel by plane (+ nach … / zu …).</w:t>
+      </w:r>
+    </w:p>
+    <w:p>
+      <w:pPr>
+        <w:spacing w:before="40" w:after="60"/>
+        <w:ind w:left="576"/>
+      </w:pPr>
+      <w:r>
+        <w:rPr>
+          <w:i/>
+          <w:color w:val="30608C"/>
+          <w:sz w:val="21"/>
+        </w:rPr>
+        <w:t xml:space="preserve">› </w:t>
+      </w:r>
+      <w:r>
+        <w:rPr>
+          <w:i/>
+          <w:color w:val="30608C"/>
+          <w:sz w:val="21"/>
+        </w:rPr>
+        <w:t>Wir fliegen nach Deutschland.</w:t>
+      </w:r>
+      <w:r>
+        <w:rPr>
+          <w:i/>
+          <w:color w:val="404040"/>
+          <w:sz w:val="21"/>
+        </w:rPr>
+        <w:t xml:space="preserve"> (We're flying to Germany.)</w:t>
+      </w:r>
+    </w:p>
+    <w:p>
+      <w:pPr>
+        <w:spacing w:before="0" w:after="120"/>
+        <w:ind w:left="576"/>
+      </w:pPr>
+      <w:r>
+        <w:rPr>
+          <w:i/>
+          <w:color w:val="30608C"/>
+          <w:sz w:val="21"/>
+        </w:rPr>
+        <w:t xml:space="preserve">› </w:t>
+      </w:r>
+      <w:r>
+        <w:rPr>
+          <w:i/>
+          <w:color w:val="30608C"/>
+          <w:sz w:val="21"/>
+        </w:rPr>
+        <w:t>Das Flugzeug fliegt nach Berlin.</w:t>
+      </w:r>
+      <w:r>
+        <w:rPr>
+          <w:i/>
+          <w:color w:val="404040"/>
+          <w:sz w:val="21"/>
+        </w:rPr>
+        <w:t xml:space="preserve"> (The plane flies to Berlin.)</w:t>
+      </w:r>
+    </w:p>
+    <w:p>
+      <w:pPr>
+        <w:spacing w:before="0" w:after="0"/>
+      </w:pPr>
+    </w:p>
+    <w:p>
+      <w:pPr>
+        <w:spacing w:after="120"/>
+      </w:pPr>
+      <w:r>
+        <w:rPr>
+          <w:b/>
+        </w:rPr>
+        <w:t>reisen</w:t>
+      </w:r>
+      <w:r>
+        <w:t xml:space="preserve"> /ˈʁaɪ̯zn̩/</w:t>
+      </w:r>
+    </w:p>
+    <w:p>
+      <w:pPr>
+        <w:spacing w:after="80"/>
+        <w:ind w:left="576"/>
+      </w:pPr>
+      <w:r>
+        <w:t>To travel; go on a trip (+ nach … without article; + in die … when an article appears).</w:t>
+      </w:r>
+    </w:p>
+    <w:p>
+      <w:pPr>
+        <w:spacing w:before="40" w:after="60"/>
+        <w:ind w:left="576"/>
+      </w:pPr>
+      <w:r>
+        <w:rPr>
+          <w:i/>
+          <w:color w:val="30608C"/>
+          <w:sz w:val="21"/>
+        </w:rPr>
+        <w:t xml:space="preserve">› </w:t>
+      </w:r>
+      <w:r>
+        <w:rPr>
+          <w:i/>
+          <w:color w:val="30608C"/>
+          <w:sz w:val="21"/>
+        </w:rPr>
+        <w:t>Wir reisen nach Deutschland.</w:t>
+      </w:r>
+      <w:r>
+        <w:rPr>
+          <w:i/>
+          <w:color w:val="404040"/>
+          <w:sz w:val="21"/>
+        </w:rPr>
+        <w:t xml:space="preserve"> (We're traveling to Germany.)</w:t>
+      </w:r>
+    </w:p>
+    <w:p>
+      <w:pPr>
+        <w:spacing w:before="0" w:after="120"/>
+        <w:ind w:left="576"/>
+      </w:pPr>
+      <w:r>
+        <w:rPr>
+          <w:i/>
+          <w:color w:val="30608C"/>
+          <w:sz w:val="21"/>
+        </w:rPr>
+        <w:t xml:space="preserve">› </w:t>
+      </w:r>
+      <w:r>
+        <w:rPr>
+          <w:i/>
+          <w:color w:val="30608C"/>
+          <w:sz w:val="21"/>
+        </w:rPr>
+        <w:t>Wir reisen in die Schweiz.</w:t>
+      </w:r>
+      <w:r>
+        <w:rPr>
+          <w:i/>
+          <w:color w:val="404040"/>
+          <w:sz w:val="21"/>
+        </w:rPr>
+        <w:t xml:space="preserve"> (We're traveling to Switzerland. [motion + accusative])</w:t>
+      </w:r>
+    </w:p>
+    <w:p>
+      <w:pPr>
+        <w:spacing w:before="0" w:after="0"/>
+      </w:pPr>
+    </w:p>
+    <w:p>
+      <w:pPr>
+        <w:spacing w:after="120"/>
+      </w:pPr>
+      <w:r>
+        <w:rPr>
+          <w:b/>
+        </w:rPr>
+        <w:t>fahren</w:t>
+      </w:r>
+      <w:r>
+        <w:t xml:space="preserve"> /ˈfaːʁən/</w:t>
+      </w:r>
+    </w:p>
+    <w:p>
+      <w:pPr>
+        <w:spacing w:after="80"/>
+        <w:ind w:left="576"/>
+      </w:pPr>
+      <w:r>
+        <w:t>To drive; ride; go by transport (+ nach … for many destinations).</w:t>
+      </w:r>
+    </w:p>
+    <w:p>
+      <w:pPr>
+        <w:spacing w:after="80"/>
+        <w:ind w:left="576"/>
+      </w:pPr>
+      <w:r>
+        <w:rPr>
+          <w:i/>
+          <w:color w:val="404040"/>
+          <w:sz w:val="20"/>
+        </w:rPr>
+        <w:t>• Strong verb: er fährt; Präteritum fuhr — expect this in texts and exams.</w:t>
+      </w:r>
+    </w:p>
+    <w:p>
+      <w:pPr>
+        <w:spacing w:before="40" w:after="60"/>
+        <w:ind w:left="576"/>
+      </w:pPr>
+      <w:r>
+        <w:rPr>
+          <w:i/>
+          <w:color w:val="30608C"/>
+          <w:sz w:val="21"/>
+        </w:rPr>
+        <w:t xml:space="preserve">› </w:t>
+      </w:r>
+      <w:r>
+        <w:rPr>
+          <w:i/>
+          <w:color w:val="30608C"/>
+          <w:sz w:val="21"/>
+        </w:rPr>
+        <w:t>Wir fahren nach München.</w:t>
+      </w:r>
+      <w:r>
+        <w:rPr>
+          <w:i/>
+          <w:color w:val="404040"/>
+          <w:sz w:val="21"/>
+        </w:rPr>
+        <w:t xml:space="preserve"> (We're going to Munich by car / bus / train.)</w:t>
+      </w:r>
+    </w:p>
+    <w:p>
+      <w:pPr>
+        <w:spacing w:before="0" w:after="120"/>
+        <w:ind w:left="576"/>
+      </w:pPr>
+      <w:r>
+        <w:rPr>
+          <w:i/>
+          <w:color w:val="30608C"/>
+          <w:sz w:val="21"/>
+        </w:rPr>
+        <w:t xml:space="preserve">› </w:t>
+      </w:r>
+      <w:r>
+        <w:rPr>
+          <w:i/>
+          <w:color w:val="30608C"/>
+          <w:sz w:val="21"/>
+        </w:rPr>
+        <w:t>Wohin fahren Sie?</w:t>
+      </w:r>
+      <w:r>
+        <w:rPr>
+          <w:i/>
+          <w:color w:val="404040"/>
+          <w:sz w:val="21"/>
+        </w:rPr>
+        <w:t xml:space="preserve"> (Where are you going? [formal, destination ask])</w:t>
+      </w:r>
+    </w:p>
+    <w:p>
+      <w:pPr>
+        <w:spacing w:before="0" w:after="0"/>
+      </w:pPr>
+    </w:p>
+    <w:p>
+      <w:pPr>
+        <w:spacing w:after="120"/>
+      </w:pPr>
+      <w:r>
+        <w:rPr>
+          <w:b/>
+        </w:rPr>
+        <w:t>gehen</w:t>
+      </w:r>
+      <w:r>
+        <w:t xml:space="preserve"> /ˈɡeːən/</w:t>
+      </w:r>
+    </w:p>
+    <w:p>
+      <w:pPr>
+        <w:spacing w:after="80"/>
+        <w:ind w:left="576"/>
+      </w:pPr>
+      <w:r>
+        <w:t>To go; walk (+ zu / nach / + place; also set phrases).</w:t>
+      </w:r>
+    </w:p>
+    <w:p>
+      <w:pPr>
+        <w:spacing w:after="80"/>
+        <w:ind w:left="576"/>
+      </w:pPr>
+      <w:r>
+        <w:rPr>
+          <w:i/>
+          <w:color w:val="404040"/>
+          <w:sz w:val="20"/>
+        </w:rPr>
+        <w:t>• Irregular present: ich gehe, du gehst, er geht; for whole countries people often prefer fahren/reisen/fliegen.</w:t>
+      </w:r>
+    </w:p>
+    <w:p>
+      <w:pPr>
+        <w:spacing w:before="40" w:after="60"/>
+        <w:ind w:left="576"/>
+      </w:pPr>
+      <w:r>
+        <w:rPr>
+          <w:i/>
+          <w:color w:val="30608C"/>
+          <w:sz w:val="21"/>
+        </w:rPr>
+        <w:t xml:space="preserve">› </w:t>
+      </w:r>
+      <w:r>
+        <w:rPr>
+          <w:i/>
+          <w:color w:val="30608C"/>
+          <w:sz w:val="21"/>
+        </w:rPr>
+        <w:t>Wir gehen nach Hause.</w:t>
+      </w:r>
+      <w:r>
+        <w:rPr>
+          <w:i/>
+          <w:color w:val="404040"/>
+          <w:sz w:val="21"/>
+        </w:rPr>
+        <w:t xml:space="preserve"> (We're going home.)</w:t>
+      </w:r>
+    </w:p>
+    <w:p>
+      <w:pPr>
+        <w:spacing w:before="0" w:after="120"/>
+        <w:ind w:left="576"/>
+      </w:pPr>
+      <w:r>
+        <w:rPr>
+          <w:i/>
+          <w:color w:val="30608C"/>
+          <w:sz w:val="21"/>
+        </w:rPr>
+        <w:t xml:space="preserve">› </w:t>
+      </w:r>
+      <w:r>
+        <w:rPr>
+          <w:i/>
+          <w:color w:val="30608C"/>
+          <w:sz w:val="21"/>
+        </w:rPr>
+        <w:t>Wohin gehen Sie?</w:t>
+      </w:r>
+      <w:r>
+        <w:rPr>
+          <w:i/>
+          <w:color w:val="404040"/>
+          <w:sz w:val="21"/>
+        </w:rPr>
+        <w:t xml:space="preserve"> (Where are you going? [formal])</w:t>
+      </w:r>
+    </w:p>
+    <w:p>
+      <w:pPr>
+        <w:spacing w:before="0" w:after="0"/>
+      </w:pPr>
+    </w:p>
+    <w:p>
+      <w:pPr>
+        <w:spacing w:after="120"/>
+      </w:pPr>
+      <w:r>
+        <w:rPr>
+          <w:b/>
+        </w:rPr>
+        <w:t>aber</w:t>
+      </w:r>
+      <w:r>
+        <w:t xml:space="preserve"> /ˈaːbɐ/</w:t>
+      </w:r>
+    </w:p>
+    <w:p>
+      <w:pPr>
+        <w:spacing w:after="80"/>
+        <w:ind w:left="576"/>
+      </w:pPr>
+      <w:r>
+        <w:t>but; however — introduces a contrast or exception</w:t>
+      </w:r>
+    </w:p>
+    <w:p>
+      <w:pPr>
+        <w:spacing w:after="80"/>
+        <w:ind w:left="576"/>
+      </w:pPr>
+      <w:r>
+        <w:rPr>
+          <w:i/>
+          <w:color w:val="404040"/>
+          <w:sz w:val="20"/>
+        </w:rPr>
+        <w:t>• Coordinating conjunction: word order in the following clause is unchanged (verb stays in position 2).</w:t>
+      </w:r>
+    </w:p>
+    <w:p>
+      <w:pPr>
+        <w:spacing w:before="40" w:after="60"/>
+        <w:ind w:left="576"/>
+      </w:pPr>
+      <w:r>
+        <w:rPr>
+          <w:i/>
+          <w:color w:val="30608C"/>
+          <w:sz w:val="21"/>
+        </w:rPr>
+        <w:t xml:space="preserve">› </w:t>
+      </w:r>
+      <w:r>
+        <w:rPr>
+          <w:i/>
+          <w:color w:val="30608C"/>
+          <w:sz w:val="21"/>
+        </w:rPr>
+        <w:t>Ich komme aus Deutschland, aber er kommt aus der Schweiz.</w:t>
+      </w:r>
+      <w:r>
+        <w:rPr>
+          <w:i/>
+          <w:color w:val="404040"/>
+          <w:sz w:val="21"/>
+        </w:rPr>
+        <w:t xml:space="preserve"> (I come from Germany, but he comes from Switzerland.)</w:t>
+      </w:r>
+    </w:p>
+    <w:p>
+      <w:pPr>
+        <w:spacing w:before="0" w:after="120"/>
+        <w:ind w:left="576"/>
+      </w:pPr>
+      <w:r>
+        <w:rPr>
+          <w:i/>
+          <w:color w:val="30608C"/>
+          <w:sz w:val="21"/>
+        </w:rPr>
+        <w:t xml:space="preserve">› </w:t>
+      </w:r>
+      <w:r>
+        <w:rPr>
+          <w:i/>
+          <w:color w:val="30608C"/>
+          <w:sz w:val="21"/>
+        </w:rPr>
+        <w:t>Die meisten Länder haben keinen Artikel — aber die Schweiz, die Türkei und die Niederlande schon.</w:t>
+      </w:r>
+      <w:r>
+        <w:rPr>
+          <w:i/>
+          <w:color w:val="404040"/>
+          <w:sz w:val="21"/>
+        </w:rPr>
+        <w:t xml:space="preserve"> (Most countries have no article — but Switzerland, Turkey, and the Netherlands do.)</w:t>
       </w:r>
     </w:p>
     <w:p>

</xml_diff>

<commit_message>
Add new vocabulary entry for "in" in vocab.docx and vocab.manifest.json
- Introduced a detailed entry for "in," including gloss, notes, and examples in both German and English.
- The entry is categorized under lesson 1 and level A1 for language learners, highlighting its usage in different contexts and grammatical cases.
</commit_message>
<xml_diff>
--- a/vocab.docx
+++ b/vocab.docx
@@ -22,10 +22,10 @@
         <w:rPr>
           <w:b/>
         </w:rPr>
-        <w:t>auch</w:t>
-      </w:r>
-      <w:r>
-        <w:t xml:space="preserve"> /aʊ̯x/</w:t>
+        <w:t>in</w:t>
+      </w:r>
+      <w:r>
+        <w:t xml:space="preserve"> /ɪn/</w:t>
       </w:r>
     </w:p>
     <w:p>
@@ -34,7 +34,7 @@
         <w:ind w:left="576"/>
       </w:pPr>
       <w:r>
-        <w:t>Also; too; as well.</w:t>
+        <w:t>In; inside; on a team (+ dative for location).</w:t>
       </w:r>
     </w:p>
     <w:p>
@@ -48,7 +48,7 @@
           <w:color w:val="404040"/>
           <w:sz w:val="20"/>
         </w:rPr>
-        <w:t>• Often comes near what it adds: Ich auch = me too; auch ich = I too / even I.</w:t>
+        <w:t>• Wo? uses dative: in einem Team. Wohin? uses accusative: in ein Team.</w:t>
       </w:r>
     </w:p>
     <w:p>
@@ -70,7 +70,7 @@
           <w:color w:val="30608C"/>
           <w:sz w:val="21"/>
         </w:rPr>
-        <w:t>Ich auch.</w:t>
+        <w:t>Ihr seid in einem Team.</w:t>
       </w:r>
       <w:r>
         <w:rPr>
@@ -78,7 +78,7 @@
           <w:color w:val="404040"/>
           <w:sz w:val="21"/>
         </w:rPr>
-        <w:t xml:space="preserve"> (Me too.)</w:t>
+        <w:t xml:space="preserve"> (You all are on a team.)</w:t>
       </w:r>
     </w:p>
     <w:p>
@@ -100,7 +100,7 @@
           <w:color w:val="30608C"/>
           <w:sz w:val="21"/>
         </w:rPr>
-        <w:t>Mir geht’s auch gut.</w:t>
+        <w:t>Ich bin in Berlin.</w:t>
       </w:r>
       <w:r>
         <w:rPr>
@@ -108,7 +108,7 @@
           <w:color w:val="404040"/>
           <w:sz w:val="21"/>
         </w:rPr>
-        <w:t xml:space="preserve"> (I’m also doing well.)</w:t>
+        <w:t xml:space="preserve"> (I am in Berlin.)</w:t>
       </w:r>
     </w:p>
     <w:p>
@@ -130,7 +130,7 @@
           <w:color w:val="30608C"/>
           <w:sz w:val="21"/>
         </w:rPr>
-        <w:t>Er kommt auch aus Berlin.</w:t>
+        <w:t>Ihr kommt in ein Team.</w:t>
       </w:r>
       <w:r>
         <w:rPr>
@@ -138,7 +138,7 @@
           <w:color w:val="404040"/>
           <w:sz w:val="21"/>
         </w:rPr>
-        <w:t xml:space="preserve"> (He also comes from Berlin.)</w:t>
+        <w:t xml:space="preserve"> (You all are joining / going into a team. [accusative: direction])</w:t>
       </w:r>
     </w:p>
     <w:p>
@@ -154,10 +154,10 @@
         <w:rPr>
           <w:b/>
         </w:rPr>
-        <w:t>Wie geht’s?</w:t>
-      </w:r>
-      <w:r>
-        <w:t xml:space="preserve"> /viː ɡeːts/</w:t>
+        <w:t>auch</w:t>
+      </w:r>
+      <w:r>
+        <w:t xml:space="preserve"> /aʊ̯x/</w:t>
       </w:r>
     </w:p>
     <w:p>
@@ -166,7 +166,7 @@
         <w:ind w:left="576"/>
       </w:pPr>
       <w:r>
-        <w:t>How’s it going? / How are you?</w:t>
+        <w:t>Also; too; as well.</w:t>
       </w:r>
     </w:p>
     <w:p>
@@ -180,7 +180,116 @@
           <w:color w:val="404040"/>
           <w:sz w:val="20"/>
         </w:rPr>
-        <w:t>• Short for: Wie geht es? Full informal form: Wie geht es dir?</w:t>
+        <w:t>• Often comes near what it adds: Ich auch = me too; auch ich = I too / even I.</w:t>
+      </w:r>
+    </w:p>
+    <w:p>
+      <w:pPr>
+        <w:spacing w:before="40" w:after="60"/>
+        <w:ind w:left="576"/>
+      </w:pPr>
+      <w:r>
+        <w:rPr>
+          <w:i/>
+          <w:color w:val="30608C"/>
+          <w:sz w:val="21"/>
+        </w:rPr>
+        <w:t xml:space="preserve">› </w:t>
+      </w:r>
+      <w:r>
+        <w:rPr>
+          <w:i/>
+          <w:color w:val="30608C"/>
+          <w:sz w:val="21"/>
+        </w:rPr>
+        <w:t>Ich auch.</w:t>
+      </w:r>
+      <w:r>
+        <w:rPr>
+          <w:i/>
+          <w:color w:val="404040"/>
+          <w:sz w:val="21"/>
+        </w:rPr>
+        <w:t xml:space="preserve"> (Me too.)</w:t>
+      </w:r>
+    </w:p>
+    <w:p>
+      <w:pPr>
+        <w:spacing w:before="0" w:after="60"/>
+        <w:ind w:left="576"/>
+      </w:pPr>
+      <w:r>
+        <w:rPr>
+          <w:i/>
+          <w:color w:val="30608C"/>
+          <w:sz w:val="21"/>
+        </w:rPr>
+        <w:t xml:space="preserve">› </w:t>
+      </w:r>
+      <w:r>
+        <w:rPr>
+          <w:i/>
+          <w:color w:val="30608C"/>
+          <w:sz w:val="21"/>
+        </w:rPr>
+        <w:t>Mir geht’s auch gut.</w:t>
+      </w:r>
+      <w:r>
+        <w:rPr>
+          <w:i/>
+          <w:color w:val="404040"/>
+          <w:sz w:val="21"/>
+        </w:rPr>
+        <w:t xml:space="preserve"> (I’m also doing well.)</w:t>
+      </w:r>
+    </w:p>
+    <w:p>
+      <w:pPr>
+        <w:spacing w:before="0" w:after="120"/>
+        <w:ind w:left="576"/>
+      </w:pPr>
+      <w:r>
+        <w:rPr>
+          <w:i/>
+          <w:color w:val="30608C"/>
+          <w:sz w:val="21"/>
+        </w:rPr>
+        <w:t xml:space="preserve">› </w:t>
+      </w:r>
+      <w:r>
+        <w:rPr>
+          <w:i/>
+          <w:color w:val="30608C"/>
+          <w:sz w:val="21"/>
+        </w:rPr>
+        <w:t>Er kommt auch aus Berlin.</w:t>
+      </w:r>
+      <w:r>
+        <w:rPr>
+          <w:i/>
+          <w:color w:val="404040"/>
+          <w:sz w:val="21"/>
+        </w:rPr>
+        <w:t xml:space="preserve"> (He also comes from Berlin.)</w:t>
+      </w:r>
+    </w:p>
+    <w:p>
+      <w:pPr>
+        <w:spacing w:before="0" w:after="0"/>
+      </w:pPr>
+    </w:p>
+    <w:p>
+      <w:pPr>
+        <w:spacing w:after="120"/>
+      </w:pPr>
+      <w:r>
+        <w:rPr>
+          <w:b/>
+        </w:rPr>
+        <w:t>Wie geht’s?</w:t>
+      </w:r>
+      <w:r>
+        <w:t xml:space="preserve"> /viː ɡeːts/</w:t>
       </w:r>
     </w:p>
     <w:p>
@@ -189,12 +298,21 @@
         <w:ind w:left="576"/>
       </w:pPr>
       <w:r>
+        <w:t>How’s it going? / How are you?</w:t>
+      </w:r>
+    </w:p>
+    <w:p>
+      <w:pPr>
+        <w:spacing w:after="80"/>
+        <w:ind w:left="576"/>
+      </w:pPr>
+      <w:r>
         <w:rPr>
           <w:i/>
           <w:color w:val="404040"/>
           <w:sz w:val="20"/>
         </w:rPr>
-        <w:t>• Common response: Und dir? (= Und wie geht es dir?)</w:t>
+        <w:t>• Short for: Wie geht es? Full informal form: Wie geht es dir?</w:t>
       </w:r>
     </w:p>
     <w:p>
@@ -208,7 +326,7 @@
           <w:color w:val="404040"/>
           <w:sz w:val="20"/>
         </w:rPr>
-        <w:t>• Another common response: Mir geht’s gut. (= I’m doing well.)</w:t>
+        <w:t>• Common response: Und dir? (= Und wie geht es dir?)</w:t>
       </w:r>
     </w:p>
     <w:p>
@@ -222,6 +340,20 @@
           <w:color w:val="404040"/>
           <w:sz w:val="20"/>
         </w:rPr>
+        <w:t>• Another common response: Mir geht’s gut. (= I’m doing well.)</w:t>
+      </w:r>
+    </w:p>
+    <w:p>
+      <w:pPr>
+        <w:spacing w:after="80"/>
+        <w:ind w:left="576"/>
+      </w:pPr>
+      <w:r>
+        <w:rPr>
+          <w:i/>
+          <w:color w:val="404040"/>
+          <w:sz w:val="20"/>
+        </w:rPr>
         <w:t>• Formally: Wie geht es Ihnen?</w:t>
       </w:r>
     </w:p>
@@ -7163,6 +7295,36 @@
     </w:p>
     <w:p>
       <w:pPr>
+        <w:spacing w:before="0" w:after="60"/>
+        <w:ind w:left="576"/>
+      </w:pPr>
+      <w:r>
+        <w:rPr>
+          <w:i/>
+          <w:color w:val="30608C"/>
+          <w:sz w:val="21"/>
+        </w:rPr>
+        <w:t xml:space="preserve">› </w:t>
+      </w:r>
+      <w:r>
+        <w:rPr>
+          <w:i/>
+          <w:color w:val="30608C"/>
+          <w:sz w:val="21"/>
+        </w:rPr>
+        <w:t>Wir sind müde.</w:t>
+      </w:r>
+      <w:r>
+        <w:rPr>
+          <w:i/>
+          <w:color w:val="404040"/>
+          <w:sz w:val="21"/>
+        </w:rPr>
+        <w:t xml:space="preserve"> (We're tired.)</w:t>
+      </w:r>
+    </w:p>
+    <w:p>
+      <w:pPr>
         <w:spacing w:before="0" w:after="120"/>
         <w:ind w:left="576"/>
       </w:pPr>
@@ -7180,7 +7342,7 @@
           <w:color w:val="30608C"/>
           <w:sz w:val="21"/>
         </w:rPr>
-        <w:t>Wir sind müde.</w:t>
+        <w:t>Ihr seid in einem Team.</w:t>
       </w:r>
       <w:r>
         <w:rPr>
@@ -7188,7 +7350,7 @@
           <w:color w:val="404040"/>
           <w:sz w:val="21"/>
         </w:rPr>
-        <w:t xml:space="preserve"> (We're tired.)</w:t>
+        <w:t xml:space="preserve"> (You all are on a team.)</w:t>
       </w:r>
     </w:p>
     <w:p>

</xml_diff>

<commit_message>
Add new vocabulary entry for "der neue Praktikant" in vocab.docx and vocab.manifest.json
- Introduced a detailed entry for "der neue Praktikant," including gloss, notes, and examples in both German and English.
- The entry features a grammar table illustrating adjective endings and is categorized under lesson 1 and level A1 for language learners, emphasizing its grammatical usage in different cases.
</commit_message>
<xml_diff>
--- a/vocab.docx
+++ b/vocab.docx
@@ -13,6 +13,1069 @@
         </w:rPr>
         <w:t>daf — vocabulary</w:t>
       </w:r>
+    </w:p>
+    <w:p>
+      <w:pPr>
+        <w:spacing w:after="120"/>
+      </w:pPr>
+      <w:r>
+        <w:rPr>
+          <w:b/>
+        </w:rPr>
+        <w:t>der neue Praktikant</w:t>
+      </w:r>
+      <w:r>
+        <w:t xml:space="preserve"> /deːɐ̯ ˈnɔʏə pʁaktiˈkant/</w:t>
+      </w:r>
+    </w:p>
+    <w:p>
+      <w:pPr>
+        <w:spacing w:after="80"/>
+        <w:ind w:left="576"/>
+      </w:pPr>
+      <w:r>
+        <w:t>The new intern; pattern for adjective endings after der.</w:t>
+      </w:r>
+    </w:p>
+    <w:p>
+      <w:pPr>
+        <w:spacing w:after="80"/>
+        <w:ind w:left="576"/>
+      </w:pPr>
+      <w:r>
+        <w:rPr>
+          <w:i/>
+          <w:color w:val="404040"/>
+          <w:sz w:val="20"/>
+        </w:rPr>
+        <w:t>• neu becomes neue because it stands before a masculine nominative noun with der.</w:t>
+      </w:r>
+    </w:p>
+    <w:p>
+      <w:pPr>
+        <w:spacing w:after="80"/>
+        <w:ind w:left="576"/>
+      </w:pPr>
+      <w:r>
+        <w:rPr>
+          <w:i/>
+          <w:color w:val="404040"/>
+          <w:sz w:val="20"/>
+        </w:rPr>
+        <w:t>• After der/die/das, use -e in nominative singular; use -en in most other definite-article forms.</w:t>
+      </w:r>
+    </w:p>
+    <w:tbl>
+      <w:tblPr>
+        <w:tblStyle w:val="TableGrid"/>
+        <w:tblW w:type="auto" w:w="0"/>
+        <w:tblLook w:firstColumn="1" w:firstRow="1" w:lastColumn="0" w:lastRow="0" w:noHBand="0" w:noVBand="1" w:val="04A0"/>
+        <w:tblInd w:w="576" w:type="dxa"/>
+      </w:tblPr>
+      <w:tblGrid>
+        <w:gridCol w:w="1728"/>
+        <w:gridCol w:w="1728"/>
+        <w:gridCol w:w="1728"/>
+        <w:gridCol w:w="1728"/>
+        <w:gridCol w:w="1728"/>
+      </w:tblGrid>
+      <w:tr>
+        <w:tc>
+          <w:tcPr>
+            <w:tcW w:w="680" w:type="dxa"/>
+            <w:shd w:val="clear" w:color="auto" w:fill="EFF6FC"/>
+          </w:tcPr>
+          <w:p>
+            <w:pPr>
+              <w:spacing w:after="40"/>
+            </w:pPr>
+            <w:r/>
+            <w:r>
+              <w:rPr>
+                <w:rFonts w:ascii="Calibri" w:hAnsi="Calibri"/>
+                <w:b/>
+                <w:color w:val="333333"/>
+                <w:sz w:val="20"/>
+              </w:rPr>
+            </w:r>
+          </w:p>
+        </w:tc>
+        <w:tc>
+          <w:tcPr>
+            <w:tcW w:type="dxa" w:w="1728"/>
+            <w:shd w:val="clear" w:color="auto" w:fill="EFF6FC"/>
+          </w:tcPr>
+          <w:p>
+            <w:pPr>
+              <w:spacing w:after="40"/>
+            </w:pPr>
+            <w:r/>
+            <w:r>
+              <w:rPr>
+                <w:rFonts w:ascii="Calibri" w:hAnsi="Calibri"/>
+                <w:b/>
+                <w:color w:val="333333"/>
+                <w:sz w:val="20"/>
+              </w:rPr>
+              <w:t>m.</w:t>
+            </w:r>
+          </w:p>
+        </w:tc>
+        <w:tc>
+          <w:tcPr>
+            <w:tcW w:type="dxa" w:w="1728"/>
+            <w:shd w:val="clear" w:color="auto" w:fill="EFF6FC"/>
+          </w:tcPr>
+          <w:p>
+            <w:pPr>
+              <w:spacing w:after="40"/>
+            </w:pPr>
+            <w:r/>
+            <w:r>
+              <w:rPr>
+                <w:rFonts w:ascii="Calibri" w:hAnsi="Calibri"/>
+                <w:b/>
+                <w:color w:val="333333"/>
+                <w:sz w:val="20"/>
+              </w:rPr>
+              <w:t>f.</w:t>
+            </w:r>
+          </w:p>
+        </w:tc>
+        <w:tc>
+          <w:tcPr>
+            <w:tcW w:type="dxa" w:w="1728"/>
+            <w:shd w:val="clear" w:color="auto" w:fill="EFF6FC"/>
+          </w:tcPr>
+          <w:p>
+            <w:pPr>
+              <w:spacing w:after="40"/>
+            </w:pPr>
+            <w:r/>
+            <w:r>
+              <w:rPr>
+                <w:rFonts w:ascii="Calibri" w:hAnsi="Calibri"/>
+                <w:b/>
+                <w:color w:val="333333"/>
+                <w:sz w:val="20"/>
+              </w:rPr>
+              <w:t>n.</w:t>
+            </w:r>
+          </w:p>
+        </w:tc>
+        <w:tc>
+          <w:tcPr>
+            <w:tcW w:type="dxa" w:w="1728"/>
+            <w:shd w:val="clear" w:color="auto" w:fill="EFF6FC"/>
+          </w:tcPr>
+          <w:p>
+            <w:pPr>
+              <w:spacing w:after="40"/>
+            </w:pPr>
+            <w:r/>
+            <w:r>
+              <w:rPr>
+                <w:rFonts w:ascii="Calibri" w:hAnsi="Calibri"/>
+                <w:b/>
+                <w:color w:val="333333"/>
+                <w:sz w:val="20"/>
+              </w:rPr>
+              <w:t>pl.</w:t>
+            </w:r>
+          </w:p>
+        </w:tc>
+      </w:tr>
+      <w:tr>
+        <w:tc>
+          <w:tcPr>
+            <w:tcW w:w="680" w:type="dxa"/>
+          </w:tcPr>
+          <w:p>
+            <w:pPr>
+              <w:spacing w:after="40"/>
+            </w:pPr>
+            <w:r/>
+            <w:r>
+              <w:rPr>
+                <w:rFonts w:ascii="Calibri" w:hAnsi="Calibri"/>
+                <w:color w:val="404040"/>
+                <w:sz w:val="19"/>
+              </w:rPr>
+              <w:t>Nom</w:t>
+            </w:r>
+          </w:p>
+        </w:tc>
+        <w:tc>
+          <w:tcPr>
+            <w:tcW w:type="dxa" w:w="1728"/>
+          </w:tcPr>
+          <w:p>
+            <w:pPr>
+              <w:spacing w:after="40"/>
+            </w:pPr>
+            <w:r/>
+            <w:r>
+              <w:rPr>
+                <w:rFonts w:ascii="Calibri" w:hAnsi="Calibri"/>
+                <w:color w:val="404040"/>
+                <w:sz w:val="19"/>
+              </w:rPr>
+              <w:t xml:space="preserve">der </w:t>
+            </w:r>
+            <w:r>
+              <w:rPr>
+                <w:rFonts w:ascii="Calibri" w:hAnsi="Calibri"/>
+                <w:color w:val="404040"/>
+                <w:sz w:val="19"/>
+              </w:rPr>
+              <w:t>neu</w:t>
+            </w:r>
+            <w:r>
+              <w:rPr>
+                <w:rFonts w:ascii="Calibri" w:hAnsi="Calibri"/>
+                <w:b/>
+                <w:color w:val="1F4F8C"/>
+                <w:sz w:val="19"/>
+              </w:rPr>
+              <w:t>e</w:t>
+            </w:r>
+            <w:r>
+              <w:rPr>
+                <w:rFonts w:ascii="Calibri" w:hAnsi="Calibri"/>
+                <w:color w:val="404040"/>
+                <w:sz w:val="19"/>
+              </w:rPr>
+              <w:t xml:space="preserve"> Praktikant</w:t>
+            </w:r>
+          </w:p>
+        </w:tc>
+        <w:tc>
+          <w:tcPr>
+            <w:tcW w:type="dxa" w:w="1728"/>
+          </w:tcPr>
+          <w:p>
+            <w:pPr>
+              <w:spacing w:after="40"/>
+            </w:pPr>
+            <w:r/>
+            <w:r>
+              <w:rPr>
+                <w:rFonts w:ascii="Calibri" w:hAnsi="Calibri"/>
+                <w:color w:val="404040"/>
+                <w:sz w:val="19"/>
+              </w:rPr>
+              <w:t xml:space="preserve">die </w:t>
+            </w:r>
+            <w:r>
+              <w:rPr>
+                <w:rFonts w:ascii="Calibri" w:hAnsi="Calibri"/>
+                <w:color w:val="404040"/>
+                <w:sz w:val="19"/>
+              </w:rPr>
+              <w:t>neu</w:t>
+            </w:r>
+            <w:r>
+              <w:rPr>
+                <w:rFonts w:ascii="Calibri" w:hAnsi="Calibri"/>
+                <w:b/>
+                <w:color w:val="1F4F8C"/>
+                <w:sz w:val="19"/>
+              </w:rPr>
+              <w:t>e</w:t>
+            </w:r>
+            <w:r>
+              <w:rPr>
+                <w:rFonts w:ascii="Calibri" w:hAnsi="Calibri"/>
+                <w:color w:val="404040"/>
+                <w:sz w:val="19"/>
+              </w:rPr>
+              <w:t xml:space="preserve"> Sekretärin</w:t>
+            </w:r>
+          </w:p>
+        </w:tc>
+        <w:tc>
+          <w:tcPr>
+            <w:tcW w:type="dxa" w:w="1728"/>
+          </w:tcPr>
+          <w:p>
+            <w:pPr>
+              <w:spacing w:after="40"/>
+            </w:pPr>
+            <w:r/>
+            <w:r>
+              <w:rPr>
+                <w:rFonts w:ascii="Calibri" w:hAnsi="Calibri"/>
+                <w:color w:val="404040"/>
+                <w:sz w:val="19"/>
+              </w:rPr>
+              <w:t xml:space="preserve">das </w:t>
+            </w:r>
+            <w:r>
+              <w:rPr>
+                <w:rFonts w:ascii="Calibri" w:hAnsi="Calibri"/>
+                <w:color w:val="404040"/>
+                <w:sz w:val="19"/>
+              </w:rPr>
+              <w:t>neu</w:t>
+            </w:r>
+            <w:r>
+              <w:rPr>
+                <w:rFonts w:ascii="Calibri" w:hAnsi="Calibri"/>
+                <w:b/>
+                <w:color w:val="1F4F8C"/>
+                <w:sz w:val="19"/>
+              </w:rPr>
+              <w:t>e</w:t>
+            </w:r>
+            <w:r>
+              <w:rPr>
+                <w:rFonts w:ascii="Calibri" w:hAnsi="Calibri"/>
+                <w:color w:val="404040"/>
+                <w:sz w:val="19"/>
+              </w:rPr>
+              <w:t xml:space="preserve"> Team</w:t>
+            </w:r>
+          </w:p>
+        </w:tc>
+        <w:tc>
+          <w:tcPr>
+            <w:tcW w:type="dxa" w:w="1728"/>
+            <w:shd w:val="clear" w:color="auto" w:fill="FFF3CD"/>
+          </w:tcPr>
+          <w:p>
+            <w:pPr>
+              <w:spacing w:after="40"/>
+            </w:pPr>
+            <w:r/>
+            <w:r>
+              <w:rPr>
+                <w:rFonts w:ascii="Calibri" w:hAnsi="Calibri"/>
+                <w:color w:val="404040"/>
+                <w:sz w:val="19"/>
+              </w:rPr>
+              <w:t xml:space="preserve">die </w:t>
+            </w:r>
+            <w:r>
+              <w:rPr>
+                <w:rFonts w:ascii="Calibri" w:hAnsi="Calibri"/>
+                <w:color w:val="404040"/>
+                <w:sz w:val="19"/>
+              </w:rPr>
+              <w:t>neu</w:t>
+            </w:r>
+            <w:r>
+              <w:rPr>
+                <w:rFonts w:ascii="Calibri" w:hAnsi="Calibri"/>
+                <w:b/>
+                <w:color w:val="1F4F8C"/>
+                <w:sz w:val="19"/>
+              </w:rPr>
+              <w:t>en</w:t>
+            </w:r>
+            <w:r>
+              <w:rPr>
+                <w:rFonts w:ascii="Calibri" w:hAnsi="Calibri"/>
+                <w:color w:val="404040"/>
+                <w:sz w:val="19"/>
+              </w:rPr>
+              <w:t xml:space="preserve"> Praktikanten</w:t>
+            </w:r>
+          </w:p>
+        </w:tc>
+      </w:tr>
+      <w:tr>
+        <w:tc>
+          <w:tcPr>
+            <w:tcW w:w="680" w:type="dxa"/>
+          </w:tcPr>
+          <w:p>
+            <w:pPr>
+              <w:spacing w:after="40"/>
+            </w:pPr>
+            <w:r/>
+            <w:r>
+              <w:rPr>
+                <w:rFonts w:ascii="Calibri" w:hAnsi="Calibri"/>
+                <w:color w:val="404040"/>
+                <w:sz w:val="19"/>
+              </w:rPr>
+              <w:t>Akk</w:t>
+            </w:r>
+          </w:p>
+        </w:tc>
+        <w:tc>
+          <w:tcPr>
+            <w:tcW w:type="dxa" w:w="1728"/>
+          </w:tcPr>
+          <w:p>
+            <w:pPr>
+              <w:spacing w:after="40"/>
+            </w:pPr>
+            <w:r/>
+            <w:r>
+              <w:rPr>
+                <w:rFonts w:ascii="Calibri" w:hAnsi="Calibri"/>
+                <w:color w:val="404040"/>
+                <w:sz w:val="19"/>
+              </w:rPr>
+              <w:t xml:space="preserve">den </w:t>
+            </w:r>
+            <w:r>
+              <w:rPr>
+                <w:rFonts w:ascii="Calibri" w:hAnsi="Calibri"/>
+                <w:color w:val="404040"/>
+                <w:sz w:val="19"/>
+              </w:rPr>
+              <w:t>neu</w:t>
+            </w:r>
+            <w:r>
+              <w:rPr>
+                <w:rFonts w:ascii="Calibri" w:hAnsi="Calibri"/>
+                <w:b/>
+                <w:color w:val="1F4F8C"/>
+                <w:sz w:val="19"/>
+              </w:rPr>
+              <w:t>en</w:t>
+            </w:r>
+            <w:r>
+              <w:rPr>
+                <w:rFonts w:ascii="Calibri" w:hAnsi="Calibri"/>
+                <w:color w:val="404040"/>
+                <w:sz w:val="19"/>
+              </w:rPr>
+              <w:t xml:space="preserve"> Praktikanten</w:t>
+            </w:r>
+          </w:p>
+        </w:tc>
+        <w:tc>
+          <w:tcPr>
+            <w:tcW w:type="dxa" w:w="1728"/>
+            <w:shd w:val="clear" w:color="auto" w:fill="FFF3CD"/>
+          </w:tcPr>
+          <w:p>
+            <w:pPr>
+              <w:spacing w:after="40"/>
+            </w:pPr>
+            <w:r/>
+            <w:r>
+              <w:rPr>
+                <w:rFonts w:ascii="Calibri" w:hAnsi="Calibri"/>
+                <w:color w:val="404040"/>
+                <w:sz w:val="19"/>
+              </w:rPr>
+              <w:t xml:space="preserve">die </w:t>
+            </w:r>
+            <w:r>
+              <w:rPr>
+                <w:rFonts w:ascii="Calibri" w:hAnsi="Calibri"/>
+                <w:color w:val="404040"/>
+                <w:sz w:val="19"/>
+              </w:rPr>
+              <w:t>neu</w:t>
+            </w:r>
+            <w:r>
+              <w:rPr>
+                <w:rFonts w:ascii="Calibri" w:hAnsi="Calibri"/>
+                <w:b/>
+                <w:color w:val="1F4F8C"/>
+                <w:sz w:val="19"/>
+              </w:rPr>
+              <w:t>e</w:t>
+            </w:r>
+            <w:r>
+              <w:rPr>
+                <w:rFonts w:ascii="Calibri" w:hAnsi="Calibri"/>
+                <w:color w:val="404040"/>
+                <w:sz w:val="19"/>
+              </w:rPr>
+              <w:t xml:space="preserve"> Sekretärin</w:t>
+            </w:r>
+          </w:p>
+        </w:tc>
+        <w:tc>
+          <w:tcPr>
+            <w:tcW w:type="dxa" w:w="1728"/>
+            <w:shd w:val="clear" w:color="auto" w:fill="FFF3CD"/>
+          </w:tcPr>
+          <w:p>
+            <w:pPr>
+              <w:spacing w:after="40"/>
+            </w:pPr>
+            <w:r/>
+            <w:r>
+              <w:rPr>
+                <w:rFonts w:ascii="Calibri" w:hAnsi="Calibri"/>
+                <w:color w:val="404040"/>
+                <w:sz w:val="19"/>
+              </w:rPr>
+              <w:t xml:space="preserve">das </w:t>
+            </w:r>
+            <w:r>
+              <w:rPr>
+                <w:rFonts w:ascii="Calibri" w:hAnsi="Calibri"/>
+                <w:color w:val="404040"/>
+                <w:sz w:val="19"/>
+              </w:rPr>
+              <w:t>neu</w:t>
+            </w:r>
+            <w:r>
+              <w:rPr>
+                <w:rFonts w:ascii="Calibri" w:hAnsi="Calibri"/>
+                <w:b/>
+                <w:color w:val="1F4F8C"/>
+                <w:sz w:val="19"/>
+              </w:rPr>
+              <w:t>e</w:t>
+            </w:r>
+            <w:r>
+              <w:rPr>
+                <w:rFonts w:ascii="Calibri" w:hAnsi="Calibri"/>
+                <w:color w:val="404040"/>
+                <w:sz w:val="19"/>
+              </w:rPr>
+              <w:t xml:space="preserve"> Team</w:t>
+            </w:r>
+          </w:p>
+        </w:tc>
+        <w:tc>
+          <w:tcPr>
+            <w:tcW w:type="dxa" w:w="1728"/>
+          </w:tcPr>
+          <w:p>
+            <w:pPr>
+              <w:spacing w:after="40"/>
+            </w:pPr>
+            <w:r/>
+            <w:r>
+              <w:rPr>
+                <w:rFonts w:ascii="Calibri" w:hAnsi="Calibri"/>
+                <w:color w:val="404040"/>
+                <w:sz w:val="19"/>
+              </w:rPr>
+              <w:t xml:space="preserve">die </w:t>
+            </w:r>
+            <w:r>
+              <w:rPr>
+                <w:rFonts w:ascii="Calibri" w:hAnsi="Calibri"/>
+                <w:color w:val="404040"/>
+                <w:sz w:val="19"/>
+              </w:rPr>
+              <w:t>neu</w:t>
+            </w:r>
+            <w:r>
+              <w:rPr>
+                <w:rFonts w:ascii="Calibri" w:hAnsi="Calibri"/>
+                <w:b/>
+                <w:color w:val="1F4F8C"/>
+                <w:sz w:val="19"/>
+              </w:rPr>
+              <w:t>en</w:t>
+            </w:r>
+            <w:r>
+              <w:rPr>
+                <w:rFonts w:ascii="Calibri" w:hAnsi="Calibri"/>
+                <w:color w:val="404040"/>
+                <w:sz w:val="19"/>
+              </w:rPr>
+              <w:t xml:space="preserve"> Praktikanten</w:t>
+            </w:r>
+          </w:p>
+        </w:tc>
+      </w:tr>
+      <w:tr>
+        <w:tc>
+          <w:tcPr>
+            <w:tcW w:w="680" w:type="dxa"/>
+          </w:tcPr>
+          <w:p>
+            <w:pPr>
+              <w:spacing w:after="40"/>
+            </w:pPr>
+            <w:r/>
+            <w:r>
+              <w:rPr>
+                <w:rFonts w:ascii="Calibri" w:hAnsi="Calibri"/>
+                <w:color w:val="404040"/>
+                <w:sz w:val="19"/>
+              </w:rPr>
+              <w:t>Dat</w:t>
+            </w:r>
+          </w:p>
+        </w:tc>
+        <w:tc>
+          <w:tcPr>
+            <w:tcW w:type="dxa" w:w="1728"/>
+          </w:tcPr>
+          <w:p>
+            <w:pPr>
+              <w:spacing w:after="40"/>
+            </w:pPr>
+            <w:r/>
+            <w:r>
+              <w:rPr>
+                <w:rFonts w:ascii="Calibri" w:hAnsi="Calibri"/>
+                <w:color w:val="404040"/>
+                <w:sz w:val="19"/>
+              </w:rPr>
+              <w:t xml:space="preserve">dem </w:t>
+            </w:r>
+            <w:r>
+              <w:rPr>
+                <w:rFonts w:ascii="Calibri" w:hAnsi="Calibri"/>
+                <w:color w:val="404040"/>
+                <w:sz w:val="19"/>
+              </w:rPr>
+              <w:t>neu</w:t>
+            </w:r>
+            <w:r>
+              <w:rPr>
+                <w:rFonts w:ascii="Calibri" w:hAnsi="Calibri"/>
+                <w:b/>
+                <w:color w:val="1F4F8C"/>
+                <w:sz w:val="19"/>
+              </w:rPr>
+              <w:t>en</w:t>
+            </w:r>
+            <w:r>
+              <w:rPr>
+                <w:rFonts w:ascii="Calibri" w:hAnsi="Calibri"/>
+                <w:color w:val="404040"/>
+                <w:sz w:val="19"/>
+              </w:rPr>
+              <w:t xml:space="preserve"> Praktikanten</w:t>
+            </w:r>
+          </w:p>
+        </w:tc>
+        <w:tc>
+          <w:tcPr>
+            <w:tcW w:type="dxa" w:w="1728"/>
+          </w:tcPr>
+          <w:p>
+            <w:pPr>
+              <w:spacing w:after="40"/>
+            </w:pPr>
+            <w:r/>
+            <w:r>
+              <w:rPr>
+                <w:rFonts w:ascii="Calibri" w:hAnsi="Calibri"/>
+                <w:color w:val="404040"/>
+                <w:sz w:val="19"/>
+              </w:rPr>
+              <w:t xml:space="preserve">der </w:t>
+            </w:r>
+            <w:r>
+              <w:rPr>
+                <w:rFonts w:ascii="Calibri" w:hAnsi="Calibri"/>
+                <w:color w:val="404040"/>
+                <w:sz w:val="19"/>
+              </w:rPr>
+              <w:t>neu</w:t>
+            </w:r>
+            <w:r>
+              <w:rPr>
+                <w:rFonts w:ascii="Calibri" w:hAnsi="Calibri"/>
+                <w:b/>
+                <w:color w:val="1F4F8C"/>
+                <w:sz w:val="19"/>
+              </w:rPr>
+              <w:t>en</w:t>
+            </w:r>
+            <w:r>
+              <w:rPr>
+                <w:rFonts w:ascii="Calibri" w:hAnsi="Calibri"/>
+                <w:color w:val="404040"/>
+                <w:sz w:val="19"/>
+              </w:rPr>
+              <w:t xml:space="preserve"> Sekretärin</w:t>
+            </w:r>
+          </w:p>
+        </w:tc>
+        <w:tc>
+          <w:tcPr>
+            <w:tcW w:type="dxa" w:w="1728"/>
+          </w:tcPr>
+          <w:p>
+            <w:pPr>
+              <w:spacing w:after="40"/>
+            </w:pPr>
+            <w:r/>
+            <w:r>
+              <w:rPr>
+                <w:rFonts w:ascii="Calibri" w:hAnsi="Calibri"/>
+                <w:color w:val="404040"/>
+                <w:sz w:val="19"/>
+              </w:rPr>
+              <w:t xml:space="preserve">dem </w:t>
+            </w:r>
+            <w:r>
+              <w:rPr>
+                <w:rFonts w:ascii="Calibri" w:hAnsi="Calibri"/>
+                <w:color w:val="404040"/>
+                <w:sz w:val="19"/>
+              </w:rPr>
+              <w:t>neu</w:t>
+            </w:r>
+            <w:r>
+              <w:rPr>
+                <w:rFonts w:ascii="Calibri" w:hAnsi="Calibri"/>
+                <w:b/>
+                <w:color w:val="1F4F8C"/>
+                <w:sz w:val="19"/>
+              </w:rPr>
+              <w:t>en</w:t>
+            </w:r>
+            <w:r>
+              <w:rPr>
+                <w:rFonts w:ascii="Calibri" w:hAnsi="Calibri"/>
+                <w:color w:val="404040"/>
+                <w:sz w:val="19"/>
+              </w:rPr>
+              <w:t xml:space="preserve"> Team</w:t>
+            </w:r>
+          </w:p>
+        </w:tc>
+        <w:tc>
+          <w:tcPr>
+            <w:tcW w:type="dxa" w:w="1728"/>
+          </w:tcPr>
+          <w:p>
+            <w:pPr>
+              <w:spacing w:after="40"/>
+            </w:pPr>
+            <w:r/>
+            <w:r>
+              <w:rPr>
+                <w:rFonts w:ascii="Calibri" w:hAnsi="Calibri"/>
+                <w:color w:val="404040"/>
+                <w:sz w:val="19"/>
+              </w:rPr>
+              <w:t xml:space="preserve">den </w:t>
+            </w:r>
+            <w:r>
+              <w:rPr>
+                <w:rFonts w:ascii="Calibri" w:hAnsi="Calibri"/>
+                <w:color w:val="404040"/>
+                <w:sz w:val="19"/>
+              </w:rPr>
+              <w:t>neu</w:t>
+            </w:r>
+            <w:r>
+              <w:rPr>
+                <w:rFonts w:ascii="Calibri" w:hAnsi="Calibri"/>
+                <w:b/>
+                <w:color w:val="1F4F8C"/>
+                <w:sz w:val="19"/>
+              </w:rPr>
+              <w:t>en</w:t>
+            </w:r>
+            <w:r>
+              <w:rPr>
+                <w:rFonts w:ascii="Calibri" w:hAnsi="Calibri"/>
+                <w:color w:val="404040"/>
+                <w:sz w:val="19"/>
+              </w:rPr>
+              <w:t xml:space="preserve"> Praktikanten</w:t>
+            </w:r>
+          </w:p>
+        </w:tc>
+      </w:tr>
+      <w:tr>
+        <w:tc>
+          <w:tcPr>
+            <w:tcW w:w="680" w:type="dxa"/>
+          </w:tcPr>
+          <w:p>
+            <w:pPr>
+              <w:spacing w:after="40"/>
+            </w:pPr>
+            <w:r/>
+            <w:r>
+              <w:rPr>
+                <w:rFonts w:ascii="Calibri" w:hAnsi="Calibri"/>
+                <w:color w:val="404040"/>
+                <w:sz w:val="19"/>
+              </w:rPr>
+              <w:t>Gen</w:t>
+            </w:r>
+          </w:p>
+        </w:tc>
+        <w:tc>
+          <w:tcPr>
+            <w:tcW w:type="dxa" w:w="1728"/>
+          </w:tcPr>
+          <w:p>
+            <w:pPr>
+              <w:spacing w:after="40"/>
+            </w:pPr>
+            <w:r/>
+            <w:r>
+              <w:rPr>
+                <w:rFonts w:ascii="Calibri" w:hAnsi="Calibri"/>
+                <w:color w:val="404040"/>
+                <w:sz w:val="19"/>
+              </w:rPr>
+              <w:t xml:space="preserve">des </w:t>
+            </w:r>
+            <w:r>
+              <w:rPr>
+                <w:rFonts w:ascii="Calibri" w:hAnsi="Calibri"/>
+                <w:color w:val="404040"/>
+                <w:sz w:val="19"/>
+              </w:rPr>
+              <w:t>neu</w:t>
+            </w:r>
+            <w:r>
+              <w:rPr>
+                <w:rFonts w:ascii="Calibri" w:hAnsi="Calibri"/>
+                <w:b/>
+                <w:color w:val="1F4F8C"/>
+                <w:sz w:val="19"/>
+              </w:rPr>
+              <w:t>en</w:t>
+            </w:r>
+            <w:r>
+              <w:rPr>
+                <w:rFonts w:ascii="Calibri" w:hAnsi="Calibri"/>
+                <w:color w:val="404040"/>
+                <w:sz w:val="19"/>
+              </w:rPr>
+              <w:t xml:space="preserve"> Praktikanten</w:t>
+            </w:r>
+          </w:p>
+        </w:tc>
+        <w:tc>
+          <w:tcPr>
+            <w:tcW w:type="dxa" w:w="1728"/>
+          </w:tcPr>
+          <w:p>
+            <w:pPr>
+              <w:spacing w:after="40"/>
+            </w:pPr>
+            <w:r/>
+            <w:r>
+              <w:rPr>
+                <w:rFonts w:ascii="Calibri" w:hAnsi="Calibri"/>
+                <w:color w:val="404040"/>
+                <w:sz w:val="19"/>
+              </w:rPr>
+              <w:t xml:space="preserve">der </w:t>
+            </w:r>
+            <w:r>
+              <w:rPr>
+                <w:rFonts w:ascii="Calibri" w:hAnsi="Calibri"/>
+                <w:color w:val="404040"/>
+                <w:sz w:val="19"/>
+              </w:rPr>
+              <w:t>neu</w:t>
+            </w:r>
+            <w:r>
+              <w:rPr>
+                <w:rFonts w:ascii="Calibri" w:hAnsi="Calibri"/>
+                <w:b/>
+                <w:color w:val="1F4F8C"/>
+                <w:sz w:val="19"/>
+              </w:rPr>
+              <w:t>en</w:t>
+            </w:r>
+            <w:r>
+              <w:rPr>
+                <w:rFonts w:ascii="Calibri" w:hAnsi="Calibri"/>
+                <w:color w:val="404040"/>
+                <w:sz w:val="19"/>
+              </w:rPr>
+              <w:t xml:space="preserve"> Sekretärin</w:t>
+            </w:r>
+          </w:p>
+        </w:tc>
+        <w:tc>
+          <w:tcPr>
+            <w:tcW w:type="dxa" w:w="1728"/>
+          </w:tcPr>
+          <w:p>
+            <w:pPr>
+              <w:spacing w:after="40"/>
+            </w:pPr>
+            <w:r/>
+            <w:r>
+              <w:rPr>
+                <w:rFonts w:ascii="Calibri" w:hAnsi="Calibri"/>
+                <w:color w:val="404040"/>
+                <w:sz w:val="19"/>
+              </w:rPr>
+              <w:t xml:space="preserve">des </w:t>
+            </w:r>
+            <w:r>
+              <w:rPr>
+                <w:rFonts w:ascii="Calibri" w:hAnsi="Calibri"/>
+                <w:color w:val="404040"/>
+                <w:sz w:val="19"/>
+              </w:rPr>
+              <w:t>neu</w:t>
+            </w:r>
+            <w:r>
+              <w:rPr>
+                <w:rFonts w:ascii="Calibri" w:hAnsi="Calibri"/>
+                <w:b/>
+                <w:color w:val="1F4F8C"/>
+                <w:sz w:val="19"/>
+              </w:rPr>
+              <w:t>en</w:t>
+            </w:r>
+            <w:r>
+              <w:rPr>
+                <w:rFonts w:ascii="Calibri" w:hAnsi="Calibri"/>
+                <w:color w:val="404040"/>
+                <w:sz w:val="19"/>
+              </w:rPr>
+              <w:t xml:space="preserve"> Teams</w:t>
+            </w:r>
+          </w:p>
+        </w:tc>
+        <w:tc>
+          <w:tcPr>
+            <w:tcW w:type="dxa" w:w="1728"/>
+          </w:tcPr>
+          <w:p>
+            <w:pPr>
+              <w:spacing w:after="40"/>
+            </w:pPr>
+            <w:r/>
+            <w:r>
+              <w:rPr>
+                <w:rFonts w:ascii="Calibri" w:hAnsi="Calibri"/>
+                <w:color w:val="404040"/>
+                <w:sz w:val="19"/>
+              </w:rPr>
+              <w:t xml:space="preserve">der </w:t>
+            </w:r>
+            <w:r>
+              <w:rPr>
+                <w:rFonts w:ascii="Calibri" w:hAnsi="Calibri"/>
+                <w:color w:val="404040"/>
+                <w:sz w:val="19"/>
+              </w:rPr>
+              <w:t>neu</w:t>
+            </w:r>
+            <w:r>
+              <w:rPr>
+                <w:rFonts w:ascii="Calibri" w:hAnsi="Calibri"/>
+                <w:b/>
+                <w:color w:val="1F4F8C"/>
+                <w:sz w:val="19"/>
+              </w:rPr>
+              <w:t>en</w:t>
+            </w:r>
+            <w:r>
+              <w:rPr>
+                <w:rFonts w:ascii="Calibri" w:hAnsi="Calibri"/>
+                <w:color w:val="404040"/>
+                <w:sz w:val="19"/>
+              </w:rPr>
+              <w:t xml:space="preserve"> Praktikanten</w:t>
+            </w:r>
+          </w:p>
+        </w:tc>
+      </w:tr>
+    </w:tbl>
+    <w:p>
+      <w:pPr>
+        <w:spacing w:before="40" w:after="120"/>
+      </w:pPr>
+    </w:p>
+    <w:p>
+      <w:pPr>
+        <w:spacing w:before="40" w:after="60"/>
+        <w:ind w:left="576"/>
+      </w:pPr>
+      <w:r>
+        <w:rPr>
+          <w:i/>
+          <w:color w:val="30608C"/>
+          <w:sz w:val="21"/>
+        </w:rPr>
+        <w:t xml:space="preserve">› </w:t>
+      </w:r>
+      <w:r>
+        <w:rPr>
+          <w:i/>
+          <w:color w:val="30608C"/>
+          <w:sz w:val="21"/>
+        </w:rPr>
+        <w:t>Das ist der neue Praktikant.</w:t>
+      </w:r>
+      <w:r>
+        <w:rPr>
+          <w:i/>
+          <w:color w:val="404040"/>
+          <w:sz w:val="21"/>
+        </w:rPr>
+        <w:t xml:space="preserve"> (That is the new intern.)</w:t>
+      </w:r>
+    </w:p>
+    <w:p>
+      <w:pPr>
+        <w:spacing w:before="0" w:after="60"/>
+        <w:ind w:left="576"/>
+      </w:pPr>
+      <w:r>
+        <w:rPr>
+          <w:i/>
+          <w:color w:val="30608C"/>
+          <w:sz w:val="21"/>
+        </w:rPr>
+        <w:t xml:space="preserve">› </w:t>
+      </w:r>
+      <w:r>
+        <w:rPr>
+          <w:i/>
+          <w:color w:val="30608C"/>
+          <w:sz w:val="21"/>
+        </w:rPr>
+        <w:t>Der Praktikant ist neu.</w:t>
+      </w:r>
+      <w:r>
+        <w:rPr>
+          <w:i/>
+          <w:color w:val="404040"/>
+          <w:sz w:val="21"/>
+        </w:rPr>
+        <w:t xml:space="preserve"> (The intern is new. [after sein: no adjective ending])</w:t>
+      </w:r>
+    </w:p>
+    <w:p>
+      <w:pPr>
+        <w:spacing w:before="0" w:after="120"/>
+        <w:ind w:left="576"/>
+      </w:pPr>
+      <w:r>
+        <w:rPr>
+          <w:i/>
+          <w:color w:val="30608C"/>
+          <w:sz w:val="21"/>
+        </w:rPr>
+        <w:t xml:space="preserve">› </w:t>
+      </w:r>
+      <w:r>
+        <w:rPr>
+          <w:i/>
+          <w:color w:val="30608C"/>
+          <w:sz w:val="21"/>
+        </w:rPr>
+        <w:t>Ich sehe den neuen Praktikanten.</w:t>
+      </w:r>
+      <w:r>
+        <w:rPr>
+          <w:i/>
+          <w:color w:val="404040"/>
+          <w:sz w:val="21"/>
+        </w:rPr>
+        <w:t xml:space="preserve"> (I see the new intern. [accusative masculine: den neuen])</w:t>
+      </w:r>
+    </w:p>
+    <w:p>
+      <w:pPr>
+        <w:spacing w:before="0" w:after="0"/>
+      </w:pPr>
     </w:p>
     <w:p>
       <w:pPr>

</xml_diff>

<commit_message>
Add new vocabulary entries for "die Argentinierin," "Servus," and "in" in vocab.docx and vocab.manifest.json
- Introduced detailed entries for "die Argentinierin" and "Servus," including glosses, notes, and examples in both German and English.
- Updated the entry for "in" to ensure consistency and clarity, with a focus on its usage in different contexts and grammatical cases.
- All entries are categorized under lesson 1 and level A1 for language learners.
</commit_message>
<xml_diff>
--- a/vocab.docx
+++ b/vocab.docx
@@ -13,6 +13,442 @@
         </w:rPr>
         <w:t>daf — vocabulary</w:t>
       </w:r>
+    </w:p>
+    <w:p>
+      <w:pPr>
+        <w:spacing w:after="120"/>
+      </w:pPr>
+      <w:r>
+        <w:rPr>
+          <w:b/>
+        </w:rPr>
+        <w:t>die Argentinierin</w:t>
+      </w:r>
+      <w:r>
+        <w:t xml:space="preserve"> /aʁɡɛnˈtsiːnəʁɪn/</w:t>
+      </w:r>
+    </w:p>
+    <w:p>
+      <w:pPr>
+        <w:spacing w:after="80"/>
+        <w:ind w:left="576"/>
+      </w:pPr>
+      <w:r>
+        <w:rPr>
+          <w:sz w:val="22"/>
+        </w:rPr>
+        <w:t>die Argentinierin, -nen / der Argentinier, -</w:t>
+      </w:r>
+    </w:p>
+    <w:p>
+      <w:pPr>
+        <w:spacing w:after="80"/>
+        <w:ind w:left="576"/>
+      </w:pPr>
+      <w:r>
+        <w:t>An Argentine; feminine die Argentinierin, masculine der Argentinier.</w:t>
+      </w:r>
+    </w:p>
+    <w:p>
+      <w:pPr>
+        <w:spacing w:after="80"/>
+        <w:ind w:left="576"/>
+      </w:pPr>
+      <w:r>
+        <w:rPr>
+          <w:i/>
+          <w:color w:val="404040"/>
+          <w:sz w:val="20"/>
+        </w:rPr>
+        <w:t>• Same pattern as die Schweizerin (from die Schweiz): demonyms from Argentinien, the country name in German.</w:t>
+      </w:r>
+    </w:p>
+    <w:p>
+      <w:pPr>
+        <w:spacing w:before="40" w:after="60"/>
+        <w:ind w:left="576"/>
+      </w:pPr>
+      <w:r>
+        <w:rPr>
+          <w:i/>
+          <w:color w:val="30608C"/>
+          <w:sz w:val="21"/>
+        </w:rPr>
+        <w:t xml:space="preserve">› </w:t>
+      </w:r>
+      <w:r>
+        <w:rPr>
+          <w:i/>
+          <w:color w:val="30608C"/>
+          <w:sz w:val="21"/>
+        </w:rPr>
+        <w:t>Er ist Argentinier, sie ist Argentinierin.</w:t>
+      </w:r>
+      <w:r>
+        <w:rPr>
+          <w:i/>
+          <w:color w:val="404040"/>
+          <w:sz w:val="21"/>
+        </w:rPr>
+        <w:t xml:space="preserve"> (He is Argentine; she is Argentine.)</w:t>
+      </w:r>
+    </w:p>
+    <w:p>
+      <w:pPr>
+        <w:spacing w:before="0" w:after="60"/>
+        <w:ind w:left="576"/>
+      </w:pPr>
+      <w:r>
+        <w:rPr>
+          <w:i/>
+          <w:color w:val="30608C"/>
+          <w:sz w:val="21"/>
+        </w:rPr>
+        <w:t xml:space="preserve">› </w:t>
+      </w:r>
+      <w:r>
+        <w:rPr>
+          <w:i/>
+          <w:color w:val="30608C"/>
+          <w:sz w:val="21"/>
+        </w:rPr>
+        <w:t>Er ist Schweizer, sie ist Schweizerin; er ist Argentinier, sie ist Argentinierin.</w:t>
+      </w:r>
+      <w:r>
+        <w:rPr>
+          <w:i/>
+          <w:color w:val="404040"/>
+          <w:sz w:val="21"/>
+        </w:rPr>
+        <w:t xml:space="preserve"> (He is Swiss, she is Swiss; he is Argentine, she is Argentine.)</w:t>
+      </w:r>
+    </w:p>
+    <w:p>
+      <w:pPr>
+        <w:spacing w:before="0" w:after="60"/>
+        <w:ind w:left="576"/>
+      </w:pPr>
+      <w:r>
+        <w:rPr>
+          <w:i/>
+          <w:color w:val="30608C"/>
+          <w:sz w:val="21"/>
+        </w:rPr>
+        <w:t xml:space="preserve">› </w:t>
+      </w:r>
+      <w:r>
+        <w:rPr>
+          <w:i/>
+          <w:color w:val="30608C"/>
+          <w:sz w:val="21"/>
+        </w:rPr>
+        <w:t>Sie ist Argentinierin und lebt in Berlin.</w:t>
+      </w:r>
+      <w:r>
+        <w:rPr>
+          <w:i/>
+          <w:color w:val="404040"/>
+          <w:sz w:val="21"/>
+        </w:rPr>
+        <w:t xml:space="preserve"> (She is Argentine and lives in Berlin.)</w:t>
+      </w:r>
+    </w:p>
+    <w:p>
+      <w:pPr>
+        <w:spacing w:before="0" w:after="120"/>
+        <w:ind w:left="576"/>
+      </w:pPr>
+      <w:r>
+        <w:rPr>
+          <w:i/>
+          <w:color w:val="30608C"/>
+          <w:sz w:val="21"/>
+        </w:rPr>
+        <w:t xml:space="preserve">› </w:t>
+      </w:r>
+      <w:r>
+        <w:rPr>
+          <w:i/>
+          <w:color w:val="30608C"/>
+          <w:sz w:val="21"/>
+        </w:rPr>
+        <w:t>Zwei Argentinierinnen und ein Argentinier arbeiten hier.</w:t>
+      </w:r>
+      <w:r>
+        <w:rPr>
+          <w:i/>
+          <w:color w:val="404040"/>
+          <w:sz w:val="21"/>
+        </w:rPr>
+        <w:t xml:space="preserve"> (Two Argentine women and one Argentine man work here.)</w:t>
+      </w:r>
+    </w:p>
+    <w:p>
+      <w:pPr>
+        <w:spacing w:before="0" w:after="0"/>
+      </w:pPr>
+    </w:p>
+    <w:p>
+      <w:pPr>
+        <w:spacing w:after="120"/>
+      </w:pPr>
+      <w:r>
+        <w:rPr>
+          <w:b/>
+        </w:rPr>
+        <w:t>Servus</w:t>
+      </w:r>
+      <w:r>
+        <w:t xml:space="preserve"> /ˈzɛɐ̯vus/</w:t>
+      </w:r>
+    </w:p>
+    <w:p>
+      <w:pPr>
+        <w:spacing w:after="80"/>
+        <w:ind w:left="576"/>
+      </w:pPr>
+      <w:r>
+        <w:t>Informal hi or bye; strongest in Austria and southern Germany.</w:t>
+      </w:r>
+    </w:p>
+    <w:p>
+      <w:pPr>
+        <w:spacing w:after="80"/>
+        <w:ind w:left="576"/>
+      </w:pPr>
+      <w:r>
+        <w:rPr>
+          <w:i/>
+          <w:color w:val="404040"/>
+          <w:sz w:val="20"/>
+        </w:rPr>
+        <w:t>• Informal greeting and goodbye; most typical in Austria, Bavaria, and other southern regions.</w:t>
+      </w:r>
+    </w:p>
+    <w:p>
+      <w:pPr>
+        <w:spacing w:after="80"/>
+        <w:ind w:left="576"/>
+      </w:pPr>
+      <w:r>
+        <w:rPr>
+          <w:i/>
+          <w:color w:val="404040"/>
+          <w:sz w:val="20"/>
+        </w:rPr>
+        <w:t>• From Latin for “your servant”; today it is a casual hi, hey, or bye in one short word.</w:t>
+      </w:r>
+    </w:p>
+    <w:p>
+      <w:pPr>
+        <w:spacing w:after="80"/>
+        <w:ind w:left="576"/>
+      </w:pPr>
+      <w:r>
+        <w:rPr>
+          <w:i/>
+          <w:color w:val="404040"/>
+          <w:sz w:val="20"/>
+        </w:rPr>
+        <w:t>• Not the everyday norm everywhere in Germany; in the north people more often say Hallo or Tschüss.</w:t>
+      </w:r>
+    </w:p>
+    <w:p>
+      <w:pPr>
+        <w:spacing w:before="40" w:after="60"/>
+        <w:ind w:left="576"/>
+      </w:pPr>
+      <w:r>
+        <w:rPr>
+          <w:i/>
+          <w:color w:val="30608C"/>
+          <w:sz w:val="21"/>
+        </w:rPr>
+        <w:t xml:space="preserve">› </w:t>
+      </w:r>
+      <w:r>
+        <w:rPr>
+          <w:i/>
+          <w:color w:val="30608C"/>
+          <w:sz w:val="21"/>
+        </w:rPr>
+        <w:t>Servus!</w:t>
+      </w:r>
+      <w:r>
+        <w:rPr>
+          <w:i/>
+          <w:color w:val="404040"/>
+          <w:sz w:val="21"/>
+        </w:rPr>
+        <w:t xml:space="preserve"> (Hi! / Bye! [informal, southern])</w:t>
+      </w:r>
+    </w:p>
+    <w:p>
+      <w:pPr>
+        <w:spacing w:before="0" w:after="120"/>
+        <w:ind w:left="576"/>
+      </w:pPr>
+      <w:r>
+        <w:rPr>
+          <w:i/>
+          <w:color w:val="30608C"/>
+          <w:sz w:val="21"/>
+        </w:rPr>
+        <w:t xml:space="preserve">› </w:t>
+      </w:r>
+      <w:r>
+        <w:rPr>
+          <w:i/>
+          <w:color w:val="30608C"/>
+          <w:sz w:val="21"/>
+        </w:rPr>
+        <w:t>Servus, wie geht's?</w:t>
+      </w:r>
+      <w:r>
+        <w:rPr>
+          <w:i/>
+          <w:color w:val="404040"/>
+          <w:sz w:val="21"/>
+        </w:rPr>
+        <w:t xml:space="preserve"> (Hey — how's it going?)</w:t>
+      </w:r>
+    </w:p>
+    <w:p>
+      <w:pPr>
+        <w:spacing w:before="0" w:after="0"/>
+      </w:pPr>
+    </w:p>
+    <w:p>
+      <w:pPr>
+        <w:spacing w:after="120"/>
+      </w:pPr>
+      <w:r>
+        <w:rPr>
+          <w:b/>
+        </w:rPr>
+        <w:t>in</w:t>
+      </w:r>
+      <w:r>
+        <w:t xml:space="preserve"> /ɪn/</w:t>
+      </w:r>
+    </w:p>
+    <w:p>
+      <w:pPr>
+        <w:spacing w:after="80"/>
+        <w:ind w:left="576"/>
+      </w:pPr>
+      <w:r>
+        <w:t>In; inside; on a team (+ dative for location).</w:t>
+      </w:r>
+    </w:p>
+    <w:p>
+      <w:pPr>
+        <w:spacing w:after="80"/>
+        <w:ind w:left="576"/>
+      </w:pPr>
+      <w:r>
+        <w:rPr>
+          <w:i/>
+          <w:color w:val="404040"/>
+          <w:sz w:val="20"/>
+        </w:rPr>
+        <w:t>• Wo? uses dative: in einem Team. Wohin? uses accusative: in ein Team.</w:t>
+      </w:r>
+    </w:p>
+    <w:p>
+      <w:pPr>
+        <w:spacing w:before="40" w:after="60"/>
+        <w:ind w:left="576"/>
+      </w:pPr>
+      <w:r>
+        <w:rPr>
+          <w:i/>
+          <w:color w:val="30608C"/>
+          <w:sz w:val="21"/>
+        </w:rPr>
+        <w:t xml:space="preserve">› </w:t>
+      </w:r>
+      <w:r>
+        <w:rPr>
+          <w:i/>
+          <w:color w:val="30608C"/>
+          <w:sz w:val="21"/>
+        </w:rPr>
+        <w:t>Ihr seid in einem Team.</w:t>
+      </w:r>
+      <w:r>
+        <w:rPr>
+          <w:i/>
+          <w:color w:val="404040"/>
+          <w:sz w:val="21"/>
+        </w:rPr>
+        <w:t xml:space="preserve"> (You all are on a team.)</w:t>
+      </w:r>
+    </w:p>
+    <w:p>
+      <w:pPr>
+        <w:spacing w:before="0" w:after="60"/>
+        <w:ind w:left="576"/>
+      </w:pPr>
+      <w:r>
+        <w:rPr>
+          <w:i/>
+          <w:color w:val="30608C"/>
+          <w:sz w:val="21"/>
+        </w:rPr>
+        <w:t xml:space="preserve">› </w:t>
+      </w:r>
+      <w:r>
+        <w:rPr>
+          <w:i/>
+          <w:color w:val="30608C"/>
+          <w:sz w:val="21"/>
+        </w:rPr>
+        <w:t>Ich bin in Berlin.</w:t>
+      </w:r>
+      <w:r>
+        <w:rPr>
+          <w:i/>
+          <w:color w:val="404040"/>
+          <w:sz w:val="21"/>
+        </w:rPr>
+        <w:t xml:space="preserve"> (I am in Berlin.)</w:t>
+      </w:r>
+    </w:p>
+    <w:p>
+      <w:pPr>
+        <w:spacing w:before="0" w:after="120"/>
+        <w:ind w:left="576"/>
+      </w:pPr>
+      <w:r>
+        <w:rPr>
+          <w:i/>
+          <w:color w:val="30608C"/>
+          <w:sz w:val="21"/>
+        </w:rPr>
+        <w:t xml:space="preserve">› </w:t>
+      </w:r>
+      <w:r>
+        <w:rPr>
+          <w:i/>
+          <w:color w:val="30608C"/>
+          <w:sz w:val="21"/>
+        </w:rPr>
+        <w:t>Ihr kommt in ein Team.</w:t>
+      </w:r>
+      <w:r>
+        <w:rPr>
+          <w:i/>
+          <w:color w:val="404040"/>
+          <w:sz w:val="21"/>
+        </w:rPr>
+        <w:t xml:space="preserve"> (You all are joining / going into a team. [accusative: direction])</w:t>
+      </w:r>
+    </w:p>
+    <w:p>
+      <w:pPr>
+        <w:spacing w:before="0" w:after="0"/>
+      </w:pPr>
     </w:p>
     <w:p>
       <w:pPr>
@@ -1070,138 +1506,6 @@
           <w:sz w:val="21"/>
         </w:rPr>
         <w:t xml:space="preserve"> (I see the new intern. [accusative masculine: den neuen])</w:t>
-      </w:r>
-    </w:p>
-    <w:p>
-      <w:pPr>
-        <w:spacing w:before="0" w:after="0"/>
-      </w:pPr>
-    </w:p>
-    <w:p>
-      <w:pPr>
-        <w:spacing w:after="120"/>
-      </w:pPr>
-      <w:r>
-        <w:rPr>
-          <w:b/>
-        </w:rPr>
-        <w:t>in</w:t>
-      </w:r>
-      <w:r>
-        <w:t xml:space="preserve"> /ɪn/</w:t>
-      </w:r>
-    </w:p>
-    <w:p>
-      <w:pPr>
-        <w:spacing w:after="80"/>
-        <w:ind w:left="576"/>
-      </w:pPr>
-      <w:r>
-        <w:t>In; inside; on a team (+ dative for location).</w:t>
-      </w:r>
-    </w:p>
-    <w:p>
-      <w:pPr>
-        <w:spacing w:after="80"/>
-        <w:ind w:left="576"/>
-      </w:pPr>
-      <w:r>
-        <w:rPr>
-          <w:i/>
-          <w:color w:val="404040"/>
-          <w:sz w:val="20"/>
-        </w:rPr>
-        <w:t>• Wo? uses dative: in einem Team. Wohin? uses accusative: in ein Team.</w:t>
-      </w:r>
-    </w:p>
-    <w:p>
-      <w:pPr>
-        <w:spacing w:before="40" w:after="60"/>
-        <w:ind w:left="576"/>
-      </w:pPr>
-      <w:r>
-        <w:rPr>
-          <w:i/>
-          <w:color w:val="30608C"/>
-          <w:sz w:val="21"/>
-        </w:rPr>
-        <w:t xml:space="preserve">› </w:t>
-      </w:r>
-      <w:r>
-        <w:rPr>
-          <w:i/>
-          <w:color w:val="30608C"/>
-          <w:sz w:val="21"/>
-        </w:rPr>
-        <w:t>Ihr seid in einem Team.</w:t>
-      </w:r>
-      <w:r>
-        <w:rPr>
-          <w:i/>
-          <w:color w:val="404040"/>
-          <w:sz w:val="21"/>
-        </w:rPr>
-        <w:t xml:space="preserve"> (You all are on a team.)</w:t>
-      </w:r>
-    </w:p>
-    <w:p>
-      <w:pPr>
-        <w:spacing w:before="0" w:after="60"/>
-        <w:ind w:left="576"/>
-      </w:pPr>
-      <w:r>
-        <w:rPr>
-          <w:i/>
-          <w:color w:val="30608C"/>
-          <w:sz w:val="21"/>
-        </w:rPr>
-        <w:t xml:space="preserve">› </w:t>
-      </w:r>
-      <w:r>
-        <w:rPr>
-          <w:i/>
-          <w:color w:val="30608C"/>
-          <w:sz w:val="21"/>
-        </w:rPr>
-        <w:t>Ich bin in Berlin.</w:t>
-      </w:r>
-      <w:r>
-        <w:rPr>
-          <w:i/>
-          <w:color w:val="404040"/>
-          <w:sz w:val="21"/>
-        </w:rPr>
-        <w:t xml:space="preserve"> (I am in Berlin.)</w:t>
-      </w:r>
-    </w:p>
-    <w:p>
-      <w:pPr>
-        <w:spacing w:before="0" w:after="120"/>
-        <w:ind w:left="576"/>
-      </w:pPr>
-      <w:r>
-        <w:rPr>
-          <w:i/>
-          <w:color w:val="30608C"/>
-          <w:sz w:val="21"/>
-        </w:rPr>
-        <w:t xml:space="preserve">› </w:t>
-      </w:r>
-      <w:r>
-        <w:rPr>
-          <w:i/>
-          <w:color w:val="30608C"/>
-          <w:sz w:val="21"/>
-        </w:rPr>
-        <w:t>Ihr kommt in ein Team.</w:t>
-      </w:r>
-      <w:r>
-        <w:rPr>
-          <w:i/>
-          <w:color w:val="404040"/>
-          <w:sz w:val="21"/>
-        </w:rPr>
-        <w:t xml:space="preserve"> (You all are joining / going into a team. [accusative: direction])</w:t>
       </w:r>
     </w:p>
     <w:p>

</xml_diff>

<commit_message>
Refactor vocabulary entries in vocab.docx and vocab.manifest.json
- Removed redundant gloss entries and improved formatting for clarity and consistency across multiple vocabulary entries.
- Updated the grammar table structure in the code to enhance readability and maintainability.
- Eliminated unused functions related to adjective token extraction and grammar row masking to streamline the codebase.
</commit_message>
<xml_diff>
--- a/vocab.docx
+++ b/vocab.docx
@@ -66,36 +66,6 @@
     <w:p>
       <w:pPr>
         <w:spacing w:before="40" w:after="60"/>
-        <w:ind w:left="576"/>
-      </w:pPr>
-      <w:r>
-        <w:rPr>
-          <w:i/>
-          <w:color w:val="30608C"/>
-          <w:sz w:val="21"/>
-        </w:rPr>
-        <w:t xml:space="preserve">› </w:t>
-      </w:r>
-      <w:r>
-        <w:rPr>
-          <w:i/>
-          <w:color w:val="30608C"/>
-          <w:sz w:val="21"/>
-        </w:rPr>
-        <w:t>Er ist Argentinier, sie ist Argentinierin.</w:t>
-      </w:r>
-      <w:r>
-        <w:rPr>
-          <w:i/>
-          <w:color w:val="404040"/>
-          <w:sz w:val="21"/>
-        </w:rPr>
-        <w:t xml:space="preserve"> (He is Argentine; she is Argentine.)</w:t>
-      </w:r>
-    </w:p>
-    <w:p>
-      <w:pPr>
-        <w:spacing w:before="0" w:after="60"/>
         <w:ind w:left="576"/>
       </w:pPr>
       <w:r>
@@ -776,7 +746,6 @@
         <w:tc>
           <w:tcPr>
             <w:tcW w:type="dxa" w:w="1728"/>
-            <w:shd w:val="clear" w:color="auto" w:fill="FFF3CD"/>
           </w:tcPr>
           <w:p>
             <w:pPr>
@@ -886,7 +855,6 @@
         <w:tc>
           <w:tcPr>
             <w:tcW w:type="dxa" w:w="1728"/>
-            <w:shd w:val="clear" w:color="auto" w:fill="FFF3CD"/>
           </w:tcPr>
           <w:p>
             <w:pPr>
@@ -931,7 +899,6 @@
         <w:tc>
           <w:tcPr>
             <w:tcW w:type="dxa" w:w="1728"/>
-            <w:shd w:val="clear" w:color="auto" w:fill="FFF3CD"/>
           </w:tcPr>
           <w:p>
             <w:pPr>

</xml_diff>

<commit_message>
Add new vocabulary entries for "Viel Spaß!", "der Spaß," "viel," "zusammen," and "Hoi" in vocab.docx and vocab.manifest.json
- Introduced detailed entries for each term, including glosses, notes, and examples in both German and English.
- All entries are categorized under lesson 1 and level A1 for language learners, enhancing the vocabulary resource with practical usage and common phrases.
</commit_message>
<xml_diff>
--- a/vocab.docx
+++ b/vocab.docx
@@ -13,6 +13,616 @@
         </w:rPr>
         <w:t>daf — vocabulary</w:t>
       </w:r>
+    </w:p>
+    <w:p>
+      <w:pPr>
+        <w:spacing w:after="120"/>
+      </w:pPr>
+      <w:r>
+        <w:rPr>
+          <w:b/>
+        </w:rPr>
+        <w:t>Viel Spaß!</w:t>
+      </w:r>
+      <w:r>
+        <w:t xml:space="preserve"> /fiːl ʃpaːs/</w:t>
+      </w:r>
+    </w:p>
+    <w:p>
+      <w:pPr>
+        <w:spacing w:after="80"/>
+        <w:ind w:left="576"/>
+      </w:pPr>
+      <w:r>
+        <w:t>Have fun! Enjoy yourself!</w:t>
+      </w:r>
+    </w:p>
+    <w:p>
+      <w:pPr>
+        <w:spacing w:after="80"/>
+        <w:ind w:left="576"/>
+      </w:pPr>
+      <w:r>
+        <w:rPr>
+          <w:i/>
+          <w:color w:val="404040"/>
+          <w:sz w:val="20"/>
+        </w:rPr>
+        <w:t>• Correct spelling in standard German: Spaß with ß, not spas.</w:t>
+      </w:r>
+    </w:p>
+    <w:p>
+      <w:pPr>
+        <w:spacing w:before="40" w:after="60"/>
+        <w:ind w:left="576"/>
+      </w:pPr>
+      <w:r>
+        <w:rPr>
+          <w:i/>
+          <w:color w:val="30608C"/>
+          <w:sz w:val="21"/>
+        </w:rPr>
+        <w:t xml:space="preserve">› </w:t>
+      </w:r>
+      <w:r>
+        <w:rPr>
+          <w:i/>
+          <w:color w:val="30608C"/>
+          <w:sz w:val="21"/>
+        </w:rPr>
+        <w:t>Viel Spaß!</w:t>
+      </w:r>
+      <w:r>
+        <w:rPr>
+          <w:i/>
+          <w:color w:val="404040"/>
+          <w:sz w:val="21"/>
+        </w:rPr>
+        <w:t xml:space="preserve"> (Have fun!)</w:t>
+      </w:r>
+    </w:p>
+    <w:p>
+      <w:pPr>
+        <w:spacing w:before="0" w:after="120"/>
+        <w:ind w:left="576"/>
+      </w:pPr>
+      <w:r>
+        <w:rPr>
+          <w:i/>
+          <w:color w:val="30608C"/>
+          <w:sz w:val="21"/>
+        </w:rPr>
+        <w:t xml:space="preserve">› </w:t>
+      </w:r>
+      <w:r>
+        <w:rPr>
+          <w:i/>
+          <w:color w:val="30608C"/>
+          <w:sz w:val="21"/>
+        </w:rPr>
+        <w:t>Viel Spaß beim Deutschlernen!</w:t>
+      </w:r>
+      <w:r>
+        <w:rPr>
+          <w:i/>
+          <w:color w:val="404040"/>
+          <w:sz w:val="21"/>
+        </w:rPr>
+        <w:t xml:space="preserve"> (Have fun learning German!)</w:t>
+      </w:r>
+    </w:p>
+    <w:p>
+      <w:pPr>
+        <w:spacing w:before="0" w:after="0"/>
+      </w:pPr>
+    </w:p>
+    <w:p>
+      <w:pPr>
+        <w:spacing w:after="120"/>
+      </w:pPr>
+      <w:r>
+        <w:rPr>
+          <w:b/>
+        </w:rPr>
+        <w:t>der Spaß</w:t>
+      </w:r>
+      <w:r>
+        <w:t xml:space="preserve"> /ʃpaːs/</w:t>
+      </w:r>
+    </w:p>
+    <w:p>
+      <w:pPr>
+        <w:spacing w:after="80"/>
+        <w:ind w:left="576"/>
+      </w:pPr>
+      <w:r>
+        <w:rPr>
+          <w:sz w:val="22"/>
+        </w:rPr>
+        <w:t>der Spaß, -äße</w:t>
+      </w:r>
+    </w:p>
+    <w:p>
+      <w:pPr>
+        <w:spacing w:after="80"/>
+        <w:ind w:left="576"/>
+      </w:pPr>
+      <w:r>
+        <w:t>Fun; enjoyment.</w:t>
+      </w:r>
+    </w:p>
+    <w:p>
+      <w:pPr>
+        <w:spacing w:after="80"/>
+        <w:ind w:left="576"/>
+      </w:pPr>
+      <w:r>
+        <w:rPr>
+          <w:i/>
+          <w:color w:val="404040"/>
+          <w:sz w:val="20"/>
+        </w:rPr>
+        <w:t>• Long a + sharp s: Spaß. In Switzerland, ß is usually written ss: Spass.</w:t>
+      </w:r>
+    </w:p>
+    <w:p>
+      <w:pPr>
+        <w:spacing w:before="40" w:after="60"/>
+        <w:ind w:left="576"/>
+      </w:pPr>
+      <w:r>
+        <w:rPr>
+          <w:i/>
+          <w:color w:val="30608C"/>
+          <w:sz w:val="21"/>
+        </w:rPr>
+        <w:t xml:space="preserve">› </w:t>
+      </w:r>
+      <w:r>
+        <w:rPr>
+          <w:i/>
+          <w:color w:val="30608C"/>
+          <w:sz w:val="21"/>
+        </w:rPr>
+        <w:t>Deutsch macht Spaß.</w:t>
+      </w:r>
+      <w:r>
+        <w:rPr>
+          <w:i/>
+          <w:color w:val="404040"/>
+          <w:sz w:val="21"/>
+        </w:rPr>
+        <w:t xml:space="preserve"> (German is fun.)</w:t>
+      </w:r>
+    </w:p>
+    <w:p>
+      <w:pPr>
+        <w:spacing w:before="0" w:after="120"/>
+        <w:ind w:left="576"/>
+      </w:pPr>
+      <w:r>
+        <w:rPr>
+          <w:i/>
+          <w:color w:val="30608C"/>
+          <w:sz w:val="21"/>
+        </w:rPr>
+        <w:t xml:space="preserve">› </w:t>
+      </w:r>
+      <w:r>
+        <w:rPr>
+          <w:i/>
+          <w:color w:val="30608C"/>
+          <w:sz w:val="21"/>
+        </w:rPr>
+        <w:t>Das macht viel Spaß.</w:t>
+      </w:r>
+      <w:r>
+        <w:rPr>
+          <w:i/>
+          <w:color w:val="404040"/>
+          <w:sz w:val="21"/>
+        </w:rPr>
+        <w:t xml:space="preserve"> (That is a lot of fun.)</w:t>
+      </w:r>
+    </w:p>
+    <w:p>
+      <w:pPr>
+        <w:spacing w:before="0" w:after="0"/>
+      </w:pPr>
+    </w:p>
+    <w:p>
+      <w:pPr>
+        <w:spacing w:after="120"/>
+      </w:pPr>
+      <w:r>
+        <w:rPr>
+          <w:b/>
+        </w:rPr>
+        <w:t>viel</w:t>
+      </w:r>
+      <w:r>
+        <w:t xml:space="preserve"> /fiːl/</w:t>
+      </w:r>
+    </w:p>
+    <w:p>
+      <w:pPr>
+        <w:spacing w:after="80"/>
+        <w:ind w:left="576"/>
+      </w:pPr>
+      <w:r>
+        <w:t>Much; a lot; many before plural nouns.</w:t>
+      </w:r>
+    </w:p>
+    <w:p>
+      <w:pPr>
+        <w:spacing w:after="80"/>
+        <w:ind w:left="576"/>
+      </w:pPr>
+      <w:r>
+        <w:rPr>
+          <w:i/>
+          <w:color w:val="404040"/>
+          <w:sz w:val="20"/>
+        </w:rPr>
+        <w:t>• In Viel Spaß!, viel intensifies the wish: literally much fun, naturally have fun.</w:t>
+      </w:r>
+    </w:p>
+    <w:p>
+      <w:pPr>
+        <w:spacing w:before="40" w:after="60"/>
+        <w:ind w:left="576"/>
+      </w:pPr>
+      <w:r>
+        <w:rPr>
+          <w:i/>
+          <w:color w:val="30608C"/>
+          <w:sz w:val="21"/>
+        </w:rPr>
+        <w:t xml:space="preserve">› </w:t>
+      </w:r>
+      <w:r>
+        <w:rPr>
+          <w:i/>
+          <w:color w:val="30608C"/>
+          <w:sz w:val="21"/>
+        </w:rPr>
+        <w:t>Ich habe viel Zeit.</w:t>
+      </w:r>
+      <w:r>
+        <w:rPr>
+          <w:i/>
+          <w:color w:val="404040"/>
+          <w:sz w:val="21"/>
+        </w:rPr>
+        <w:t xml:space="preserve"> (I have a lot of time.)</w:t>
+      </w:r>
+    </w:p>
+    <w:p>
+      <w:pPr>
+        <w:spacing w:before="0" w:after="120"/>
+        <w:ind w:left="576"/>
+      </w:pPr>
+      <w:r>
+        <w:rPr>
+          <w:i/>
+          <w:color w:val="30608C"/>
+          <w:sz w:val="21"/>
+        </w:rPr>
+        <w:t xml:space="preserve">› </w:t>
+      </w:r>
+      <w:r>
+        <w:rPr>
+          <w:i/>
+          <w:color w:val="30608C"/>
+          <w:sz w:val="21"/>
+        </w:rPr>
+        <w:t>Viele Personen warten.</w:t>
+      </w:r>
+      <w:r>
+        <w:rPr>
+          <w:i/>
+          <w:color w:val="404040"/>
+          <w:sz w:val="21"/>
+        </w:rPr>
+        <w:t xml:space="preserve"> (Many people are waiting.)</w:t>
+      </w:r>
+    </w:p>
+    <w:p>
+      <w:pPr>
+        <w:spacing w:before="0" w:after="0"/>
+      </w:pPr>
+    </w:p>
+    <w:p>
+      <w:pPr>
+        <w:spacing w:after="120"/>
+      </w:pPr>
+      <w:r>
+        <w:rPr>
+          <w:b/>
+        </w:rPr>
+        <w:t>zusammen</w:t>
+      </w:r>
+      <w:r>
+        <w:t xml:space="preserve"> /tsuˈzamən/</w:t>
+      </w:r>
+    </w:p>
+    <w:p>
+      <w:pPr>
+        <w:spacing w:after="80"/>
+        <w:ind w:left="576"/>
+      </w:pPr>
+      <w:r>
+        <w:t>Together; as a group (adverb).</w:t>
+      </w:r>
+    </w:p>
+    <w:p>
+      <w:pPr>
+        <w:spacing w:after="80"/>
+        <w:ind w:left="576"/>
+      </w:pPr>
+      <w:r>
+        <w:rPr>
+          <w:i/>
+          <w:color w:val="404040"/>
+          <w:sz w:val="20"/>
+        </w:rPr>
+        <w:t>• Spelling: zwei m und -en at the end — not zusamen (common typo/OCR).</w:t>
+      </w:r>
+    </w:p>
+    <w:p>
+      <w:pPr>
+        <w:spacing w:after="80"/>
+        <w:ind w:left="576"/>
+      </w:pPr>
+      <w:r>
+        <w:rPr>
+          <w:i/>
+          <w:color w:val="404040"/>
+          <w:sz w:val="20"/>
+        </w:rPr>
+        <w:t>• In Hoi zusammen!, zusammen means “everyone / all of you” — like English “Hi all!”</w:t>
+      </w:r>
+    </w:p>
+    <w:p>
+      <w:pPr>
+        <w:spacing w:before="40" w:after="60"/>
+        <w:ind w:left="576"/>
+      </w:pPr>
+      <w:r>
+        <w:rPr>
+          <w:i/>
+          <w:color w:val="30608C"/>
+          <w:sz w:val="21"/>
+        </w:rPr>
+        <w:t xml:space="preserve">› </w:t>
+      </w:r>
+      <w:r>
+        <w:rPr>
+          <w:i/>
+          <w:color w:val="30608C"/>
+          <w:sz w:val="21"/>
+        </w:rPr>
+        <w:t>Hoi zusammen!</w:t>
+      </w:r>
+      <w:r>
+        <w:rPr>
+          <w:i/>
+          <w:color w:val="404040"/>
+          <w:sz w:val="21"/>
+        </w:rPr>
+        <w:t xml:space="preserve"> (Hi, everyone!)</w:t>
+      </w:r>
+    </w:p>
+    <w:p>
+      <w:pPr>
+        <w:spacing w:before="0" w:after="60"/>
+        <w:ind w:left="576"/>
+      </w:pPr>
+      <w:r>
+        <w:rPr>
+          <w:i/>
+          <w:color w:val="30608C"/>
+          <w:sz w:val="21"/>
+        </w:rPr>
+        <w:t xml:space="preserve">› </w:t>
+      </w:r>
+      <w:r>
+        <w:rPr>
+          <w:i/>
+          <w:color w:val="30608C"/>
+          <w:sz w:val="21"/>
+        </w:rPr>
+        <w:t>Wir lernen zusammen Deutsch.</w:t>
+      </w:r>
+      <w:r>
+        <w:rPr>
+          <w:i/>
+          <w:color w:val="404040"/>
+          <w:sz w:val="21"/>
+        </w:rPr>
+        <w:t xml:space="preserve"> (We are learning German together.)</w:t>
+      </w:r>
+    </w:p>
+    <w:p>
+      <w:pPr>
+        <w:spacing w:before="0" w:after="120"/>
+        <w:ind w:left="576"/>
+      </w:pPr>
+      <w:r>
+        <w:rPr>
+          <w:i/>
+          <w:color w:val="30608C"/>
+          <w:sz w:val="21"/>
+        </w:rPr>
+        <w:t xml:space="preserve">› </w:t>
+      </w:r>
+      <w:r>
+        <w:rPr>
+          <w:i/>
+          <w:color w:val="30608C"/>
+          <w:sz w:val="21"/>
+        </w:rPr>
+        <w:t>Kommt alle zusammen!</w:t>
+      </w:r>
+      <w:r>
+        <w:rPr>
+          <w:i/>
+          <w:color w:val="404040"/>
+          <w:sz w:val="21"/>
+        </w:rPr>
+        <w:t xml:space="preserve"> (Everyone come together! / Gather round!)</w:t>
+      </w:r>
+    </w:p>
+    <w:p>
+      <w:pPr>
+        <w:spacing w:before="0" w:after="0"/>
+      </w:pPr>
+    </w:p>
+    <w:p>
+      <w:pPr>
+        <w:spacing w:after="120"/>
+      </w:pPr>
+      <w:r>
+        <w:rPr>
+          <w:b/>
+        </w:rPr>
+        <w:t>Hoi</w:t>
+      </w:r>
+      <w:r>
+        <w:t xml:space="preserve"> /hɔɪ/</w:t>
+      </w:r>
+    </w:p>
+    <w:p>
+      <w:pPr>
+        <w:spacing w:after="80"/>
+        <w:ind w:left="576"/>
+      </w:pPr>
+      <w:r>
+        <w:t>Informal hi or hey; especially typical in Switzerland.</w:t>
+      </w:r>
+    </w:p>
+    <w:p>
+      <w:pPr>
+        <w:spacing w:after="80"/>
+        <w:ind w:left="576"/>
+      </w:pPr>
+      <w:r>
+        <w:rPr>
+          <w:i/>
+          <w:color w:val="404040"/>
+          <w:sz w:val="20"/>
+        </w:rPr>
+        <w:t>• One-word greeting (interjection), like Hallo or Servus — no article, no plural, no verb endings.</w:t>
+      </w:r>
+    </w:p>
+    <w:p>
+      <w:pPr>
+        <w:spacing w:after="80"/>
+        <w:ind w:left="576"/>
+      </w:pPr>
+      <w:r>
+        <w:rPr>
+          <w:i/>
+          <w:color w:val="404040"/>
+          <w:sz w:val="20"/>
+        </w:rPr>
+        <w:t>• Very common in Swiss German contexts; also heard in casual speech elsewhere; not the standard classroom default.</w:t>
+      </w:r>
+    </w:p>
+    <w:p>
+      <w:pPr>
+        <w:spacing w:before="40" w:after="60"/>
+        <w:ind w:left="576"/>
+      </w:pPr>
+      <w:r>
+        <w:rPr>
+          <w:i/>
+          <w:color w:val="30608C"/>
+          <w:sz w:val="21"/>
+        </w:rPr>
+        <w:t xml:space="preserve">› </w:t>
+      </w:r>
+      <w:r>
+        <w:rPr>
+          <w:i/>
+          <w:color w:val="30608C"/>
+          <w:sz w:val="21"/>
+        </w:rPr>
+        <w:t>Hoi!</w:t>
+      </w:r>
+      <w:r>
+        <w:rPr>
+          <w:i/>
+          <w:color w:val="404040"/>
+          <w:sz w:val="21"/>
+        </w:rPr>
+        <w:t xml:space="preserve"> (Hi! / Hey!)</w:t>
+      </w:r>
+    </w:p>
+    <w:p>
+      <w:pPr>
+        <w:spacing w:before="0" w:after="60"/>
+        <w:ind w:left="576"/>
+      </w:pPr>
+      <w:r>
+        <w:rPr>
+          <w:i/>
+          <w:color w:val="30608C"/>
+          <w:sz w:val="21"/>
+        </w:rPr>
+        <w:t xml:space="preserve">› </w:t>
+      </w:r>
+      <w:r>
+        <w:rPr>
+          <w:i/>
+          <w:color w:val="30608C"/>
+          <w:sz w:val="21"/>
+        </w:rPr>
+        <w:t>Hoi, wie geht's?</w:t>
+      </w:r>
+      <w:r>
+        <w:rPr>
+          <w:i/>
+          <w:color w:val="404040"/>
+          <w:sz w:val="21"/>
+        </w:rPr>
+        <w:t xml:space="preserve"> (Hey, how's it going?)</w:t>
+      </w:r>
+    </w:p>
+    <w:p>
+      <w:pPr>
+        <w:spacing w:before="0" w:after="120"/>
+        <w:ind w:left="576"/>
+      </w:pPr>
+      <w:r>
+        <w:rPr>
+          <w:i/>
+          <w:color w:val="30608C"/>
+          <w:sz w:val="21"/>
+        </w:rPr>
+        <w:t xml:space="preserve">› </w:t>
+      </w:r>
+      <w:r>
+        <w:rPr>
+          <w:i/>
+          <w:color w:val="30608C"/>
+          <w:sz w:val="21"/>
+        </w:rPr>
+        <w:t>Hoi zusammen!</w:t>
+      </w:r>
+      <w:r>
+        <w:rPr>
+          <w:i/>
+          <w:color w:val="404040"/>
+          <w:sz w:val="21"/>
+        </w:rPr>
+        <w:t xml:space="preserve"> (Hi, everyone!)</w:t>
+      </w:r>
+    </w:p>
+    <w:p>
+      <w:pPr>
+        <w:spacing w:before="0" w:after="0"/>
+      </w:pPr>
     </w:p>
     <w:p>
       <w:pPr>

</xml_diff>

<commit_message>
Add new vocabulary entries for countries, languages, and nationalities in vocab.docx and vocab.manifest.json
- Introduced detailed entries including glosses, notes, grammar tables, and examples in both German and English for various countries and their corresponding languages and nationalities.
- All entries are categorized under lesson 1 and level A1 for language learners, enhancing the vocabulary resource with practical usage and common phrases.
</commit_message>
<xml_diff>
--- a/vocab.docx
+++ b/vocab.docx
@@ -13,6 +13,766 @@
         </w:rPr>
         <w:t>daf — vocabulary</w:t>
       </w:r>
+    </w:p>
+    <w:p>
+      <w:pPr>
+        <w:spacing w:after="120"/>
+      </w:pPr>
+      <w:r>
+        <w:rPr>
+          <w:b/>
+        </w:rPr>
+        <w:t>Länder, Sprachen, Nationalitäten</w:t>
+      </w:r>
+      <w:r>
+        <w:t xml:space="preserve"> /ˈlɛndɐ ˈʃpʁaːxən natsi̯onaliˈtɛːtən/</w:t>
+      </w:r>
+    </w:p>
+    <w:p>
+      <w:pPr>
+        <w:spacing w:after="80"/>
+        <w:ind w:left="576"/>
+      </w:pPr>
+      <w:r>
+        <w:t>Countries, languages, and nationalities.</w:t>
+      </w:r>
+    </w:p>
+    <w:p>
+      <w:pPr>
+        <w:spacing w:after="80"/>
+        <w:ind w:left="576"/>
+      </w:pPr>
+      <w:r>
+        <w:rPr>
+          <w:i/>
+          <w:color w:val="404040"/>
+          <w:sz w:val="20"/>
+        </w:rPr>
+        <w:t>• Nationality nouns are capitalized in German: der Schweizer, die Schweizerin.</w:t>
+      </w:r>
+    </w:p>
+    <w:p>
+      <w:pPr>
+        <w:spacing w:after="80"/>
+        <w:ind w:left="576"/>
+      </w:pPr>
+      <w:r>
+        <w:rPr>
+          <w:i/>
+          <w:color w:val="404040"/>
+          <w:sz w:val="20"/>
+        </w:rPr>
+        <w:t>• Textbook shorthand Spanier/in means der Spanier / die Spanierin.</w:t>
+      </w:r>
+    </w:p>
+    <w:tbl>
+      <w:tblPr>
+        <w:tblStyle w:val="TableGrid"/>
+        <w:tblW w:type="auto" w:w="0"/>
+        <w:tblLook w:firstColumn="1" w:firstRow="1" w:lastColumn="0" w:lastRow="0" w:noHBand="0" w:noVBand="1" w:val="04A0"/>
+        <w:tblInd w:w="576" w:type="dxa"/>
+      </w:tblPr>
+      <w:tblGrid>
+        <w:gridCol w:w="2880"/>
+        <w:gridCol w:w="2880"/>
+        <w:gridCol w:w="2880"/>
+      </w:tblGrid>
+      <w:tr>
+        <w:tc>
+          <w:tcPr>
+            <w:tcW w:type="dxa" w:w="2880"/>
+            <w:shd w:val="clear" w:color="auto" w:fill="EFF6FC"/>
+          </w:tcPr>
+          <w:p>
+            <w:pPr>
+              <w:spacing w:after="40"/>
+            </w:pPr>
+            <w:r/>
+            <w:r>
+              <w:rPr>
+                <w:rFonts w:ascii="Calibri" w:hAnsi="Calibri"/>
+                <w:b/>
+                <w:color w:val="333333"/>
+                <w:sz w:val="20"/>
+              </w:rPr>
+              <w:t>Länder</w:t>
+            </w:r>
+          </w:p>
+        </w:tc>
+        <w:tc>
+          <w:tcPr>
+            <w:tcW w:type="dxa" w:w="2880"/>
+            <w:shd w:val="clear" w:color="auto" w:fill="EFF6FC"/>
+          </w:tcPr>
+          <w:p>
+            <w:pPr>
+              <w:spacing w:after="40"/>
+            </w:pPr>
+            <w:r/>
+            <w:r>
+              <w:rPr>
+                <w:rFonts w:ascii="Calibri" w:hAnsi="Calibri"/>
+                <w:b/>
+                <w:color w:val="333333"/>
+                <w:sz w:val="20"/>
+              </w:rPr>
+              <w:t>Sprachen</w:t>
+            </w:r>
+          </w:p>
+        </w:tc>
+        <w:tc>
+          <w:tcPr>
+            <w:tcW w:type="dxa" w:w="2880"/>
+            <w:shd w:val="clear" w:color="auto" w:fill="EFF6FC"/>
+          </w:tcPr>
+          <w:p>
+            <w:pPr>
+              <w:spacing w:after="40"/>
+            </w:pPr>
+            <w:r/>
+            <w:r>
+              <w:rPr>
+                <w:rFonts w:ascii="Calibri" w:hAnsi="Calibri"/>
+                <w:b/>
+                <w:color w:val="333333"/>
+                <w:sz w:val="20"/>
+              </w:rPr>
+              <w:t>Nationalitäten</w:t>
+            </w:r>
+          </w:p>
+        </w:tc>
+      </w:tr>
+      <w:tr>
+        <w:tc>
+          <w:tcPr>
+            <w:tcW w:type="dxa" w:w="2880"/>
+          </w:tcPr>
+          <w:p>
+            <w:pPr>
+              <w:spacing w:after="40"/>
+            </w:pPr>
+            <w:r/>
+            <w:r>
+              <w:rPr>
+                <w:rFonts w:ascii="Calibri" w:hAnsi="Calibri"/>
+                <w:color w:val="404040"/>
+                <w:sz w:val="19"/>
+              </w:rPr>
+              <w:t>die Schweiz</w:t>
+            </w:r>
+          </w:p>
+        </w:tc>
+        <w:tc>
+          <w:tcPr>
+            <w:tcW w:type="dxa" w:w="2880"/>
+          </w:tcPr>
+          <w:p>
+            <w:pPr>
+              <w:spacing w:after="40"/>
+            </w:pPr>
+            <w:r/>
+            <w:r>
+              <w:rPr>
+                <w:rFonts w:ascii="Calibri" w:hAnsi="Calibri"/>
+                <w:color w:val="404040"/>
+                <w:sz w:val="19"/>
+              </w:rPr>
+              <w:t>Deutsch / Französisch / Italienisch</w:t>
+            </w:r>
+          </w:p>
+        </w:tc>
+        <w:tc>
+          <w:tcPr>
+            <w:tcW w:type="dxa" w:w="2880"/>
+          </w:tcPr>
+          <w:p>
+            <w:pPr>
+              <w:spacing w:after="40"/>
+            </w:pPr>
+            <w:r/>
+            <w:r>
+              <w:rPr>
+                <w:rFonts w:ascii="Calibri" w:hAnsi="Calibri"/>
+                <w:color w:val="404040"/>
+                <w:sz w:val="19"/>
+              </w:rPr>
+              <w:t>der Schweizer / die Schweizerin</w:t>
+            </w:r>
+          </w:p>
+        </w:tc>
+      </w:tr>
+      <w:tr>
+        <w:tc>
+          <w:tcPr>
+            <w:tcW w:type="dxa" w:w="2880"/>
+          </w:tcPr>
+          <w:p>
+            <w:pPr>
+              <w:spacing w:after="40"/>
+            </w:pPr>
+            <w:r/>
+            <w:r>
+              <w:rPr>
+                <w:rFonts w:ascii="Calibri" w:hAnsi="Calibri"/>
+                <w:color w:val="404040"/>
+                <w:sz w:val="19"/>
+              </w:rPr>
+              <w:t>Polen</w:t>
+            </w:r>
+          </w:p>
+        </w:tc>
+        <w:tc>
+          <w:tcPr>
+            <w:tcW w:type="dxa" w:w="2880"/>
+          </w:tcPr>
+          <w:p>
+            <w:pPr>
+              <w:spacing w:after="40"/>
+            </w:pPr>
+            <w:r/>
+            <w:r>
+              <w:rPr>
+                <w:rFonts w:ascii="Calibri" w:hAnsi="Calibri"/>
+                <w:color w:val="404040"/>
+                <w:sz w:val="19"/>
+              </w:rPr>
+              <w:t>Polnisch</w:t>
+            </w:r>
+          </w:p>
+        </w:tc>
+        <w:tc>
+          <w:tcPr>
+            <w:tcW w:type="dxa" w:w="2880"/>
+          </w:tcPr>
+          <w:p>
+            <w:pPr>
+              <w:spacing w:after="40"/>
+            </w:pPr>
+            <w:r/>
+            <w:r>
+              <w:rPr>
+                <w:rFonts w:ascii="Calibri" w:hAnsi="Calibri"/>
+                <w:color w:val="404040"/>
+                <w:sz w:val="19"/>
+              </w:rPr>
+              <w:t>der Pole / die Polin</w:t>
+            </w:r>
+          </w:p>
+        </w:tc>
+      </w:tr>
+      <w:tr>
+        <w:tc>
+          <w:tcPr>
+            <w:tcW w:type="dxa" w:w="2880"/>
+          </w:tcPr>
+          <w:p>
+            <w:pPr>
+              <w:spacing w:after="40"/>
+            </w:pPr>
+            <w:r/>
+            <w:r>
+              <w:rPr>
+                <w:rFonts w:ascii="Calibri" w:hAnsi="Calibri"/>
+                <w:color w:val="404040"/>
+                <w:sz w:val="19"/>
+              </w:rPr>
+              <w:t>Frankreich</w:t>
+            </w:r>
+          </w:p>
+        </w:tc>
+        <w:tc>
+          <w:tcPr>
+            <w:tcW w:type="dxa" w:w="2880"/>
+          </w:tcPr>
+          <w:p>
+            <w:pPr>
+              <w:spacing w:after="40"/>
+            </w:pPr>
+            <w:r/>
+            <w:r>
+              <w:rPr>
+                <w:rFonts w:ascii="Calibri" w:hAnsi="Calibri"/>
+                <w:color w:val="404040"/>
+                <w:sz w:val="19"/>
+              </w:rPr>
+              <w:t>Französisch</w:t>
+            </w:r>
+          </w:p>
+        </w:tc>
+        <w:tc>
+          <w:tcPr>
+            <w:tcW w:type="dxa" w:w="2880"/>
+          </w:tcPr>
+          <w:p>
+            <w:pPr>
+              <w:spacing w:after="40"/>
+            </w:pPr>
+            <w:r/>
+            <w:r>
+              <w:rPr>
+                <w:rFonts w:ascii="Calibri" w:hAnsi="Calibri"/>
+                <w:color w:val="404040"/>
+                <w:sz w:val="19"/>
+              </w:rPr>
+              <w:t>der Franzose / die Französin</w:t>
+            </w:r>
+          </w:p>
+        </w:tc>
+      </w:tr>
+      <w:tr>
+        <w:tc>
+          <w:tcPr>
+            <w:tcW w:type="dxa" w:w="2880"/>
+          </w:tcPr>
+          <w:p>
+            <w:pPr>
+              <w:spacing w:after="40"/>
+            </w:pPr>
+            <w:r/>
+            <w:r>
+              <w:rPr>
+                <w:rFonts w:ascii="Calibri" w:hAnsi="Calibri"/>
+                <w:color w:val="404040"/>
+                <w:sz w:val="19"/>
+              </w:rPr>
+              <w:t>Deutschland</w:t>
+            </w:r>
+          </w:p>
+        </w:tc>
+        <w:tc>
+          <w:tcPr>
+            <w:tcW w:type="dxa" w:w="2880"/>
+          </w:tcPr>
+          <w:p>
+            <w:pPr>
+              <w:spacing w:after="40"/>
+            </w:pPr>
+            <w:r/>
+            <w:r>
+              <w:rPr>
+                <w:rFonts w:ascii="Calibri" w:hAnsi="Calibri"/>
+                <w:color w:val="404040"/>
+                <w:sz w:val="19"/>
+              </w:rPr>
+              <w:t>Deutsch</w:t>
+            </w:r>
+          </w:p>
+        </w:tc>
+        <w:tc>
+          <w:tcPr>
+            <w:tcW w:type="dxa" w:w="2880"/>
+          </w:tcPr>
+          <w:p>
+            <w:pPr>
+              <w:spacing w:after="40"/>
+            </w:pPr>
+            <w:r/>
+            <w:r>
+              <w:rPr>
+                <w:rFonts w:ascii="Calibri" w:hAnsi="Calibri"/>
+                <w:color w:val="404040"/>
+                <w:sz w:val="19"/>
+              </w:rPr>
+              <w:t>der Deutsche / die Deutsche</w:t>
+            </w:r>
+          </w:p>
+        </w:tc>
+      </w:tr>
+      <w:tr>
+        <w:tc>
+          <w:tcPr>
+            <w:tcW w:type="dxa" w:w="2880"/>
+          </w:tcPr>
+          <w:p>
+            <w:pPr>
+              <w:spacing w:after="40"/>
+            </w:pPr>
+            <w:r/>
+            <w:r>
+              <w:rPr>
+                <w:rFonts w:ascii="Calibri" w:hAnsi="Calibri"/>
+                <w:color w:val="404040"/>
+                <w:sz w:val="19"/>
+              </w:rPr>
+              <w:t>Spanien</w:t>
+            </w:r>
+          </w:p>
+        </w:tc>
+        <w:tc>
+          <w:tcPr>
+            <w:tcW w:type="dxa" w:w="2880"/>
+          </w:tcPr>
+          <w:p>
+            <w:pPr>
+              <w:spacing w:after="40"/>
+            </w:pPr>
+            <w:r/>
+            <w:r>
+              <w:rPr>
+                <w:rFonts w:ascii="Calibri" w:hAnsi="Calibri"/>
+                <w:color w:val="404040"/>
+                <w:sz w:val="19"/>
+              </w:rPr>
+              <w:t>Spanisch</w:t>
+            </w:r>
+          </w:p>
+        </w:tc>
+        <w:tc>
+          <w:tcPr>
+            <w:tcW w:type="dxa" w:w="2880"/>
+          </w:tcPr>
+          <w:p>
+            <w:pPr>
+              <w:spacing w:after="40"/>
+            </w:pPr>
+            <w:r/>
+            <w:r>
+              <w:rPr>
+                <w:rFonts w:ascii="Calibri" w:hAnsi="Calibri"/>
+                <w:color w:val="404040"/>
+                <w:sz w:val="19"/>
+              </w:rPr>
+              <w:t>der Spanier / die Spanierin</w:t>
+            </w:r>
+          </w:p>
+        </w:tc>
+      </w:tr>
+      <w:tr>
+        <w:tc>
+          <w:tcPr>
+            <w:tcW w:type="dxa" w:w="2880"/>
+          </w:tcPr>
+          <w:p>
+            <w:pPr>
+              <w:spacing w:after="40"/>
+            </w:pPr>
+            <w:r/>
+            <w:r>
+              <w:rPr>
+                <w:rFonts w:ascii="Calibri" w:hAnsi="Calibri"/>
+                <w:color w:val="404040"/>
+                <w:sz w:val="19"/>
+              </w:rPr>
+              <w:t>Japan</w:t>
+            </w:r>
+          </w:p>
+        </w:tc>
+        <w:tc>
+          <w:tcPr>
+            <w:tcW w:type="dxa" w:w="2880"/>
+          </w:tcPr>
+          <w:p>
+            <w:pPr>
+              <w:spacing w:after="40"/>
+            </w:pPr>
+            <w:r/>
+            <w:r>
+              <w:rPr>
+                <w:rFonts w:ascii="Calibri" w:hAnsi="Calibri"/>
+                <w:color w:val="404040"/>
+                <w:sz w:val="19"/>
+              </w:rPr>
+              <w:t>Japanisch</w:t>
+            </w:r>
+          </w:p>
+        </w:tc>
+        <w:tc>
+          <w:tcPr>
+            <w:tcW w:type="dxa" w:w="2880"/>
+          </w:tcPr>
+          <w:p>
+            <w:pPr>
+              <w:spacing w:after="40"/>
+            </w:pPr>
+            <w:r/>
+            <w:r>
+              <w:rPr>
+                <w:rFonts w:ascii="Calibri" w:hAnsi="Calibri"/>
+                <w:color w:val="404040"/>
+                <w:sz w:val="19"/>
+              </w:rPr>
+              <w:t>der Japaner / die Japanerin</w:t>
+            </w:r>
+          </w:p>
+        </w:tc>
+      </w:tr>
+      <w:tr>
+        <w:tc>
+          <w:tcPr>
+            <w:tcW w:type="dxa" w:w="2880"/>
+          </w:tcPr>
+          <w:p>
+            <w:pPr>
+              <w:spacing w:after="40"/>
+            </w:pPr>
+            <w:r/>
+            <w:r>
+              <w:rPr>
+                <w:rFonts w:ascii="Calibri" w:hAnsi="Calibri"/>
+                <w:color w:val="404040"/>
+                <w:sz w:val="19"/>
+              </w:rPr>
+              <w:t>England</w:t>
+            </w:r>
+          </w:p>
+        </w:tc>
+        <w:tc>
+          <w:tcPr>
+            <w:tcW w:type="dxa" w:w="2880"/>
+          </w:tcPr>
+          <w:p>
+            <w:pPr>
+              <w:spacing w:after="40"/>
+            </w:pPr>
+            <w:r/>
+            <w:r>
+              <w:rPr>
+                <w:rFonts w:ascii="Calibri" w:hAnsi="Calibri"/>
+                <w:color w:val="404040"/>
+                <w:sz w:val="19"/>
+              </w:rPr>
+              <w:t>Englisch</w:t>
+            </w:r>
+          </w:p>
+        </w:tc>
+        <w:tc>
+          <w:tcPr>
+            <w:tcW w:type="dxa" w:w="2880"/>
+          </w:tcPr>
+          <w:p>
+            <w:pPr>
+              <w:spacing w:after="40"/>
+            </w:pPr>
+            <w:r/>
+            <w:r>
+              <w:rPr>
+                <w:rFonts w:ascii="Calibri" w:hAnsi="Calibri"/>
+                <w:color w:val="404040"/>
+                <w:sz w:val="19"/>
+              </w:rPr>
+              <w:t>der Engländer / die Engländerin</w:t>
+            </w:r>
+          </w:p>
+        </w:tc>
+      </w:tr>
+      <w:tr>
+        <w:tc>
+          <w:tcPr>
+            <w:tcW w:type="dxa" w:w="2880"/>
+          </w:tcPr>
+          <w:p>
+            <w:pPr>
+              <w:spacing w:after="40"/>
+            </w:pPr>
+            <w:r/>
+            <w:r>
+              <w:rPr>
+                <w:rFonts w:ascii="Calibri" w:hAnsi="Calibri"/>
+                <w:color w:val="404040"/>
+                <w:sz w:val="19"/>
+              </w:rPr>
+              <w:t>China</w:t>
+            </w:r>
+          </w:p>
+        </w:tc>
+        <w:tc>
+          <w:tcPr>
+            <w:tcW w:type="dxa" w:w="2880"/>
+          </w:tcPr>
+          <w:p>
+            <w:pPr>
+              <w:spacing w:after="40"/>
+            </w:pPr>
+            <w:r/>
+            <w:r>
+              <w:rPr>
+                <w:rFonts w:ascii="Calibri" w:hAnsi="Calibri"/>
+                <w:color w:val="404040"/>
+                <w:sz w:val="19"/>
+              </w:rPr>
+              <w:t>Chinesisch</w:t>
+            </w:r>
+          </w:p>
+        </w:tc>
+        <w:tc>
+          <w:tcPr>
+            <w:tcW w:type="dxa" w:w="2880"/>
+          </w:tcPr>
+          <w:p>
+            <w:pPr>
+              <w:spacing w:after="40"/>
+            </w:pPr>
+            <w:r/>
+            <w:r>
+              <w:rPr>
+                <w:rFonts w:ascii="Calibri" w:hAnsi="Calibri"/>
+                <w:color w:val="404040"/>
+                <w:sz w:val="19"/>
+              </w:rPr>
+              <w:t>der Chinese / die Chinesin</w:t>
+            </w:r>
+          </w:p>
+        </w:tc>
+      </w:tr>
+      <w:tr>
+        <w:tc>
+          <w:tcPr>
+            <w:tcW w:type="dxa" w:w="2880"/>
+          </w:tcPr>
+          <w:p>
+            <w:pPr>
+              <w:spacing w:after="40"/>
+            </w:pPr>
+            <w:r/>
+            <w:r>
+              <w:rPr>
+                <w:rFonts w:ascii="Calibri" w:hAnsi="Calibri"/>
+                <w:color w:val="404040"/>
+                <w:sz w:val="19"/>
+              </w:rPr>
+              <w:t>die Türkei</w:t>
+            </w:r>
+          </w:p>
+        </w:tc>
+        <w:tc>
+          <w:tcPr>
+            <w:tcW w:type="dxa" w:w="2880"/>
+          </w:tcPr>
+          <w:p>
+            <w:pPr>
+              <w:spacing w:after="40"/>
+            </w:pPr>
+            <w:r/>
+            <w:r>
+              <w:rPr>
+                <w:rFonts w:ascii="Calibri" w:hAnsi="Calibri"/>
+                <w:color w:val="404040"/>
+                <w:sz w:val="19"/>
+              </w:rPr>
+              <w:t>Türkisch</w:t>
+            </w:r>
+          </w:p>
+        </w:tc>
+        <w:tc>
+          <w:tcPr>
+            <w:tcW w:type="dxa" w:w="2880"/>
+          </w:tcPr>
+          <w:p>
+            <w:pPr>
+              <w:spacing w:after="40"/>
+            </w:pPr>
+            <w:r/>
+            <w:r>
+              <w:rPr>
+                <w:rFonts w:ascii="Calibri" w:hAnsi="Calibri"/>
+                <w:color w:val="404040"/>
+                <w:sz w:val="19"/>
+              </w:rPr>
+              <w:t>der Türke / die Türkin</w:t>
+            </w:r>
+          </w:p>
+        </w:tc>
+      </w:tr>
+    </w:tbl>
+    <w:p>
+      <w:pPr>
+        <w:spacing w:before="40" w:after="120"/>
+      </w:pPr>
+    </w:p>
+    <w:p>
+      <w:pPr>
+        <w:spacing w:before="40" w:after="60"/>
+        <w:ind w:left="576"/>
+      </w:pPr>
+      <w:r>
+        <w:rPr>
+          <w:i/>
+          <w:color w:val="30608C"/>
+          <w:sz w:val="21"/>
+        </w:rPr>
+        <w:t xml:space="preserve">› </w:t>
+      </w:r>
+      <w:r>
+        <w:rPr>
+          <w:i/>
+          <w:color w:val="30608C"/>
+          <w:sz w:val="21"/>
+        </w:rPr>
+        <w:t>Sie kommt aus Frankreich und spricht Französisch.</w:t>
+      </w:r>
+      <w:r>
+        <w:rPr>
+          <w:i/>
+          <w:color w:val="404040"/>
+          <w:sz w:val="21"/>
+        </w:rPr>
+        <w:t xml:space="preserve"> (She comes from France and speaks French.)</w:t>
+      </w:r>
+    </w:p>
+    <w:p>
+      <w:pPr>
+        <w:spacing w:before="0" w:after="60"/>
+        <w:ind w:left="576"/>
+      </w:pPr>
+      <w:r>
+        <w:rPr>
+          <w:i/>
+          <w:color w:val="30608C"/>
+          <w:sz w:val="21"/>
+        </w:rPr>
+        <w:t xml:space="preserve">› </w:t>
+      </w:r>
+      <w:r>
+        <w:rPr>
+          <w:i/>
+          <w:color w:val="30608C"/>
+          <w:sz w:val="21"/>
+        </w:rPr>
+        <w:t>Er ist Schweizer, sie ist Schweizerin.</w:t>
+      </w:r>
+      <w:r>
+        <w:rPr>
+          <w:i/>
+          <w:color w:val="404040"/>
+          <w:sz w:val="21"/>
+        </w:rPr>
+        <w:t xml:space="preserve"> (He is Swiss; she is Swiss.)</w:t>
+      </w:r>
+    </w:p>
+    <w:p>
+      <w:pPr>
+        <w:spacing w:before="0" w:after="120"/>
+        <w:ind w:left="576"/>
+      </w:pPr>
+      <w:r>
+        <w:rPr>
+          <w:i/>
+          <w:color w:val="30608C"/>
+          <w:sz w:val="21"/>
+        </w:rPr>
+        <w:t xml:space="preserve">› </w:t>
+      </w:r>
+      <w:r>
+        <w:rPr>
+          <w:i/>
+          <w:color w:val="30608C"/>
+          <w:sz w:val="21"/>
+        </w:rPr>
+        <w:t>Er ist Spanier, sie ist Spanierin.</w:t>
+      </w:r>
+      <w:r>
+        <w:rPr>
+          <w:i/>
+          <w:color w:val="404040"/>
+          <w:sz w:val="21"/>
+        </w:rPr>
+        <w:t xml:space="preserve"> (He is Spanish; she is Spanish.)</w:t>
+      </w:r>
+    </w:p>
+    <w:p>
+      <w:pPr>
+        <w:spacing w:before="0" w:after="0"/>
+      </w:pPr>
     </w:p>
     <w:p>
       <w:pPr>

</xml_diff>

<commit_message>
Add new vocabulary entries for "ergänzen," "die Regel," "schreiben," and "der Satz" in vocab.docx and vocab.manifest.json
- Introduced detailed entries for each term, including glosses, notes, and examples in both German and English.
- All entries are categorized under lesson 1 and level A1 for language learners, enhancing the vocabulary resource with practical usage and common phrases.
</commit_message>
<xml_diff>
--- a/vocab.docx
+++ b/vocab.docx
@@ -13,6 +13,586 @@
         </w:rPr>
         <w:t>daf — vocabulary</w:t>
       </w:r>
+    </w:p>
+    <w:p>
+      <w:pPr>
+        <w:spacing w:after="120"/>
+      </w:pPr>
+      <w:r>
+        <w:rPr>
+          <w:b/>
+        </w:rPr>
+        <w:t>ergänzen</w:t>
+      </w:r>
+      <w:r>
+        <w:t xml:space="preserve"> /ˈʔɛʁɡɛntsən/</w:t>
+      </w:r>
+    </w:p>
+    <w:p>
+      <w:pPr>
+        <w:spacing w:after="80"/>
+        <w:ind w:left="576"/>
+      </w:pPr>
+      <w:r>
+        <w:t>To complete; fill in; add what is missing.</w:t>
+      </w:r>
+    </w:p>
+    <w:p>
+      <w:pPr>
+        <w:spacing w:after="80"/>
+        <w:ind w:left="576"/>
+      </w:pPr>
+      <w:r>
+        <w:rPr>
+          <w:i/>
+          <w:color w:val="404040"/>
+          <w:sz w:val="20"/>
+        </w:rPr>
+        <w:t>• Correct spelling: ergänzen with ä; Erganzen is usually OCR/typing without the umlaut.</w:t>
+      </w:r>
+    </w:p>
+    <w:p>
+      <w:pPr>
+        <w:spacing w:after="80"/>
+        <w:ind w:left="576"/>
+      </w:pPr>
+      <w:r>
+        <w:rPr>
+          <w:i/>
+          <w:color w:val="404040"/>
+          <w:sz w:val="20"/>
+        </w:rPr>
+        <w:t>• Formal command: Ergänzen Sie ... = Complete ... / Fill in ...; verb first, Sie capitalized.</w:t>
+      </w:r>
+    </w:p>
+    <w:p>
+      <w:pPr>
+        <w:spacing w:before="40" w:after="60"/>
+        <w:ind w:left="576"/>
+      </w:pPr>
+      <w:r>
+        <w:rPr>
+          <w:i/>
+          <w:color w:val="30608C"/>
+          <w:sz w:val="21"/>
+        </w:rPr>
+        <w:t xml:space="preserve">› </w:t>
+      </w:r>
+      <w:r>
+        <w:rPr>
+          <w:i/>
+          <w:color w:val="30608C"/>
+          <w:sz w:val="21"/>
+        </w:rPr>
+        <w:t>Ergänzen Sie die Regeln.</w:t>
+      </w:r>
+      <w:r>
+        <w:rPr>
+          <w:i/>
+          <w:color w:val="404040"/>
+          <w:sz w:val="21"/>
+        </w:rPr>
+        <w:t xml:space="preserve"> (Complete the rules. [formal you])</w:t>
+      </w:r>
+    </w:p>
+    <w:p>
+      <w:pPr>
+        <w:spacing w:before="0" w:after="60"/>
+        <w:ind w:left="576"/>
+      </w:pPr>
+      <w:r>
+        <w:rPr>
+          <w:i/>
+          <w:color w:val="30608C"/>
+          <w:sz w:val="21"/>
+        </w:rPr>
+        <w:t xml:space="preserve">› </w:t>
+      </w:r>
+      <w:r>
+        <w:rPr>
+          <w:i/>
+          <w:color w:val="30608C"/>
+          <w:sz w:val="21"/>
+        </w:rPr>
+        <w:t>Ergänzen Sie die Lücken mit den passenden Wörtern.</w:t>
+      </w:r>
+      <w:r>
+        <w:rPr>
+          <w:i/>
+          <w:color w:val="404040"/>
+          <w:sz w:val="21"/>
+        </w:rPr>
+        <w:t xml:space="preserve"> (Fill in the gaps with suitable words.)</w:t>
+      </w:r>
+    </w:p>
+    <w:p>
+      <w:pPr>
+        <w:spacing w:before="0" w:after="120"/>
+        <w:ind w:left="576"/>
+      </w:pPr>
+      <w:r>
+        <w:rPr>
+          <w:i/>
+          <w:color w:val="30608C"/>
+          <w:sz w:val="21"/>
+        </w:rPr>
+        <w:t xml:space="preserve">› </w:t>
+      </w:r>
+      <w:r>
+        <w:rPr>
+          <w:i/>
+          <w:color w:val="30608C"/>
+          <w:sz w:val="21"/>
+        </w:rPr>
+        <w:t>Lesen Sie das Gespräch und ergänzen Sie.</w:t>
+      </w:r>
+      <w:r>
+        <w:rPr>
+          <w:i/>
+          <w:color w:val="404040"/>
+          <w:sz w:val="21"/>
+        </w:rPr>
+        <w:t xml:space="preserve"> (Read the dialogue and fill in what is missing.)</w:t>
+      </w:r>
+    </w:p>
+    <w:p>
+      <w:pPr>
+        <w:spacing w:before="0" w:after="0"/>
+      </w:pPr>
+    </w:p>
+    <w:p>
+      <w:pPr>
+        <w:spacing w:after="120"/>
+      </w:pPr>
+      <w:r>
+        <w:rPr>
+          <w:b/>
+        </w:rPr>
+        <w:t>die Regel</w:t>
+      </w:r>
+      <w:r>
+        <w:t xml:space="preserve"> /ˈʁeːɡl̩/</w:t>
+      </w:r>
+    </w:p>
+    <w:p>
+      <w:pPr>
+        <w:spacing w:after="80"/>
+        <w:ind w:left="576"/>
+      </w:pPr>
+      <w:r>
+        <w:rPr>
+          <w:sz w:val="22"/>
+        </w:rPr>
+        <w:t>die Regel, -n</w:t>
+      </w:r>
+    </w:p>
+    <w:p>
+      <w:pPr>
+        <w:spacing w:after="80"/>
+        <w:ind w:left="576"/>
+      </w:pPr>
+      <w:r>
+        <w:t>Rule.</w:t>
+      </w:r>
+    </w:p>
+    <w:p>
+      <w:pPr>
+        <w:spacing w:after="80"/>
+        <w:ind w:left="576"/>
+      </w:pPr>
+      <w:r>
+        <w:rPr>
+          <w:i/>
+          <w:color w:val="404040"/>
+          <w:sz w:val="20"/>
+        </w:rPr>
+        <w:t>• die Regeln is plural accusative here: the rules being completed.</w:t>
+      </w:r>
+    </w:p>
+    <w:p>
+      <w:pPr>
+        <w:spacing w:before="40" w:after="60"/>
+        <w:ind w:left="576"/>
+      </w:pPr>
+      <w:r>
+        <w:rPr>
+          <w:i/>
+          <w:color w:val="30608C"/>
+          <w:sz w:val="21"/>
+        </w:rPr>
+        <w:t xml:space="preserve">› </w:t>
+      </w:r>
+      <w:r>
+        <w:rPr>
+          <w:i/>
+          <w:color w:val="30608C"/>
+          <w:sz w:val="21"/>
+        </w:rPr>
+        <w:t>Ergänzen Sie die Regeln.</w:t>
+      </w:r>
+      <w:r>
+        <w:rPr>
+          <w:i/>
+          <w:color w:val="404040"/>
+          <w:sz w:val="21"/>
+        </w:rPr>
+        <w:t xml:space="preserve"> (Complete the rules.)</w:t>
+      </w:r>
+    </w:p>
+    <w:p>
+      <w:pPr>
+        <w:spacing w:before="0" w:after="60"/>
+        <w:ind w:left="576"/>
+      </w:pPr>
+      <w:r>
+        <w:rPr>
+          <w:i/>
+          <w:color w:val="30608C"/>
+          <w:sz w:val="21"/>
+        </w:rPr>
+        <w:t xml:space="preserve">› </w:t>
+      </w:r>
+      <w:r>
+        <w:rPr>
+          <w:i/>
+          <w:color w:val="30608C"/>
+          <w:sz w:val="21"/>
+        </w:rPr>
+        <w:t>Die Regel ist einfach.</w:t>
+      </w:r>
+      <w:r>
+        <w:rPr>
+          <w:i/>
+          <w:color w:val="404040"/>
+          <w:sz w:val="21"/>
+        </w:rPr>
+        <w:t xml:space="preserve"> (The rule is simple.)</w:t>
+      </w:r>
+    </w:p>
+    <w:p>
+      <w:pPr>
+        <w:spacing w:before="0" w:after="120"/>
+        <w:ind w:left="576"/>
+      </w:pPr>
+      <w:r>
+        <w:rPr>
+          <w:i/>
+          <w:color w:val="30608C"/>
+          <w:sz w:val="21"/>
+        </w:rPr>
+        <w:t xml:space="preserve">› </w:t>
+      </w:r>
+      <w:r>
+        <w:rPr>
+          <w:i/>
+          <w:color w:val="30608C"/>
+          <w:sz w:val="21"/>
+        </w:rPr>
+        <w:t>Lesen Sie die Regeln.</w:t>
+      </w:r>
+      <w:r>
+        <w:rPr>
+          <w:i/>
+          <w:color w:val="404040"/>
+          <w:sz w:val="21"/>
+        </w:rPr>
+        <w:t xml:space="preserve"> (Read the rules. [formal you])</w:t>
+      </w:r>
+    </w:p>
+    <w:p>
+      <w:pPr>
+        <w:spacing w:before="0" w:after="0"/>
+      </w:pPr>
+    </w:p>
+    <w:p>
+      <w:pPr>
+        <w:spacing w:after="120"/>
+      </w:pPr>
+      <w:r>
+        <w:rPr>
+          <w:b/>
+        </w:rPr>
+        <w:t>schreiben</w:t>
+      </w:r>
+      <w:r>
+        <w:t xml:space="preserve"> /ˈʃʁaɪ̯bən/</w:t>
+      </w:r>
+    </w:p>
+    <w:p>
+      <w:pPr>
+        <w:spacing w:after="80"/>
+        <w:ind w:left="576"/>
+      </w:pPr>
+      <w:r>
+        <w:t>To write.</w:t>
+      </w:r>
+    </w:p>
+    <w:p>
+      <w:pPr>
+        <w:spacing w:after="80"/>
+        <w:ind w:left="576"/>
+      </w:pPr>
+      <w:r>
+        <w:rPr>
+          <w:i/>
+          <w:color w:val="404040"/>
+          <w:sz w:val="20"/>
+        </w:rPr>
+        <w:t>• Formal command: Schreiben Sie ... = Write ...; verb first, Sie capitalized.</w:t>
+      </w:r>
+    </w:p>
+    <w:p>
+      <w:pPr>
+        <w:spacing w:before="40" w:after="60"/>
+        <w:ind w:left="576"/>
+      </w:pPr>
+      <w:r>
+        <w:rPr>
+          <w:i/>
+          <w:color w:val="30608C"/>
+          <w:sz w:val="21"/>
+        </w:rPr>
+        <w:t xml:space="preserve">› </w:t>
+      </w:r>
+      <w:r>
+        <w:rPr>
+          <w:i/>
+          <w:color w:val="30608C"/>
+          <w:sz w:val="21"/>
+        </w:rPr>
+        <w:t>Schreiben Sie die Sätze.</w:t>
+      </w:r>
+      <w:r>
+        <w:rPr>
+          <w:i/>
+          <w:color w:val="404040"/>
+          <w:sz w:val="21"/>
+        </w:rPr>
+        <w:t xml:space="preserve"> (Write the sentences. [formal you])</w:t>
+      </w:r>
+    </w:p>
+    <w:p>
+      <w:pPr>
+        <w:spacing w:before="0" w:after="60"/>
+        <w:ind w:left="576"/>
+      </w:pPr>
+      <w:r>
+        <w:rPr>
+          <w:i/>
+          <w:color w:val="30608C"/>
+          <w:sz w:val="21"/>
+        </w:rPr>
+        <w:t xml:space="preserve">› </w:t>
+      </w:r>
+      <w:r>
+        <w:rPr>
+          <w:i/>
+          <w:color w:val="30608C"/>
+          <w:sz w:val="21"/>
+        </w:rPr>
+        <w:t>Ich schreibe die Antwort.</w:t>
+      </w:r>
+      <w:r>
+        <w:rPr>
+          <w:i/>
+          <w:color w:val="404040"/>
+          <w:sz w:val="21"/>
+        </w:rPr>
+        <w:t xml:space="preserve"> (I write the answer.)</w:t>
+      </w:r>
+    </w:p>
+    <w:p>
+      <w:pPr>
+        <w:spacing w:before="0" w:after="120"/>
+        <w:ind w:left="576"/>
+      </w:pPr>
+      <w:r>
+        <w:rPr>
+          <w:i/>
+          <w:color w:val="30608C"/>
+          <w:sz w:val="21"/>
+        </w:rPr>
+        <w:t xml:space="preserve">› </w:t>
+      </w:r>
+      <w:r>
+        <w:rPr>
+          <w:i/>
+          <w:color w:val="30608C"/>
+          <w:sz w:val="21"/>
+        </w:rPr>
+        <w:t>Schreiben Sie das in die Tabelle.</w:t>
+      </w:r>
+      <w:r>
+        <w:rPr>
+          <w:i/>
+          <w:color w:val="404040"/>
+          <w:sz w:val="21"/>
+        </w:rPr>
+        <w:t xml:space="preserve"> (Write that in the table. [formal you])</w:t>
+      </w:r>
+    </w:p>
+    <w:p>
+      <w:pPr>
+        <w:spacing w:before="0" w:after="0"/>
+      </w:pPr>
+    </w:p>
+    <w:p>
+      <w:pPr>
+        <w:spacing w:after="120"/>
+      </w:pPr>
+      <w:r>
+        <w:rPr>
+          <w:b/>
+        </w:rPr>
+        <w:t>der Satz</w:t>
+      </w:r>
+      <w:r>
+        <w:t xml:space="preserve"> /zats/</w:t>
+      </w:r>
+    </w:p>
+    <w:p>
+      <w:pPr>
+        <w:spacing w:after="80"/>
+        <w:ind w:left="576"/>
+      </w:pPr>
+      <w:r>
+        <w:rPr>
+          <w:sz w:val="22"/>
+        </w:rPr>
+        <w:t>der Satz, -ätze</w:t>
+      </w:r>
+    </w:p>
+    <w:p>
+      <w:pPr>
+        <w:spacing w:after="80"/>
+        <w:ind w:left="576"/>
+      </w:pPr>
+      <w:r>
+        <w:t>Sentence.</w:t>
+      </w:r>
+    </w:p>
+    <w:p>
+      <w:pPr>
+        <w:spacing w:after="80"/>
+        <w:ind w:left="576"/>
+      </w:pPr>
+      <w:r>
+        <w:rPr>
+          <w:i/>
+          <w:color w:val="404040"/>
+          <w:sz w:val="20"/>
+        </w:rPr>
+        <w:t>• die Sätze is plural accusative here: the sentences being written.</w:t>
+      </w:r>
+    </w:p>
+    <w:p>
+      <w:pPr>
+        <w:spacing w:after="80"/>
+        <w:ind w:left="576"/>
+      </w:pPr>
+      <w:r>
+        <w:rPr>
+          <w:i/>
+          <w:color w:val="404040"/>
+          <w:sz w:val="20"/>
+        </w:rPr>
+        <w:t>• Correct spelling: Sätze with ä, not Satze.</w:t>
+      </w:r>
+    </w:p>
+    <w:p>
+      <w:pPr>
+        <w:spacing w:before="40" w:after="60"/>
+        <w:ind w:left="576"/>
+      </w:pPr>
+      <w:r>
+        <w:rPr>
+          <w:i/>
+          <w:color w:val="30608C"/>
+          <w:sz w:val="21"/>
+        </w:rPr>
+        <w:t xml:space="preserve">› </w:t>
+      </w:r>
+      <w:r>
+        <w:rPr>
+          <w:i/>
+          <w:color w:val="30608C"/>
+          <w:sz w:val="21"/>
+        </w:rPr>
+        <w:t>Schreiben Sie die Sätze.</w:t>
+      </w:r>
+      <w:r>
+        <w:rPr>
+          <w:i/>
+          <w:color w:val="404040"/>
+          <w:sz w:val="21"/>
+        </w:rPr>
+        <w:t xml:space="preserve"> (Write the sentences.)</w:t>
+      </w:r>
+    </w:p>
+    <w:p>
+      <w:pPr>
+        <w:spacing w:before="0" w:after="60"/>
+        <w:ind w:left="576"/>
+      </w:pPr>
+      <w:r>
+        <w:rPr>
+          <w:i/>
+          <w:color w:val="30608C"/>
+          <w:sz w:val="21"/>
+        </w:rPr>
+        <w:t xml:space="preserve">› </w:t>
+      </w:r>
+      <w:r>
+        <w:rPr>
+          <w:i/>
+          <w:color w:val="30608C"/>
+          <w:sz w:val="21"/>
+        </w:rPr>
+        <w:t>Der Satz ist kurz.</w:t>
+      </w:r>
+      <w:r>
+        <w:rPr>
+          <w:i/>
+          <w:color w:val="404040"/>
+          <w:sz w:val="21"/>
+        </w:rPr>
+        <w:t xml:space="preserve"> (The sentence is short.)</w:t>
+      </w:r>
+    </w:p>
+    <w:p>
+      <w:pPr>
+        <w:spacing w:before="0" w:after="120"/>
+        <w:ind w:left="576"/>
+      </w:pPr>
+      <w:r>
+        <w:rPr>
+          <w:i/>
+          <w:color w:val="30608C"/>
+          <w:sz w:val="21"/>
+        </w:rPr>
+        <w:t xml:space="preserve">› </w:t>
+      </w:r>
+      <w:r>
+        <w:rPr>
+          <w:i/>
+          <w:color w:val="30608C"/>
+          <w:sz w:val="21"/>
+        </w:rPr>
+        <w:t>Lesen Sie die Sätze noch einmal.</w:t>
+      </w:r>
+      <w:r>
+        <w:rPr>
+          <w:i/>
+          <w:color w:val="404040"/>
+          <w:sz w:val="21"/>
+        </w:rPr>
+        <w:t xml:space="preserve"> (Read the sentences one more time. [formal you])</w:t>
+      </w:r>
+    </w:p>
+    <w:p>
+      <w:pPr>
+        <w:spacing w:before="0" w:after="0"/>
+      </w:pPr>
     </w:p>
     <w:p>
       <w:pPr>
@@ -8623,94 +9203,6 @@
           <w:sz w:val="21"/>
         </w:rPr>
         <w:t xml:space="preserve"> (Hello, Ms. Schmid!)</w:t>
-      </w:r>
-    </w:p>
-    <w:p>
-      <w:pPr>
-        <w:spacing w:before="0" w:after="0"/>
-      </w:pPr>
-    </w:p>
-    <w:p>
-      <w:pPr>
-        <w:spacing w:after="120"/>
-      </w:pPr>
-      <w:r>
-        <w:rPr>
-          <w:b/>
-        </w:rPr>
-        <w:t>ergänzen</w:t>
-      </w:r>
-      <w:r>
-        <w:t xml:space="preserve"> /ˈʔɛʁɡɛntsən/</w:t>
-      </w:r>
-    </w:p>
-    <w:p>
-      <w:pPr>
-        <w:spacing w:after="80"/>
-        <w:ind w:left="576"/>
-      </w:pPr>
-      <w:r>
-        <w:t>To complete / fill in blanks.</w:t>
-      </w:r>
-    </w:p>
-    <w:p>
-      <w:pPr>
-        <w:spacing w:before="40" w:after="60"/>
-        <w:ind w:left="576"/>
-      </w:pPr>
-      <w:r>
-        <w:rPr>
-          <w:i/>
-          <w:color w:val="30608C"/>
-          <w:sz w:val="21"/>
-        </w:rPr>
-        <w:t xml:space="preserve">› </w:t>
-      </w:r>
-      <w:r>
-        <w:rPr>
-          <w:i/>
-          <w:color w:val="30608C"/>
-          <w:sz w:val="21"/>
-        </w:rPr>
-        <w:t>Lesen Sie das Gespräch und ergänzen Sie.</w:t>
-      </w:r>
-      <w:r>
-        <w:rPr>
-          <w:i/>
-          <w:color w:val="404040"/>
-          <w:sz w:val="21"/>
-        </w:rPr>
-        <w:t xml:space="preserve"> (Read the dialogue, then supply the missing parts / fill everything in.)</w:t>
-      </w:r>
-    </w:p>
-    <w:p>
-      <w:pPr>
-        <w:spacing w:before="0" w:after="120"/>
-        <w:ind w:left="576"/>
-      </w:pPr>
-      <w:r>
-        <w:rPr>
-          <w:i/>
-          <w:color w:val="30608C"/>
-          <w:sz w:val="21"/>
-        </w:rPr>
-        <w:t xml:space="preserve">› </w:t>
-      </w:r>
-      <w:r>
-        <w:rPr>
-          <w:i/>
-          <w:color w:val="30608C"/>
-          <w:sz w:val="21"/>
-        </w:rPr>
-        <w:t>Ergänzen Sie die Lücken mit den passenden Wörtern.</w:t>
-      </w:r>
-      <w:r>
-        <w:rPr>
-          <w:i/>
-          <w:color w:val="404040"/>
-          <w:sz w:val="21"/>
-        </w:rPr>
-        <w:t xml:space="preserve"> (Fill in the gaps with suitable words.)</w:t>
       </w:r>
     </w:p>
     <w:p>

</xml_diff>

<commit_message>
Update vocabulary entries by adding "stehen" in vocab.docx and vocab.manifest.json
- Introduced a detailed entry for "stehen," including gloss, notes, and examples in both German and English.
- The entry is categorized under lesson 1 and level A1 for language learners, enhancing the vocabulary resource with practical usage and common phrases.
</commit_message>
<xml_diff>
--- a/vocab.docx
+++ b/vocab.docx
@@ -22,10 +22,10 @@
         <w:rPr>
           <w:b/>
         </w:rPr>
-        <w:t>ergänzen</w:t>
-      </w:r>
-      <w:r>
-        <w:t xml:space="preserve"> /ˈʔɛʁɡɛntsən/</w:t>
+        <w:t>stehen</w:t>
+      </w:r>
+      <w:r>
+        <w:t xml:space="preserve"> /ˈʃteːən/</w:t>
       </w:r>
     </w:p>
     <w:p>
@@ -34,7 +34,7 @@
         <w:ind w:left="576"/>
       </w:pPr>
       <w:r>
-        <w:t>To complete; fill in; add what is missing.</w:t>
+        <w:t>To stand; be located or positioned.</w:t>
       </w:r>
     </w:p>
     <w:p>
@@ -48,7 +48,7 @@
           <w:color w:val="404040"/>
           <w:sz w:val="20"/>
         </w:rPr>
-        <w:t>• Correct spelling: ergänzen with ä; Erganzen is usually OCR/typing without the umlaut.</w:t>
+        <w:t>• In word-order rules, stehen means a word “stands” or “goes” in a certain sentence position.</w:t>
       </w:r>
     </w:p>
     <w:p>
@@ -62,7 +62,7 @@
           <w:color w:val="404040"/>
           <w:sz w:val="20"/>
         </w:rPr>
-        <w:t>• Formal command: Ergänzen Sie ... = Complete ... / Fill in ...; verb first, Sie capitalized.</w:t>
+        <w:t>• Das Verb steht auf Position 1 means the verb comes first; Position 2 means it comes second.</w:t>
       </w:r>
     </w:p>
     <w:p>
@@ -84,7 +84,7 @@
           <w:color w:val="30608C"/>
           <w:sz w:val="21"/>
         </w:rPr>
-        <w:t>Ergänzen Sie die Regeln.</w:t>
+        <w:t>In Ja-/Nein-Fragen steht das Verb auf Position 1.</w:t>
       </w:r>
       <w:r>
         <w:rPr>
@@ -92,7 +92,7 @@
           <w:color w:val="404040"/>
           <w:sz w:val="21"/>
         </w:rPr>
-        <w:t xml:space="preserve"> (Complete the rules. [formal you])</w:t>
+        <w:t xml:space="preserve"> (In yes/no questions, the verb comes first.)</w:t>
       </w:r>
     </w:p>
     <w:p>
@@ -114,7 +114,7 @@
           <w:color w:val="30608C"/>
           <w:sz w:val="21"/>
         </w:rPr>
-        <w:t>Ergänzen Sie die Lücken mit den passenden Wörtern.</w:t>
+        <w:t>In Antworten und W-Fragen steht das Verb auf Position 2.</w:t>
       </w:r>
       <w:r>
         <w:rPr>
@@ -122,7 +122,7 @@
           <w:color w:val="404040"/>
           <w:sz w:val="21"/>
         </w:rPr>
-        <w:t xml:space="preserve"> (Fill in the gaps with suitable words.)</w:t>
+        <w:t xml:space="preserve"> (In answers and W-questions, the verb comes second.)</w:t>
       </w:r>
     </w:p>
     <w:p>
@@ -144,7 +144,7 @@
           <w:color w:val="30608C"/>
           <w:sz w:val="21"/>
         </w:rPr>
-        <w:t>Lesen Sie das Gespräch und ergänzen Sie.</w:t>
+        <w:t>Ein neues Auto steht da.</w:t>
       </w:r>
       <w:r>
         <w:rPr>
@@ -152,7 +152,7 @@
           <w:color w:val="404040"/>
           <w:sz w:val="21"/>
         </w:rPr>
-        <w:t xml:space="preserve"> (Read the dialogue and fill in what is missing.)</w:t>
+        <w:t xml:space="preserve"> (A new car is parked there.)</w:t>
       </w:r>
     </w:p>
     <w:p>

</xml_diff>

<commit_message>
Add new vocabulary entries for "gern," "wiederholen," and "wieder" in vocab.docx and vocab.manifest.json
- Introduced detailed entries for each term, including glosses, notes, and examples in both German and English.
- All entries are categorized under lesson 1 and level A1 for language learners, enhancing the vocabulary resource with practical usage and common phrases.
</commit_message>
<xml_diff>
--- a/vocab.docx
+++ b/vocab.docx
@@ -13,6 +13,492 @@
         </w:rPr>
         <w:t>daf — vocabulary</w:t>
       </w:r>
+    </w:p>
+    <w:p>
+      <w:pPr>
+        <w:spacing w:after="120"/>
+      </w:pPr>
+      <w:r>
+        <w:rPr>
+          <w:b/>
+        </w:rPr>
+        <w:t>gern</w:t>
+      </w:r>
+      <w:r>
+        <w:t xml:space="preserve"> /ɡɛʁn/</w:t>
+      </w:r>
+    </w:p>
+    <w:p>
+      <w:pPr>
+        <w:spacing w:after="80"/>
+        <w:ind w:left="576"/>
+      </w:pPr>
+      <w:r>
+        <w:t>Gladly; like to do something.</w:t>
+      </w:r>
+    </w:p>
+    <w:p>
+      <w:pPr>
+        <w:spacing w:after="80"/>
+        <w:ind w:left="576"/>
+      </w:pPr>
+      <w:r>
+        <w:rPr>
+          <w:i/>
+          <w:color w:val="404040"/>
+          <w:sz w:val="20"/>
+        </w:rPr>
+        <w:t>• gern and gerne mean the same thing; gerne sounds a little fuller/softer.</w:t>
+      </w:r>
+    </w:p>
+    <w:p>
+      <w:pPr>
+        <w:spacing w:after="80"/>
+        <w:ind w:left="576"/>
+      </w:pPr>
+      <w:r>
+        <w:rPr>
+          <w:i/>
+          <w:color w:val="404040"/>
+          <w:sz w:val="20"/>
+        </w:rPr>
+        <w:t>• With a verb, gern often translates naturally as like to: Ich lerne gern = I like learning.</w:t>
+      </w:r>
+    </w:p>
+    <w:p>
+      <w:pPr>
+        <w:spacing w:before="40" w:after="60"/>
+        <w:ind w:left="576"/>
+      </w:pPr>
+      <w:r>
+        <w:rPr>
+          <w:i/>
+          <w:color w:val="30608C"/>
+          <w:sz w:val="21"/>
+        </w:rPr>
+        <w:t xml:space="preserve">› </w:t>
+      </w:r>
+      <w:r>
+        <w:rPr>
+          <w:i/>
+          <w:color w:val="30608C"/>
+          <w:sz w:val="21"/>
+        </w:rPr>
+        <w:t>Ich lerne gern Deutsch.</w:t>
+      </w:r>
+      <w:r>
+        <w:rPr>
+          <w:i/>
+          <w:color w:val="404040"/>
+          <w:sz w:val="21"/>
+        </w:rPr>
+        <w:t xml:space="preserve"> (I like learning German.)</w:t>
+      </w:r>
+    </w:p>
+    <w:p>
+      <w:pPr>
+        <w:spacing w:before="0" w:after="60"/>
+        <w:ind w:left="576"/>
+      </w:pPr>
+      <w:r>
+        <w:rPr>
+          <w:i/>
+          <w:color w:val="30608C"/>
+          <w:sz w:val="21"/>
+        </w:rPr>
+        <w:t xml:space="preserve">› </w:t>
+      </w:r>
+      <w:r>
+        <w:rPr>
+          <w:i/>
+          <w:color w:val="30608C"/>
+          <w:sz w:val="21"/>
+        </w:rPr>
+        <w:t>Ich trinke gern Kaffee.</w:t>
+      </w:r>
+      <w:r>
+        <w:rPr>
+          <w:i/>
+          <w:color w:val="404040"/>
+          <w:sz w:val="21"/>
+        </w:rPr>
+        <w:t xml:space="preserve"> (I like drinking coffee.)</w:t>
+      </w:r>
+    </w:p>
+    <w:p>
+      <w:pPr>
+        <w:spacing w:before="0" w:after="60"/>
+        <w:ind w:left="576"/>
+      </w:pPr>
+      <w:r>
+        <w:rPr>
+          <w:i/>
+          <w:color w:val="30608C"/>
+          <w:sz w:val="21"/>
+        </w:rPr>
+        <w:t xml:space="preserve">› </w:t>
+      </w:r>
+      <w:r>
+        <w:rPr>
+          <w:i/>
+          <w:color w:val="30608C"/>
+          <w:sz w:val="21"/>
+        </w:rPr>
+        <w:t>Kommst du gern hierher?</w:t>
+      </w:r>
+      <w:r>
+        <w:rPr>
+          <w:i/>
+          <w:color w:val="404040"/>
+          <w:sz w:val="21"/>
+        </w:rPr>
+        <w:t xml:space="preserve"> (Do you like coming here?)</w:t>
+      </w:r>
+    </w:p>
+    <w:p>
+      <w:pPr>
+        <w:spacing w:before="0" w:after="120"/>
+        <w:ind w:left="576"/>
+      </w:pPr>
+      <w:r>
+        <w:rPr>
+          <w:i/>
+          <w:color w:val="30608C"/>
+          <w:sz w:val="21"/>
+        </w:rPr>
+        <w:t xml:space="preserve">› </w:t>
+      </w:r>
+      <w:r>
+        <w:rPr>
+          <w:i/>
+          <w:color w:val="30608C"/>
+          <w:sz w:val="21"/>
+        </w:rPr>
+        <w:t>Gern!</w:t>
+      </w:r>
+      <w:r>
+        <w:rPr>
+          <w:i/>
+          <w:color w:val="404040"/>
+          <w:sz w:val="21"/>
+        </w:rPr>
+        <w:t xml:space="preserve"> (Gladly! / Sure! / With pleasure!)</w:t>
+      </w:r>
+    </w:p>
+    <w:p>
+      <w:pPr>
+        <w:spacing w:before="0" w:after="0"/>
+      </w:pPr>
+    </w:p>
+    <w:p>
+      <w:pPr>
+        <w:spacing w:after="120"/>
+      </w:pPr>
+      <w:r>
+        <w:rPr>
+          <w:b/>
+        </w:rPr>
+        <w:t>wiederholen</w:t>
+      </w:r>
+      <w:r>
+        <w:t xml:space="preserve"> /viːdɐˈhoːlən/</w:t>
+      </w:r>
+    </w:p>
+    <w:p>
+      <w:pPr>
+        <w:spacing w:after="80"/>
+        <w:ind w:left="576"/>
+      </w:pPr>
+      <w:r>
+        <w:t>To repeat; say or do again.</w:t>
+      </w:r>
+    </w:p>
+    <w:p>
+      <w:pPr>
+        <w:spacing w:before="40" w:after="60"/>
+        <w:ind w:left="576"/>
+      </w:pPr>
+      <w:r>
+        <w:rPr>
+          <w:i/>
+          <w:color w:val="30608C"/>
+          <w:sz w:val="21"/>
+        </w:rPr>
+        <w:t xml:space="preserve">› </w:t>
+      </w:r>
+      <w:r>
+        <w:rPr>
+          <w:i/>
+          <w:color w:val="30608C"/>
+          <w:sz w:val="21"/>
+        </w:rPr>
+        <w:t>Bitte wiederholen Sie das.</w:t>
+      </w:r>
+      <w:r>
+        <w:rPr>
+          <w:i/>
+          <w:color w:val="404040"/>
+          <w:sz w:val="21"/>
+        </w:rPr>
+        <w:t xml:space="preserve"> (Please repeat that.)</w:t>
+      </w:r>
+    </w:p>
+    <w:p>
+      <w:pPr>
+        <w:spacing w:before="0" w:after="60"/>
+        <w:ind w:left="576"/>
+      </w:pPr>
+      <w:r>
+        <w:rPr>
+          <w:i/>
+          <w:color w:val="30608C"/>
+          <w:sz w:val="21"/>
+        </w:rPr>
+        <w:t xml:space="preserve">› </w:t>
+      </w:r>
+      <w:r>
+        <w:rPr>
+          <w:i/>
+          <w:color w:val="30608C"/>
+          <w:sz w:val="21"/>
+        </w:rPr>
+        <w:t>Wiederholen Sie bitte die Frage.</w:t>
+      </w:r>
+      <w:r>
+        <w:rPr>
+          <w:i/>
+          <w:color w:val="404040"/>
+          <w:sz w:val="21"/>
+        </w:rPr>
+        <w:t xml:space="preserve"> (Please repeat the question. [formal you])</w:t>
+      </w:r>
+    </w:p>
+    <w:p>
+      <w:pPr>
+        <w:spacing w:before="0" w:after="60"/>
+        <w:ind w:left="576"/>
+      </w:pPr>
+      <w:r>
+        <w:rPr>
+          <w:i/>
+          <w:color w:val="30608C"/>
+          <w:sz w:val="21"/>
+        </w:rPr>
+        <w:t xml:space="preserve">› </w:t>
+      </w:r>
+      <w:r>
+        <w:rPr>
+          <w:i/>
+          <w:color w:val="30608C"/>
+          <w:sz w:val="21"/>
+        </w:rPr>
+        <w:t>Du wiederholst den Satz.</w:t>
+      </w:r>
+      <w:r>
+        <w:rPr>
+          <w:i/>
+          <w:color w:val="404040"/>
+          <w:sz w:val="21"/>
+        </w:rPr>
+        <w:t xml:space="preserve"> (You repeat the sentence. [informal you])</w:t>
+      </w:r>
+    </w:p>
+    <w:p>
+      <w:pPr>
+        <w:spacing w:before="0" w:after="120"/>
+        <w:ind w:left="576"/>
+      </w:pPr>
+      <w:r>
+        <w:rPr>
+          <w:i/>
+          <w:color w:val="30608C"/>
+          <w:sz w:val="21"/>
+        </w:rPr>
+        <w:t xml:space="preserve">› </w:t>
+      </w:r>
+      <w:r>
+        <w:rPr>
+          <w:i/>
+          <w:color w:val="30608C"/>
+          <w:sz w:val="21"/>
+        </w:rPr>
+        <w:t>Er wiederholt die Regel.</w:t>
+      </w:r>
+      <w:r>
+        <w:rPr>
+          <w:i/>
+          <w:color w:val="404040"/>
+          <w:sz w:val="21"/>
+        </w:rPr>
+        <w:t xml:space="preserve"> (He repeats the rule.)</w:t>
+      </w:r>
+    </w:p>
+    <w:p>
+      <w:pPr>
+        <w:spacing w:before="0" w:after="0"/>
+      </w:pPr>
+    </w:p>
+    <w:p>
+      <w:pPr>
+        <w:spacing w:after="120"/>
+      </w:pPr>
+      <w:r>
+        <w:rPr>
+          <w:b/>
+        </w:rPr>
+        <w:t>wieder</w:t>
+      </w:r>
+      <w:r>
+        <w:t xml:space="preserve"> /ˈviːdɐ/</w:t>
+      </w:r>
+    </w:p>
+    <w:p>
+      <w:pPr>
+        <w:spacing w:after="80"/>
+        <w:ind w:left="576"/>
+      </w:pPr>
+      <w:r>
+        <w:t>Again; back again.</w:t>
+      </w:r>
+    </w:p>
+    <w:p>
+      <w:pPr>
+        <w:spacing w:after="80"/>
+        <w:ind w:left="576"/>
+      </w:pPr>
+      <w:r>
+        <w:rPr>
+          <w:i/>
+          <w:color w:val="404040"/>
+          <w:sz w:val="20"/>
+        </w:rPr>
+        <w:t>• Do not confuse wieder (again) with wider (against).</w:t>
+      </w:r>
+    </w:p>
+    <w:p>
+      <w:pPr>
+        <w:spacing w:before="40" w:after="60"/>
+        <w:ind w:left="576"/>
+      </w:pPr>
+      <w:r>
+        <w:rPr>
+          <w:i/>
+          <w:color w:val="30608C"/>
+          <w:sz w:val="21"/>
+        </w:rPr>
+        <w:t xml:space="preserve">› </w:t>
+      </w:r>
+      <w:r>
+        <w:rPr>
+          <w:i/>
+          <w:color w:val="30608C"/>
+          <w:sz w:val="21"/>
+        </w:rPr>
+        <w:t>Noch einmal, bitte.</w:t>
+      </w:r>
+      <w:r>
+        <w:rPr>
+          <w:i/>
+          <w:color w:val="404040"/>
+          <w:sz w:val="21"/>
+        </w:rPr>
+        <w:t xml:space="preserve"> (One more time, please.)</w:t>
+      </w:r>
+    </w:p>
+    <w:p>
+      <w:pPr>
+        <w:spacing w:before="0" w:after="60"/>
+        <w:ind w:left="576"/>
+      </w:pPr>
+      <w:r>
+        <w:rPr>
+          <w:i/>
+          <w:color w:val="30608C"/>
+          <w:sz w:val="21"/>
+        </w:rPr>
+        <w:t xml:space="preserve">› </w:t>
+      </w:r>
+      <w:r>
+        <w:rPr>
+          <w:i/>
+          <w:color w:val="30608C"/>
+          <w:sz w:val="21"/>
+        </w:rPr>
+        <w:t>Bitte wiederholen Sie das.</w:t>
+      </w:r>
+      <w:r>
+        <w:rPr>
+          <w:i/>
+          <w:color w:val="404040"/>
+          <w:sz w:val="21"/>
+        </w:rPr>
+        <w:t xml:space="preserve"> (Please repeat that.)</w:t>
+      </w:r>
+    </w:p>
+    <w:p>
+      <w:pPr>
+        <w:spacing w:before="0" w:after="60"/>
+        <w:ind w:left="576"/>
+      </w:pPr>
+      <w:r>
+        <w:rPr>
+          <w:i/>
+          <w:color w:val="30608C"/>
+          <w:sz w:val="21"/>
+        </w:rPr>
+        <w:t xml:space="preserve">› </w:t>
+      </w:r>
+      <w:r>
+        <w:rPr>
+          <w:i/>
+          <w:color w:val="30608C"/>
+          <w:sz w:val="21"/>
+        </w:rPr>
+        <w:t>Ich bin wieder da.</w:t>
+      </w:r>
+      <w:r>
+        <w:rPr>
+          <w:i/>
+          <w:color w:val="404040"/>
+          <w:sz w:val="21"/>
+        </w:rPr>
+        <w:t xml:space="preserve"> (I'm back again.)</w:t>
+      </w:r>
+    </w:p>
+    <w:p>
+      <w:pPr>
+        <w:spacing w:before="0" w:after="120"/>
+        <w:ind w:left="576"/>
+      </w:pPr>
+      <w:r>
+        <w:rPr>
+          <w:i/>
+          <w:color w:val="30608C"/>
+          <w:sz w:val="21"/>
+        </w:rPr>
+        <w:t xml:space="preserve">› </w:t>
+      </w:r>
+      <w:r>
+        <w:rPr>
+          <w:i/>
+          <w:color w:val="30608C"/>
+          <w:sz w:val="21"/>
+        </w:rPr>
+        <w:t>Bis morgen! Wir sehen uns wieder.</w:t>
+      </w:r>
+      <w:r>
+        <w:rPr>
+          <w:i/>
+          <w:color w:val="404040"/>
+          <w:sz w:val="21"/>
+        </w:rPr>
+        <w:t xml:space="preserve"> (See you tomorrow! We'll see each other again.)</w:t>
+      </w:r>
+    </w:p>
+    <w:p>
+      <w:pPr>
+        <w:spacing w:before="0" w:after="0"/>
+      </w:pPr>
     </w:p>
     <w:p>
       <w:pPr>

</xml_diff>

<commit_message>
Add new vocabulary entries for numbers 0-10 and "von" in vocab.docx and vocab.manifest.json
- Introduced detailed entries for numbers 0-10, including glosses, notes, and examples in both German and English.
- Added an entry for "von," with explanations of its usage and examples.
- All entries are categorized under lesson 1 and level A1 for language learners, enhancing the vocabulary resource with practical usage and common phrases.
</commit_message>
<xml_diff>
--- a/vocab.docx
+++ b/vocab.docx
@@ -13,6 +13,829 @@
         </w:rPr>
         <w:t>daf — vocabulary</w:t>
       </w:r>
+    </w:p>
+    <w:p>
+      <w:pPr>
+        <w:spacing w:after="120"/>
+      </w:pPr>
+      <w:r>
+        <w:rPr>
+          <w:b/>
+        </w:rPr>
+        <w:t>die Zahlen 0-10</w:t>
+      </w:r>
+      <w:r>
+        <w:t xml:space="preserve"> /diː ˈtsaːlən nʊl bɪs tseːn/</w:t>
+      </w:r>
+    </w:p>
+    <w:p>
+      <w:pPr>
+        <w:spacing w:after="80"/>
+        <w:ind w:left="576"/>
+      </w:pPr>
+      <w:r>
+        <w:t>Numbers from zero to ten.</w:t>
+      </w:r>
+    </w:p>
+    <w:p>
+      <w:pPr>
+        <w:spacing w:after="80"/>
+        <w:ind w:left="576"/>
+      </w:pPr>
+      <w:r>
+        <w:rPr>
+          <w:i/>
+          <w:color w:val="404040"/>
+          <w:sz w:val="20"/>
+        </w:rPr>
+        <w:t>• eins is the counting form for 1; before a noun it usually becomes ein/eine.</w:t>
+      </w:r>
+    </w:p>
+    <w:p>
+      <w:pPr>
+        <w:spacing w:after="80"/>
+        <w:ind w:left="576"/>
+      </w:pPr>
+      <w:r>
+        <w:rPr>
+          <w:i/>
+          <w:color w:val="404040"/>
+          <w:sz w:val="20"/>
+        </w:rPr>
+        <w:t>• In phone numbers, digits are often spoken one by one: 0612 = null sechs eins zwei.</w:t>
+      </w:r>
+    </w:p>
+    <w:tbl>
+      <w:tblPr>
+        <w:tblStyle w:val="TableGrid"/>
+        <w:tblW w:type="auto" w:w="0"/>
+        <w:tblLook w:firstColumn="1" w:firstRow="1" w:lastColumn="0" w:lastRow="0" w:noHBand="0" w:noVBand="1" w:val="04A0"/>
+        <w:tblInd w:w="576" w:type="dxa"/>
+      </w:tblPr>
+      <w:tblGrid>
+        <w:gridCol w:w="4320"/>
+        <w:gridCol w:w="4320"/>
+      </w:tblGrid>
+      <w:tr>
+        <w:tc>
+          <w:tcPr>
+            <w:tcW w:type="dxa" w:w="4320"/>
+            <w:shd w:val="clear" w:color="auto" w:fill="EFF6FC"/>
+          </w:tcPr>
+          <w:p>
+            <w:pPr>
+              <w:spacing w:after="40"/>
+            </w:pPr>
+            <w:r/>
+            <w:r>
+              <w:rPr>
+                <w:rFonts w:ascii="Calibri" w:hAnsi="Calibri"/>
+                <w:b/>
+                <w:color w:val="333333"/>
+                <w:sz w:val="20"/>
+              </w:rPr>
+              <w:t>Zahl</w:t>
+            </w:r>
+          </w:p>
+        </w:tc>
+        <w:tc>
+          <w:tcPr>
+            <w:tcW w:type="dxa" w:w="4320"/>
+            <w:shd w:val="clear" w:color="auto" w:fill="EFF6FC"/>
+          </w:tcPr>
+          <w:p>
+            <w:pPr>
+              <w:spacing w:after="40"/>
+            </w:pPr>
+            <w:r/>
+            <w:r>
+              <w:rPr>
+                <w:rFonts w:ascii="Calibri" w:hAnsi="Calibri"/>
+                <w:b/>
+                <w:color w:val="333333"/>
+                <w:sz w:val="20"/>
+              </w:rPr>
+              <w:t>Wort</w:t>
+            </w:r>
+          </w:p>
+        </w:tc>
+      </w:tr>
+      <w:tr>
+        <w:tc>
+          <w:tcPr>
+            <w:tcW w:type="dxa" w:w="4320"/>
+          </w:tcPr>
+          <w:p>
+            <w:pPr>
+              <w:spacing w:after="40"/>
+            </w:pPr>
+            <w:r/>
+            <w:r>
+              <w:rPr>
+                <w:rFonts w:ascii="Calibri" w:hAnsi="Calibri"/>
+                <w:color w:val="404040"/>
+                <w:sz w:val="19"/>
+              </w:rPr>
+              <w:t>0</w:t>
+            </w:r>
+          </w:p>
+        </w:tc>
+        <w:tc>
+          <w:tcPr>
+            <w:tcW w:type="dxa" w:w="4320"/>
+          </w:tcPr>
+          <w:p>
+            <w:pPr>
+              <w:spacing w:after="40"/>
+            </w:pPr>
+            <w:r/>
+            <w:r>
+              <w:rPr>
+                <w:rFonts w:ascii="Calibri" w:hAnsi="Calibri"/>
+                <w:color w:val="404040"/>
+                <w:sz w:val="19"/>
+              </w:rPr>
+              <w:t>null</w:t>
+            </w:r>
+          </w:p>
+        </w:tc>
+      </w:tr>
+      <w:tr>
+        <w:tc>
+          <w:tcPr>
+            <w:tcW w:type="dxa" w:w="4320"/>
+          </w:tcPr>
+          <w:p>
+            <w:pPr>
+              <w:spacing w:after="40"/>
+            </w:pPr>
+            <w:r/>
+            <w:r>
+              <w:rPr>
+                <w:rFonts w:ascii="Calibri" w:hAnsi="Calibri"/>
+                <w:color w:val="404040"/>
+                <w:sz w:val="19"/>
+              </w:rPr>
+              <w:t>1</w:t>
+            </w:r>
+          </w:p>
+        </w:tc>
+        <w:tc>
+          <w:tcPr>
+            <w:tcW w:type="dxa" w:w="4320"/>
+          </w:tcPr>
+          <w:p>
+            <w:pPr>
+              <w:spacing w:after="40"/>
+            </w:pPr>
+            <w:r/>
+            <w:r>
+              <w:rPr>
+                <w:rFonts w:ascii="Calibri" w:hAnsi="Calibri"/>
+                <w:color w:val="404040"/>
+                <w:sz w:val="19"/>
+              </w:rPr>
+              <w:t>eins</w:t>
+            </w:r>
+          </w:p>
+        </w:tc>
+      </w:tr>
+      <w:tr>
+        <w:tc>
+          <w:tcPr>
+            <w:tcW w:type="dxa" w:w="4320"/>
+          </w:tcPr>
+          <w:p>
+            <w:pPr>
+              <w:spacing w:after="40"/>
+            </w:pPr>
+            <w:r/>
+            <w:r>
+              <w:rPr>
+                <w:rFonts w:ascii="Calibri" w:hAnsi="Calibri"/>
+                <w:color w:val="404040"/>
+                <w:sz w:val="19"/>
+              </w:rPr>
+              <w:t>2</w:t>
+            </w:r>
+          </w:p>
+        </w:tc>
+        <w:tc>
+          <w:tcPr>
+            <w:tcW w:type="dxa" w:w="4320"/>
+          </w:tcPr>
+          <w:p>
+            <w:pPr>
+              <w:spacing w:after="40"/>
+            </w:pPr>
+            <w:r/>
+            <w:r>
+              <w:rPr>
+                <w:rFonts w:ascii="Calibri" w:hAnsi="Calibri"/>
+                <w:color w:val="404040"/>
+                <w:sz w:val="19"/>
+              </w:rPr>
+              <w:t>zwei</w:t>
+            </w:r>
+          </w:p>
+        </w:tc>
+      </w:tr>
+      <w:tr>
+        <w:tc>
+          <w:tcPr>
+            <w:tcW w:type="dxa" w:w="4320"/>
+          </w:tcPr>
+          <w:p>
+            <w:pPr>
+              <w:spacing w:after="40"/>
+            </w:pPr>
+            <w:r/>
+            <w:r>
+              <w:rPr>
+                <w:rFonts w:ascii="Calibri" w:hAnsi="Calibri"/>
+                <w:color w:val="404040"/>
+                <w:sz w:val="19"/>
+              </w:rPr>
+              <w:t>3</w:t>
+            </w:r>
+          </w:p>
+        </w:tc>
+        <w:tc>
+          <w:tcPr>
+            <w:tcW w:type="dxa" w:w="4320"/>
+          </w:tcPr>
+          <w:p>
+            <w:pPr>
+              <w:spacing w:after="40"/>
+            </w:pPr>
+            <w:r/>
+            <w:r>
+              <w:rPr>
+                <w:rFonts w:ascii="Calibri" w:hAnsi="Calibri"/>
+                <w:color w:val="404040"/>
+                <w:sz w:val="19"/>
+              </w:rPr>
+              <w:t>drei</w:t>
+            </w:r>
+          </w:p>
+        </w:tc>
+      </w:tr>
+      <w:tr>
+        <w:tc>
+          <w:tcPr>
+            <w:tcW w:type="dxa" w:w="4320"/>
+          </w:tcPr>
+          <w:p>
+            <w:pPr>
+              <w:spacing w:after="40"/>
+            </w:pPr>
+            <w:r/>
+            <w:r>
+              <w:rPr>
+                <w:rFonts w:ascii="Calibri" w:hAnsi="Calibri"/>
+                <w:color w:val="404040"/>
+                <w:sz w:val="19"/>
+              </w:rPr>
+              <w:t>4</w:t>
+            </w:r>
+          </w:p>
+        </w:tc>
+        <w:tc>
+          <w:tcPr>
+            <w:tcW w:type="dxa" w:w="4320"/>
+          </w:tcPr>
+          <w:p>
+            <w:pPr>
+              <w:spacing w:after="40"/>
+            </w:pPr>
+            <w:r/>
+            <w:r>
+              <w:rPr>
+                <w:rFonts w:ascii="Calibri" w:hAnsi="Calibri"/>
+                <w:color w:val="404040"/>
+                <w:sz w:val="19"/>
+              </w:rPr>
+              <w:t>vier</w:t>
+            </w:r>
+          </w:p>
+        </w:tc>
+      </w:tr>
+      <w:tr>
+        <w:tc>
+          <w:tcPr>
+            <w:tcW w:type="dxa" w:w="4320"/>
+          </w:tcPr>
+          <w:p>
+            <w:pPr>
+              <w:spacing w:after="40"/>
+            </w:pPr>
+            <w:r/>
+            <w:r>
+              <w:rPr>
+                <w:rFonts w:ascii="Calibri" w:hAnsi="Calibri"/>
+                <w:color w:val="404040"/>
+                <w:sz w:val="19"/>
+              </w:rPr>
+              <w:t>5</w:t>
+            </w:r>
+          </w:p>
+        </w:tc>
+        <w:tc>
+          <w:tcPr>
+            <w:tcW w:type="dxa" w:w="4320"/>
+          </w:tcPr>
+          <w:p>
+            <w:pPr>
+              <w:spacing w:after="40"/>
+            </w:pPr>
+            <w:r/>
+            <w:r>
+              <w:rPr>
+                <w:rFonts w:ascii="Calibri" w:hAnsi="Calibri"/>
+                <w:color w:val="404040"/>
+                <w:sz w:val="19"/>
+              </w:rPr>
+              <w:t>fünf</w:t>
+            </w:r>
+          </w:p>
+        </w:tc>
+      </w:tr>
+      <w:tr>
+        <w:tc>
+          <w:tcPr>
+            <w:tcW w:type="dxa" w:w="4320"/>
+          </w:tcPr>
+          <w:p>
+            <w:pPr>
+              <w:spacing w:after="40"/>
+            </w:pPr>
+            <w:r/>
+            <w:r>
+              <w:rPr>
+                <w:rFonts w:ascii="Calibri" w:hAnsi="Calibri"/>
+                <w:color w:val="404040"/>
+                <w:sz w:val="19"/>
+              </w:rPr>
+              <w:t>6</w:t>
+            </w:r>
+          </w:p>
+        </w:tc>
+        <w:tc>
+          <w:tcPr>
+            <w:tcW w:type="dxa" w:w="4320"/>
+          </w:tcPr>
+          <w:p>
+            <w:pPr>
+              <w:spacing w:after="40"/>
+            </w:pPr>
+            <w:r/>
+            <w:r>
+              <w:rPr>
+                <w:rFonts w:ascii="Calibri" w:hAnsi="Calibri"/>
+                <w:color w:val="404040"/>
+                <w:sz w:val="19"/>
+              </w:rPr>
+              <w:t>sechs</w:t>
+            </w:r>
+          </w:p>
+        </w:tc>
+      </w:tr>
+      <w:tr>
+        <w:tc>
+          <w:tcPr>
+            <w:tcW w:type="dxa" w:w="4320"/>
+          </w:tcPr>
+          <w:p>
+            <w:pPr>
+              <w:spacing w:after="40"/>
+            </w:pPr>
+            <w:r/>
+            <w:r>
+              <w:rPr>
+                <w:rFonts w:ascii="Calibri" w:hAnsi="Calibri"/>
+                <w:color w:val="404040"/>
+                <w:sz w:val="19"/>
+              </w:rPr>
+              <w:t>7</w:t>
+            </w:r>
+          </w:p>
+        </w:tc>
+        <w:tc>
+          <w:tcPr>
+            <w:tcW w:type="dxa" w:w="4320"/>
+          </w:tcPr>
+          <w:p>
+            <w:pPr>
+              <w:spacing w:after="40"/>
+            </w:pPr>
+            <w:r/>
+            <w:r>
+              <w:rPr>
+                <w:rFonts w:ascii="Calibri" w:hAnsi="Calibri"/>
+                <w:color w:val="404040"/>
+                <w:sz w:val="19"/>
+              </w:rPr>
+              <w:t>sieben</w:t>
+            </w:r>
+          </w:p>
+        </w:tc>
+      </w:tr>
+      <w:tr>
+        <w:tc>
+          <w:tcPr>
+            <w:tcW w:type="dxa" w:w="4320"/>
+          </w:tcPr>
+          <w:p>
+            <w:pPr>
+              <w:spacing w:after="40"/>
+            </w:pPr>
+            <w:r/>
+            <w:r>
+              <w:rPr>
+                <w:rFonts w:ascii="Calibri" w:hAnsi="Calibri"/>
+                <w:color w:val="404040"/>
+                <w:sz w:val="19"/>
+              </w:rPr>
+              <w:t>8</w:t>
+            </w:r>
+          </w:p>
+        </w:tc>
+        <w:tc>
+          <w:tcPr>
+            <w:tcW w:type="dxa" w:w="4320"/>
+          </w:tcPr>
+          <w:p>
+            <w:pPr>
+              <w:spacing w:after="40"/>
+            </w:pPr>
+            <w:r/>
+            <w:r>
+              <w:rPr>
+                <w:rFonts w:ascii="Calibri" w:hAnsi="Calibri"/>
+                <w:color w:val="404040"/>
+                <w:sz w:val="19"/>
+              </w:rPr>
+              <w:t>acht</w:t>
+            </w:r>
+          </w:p>
+        </w:tc>
+      </w:tr>
+      <w:tr>
+        <w:tc>
+          <w:tcPr>
+            <w:tcW w:type="dxa" w:w="4320"/>
+          </w:tcPr>
+          <w:p>
+            <w:pPr>
+              <w:spacing w:after="40"/>
+            </w:pPr>
+            <w:r/>
+            <w:r>
+              <w:rPr>
+                <w:rFonts w:ascii="Calibri" w:hAnsi="Calibri"/>
+                <w:color w:val="404040"/>
+                <w:sz w:val="19"/>
+              </w:rPr>
+              <w:t>9</w:t>
+            </w:r>
+          </w:p>
+        </w:tc>
+        <w:tc>
+          <w:tcPr>
+            <w:tcW w:type="dxa" w:w="4320"/>
+          </w:tcPr>
+          <w:p>
+            <w:pPr>
+              <w:spacing w:after="40"/>
+            </w:pPr>
+            <w:r/>
+            <w:r>
+              <w:rPr>
+                <w:rFonts w:ascii="Calibri" w:hAnsi="Calibri"/>
+                <w:color w:val="404040"/>
+                <w:sz w:val="19"/>
+              </w:rPr>
+              <w:t>neun</w:t>
+            </w:r>
+          </w:p>
+        </w:tc>
+      </w:tr>
+      <w:tr>
+        <w:tc>
+          <w:tcPr>
+            <w:tcW w:type="dxa" w:w="4320"/>
+          </w:tcPr>
+          <w:p>
+            <w:pPr>
+              <w:spacing w:after="40"/>
+            </w:pPr>
+            <w:r/>
+            <w:r>
+              <w:rPr>
+                <w:rFonts w:ascii="Calibri" w:hAnsi="Calibri"/>
+                <w:color w:val="404040"/>
+                <w:sz w:val="19"/>
+              </w:rPr>
+              <w:t>10</w:t>
+            </w:r>
+          </w:p>
+        </w:tc>
+        <w:tc>
+          <w:tcPr>
+            <w:tcW w:type="dxa" w:w="4320"/>
+          </w:tcPr>
+          <w:p>
+            <w:pPr>
+              <w:spacing w:after="40"/>
+            </w:pPr>
+            <w:r/>
+            <w:r>
+              <w:rPr>
+                <w:rFonts w:ascii="Calibri" w:hAnsi="Calibri"/>
+                <w:color w:val="404040"/>
+                <w:sz w:val="19"/>
+              </w:rPr>
+              <w:t>zehn</w:t>
+            </w:r>
+          </w:p>
+        </w:tc>
+      </w:tr>
+    </w:tbl>
+    <w:p>
+      <w:pPr>
+        <w:spacing w:before="40" w:after="120"/>
+      </w:pPr>
+    </w:p>
+    <w:p>
+      <w:pPr>
+        <w:spacing w:before="40" w:after="60"/>
+        <w:ind w:left="576"/>
+      </w:pPr>
+      <w:r>
+        <w:rPr>
+          <w:i/>
+          <w:color w:val="30608C"/>
+          <w:sz w:val="21"/>
+        </w:rPr>
+        <w:t xml:space="preserve">› </w:t>
+      </w:r>
+      <w:r>
+        <w:rPr>
+          <w:i/>
+          <w:color w:val="30608C"/>
+          <w:sz w:val="21"/>
+        </w:rPr>
+        <w:t>Hören Sie die Zahlen.</w:t>
+      </w:r>
+      <w:r>
+        <w:rPr>
+          <w:i/>
+          <w:color w:val="404040"/>
+          <w:sz w:val="21"/>
+        </w:rPr>
+        <w:t xml:space="preserve"> (Listen to the numbers.)</w:t>
+      </w:r>
+    </w:p>
+    <w:p>
+      <w:pPr>
+        <w:spacing w:before="0" w:after="60"/>
+        <w:ind w:left="576"/>
+      </w:pPr>
+      <w:r>
+        <w:rPr>
+          <w:i/>
+          <w:color w:val="30608C"/>
+          <w:sz w:val="21"/>
+        </w:rPr>
+        <w:t xml:space="preserve">› </w:t>
+      </w:r>
+      <w:r>
+        <w:rPr>
+          <w:i/>
+          <w:color w:val="30608C"/>
+          <w:sz w:val="21"/>
+        </w:rPr>
+        <w:t>Welche Zahlen hören Sie?</w:t>
+      </w:r>
+      <w:r>
+        <w:rPr>
+          <w:i/>
+          <w:color w:val="404040"/>
+          <w:sz w:val="21"/>
+        </w:rPr>
+        <w:t xml:space="preserve"> (Which numbers do you hear?)</w:t>
+      </w:r>
+    </w:p>
+    <w:p>
+      <w:pPr>
+        <w:spacing w:before="0" w:after="120"/>
+        <w:ind w:left="576"/>
+      </w:pPr>
+      <w:r>
+        <w:rPr>
+          <w:i/>
+          <w:color w:val="30608C"/>
+          <w:sz w:val="21"/>
+        </w:rPr>
+        <w:t xml:space="preserve">› </w:t>
+      </w:r>
+      <w:r>
+        <w:rPr>
+          <w:i/>
+          <w:color w:val="30608C"/>
+          <w:sz w:val="21"/>
+        </w:rPr>
+        <w:t>Meine Telefonnummer ist null sechs eins zwei.</w:t>
+      </w:r>
+      <w:r>
+        <w:rPr>
+          <w:i/>
+          <w:color w:val="404040"/>
+          <w:sz w:val="21"/>
+        </w:rPr>
+        <w:t xml:space="preserve"> (My phone number is zero six one two.)</w:t>
+      </w:r>
+    </w:p>
+    <w:p>
+      <w:pPr>
+        <w:spacing w:before="0" w:after="0"/>
+      </w:pPr>
+    </w:p>
+    <w:p>
+      <w:pPr>
+        <w:spacing w:after="120"/>
+      </w:pPr>
+      <w:r>
+        <w:rPr>
+          <w:b/>
+        </w:rPr>
+        <w:t>von</w:t>
+      </w:r>
+      <w:r>
+        <w:t xml:space="preserve"> /fɔn/</w:t>
+      </w:r>
+    </w:p>
+    <w:p>
+      <w:pPr>
+        <w:spacing w:after="80"/>
+        <w:ind w:left="576"/>
+      </w:pPr>
+      <w:r>
+        <w:t>Of; from; belonging to.</w:t>
+      </w:r>
+    </w:p>
+    <w:p>
+      <w:pPr>
+        <w:spacing w:after="80"/>
+        <w:ind w:left="576"/>
+      </w:pPr>
+      <w:r>
+        <w:rPr>
+          <w:i/>
+          <w:color w:val="404040"/>
+          <w:sz w:val="20"/>
+        </w:rPr>
+        <w:t>• In die Adresse von Anne, von shows whose address it is: Anne's address.</w:t>
+      </w:r>
+    </w:p>
+    <w:p>
+      <w:pPr>
+        <w:spacing w:after="80"/>
+        <w:ind w:left="576"/>
+      </w:pPr>
+      <w:r>
+        <w:rPr>
+          <w:i/>
+          <w:color w:val="404040"/>
+          <w:sz w:val="20"/>
+        </w:rPr>
+        <w:t>• von always takes dative, but with names like Anne there is no visible article change.</w:t>
+      </w:r>
+    </w:p>
+    <w:p>
+      <w:pPr>
+        <w:spacing w:before="40" w:after="60"/>
+        <w:ind w:left="576"/>
+      </w:pPr>
+      <w:r>
+        <w:rPr>
+          <w:i/>
+          <w:color w:val="30608C"/>
+          <w:sz w:val="21"/>
+        </w:rPr>
+        <w:t xml:space="preserve">› </w:t>
+      </w:r>
+      <w:r>
+        <w:rPr>
+          <w:i/>
+          <w:color w:val="30608C"/>
+          <w:sz w:val="21"/>
+        </w:rPr>
+        <w:t>Die Adresse von Anne ist hier.</w:t>
+      </w:r>
+      <w:r>
+        <w:rPr>
+          <w:i/>
+          <w:color w:val="404040"/>
+          <w:sz w:val="21"/>
+        </w:rPr>
+        <w:t xml:space="preserve"> (Anne's address is here.)</w:t>
+      </w:r>
+    </w:p>
+    <w:p>
+      <w:pPr>
+        <w:spacing w:before="0" w:after="60"/>
+        <w:ind w:left="576"/>
+      </w:pPr>
+      <w:r>
+        <w:rPr>
+          <w:i/>
+          <w:color w:val="30608C"/>
+          <w:sz w:val="21"/>
+        </w:rPr>
+        <w:t xml:space="preserve">› </w:t>
+      </w:r>
+      <w:r>
+        <w:rPr>
+          <w:i/>
+          <w:color w:val="30608C"/>
+          <w:sz w:val="21"/>
+        </w:rPr>
+        <w:t>Das ist die Telefonnummer von Maria.</w:t>
+      </w:r>
+      <w:r>
+        <w:rPr>
+          <w:i/>
+          <w:color w:val="404040"/>
+          <w:sz w:val="21"/>
+        </w:rPr>
+        <w:t xml:space="preserve"> (That is Maria's phone number.)</w:t>
+      </w:r>
+    </w:p>
+    <w:p>
+      <w:pPr>
+        <w:spacing w:before="0" w:after="60"/>
+        <w:ind w:left="576"/>
+      </w:pPr>
+      <w:r>
+        <w:rPr>
+          <w:i/>
+          <w:color w:val="30608C"/>
+          <w:sz w:val="21"/>
+        </w:rPr>
+        <w:t xml:space="preserve">› </w:t>
+      </w:r>
+      <w:r>
+        <w:rPr>
+          <w:i/>
+          <w:color w:val="30608C"/>
+          <w:sz w:val="21"/>
+        </w:rPr>
+        <w:t>Ich komme von der Arbeit.</w:t>
+      </w:r>
+      <w:r>
+        <w:rPr>
+          <w:i/>
+          <w:color w:val="404040"/>
+          <w:sz w:val="21"/>
+        </w:rPr>
+        <w:t xml:space="preserve"> (I am coming from work.)</w:t>
+      </w:r>
+    </w:p>
+    <w:p>
+      <w:pPr>
+        <w:spacing w:before="0" w:after="120"/>
+        <w:ind w:left="576"/>
+      </w:pPr>
+      <w:r>
+        <w:rPr>
+          <w:i/>
+          <w:color w:val="30608C"/>
+          <w:sz w:val="21"/>
+        </w:rPr>
+        <w:t xml:space="preserve">› </w:t>
+      </w:r>
+      <w:r>
+        <w:rPr>
+          <w:i/>
+          <w:color w:val="30608C"/>
+          <w:sz w:val="21"/>
+        </w:rPr>
+        <w:t>die Verbform von essen</w:t>
+      </w:r>
+      <w:r>
+        <w:rPr>
+          <w:i/>
+          <w:color w:val="404040"/>
+          <w:sz w:val="21"/>
+        </w:rPr>
+        <w:t xml:space="preserve"> (the verb form of essen.)</w:t>
+      </w:r>
+    </w:p>
+    <w:p>
+      <w:pPr>
+        <w:spacing w:before="0" w:after="0"/>
+      </w:pPr>
     </w:p>
     <w:p>
       <w:pPr>

</xml_diff>

<commit_message>
Add new vocabulary entries for "heute," "zum," and "essen" in vocab.docx and vocab.manifest.json
- Introduced detailed entries for each term, including glosses, notes, and examples in both German and English.
- All entries are categorized under lesson 1 and level A1 for language learners, enhancing the vocabulary resource with practical usage and common phrases.
</commit_message>
<xml_diff>
--- a/vocab.docx
+++ b/vocab.docx
@@ -13,6 +13,416 @@
         </w:rPr>
         <w:t>daf — vocabulary</w:t>
       </w:r>
+    </w:p>
+    <w:p>
+      <w:pPr>
+        <w:spacing w:after="120"/>
+      </w:pPr>
+      <w:r>
+        <w:rPr>
+          <w:b/>
+        </w:rPr>
+        <w:t>heute</w:t>
+      </w:r>
+      <w:r>
+        <w:t xml:space="preserve"> /ˈhɔʏtə/</w:t>
+      </w:r>
+    </w:p>
+    <w:p>
+      <w:pPr>
+        <w:spacing w:after="80"/>
+        <w:ind w:left="576"/>
+      </w:pPr>
+      <w:r>
+        <w:t>Today.</w:t>
+      </w:r>
+    </w:p>
+    <w:p>
+      <w:pPr>
+        <w:spacing w:before="40" w:after="60"/>
+        <w:ind w:left="576"/>
+      </w:pPr>
+      <w:r>
+        <w:rPr>
+          <w:i/>
+          <w:color w:val="30608C"/>
+          <w:sz w:val="21"/>
+        </w:rPr>
+        <w:t xml:space="preserve">› </w:t>
+      </w:r>
+      <w:r>
+        <w:rPr>
+          <w:i/>
+          <w:color w:val="30608C"/>
+          <w:sz w:val="21"/>
+        </w:rPr>
+        <w:t>Georg kommt heute zum Essen.</w:t>
+      </w:r>
+      <w:r>
+        <w:rPr>
+          <w:i/>
+          <w:color w:val="404040"/>
+          <w:sz w:val="21"/>
+        </w:rPr>
+        <w:t xml:space="preserve"> (Georg is coming for the meal today.)</w:t>
+      </w:r>
+    </w:p>
+    <w:p>
+      <w:pPr>
+        <w:spacing w:before="0" w:after="60"/>
+        <w:ind w:left="576"/>
+      </w:pPr>
+      <w:r>
+        <w:rPr>
+          <w:i/>
+          <w:color w:val="30608C"/>
+          <w:sz w:val="21"/>
+        </w:rPr>
+        <w:t xml:space="preserve">› </w:t>
+      </w:r>
+      <w:r>
+        <w:rPr>
+          <w:i/>
+          <w:color w:val="30608C"/>
+          <w:sz w:val="21"/>
+        </w:rPr>
+        <w:t>Heute lernen wir Deutsch.</w:t>
+      </w:r>
+      <w:r>
+        <w:rPr>
+          <w:i/>
+          <w:color w:val="404040"/>
+          <w:sz w:val="21"/>
+        </w:rPr>
+        <w:t xml:space="preserve"> (Today we are learning German.)</w:t>
+      </w:r>
+    </w:p>
+    <w:p>
+      <w:pPr>
+        <w:spacing w:before="0" w:after="120"/>
+        <w:ind w:left="576"/>
+      </w:pPr>
+      <w:r>
+        <w:rPr>
+          <w:i/>
+          <w:color w:val="30608C"/>
+          <w:sz w:val="21"/>
+        </w:rPr>
+        <w:t xml:space="preserve">› </w:t>
+      </w:r>
+      <w:r>
+        <w:rPr>
+          <w:i/>
+          <w:color w:val="30608C"/>
+          <w:sz w:val="21"/>
+        </w:rPr>
+        <w:t>Bis heute Abend!</w:t>
+      </w:r>
+      <w:r>
+        <w:rPr>
+          <w:i/>
+          <w:color w:val="404040"/>
+          <w:sz w:val="21"/>
+        </w:rPr>
+        <w:t xml:space="preserve"> (See you this evening!)</w:t>
+      </w:r>
+    </w:p>
+    <w:p>
+      <w:pPr>
+        <w:spacing w:before="0" w:after="0"/>
+      </w:pPr>
+    </w:p>
+    <w:p>
+      <w:pPr>
+        <w:spacing w:after="120"/>
+      </w:pPr>
+      <w:r>
+        <w:rPr>
+          <w:b/>
+        </w:rPr>
+        <w:t>zum</w:t>
+      </w:r>
+      <w:r>
+        <w:t xml:space="preserve"> /tsʊm/</w:t>
+      </w:r>
+    </w:p>
+    <w:p>
+      <w:pPr>
+        <w:spacing w:after="80"/>
+        <w:ind w:left="576"/>
+      </w:pPr>
+      <w:r>
+        <w:t>To the; for the; contraction of zu + dem.</w:t>
+      </w:r>
+    </w:p>
+    <w:p>
+      <w:pPr>
+        <w:spacing w:after="80"/>
+        <w:ind w:left="576"/>
+      </w:pPr>
+      <w:r>
+        <w:rPr>
+          <w:i/>
+          <w:color w:val="404040"/>
+          <w:sz w:val="20"/>
+        </w:rPr>
+        <w:t>• zum = zu + dem, used before masculine or neuter dative nouns.</w:t>
+      </w:r>
+    </w:p>
+    <w:p>
+      <w:pPr>
+        <w:spacing w:after="80"/>
+        <w:ind w:left="576"/>
+      </w:pPr>
+      <w:r>
+        <w:rPr>
+          <w:i/>
+          <w:color w:val="404040"/>
+          <w:sz w:val="20"/>
+        </w:rPr>
+        <w:t>• In zum Essen, Essen is used as a noun: for the meal / to eat.</w:t>
+      </w:r>
+    </w:p>
+    <w:p>
+      <w:pPr>
+        <w:spacing w:before="40" w:after="60"/>
+        <w:ind w:left="576"/>
+      </w:pPr>
+      <w:r>
+        <w:rPr>
+          <w:i/>
+          <w:color w:val="30608C"/>
+          <w:sz w:val="21"/>
+        </w:rPr>
+        <w:t xml:space="preserve">› </w:t>
+      </w:r>
+      <w:r>
+        <w:rPr>
+          <w:i/>
+          <w:color w:val="30608C"/>
+          <w:sz w:val="21"/>
+        </w:rPr>
+        <w:t>Georg kommt heute zum Essen.</w:t>
+      </w:r>
+      <w:r>
+        <w:rPr>
+          <w:i/>
+          <w:color w:val="404040"/>
+          <w:sz w:val="21"/>
+        </w:rPr>
+        <w:t xml:space="preserve"> (Georg is coming for the meal today.)</w:t>
+      </w:r>
+    </w:p>
+    <w:p>
+      <w:pPr>
+        <w:spacing w:before="0" w:after="60"/>
+        <w:ind w:left="576"/>
+      </w:pPr>
+      <w:r>
+        <w:rPr>
+          <w:i/>
+          <w:color w:val="30608C"/>
+          <w:sz w:val="21"/>
+        </w:rPr>
+        <w:t xml:space="preserve">› </w:t>
+      </w:r>
+      <w:r>
+        <w:rPr>
+          <w:i/>
+          <w:color w:val="30608C"/>
+          <w:sz w:val="21"/>
+        </w:rPr>
+        <w:t>Ich gehe zum Kurs.</w:t>
+      </w:r>
+      <w:r>
+        <w:rPr>
+          <w:i/>
+          <w:color w:val="404040"/>
+          <w:sz w:val="21"/>
+        </w:rPr>
+        <w:t xml:space="preserve"> (I am going to the course.)</w:t>
+      </w:r>
+    </w:p>
+    <w:p>
+      <w:pPr>
+        <w:spacing w:before="0" w:after="120"/>
+        <w:ind w:left="576"/>
+      </w:pPr>
+      <w:r>
+        <w:rPr>
+          <w:i/>
+          <w:color w:val="30608C"/>
+          <w:sz w:val="21"/>
+        </w:rPr>
+        <w:t xml:space="preserve">› </w:t>
+      </w:r>
+      <w:r>
+        <w:rPr>
+          <w:i/>
+          <w:color w:val="30608C"/>
+          <w:sz w:val="21"/>
+        </w:rPr>
+        <w:t>Zum Beispiel: eins, zwei, drei.</w:t>
+      </w:r>
+      <w:r>
+        <w:rPr>
+          <w:i/>
+          <w:color w:val="404040"/>
+          <w:sz w:val="21"/>
+        </w:rPr>
+        <w:t xml:space="preserve"> (For example: one, two, three.)</w:t>
+      </w:r>
+    </w:p>
+    <w:p>
+      <w:pPr>
+        <w:spacing w:before="0" w:after="0"/>
+      </w:pPr>
+    </w:p>
+    <w:p>
+      <w:pPr>
+        <w:spacing w:after="120"/>
+      </w:pPr>
+      <w:r>
+        <w:rPr>
+          <w:b/>
+        </w:rPr>
+        <w:t>essen</w:t>
+      </w:r>
+      <w:r>
+        <w:t xml:space="preserve"> /ˈɛsn̩/</w:t>
+      </w:r>
+    </w:p>
+    <w:p>
+      <w:pPr>
+        <w:spacing w:after="80"/>
+        <w:ind w:left="576"/>
+      </w:pPr>
+      <w:r>
+        <w:t>To eat; food or meal when capitalized as Essen.</w:t>
+      </w:r>
+    </w:p>
+    <w:p>
+      <w:pPr>
+        <w:spacing w:after="80"/>
+        <w:ind w:left="576"/>
+      </w:pPr>
+      <w:r>
+        <w:rPr>
+          <w:i/>
+          <w:color w:val="404040"/>
+          <w:sz w:val="20"/>
+        </w:rPr>
+        <w:t>• Lowercase essen is the verb: to eat.</w:t>
+      </w:r>
+    </w:p>
+    <w:p>
+      <w:pPr>
+        <w:spacing w:after="80"/>
+        <w:ind w:left="576"/>
+      </w:pPr>
+      <w:r>
+        <w:rPr>
+          <w:i/>
+          <w:color w:val="404040"/>
+          <w:sz w:val="20"/>
+        </w:rPr>
+        <w:t>• Capitalized Essen is a noun: food or a meal. So write zum Essen, not zum essen.</w:t>
+      </w:r>
+    </w:p>
+    <w:p>
+      <w:pPr>
+        <w:spacing w:before="40" w:after="60"/>
+        <w:ind w:left="576"/>
+      </w:pPr>
+      <w:r>
+        <w:rPr>
+          <w:i/>
+          <w:color w:val="30608C"/>
+          <w:sz w:val="21"/>
+        </w:rPr>
+        <w:t xml:space="preserve">› </w:t>
+      </w:r>
+      <w:r>
+        <w:rPr>
+          <w:i/>
+          <w:color w:val="30608C"/>
+          <w:sz w:val="21"/>
+        </w:rPr>
+        <w:t>Georg kommt heute zum Essen.</w:t>
+      </w:r>
+      <w:r>
+        <w:rPr>
+          <w:i/>
+          <w:color w:val="404040"/>
+          <w:sz w:val="21"/>
+        </w:rPr>
+        <w:t xml:space="preserve"> (Georg is coming for the meal today.)</w:t>
+      </w:r>
+    </w:p>
+    <w:p>
+      <w:pPr>
+        <w:spacing w:before="0" w:after="60"/>
+        <w:ind w:left="576"/>
+      </w:pPr>
+      <w:r>
+        <w:rPr>
+          <w:i/>
+          <w:color w:val="30608C"/>
+          <w:sz w:val="21"/>
+        </w:rPr>
+        <w:t xml:space="preserve">› </w:t>
+      </w:r>
+      <w:r>
+        <w:rPr>
+          <w:i/>
+          <w:color w:val="30608C"/>
+          <w:sz w:val="21"/>
+        </w:rPr>
+        <w:t>Wir essen zusammen.</w:t>
+      </w:r>
+      <w:r>
+        <w:rPr>
+          <w:i/>
+          <w:color w:val="404040"/>
+          <w:sz w:val="21"/>
+        </w:rPr>
+        <w:t xml:space="preserve"> (We are eating together.)</w:t>
+      </w:r>
+    </w:p>
+    <w:p>
+      <w:pPr>
+        <w:spacing w:before="0" w:after="120"/>
+        <w:ind w:left="576"/>
+      </w:pPr>
+      <w:r>
+        <w:rPr>
+          <w:i/>
+          <w:color w:val="30608C"/>
+          <w:sz w:val="21"/>
+        </w:rPr>
+        <w:t xml:space="preserve">› </w:t>
+      </w:r>
+      <w:r>
+        <w:rPr>
+          <w:i/>
+          <w:color w:val="30608C"/>
+          <w:sz w:val="21"/>
+        </w:rPr>
+        <w:t>Das Essen ist gut.</w:t>
+      </w:r>
+      <w:r>
+        <w:rPr>
+          <w:i/>
+          <w:color w:val="404040"/>
+          <w:sz w:val="21"/>
+        </w:rPr>
+        <w:t xml:space="preserve"> (The food is good.)</w:t>
+      </w:r>
+    </w:p>
+    <w:p>
+      <w:pPr>
+        <w:spacing w:before="0" w:after="0"/>
+      </w:pPr>
     </w:p>
     <w:p>
       <w:pPr>

</xml_diff>

<commit_message>
Update "gern" entry in vocab.docx and vocab.manifest.json
- Removed duplicate entry for "gern" and consolidated its details into a single comprehensive entry.
- Enhanced the entry with additional examples and notes to clarify usage and context for language learners.
- Maintained categorization under lesson 1 and level A1, ensuring consistency with previous vocabulary resources.
</commit_message>
<xml_diff>
--- a/vocab.docx
+++ b/vocab.docx
@@ -13,6 +13,212 @@
         </w:rPr>
         <w:t>daf — vocabulary</w:t>
       </w:r>
+    </w:p>
+    <w:p>
+      <w:pPr>
+        <w:spacing w:after="120"/>
+      </w:pPr>
+      <w:r>
+        <w:rPr>
+          <w:b/>
+        </w:rPr>
+        <w:t>gern</w:t>
+      </w:r>
+      <w:r>
+        <w:t xml:space="preserve"> /ɡɛʁn/</w:t>
+      </w:r>
+    </w:p>
+    <w:p>
+      <w:pPr>
+        <w:spacing w:after="80"/>
+        <w:ind w:left="576"/>
+      </w:pPr>
+      <w:r>
+        <w:t>Gladly; like to do something.</w:t>
+      </w:r>
+    </w:p>
+    <w:p>
+      <w:pPr>
+        <w:spacing w:after="80"/>
+        <w:ind w:left="576"/>
+      </w:pPr>
+      <w:r>
+        <w:rPr>
+          <w:i/>
+          <w:color w:val="404040"/>
+          <w:sz w:val="20"/>
+        </w:rPr>
+        <w:t>• gern and gerne mean the same thing; gerne sounds a little fuller/softer.</w:t>
+      </w:r>
+    </w:p>
+    <w:p>
+      <w:pPr>
+        <w:spacing w:after="80"/>
+        <w:ind w:left="576"/>
+      </w:pPr>
+      <w:r>
+        <w:rPr>
+          <w:i/>
+          <w:color w:val="404040"/>
+          <w:sz w:val="20"/>
+        </w:rPr>
+        <w:t>• With a verb, gern often translates naturally as like to: Ich lerne gern = I like learning.</w:t>
+      </w:r>
+    </w:p>
+    <w:p>
+      <w:pPr>
+        <w:spacing w:before="40" w:after="60"/>
+        <w:ind w:left="576"/>
+      </w:pPr>
+      <w:r>
+        <w:rPr>
+          <w:i/>
+          <w:color w:val="30608C"/>
+          <w:sz w:val="21"/>
+        </w:rPr>
+        <w:t xml:space="preserve">› </w:t>
+      </w:r>
+      <w:r>
+        <w:rPr>
+          <w:i/>
+          <w:color w:val="30608C"/>
+          <w:sz w:val="21"/>
+        </w:rPr>
+        <w:t>Ich lerne gern Deutsch.</w:t>
+      </w:r>
+      <w:r>
+        <w:rPr>
+          <w:i/>
+          <w:color w:val="404040"/>
+          <w:sz w:val="21"/>
+        </w:rPr>
+        <w:t xml:space="preserve"> (I like learning German.)</w:t>
+      </w:r>
+    </w:p>
+    <w:p>
+      <w:pPr>
+        <w:spacing w:before="0" w:after="60"/>
+        <w:ind w:left="576"/>
+      </w:pPr>
+      <w:r>
+        <w:rPr>
+          <w:i/>
+          <w:color w:val="30608C"/>
+          <w:sz w:val="21"/>
+        </w:rPr>
+        <w:t xml:space="preserve">› </w:t>
+      </w:r>
+      <w:r>
+        <w:rPr>
+          <w:i/>
+          <w:color w:val="30608C"/>
+          <w:sz w:val="21"/>
+        </w:rPr>
+        <w:t>Ich trinke gern Kaffee.</w:t>
+      </w:r>
+      <w:r>
+        <w:rPr>
+          <w:i/>
+          <w:color w:val="404040"/>
+          <w:sz w:val="21"/>
+        </w:rPr>
+        <w:t xml:space="preserve"> (I like drinking coffee.)</w:t>
+      </w:r>
+    </w:p>
+    <w:p>
+      <w:pPr>
+        <w:spacing w:before="0" w:after="60"/>
+        <w:ind w:left="576"/>
+      </w:pPr>
+      <w:r>
+        <w:rPr>
+          <w:i/>
+          <w:color w:val="30608C"/>
+          <w:sz w:val="21"/>
+        </w:rPr>
+        <w:t xml:space="preserve">› </w:t>
+      </w:r>
+      <w:r>
+        <w:rPr>
+          <w:i/>
+          <w:color w:val="30608C"/>
+          <w:sz w:val="21"/>
+        </w:rPr>
+        <w:t>Kommst du gern hierher?</w:t>
+      </w:r>
+      <w:r>
+        <w:rPr>
+          <w:i/>
+          <w:color w:val="404040"/>
+          <w:sz w:val="21"/>
+        </w:rPr>
+        <w:t xml:space="preserve"> (Do you like coming here?)</w:t>
+      </w:r>
+    </w:p>
+    <w:p>
+      <w:pPr>
+        <w:spacing w:before="0" w:after="60"/>
+        <w:ind w:left="576"/>
+      </w:pPr>
+      <w:r>
+        <w:rPr>
+          <w:i/>
+          <w:color w:val="30608C"/>
+          <w:sz w:val="21"/>
+        </w:rPr>
+        <w:t xml:space="preserve">› </w:t>
+      </w:r>
+      <w:r>
+        <w:rPr>
+          <w:i/>
+          <w:color w:val="30608C"/>
+          <w:sz w:val="21"/>
+        </w:rPr>
+        <w:t>Ja, gern!</w:t>
+      </w:r>
+      <w:r>
+        <w:rPr>
+          <w:i/>
+          <w:color w:val="404040"/>
+          <w:sz w:val="21"/>
+        </w:rPr>
+        <w:t xml:space="preserve"> (Yes, gladly! / Yes, sure!)</w:t>
+      </w:r>
+    </w:p>
+    <w:p>
+      <w:pPr>
+        <w:spacing w:before="0" w:after="120"/>
+        <w:ind w:left="576"/>
+      </w:pPr>
+      <w:r>
+        <w:rPr>
+          <w:i/>
+          <w:color w:val="30608C"/>
+          <w:sz w:val="21"/>
+        </w:rPr>
+        <w:t xml:space="preserve">› </w:t>
+      </w:r>
+      <w:r>
+        <w:rPr>
+          <w:i/>
+          <w:color w:val="30608C"/>
+          <w:sz w:val="21"/>
+        </w:rPr>
+        <w:t>Gern!</w:t>
+      </w:r>
+      <w:r>
+        <w:rPr>
+          <w:i/>
+          <w:color w:val="404040"/>
+          <w:sz w:val="21"/>
+        </w:rPr>
+        <w:t xml:space="preserve"> (Gladly! / Sure! / With pleasure!)</w:t>
+      </w:r>
+    </w:p>
+    <w:p>
+      <w:pPr>
+        <w:spacing w:before="0" w:after="0"/>
+      </w:pPr>
     </w:p>
     <w:p>
       <w:pPr>
@@ -1240,182 +1446,6 @@
           <w:sz w:val="21"/>
         </w:rPr>
         <w:t xml:space="preserve"> (the verb form of essen.)</w:t>
-      </w:r>
-    </w:p>
-    <w:p>
-      <w:pPr>
-        <w:spacing w:before="0" w:after="0"/>
-      </w:pPr>
-    </w:p>
-    <w:p>
-      <w:pPr>
-        <w:spacing w:after="120"/>
-      </w:pPr>
-      <w:r>
-        <w:rPr>
-          <w:b/>
-        </w:rPr>
-        <w:t>gern</w:t>
-      </w:r>
-      <w:r>
-        <w:t xml:space="preserve"> /ɡɛʁn/</w:t>
-      </w:r>
-    </w:p>
-    <w:p>
-      <w:pPr>
-        <w:spacing w:after="80"/>
-        <w:ind w:left="576"/>
-      </w:pPr>
-      <w:r>
-        <w:t>Gladly; like to do something.</w:t>
-      </w:r>
-    </w:p>
-    <w:p>
-      <w:pPr>
-        <w:spacing w:after="80"/>
-        <w:ind w:left="576"/>
-      </w:pPr>
-      <w:r>
-        <w:rPr>
-          <w:i/>
-          <w:color w:val="404040"/>
-          <w:sz w:val="20"/>
-        </w:rPr>
-        <w:t>• gern and gerne mean the same thing; gerne sounds a little fuller/softer.</w:t>
-      </w:r>
-    </w:p>
-    <w:p>
-      <w:pPr>
-        <w:spacing w:after="80"/>
-        <w:ind w:left="576"/>
-      </w:pPr>
-      <w:r>
-        <w:rPr>
-          <w:i/>
-          <w:color w:val="404040"/>
-          <w:sz w:val="20"/>
-        </w:rPr>
-        <w:t>• With a verb, gern often translates naturally as like to: Ich lerne gern = I like learning.</w:t>
-      </w:r>
-    </w:p>
-    <w:p>
-      <w:pPr>
-        <w:spacing w:before="40" w:after="60"/>
-        <w:ind w:left="576"/>
-      </w:pPr>
-      <w:r>
-        <w:rPr>
-          <w:i/>
-          <w:color w:val="30608C"/>
-          <w:sz w:val="21"/>
-        </w:rPr>
-        <w:t xml:space="preserve">› </w:t>
-      </w:r>
-      <w:r>
-        <w:rPr>
-          <w:i/>
-          <w:color w:val="30608C"/>
-          <w:sz w:val="21"/>
-        </w:rPr>
-        <w:t>Ich lerne gern Deutsch.</w:t>
-      </w:r>
-      <w:r>
-        <w:rPr>
-          <w:i/>
-          <w:color w:val="404040"/>
-          <w:sz w:val="21"/>
-        </w:rPr>
-        <w:t xml:space="preserve"> (I like learning German.)</w:t>
-      </w:r>
-    </w:p>
-    <w:p>
-      <w:pPr>
-        <w:spacing w:before="0" w:after="60"/>
-        <w:ind w:left="576"/>
-      </w:pPr>
-      <w:r>
-        <w:rPr>
-          <w:i/>
-          <w:color w:val="30608C"/>
-          <w:sz w:val="21"/>
-        </w:rPr>
-        <w:t xml:space="preserve">› </w:t>
-      </w:r>
-      <w:r>
-        <w:rPr>
-          <w:i/>
-          <w:color w:val="30608C"/>
-          <w:sz w:val="21"/>
-        </w:rPr>
-        <w:t>Ich trinke gern Kaffee.</w:t>
-      </w:r>
-      <w:r>
-        <w:rPr>
-          <w:i/>
-          <w:color w:val="404040"/>
-          <w:sz w:val="21"/>
-        </w:rPr>
-        <w:t xml:space="preserve"> (I like drinking coffee.)</w:t>
-      </w:r>
-    </w:p>
-    <w:p>
-      <w:pPr>
-        <w:spacing w:before="0" w:after="60"/>
-        <w:ind w:left="576"/>
-      </w:pPr>
-      <w:r>
-        <w:rPr>
-          <w:i/>
-          <w:color w:val="30608C"/>
-          <w:sz w:val="21"/>
-        </w:rPr>
-        <w:t xml:space="preserve">› </w:t>
-      </w:r>
-      <w:r>
-        <w:rPr>
-          <w:i/>
-          <w:color w:val="30608C"/>
-          <w:sz w:val="21"/>
-        </w:rPr>
-        <w:t>Kommst du gern hierher?</w:t>
-      </w:r>
-      <w:r>
-        <w:rPr>
-          <w:i/>
-          <w:color w:val="404040"/>
-          <w:sz w:val="21"/>
-        </w:rPr>
-        <w:t xml:space="preserve"> (Do you like coming here?)</w:t>
-      </w:r>
-    </w:p>
-    <w:p>
-      <w:pPr>
-        <w:spacing w:before="0" w:after="120"/>
-        <w:ind w:left="576"/>
-      </w:pPr>
-      <w:r>
-        <w:rPr>
-          <w:i/>
-          <w:color w:val="30608C"/>
-          <w:sz w:val="21"/>
-        </w:rPr>
-        <w:t xml:space="preserve">› </w:t>
-      </w:r>
-      <w:r>
-        <w:rPr>
-          <w:i/>
-          <w:color w:val="30608C"/>
-          <w:sz w:val="21"/>
-        </w:rPr>
-        <w:t>Gern!</w:t>
-      </w:r>
-      <w:r>
-        <w:rPr>
-          <w:i/>
-          <w:color w:val="404040"/>
-          <w:sz w:val="21"/>
-        </w:rPr>
-        <w:t xml:space="preserve"> (Gladly! / Sure! / With pleasure!)</w:t>
       </w:r>
     </w:p>
     <w:p>

</xml_diff>

<commit_message>
Add new vocabulary entries for "die Telefonnummer," "die Straße," and "wohnen" in vocab.docx and vocab.manifest.json
- Introduced detailed entries for each term, including glosses, notes, and examples in both German and English.
- All entries are categorized under lesson 1 and level A1 for language learners, enhancing the vocabulary resource with practical usage and common phrases.
</commit_message>
<xml_diff>
--- a/vocab.docx
+++ b/vocab.docx
@@ -13,6 +13,468 @@
         </w:rPr>
         <w:t>daf — vocabulary</w:t>
       </w:r>
+    </w:p>
+    <w:p>
+      <w:pPr>
+        <w:spacing w:after="120"/>
+      </w:pPr>
+      <w:r>
+        <w:rPr>
+          <w:b/>
+        </w:rPr>
+        <w:t>die Telefonnummer</w:t>
+      </w:r>
+      <w:r>
+        <w:t xml:space="preserve"> /teˈlefoːnˌnʊmɐ/</w:t>
+      </w:r>
+    </w:p>
+    <w:p>
+      <w:pPr>
+        <w:spacing w:after="80"/>
+        <w:ind w:left="576"/>
+      </w:pPr>
+      <w:r>
+        <w:rPr>
+          <w:sz w:val="22"/>
+        </w:rPr>
+        <w:t>die Telefonnummer, -n</w:t>
+      </w:r>
+    </w:p>
+    <w:p>
+      <w:pPr>
+        <w:spacing w:after="80"/>
+        <w:ind w:left="576"/>
+      </w:pPr>
+      <w:r>
+        <w:t>Telephone number; phone number.</w:t>
+      </w:r>
+    </w:p>
+    <w:p>
+      <w:pPr>
+        <w:spacing w:after="80"/>
+        <w:ind w:left="576"/>
+      </w:pPr>
+      <w:r>
+        <w:rPr>
+          <w:i/>
+          <w:color w:val="404040"/>
+          <w:sz w:val="20"/>
+        </w:rPr>
+        <w:t>• die Nummer + das Telefon becomes die Telefonnummer: a compound noun with the gender of Nummer.</w:t>
+      </w:r>
+    </w:p>
+    <w:p>
+      <w:pPr>
+        <w:spacing w:after="80"/>
+        <w:ind w:left="576"/>
+      </w:pPr>
+      <w:r>
+        <w:rPr>
+          <w:i/>
+          <w:color w:val="404040"/>
+          <w:sz w:val="20"/>
+        </w:rPr>
+        <w:t>• In German, ask Wie ist deine Telefonnummer? literally: How is your phone number?</w:t>
+      </w:r>
+    </w:p>
+    <w:p>
+      <w:pPr>
+        <w:spacing w:before="40" w:after="60"/>
+        <w:ind w:left="576"/>
+      </w:pPr>
+      <w:r>
+        <w:rPr>
+          <w:i/>
+          <w:color w:val="30608C"/>
+          <w:sz w:val="21"/>
+        </w:rPr>
+        <w:t xml:space="preserve">› </w:t>
+      </w:r>
+      <w:r>
+        <w:rPr>
+          <w:i/>
+          <w:color w:val="30608C"/>
+          <w:sz w:val="21"/>
+        </w:rPr>
+        <w:t>Wie ist deine Telefonnummer?</w:t>
+      </w:r>
+      <w:r>
+        <w:rPr>
+          <w:i/>
+          <w:color w:val="404040"/>
+          <w:sz w:val="21"/>
+        </w:rPr>
+        <w:t xml:space="preserve"> (What is your phone number?)</w:t>
+      </w:r>
+    </w:p>
+    <w:p>
+      <w:pPr>
+        <w:spacing w:before="0" w:after="60"/>
+        <w:ind w:left="576"/>
+      </w:pPr>
+      <w:r>
+        <w:rPr>
+          <w:i/>
+          <w:color w:val="30608C"/>
+          <w:sz w:val="21"/>
+        </w:rPr>
+        <w:t xml:space="preserve">› </w:t>
+      </w:r>
+      <w:r>
+        <w:rPr>
+          <w:i/>
+          <w:color w:val="30608C"/>
+          <w:sz w:val="21"/>
+        </w:rPr>
+        <w:t>Anne: Meine Telefonnummer ist 0621 / 53487.</w:t>
+      </w:r>
+      <w:r>
+        <w:rPr>
+          <w:i/>
+          <w:color w:val="404040"/>
+          <w:sz w:val="21"/>
+        </w:rPr>
+        <w:t xml:space="preserve"> (Anne: My phone number is 0621 / 53487.)</w:t>
+      </w:r>
+    </w:p>
+    <w:p>
+      <w:pPr>
+        <w:spacing w:before="0" w:after="120"/>
+        <w:ind w:left="576"/>
+      </w:pPr>
+      <w:r>
+        <w:rPr>
+          <w:i/>
+          <w:color w:val="30608C"/>
+          <w:sz w:val="21"/>
+        </w:rPr>
+        <w:t xml:space="preserve">› </w:t>
+      </w:r>
+      <w:r>
+        <w:rPr>
+          <w:i/>
+          <w:color w:val="30608C"/>
+          <w:sz w:val="21"/>
+        </w:rPr>
+        <w:t>Das ist die Telefonnummer von Maria.</w:t>
+      </w:r>
+      <w:r>
+        <w:rPr>
+          <w:i/>
+          <w:color w:val="404040"/>
+          <w:sz w:val="21"/>
+        </w:rPr>
+        <w:t xml:space="preserve"> (That is Maria's phone number.)</w:t>
+      </w:r>
+    </w:p>
+    <w:p>
+      <w:pPr>
+        <w:spacing w:before="0" w:after="0"/>
+      </w:pPr>
+    </w:p>
+    <w:p>
+      <w:pPr>
+        <w:spacing w:after="120"/>
+      </w:pPr>
+      <w:r>
+        <w:rPr>
+          <w:b/>
+        </w:rPr>
+        <w:t>die Straße</w:t>
+      </w:r>
+      <w:r>
+        <w:t xml:space="preserve"> /ˈʃtʁaːsə/</w:t>
+      </w:r>
+    </w:p>
+    <w:p>
+      <w:pPr>
+        <w:spacing w:after="80"/>
+        <w:ind w:left="576"/>
+      </w:pPr>
+      <w:r>
+        <w:rPr>
+          <w:sz w:val="22"/>
+        </w:rPr>
+        <w:t>die Straße, -n</w:t>
+      </w:r>
+    </w:p>
+    <w:p>
+      <w:pPr>
+        <w:spacing w:after="80"/>
+        <w:ind w:left="576"/>
+      </w:pPr>
+      <w:r>
+        <w:t>Street; road.</w:t>
+      </w:r>
+    </w:p>
+    <w:p>
+      <w:pPr>
+        <w:spacing w:after="80"/>
+        <w:ind w:left="576"/>
+      </w:pPr>
+      <w:r>
+        <w:rPr>
+          <w:i/>
+          <w:color w:val="404040"/>
+          <w:sz w:val="20"/>
+        </w:rPr>
+        <w:t>• Standard German spelling uses ß: Straße. In Switzerland, it is usually written Strasse.</w:t>
+      </w:r>
+    </w:p>
+    <w:p>
+      <w:pPr>
+        <w:spacing w:after="80"/>
+        <w:ind w:left="576"/>
+      </w:pPr>
+      <w:r>
+        <w:rPr>
+          <w:i/>
+          <w:color w:val="404040"/>
+          <w:sz w:val="20"/>
+        </w:rPr>
+        <w:t>• In der Bergstraße uses Dativ: wohnen answers where?; with location, in + feminine die Straße becomes in der Straße.</w:t>
+      </w:r>
+    </w:p>
+    <w:p>
+      <w:pPr>
+        <w:spacing w:before="40" w:after="60"/>
+        <w:ind w:left="576"/>
+      </w:pPr>
+      <w:r>
+        <w:rPr>
+          <w:i/>
+          <w:color w:val="30608C"/>
+          <w:sz w:val="21"/>
+        </w:rPr>
+        <w:t xml:space="preserve">› </w:t>
+      </w:r>
+      <w:r>
+        <w:rPr>
+          <w:i/>
+          <w:color w:val="30608C"/>
+          <w:sz w:val="21"/>
+        </w:rPr>
+        <w:t>Ich wohne in Mannheim in der Bergstraße 10.</w:t>
+      </w:r>
+      <w:r>
+        <w:rPr>
+          <w:i/>
+          <w:color w:val="404040"/>
+          <w:sz w:val="21"/>
+        </w:rPr>
+        <w:t xml:space="preserve"> (I live in Mannheim at 10 Bergstraße.)</w:t>
+      </w:r>
+    </w:p>
+    <w:p>
+      <w:pPr>
+        <w:spacing w:before="0" w:after="60"/>
+        <w:ind w:left="576"/>
+      </w:pPr>
+      <w:r>
+        <w:rPr>
+          <w:i/>
+          <w:color w:val="30608C"/>
+          <w:sz w:val="21"/>
+        </w:rPr>
+        <w:t xml:space="preserve">› </w:t>
+      </w:r>
+      <w:r>
+        <w:rPr>
+          <w:i/>
+          <w:color w:val="30608C"/>
+          <w:sz w:val="21"/>
+        </w:rPr>
+        <w:t>Die Straße ist lang.</w:t>
+      </w:r>
+      <w:r>
+        <w:rPr>
+          <w:i/>
+          <w:color w:val="404040"/>
+          <w:sz w:val="21"/>
+        </w:rPr>
+        <w:t xml:space="preserve"> (The street is long.)</w:t>
+      </w:r>
+    </w:p>
+    <w:p>
+      <w:pPr>
+        <w:spacing w:before="0" w:after="120"/>
+        <w:ind w:left="576"/>
+      </w:pPr>
+      <w:r>
+        <w:rPr>
+          <w:i/>
+          <w:color w:val="30608C"/>
+          <w:sz w:val="21"/>
+        </w:rPr>
+        <w:t xml:space="preserve">› </w:t>
+      </w:r>
+      <w:r>
+        <w:rPr>
+          <w:i/>
+          <w:color w:val="30608C"/>
+          <w:sz w:val="21"/>
+        </w:rPr>
+        <w:t>Wie heißt die Straße?</w:t>
+      </w:r>
+      <w:r>
+        <w:rPr>
+          <w:i/>
+          <w:color w:val="404040"/>
+          <w:sz w:val="21"/>
+        </w:rPr>
+        <w:t xml:space="preserve"> (What is the street called?)</w:t>
+      </w:r>
+    </w:p>
+    <w:p>
+      <w:pPr>
+        <w:spacing w:before="0" w:after="0"/>
+      </w:pPr>
+    </w:p>
+    <w:p>
+      <w:pPr>
+        <w:spacing w:after="120"/>
+      </w:pPr>
+      <w:r>
+        <w:rPr>
+          <w:b/>
+        </w:rPr>
+        <w:t>wohnen</w:t>
+      </w:r>
+      <w:r>
+        <w:t xml:space="preserve"> /ˈvoːnən/</w:t>
+      </w:r>
+    </w:p>
+    <w:p>
+      <w:pPr>
+        <w:spacing w:after="80"/>
+        <w:ind w:left="576"/>
+      </w:pPr>
+      <w:r>
+        <w:t>To live; reside.</w:t>
+      </w:r>
+    </w:p>
+    <w:p>
+      <w:pPr>
+        <w:spacing w:after="80"/>
+        <w:ind w:left="576"/>
+      </w:pPr>
+      <w:r>
+        <w:rPr>
+          <w:i/>
+          <w:color w:val="404040"/>
+          <w:sz w:val="20"/>
+        </w:rPr>
+        <w:t>• Use wohnen for where someone lives: Ich wohne in Berlin.</w:t>
+      </w:r>
+    </w:p>
+    <w:p>
+      <w:pPr>
+        <w:spacing w:after="80"/>
+        <w:ind w:left="576"/>
+      </w:pPr>
+      <w:r>
+        <w:rPr>
+          <w:i/>
+          <w:color w:val="404040"/>
+          <w:sz w:val="20"/>
+        </w:rPr>
+        <w:t>• Common question: Wo wohnen Sie? = Where do you live? [formal you]</w:t>
+      </w:r>
+    </w:p>
+    <w:p>
+      <w:pPr>
+        <w:spacing w:before="40" w:after="60"/>
+        <w:ind w:left="576"/>
+      </w:pPr>
+      <w:r>
+        <w:rPr>
+          <w:i/>
+          <w:color w:val="30608C"/>
+          <w:sz w:val="21"/>
+        </w:rPr>
+        <w:t xml:space="preserve">› </w:t>
+      </w:r>
+      <w:r>
+        <w:rPr>
+          <w:i/>
+          <w:color w:val="30608C"/>
+          <w:sz w:val="21"/>
+        </w:rPr>
+        <w:t>Wo wohnen Sie?</w:t>
+      </w:r>
+      <w:r>
+        <w:rPr>
+          <w:i/>
+          <w:color w:val="404040"/>
+          <w:sz w:val="21"/>
+        </w:rPr>
+        <w:t xml:space="preserve"> (Where do you live? [formal you])</w:t>
+      </w:r>
+    </w:p>
+    <w:p>
+      <w:pPr>
+        <w:spacing w:before="0" w:after="60"/>
+        <w:ind w:left="576"/>
+      </w:pPr>
+      <w:r>
+        <w:rPr>
+          <w:i/>
+          <w:color w:val="30608C"/>
+          <w:sz w:val="21"/>
+        </w:rPr>
+        <w:t xml:space="preserve">› </w:t>
+      </w:r>
+      <w:r>
+        <w:rPr>
+          <w:i/>
+          <w:color w:val="30608C"/>
+          <w:sz w:val="21"/>
+        </w:rPr>
+        <w:t>Ich wohne in Berlin.</w:t>
+      </w:r>
+      <w:r>
+        <w:rPr>
+          <w:i/>
+          <w:color w:val="404040"/>
+          <w:sz w:val="21"/>
+        </w:rPr>
+        <w:t xml:space="preserve"> (I live in Berlin.)</w:t>
+      </w:r>
+    </w:p>
+    <w:p>
+      <w:pPr>
+        <w:spacing w:before="0" w:after="120"/>
+        <w:ind w:left="576"/>
+      </w:pPr>
+      <w:r>
+        <w:rPr>
+          <w:i/>
+          <w:color w:val="30608C"/>
+          <w:sz w:val="21"/>
+        </w:rPr>
+        <w:t xml:space="preserve">› </w:t>
+      </w:r>
+      <w:r>
+        <w:rPr>
+          <w:i/>
+          <w:color w:val="30608C"/>
+          <w:sz w:val="21"/>
+        </w:rPr>
+        <w:t>Er wohnt in München.</w:t>
+      </w:r>
+      <w:r>
+        <w:rPr>
+          <w:i/>
+          <w:color w:val="404040"/>
+          <w:sz w:val="21"/>
+        </w:rPr>
+        <w:t xml:space="preserve"> (He lives in Munich.)</w:t>
+      </w:r>
+    </w:p>
+    <w:p>
+      <w:pPr>
+        <w:spacing w:before="0" w:after="0"/>
+      </w:pPr>
     </w:p>
     <w:p>
       <w:pPr>

</xml_diff>

<commit_message>
Enhance vocabulary entries for "wiederholen" and "wieder" in vocab.docx and vocab.manifest.json
- Added detailed entries for "wiederholen" and "wieder," including glosses, notes, and multiple examples in both German and English.
- Removed previous duplicate entries to streamline the vocabulary resource.
- Both entries are categorized under lesson 1 and level A1, providing learners with practical usage and context.
</commit_message>
<xml_diff>
--- a/vocab.docx
+++ b/vocab.docx
@@ -13,6 +13,316 @@
         </w:rPr>
         <w:t>daf — vocabulary</w:t>
       </w:r>
+    </w:p>
+    <w:p>
+      <w:pPr>
+        <w:spacing w:after="120"/>
+      </w:pPr>
+      <w:r>
+        <w:rPr>
+          <w:b/>
+        </w:rPr>
+        <w:t>wiederholen</w:t>
+      </w:r>
+      <w:r>
+        <w:t xml:space="preserve"> /viːdɐˈhoːlən/</w:t>
+      </w:r>
+    </w:p>
+    <w:p>
+      <w:pPr>
+        <w:spacing w:after="80"/>
+        <w:ind w:left="576"/>
+      </w:pPr>
+      <w:r>
+        <w:t>To repeat; say or do again.</w:t>
+      </w:r>
+    </w:p>
+    <w:p>
+      <w:pPr>
+        <w:spacing w:before="40" w:after="60"/>
+        <w:ind w:left="576"/>
+      </w:pPr>
+      <w:r>
+        <w:rPr>
+          <w:i/>
+          <w:color w:val="30608C"/>
+          <w:sz w:val="21"/>
+        </w:rPr>
+        <w:t xml:space="preserve">› </w:t>
+      </w:r>
+      <w:r>
+        <w:rPr>
+          <w:i/>
+          <w:color w:val="30608C"/>
+          <w:sz w:val="21"/>
+        </w:rPr>
+        <w:t>Bitte wiederholen Sie das.</w:t>
+      </w:r>
+      <w:r>
+        <w:rPr>
+          <w:i/>
+          <w:color w:val="404040"/>
+          <w:sz w:val="21"/>
+        </w:rPr>
+        <w:t xml:space="preserve"> (Please repeat that.)</w:t>
+      </w:r>
+    </w:p>
+    <w:p>
+      <w:pPr>
+        <w:spacing w:before="0" w:after="60"/>
+        <w:ind w:left="576"/>
+      </w:pPr>
+      <w:r>
+        <w:rPr>
+          <w:i/>
+          <w:color w:val="30608C"/>
+          <w:sz w:val="21"/>
+        </w:rPr>
+        <w:t xml:space="preserve">› </w:t>
+      </w:r>
+      <w:r>
+        <w:rPr>
+          <w:i/>
+          <w:color w:val="30608C"/>
+          <w:sz w:val="21"/>
+        </w:rPr>
+        <w:t>Wiederholen Sie bitte die Frage.</w:t>
+      </w:r>
+      <w:r>
+        <w:rPr>
+          <w:i/>
+          <w:color w:val="404040"/>
+          <w:sz w:val="21"/>
+        </w:rPr>
+        <w:t xml:space="preserve"> (Please repeat the question. [formal you])</w:t>
+      </w:r>
+    </w:p>
+    <w:p>
+      <w:pPr>
+        <w:spacing w:before="0" w:after="60"/>
+        <w:ind w:left="576"/>
+      </w:pPr>
+      <w:r>
+        <w:rPr>
+          <w:i/>
+          <w:color w:val="30608C"/>
+          <w:sz w:val="21"/>
+        </w:rPr>
+        <w:t xml:space="preserve">› </w:t>
+      </w:r>
+      <w:r>
+        <w:rPr>
+          <w:i/>
+          <w:color w:val="30608C"/>
+          <w:sz w:val="21"/>
+        </w:rPr>
+        <w:t>Du wiederholst den Satz.</w:t>
+      </w:r>
+      <w:r>
+        <w:rPr>
+          <w:i/>
+          <w:color w:val="404040"/>
+          <w:sz w:val="21"/>
+        </w:rPr>
+        <w:t xml:space="preserve"> (You repeat the sentence. [informal you])</w:t>
+      </w:r>
+    </w:p>
+    <w:p>
+      <w:pPr>
+        <w:spacing w:before="0" w:after="120"/>
+        <w:ind w:left="576"/>
+      </w:pPr>
+      <w:r>
+        <w:rPr>
+          <w:i/>
+          <w:color w:val="30608C"/>
+          <w:sz w:val="21"/>
+        </w:rPr>
+        <w:t xml:space="preserve">› </w:t>
+      </w:r>
+      <w:r>
+        <w:rPr>
+          <w:i/>
+          <w:color w:val="30608C"/>
+          <w:sz w:val="21"/>
+        </w:rPr>
+        <w:t>Er wiederholt die Regel.</w:t>
+      </w:r>
+      <w:r>
+        <w:rPr>
+          <w:i/>
+          <w:color w:val="404040"/>
+          <w:sz w:val="21"/>
+        </w:rPr>
+        <w:t xml:space="preserve"> (He repeats the rule.)</w:t>
+      </w:r>
+    </w:p>
+    <w:p>
+      <w:pPr>
+        <w:spacing w:before="0" w:after="0"/>
+      </w:pPr>
+    </w:p>
+    <w:p>
+      <w:pPr>
+        <w:spacing w:after="120"/>
+      </w:pPr>
+      <w:r>
+        <w:rPr>
+          <w:b/>
+        </w:rPr>
+        <w:t>wieder</w:t>
+      </w:r>
+      <w:r>
+        <w:t xml:space="preserve"> /ˈviːdɐ/</w:t>
+      </w:r>
+    </w:p>
+    <w:p>
+      <w:pPr>
+        <w:spacing w:after="80"/>
+        <w:ind w:left="576"/>
+      </w:pPr>
+      <w:r>
+        <w:t>Again; back again.</w:t>
+      </w:r>
+    </w:p>
+    <w:p>
+      <w:pPr>
+        <w:spacing w:after="80"/>
+        <w:ind w:left="576"/>
+      </w:pPr>
+      <w:r>
+        <w:rPr>
+          <w:i/>
+          <w:color w:val="404040"/>
+          <w:sz w:val="20"/>
+        </w:rPr>
+        <w:t>• Do not confuse wieder (again) with wider (against).</w:t>
+      </w:r>
+    </w:p>
+    <w:p>
+      <w:pPr>
+        <w:spacing w:before="40" w:after="60"/>
+        <w:ind w:left="576"/>
+      </w:pPr>
+      <w:r>
+        <w:rPr>
+          <w:i/>
+          <w:color w:val="30608C"/>
+          <w:sz w:val="21"/>
+        </w:rPr>
+        <w:t xml:space="preserve">› </w:t>
+      </w:r>
+      <w:r>
+        <w:rPr>
+          <w:i/>
+          <w:color w:val="30608C"/>
+          <w:sz w:val="21"/>
+        </w:rPr>
+        <w:t>Noch einmal, bitte.</w:t>
+      </w:r>
+      <w:r>
+        <w:rPr>
+          <w:i/>
+          <w:color w:val="404040"/>
+          <w:sz w:val="21"/>
+        </w:rPr>
+        <w:t xml:space="preserve"> (One more time, please.)</w:t>
+      </w:r>
+    </w:p>
+    <w:p>
+      <w:pPr>
+        <w:spacing w:before="0" w:after="60"/>
+        <w:ind w:left="576"/>
+      </w:pPr>
+      <w:r>
+        <w:rPr>
+          <w:i/>
+          <w:color w:val="30608C"/>
+          <w:sz w:val="21"/>
+        </w:rPr>
+        <w:t xml:space="preserve">› </w:t>
+      </w:r>
+      <w:r>
+        <w:rPr>
+          <w:i/>
+          <w:color w:val="30608C"/>
+          <w:sz w:val="21"/>
+        </w:rPr>
+        <w:t>Bitte wiederholen Sie das.</w:t>
+      </w:r>
+      <w:r>
+        <w:rPr>
+          <w:i/>
+          <w:color w:val="404040"/>
+          <w:sz w:val="21"/>
+        </w:rPr>
+        <w:t xml:space="preserve"> (Please repeat that.)</w:t>
+      </w:r>
+    </w:p>
+    <w:p>
+      <w:pPr>
+        <w:spacing w:before="0" w:after="60"/>
+        <w:ind w:left="576"/>
+      </w:pPr>
+      <w:r>
+        <w:rPr>
+          <w:i/>
+          <w:color w:val="30608C"/>
+          <w:sz w:val="21"/>
+        </w:rPr>
+        <w:t xml:space="preserve">› </w:t>
+      </w:r>
+      <w:r>
+        <w:rPr>
+          <w:i/>
+          <w:color w:val="30608C"/>
+          <w:sz w:val="21"/>
+        </w:rPr>
+        <w:t>Ich bin wieder da.</w:t>
+      </w:r>
+      <w:r>
+        <w:rPr>
+          <w:i/>
+          <w:color w:val="404040"/>
+          <w:sz w:val="21"/>
+        </w:rPr>
+        <w:t xml:space="preserve"> (I'm back again.)</w:t>
+      </w:r>
+    </w:p>
+    <w:p>
+      <w:pPr>
+        <w:spacing w:before="0" w:after="120"/>
+        <w:ind w:left="576"/>
+      </w:pPr>
+      <w:r>
+        <w:rPr>
+          <w:i/>
+          <w:color w:val="30608C"/>
+          <w:sz w:val="21"/>
+        </w:rPr>
+        <w:t xml:space="preserve">› </w:t>
+      </w:r>
+      <w:r>
+        <w:rPr>
+          <w:i/>
+          <w:color w:val="30608C"/>
+          <w:sz w:val="21"/>
+        </w:rPr>
+        <w:t>Bis morgen! Wir sehen uns wieder.</w:t>
+      </w:r>
+      <w:r>
+        <w:rPr>
+          <w:i/>
+          <w:color w:val="404040"/>
+          <w:sz w:val="21"/>
+        </w:rPr>
+        <w:t xml:space="preserve"> (See you tomorrow! We'll see each other again.)</w:t>
+      </w:r>
+    </w:p>
+    <w:p>
+      <w:pPr>
+        <w:spacing w:before="0" w:after="0"/>
+      </w:pPr>
     </w:p>
     <w:p>
       <w:pPr>
@@ -1908,316 +2218,6 @@
           <w:sz w:val="21"/>
         </w:rPr>
         <w:t xml:space="preserve"> (the verb form of essen.)</w:t>
-      </w:r>
-    </w:p>
-    <w:p>
-      <w:pPr>
-        <w:spacing w:before="0" w:after="0"/>
-      </w:pPr>
-    </w:p>
-    <w:p>
-      <w:pPr>
-        <w:spacing w:after="120"/>
-      </w:pPr>
-      <w:r>
-        <w:rPr>
-          <w:b/>
-        </w:rPr>
-        <w:t>wiederholen</w:t>
-      </w:r>
-      <w:r>
-        <w:t xml:space="preserve"> /viːdɐˈhoːlən/</w:t>
-      </w:r>
-    </w:p>
-    <w:p>
-      <w:pPr>
-        <w:spacing w:after="80"/>
-        <w:ind w:left="576"/>
-      </w:pPr>
-      <w:r>
-        <w:t>To repeat; say or do again.</w:t>
-      </w:r>
-    </w:p>
-    <w:p>
-      <w:pPr>
-        <w:spacing w:before="40" w:after="60"/>
-        <w:ind w:left="576"/>
-      </w:pPr>
-      <w:r>
-        <w:rPr>
-          <w:i/>
-          <w:color w:val="30608C"/>
-          <w:sz w:val="21"/>
-        </w:rPr>
-        <w:t xml:space="preserve">› </w:t>
-      </w:r>
-      <w:r>
-        <w:rPr>
-          <w:i/>
-          <w:color w:val="30608C"/>
-          <w:sz w:val="21"/>
-        </w:rPr>
-        <w:t>Bitte wiederholen Sie das.</w:t>
-      </w:r>
-      <w:r>
-        <w:rPr>
-          <w:i/>
-          <w:color w:val="404040"/>
-          <w:sz w:val="21"/>
-        </w:rPr>
-        <w:t xml:space="preserve"> (Please repeat that.)</w:t>
-      </w:r>
-    </w:p>
-    <w:p>
-      <w:pPr>
-        <w:spacing w:before="0" w:after="60"/>
-        <w:ind w:left="576"/>
-      </w:pPr>
-      <w:r>
-        <w:rPr>
-          <w:i/>
-          <w:color w:val="30608C"/>
-          <w:sz w:val="21"/>
-        </w:rPr>
-        <w:t xml:space="preserve">› </w:t>
-      </w:r>
-      <w:r>
-        <w:rPr>
-          <w:i/>
-          <w:color w:val="30608C"/>
-          <w:sz w:val="21"/>
-        </w:rPr>
-        <w:t>Wiederholen Sie bitte die Frage.</w:t>
-      </w:r>
-      <w:r>
-        <w:rPr>
-          <w:i/>
-          <w:color w:val="404040"/>
-          <w:sz w:val="21"/>
-        </w:rPr>
-        <w:t xml:space="preserve"> (Please repeat the question. [formal you])</w:t>
-      </w:r>
-    </w:p>
-    <w:p>
-      <w:pPr>
-        <w:spacing w:before="0" w:after="60"/>
-        <w:ind w:left="576"/>
-      </w:pPr>
-      <w:r>
-        <w:rPr>
-          <w:i/>
-          <w:color w:val="30608C"/>
-          <w:sz w:val="21"/>
-        </w:rPr>
-        <w:t xml:space="preserve">› </w:t>
-      </w:r>
-      <w:r>
-        <w:rPr>
-          <w:i/>
-          <w:color w:val="30608C"/>
-          <w:sz w:val="21"/>
-        </w:rPr>
-        <w:t>Du wiederholst den Satz.</w:t>
-      </w:r>
-      <w:r>
-        <w:rPr>
-          <w:i/>
-          <w:color w:val="404040"/>
-          <w:sz w:val="21"/>
-        </w:rPr>
-        <w:t xml:space="preserve"> (You repeat the sentence. [informal you])</w:t>
-      </w:r>
-    </w:p>
-    <w:p>
-      <w:pPr>
-        <w:spacing w:before="0" w:after="120"/>
-        <w:ind w:left="576"/>
-      </w:pPr>
-      <w:r>
-        <w:rPr>
-          <w:i/>
-          <w:color w:val="30608C"/>
-          <w:sz w:val="21"/>
-        </w:rPr>
-        <w:t xml:space="preserve">› </w:t>
-      </w:r>
-      <w:r>
-        <w:rPr>
-          <w:i/>
-          <w:color w:val="30608C"/>
-          <w:sz w:val="21"/>
-        </w:rPr>
-        <w:t>Er wiederholt die Regel.</w:t>
-      </w:r>
-      <w:r>
-        <w:rPr>
-          <w:i/>
-          <w:color w:val="404040"/>
-          <w:sz w:val="21"/>
-        </w:rPr>
-        <w:t xml:space="preserve"> (He repeats the rule.)</w:t>
-      </w:r>
-    </w:p>
-    <w:p>
-      <w:pPr>
-        <w:spacing w:before="0" w:after="0"/>
-      </w:pPr>
-    </w:p>
-    <w:p>
-      <w:pPr>
-        <w:spacing w:after="120"/>
-      </w:pPr>
-      <w:r>
-        <w:rPr>
-          <w:b/>
-        </w:rPr>
-        <w:t>wieder</w:t>
-      </w:r>
-      <w:r>
-        <w:t xml:space="preserve"> /ˈviːdɐ/</w:t>
-      </w:r>
-    </w:p>
-    <w:p>
-      <w:pPr>
-        <w:spacing w:after="80"/>
-        <w:ind w:left="576"/>
-      </w:pPr>
-      <w:r>
-        <w:t>Again; back again.</w:t>
-      </w:r>
-    </w:p>
-    <w:p>
-      <w:pPr>
-        <w:spacing w:after="80"/>
-        <w:ind w:left="576"/>
-      </w:pPr>
-      <w:r>
-        <w:rPr>
-          <w:i/>
-          <w:color w:val="404040"/>
-          <w:sz w:val="20"/>
-        </w:rPr>
-        <w:t>• Do not confuse wieder (again) with wider (against).</w:t>
-      </w:r>
-    </w:p>
-    <w:p>
-      <w:pPr>
-        <w:spacing w:before="40" w:after="60"/>
-        <w:ind w:left="576"/>
-      </w:pPr>
-      <w:r>
-        <w:rPr>
-          <w:i/>
-          <w:color w:val="30608C"/>
-          <w:sz w:val="21"/>
-        </w:rPr>
-        <w:t xml:space="preserve">› </w:t>
-      </w:r>
-      <w:r>
-        <w:rPr>
-          <w:i/>
-          <w:color w:val="30608C"/>
-          <w:sz w:val="21"/>
-        </w:rPr>
-        <w:t>Noch einmal, bitte.</w:t>
-      </w:r>
-      <w:r>
-        <w:rPr>
-          <w:i/>
-          <w:color w:val="404040"/>
-          <w:sz w:val="21"/>
-        </w:rPr>
-        <w:t xml:space="preserve"> (One more time, please.)</w:t>
-      </w:r>
-    </w:p>
-    <w:p>
-      <w:pPr>
-        <w:spacing w:before="0" w:after="60"/>
-        <w:ind w:left="576"/>
-      </w:pPr>
-      <w:r>
-        <w:rPr>
-          <w:i/>
-          <w:color w:val="30608C"/>
-          <w:sz w:val="21"/>
-        </w:rPr>
-        <w:t xml:space="preserve">› </w:t>
-      </w:r>
-      <w:r>
-        <w:rPr>
-          <w:i/>
-          <w:color w:val="30608C"/>
-          <w:sz w:val="21"/>
-        </w:rPr>
-        <w:t>Bitte wiederholen Sie das.</w:t>
-      </w:r>
-      <w:r>
-        <w:rPr>
-          <w:i/>
-          <w:color w:val="404040"/>
-          <w:sz w:val="21"/>
-        </w:rPr>
-        <w:t xml:space="preserve"> (Please repeat that.)</w:t>
-      </w:r>
-    </w:p>
-    <w:p>
-      <w:pPr>
-        <w:spacing w:before="0" w:after="60"/>
-        <w:ind w:left="576"/>
-      </w:pPr>
-      <w:r>
-        <w:rPr>
-          <w:i/>
-          <w:color w:val="30608C"/>
-          <w:sz w:val="21"/>
-        </w:rPr>
-        <w:t xml:space="preserve">› </w:t>
-      </w:r>
-      <w:r>
-        <w:rPr>
-          <w:i/>
-          <w:color w:val="30608C"/>
-          <w:sz w:val="21"/>
-        </w:rPr>
-        <w:t>Ich bin wieder da.</w:t>
-      </w:r>
-      <w:r>
-        <w:rPr>
-          <w:i/>
-          <w:color w:val="404040"/>
-          <w:sz w:val="21"/>
-        </w:rPr>
-        <w:t xml:space="preserve"> (I'm back again.)</w:t>
-      </w:r>
-    </w:p>
-    <w:p>
-      <w:pPr>
-        <w:spacing w:before="0" w:after="120"/>
-        <w:ind w:left="576"/>
-      </w:pPr>
-      <w:r>
-        <w:rPr>
-          <w:i/>
-          <w:color w:val="30608C"/>
-          <w:sz w:val="21"/>
-        </w:rPr>
-        <w:t xml:space="preserve">› </w:t>
-      </w:r>
-      <w:r>
-        <w:rPr>
-          <w:i/>
-          <w:color w:val="30608C"/>
-          <w:sz w:val="21"/>
-        </w:rPr>
-        <w:t>Bis morgen! Wir sehen uns wieder.</w:t>
-      </w:r>
-      <w:r>
-        <w:rPr>
-          <w:i/>
-          <w:color w:val="404040"/>
-          <w:sz w:val="21"/>
-        </w:rPr>
-        <w:t xml:space="preserve"> (See you tomorrow! We'll see each other again.)</w:t>
       </w:r>
     </w:p>
     <w:p>

</xml_diff>

<commit_message>
Add new vocabulary entry for "können" in vocab.docx and vocab.manifest.json
- Introduced a detailed entry for "können," including gloss, notes on usage, a grammar table, and multiple examples in both German and English.
- The entry is categorized under lesson 1 and level A1, enhancing the vocabulary resource for language learners with practical usage and context.
</commit_message>
<xml_diff>
--- a/vocab.docx
+++ b/vocab.docx
@@ -13,6 +13,457 @@
         </w:rPr>
         <w:t>daf — vocabulary</w:t>
       </w:r>
+    </w:p>
+    <w:p>
+      <w:pPr>
+        <w:spacing w:after="120"/>
+      </w:pPr>
+      <w:r>
+        <w:rPr>
+          <w:b/>
+        </w:rPr>
+        <w:t>können</w:t>
+      </w:r>
+      <w:r>
+        <w:t xml:space="preserve"> /ˈkœnən/</w:t>
+      </w:r>
+    </w:p>
+    <w:p>
+      <w:pPr>
+        <w:spacing w:after="80"/>
+        <w:ind w:left="576"/>
+      </w:pPr>
+      <w:r>
+        <w:t>Can; be able to (modal verb).</w:t>
+      </w:r>
+    </w:p>
+    <w:p>
+      <w:pPr>
+        <w:spacing w:after="80"/>
+        <w:ind w:left="576"/>
+      </w:pPr>
+      <w:r>
+        <w:rPr>
+          <w:i/>
+          <w:color w:val="404040"/>
+          <w:sz w:val="20"/>
+        </w:rPr>
+        <w:t>• Modal-verb pattern: the conjugated modal verb takes the normal verb position, and the main verb stays as an infinitive at the end.</w:t>
+      </w:r>
+    </w:p>
+    <w:p>
+      <w:pPr>
+        <w:spacing w:after="80"/>
+        <w:ind w:left="576"/>
+      </w:pPr>
+      <w:r>
+        <w:rPr>
+          <w:i/>
+          <w:color w:val="404040"/>
+          <w:sz w:val="20"/>
+        </w:rPr>
+        <w:t>• In yes/no questions, the conjugated modal comes first: Kannst du ... wiederholen?</w:t>
+      </w:r>
+    </w:p>
+    <w:p>
+      <w:pPr>
+        <w:spacing w:after="80"/>
+        <w:ind w:left="576"/>
+      </w:pPr>
+      <w:r>
+        <w:rPr>
+          <w:i/>
+          <w:color w:val="404040"/>
+          <w:sz w:val="20"/>
+        </w:rPr>
+        <w:t>• In Kannst du das bitte wiederholen?, das is the object (مفعول) of the sentence (جمله): the thing being repeated. Bitte means please and can move around.</w:t>
+      </w:r>
+    </w:p>
+    <w:tbl>
+      <w:tblPr>
+        <w:tblStyle w:val="TableGrid"/>
+        <w:tblW w:type="auto" w:w="0"/>
+        <w:tblLook w:firstColumn="1" w:firstRow="1" w:lastColumn="0" w:lastRow="0" w:noHBand="0" w:noVBand="1" w:val="04A0"/>
+        <w:tblInd w:w="576" w:type="dxa"/>
+      </w:tblPr>
+      <w:tblGrid>
+        <w:gridCol w:w="4320"/>
+        <w:gridCol w:w="4320"/>
+      </w:tblGrid>
+      <w:tr>
+        <w:tc>
+          <w:tcPr>
+            <w:tcW w:type="dxa" w:w="4320"/>
+            <w:shd w:val="clear" w:color="auto" w:fill="EFF6FC"/>
+          </w:tcPr>
+          <w:p>
+            <w:pPr>
+              <w:spacing w:after="40"/>
+            </w:pPr>
+            <w:r/>
+            <w:r>
+              <w:rPr>
+                <w:rFonts w:ascii="Calibri" w:hAnsi="Calibri"/>
+                <w:b/>
+                <w:color w:val="333333"/>
+                <w:sz w:val="20"/>
+              </w:rPr>
+              <w:t>Person</w:t>
+            </w:r>
+          </w:p>
+        </w:tc>
+        <w:tc>
+          <w:tcPr>
+            <w:tcW w:type="dxa" w:w="4320"/>
+            <w:shd w:val="clear" w:color="auto" w:fill="EFF6FC"/>
+          </w:tcPr>
+          <w:p>
+            <w:pPr>
+              <w:spacing w:after="40"/>
+            </w:pPr>
+            <w:r/>
+            <w:r>
+              <w:rPr>
+                <w:rFonts w:ascii="Calibri" w:hAnsi="Calibri"/>
+                <w:b/>
+                <w:color w:val="333333"/>
+                <w:sz w:val="20"/>
+              </w:rPr>
+              <w:t>Form</w:t>
+            </w:r>
+          </w:p>
+        </w:tc>
+      </w:tr>
+      <w:tr>
+        <w:tc>
+          <w:tcPr>
+            <w:tcW w:type="dxa" w:w="4320"/>
+          </w:tcPr>
+          <w:p>
+            <w:pPr>
+              <w:spacing w:after="40"/>
+            </w:pPr>
+            <w:r/>
+            <w:r>
+              <w:rPr>
+                <w:rFonts w:ascii="Calibri" w:hAnsi="Calibri"/>
+                <w:color w:val="404040"/>
+                <w:sz w:val="19"/>
+              </w:rPr>
+              <w:t>ich</w:t>
+            </w:r>
+          </w:p>
+        </w:tc>
+        <w:tc>
+          <w:tcPr>
+            <w:tcW w:type="dxa" w:w="4320"/>
+          </w:tcPr>
+          <w:p>
+            <w:pPr>
+              <w:spacing w:after="40"/>
+            </w:pPr>
+            <w:r/>
+            <w:r>
+              <w:rPr>
+                <w:rFonts w:ascii="Calibri" w:hAnsi="Calibri"/>
+                <w:color w:val="404040"/>
+                <w:sz w:val="19"/>
+              </w:rPr>
+              <w:t>kann</w:t>
+            </w:r>
+          </w:p>
+        </w:tc>
+      </w:tr>
+      <w:tr>
+        <w:tc>
+          <w:tcPr>
+            <w:tcW w:type="dxa" w:w="4320"/>
+          </w:tcPr>
+          <w:p>
+            <w:pPr>
+              <w:spacing w:after="40"/>
+            </w:pPr>
+            <w:r/>
+            <w:r>
+              <w:rPr>
+                <w:rFonts w:ascii="Calibri" w:hAnsi="Calibri"/>
+                <w:color w:val="404040"/>
+                <w:sz w:val="19"/>
+              </w:rPr>
+              <w:t>du</w:t>
+            </w:r>
+          </w:p>
+        </w:tc>
+        <w:tc>
+          <w:tcPr>
+            <w:tcW w:type="dxa" w:w="4320"/>
+          </w:tcPr>
+          <w:p>
+            <w:pPr>
+              <w:spacing w:after="40"/>
+            </w:pPr>
+            <w:r/>
+            <w:r>
+              <w:rPr>
+                <w:rFonts w:ascii="Calibri" w:hAnsi="Calibri"/>
+                <w:color w:val="404040"/>
+                <w:sz w:val="19"/>
+              </w:rPr>
+              <w:t>kannst</w:t>
+            </w:r>
+          </w:p>
+        </w:tc>
+      </w:tr>
+      <w:tr>
+        <w:tc>
+          <w:tcPr>
+            <w:tcW w:type="dxa" w:w="4320"/>
+          </w:tcPr>
+          <w:p>
+            <w:pPr>
+              <w:spacing w:after="40"/>
+            </w:pPr>
+            <w:r/>
+            <w:r>
+              <w:rPr>
+                <w:rFonts w:ascii="Calibri" w:hAnsi="Calibri"/>
+                <w:color w:val="404040"/>
+                <w:sz w:val="19"/>
+              </w:rPr>
+              <w:t>er/sie/es</w:t>
+            </w:r>
+          </w:p>
+        </w:tc>
+        <w:tc>
+          <w:tcPr>
+            <w:tcW w:type="dxa" w:w="4320"/>
+          </w:tcPr>
+          <w:p>
+            <w:pPr>
+              <w:spacing w:after="40"/>
+            </w:pPr>
+            <w:r/>
+            <w:r>
+              <w:rPr>
+                <w:rFonts w:ascii="Calibri" w:hAnsi="Calibri"/>
+                <w:color w:val="404040"/>
+                <w:sz w:val="19"/>
+              </w:rPr>
+              <w:t>kann</w:t>
+            </w:r>
+          </w:p>
+        </w:tc>
+      </w:tr>
+      <w:tr>
+        <w:tc>
+          <w:tcPr>
+            <w:tcW w:type="dxa" w:w="4320"/>
+          </w:tcPr>
+          <w:p>
+            <w:pPr>
+              <w:spacing w:after="40"/>
+            </w:pPr>
+            <w:r/>
+            <w:r>
+              <w:rPr>
+                <w:rFonts w:ascii="Calibri" w:hAnsi="Calibri"/>
+                <w:color w:val="404040"/>
+                <w:sz w:val="19"/>
+              </w:rPr>
+              <w:t>wir/sie/Sie</w:t>
+            </w:r>
+          </w:p>
+        </w:tc>
+        <w:tc>
+          <w:tcPr>
+            <w:tcW w:type="dxa" w:w="4320"/>
+          </w:tcPr>
+          <w:p>
+            <w:pPr>
+              <w:spacing w:after="40"/>
+            </w:pPr>
+            <w:r/>
+            <w:r>
+              <w:rPr>
+                <w:rFonts w:ascii="Calibri" w:hAnsi="Calibri"/>
+                <w:color w:val="404040"/>
+                <w:sz w:val="19"/>
+              </w:rPr>
+              <w:t>können</w:t>
+            </w:r>
+          </w:p>
+        </w:tc>
+      </w:tr>
+      <w:tr>
+        <w:tc>
+          <w:tcPr>
+            <w:tcW w:type="dxa" w:w="4320"/>
+          </w:tcPr>
+          <w:p>
+            <w:pPr>
+              <w:spacing w:after="40"/>
+            </w:pPr>
+            <w:r/>
+            <w:r>
+              <w:rPr>
+                <w:rFonts w:ascii="Calibri" w:hAnsi="Calibri"/>
+                <w:color w:val="404040"/>
+                <w:sz w:val="19"/>
+              </w:rPr>
+              <w:t>ihr</w:t>
+            </w:r>
+          </w:p>
+        </w:tc>
+        <w:tc>
+          <w:tcPr>
+            <w:tcW w:type="dxa" w:w="4320"/>
+          </w:tcPr>
+          <w:p>
+            <w:pPr>
+              <w:spacing w:after="40"/>
+            </w:pPr>
+            <w:r/>
+            <w:r>
+              <w:rPr>
+                <w:rFonts w:ascii="Calibri" w:hAnsi="Calibri"/>
+                <w:color w:val="404040"/>
+                <w:sz w:val="19"/>
+              </w:rPr>
+              <w:t>könnt</w:t>
+            </w:r>
+          </w:p>
+        </w:tc>
+      </w:tr>
+    </w:tbl>
+    <w:p>
+      <w:pPr>
+        <w:spacing w:before="40" w:after="120"/>
+      </w:pPr>
+    </w:p>
+    <w:p>
+      <w:pPr>
+        <w:spacing w:before="40" w:after="60"/>
+        <w:ind w:left="576"/>
+      </w:pPr>
+      <w:r>
+        <w:rPr>
+          <w:i/>
+          <w:color w:val="30608C"/>
+          <w:sz w:val="21"/>
+        </w:rPr>
+        <w:t xml:space="preserve">› </w:t>
+      </w:r>
+      <w:r>
+        <w:rPr>
+          <w:i/>
+          <w:color w:val="30608C"/>
+          <w:sz w:val="21"/>
+        </w:rPr>
+        <w:t>Kannst du das bitte wiederholen?</w:t>
+      </w:r>
+      <w:r>
+        <w:rPr>
+          <w:i/>
+          <w:color w:val="404040"/>
+          <w:sz w:val="21"/>
+        </w:rPr>
+        <w:t xml:space="preserve"> (Can you please repeat that?)</w:t>
+      </w:r>
+    </w:p>
+    <w:p>
+      <w:pPr>
+        <w:spacing w:before="0" w:after="60"/>
+        <w:ind w:left="576"/>
+      </w:pPr>
+      <w:r>
+        <w:rPr>
+          <w:i/>
+          <w:color w:val="30608C"/>
+          <w:sz w:val="21"/>
+        </w:rPr>
+        <w:t xml:space="preserve">› </w:t>
+      </w:r>
+      <w:r>
+        <w:rPr>
+          <w:i/>
+          <w:color w:val="30608C"/>
+          <w:sz w:val="21"/>
+        </w:rPr>
+        <w:t>Kannst du das wiederholen, bitte?</w:t>
+      </w:r>
+      <w:r>
+        <w:rPr>
+          <w:i/>
+          <w:color w:val="404040"/>
+          <w:sz w:val="21"/>
+        </w:rPr>
+        <w:t xml:space="preserve"> (Can you repeat that, please?)</w:t>
+      </w:r>
+    </w:p>
+    <w:p>
+      <w:pPr>
+        <w:spacing w:before="0" w:after="60"/>
+        <w:ind w:left="576"/>
+      </w:pPr>
+      <w:r>
+        <w:rPr>
+          <w:i/>
+          <w:color w:val="30608C"/>
+          <w:sz w:val="21"/>
+        </w:rPr>
+        <w:t xml:space="preserve">› </w:t>
+      </w:r>
+      <w:r>
+        <w:rPr>
+          <w:i/>
+          <w:color w:val="30608C"/>
+          <w:sz w:val="21"/>
+        </w:rPr>
+        <w:t>Ich kann Deutsch sprechen.</w:t>
+      </w:r>
+      <w:r>
+        <w:rPr>
+          <w:i/>
+          <w:color w:val="404040"/>
+          <w:sz w:val="21"/>
+        </w:rPr>
+        <w:t xml:space="preserve"> (I can speak German.)</w:t>
+      </w:r>
+    </w:p>
+    <w:p>
+      <w:pPr>
+        <w:spacing w:before="0" w:after="120"/>
+        <w:ind w:left="576"/>
+      </w:pPr>
+      <w:r>
+        <w:rPr>
+          <w:i/>
+          <w:color w:val="30608C"/>
+          <w:sz w:val="21"/>
+        </w:rPr>
+        <w:t xml:space="preserve">› </w:t>
+      </w:r>
+      <w:r>
+        <w:rPr>
+          <w:i/>
+          <w:color w:val="30608C"/>
+          <w:sz w:val="21"/>
+        </w:rPr>
+        <w:t>Können Sie bitte langsam sprechen?</w:t>
+      </w:r>
+      <w:r>
+        <w:rPr>
+          <w:i/>
+          <w:color w:val="404040"/>
+          <w:sz w:val="21"/>
+        </w:rPr>
+        <w:t xml:space="preserve"> (Can you please speak slowly? [formal you])</w:t>
+      </w:r>
+    </w:p>
+    <w:p>
+      <w:pPr>
+        <w:spacing w:before="0" w:after="0"/>
+      </w:pPr>
     </w:p>
     <w:p>
       <w:pPr>

</xml_diff>

<commit_message>
Enhance "können" entry in vocab.docx and vocab.manifest.json
- Expanded the entry for "können" by adding examples and patterns for each person, providing clearer context and usage for language learners.
- Updated the grammar table to include new columns for examples and patterns, improving the overall structure and usability of the vocabulary resource.
- Maintained categorization under lesson 1 and level A1, ensuring consistency with previous entries.
</commit_message>
<xml_diff>
--- a/vocab.docx
+++ b/vocab.docx
@@ -87,13 +87,15 @@
         <w:tblInd w:w="576" w:type="dxa"/>
       </w:tblPr>
       <w:tblGrid>
-        <w:gridCol w:w="4320"/>
-        <w:gridCol w:w="4320"/>
+        <w:gridCol w:w="2160"/>
+        <w:gridCol w:w="2160"/>
+        <w:gridCol w:w="2160"/>
+        <w:gridCol w:w="2160"/>
       </w:tblGrid>
       <w:tr>
         <w:tc>
           <w:tcPr>
-            <w:tcW w:type="dxa" w:w="4320"/>
+            <w:tcW w:type="dxa" w:w="2160"/>
             <w:shd w:val="clear" w:color="auto" w:fill="EFF6FC"/>
           </w:tcPr>
           <w:p>
@@ -114,7 +116,7 @@
         </w:tc>
         <w:tc>
           <w:tcPr>
-            <w:tcW w:type="dxa" w:w="4320"/>
+            <w:tcW w:type="dxa" w:w="2160"/>
             <w:shd w:val="clear" w:color="auto" w:fill="EFF6FC"/>
           </w:tcPr>
           <w:p>
@@ -133,11 +135,53 @@
             </w:r>
           </w:p>
         </w:tc>
+        <w:tc>
+          <w:tcPr>
+            <w:tcW w:type="dxa" w:w="2160"/>
+            <w:shd w:val="clear" w:color="auto" w:fill="EFF6FC"/>
+          </w:tcPr>
+          <w:p>
+            <w:pPr>
+              <w:spacing w:after="40"/>
+            </w:pPr>
+            <w:r/>
+            <w:r>
+              <w:rPr>
+                <w:rFonts w:ascii="Calibri" w:hAnsi="Calibri"/>
+                <w:b/>
+                <w:color w:val="333333"/>
+                <w:sz w:val="20"/>
+              </w:rPr>
+              <w:t>Example</w:t>
+            </w:r>
+          </w:p>
+        </w:tc>
+        <w:tc>
+          <w:tcPr>
+            <w:tcW w:type="dxa" w:w="2160"/>
+            <w:shd w:val="clear" w:color="auto" w:fill="EFF6FC"/>
+          </w:tcPr>
+          <w:p>
+            <w:pPr>
+              <w:spacing w:after="40"/>
+            </w:pPr>
+            <w:r/>
+            <w:r>
+              <w:rPr>
+                <w:rFonts w:ascii="Calibri" w:hAnsi="Calibri"/>
+                <w:b/>
+                <w:color w:val="333333"/>
+                <w:sz w:val="20"/>
+              </w:rPr>
+              <w:t>Pattern</w:t>
+            </w:r>
+          </w:p>
+        </w:tc>
       </w:tr>
       <w:tr>
         <w:tc>
           <w:tcPr>
-            <w:tcW w:type="dxa" w:w="4320"/>
+            <w:tcW w:type="dxa" w:w="2160"/>
           </w:tcPr>
           <w:p>
             <w:pPr>
@@ -156,7 +200,7 @@
         </w:tc>
         <w:tc>
           <w:tcPr>
-            <w:tcW w:type="dxa" w:w="4320"/>
+            <w:tcW w:type="dxa" w:w="2160"/>
           </w:tcPr>
           <w:p>
             <w:pPr>
@@ -173,11 +217,49 @@
             </w:r>
           </w:p>
         </w:tc>
+        <w:tc>
+          <w:tcPr>
+            <w:tcW w:type="dxa" w:w="2160"/>
+          </w:tcPr>
+          <w:p>
+            <w:pPr>
+              <w:spacing w:after="40"/>
+            </w:pPr>
+            <w:r/>
+            <w:r>
+              <w:rPr>
+                <w:rFonts w:ascii="Calibri" w:hAnsi="Calibri"/>
+                <w:color w:val="404040"/>
+                <w:sz w:val="19"/>
+              </w:rPr>
+              <w:t>Ich kann Deutsch sprechen.</w:t>
+            </w:r>
+          </w:p>
+        </w:tc>
+        <w:tc>
+          <w:tcPr>
+            <w:tcW w:type="dxa" w:w="2160"/>
+          </w:tcPr>
+          <w:p>
+            <w:pPr>
+              <w:spacing w:after="40"/>
+            </w:pPr>
+            <w:r/>
+            <w:r>
+              <w:rPr>
+                <w:rFonts w:ascii="Calibri" w:hAnsi="Calibri"/>
+                <w:color w:val="404040"/>
+                <w:sz w:val="19"/>
+              </w:rPr>
+              <w:t>kann + ... + sprechen</w:t>
+            </w:r>
+          </w:p>
+        </w:tc>
       </w:tr>
       <w:tr>
         <w:tc>
           <w:tcPr>
-            <w:tcW w:type="dxa" w:w="4320"/>
+            <w:tcW w:type="dxa" w:w="2160"/>
           </w:tcPr>
           <w:p>
             <w:pPr>
@@ -196,7 +278,7 @@
         </w:tc>
         <w:tc>
           <w:tcPr>
-            <w:tcW w:type="dxa" w:w="4320"/>
+            <w:tcW w:type="dxa" w:w="2160"/>
           </w:tcPr>
           <w:p>
             <w:pPr>
@@ -213,11 +295,49 @@
             </w:r>
           </w:p>
         </w:tc>
+        <w:tc>
+          <w:tcPr>
+            <w:tcW w:type="dxa" w:w="2160"/>
+          </w:tcPr>
+          <w:p>
+            <w:pPr>
+              <w:spacing w:after="40"/>
+            </w:pPr>
+            <w:r/>
+            <w:r>
+              <w:rPr>
+                <w:rFonts w:ascii="Calibri" w:hAnsi="Calibri"/>
+                <w:color w:val="404040"/>
+                <w:sz w:val="19"/>
+              </w:rPr>
+              <w:t>Kannst du das wiederholen?</w:t>
+            </w:r>
+          </w:p>
+        </w:tc>
+        <w:tc>
+          <w:tcPr>
+            <w:tcW w:type="dxa" w:w="2160"/>
+          </w:tcPr>
+          <w:p>
+            <w:pPr>
+              <w:spacing w:after="40"/>
+            </w:pPr>
+            <w:r/>
+            <w:r>
+              <w:rPr>
+                <w:rFonts w:ascii="Calibri" w:hAnsi="Calibri"/>
+                <w:color w:val="404040"/>
+                <w:sz w:val="19"/>
+              </w:rPr>
+              <w:t>Kannst + du + ... + wiederholen?</w:t>
+            </w:r>
+          </w:p>
+        </w:tc>
       </w:tr>
       <w:tr>
         <w:tc>
           <w:tcPr>
-            <w:tcW w:type="dxa" w:w="4320"/>
+            <w:tcW w:type="dxa" w:w="2160"/>
           </w:tcPr>
           <w:p>
             <w:pPr>
@@ -236,7 +356,7 @@
         </w:tc>
         <w:tc>
           <w:tcPr>
-            <w:tcW w:type="dxa" w:w="4320"/>
+            <w:tcW w:type="dxa" w:w="2160"/>
           </w:tcPr>
           <w:p>
             <w:pPr>
@@ -253,11 +373,9 @@
             </w:r>
           </w:p>
         </w:tc>
-      </w:tr>
-      <w:tr>
         <w:tc>
           <w:tcPr>
-            <w:tcW w:type="dxa" w:w="4320"/>
+            <w:tcW w:type="dxa" w:w="2160"/>
           </w:tcPr>
           <w:p>
             <w:pPr>
@@ -270,13 +388,53 @@
                 <w:color w:val="404040"/>
                 <w:sz w:val="19"/>
               </w:rPr>
-              <w:t>wir/sie/Sie</w:t>
+              <w:t>Er kann die Frage beantworten.</w:t>
             </w:r>
           </w:p>
         </w:tc>
         <w:tc>
           <w:tcPr>
-            <w:tcW w:type="dxa" w:w="4320"/>
+            <w:tcW w:type="dxa" w:w="2160"/>
+          </w:tcPr>
+          <w:p>
+            <w:pPr>
+              <w:spacing w:after="40"/>
+            </w:pPr>
+            <w:r/>
+            <w:r>
+              <w:rPr>
+                <w:rFonts w:ascii="Calibri" w:hAnsi="Calibri"/>
+                <w:color w:val="404040"/>
+                <w:sz w:val="19"/>
+              </w:rPr>
+              <w:t>kann + ... + beantworten</w:t>
+            </w:r>
+          </w:p>
+        </w:tc>
+      </w:tr>
+      <w:tr>
+        <w:tc>
+          <w:tcPr>
+            <w:tcW w:type="dxa" w:w="2160"/>
+          </w:tcPr>
+          <w:p>
+            <w:pPr>
+              <w:spacing w:after="40"/>
+            </w:pPr>
+            <w:r/>
+            <w:r>
+              <w:rPr>
+                <w:rFonts w:ascii="Calibri" w:hAnsi="Calibri"/>
+                <w:color w:val="404040"/>
+                <w:sz w:val="19"/>
+              </w:rPr>
+              <w:t>wir</w:t>
+            </w:r>
+          </w:p>
+        </w:tc>
+        <w:tc>
+          <w:tcPr>
+            <w:tcW w:type="dxa" w:w="2160"/>
           </w:tcPr>
           <w:p>
             <w:pPr>
@@ -293,11 +451,49 @@
             </w:r>
           </w:p>
         </w:tc>
+        <w:tc>
+          <w:tcPr>
+            <w:tcW w:type="dxa" w:w="2160"/>
+          </w:tcPr>
+          <w:p>
+            <w:pPr>
+              <w:spacing w:after="40"/>
+            </w:pPr>
+            <w:r/>
+            <w:r>
+              <w:rPr>
+                <w:rFonts w:ascii="Calibri" w:hAnsi="Calibri"/>
+                <w:color w:val="404040"/>
+                <w:sz w:val="19"/>
+              </w:rPr>
+              <w:t>Wir können zusammen lernen.</w:t>
+            </w:r>
+          </w:p>
+        </w:tc>
+        <w:tc>
+          <w:tcPr>
+            <w:tcW w:type="dxa" w:w="2160"/>
+          </w:tcPr>
+          <w:p>
+            <w:pPr>
+              <w:spacing w:after="40"/>
+            </w:pPr>
+            <w:r/>
+            <w:r>
+              <w:rPr>
+                <w:rFonts w:ascii="Calibri" w:hAnsi="Calibri"/>
+                <w:color w:val="404040"/>
+                <w:sz w:val="19"/>
+              </w:rPr>
+              <w:t>können + ... + lernen</w:t>
+            </w:r>
+          </w:p>
+        </w:tc>
       </w:tr>
       <w:tr>
         <w:tc>
           <w:tcPr>
-            <w:tcW w:type="dxa" w:w="4320"/>
+            <w:tcW w:type="dxa" w:w="2160"/>
           </w:tcPr>
           <w:p>
             <w:pPr>
@@ -316,7 +512,7 @@
         </w:tc>
         <w:tc>
           <w:tcPr>
-            <w:tcW w:type="dxa" w:w="4320"/>
+            <w:tcW w:type="dxa" w:w="2160"/>
           </w:tcPr>
           <w:p>
             <w:pPr>
@@ -330,6 +526,122 @@
                 <w:sz w:val="19"/>
               </w:rPr>
               <w:t>könnt</w:t>
+            </w:r>
+          </w:p>
+        </w:tc>
+        <w:tc>
+          <w:tcPr>
+            <w:tcW w:type="dxa" w:w="2160"/>
+          </w:tcPr>
+          <w:p>
+            <w:pPr>
+              <w:spacing w:after="40"/>
+            </w:pPr>
+            <w:r/>
+            <w:r>
+              <w:rPr>
+                <w:rFonts w:ascii="Calibri" w:hAnsi="Calibri"/>
+                <w:color w:val="404040"/>
+                <w:sz w:val="19"/>
+              </w:rPr>
+              <w:t>Könnt ihr das lesen?</w:t>
+            </w:r>
+          </w:p>
+        </w:tc>
+        <w:tc>
+          <w:tcPr>
+            <w:tcW w:type="dxa" w:w="2160"/>
+          </w:tcPr>
+          <w:p>
+            <w:pPr>
+              <w:spacing w:after="40"/>
+            </w:pPr>
+            <w:r/>
+            <w:r>
+              <w:rPr>
+                <w:rFonts w:ascii="Calibri" w:hAnsi="Calibri"/>
+                <w:color w:val="404040"/>
+                <w:sz w:val="19"/>
+              </w:rPr>
+              <w:t>Könnt + ihr + ... + lesen?</w:t>
+            </w:r>
+          </w:p>
+        </w:tc>
+      </w:tr>
+      <w:tr>
+        <w:tc>
+          <w:tcPr>
+            <w:tcW w:type="dxa" w:w="2160"/>
+          </w:tcPr>
+          <w:p>
+            <w:pPr>
+              <w:spacing w:after="40"/>
+            </w:pPr>
+            <w:r/>
+            <w:r>
+              <w:rPr>
+                <w:rFonts w:ascii="Calibri" w:hAnsi="Calibri"/>
+                <w:color w:val="404040"/>
+                <w:sz w:val="19"/>
+              </w:rPr>
+              <w:t>sie/Sie</w:t>
+            </w:r>
+          </w:p>
+        </w:tc>
+        <w:tc>
+          <w:tcPr>
+            <w:tcW w:type="dxa" w:w="2160"/>
+          </w:tcPr>
+          <w:p>
+            <w:pPr>
+              <w:spacing w:after="40"/>
+            </w:pPr>
+            <w:r/>
+            <w:r>
+              <w:rPr>
+                <w:rFonts w:ascii="Calibri" w:hAnsi="Calibri"/>
+                <w:color w:val="404040"/>
+                <w:sz w:val="19"/>
+              </w:rPr>
+              <w:t>können</w:t>
+            </w:r>
+          </w:p>
+        </w:tc>
+        <w:tc>
+          <w:tcPr>
+            <w:tcW w:type="dxa" w:w="2160"/>
+          </w:tcPr>
+          <w:p>
+            <w:pPr>
+              <w:spacing w:after="40"/>
+            </w:pPr>
+            <w:r/>
+            <w:r>
+              <w:rPr>
+                <w:rFonts w:ascii="Calibri" w:hAnsi="Calibri"/>
+                <w:color w:val="404040"/>
+                <w:sz w:val="19"/>
+              </w:rPr>
+              <w:t>Können Sie bitte langsam sprechen?</w:t>
+            </w:r>
+          </w:p>
+        </w:tc>
+        <w:tc>
+          <w:tcPr>
+            <w:tcW w:type="dxa" w:w="2160"/>
+          </w:tcPr>
+          <w:p>
+            <w:pPr>
+              <w:spacing w:after="40"/>
+            </w:pPr>
+            <w:r/>
+            <w:r>
+              <w:rPr>
+                <w:rFonts w:ascii="Calibri" w:hAnsi="Calibri"/>
+                <w:color w:val="404040"/>
+                <w:sz w:val="19"/>
+              </w:rPr>
+              <w:t>können + sie/Sie + ... + sprechen</w:t>
             </w:r>
           </w:p>
         </w:tc>

</xml_diff>

<commit_message>
Add new vocabulary entry for "die Vorwahl" in vocab.docx and vocab.manifest.json
- Introduced a detailed entry for "die Vorwahl," including gloss, notes on usage, and multiple examples in both German and English.
- The entry is categorized under lesson 1 and level A1, enhancing the vocabulary resource for language learners with practical usage and context.
</commit_message>
<xml_diff>
--- a/vocab.docx
+++ b/vocab.docx
@@ -13,6 +13,164 @@
         </w:rPr>
         <w:t>daf — vocabulary</w:t>
       </w:r>
+    </w:p>
+    <w:p>
+      <w:pPr>
+        <w:spacing w:after="120"/>
+      </w:pPr>
+      <w:r>
+        <w:rPr>
+          <w:b/>
+        </w:rPr>
+        <w:t>die Vorwahl</w:t>
+      </w:r>
+      <w:r>
+        <w:t xml:space="preserve"> /ˈfoːɐ̯vaːl/</w:t>
+      </w:r>
+    </w:p>
+    <w:p>
+      <w:pPr>
+        <w:spacing w:after="80"/>
+        <w:ind w:left="576"/>
+      </w:pPr>
+      <w:r>
+        <w:rPr>
+          <w:sz w:val="22"/>
+        </w:rPr>
+        <w:t>die Vorwahl, -en</w:t>
+      </w:r>
+    </w:p>
+    <w:p>
+      <w:pPr>
+        <w:spacing w:after="80"/>
+        <w:ind w:left="576"/>
+      </w:pPr>
+      <w:r>
+        <w:t>Area code; dialing prefix.</w:t>
+      </w:r>
+    </w:p>
+    <w:p>
+      <w:pPr>
+        <w:spacing w:after="80"/>
+        <w:ind w:left="576"/>
+      </w:pPr>
+      <w:r>
+        <w:rPr>
+          <w:i/>
+          <w:color w:val="404040"/>
+          <w:sz w:val="20"/>
+        </w:rPr>
+        <w:t>• One compound word: Vorwahl, not two words.</w:t>
+      </w:r>
+    </w:p>
+    <w:p>
+      <w:pPr>
+        <w:spacing w:after="80"/>
+        <w:ind w:left="576"/>
+      </w:pPr>
+      <w:r>
+        <w:rPr>
+          <w:i/>
+          <w:color w:val="404040"/>
+          <w:sz w:val="20"/>
+        </w:rPr>
+        <w:t>• In 0621 / 53487, 0621 is the Vorwahl and 53487 is the local number.</w:t>
+      </w:r>
+    </w:p>
+    <w:p>
+      <w:pPr>
+        <w:spacing w:before="40" w:after="60"/>
+        <w:ind w:left="576"/>
+      </w:pPr>
+      <w:r>
+        <w:rPr>
+          <w:i/>
+          <w:color w:val="30608C"/>
+          <w:sz w:val="21"/>
+        </w:rPr>
+        <w:t xml:space="preserve">› </w:t>
+      </w:r>
+      <w:r>
+        <w:rPr>
+          <w:i/>
+          <w:color w:val="30608C"/>
+          <w:sz w:val="21"/>
+        </w:rPr>
+        <w:t>Die Vorwahl von Mannheim ist 0621.</w:t>
+      </w:r>
+      <w:r>
+        <w:rPr>
+          <w:i/>
+          <w:color w:val="404040"/>
+          <w:sz w:val="21"/>
+        </w:rPr>
+        <w:t xml:space="preserve"> (Mannheim's area code is 0621.)</w:t>
+      </w:r>
+    </w:p>
+    <w:p>
+      <w:pPr>
+        <w:spacing w:before="0" w:after="60"/>
+        <w:ind w:left="576"/>
+      </w:pPr>
+      <w:r>
+        <w:rPr>
+          <w:i/>
+          <w:color w:val="30608C"/>
+          <w:sz w:val="21"/>
+        </w:rPr>
+        <w:t xml:space="preserve">› </w:t>
+      </w:r>
+      <w:r>
+        <w:rPr>
+          <w:i/>
+          <w:color w:val="30608C"/>
+          <w:sz w:val="21"/>
+        </w:rPr>
+        <w:t>Anne: Meine Telefonnummer ist 0621 / 53487.</w:t>
+      </w:r>
+      <w:r>
+        <w:rPr>
+          <w:i/>
+          <w:color w:val="404040"/>
+          <w:sz w:val="21"/>
+        </w:rPr>
+        <w:t xml:space="preserve"> (Anne: My phone number is 0621 / 53487.)</w:t>
+      </w:r>
+    </w:p>
+    <w:p>
+      <w:pPr>
+        <w:spacing w:before="0" w:after="120"/>
+        <w:ind w:left="576"/>
+      </w:pPr>
+      <w:r>
+        <w:rPr>
+          <w:i/>
+          <w:color w:val="30608C"/>
+          <w:sz w:val="21"/>
+        </w:rPr>
+        <w:t xml:space="preserve">› </w:t>
+      </w:r>
+      <w:r>
+        <w:rPr>
+          <w:i/>
+          <w:color w:val="30608C"/>
+          <w:sz w:val="21"/>
+        </w:rPr>
+        <w:t>Welche Vorwahl hat Berlin?</w:t>
+      </w:r>
+      <w:r>
+        <w:rPr>
+          <w:i/>
+          <w:color w:val="404040"/>
+          <w:sz w:val="21"/>
+        </w:rPr>
+        <w:t xml:space="preserve"> (What area code does Berlin have?)</w:t>
+      </w:r>
+    </w:p>
+    <w:p>
+      <w:pPr>
+        <w:spacing w:before="0" w:after="0"/>
+      </w:pPr>
     </w:p>
     <w:p>
       <w:pPr>

</xml_diff>

<commit_message>
Add new vocabulary entry for "dann" in vocab.docx and vocab.manifest.json
- Introduced a detailed entry for "dann," including gloss, notes on usage, and multiple examples in both German and English.
- The entry is categorized under lesson 1 and level A1, enhancing the vocabulary resource for language learners with practical usage and context.
</commit_message>
<xml_diff>
--- a/vocab.docx
+++ b/vocab.docx
@@ -13,6 +13,152 @@
         </w:rPr>
         <w:t>daf — vocabulary</w:t>
       </w:r>
+    </w:p>
+    <w:p>
+      <w:pPr>
+        <w:spacing w:after="120"/>
+      </w:pPr>
+      <w:r>
+        <w:rPr>
+          <w:b/>
+        </w:rPr>
+        <w:t>dann</w:t>
+      </w:r>
+      <w:r>
+        <w:t xml:space="preserve"> /dan/</w:t>
+      </w:r>
+    </w:p>
+    <w:p>
+      <w:pPr>
+        <w:spacing w:after="80"/>
+        <w:ind w:left="576"/>
+      </w:pPr>
+      <w:r>
+        <w:t>Then; after that.</w:t>
+      </w:r>
+    </w:p>
+    <w:p>
+      <w:pPr>
+        <w:spacing w:after="80"/>
+        <w:ind w:left="576"/>
+      </w:pPr>
+      <w:r>
+        <w:rPr>
+          <w:i/>
+          <w:color w:val="404040"/>
+          <w:sz w:val="20"/>
+        </w:rPr>
+        <w:t>• Use dann to order actions in time: first one thing, then the next.</w:t>
+      </w:r>
+    </w:p>
+    <w:p>
+      <w:pPr>
+        <w:spacing w:after="80"/>
+        <w:ind w:left="576"/>
+      </w:pPr>
+      <w:r>
+        <w:rPr>
+          <w:i/>
+          <w:color w:val="404040"/>
+          <w:sz w:val="20"/>
+        </w:rPr>
+        <w:t>• In a normal statement, dann can stand first; the conjugated verb then comes right after it.</w:t>
+      </w:r>
+    </w:p>
+    <w:p>
+      <w:pPr>
+        <w:spacing w:before="40" w:after="60"/>
+        <w:ind w:left="576"/>
+      </w:pPr>
+      <w:r>
+        <w:rPr>
+          <w:i/>
+          <w:color w:val="30608C"/>
+          <w:sz w:val="21"/>
+        </w:rPr>
+        <w:t xml:space="preserve">› </w:t>
+      </w:r>
+      <w:r>
+        <w:rPr>
+          <w:i/>
+          <w:color w:val="30608C"/>
+          <w:sz w:val="21"/>
+        </w:rPr>
+        <w:t>Zuerst lernen wir Zahlen, dann lesen wir den Text.</w:t>
+      </w:r>
+      <w:r>
+        <w:rPr>
+          <w:i/>
+          <w:color w:val="404040"/>
+          <w:sz w:val="21"/>
+        </w:rPr>
+        <w:t xml:space="preserve"> (First we learn numbers, then we read the text.)</w:t>
+      </w:r>
+    </w:p>
+    <w:p>
+      <w:pPr>
+        <w:spacing w:before="0" w:after="60"/>
+        <w:ind w:left="576"/>
+      </w:pPr>
+      <w:r>
+        <w:rPr>
+          <w:i/>
+          <w:color w:val="30608C"/>
+          <w:sz w:val="21"/>
+        </w:rPr>
+        <w:t xml:space="preserve">› </w:t>
+      </w:r>
+      <w:r>
+        <w:rPr>
+          <w:i/>
+          <w:color w:val="30608C"/>
+          <w:sz w:val="21"/>
+        </w:rPr>
+        <w:t>Ich trinke Kaffee, dann gehe ich zum Kurs.</w:t>
+      </w:r>
+      <w:r>
+        <w:rPr>
+          <w:i/>
+          <w:color w:val="404040"/>
+          <w:sz w:val="21"/>
+        </w:rPr>
+        <w:t xml:space="preserve"> (I drink coffee, then I go to the course.)</w:t>
+      </w:r>
+    </w:p>
+    <w:p>
+      <w:pPr>
+        <w:spacing w:before="0" w:after="120"/>
+        <w:ind w:left="576"/>
+      </w:pPr>
+      <w:r>
+        <w:rPr>
+          <w:i/>
+          <w:color w:val="30608C"/>
+          <w:sz w:val="21"/>
+        </w:rPr>
+        <w:t xml:space="preserve">› </w:t>
+      </w:r>
+      <w:r>
+        <w:rPr>
+          <w:i/>
+          <w:color w:val="30608C"/>
+          <w:sz w:val="21"/>
+        </w:rPr>
+        <w:t>Wenn du Zeit hast, dann komm bitte.</w:t>
+      </w:r>
+      <w:r>
+        <w:rPr>
+          <w:i/>
+          <w:color w:val="404040"/>
+          <w:sz w:val="21"/>
+        </w:rPr>
+        <w:t xml:space="preserve"> (If you have time, then please come.)</w:t>
+      </w:r>
+    </w:p>
+    <w:p>
+      <w:pPr>
+        <w:spacing w:before="0" w:after="0"/>
+      </w:pPr>
     </w:p>
     <w:p>
       <w:pPr>

</xml_diff>

<commit_message>
Add new vocabulary entries for "Tschüss," "Tschau," "später," and "bis" in vocab.docx and vocab.manifest.json
- Introduced detailed entries for each term, including glosses, notes on usage, and multiple examples in both German and English.
- All entries are categorized under lesson 1 and level A1, enhancing the vocabulary resource for language learners with practical usage and context.
</commit_message>
<xml_diff>
--- a/vocab.docx
+++ b/vocab.docx
@@ -13,6 +13,532 @@
         </w:rPr>
         <w:t>daf — vocabulary</w:t>
       </w:r>
+    </w:p>
+    <w:p>
+      <w:pPr>
+        <w:spacing w:after="120"/>
+      </w:pPr>
+      <w:r>
+        <w:rPr>
+          <w:b/>
+        </w:rPr>
+        <w:t>Tschüss</w:t>
+      </w:r>
+      <w:r>
+        <w:t xml:space="preserve"> /tʃʏs/</w:t>
+      </w:r>
+    </w:p>
+    <w:p>
+      <w:pPr>
+        <w:spacing w:after="80"/>
+        <w:ind w:left="576"/>
+      </w:pPr>
+      <w:r>
+        <w:t>Bye; casual goodbye.</w:t>
+      </w:r>
+    </w:p>
+    <w:p>
+      <w:pPr>
+        <w:spacing w:after="80"/>
+        <w:ind w:left="576"/>
+      </w:pPr>
+      <w:r>
+        <w:rPr>
+          <w:i/>
+          <w:color w:val="404040"/>
+          <w:sz w:val="20"/>
+        </w:rPr>
+        <w:t>• Tschüss is the common German casual goodbye, especially in everyday speech.</w:t>
+      </w:r>
+    </w:p>
+    <w:p>
+      <w:pPr>
+        <w:spacing w:before="40" w:after="60"/>
+        <w:ind w:left="576"/>
+      </w:pPr>
+      <w:r>
+        <w:rPr>
+          <w:i/>
+          <w:color w:val="30608C"/>
+          <w:sz w:val="21"/>
+        </w:rPr>
+        <w:t xml:space="preserve">› </w:t>
+      </w:r>
+      <w:r>
+        <w:rPr>
+          <w:i/>
+          <w:color w:val="30608C"/>
+          <w:sz w:val="21"/>
+        </w:rPr>
+        <w:t>Ich gehe jetzt. Tschüss!</w:t>
+      </w:r>
+      <w:r>
+        <w:rPr>
+          <w:i/>
+          <w:color w:val="404040"/>
+          <w:sz w:val="21"/>
+        </w:rPr>
+        <w:t xml:space="preserve"> (I'm leaving now. Bye!)</w:t>
+      </w:r>
+    </w:p>
+    <w:p>
+      <w:pPr>
+        <w:spacing w:before="0" w:after="60"/>
+        <w:ind w:left="576"/>
+      </w:pPr>
+      <w:r>
+        <w:rPr>
+          <w:i/>
+          <w:color w:val="30608C"/>
+          <w:sz w:val="21"/>
+        </w:rPr>
+        <w:t xml:space="preserve">› </w:t>
+      </w:r>
+      <w:r>
+        <w:rPr>
+          <w:i/>
+          <w:color w:val="30608C"/>
+          <w:sz w:val="21"/>
+        </w:rPr>
+        <w:t>Tschüss, bis morgen!</w:t>
+      </w:r>
+      <w:r>
+        <w:rPr>
+          <w:i/>
+          <w:color w:val="404040"/>
+          <w:sz w:val="21"/>
+        </w:rPr>
+        <w:t xml:space="preserve"> (Bye, see you tomorrow!)</w:t>
+      </w:r>
+    </w:p>
+    <w:p>
+      <w:pPr>
+        <w:spacing w:before="0" w:after="120"/>
+        <w:ind w:left="576"/>
+      </w:pPr>
+      <w:r>
+        <w:rPr>
+          <w:i/>
+          <w:color w:val="30608C"/>
+          <w:sz w:val="21"/>
+        </w:rPr>
+        <w:t xml:space="preserve">› </w:t>
+      </w:r>
+      <w:r>
+        <w:rPr>
+          <w:i/>
+          <w:color w:val="30608C"/>
+          <w:sz w:val="21"/>
+        </w:rPr>
+        <w:t>Danke und tschüss!</w:t>
+      </w:r>
+      <w:r>
+        <w:rPr>
+          <w:i/>
+          <w:color w:val="404040"/>
+          <w:sz w:val="21"/>
+        </w:rPr>
+        <w:t xml:space="preserve"> (Thanks and bye!)</w:t>
+      </w:r>
+    </w:p>
+    <w:p>
+      <w:pPr>
+        <w:spacing w:before="0" w:after="0"/>
+      </w:pPr>
+    </w:p>
+    <w:p>
+      <w:pPr>
+        <w:spacing w:after="120"/>
+      </w:pPr>
+      <w:r>
+        <w:rPr>
+          <w:b/>
+        </w:rPr>
+        <w:t>Tschau</w:t>
+      </w:r>
+      <w:r>
+        <w:t xml:space="preserve"> /tʃaʊ/</w:t>
+      </w:r>
+    </w:p>
+    <w:p>
+      <w:pPr>
+        <w:spacing w:after="80"/>
+        <w:ind w:left="576"/>
+      </w:pPr>
+      <w:r>
+        <w:t>Bye; informal farewell.</w:t>
+      </w:r>
+    </w:p>
+    <w:p>
+      <w:pPr>
+        <w:spacing w:after="80"/>
+        <w:ind w:left="576"/>
+      </w:pPr>
+      <w:r>
+        <w:rPr>
+          <w:i/>
+          <w:color w:val="404040"/>
+          <w:sz w:val="20"/>
+        </w:rPr>
+        <w:t>• Tschau is the German spelling of Italian ciao; it is casual, like English bye.</w:t>
+      </w:r>
+    </w:p>
+    <w:p>
+      <w:pPr>
+        <w:spacing w:after="80"/>
+        <w:ind w:left="576"/>
+      </w:pPr>
+      <w:r>
+        <w:rPr>
+          <w:i/>
+          <w:color w:val="404040"/>
+          <w:sz w:val="20"/>
+        </w:rPr>
+        <w:t>• Tschüss and Tschau feel similar because both are casual goodbyes and both start with tsch, but they are different words.</w:t>
+      </w:r>
+    </w:p>
+    <w:p>
+      <w:pPr>
+        <w:spacing w:before="40" w:after="60"/>
+        <w:ind w:left="576"/>
+      </w:pPr>
+      <w:r>
+        <w:rPr>
+          <w:i/>
+          <w:color w:val="30608C"/>
+          <w:sz w:val="21"/>
+        </w:rPr>
+        <w:t xml:space="preserve">› </w:t>
+      </w:r>
+      <w:r>
+        <w:rPr>
+          <w:i/>
+          <w:color w:val="30608C"/>
+          <w:sz w:val="21"/>
+        </w:rPr>
+        <w:t>Tschau, bis später!</w:t>
+      </w:r>
+      <w:r>
+        <w:rPr>
+          <w:i/>
+          <w:color w:val="404040"/>
+          <w:sz w:val="21"/>
+        </w:rPr>
+        <w:t xml:space="preserve"> (Bye, see you later!)</w:t>
+      </w:r>
+    </w:p>
+    <w:p>
+      <w:pPr>
+        <w:spacing w:before="0" w:after="120"/>
+        <w:ind w:left="576"/>
+      </w:pPr>
+      <w:r>
+        <w:rPr>
+          <w:i/>
+          <w:color w:val="30608C"/>
+          <w:sz w:val="21"/>
+        </w:rPr>
+        <w:t xml:space="preserve">› </w:t>
+      </w:r>
+      <w:r>
+        <w:rPr>
+          <w:i/>
+          <w:color w:val="30608C"/>
+          <w:sz w:val="21"/>
+        </w:rPr>
+        <w:t>Tschau, Anne!</w:t>
+      </w:r>
+      <w:r>
+        <w:rPr>
+          <w:i/>
+          <w:color w:val="404040"/>
+          <w:sz w:val="21"/>
+        </w:rPr>
+        <w:t xml:space="preserve"> (Bye, Anne!)</w:t>
+      </w:r>
+    </w:p>
+    <w:p>
+      <w:pPr>
+        <w:spacing w:before="0" w:after="0"/>
+      </w:pPr>
+    </w:p>
+    <w:p>
+      <w:pPr>
+        <w:spacing w:after="120"/>
+      </w:pPr>
+      <w:r>
+        <w:rPr>
+          <w:b/>
+        </w:rPr>
+        <w:t>später</w:t>
+      </w:r>
+      <w:r>
+        <w:t xml:space="preserve"> /ˈʃpɛːtɐ/</w:t>
+      </w:r>
+    </w:p>
+    <w:p>
+      <w:pPr>
+        <w:spacing w:after="80"/>
+        <w:ind w:left="576"/>
+      </w:pPr>
+      <w:r>
+        <w:t>Later.</w:t>
+      </w:r>
+    </w:p>
+    <w:p>
+      <w:pPr>
+        <w:spacing w:after="80"/>
+        <w:ind w:left="576"/>
+      </w:pPr>
+      <w:r>
+        <w:rPr>
+          <w:i/>
+          <w:color w:val="404040"/>
+          <w:sz w:val="20"/>
+        </w:rPr>
+        <w:t>• Opposite idea: früh = early; später = later. Related adjective: spät = late.</w:t>
+      </w:r>
+    </w:p>
+    <w:p>
+      <w:pPr>
+        <w:spacing w:after="80"/>
+        <w:ind w:left="576"/>
+      </w:pPr>
+      <w:r>
+        <w:rPr>
+          <w:i/>
+          <w:color w:val="404040"/>
+          <w:sz w:val="20"/>
+        </w:rPr>
+        <w:t>• In bis später, German literally says until later; natural English is see you later.</w:t>
+      </w:r>
+    </w:p>
+    <w:p>
+      <w:pPr>
+        <w:spacing w:before="40" w:after="60"/>
+        <w:ind w:left="576"/>
+      </w:pPr>
+      <w:r>
+        <w:rPr>
+          <w:i/>
+          <w:color w:val="30608C"/>
+          <w:sz w:val="21"/>
+        </w:rPr>
+        <w:t xml:space="preserve">› </w:t>
+      </w:r>
+      <w:r>
+        <w:rPr>
+          <w:i/>
+          <w:color w:val="30608C"/>
+          <w:sz w:val="21"/>
+        </w:rPr>
+        <w:t>Bis später!</w:t>
+      </w:r>
+      <w:r>
+        <w:rPr>
+          <w:i/>
+          <w:color w:val="404040"/>
+          <w:sz w:val="21"/>
+        </w:rPr>
+        <w:t xml:space="preserve"> (See you later!)</w:t>
+      </w:r>
+    </w:p>
+    <w:p>
+      <w:pPr>
+        <w:spacing w:before="0" w:after="60"/>
+        <w:ind w:left="576"/>
+      </w:pPr>
+      <w:r>
+        <w:rPr>
+          <w:i/>
+          <w:color w:val="30608C"/>
+          <w:sz w:val="21"/>
+        </w:rPr>
+        <w:t xml:space="preserve">› </w:t>
+      </w:r>
+      <w:r>
+        <w:rPr>
+          <w:i/>
+          <w:color w:val="30608C"/>
+          <w:sz w:val="21"/>
+        </w:rPr>
+        <w:t>Ich komme später.</w:t>
+      </w:r>
+      <w:r>
+        <w:rPr>
+          <w:i/>
+          <w:color w:val="404040"/>
+          <w:sz w:val="21"/>
+        </w:rPr>
+        <w:t xml:space="preserve"> (I am coming later.)</w:t>
+      </w:r>
+    </w:p>
+    <w:p>
+      <w:pPr>
+        <w:spacing w:before="0" w:after="120"/>
+        <w:ind w:left="576"/>
+      </w:pPr>
+      <w:r>
+        <w:rPr>
+          <w:i/>
+          <w:color w:val="30608C"/>
+          <w:sz w:val="21"/>
+        </w:rPr>
+        <w:t xml:space="preserve">› </w:t>
+      </w:r>
+      <w:r>
+        <w:rPr>
+          <w:i/>
+          <w:color w:val="30608C"/>
+          <w:sz w:val="21"/>
+        </w:rPr>
+        <w:t>Heute früh, später am Abend.</w:t>
+      </w:r>
+      <w:r>
+        <w:rPr>
+          <w:i/>
+          <w:color w:val="404040"/>
+          <w:sz w:val="21"/>
+        </w:rPr>
+        <w:t xml:space="preserve"> (Early today, later in the evening.)</w:t>
+      </w:r>
+    </w:p>
+    <w:p>
+      <w:pPr>
+        <w:spacing w:before="0" w:after="0"/>
+      </w:pPr>
+    </w:p>
+    <w:p>
+      <w:pPr>
+        <w:spacing w:after="120"/>
+      </w:pPr>
+      <w:r>
+        <w:rPr>
+          <w:b/>
+        </w:rPr>
+        <w:t>bis</w:t>
+      </w:r>
+      <w:r>
+        <w:t xml:space="preserve"> /bɪs/</w:t>
+      </w:r>
+    </w:p>
+    <w:p>
+      <w:pPr>
+        <w:spacing w:after="80"/>
+        <w:ind w:left="576"/>
+      </w:pPr>
+      <w:r>
+        <w:t>Until; till; by.</w:t>
+      </w:r>
+    </w:p>
+    <w:p>
+      <w:pPr>
+        <w:spacing w:after="80"/>
+        <w:ind w:left="576"/>
+      </w:pPr>
+      <w:r>
+        <w:rPr>
+          <w:i/>
+          <w:color w:val="404040"/>
+          <w:sz w:val="20"/>
+        </w:rPr>
+        <w:t>• In farewell formulas, bis means until: bis später = until later / see you later.</w:t>
+      </w:r>
+    </w:p>
+    <w:p>
+      <w:pPr>
+        <w:spacing w:before="40" w:after="60"/>
+        <w:ind w:left="576"/>
+      </w:pPr>
+      <w:r>
+        <w:rPr>
+          <w:i/>
+          <w:color w:val="30608C"/>
+          <w:sz w:val="21"/>
+        </w:rPr>
+        <w:t xml:space="preserve">› </w:t>
+      </w:r>
+      <w:r>
+        <w:rPr>
+          <w:i/>
+          <w:color w:val="30608C"/>
+          <w:sz w:val="21"/>
+        </w:rPr>
+        <w:t>Bis später!</w:t>
+      </w:r>
+      <w:r>
+        <w:rPr>
+          <w:i/>
+          <w:color w:val="404040"/>
+          <w:sz w:val="21"/>
+        </w:rPr>
+        <w:t xml:space="preserve"> (See you later!)</w:t>
+      </w:r>
+    </w:p>
+    <w:p>
+      <w:pPr>
+        <w:spacing w:before="0" w:after="60"/>
+        <w:ind w:left="576"/>
+      </w:pPr>
+      <w:r>
+        <w:rPr>
+          <w:i/>
+          <w:color w:val="30608C"/>
+          <w:sz w:val="21"/>
+        </w:rPr>
+        <w:t xml:space="preserve">› </w:t>
+      </w:r>
+      <w:r>
+        <w:rPr>
+          <w:i/>
+          <w:color w:val="30608C"/>
+          <w:sz w:val="21"/>
+        </w:rPr>
+        <w:t>Bis morgen!</w:t>
+      </w:r>
+      <w:r>
+        <w:rPr>
+          <w:i/>
+          <w:color w:val="404040"/>
+          <w:sz w:val="21"/>
+        </w:rPr>
+        <w:t xml:space="preserve"> (See you tomorrow!)</w:t>
+      </w:r>
+    </w:p>
+    <w:p>
+      <w:pPr>
+        <w:spacing w:before="0" w:after="120"/>
+        <w:ind w:left="576"/>
+      </w:pPr>
+      <w:r>
+        <w:rPr>
+          <w:i/>
+          <w:color w:val="30608C"/>
+          <w:sz w:val="21"/>
+        </w:rPr>
+        <w:t xml:space="preserve">› </w:t>
+      </w:r>
+      <w:r>
+        <w:rPr>
+          <w:i/>
+          <w:color w:val="30608C"/>
+          <w:sz w:val="21"/>
+        </w:rPr>
+        <w:t>Ich lerne bis zehn Uhr.</w:t>
+      </w:r>
+      <w:r>
+        <w:rPr>
+          <w:i/>
+          <w:color w:val="404040"/>
+          <w:sz w:val="21"/>
+        </w:rPr>
+        <w:t xml:space="preserve"> (I study until ten o'clock.)</w:t>
+      </w:r>
+    </w:p>
+    <w:p>
+      <w:pPr>
+        <w:spacing w:before="0" w:after="0"/>
+      </w:pPr>
     </w:p>
     <w:p>
       <w:pPr>

</xml_diff>

<commit_message>
Add new vocabulary entries for "noch einmal" and "der Notizzettel" in vocab.docx and vocab.manifest.json
- Introduced detailed entries for each term, including glosses, notes on usage, and multiple examples in both German and English.
- Both entries are categorized under lesson 1 and level A1, enhancing the vocabulary resource for language learners with practical usage and context.
</commit_message>
<xml_diff>
--- a/vocab.docx
+++ b/vocab.docx
@@ -13,6 +13,310 @@
         </w:rPr>
         <w:t>daf — vocabulary</w:t>
       </w:r>
+    </w:p>
+    <w:p>
+      <w:pPr>
+        <w:spacing w:after="120"/>
+      </w:pPr>
+      <w:r>
+        <w:rPr>
+          <w:b/>
+        </w:rPr>
+        <w:t>noch einmal</w:t>
+      </w:r>
+      <w:r>
+        <w:t xml:space="preserve"> /nɔx ˈaɪ̯nmaːl/</w:t>
+      </w:r>
+    </w:p>
+    <w:p>
+      <w:pPr>
+        <w:spacing w:after="80"/>
+        <w:ind w:left="576"/>
+      </w:pPr>
+      <w:r>
+        <w:t>One more time; once again.</w:t>
+      </w:r>
+    </w:p>
+    <w:p>
+      <w:pPr>
+        <w:spacing w:after="80"/>
+        <w:ind w:left="576"/>
+      </w:pPr>
+      <w:r>
+        <w:rPr>
+          <w:i/>
+          <w:color w:val="404040"/>
+          <w:sz w:val="20"/>
+        </w:rPr>
+        <w:t>• noch = still / yet / additionally; einmal = once / one time.</w:t>
+      </w:r>
+    </w:p>
+    <w:p>
+      <w:pPr>
+        <w:spacing w:after="80"/>
+        <w:ind w:left="576"/>
+      </w:pPr>
+      <w:r>
+        <w:rPr>
+          <w:i/>
+          <w:color w:val="404040"/>
+          <w:sz w:val="20"/>
+        </w:rPr>
+        <w:t>• Together, noch einmal means one more time or again. Casual shorter form: nochmal.</w:t>
+      </w:r>
+    </w:p>
+    <w:p>
+      <w:pPr>
+        <w:spacing w:before="40" w:after="60"/>
+        <w:ind w:left="576"/>
+      </w:pPr>
+      <w:r>
+        <w:rPr>
+          <w:i/>
+          <w:color w:val="30608C"/>
+          <w:sz w:val="21"/>
+        </w:rPr>
+        <w:t xml:space="preserve">› </w:t>
+      </w:r>
+      <w:r>
+        <w:rPr>
+          <w:i/>
+          <w:color w:val="30608C"/>
+          <w:sz w:val="21"/>
+        </w:rPr>
+        <w:t>Noch einmal, bitte.</w:t>
+      </w:r>
+      <w:r>
+        <w:rPr>
+          <w:i/>
+          <w:color w:val="404040"/>
+          <w:sz w:val="21"/>
+        </w:rPr>
+        <w:t xml:space="preserve"> (One more time, please.)</w:t>
+      </w:r>
+    </w:p>
+    <w:p>
+      <w:pPr>
+        <w:spacing w:before="0" w:after="60"/>
+        <w:ind w:left="576"/>
+      </w:pPr>
+      <w:r>
+        <w:rPr>
+          <w:i/>
+          <w:color w:val="30608C"/>
+          <w:sz w:val="21"/>
+        </w:rPr>
+        <w:t xml:space="preserve">› </w:t>
+      </w:r>
+      <w:r>
+        <w:rPr>
+          <w:i/>
+          <w:color w:val="30608C"/>
+          <w:sz w:val="21"/>
+        </w:rPr>
+        <w:t>Hören Sie das Gespräch noch einmal.</w:t>
+      </w:r>
+      <w:r>
+        <w:rPr>
+          <w:i/>
+          <w:color w:val="404040"/>
+          <w:sz w:val="21"/>
+        </w:rPr>
+        <w:t xml:space="preserve"> (Listen to the conversation one more time.)</w:t>
+      </w:r>
+    </w:p>
+    <w:p>
+      <w:pPr>
+        <w:spacing w:before="0" w:after="120"/>
+        <w:ind w:left="576"/>
+      </w:pPr>
+      <w:r>
+        <w:rPr>
+          <w:i/>
+          <w:color w:val="30608C"/>
+          <w:sz w:val="21"/>
+        </w:rPr>
+        <w:t xml:space="preserve">› </w:t>
+      </w:r>
+      <w:r>
+        <w:rPr>
+          <w:i/>
+          <w:color w:val="30608C"/>
+          <w:sz w:val="21"/>
+        </w:rPr>
+        <w:t>Bitte wiederholen Sie das noch einmal.</w:t>
+      </w:r>
+      <w:r>
+        <w:rPr>
+          <w:i/>
+          <w:color w:val="404040"/>
+          <w:sz w:val="21"/>
+        </w:rPr>
+        <w:t xml:space="preserve"> (Please repeat that one more time.)</w:t>
+      </w:r>
+    </w:p>
+    <w:p>
+      <w:pPr>
+        <w:spacing w:before="0" w:after="0"/>
+      </w:pPr>
+    </w:p>
+    <w:p>
+      <w:pPr>
+        <w:spacing w:after="120"/>
+      </w:pPr>
+      <w:r>
+        <w:rPr>
+          <w:b/>
+        </w:rPr>
+        <w:t>der Notizzettel</w:t>
+      </w:r>
+      <w:r>
+        <w:t xml:space="preserve"> /noˈtiːtsˌtsɛtl̩/</w:t>
+      </w:r>
+    </w:p>
+    <w:p>
+      <w:pPr>
+        <w:spacing w:after="80"/>
+        <w:ind w:left="576"/>
+      </w:pPr>
+      <w:r>
+        <w:rPr>
+          <w:sz w:val="22"/>
+        </w:rPr>
+        <w:t>der Notizzettel, -</w:t>
+      </w:r>
+    </w:p>
+    <w:p>
+      <w:pPr>
+        <w:spacing w:after="80"/>
+        <w:ind w:left="576"/>
+      </w:pPr>
+      <w:r>
+        <w:t>Note slip; small note sheet.</w:t>
+      </w:r>
+    </w:p>
+    <w:p>
+      <w:pPr>
+        <w:spacing w:after="80"/>
+        <w:ind w:left="576"/>
+      </w:pPr>
+      <w:r>
+        <w:rPr>
+          <w:i/>
+          <w:color w:val="404040"/>
+          <w:sz w:val="20"/>
+        </w:rPr>
+        <w:t>• Correct spelling: Notizzettel, not notizzetel/nottizetel.</w:t>
+      </w:r>
+    </w:p>
+    <w:p>
+      <w:pPr>
+        <w:spacing w:after="80"/>
+        <w:ind w:left="576"/>
+      </w:pPr>
+      <w:r>
+        <w:rPr>
+          <w:i/>
+          <w:color w:val="404040"/>
+          <w:sz w:val="20"/>
+        </w:rPr>
+        <w:t>• die Notiz = note; der Zettel = slip/piece of paper. Together: der Notizzettel = a note sheet.</w:t>
+      </w:r>
+    </w:p>
+    <w:p>
+      <w:pPr>
+        <w:spacing w:before="40" w:after="60"/>
+        <w:ind w:left="576"/>
+      </w:pPr>
+      <w:r>
+        <w:rPr>
+          <w:i/>
+          <w:color w:val="30608C"/>
+          <w:sz w:val="21"/>
+        </w:rPr>
+        <w:t xml:space="preserve">› </w:t>
+      </w:r>
+      <w:r>
+        <w:rPr>
+          <w:i/>
+          <w:color w:val="30608C"/>
+          <w:sz w:val="21"/>
+        </w:rPr>
+        <w:t>Ergänzen Sie den Notizzettel.</w:t>
+      </w:r>
+      <w:r>
+        <w:rPr>
+          <w:i/>
+          <w:color w:val="404040"/>
+          <w:sz w:val="21"/>
+        </w:rPr>
+        <w:t xml:space="preserve"> (Complete the note sheet.)</w:t>
+      </w:r>
+    </w:p>
+    <w:p>
+      <w:pPr>
+        <w:spacing w:before="0" w:after="60"/>
+        <w:ind w:left="576"/>
+      </w:pPr>
+      <w:r>
+        <w:rPr>
+          <w:i/>
+          <w:color w:val="30608C"/>
+          <w:sz w:val="21"/>
+        </w:rPr>
+        <w:t xml:space="preserve">› </w:t>
+      </w:r>
+      <w:r>
+        <w:rPr>
+          <w:i/>
+          <w:color w:val="30608C"/>
+          <w:sz w:val="21"/>
+        </w:rPr>
+        <w:t>Hören Sie das Gespräch noch einmal und ergänzen Sie den Notizzettel.</w:t>
+      </w:r>
+      <w:r>
+        <w:rPr>
+          <w:i/>
+          <w:color w:val="404040"/>
+          <w:sz w:val="21"/>
+        </w:rPr>
+        <w:t xml:space="preserve"> (Listen to the conversation one more time and complete the note sheet.)</w:t>
+      </w:r>
+    </w:p>
+    <w:p>
+      <w:pPr>
+        <w:spacing w:before="0" w:after="120"/>
+        <w:ind w:left="576"/>
+      </w:pPr>
+      <w:r>
+        <w:rPr>
+          <w:i/>
+          <w:color w:val="30608C"/>
+          <w:sz w:val="21"/>
+        </w:rPr>
+        <w:t xml:space="preserve">› </w:t>
+      </w:r>
+      <w:r>
+        <w:rPr>
+          <w:i/>
+          <w:color w:val="30608C"/>
+          <w:sz w:val="21"/>
+        </w:rPr>
+        <w:t>Der Notizzettel liegt auf dem Tisch.</w:t>
+      </w:r>
+      <w:r>
+        <w:rPr>
+          <w:i/>
+          <w:color w:val="404040"/>
+          <w:sz w:val="21"/>
+        </w:rPr>
+        <w:t xml:space="preserve"> (The note slip is on the table.)</w:t>
+      </w:r>
+    </w:p>
+    <w:p>
+      <w:pPr>
+        <w:spacing w:before="0" w:after="0"/>
+      </w:pPr>
     </w:p>
     <w:p>
       <w:pPr>

</xml_diff>

<commit_message>
Enhance vocabulary entries for "die Nummer" and "die Zahl" in vocab.docx and vocab.manifest.json
- Added detailed entries for "die Nummer" and "die Zahl," including glosses, notes on usage, and multiple examples in both German and English.
- Both entries are categorized under lesson 1 and level A1, enriching the vocabulary resource for language learners with practical context and applications.
</commit_message>
<xml_diff>
--- a/vocab.docx
+++ b/vocab.docx
@@ -242,7 +242,7 @@
           <w:color w:val="30608C"/>
           <w:sz w:val="21"/>
         </w:rPr>
-        <w:t>Ergänzen Sie den Notizzettel.</w:t>
+        <w:t>Ergänzen Sie den Notizzettel. (den because masculine + accusative.)</w:t>
       </w:r>
       <w:r>
         <w:rPr>
@@ -3939,6 +3939,322 @@
           <w:sz w:val="21"/>
         </w:rPr>
         <w:t xml:space="preserve"> (My phone number is zero six one two.)</w:t>
+      </w:r>
+    </w:p>
+    <w:p>
+      <w:pPr>
+        <w:spacing w:before="0" w:after="0"/>
+      </w:pPr>
+    </w:p>
+    <w:p>
+      <w:pPr>
+        <w:spacing w:after="120"/>
+      </w:pPr>
+      <w:r>
+        <w:rPr>
+          <w:b/>
+        </w:rPr>
+        <w:t>die Nummer</w:t>
+      </w:r>
+      <w:r>
+        <w:t xml:space="preserve"> /ˈnʊmɐ/</w:t>
+      </w:r>
+    </w:p>
+    <w:p>
+      <w:pPr>
+        <w:spacing w:after="80"/>
+        <w:ind w:left="576"/>
+      </w:pPr>
+      <w:r>
+        <w:rPr>
+          <w:sz w:val="22"/>
+        </w:rPr>
+        <w:t>die Nummer, -en</w:t>
+      </w:r>
+    </w:p>
+    <w:p>
+      <w:pPr>
+        <w:spacing w:after="80"/>
+        <w:ind w:left="576"/>
+      </w:pPr>
+      <w:r>
+        <w:t>Number as a label, code, or identifier.</w:t>
+      </w:r>
+    </w:p>
+    <w:p>
+      <w:pPr>
+        <w:spacing w:after="80"/>
+        <w:ind w:left="576"/>
+      </w:pPr>
+      <w:r>
+        <w:rPr>
+          <w:i/>
+          <w:color w:val="404040"/>
+          <w:sz w:val="20"/>
+        </w:rPr>
+        <w:t>• Nummer is a number used as an ID or label: Telefonnummer, Hausnummer, Zimmer Nummer 12.</w:t>
+      </w:r>
+    </w:p>
+    <w:p>
+      <w:pPr>
+        <w:spacing w:after="80"/>
+        <w:ind w:left="576"/>
+      </w:pPr>
+      <w:r>
+        <w:rPr>
+          <w:i/>
+          <w:color w:val="404040"/>
+          <w:sz w:val="20"/>
+        </w:rPr>
+        <w:t>• Difference: Zahl = numerical value/counting/math; Nummer = assigned number/code/identifier.</w:t>
+      </w:r>
+    </w:p>
+    <w:p>
+      <w:pPr>
+        <w:spacing w:before="40" w:after="60"/>
+        <w:ind w:left="576"/>
+      </w:pPr>
+      <w:r>
+        <w:rPr>
+          <w:i/>
+          <w:color w:val="30608C"/>
+          <w:sz w:val="21"/>
+        </w:rPr>
+        <w:t xml:space="preserve">› </w:t>
+      </w:r>
+      <w:r>
+        <w:rPr>
+          <w:i/>
+          <w:color w:val="30608C"/>
+          <w:sz w:val="21"/>
+        </w:rPr>
+        <w:t>Wie ist deine Telefonnummer?</w:t>
+      </w:r>
+      <w:r>
+        <w:rPr>
+          <w:i/>
+          <w:color w:val="404040"/>
+          <w:sz w:val="21"/>
+        </w:rPr>
+        <w:t xml:space="preserve"> (What is your phone number?)</w:t>
+      </w:r>
+    </w:p>
+    <w:p>
+      <w:pPr>
+        <w:spacing w:before="0" w:after="60"/>
+        <w:ind w:left="576"/>
+      </w:pPr>
+      <w:r>
+        <w:rPr>
+          <w:i/>
+          <w:color w:val="30608C"/>
+          <w:sz w:val="21"/>
+        </w:rPr>
+        <w:t xml:space="preserve">› </w:t>
+      </w:r>
+      <w:r>
+        <w:rPr>
+          <w:i/>
+          <w:color w:val="30608C"/>
+          <w:sz w:val="21"/>
+        </w:rPr>
+        <w:t>Meine Nummer ist 53487.</w:t>
+      </w:r>
+      <w:r>
+        <w:rPr>
+          <w:i/>
+          <w:color w:val="404040"/>
+          <w:sz w:val="21"/>
+        </w:rPr>
+        <w:t xml:space="preserve"> (My number is 53487.)</w:t>
+      </w:r>
+    </w:p>
+    <w:p>
+      <w:pPr>
+        <w:spacing w:before="0" w:after="120"/>
+        <w:ind w:left="576"/>
+      </w:pPr>
+      <w:r>
+        <w:rPr>
+          <w:i/>
+          <w:color w:val="30608C"/>
+          <w:sz w:val="21"/>
+        </w:rPr>
+        <w:t xml:space="preserve">› </w:t>
+      </w:r>
+      <w:r>
+        <w:rPr>
+          <w:i/>
+          <w:color w:val="30608C"/>
+          <w:sz w:val="21"/>
+        </w:rPr>
+        <w:t>Zimmer Nummer 12 ist frei.</w:t>
+      </w:r>
+      <w:r>
+        <w:rPr>
+          <w:i/>
+          <w:color w:val="404040"/>
+          <w:sz w:val="21"/>
+        </w:rPr>
+        <w:t xml:space="preserve"> (Room number 12 is free.)</w:t>
+      </w:r>
+    </w:p>
+    <w:p>
+      <w:pPr>
+        <w:spacing w:before="0" w:after="0"/>
+      </w:pPr>
+    </w:p>
+    <w:p>
+      <w:pPr>
+        <w:spacing w:after="120"/>
+      </w:pPr>
+      <w:r>
+        <w:rPr>
+          <w:b/>
+        </w:rPr>
+        <w:t>die Zahl</w:t>
+      </w:r>
+      <w:r>
+        <w:t xml:space="preserve"> /tsaːl/</w:t>
+      </w:r>
+    </w:p>
+    <w:p>
+      <w:pPr>
+        <w:spacing w:after="80"/>
+        <w:ind w:left="576"/>
+      </w:pPr>
+      <w:r>
+        <w:rPr>
+          <w:sz w:val="22"/>
+        </w:rPr>
+        <w:t>die Zahl, -en</w:t>
+      </w:r>
+    </w:p>
+    <w:p>
+      <w:pPr>
+        <w:spacing w:after="80"/>
+        <w:ind w:left="576"/>
+      </w:pPr>
+      <w:r>
+        <w:t>Number as a value; numeral.</w:t>
+      </w:r>
+    </w:p>
+    <w:p>
+      <w:pPr>
+        <w:spacing w:after="80"/>
+        <w:ind w:left="576"/>
+      </w:pPr>
+      <w:r>
+        <w:rPr>
+          <w:i/>
+          <w:color w:val="404040"/>
+          <w:sz w:val="20"/>
+        </w:rPr>
+        <w:t>• Zahl is a number as a value: counting, math, or a number you hear/write.</w:t>
+      </w:r>
+    </w:p>
+    <w:p>
+      <w:pPr>
+        <w:spacing w:after="80"/>
+        <w:ind w:left="576"/>
+      </w:pPr>
+      <w:r>
+        <w:rPr>
+          <w:i/>
+          <w:color w:val="404040"/>
+          <w:sz w:val="20"/>
+        </w:rPr>
+        <w:t>• Compare Nummer: an assigned label/code/ID, as in Telefonnummer, Hausnummer, Zimmer Nummer 12.</w:t>
+      </w:r>
+    </w:p>
+    <w:p>
+      <w:pPr>
+        <w:spacing w:before="40" w:after="60"/>
+        <w:ind w:left="576"/>
+      </w:pPr>
+      <w:r>
+        <w:rPr>
+          <w:i/>
+          <w:color w:val="30608C"/>
+          <w:sz w:val="21"/>
+        </w:rPr>
+        <w:t xml:space="preserve">› </w:t>
+      </w:r>
+      <w:r>
+        <w:rPr>
+          <w:i/>
+          <w:color w:val="30608C"/>
+          <w:sz w:val="21"/>
+        </w:rPr>
+        <w:t>Welche Zahl hören Sie?</w:t>
+      </w:r>
+      <w:r>
+        <w:rPr>
+          <w:i/>
+          <w:color w:val="404040"/>
+          <w:sz w:val="21"/>
+        </w:rPr>
+        <w:t xml:space="preserve"> (Which number do you hear?)</w:t>
+      </w:r>
+    </w:p>
+    <w:p>
+      <w:pPr>
+        <w:spacing w:before="0" w:after="60"/>
+        <w:ind w:left="576"/>
+      </w:pPr>
+      <w:r>
+        <w:rPr>
+          <w:i/>
+          <w:color w:val="30608C"/>
+          <w:sz w:val="21"/>
+        </w:rPr>
+        <w:t xml:space="preserve">› </w:t>
+      </w:r>
+      <w:r>
+        <w:rPr>
+          <w:i/>
+          <w:color w:val="30608C"/>
+          <w:sz w:val="21"/>
+        </w:rPr>
+        <w:t>Die Zahl ist sechs.</w:t>
+      </w:r>
+      <w:r>
+        <w:rPr>
+          <w:i/>
+          <w:color w:val="404040"/>
+          <w:sz w:val="21"/>
+        </w:rPr>
+        <w:t xml:space="preserve"> (The number is six.)</w:t>
+      </w:r>
+    </w:p>
+    <w:p>
+      <w:pPr>
+        <w:spacing w:before="0" w:after="120"/>
+        <w:ind w:left="576"/>
+      </w:pPr>
+      <w:r>
+        <w:rPr>
+          <w:i/>
+          <w:color w:val="30608C"/>
+          <w:sz w:val="21"/>
+        </w:rPr>
+        <w:t xml:space="preserve">› </w:t>
+      </w:r>
+      <w:r>
+        <w:rPr>
+          <w:i/>
+          <w:color w:val="30608C"/>
+          <w:sz w:val="21"/>
+        </w:rPr>
+        <w:t>Die Zahl 10 ist größer als 5.</w:t>
+      </w:r>
+      <w:r>
+        <w:rPr>
+          <w:i/>
+          <w:color w:val="404040"/>
+          <w:sz w:val="21"/>
+        </w:rPr>
+        <w:t xml:space="preserve"> (The number 10 is greater than 5.)</w:t>
       </w:r>
     </w:p>
     <w:p>

</xml_diff>

<commit_message>
Add new vocabulary entry for "mehr" in vocab.docx and vocab.manifest.json
- Introduced a detailed entry for "mehr," including gloss, notes on usage, and multiple examples in both German and English.
- The entry is categorized under lesson 1 and level A1, enhancing the vocabulary resource for language learners with practical usage and context.
</commit_message>
<xml_diff>
--- a/vocab.docx
+++ b/vocab.docx
@@ -22,10 +22,10 @@
         <w:rPr>
           <w:b/>
         </w:rPr>
-        <w:t>noch einmal</w:t>
-      </w:r>
-      <w:r>
-        <w:t xml:space="preserve"> /nɔx ˈaɪ̯nmaːl/</w:t>
+        <w:t>mehr</w:t>
+      </w:r>
+      <w:r>
+        <w:t xml:space="preserve"> /meːɐ̯/</w:t>
       </w:r>
     </w:p>
     <w:p>
@@ -34,7 +34,7 @@
         <w:ind w:left="576"/>
       </w:pPr>
       <w:r>
-        <w:t>One more time; once again.</w:t>
+        <w:t>More.</w:t>
       </w:r>
     </w:p>
     <w:p>
@@ -48,7 +48,7 @@
           <w:color w:val="404040"/>
           <w:sz w:val="20"/>
         </w:rPr>
-        <w:t>• noch = still / yet / additionally; einmal = once / one time.</w:t>
+        <w:t>• mehr adds quantity: mehr Zahlen = more numbers.</w:t>
       </w:r>
     </w:p>
     <w:p>
@@ -62,6 +62,152 @@
           <w:color w:val="404040"/>
           <w:sz w:val="20"/>
         </w:rPr>
+        <w:t>• Opposite idea: weniger = less / fewer.</w:t>
+      </w:r>
+    </w:p>
+    <w:p>
+      <w:pPr>
+        <w:spacing w:before="40" w:after="60"/>
+        <w:ind w:left="576"/>
+      </w:pPr>
+      <w:r>
+        <w:rPr>
+          <w:i/>
+          <w:color w:val="30608C"/>
+          <w:sz w:val="21"/>
+        </w:rPr>
+        <w:t xml:space="preserve">› </w:t>
+      </w:r>
+      <w:r>
+        <w:rPr>
+          <w:i/>
+          <w:color w:val="30608C"/>
+          <w:sz w:val="21"/>
+        </w:rPr>
+        <w:t>Noch mehr Zahlen?</w:t>
+      </w:r>
+      <w:r>
+        <w:rPr>
+          <w:i/>
+          <w:color w:val="404040"/>
+          <w:sz w:val="21"/>
+        </w:rPr>
+        <w:t xml:space="preserve"> (More numbers again? / Even more numbers?)</w:t>
+      </w:r>
+    </w:p>
+    <w:p>
+      <w:pPr>
+        <w:spacing w:before="0" w:after="60"/>
+        <w:ind w:left="576"/>
+      </w:pPr>
+      <w:r>
+        <w:rPr>
+          <w:i/>
+          <w:color w:val="30608C"/>
+          <w:sz w:val="21"/>
+        </w:rPr>
+        <w:t xml:space="preserve">› </w:t>
+      </w:r>
+      <w:r>
+        <w:rPr>
+          <w:i/>
+          <w:color w:val="30608C"/>
+          <w:sz w:val="21"/>
+        </w:rPr>
+        <w:t>Ich möchte mehr Kaffee.</w:t>
+      </w:r>
+      <w:r>
+        <w:rPr>
+          <w:i/>
+          <w:color w:val="404040"/>
+          <w:sz w:val="21"/>
+        </w:rPr>
+        <w:t xml:space="preserve"> (I would like more coffee.)</w:t>
+      </w:r>
+    </w:p>
+    <w:p>
+      <w:pPr>
+        <w:spacing w:before="0" w:after="120"/>
+        <w:ind w:left="576"/>
+      </w:pPr>
+      <w:r>
+        <w:rPr>
+          <w:i/>
+          <w:color w:val="30608C"/>
+          <w:sz w:val="21"/>
+        </w:rPr>
+        <w:t xml:space="preserve">› </w:t>
+      </w:r>
+      <w:r>
+        <w:rPr>
+          <w:i/>
+          <w:color w:val="30608C"/>
+          <w:sz w:val="21"/>
+        </w:rPr>
+        <w:t>Wir lernen mehr Wörter.</w:t>
+      </w:r>
+      <w:r>
+        <w:rPr>
+          <w:i/>
+          <w:color w:val="404040"/>
+          <w:sz w:val="21"/>
+        </w:rPr>
+        <w:t xml:space="preserve"> (We are learning more words.)</w:t>
+      </w:r>
+    </w:p>
+    <w:p>
+      <w:pPr>
+        <w:spacing w:before="0" w:after="0"/>
+      </w:pPr>
+    </w:p>
+    <w:p>
+      <w:pPr>
+        <w:spacing w:after="120"/>
+      </w:pPr>
+      <w:r>
+        <w:rPr>
+          <w:b/>
+        </w:rPr>
+        <w:t>noch einmal</w:t>
+      </w:r>
+      <w:r>
+        <w:t xml:space="preserve"> /nɔx ˈaɪ̯nmaːl/</w:t>
+      </w:r>
+    </w:p>
+    <w:p>
+      <w:pPr>
+        <w:spacing w:after="80"/>
+        <w:ind w:left="576"/>
+      </w:pPr>
+      <w:r>
+        <w:t>One more time; once again.</w:t>
+      </w:r>
+    </w:p>
+    <w:p>
+      <w:pPr>
+        <w:spacing w:after="80"/>
+        <w:ind w:left="576"/>
+      </w:pPr>
+      <w:r>
+        <w:rPr>
+          <w:i/>
+          <w:color w:val="404040"/>
+          <w:sz w:val="20"/>
+        </w:rPr>
+        <w:t>• noch = still / yet / additionally; einmal = once / one time.</w:t>
+      </w:r>
+    </w:p>
+    <w:p>
+      <w:pPr>
+        <w:spacing w:after="80"/>
+        <w:ind w:left="576"/>
+      </w:pPr>
+      <w:r>
+        <w:rPr>
+          <w:i/>
+          <w:color w:val="404040"/>
+          <w:sz w:val="20"/>
+        </w:rPr>
         <w:t>• Together, noch einmal means one more time or again. Casual shorter form: nochmal.</w:t>
       </w:r>
     </w:p>
@@ -127,6 +273,36 @@
     </w:p>
     <w:p>
       <w:pPr>
+        <w:spacing w:before="0" w:after="60"/>
+        <w:ind w:left="576"/>
+      </w:pPr>
+      <w:r>
+        <w:rPr>
+          <w:i/>
+          <w:color w:val="30608C"/>
+          <w:sz w:val="21"/>
+        </w:rPr>
+        <w:t xml:space="preserve">› </w:t>
+      </w:r>
+      <w:r>
+        <w:rPr>
+          <w:i/>
+          <w:color w:val="30608C"/>
+          <w:sz w:val="21"/>
+        </w:rPr>
+        <w:t>Bitte wiederholen Sie das noch einmal.</w:t>
+      </w:r>
+      <w:r>
+        <w:rPr>
+          <w:i/>
+          <w:color w:val="404040"/>
+          <w:sz w:val="21"/>
+        </w:rPr>
+        <w:t xml:space="preserve"> (Please repeat that one more time.)</w:t>
+      </w:r>
+    </w:p>
+    <w:p>
+      <w:pPr>
         <w:spacing w:before="0" w:after="120"/>
         <w:ind w:left="576"/>
       </w:pPr>
@@ -144,7 +320,7 @@
           <w:color w:val="30608C"/>
           <w:sz w:val="21"/>
         </w:rPr>
-        <w:t>Bitte wiederholen Sie das noch einmal.</w:t>
+        <w:t>Noch mehr Zahlen?</w:t>
       </w:r>
       <w:r>
         <w:rPr>
@@ -152,7 +328,7 @@
           <w:color w:val="404040"/>
           <w:sz w:val="21"/>
         </w:rPr>
-        <w:t xml:space="preserve"> (Please repeat that one more time.)</w:t>
+        <w:t xml:space="preserve"> (More numbers again? / Even more numbers?)</w:t>
       </w:r>
     </w:p>
     <w:p>

</xml_diff>

<commit_message>
Add new vocabulary entry for numbers from 11 upward in vocab.docx and vocab.manifest.json
- Introduced a comprehensive entry detailing numbers from 11 to 1,000,000, including glosses, usage notes, and a grammar table with examples.
- The entry is categorized under lesson 1 and level A1, enriching the vocabulary resource for language learners with practical applications and context.
</commit_message>
<xml_diff>
--- a/vocab.docx
+++ b/vocab.docx
@@ -13,6 +13,2313 @@
         </w:rPr>
         <w:t>daf — vocabulary</w:t>
       </w:r>
+    </w:p>
+    <w:p>
+      <w:pPr>
+        <w:spacing w:after="120"/>
+      </w:pPr>
+      <w:r>
+        <w:rPr>
+          <w:b/>
+        </w:rPr>
+        <w:t>die Zahlen ab 11</w:t>
+      </w:r>
+      <w:r>
+        <w:t xml:space="preserve"> /diː ˈtsaːlən ap ɛlf/</w:t>
+      </w:r>
+    </w:p>
+    <w:p>
+      <w:pPr>
+        <w:spacing w:after="80"/>
+        <w:ind w:left="576"/>
+      </w:pPr>
+      <w:r>
+        <w:t>Numbers from 11 upward.</w:t>
+      </w:r>
+    </w:p>
+    <w:p>
+      <w:pPr>
+        <w:spacing w:after="80"/>
+        <w:ind w:left="576"/>
+      </w:pPr>
+      <w:r>
+        <w:rPr>
+          <w:i/>
+          <w:color w:val="404040"/>
+          <w:sz w:val="20"/>
+        </w:rPr>
+        <w:t>• 13-19 mostly use -zehn: dreizehn, vierzehn, fünfzehn; watch the shortened forms sechzehn and siebzehn.</w:t>
+      </w:r>
+    </w:p>
+    <w:p>
+      <w:pPr>
+        <w:spacing w:after="80"/>
+        <w:ind w:left="576"/>
+      </w:pPr>
+      <w:r>
+        <w:rPr>
+          <w:i/>
+          <w:color w:val="404040"/>
+          <w:sz w:val="20"/>
+        </w:rPr>
+        <w:t>• 21-99 put the small number first, then und, then the ten: einundzwanzig = one-and-twenty = twenty-one.</w:t>
+      </w:r>
+    </w:p>
+    <w:p>
+      <w:pPr>
+        <w:spacing w:after="80"/>
+        <w:ind w:left="576"/>
+      </w:pPr>
+      <w:r>
+        <w:rPr>
+          <w:i/>
+          <w:color w:val="404040"/>
+          <w:sz w:val="20"/>
+        </w:rPr>
+        <w:t>• In listening, zwo may be used for zwei, hundert for einhundert, and tausend for eintausend.</w:t>
+      </w:r>
+    </w:p>
+    <w:p>
+      <w:pPr>
+        <w:spacing w:after="80"/>
+        <w:ind w:left="576"/>
+      </w:pPr>
+      <w:r>
+        <w:rPr>
+          <w:i/>
+          <w:color w:val="404040"/>
+          <w:sz w:val="20"/>
+        </w:rPr>
+        <w:t>• Million and Milliarde are nouns, so they use eine: eine Million, eine Milliarde.</w:t>
+      </w:r>
+    </w:p>
+    <w:tbl>
+      <w:tblPr>
+        <w:tblStyle w:val="TableGrid"/>
+        <w:tblW w:type="auto" w:w="0"/>
+        <w:tblLook w:firstColumn="1" w:firstRow="1" w:lastColumn="0" w:lastRow="0" w:noHBand="0" w:noVBand="1" w:val="04A0"/>
+        <w:tblInd w:w="576" w:type="dxa"/>
+      </w:tblPr>
+      <w:tblGrid>
+        <w:gridCol w:w="2160"/>
+        <w:gridCol w:w="2160"/>
+        <w:gridCol w:w="2160"/>
+        <w:gridCol w:w="2160"/>
+      </w:tblGrid>
+      <w:tr>
+        <w:tc>
+          <w:tcPr>
+            <w:tcW w:type="dxa" w:w="2160"/>
+            <w:shd w:val="clear" w:color="auto" w:fill="EFF6FC"/>
+          </w:tcPr>
+          <w:p>
+            <w:pPr>
+              <w:spacing w:after="40"/>
+            </w:pPr>
+            <w:r/>
+            <w:r>
+              <w:rPr>
+                <w:rFonts w:ascii="Calibri" w:hAnsi="Calibri"/>
+                <w:b/>
+                <w:color w:val="333333"/>
+                <w:sz w:val="20"/>
+              </w:rPr>
+              <w:t>Bereich</w:t>
+            </w:r>
+          </w:p>
+        </w:tc>
+        <w:tc>
+          <w:tcPr>
+            <w:tcW w:type="dxa" w:w="2160"/>
+            <w:shd w:val="clear" w:color="auto" w:fill="EFF6FC"/>
+          </w:tcPr>
+          <w:p>
+            <w:pPr>
+              <w:spacing w:after="40"/>
+            </w:pPr>
+            <w:r/>
+            <w:r>
+              <w:rPr>
+                <w:rFonts w:ascii="Calibri" w:hAnsi="Calibri"/>
+                <w:b/>
+                <w:color w:val="333333"/>
+                <w:sz w:val="20"/>
+              </w:rPr>
+              <w:t>Zahl</w:t>
+            </w:r>
+          </w:p>
+        </w:tc>
+        <w:tc>
+          <w:tcPr>
+            <w:tcW w:type="dxa" w:w="2160"/>
+            <w:shd w:val="clear" w:color="auto" w:fill="EFF6FC"/>
+          </w:tcPr>
+          <w:p>
+            <w:pPr>
+              <w:spacing w:after="40"/>
+            </w:pPr>
+            <w:r/>
+            <w:r>
+              <w:rPr>
+                <w:rFonts w:ascii="Calibri" w:hAnsi="Calibri"/>
+                <w:b/>
+                <w:color w:val="333333"/>
+                <w:sz w:val="20"/>
+              </w:rPr>
+              <w:t>Deutsch</w:t>
+            </w:r>
+          </w:p>
+        </w:tc>
+        <w:tc>
+          <w:tcPr>
+            <w:tcW w:type="dxa" w:w="2160"/>
+            <w:shd w:val="clear" w:color="auto" w:fill="EFF6FC"/>
+          </w:tcPr>
+          <w:p>
+            <w:pPr>
+              <w:spacing w:after="40"/>
+            </w:pPr>
+            <w:r/>
+            <w:r>
+              <w:rPr>
+                <w:rFonts w:ascii="Calibri" w:hAnsi="Calibri"/>
+                <w:b/>
+                <w:color w:val="333333"/>
+                <w:sz w:val="20"/>
+              </w:rPr>
+              <w:t>Muster / Tipp</w:t>
+            </w:r>
+          </w:p>
+        </w:tc>
+      </w:tr>
+      <w:tr>
+        <w:tc>
+          <w:tcPr>
+            <w:tcW w:type="dxa" w:w="2160"/>
+          </w:tcPr>
+          <w:p>
+            <w:pPr>
+              <w:spacing w:after="40"/>
+            </w:pPr>
+            <w:r/>
+            <w:r>
+              <w:rPr>
+                <w:rFonts w:ascii="Calibri" w:hAnsi="Calibri"/>
+                <w:color w:val="404040"/>
+                <w:sz w:val="19"/>
+              </w:rPr>
+              <w:t>11-12</w:t>
+            </w:r>
+          </w:p>
+        </w:tc>
+        <w:tc>
+          <w:tcPr>
+            <w:tcW w:type="dxa" w:w="2160"/>
+          </w:tcPr>
+          <w:p>
+            <w:pPr>
+              <w:spacing w:after="40"/>
+            </w:pPr>
+            <w:r/>
+            <w:r>
+              <w:rPr>
+                <w:rFonts w:ascii="Calibri" w:hAnsi="Calibri"/>
+                <w:color w:val="404040"/>
+                <w:sz w:val="19"/>
+              </w:rPr>
+              <w:t>11</w:t>
+            </w:r>
+          </w:p>
+        </w:tc>
+        <w:tc>
+          <w:tcPr>
+            <w:tcW w:type="dxa" w:w="2160"/>
+          </w:tcPr>
+          <w:p>
+            <w:pPr>
+              <w:spacing w:after="40"/>
+            </w:pPr>
+            <w:r/>
+            <w:r>
+              <w:rPr>
+                <w:rFonts w:ascii="Calibri" w:hAnsi="Calibri"/>
+                <w:color w:val="404040"/>
+                <w:sz w:val="19"/>
+              </w:rPr>
+              <w:t>elf</w:t>
+            </w:r>
+          </w:p>
+        </w:tc>
+        <w:tc>
+          <w:tcPr>
+            <w:tcW w:type="dxa" w:w="2160"/>
+          </w:tcPr>
+          <w:p>
+            <w:pPr>
+              <w:spacing w:after="40"/>
+            </w:pPr>
+            <w:r/>
+            <w:r>
+              <w:rPr>
+                <w:rFonts w:ascii="Calibri" w:hAnsi="Calibri"/>
+                <w:color w:val="404040"/>
+                <w:sz w:val="19"/>
+              </w:rPr>
+              <w:t>special form</w:t>
+            </w:r>
+          </w:p>
+        </w:tc>
+      </w:tr>
+      <w:tr>
+        <w:tc>
+          <w:tcPr>
+            <w:tcW w:type="dxa" w:w="2160"/>
+          </w:tcPr>
+          <w:p>
+            <w:pPr>
+              <w:spacing w:after="40"/>
+            </w:pPr>
+            <w:r/>
+            <w:r>
+              <w:rPr>
+                <w:rFonts w:ascii="Calibri" w:hAnsi="Calibri"/>
+                <w:color w:val="404040"/>
+                <w:sz w:val="19"/>
+              </w:rPr>
+              <w:t>11-12</w:t>
+            </w:r>
+          </w:p>
+        </w:tc>
+        <w:tc>
+          <w:tcPr>
+            <w:tcW w:type="dxa" w:w="2160"/>
+          </w:tcPr>
+          <w:p>
+            <w:pPr>
+              <w:spacing w:after="40"/>
+            </w:pPr>
+            <w:r/>
+            <w:r>
+              <w:rPr>
+                <w:rFonts w:ascii="Calibri" w:hAnsi="Calibri"/>
+                <w:color w:val="404040"/>
+                <w:sz w:val="19"/>
+              </w:rPr>
+              <w:t>12</w:t>
+            </w:r>
+          </w:p>
+        </w:tc>
+        <w:tc>
+          <w:tcPr>
+            <w:tcW w:type="dxa" w:w="2160"/>
+          </w:tcPr>
+          <w:p>
+            <w:pPr>
+              <w:spacing w:after="40"/>
+            </w:pPr>
+            <w:r/>
+            <w:r>
+              <w:rPr>
+                <w:rFonts w:ascii="Calibri" w:hAnsi="Calibri"/>
+                <w:color w:val="404040"/>
+                <w:sz w:val="19"/>
+              </w:rPr>
+              <w:t>zwölf</w:t>
+            </w:r>
+          </w:p>
+        </w:tc>
+        <w:tc>
+          <w:tcPr>
+            <w:tcW w:type="dxa" w:w="2160"/>
+          </w:tcPr>
+          <w:p>
+            <w:pPr>
+              <w:spacing w:after="40"/>
+            </w:pPr>
+            <w:r/>
+            <w:r>
+              <w:rPr>
+                <w:rFonts w:ascii="Calibri" w:hAnsi="Calibri"/>
+                <w:color w:val="404040"/>
+                <w:sz w:val="19"/>
+              </w:rPr>
+              <w:t>special form</w:t>
+            </w:r>
+          </w:p>
+        </w:tc>
+      </w:tr>
+      <w:tr>
+        <w:tc>
+          <w:tcPr>
+            <w:tcW w:type="dxa" w:w="2160"/>
+          </w:tcPr>
+          <w:p>
+            <w:pPr>
+              <w:spacing w:after="40"/>
+            </w:pPr>
+            <w:r/>
+            <w:r>
+              <w:rPr>
+                <w:rFonts w:ascii="Calibri" w:hAnsi="Calibri"/>
+                <w:color w:val="404040"/>
+                <w:sz w:val="19"/>
+              </w:rPr>
+              <w:t>13-19</w:t>
+            </w:r>
+          </w:p>
+        </w:tc>
+        <w:tc>
+          <w:tcPr>
+            <w:tcW w:type="dxa" w:w="2160"/>
+          </w:tcPr>
+          <w:p>
+            <w:pPr>
+              <w:spacing w:after="40"/>
+            </w:pPr>
+            <w:r/>
+            <w:r>
+              <w:rPr>
+                <w:rFonts w:ascii="Calibri" w:hAnsi="Calibri"/>
+                <w:color w:val="404040"/>
+                <w:sz w:val="19"/>
+              </w:rPr>
+              <w:t>13</w:t>
+            </w:r>
+          </w:p>
+        </w:tc>
+        <w:tc>
+          <w:tcPr>
+            <w:tcW w:type="dxa" w:w="2160"/>
+          </w:tcPr>
+          <w:p>
+            <w:pPr>
+              <w:spacing w:after="40"/>
+            </w:pPr>
+            <w:r/>
+            <w:r>
+              <w:rPr>
+                <w:rFonts w:ascii="Calibri" w:hAnsi="Calibri"/>
+                <w:color w:val="404040"/>
+                <w:sz w:val="19"/>
+              </w:rPr>
+              <w:t>dreizehn</w:t>
+            </w:r>
+          </w:p>
+        </w:tc>
+        <w:tc>
+          <w:tcPr>
+            <w:tcW w:type="dxa" w:w="2160"/>
+          </w:tcPr>
+          <w:p>
+            <w:pPr>
+              <w:spacing w:after="40"/>
+            </w:pPr>
+            <w:r/>
+            <w:r>
+              <w:rPr>
+                <w:rFonts w:ascii="Calibri" w:hAnsi="Calibri"/>
+                <w:color w:val="404040"/>
+                <w:sz w:val="19"/>
+              </w:rPr>
+              <w:t>drei + zehn</w:t>
+            </w:r>
+          </w:p>
+        </w:tc>
+      </w:tr>
+      <w:tr>
+        <w:tc>
+          <w:tcPr>
+            <w:tcW w:type="dxa" w:w="2160"/>
+          </w:tcPr>
+          <w:p>
+            <w:pPr>
+              <w:spacing w:after="40"/>
+            </w:pPr>
+            <w:r/>
+            <w:r>
+              <w:rPr>
+                <w:rFonts w:ascii="Calibri" w:hAnsi="Calibri"/>
+                <w:color w:val="404040"/>
+                <w:sz w:val="19"/>
+              </w:rPr>
+              <w:t>13-19</w:t>
+            </w:r>
+          </w:p>
+        </w:tc>
+        <w:tc>
+          <w:tcPr>
+            <w:tcW w:type="dxa" w:w="2160"/>
+          </w:tcPr>
+          <w:p>
+            <w:pPr>
+              <w:spacing w:after="40"/>
+            </w:pPr>
+            <w:r/>
+            <w:r>
+              <w:rPr>
+                <w:rFonts w:ascii="Calibri" w:hAnsi="Calibri"/>
+                <w:color w:val="404040"/>
+                <w:sz w:val="19"/>
+              </w:rPr>
+              <w:t>14</w:t>
+            </w:r>
+          </w:p>
+        </w:tc>
+        <w:tc>
+          <w:tcPr>
+            <w:tcW w:type="dxa" w:w="2160"/>
+          </w:tcPr>
+          <w:p>
+            <w:pPr>
+              <w:spacing w:after="40"/>
+            </w:pPr>
+            <w:r/>
+            <w:r>
+              <w:rPr>
+                <w:rFonts w:ascii="Calibri" w:hAnsi="Calibri"/>
+                <w:color w:val="404040"/>
+                <w:sz w:val="19"/>
+              </w:rPr>
+              <w:t>vierzehn</w:t>
+            </w:r>
+          </w:p>
+        </w:tc>
+        <w:tc>
+          <w:tcPr>
+            <w:tcW w:type="dxa" w:w="2160"/>
+          </w:tcPr>
+          <w:p>
+            <w:pPr>
+              <w:spacing w:after="40"/>
+            </w:pPr>
+            <w:r/>
+            <w:r>
+              <w:rPr>
+                <w:rFonts w:ascii="Calibri" w:hAnsi="Calibri"/>
+                <w:color w:val="404040"/>
+                <w:sz w:val="19"/>
+              </w:rPr>
+              <w:t>vier + zehn</w:t>
+            </w:r>
+          </w:p>
+        </w:tc>
+      </w:tr>
+      <w:tr>
+        <w:tc>
+          <w:tcPr>
+            <w:tcW w:type="dxa" w:w="2160"/>
+          </w:tcPr>
+          <w:p>
+            <w:pPr>
+              <w:spacing w:after="40"/>
+            </w:pPr>
+            <w:r/>
+            <w:r>
+              <w:rPr>
+                <w:rFonts w:ascii="Calibri" w:hAnsi="Calibri"/>
+                <w:color w:val="404040"/>
+                <w:sz w:val="19"/>
+              </w:rPr>
+              <w:t>13-19</w:t>
+            </w:r>
+          </w:p>
+        </w:tc>
+        <w:tc>
+          <w:tcPr>
+            <w:tcW w:type="dxa" w:w="2160"/>
+          </w:tcPr>
+          <w:p>
+            <w:pPr>
+              <w:spacing w:after="40"/>
+            </w:pPr>
+            <w:r/>
+            <w:r>
+              <w:rPr>
+                <w:rFonts w:ascii="Calibri" w:hAnsi="Calibri"/>
+                <w:color w:val="404040"/>
+                <w:sz w:val="19"/>
+              </w:rPr>
+              <w:t>15</w:t>
+            </w:r>
+          </w:p>
+        </w:tc>
+        <w:tc>
+          <w:tcPr>
+            <w:tcW w:type="dxa" w:w="2160"/>
+          </w:tcPr>
+          <w:p>
+            <w:pPr>
+              <w:spacing w:after="40"/>
+            </w:pPr>
+            <w:r/>
+            <w:r>
+              <w:rPr>
+                <w:rFonts w:ascii="Calibri" w:hAnsi="Calibri"/>
+                <w:color w:val="404040"/>
+                <w:sz w:val="19"/>
+              </w:rPr>
+              <w:t>fünfzehn</w:t>
+            </w:r>
+          </w:p>
+        </w:tc>
+        <w:tc>
+          <w:tcPr>
+            <w:tcW w:type="dxa" w:w="2160"/>
+          </w:tcPr>
+          <w:p>
+            <w:pPr>
+              <w:spacing w:after="40"/>
+            </w:pPr>
+            <w:r/>
+            <w:r>
+              <w:rPr>
+                <w:rFonts w:ascii="Calibri" w:hAnsi="Calibri"/>
+                <w:color w:val="404040"/>
+                <w:sz w:val="19"/>
+              </w:rPr>
+              <w:t>fünf + zehn</w:t>
+            </w:r>
+          </w:p>
+        </w:tc>
+      </w:tr>
+      <w:tr>
+        <w:tc>
+          <w:tcPr>
+            <w:tcW w:type="dxa" w:w="2160"/>
+          </w:tcPr>
+          <w:p>
+            <w:pPr>
+              <w:spacing w:after="40"/>
+            </w:pPr>
+            <w:r/>
+            <w:r>
+              <w:rPr>
+                <w:rFonts w:ascii="Calibri" w:hAnsi="Calibri"/>
+                <w:color w:val="404040"/>
+                <w:sz w:val="19"/>
+              </w:rPr>
+              <w:t>13-19</w:t>
+            </w:r>
+          </w:p>
+        </w:tc>
+        <w:tc>
+          <w:tcPr>
+            <w:tcW w:type="dxa" w:w="2160"/>
+          </w:tcPr>
+          <w:p>
+            <w:pPr>
+              <w:spacing w:after="40"/>
+            </w:pPr>
+            <w:r/>
+            <w:r>
+              <w:rPr>
+                <w:rFonts w:ascii="Calibri" w:hAnsi="Calibri"/>
+                <w:color w:val="404040"/>
+                <w:sz w:val="19"/>
+              </w:rPr>
+              <w:t>16</w:t>
+            </w:r>
+          </w:p>
+        </w:tc>
+        <w:tc>
+          <w:tcPr>
+            <w:tcW w:type="dxa" w:w="2160"/>
+          </w:tcPr>
+          <w:p>
+            <w:pPr>
+              <w:spacing w:after="40"/>
+            </w:pPr>
+            <w:r/>
+            <w:r>
+              <w:rPr>
+                <w:rFonts w:ascii="Calibri" w:hAnsi="Calibri"/>
+                <w:color w:val="404040"/>
+                <w:sz w:val="19"/>
+              </w:rPr>
+              <w:t>sechzehn</w:t>
+            </w:r>
+          </w:p>
+        </w:tc>
+        <w:tc>
+          <w:tcPr>
+            <w:tcW w:type="dxa" w:w="2160"/>
+          </w:tcPr>
+          <w:p>
+            <w:pPr>
+              <w:spacing w:after="40"/>
+            </w:pPr>
+            <w:r/>
+            <w:r>
+              <w:rPr>
+                <w:rFonts w:ascii="Calibri" w:hAnsi="Calibri"/>
+                <w:color w:val="404040"/>
+                <w:sz w:val="19"/>
+              </w:rPr>
+              <w:t>not sechszehn</w:t>
+            </w:r>
+          </w:p>
+        </w:tc>
+      </w:tr>
+      <w:tr>
+        <w:tc>
+          <w:tcPr>
+            <w:tcW w:type="dxa" w:w="2160"/>
+          </w:tcPr>
+          <w:p>
+            <w:pPr>
+              <w:spacing w:after="40"/>
+            </w:pPr>
+            <w:r/>
+            <w:r>
+              <w:rPr>
+                <w:rFonts w:ascii="Calibri" w:hAnsi="Calibri"/>
+                <w:color w:val="404040"/>
+                <w:sz w:val="19"/>
+              </w:rPr>
+              <w:t>13-19</w:t>
+            </w:r>
+          </w:p>
+        </w:tc>
+        <w:tc>
+          <w:tcPr>
+            <w:tcW w:type="dxa" w:w="2160"/>
+          </w:tcPr>
+          <w:p>
+            <w:pPr>
+              <w:spacing w:after="40"/>
+            </w:pPr>
+            <w:r/>
+            <w:r>
+              <w:rPr>
+                <w:rFonts w:ascii="Calibri" w:hAnsi="Calibri"/>
+                <w:color w:val="404040"/>
+                <w:sz w:val="19"/>
+              </w:rPr>
+              <w:t>17</w:t>
+            </w:r>
+          </w:p>
+        </w:tc>
+        <w:tc>
+          <w:tcPr>
+            <w:tcW w:type="dxa" w:w="2160"/>
+          </w:tcPr>
+          <w:p>
+            <w:pPr>
+              <w:spacing w:after="40"/>
+            </w:pPr>
+            <w:r/>
+            <w:r>
+              <w:rPr>
+                <w:rFonts w:ascii="Calibri" w:hAnsi="Calibri"/>
+                <w:color w:val="404040"/>
+                <w:sz w:val="19"/>
+              </w:rPr>
+              <w:t>siebzehn</w:t>
+            </w:r>
+          </w:p>
+        </w:tc>
+        <w:tc>
+          <w:tcPr>
+            <w:tcW w:type="dxa" w:w="2160"/>
+          </w:tcPr>
+          <w:p>
+            <w:pPr>
+              <w:spacing w:after="40"/>
+            </w:pPr>
+            <w:r/>
+            <w:r>
+              <w:rPr>
+                <w:rFonts w:ascii="Calibri" w:hAnsi="Calibri"/>
+                <w:color w:val="404040"/>
+                <w:sz w:val="19"/>
+              </w:rPr>
+              <w:t>not siebenzehn</w:t>
+            </w:r>
+          </w:p>
+        </w:tc>
+      </w:tr>
+      <w:tr>
+        <w:tc>
+          <w:tcPr>
+            <w:tcW w:type="dxa" w:w="2160"/>
+          </w:tcPr>
+          <w:p>
+            <w:pPr>
+              <w:spacing w:after="40"/>
+            </w:pPr>
+            <w:r/>
+            <w:r>
+              <w:rPr>
+                <w:rFonts w:ascii="Calibri" w:hAnsi="Calibri"/>
+                <w:color w:val="404040"/>
+                <w:sz w:val="19"/>
+              </w:rPr>
+              <w:t>13-19</w:t>
+            </w:r>
+          </w:p>
+        </w:tc>
+        <w:tc>
+          <w:tcPr>
+            <w:tcW w:type="dxa" w:w="2160"/>
+          </w:tcPr>
+          <w:p>
+            <w:pPr>
+              <w:spacing w:after="40"/>
+            </w:pPr>
+            <w:r/>
+            <w:r>
+              <w:rPr>
+                <w:rFonts w:ascii="Calibri" w:hAnsi="Calibri"/>
+                <w:color w:val="404040"/>
+                <w:sz w:val="19"/>
+              </w:rPr>
+              <w:t>18</w:t>
+            </w:r>
+          </w:p>
+        </w:tc>
+        <w:tc>
+          <w:tcPr>
+            <w:tcW w:type="dxa" w:w="2160"/>
+          </w:tcPr>
+          <w:p>
+            <w:pPr>
+              <w:spacing w:after="40"/>
+            </w:pPr>
+            <w:r/>
+            <w:r>
+              <w:rPr>
+                <w:rFonts w:ascii="Calibri" w:hAnsi="Calibri"/>
+                <w:color w:val="404040"/>
+                <w:sz w:val="19"/>
+              </w:rPr>
+              <w:t>achtzehn</w:t>
+            </w:r>
+          </w:p>
+        </w:tc>
+        <w:tc>
+          <w:tcPr>
+            <w:tcW w:type="dxa" w:w="2160"/>
+          </w:tcPr>
+          <w:p>
+            <w:pPr>
+              <w:spacing w:after="40"/>
+            </w:pPr>
+            <w:r/>
+            <w:r>
+              <w:rPr>
+                <w:rFonts w:ascii="Calibri" w:hAnsi="Calibri"/>
+                <w:color w:val="404040"/>
+                <w:sz w:val="19"/>
+              </w:rPr>
+              <w:t>acht + zehn</w:t>
+            </w:r>
+          </w:p>
+        </w:tc>
+      </w:tr>
+      <w:tr>
+        <w:tc>
+          <w:tcPr>
+            <w:tcW w:type="dxa" w:w="2160"/>
+          </w:tcPr>
+          <w:p>
+            <w:pPr>
+              <w:spacing w:after="40"/>
+            </w:pPr>
+            <w:r/>
+            <w:r>
+              <w:rPr>
+                <w:rFonts w:ascii="Calibri" w:hAnsi="Calibri"/>
+                <w:color w:val="404040"/>
+                <w:sz w:val="19"/>
+              </w:rPr>
+              <w:t>13-19</w:t>
+            </w:r>
+          </w:p>
+        </w:tc>
+        <w:tc>
+          <w:tcPr>
+            <w:tcW w:type="dxa" w:w="2160"/>
+          </w:tcPr>
+          <w:p>
+            <w:pPr>
+              <w:spacing w:after="40"/>
+            </w:pPr>
+            <w:r/>
+            <w:r>
+              <w:rPr>
+                <w:rFonts w:ascii="Calibri" w:hAnsi="Calibri"/>
+                <w:color w:val="404040"/>
+                <w:sz w:val="19"/>
+              </w:rPr>
+              <w:t>19</w:t>
+            </w:r>
+          </w:p>
+        </w:tc>
+        <w:tc>
+          <w:tcPr>
+            <w:tcW w:type="dxa" w:w="2160"/>
+          </w:tcPr>
+          <w:p>
+            <w:pPr>
+              <w:spacing w:after="40"/>
+            </w:pPr>
+            <w:r/>
+            <w:r>
+              <w:rPr>
+                <w:rFonts w:ascii="Calibri" w:hAnsi="Calibri"/>
+                <w:color w:val="404040"/>
+                <w:sz w:val="19"/>
+              </w:rPr>
+              <w:t>neunzehn</w:t>
+            </w:r>
+          </w:p>
+        </w:tc>
+        <w:tc>
+          <w:tcPr>
+            <w:tcW w:type="dxa" w:w="2160"/>
+          </w:tcPr>
+          <w:p>
+            <w:pPr>
+              <w:spacing w:after="40"/>
+            </w:pPr>
+            <w:r/>
+            <w:r>
+              <w:rPr>
+                <w:rFonts w:ascii="Calibri" w:hAnsi="Calibri"/>
+                <w:color w:val="404040"/>
+                <w:sz w:val="19"/>
+              </w:rPr>
+              <w:t>neun + zehn</w:t>
+            </w:r>
+          </w:p>
+        </w:tc>
+      </w:tr>
+      <w:tr>
+        <w:tc>
+          <w:tcPr>
+            <w:tcW w:type="dxa" w:w="2160"/>
+          </w:tcPr>
+          <w:p>
+            <w:pPr>
+              <w:spacing w:after="40"/>
+            </w:pPr>
+            <w:r/>
+            <w:r>
+              <w:rPr>
+                <w:rFonts w:ascii="Calibri" w:hAnsi="Calibri"/>
+                <w:color w:val="404040"/>
+                <w:sz w:val="19"/>
+              </w:rPr>
+              <w:t>tens</w:t>
+            </w:r>
+          </w:p>
+        </w:tc>
+        <w:tc>
+          <w:tcPr>
+            <w:tcW w:type="dxa" w:w="2160"/>
+          </w:tcPr>
+          <w:p>
+            <w:pPr>
+              <w:spacing w:after="40"/>
+            </w:pPr>
+            <w:r/>
+            <w:r>
+              <w:rPr>
+                <w:rFonts w:ascii="Calibri" w:hAnsi="Calibri"/>
+                <w:color w:val="404040"/>
+                <w:sz w:val="19"/>
+              </w:rPr>
+              <w:t>20</w:t>
+            </w:r>
+          </w:p>
+        </w:tc>
+        <w:tc>
+          <w:tcPr>
+            <w:tcW w:type="dxa" w:w="2160"/>
+          </w:tcPr>
+          <w:p>
+            <w:pPr>
+              <w:spacing w:after="40"/>
+            </w:pPr>
+            <w:r/>
+            <w:r>
+              <w:rPr>
+                <w:rFonts w:ascii="Calibri" w:hAnsi="Calibri"/>
+                <w:color w:val="404040"/>
+                <w:sz w:val="19"/>
+              </w:rPr>
+              <w:t>zwanzig</w:t>
+            </w:r>
+          </w:p>
+        </w:tc>
+        <w:tc>
+          <w:tcPr>
+            <w:tcW w:type="dxa" w:w="2160"/>
+          </w:tcPr>
+          <w:p>
+            <w:pPr>
+              <w:spacing w:after="40"/>
+            </w:pPr>
+            <w:r/>
+            <w:r>
+              <w:rPr>
+                <w:rFonts w:ascii="Calibri" w:hAnsi="Calibri"/>
+                <w:color w:val="404040"/>
+                <w:sz w:val="19"/>
+              </w:rPr>
+              <w:t>-zig ending</w:t>
+            </w:r>
+          </w:p>
+        </w:tc>
+      </w:tr>
+      <w:tr>
+        <w:tc>
+          <w:tcPr>
+            <w:tcW w:type="dxa" w:w="2160"/>
+          </w:tcPr>
+          <w:p>
+            <w:pPr>
+              <w:spacing w:after="40"/>
+            </w:pPr>
+            <w:r/>
+            <w:r>
+              <w:rPr>
+                <w:rFonts w:ascii="Calibri" w:hAnsi="Calibri"/>
+                <w:color w:val="404040"/>
+                <w:sz w:val="19"/>
+              </w:rPr>
+              <w:t>21-99</w:t>
+            </w:r>
+          </w:p>
+        </w:tc>
+        <w:tc>
+          <w:tcPr>
+            <w:tcW w:type="dxa" w:w="2160"/>
+          </w:tcPr>
+          <w:p>
+            <w:pPr>
+              <w:spacing w:after="40"/>
+            </w:pPr>
+            <w:r/>
+            <w:r>
+              <w:rPr>
+                <w:rFonts w:ascii="Calibri" w:hAnsi="Calibri"/>
+                <w:color w:val="404040"/>
+                <w:sz w:val="19"/>
+              </w:rPr>
+              <w:t>21</w:t>
+            </w:r>
+          </w:p>
+        </w:tc>
+        <w:tc>
+          <w:tcPr>
+            <w:tcW w:type="dxa" w:w="2160"/>
+          </w:tcPr>
+          <w:p>
+            <w:pPr>
+              <w:spacing w:after="40"/>
+            </w:pPr>
+            <w:r/>
+            <w:r>
+              <w:rPr>
+                <w:rFonts w:ascii="Calibri" w:hAnsi="Calibri"/>
+                <w:color w:val="404040"/>
+                <w:sz w:val="19"/>
+              </w:rPr>
+              <w:t>einundzwanzig</w:t>
+            </w:r>
+          </w:p>
+        </w:tc>
+        <w:tc>
+          <w:tcPr>
+            <w:tcW w:type="dxa" w:w="2160"/>
+          </w:tcPr>
+          <w:p>
+            <w:pPr>
+              <w:spacing w:after="40"/>
+            </w:pPr>
+            <w:r/>
+            <w:r>
+              <w:rPr>
+                <w:rFonts w:ascii="Calibri" w:hAnsi="Calibri"/>
+                <w:color w:val="404040"/>
+                <w:sz w:val="19"/>
+              </w:rPr>
+              <w:t>ein + und + zwanzig</w:t>
+            </w:r>
+          </w:p>
+        </w:tc>
+      </w:tr>
+      <w:tr>
+        <w:tc>
+          <w:tcPr>
+            <w:tcW w:type="dxa" w:w="2160"/>
+          </w:tcPr>
+          <w:p>
+            <w:pPr>
+              <w:spacing w:after="40"/>
+            </w:pPr>
+            <w:r/>
+            <w:r>
+              <w:rPr>
+                <w:rFonts w:ascii="Calibri" w:hAnsi="Calibri"/>
+                <w:color w:val="404040"/>
+                <w:sz w:val="19"/>
+              </w:rPr>
+              <w:t>tens</w:t>
+            </w:r>
+          </w:p>
+        </w:tc>
+        <w:tc>
+          <w:tcPr>
+            <w:tcW w:type="dxa" w:w="2160"/>
+          </w:tcPr>
+          <w:p>
+            <w:pPr>
+              <w:spacing w:after="40"/>
+            </w:pPr>
+            <w:r/>
+            <w:r>
+              <w:rPr>
+                <w:rFonts w:ascii="Calibri" w:hAnsi="Calibri"/>
+                <w:color w:val="404040"/>
+                <w:sz w:val="19"/>
+              </w:rPr>
+              <w:t>30</w:t>
+            </w:r>
+          </w:p>
+        </w:tc>
+        <w:tc>
+          <w:tcPr>
+            <w:tcW w:type="dxa" w:w="2160"/>
+          </w:tcPr>
+          <w:p>
+            <w:pPr>
+              <w:spacing w:after="40"/>
+            </w:pPr>
+            <w:r/>
+            <w:r>
+              <w:rPr>
+                <w:rFonts w:ascii="Calibri" w:hAnsi="Calibri"/>
+                <w:color w:val="404040"/>
+                <w:sz w:val="19"/>
+              </w:rPr>
+              <w:t>dreißig</w:t>
+            </w:r>
+          </w:p>
+        </w:tc>
+        <w:tc>
+          <w:tcPr>
+            <w:tcW w:type="dxa" w:w="2160"/>
+          </w:tcPr>
+          <w:p>
+            <w:pPr>
+              <w:spacing w:after="40"/>
+            </w:pPr>
+            <w:r/>
+            <w:r>
+              <w:rPr>
+                <w:rFonts w:ascii="Calibri" w:hAnsi="Calibri"/>
+                <w:color w:val="404040"/>
+                <w:sz w:val="19"/>
+              </w:rPr>
+              <w:t>irregular: ß, not z</w:t>
+            </w:r>
+          </w:p>
+        </w:tc>
+      </w:tr>
+      <w:tr>
+        <w:tc>
+          <w:tcPr>
+            <w:tcW w:type="dxa" w:w="2160"/>
+          </w:tcPr>
+          <w:p>
+            <w:pPr>
+              <w:spacing w:after="40"/>
+            </w:pPr>
+            <w:r/>
+            <w:r>
+              <w:rPr>
+                <w:rFonts w:ascii="Calibri" w:hAnsi="Calibri"/>
+                <w:color w:val="404040"/>
+                <w:sz w:val="19"/>
+              </w:rPr>
+              <w:t>tens</w:t>
+            </w:r>
+          </w:p>
+        </w:tc>
+        <w:tc>
+          <w:tcPr>
+            <w:tcW w:type="dxa" w:w="2160"/>
+          </w:tcPr>
+          <w:p>
+            <w:pPr>
+              <w:spacing w:after="40"/>
+            </w:pPr>
+            <w:r/>
+            <w:r>
+              <w:rPr>
+                <w:rFonts w:ascii="Calibri" w:hAnsi="Calibri"/>
+                <w:color w:val="404040"/>
+                <w:sz w:val="19"/>
+              </w:rPr>
+              <w:t>40</w:t>
+            </w:r>
+          </w:p>
+        </w:tc>
+        <w:tc>
+          <w:tcPr>
+            <w:tcW w:type="dxa" w:w="2160"/>
+          </w:tcPr>
+          <w:p>
+            <w:pPr>
+              <w:spacing w:after="40"/>
+            </w:pPr>
+            <w:r/>
+            <w:r>
+              <w:rPr>
+                <w:rFonts w:ascii="Calibri" w:hAnsi="Calibri"/>
+                <w:color w:val="404040"/>
+                <w:sz w:val="19"/>
+              </w:rPr>
+              <w:t>vierzig</w:t>
+            </w:r>
+          </w:p>
+        </w:tc>
+        <w:tc>
+          <w:tcPr>
+            <w:tcW w:type="dxa" w:w="2160"/>
+          </w:tcPr>
+          <w:p>
+            <w:pPr>
+              <w:spacing w:after="40"/>
+            </w:pPr>
+            <w:r/>
+            <w:r>
+              <w:rPr>
+                <w:rFonts w:ascii="Calibri" w:hAnsi="Calibri"/>
+                <w:color w:val="404040"/>
+                <w:sz w:val="19"/>
+              </w:rPr>
+              <w:t>vier + zig</w:t>
+            </w:r>
+          </w:p>
+        </w:tc>
+      </w:tr>
+      <w:tr>
+        <w:tc>
+          <w:tcPr>
+            <w:tcW w:type="dxa" w:w="2160"/>
+          </w:tcPr>
+          <w:p>
+            <w:pPr>
+              <w:spacing w:after="40"/>
+            </w:pPr>
+            <w:r/>
+            <w:r>
+              <w:rPr>
+                <w:rFonts w:ascii="Calibri" w:hAnsi="Calibri"/>
+                <w:color w:val="404040"/>
+                <w:sz w:val="19"/>
+              </w:rPr>
+              <w:t>tens</w:t>
+            </w:r>
+          </w:p>
+        </w:tc>
+        <w:tc>
+          <w:tcPr>
+            <w:tcW w:type="dxa" w:w="2160"/>
+          </w:tcPr>
+          <w:p>
+            <w:pPr>
+              <w:spacing w:after="40"/>
+            </w:pPr>
+            <w:r/>
+            <w:r>
+              <w:rPr>
+                <w:rFonts w:ascii="Calibri" w:hAnsi="Calibri"/>
+                <w:color w:val="404040"/>
+                <w:sz w:val="19"/>
+              </w:rPr>
+              <w:t>50</w:t>
+            </w:r>
+          </w:p>
+        </w:tc>
+        <w:tc>
+          <w:tcPr>
+            <w:tcW w:type="dxa" w:w="2160"/>
+          </w:tcPr>
+          <w:p>
+            <w:pPr>
+              <w:spacing w:after="40"/>
+            </w:pPr>
+            <w:r/>
+            <w:r>
+              <w:rPr>
+                <w:rFonts w:ascii="Calibri" w:hAnsi="Calibri"/>
+                <w:color w:val="404040"/>
+                <w:sz w:val="19"/>
+              </w:rPr>
+              <w:t>fünfzig</w:t>
+            </w:r>
+          </w:p>
+        </w:tc>
+        <w:tc>
+          <w:tcPr>
+            <w:tcW w:type="dxa" w:w="2160"/>
+          </w:tcPr>
+          <w:p>
+            <w:pPr>
+              <w:spacing w:after="40"/>
+            </w:pPr>
+            <w:r/>
+            <w:r>
+              <w:rPr>
+                <w:rFonts w:ascii="Calibri" w:hAnsi="Calibri"/>
+                <w:color w:val="404040"/>
+                <w:sz w:val="19"/>
+              </w:rPr>
+              <w:t>fünf + zig</w:t>
+            </w:r>
+          </w:p>
+        </w:tc>
+      </w:tr>
+      <w:tr>
+        <w:tc>
+          <w:tcPr>
+            <w:tcW w:type="dxa" w:w="2160"/>
+          </w:tcPr>
+          <w:p>
+            <w:pPr>
+              <w:spacing w:after="40"/>
+            </w:pPr>
+            <w:r/>
+            <w:r>
+              <w:rPr>
+                <w:rFonts w:ascii="Calibri" w:hAnsi="Calibri"/>
+                <w:color w:val="404040"/>
+                <w:sz w:val="19"/>
+              </w:rPr>
+              <w:t>tens</w:t>
+            </w:r>
+          </w:p>
+        </w:tc>
+        <w:tc>
+          <w:tcPr>
+            <w:tcW w:type="dxa" w:w="2160"/>
+          </w:tcPr>
+          <w:p>
+            <w:pPr>
+              <w:spacing w:after="40"/>
+            </w:pPr>
+            <w:r/>
+            <w:r>
+              <w:rPr>
+                <w:rFonts w:ascii="Calibri" w:hAnsi="Calibri"/>
+                <w:color w:val="404040"/>
+                <w:sz w:val="19"/>
+              </w:rPr>
+              <w:t>60</w:t>
+            </w:r>
+          </w:p>
+        </w:tc>
+        <w:tc>
+          <w:tcPr>
+            <w:tcW w:type="dxa" w:w="2160"/>
+          </w:tcPr>
+          <w:p>
+            <w:pPr>
+              <w:spacing w:after="40"/>
+            </w:pPr>
+            <w:r/>
+            <w:r>
+              <w:rPr>
+                <w:rFonts w:ascii="Calibri" w:hAnsi="Calibri"/>
+                <w:color w:val="404040"/>
+                <w:sz w:val="19"/>
+              </w:rPr>
+              <w:t>sechzig</w:t>
+            </w:r>
+          </w:p>
+        </w:tc>
+        <w:tc>
+          <w:tcPr>
+            <w:tcW w:type="dxa" w:w="2160"/>
+          </w:tcPr>
+          <w:p>
+            <w:pPr>
+              <w:spacing w:after="40"/>
+            </w:pPr>
+            <w:r/>
+            <w:r>
+              <w:rPr>
+                <w:rFonts w:ascii="Calibri" w:hAnsi="Calibri"/>
+                <w:color w:val="404040"/>
+                <w:sz w:val="19"/>
+              </w:rPr>
+              <w:t>not sechszig</w:t>
+            </w:r>
+          </w:p>
+        </w:tc>
+      </w:tr>
+      <w:tr>
+        <w:tc>
+          <w:tcPr>
+            <w:tcW w:type="dxa" w:w="2160"/>
+          </w:tcPr>
+          <w:p>
+            <w:pPr>
+              <w:spacing w:after="40"/>
+            </w:pPr>
+            <w:r/>
+            <w:r>
+              <w:rPr>
+                <w:rFonts w:ascii="Calibri" w:hAnsi="Calibri"/>
+                <w:color w:val="404040"/>
+                <w:sz w:val="19"/>
+              </w:rPr>
+              <w:t>tens</w:t>
+            </w:r>
+          </w:p>
+        </w:tc>
+        <w:tc>
+          <w:tcPr>
+            <w:tcW w:type="dxa" w:w="2160"/>
+          </w:tcPr>
+          <w:p>
+            <w:pPr>
+              <w:spacing w:after="40"/>
+            </w:pPr>
+            <w:r/>
+            <w:r>
+              <w:rPr>
+                <w:rFonts w:ascii="Calibri" w:hAnsi="Calibri"/>
+                <w:color w:val="404040"/>
+                <w:sz w:val="19"/>
+              </w:rPr>
+              <w:t>70</w:t>
+            </w:r>
+          </w:p>
+        </w:tc>
+        <w:tc>
+          <w:tcPr>
+            <w:tcW w:type="dxa" w:w="2160"/>
+          </w:tcPr>
+          <w:p>
+            <w:pPr>
+              <w:spacing w:after="40"/>
+            </w:pPr>
+            <w:r/>
+            <w:r>
+              <w:rPr>
+                <w:rFonts w:ascii="Calibri" w:hAnsi="Calibri"/>
+                <w:color w:val="404040"/>
+                <w:sz w:val="19"/>
+              </w:rPr>
+              <w:t>siebzig</w:t>
+            </w:r>
+          </w:p>
+        </w:tc>
+        <w:tc>
+          <w:tcPr>
+            <w:tcW w:type="dxa" w:w="2160"/>
+          </w:tcPr>
+          <w:p>
+            <w:pPr>
+              <w:spacing w:after="40"/>
+            </w:pPr>
+            <w:r/>
+            <w:r>
+              <w:rPr>
+                <w:rFonts w:ascii="Calibri" w:hAnsi="Calibri"/>
+                <w:color w:val="404040"/>
+                <w:sz w:val="19"/>
+              </w:rPr>
+              <w:t>not siebenzig</w:t>
+            </w:r>
+          </w:p>
+        </w:tc>
+      </w:tr>
+      <w:tr>
+        <w:tc>
+          <w:tcPr>
+            <w:tcW w:type="dxa" w:w="2160"/>
+          </w:tcPr>
+          <w:p>
+            <w:pPr>
+              <w:spacing w:after="40"/>
+            </w:pPr>
+            <w:r/>
+            <w:r>
+              <w:rPr>
+                <w:rFonts w:ascii="Calibri" w:hAnsi="Calibri"/>
+                <w:color w:val="404040"/>
+                <w:sz w:val="19"/>
+              </w:rPr>
+              <w:t>tens</w:t>
+            </w:r>
+          </w:p>
+        </w:tc>
+        <w:tc>
+          <w:tcPr>
+            <w:tcW w:type="dxa" w:w="2160"/>
+          </w:tcPr>
+          <w:p>
+            <w:pPr>
+              <w:spacing w:after="40"/>
+            </w:pPr>
+            <w:r/>
+            <w:r>
+              <w:rPr>
+                <w:rFonts w:ascii="Calibri" w:hAnsi="Calibri"/>
+                <w:color w:val="404040"/>
+                <w:sz w:val="19"/>
+              </w:rPr>
+              <w:t>80</w:t>
+            </w:r>
+          </w:p>
+        </w:tc>
+        <w:tc>
+          <w:tcPr>
+            <w:tcW w:type="dxa" w:w="2160"/>
+          </w:tcPr>
+          <w:p>
+            <w:pPr>
+              <w:spacing w:after="40"/>
+            </w:pPr>
+            <w:r/>
+            <w:r>
+              <w:rPr>
+                <w:rFonts w:ascii="Calibri" w:hAnsi="Calibri"/>
+                <w:color w:val="404040"/>
+                <w:sz w:val="19"/>
+              </w:rPr>
+              <w:t>achtzig</w:t>
+            </w:r>
+          </w:p>
+        </w:tc>
+        <w:tc>
+          <w:tcPr>
+            <w:tcW w:type="dxa" w:w="2160"/>
+          </w:tcPr>
+          <w:p>
+            <w:pPr>
+              <w:spacing w:after="40"/>
+            </w:pPr>
+            <w:r/>
+            <w:r>
+              <w:rPr>
+                <w:rFonts w:ascii="Calibri" w:hAnsi="Calibri"/>
+                <w:color w:val="404040"/>
+                <w:sz w:val="19"/>
+              </w:rPr>
+              <w:t>acht + zig</w:t>
+            </w:r>
+          </w:p>
+        </w:tc>
+      </w:tr>
+      <w:tr>
+        <w:tc>
+          <w:tcPr>
+            <w:tcW w:type="dxa" w:w="2160"/>
+          </w:tcPr>
+          <w:p>
+            <w:pPr>
+              <w:spacing w:after="40"/>
+            </w:pPr>
+            <w:r/>
+            <w:r>
+              <w:rPr>
+                <w:rFonts w:ascii="Calibri" w:hAnsi="Calibri"/>
+                <w:color w:val="404040"/>
+                <w:sz w:val="19"/>
+              </w:rPr>
+              <w:t>tens</w:t>
+            </w:r>
+          </w:p>
+        </w:tc>
+        <w:tc>
+          <w:tcPr>
+            <w:tcW w:type="dxa" w:w="2160"/>
+          </w:tcPr>
+          <w:p>
+            <w:pPr>
+              <w:spacing w:after="40"/>
+            </w:pPr>
+            <w:r/>
+            <w:r>
+              <w:rPr>
+                <w:rFonts w:ascii="Calibri" w:hAnsi="Calibri"/>
+                <w:color w:val="404040"/>
+                <w:sz w:val="19"/>
+              </w:rPr>
+              <w:t>90</w:t>
+            </w:r>
+          </w:p>
+        </w:tc>
+        <w:tc>
+          <w:tcPr>
+            <w:tcW w:type="dxa" w:w="2160"/>
+          </w:tcPr>
+          <w:p>
+            <w:pPr>
+              <w:spacing w:after="40"/>
+            </w:pPr>
+            <w:r/>
+            <w:r>
+              <w:rPr>
+                <w:rFonts w:ascii="Calibri" w:hAnsi="Calibri"/>
+                <w:color w:val="404040"/>
+                <w:sz w:val="19"/>
+              </w:rPr>
+              <w:t>neunzig</w:t>
+            </w:r>
+          </w:p>
+        </w:tc>
+        <w:tc>
+          <w:tcPr>
+            <w:tcW w:type="dxa" w:w="2160"/>
+          </w:tcPr>
+          <w:p>
+            <w:pPr>
+              <w:spacing w:after="40"/>
+            </w:pPr>
+            <w:r/>
+            <w:r>
+              <w:rPr>
+                <w:rFonts w:ascii="Calibri" w:hAnsi="Calibri"/>
+                <w:color w:val="404040"/>
+                <w:sz w:val="19"/>
+              </w:rPr>
+              <w:t>neun + zig</w:t>
+            </w:r>
+          </w:p>
+        </w:tc>
+      </w:tr>
+      <w:tr>
+        <w:tc>
+          <w:tcPr>
+            <w:tcW w:type="dxa" w:w="2160"/>
+          </w:tcPr>
+          <w:p>
+            <w:pPr>
+              <w:spacing w:after="40"/>
+            </w:pPr>
+            <w:r/>
+            <w:r>
+              <w:rPr>
+                <w:rFonts w:ascii="Calibri" w:hAnsi="Calibri"/>
+                <w:color w:val="404040"/>
+                <w:sz w:val="19"/>
+              </w:rPr>
+              <w:t>hundreds</w:t>
+            </w:r>
+          </w:p>
+        </w:tc>
+        <w:tc>
+          <w:tcPr>
+            <w:tcW w:type="dxa" w:w="2160"/>
+          </w:tcPr>
+          <w:p>
+            <w:pPr>
+              <w:spacing w:after="40"/>
+            </w:pPr>
+            <w:r/>
+            <w:r>
+              <w:rPr>
+                <w:rFonts w:ascii="Calibri" w:hAnsi="Calibri"/>
+                <w:color w:val="404040"/>
+                <w:sz w:val="19"/>
+              </w:rPr>
+              <w:t>100</w:t>
+            </w:r>
+          </w:p>
+        </w:tc>
+        <w:tc>
+          <w:tcPr>
+            <w:tcW w:type="dxa" w:w="2160"/>
+          </w:tcPr>
+          <w:p>
+            <w:pPr>
+              <w:spacing w:after="40"/>
+            </w:pPr>
+            <w:r/>
+            <w:r>
+              <w:rPr>
+                <w:rFonts w:ascii="Calibri" w:hAnsi="Calibri"/>
+                <w:color w:val="404040"/>
+                <w:sz w:val="19"/>
+              </w:rPr>
+              <w:t>einhundert</w:t>
+            </w:r>
+          </w:p>
+        </w:tc>
+        <w:tc>
+          <w:tcPr>
+            <w:tcW w:type="dxa" w:w="2160"/>
+          </w:tcPr>
+          <w:p>
+            <w:pPr>
+              <w:spacing w:after="40"/>
+            </w:pPr>
+            <w:r/>
+            <w:r>
+              <w:rPr>
+                <w:rFonts w:ascii="Calibri" w:hAnsi="Calibri"/>
+                <w:color w:val="404040"/>
+                <w:sz w:val="19"/>
+              </w:rPr>
+              <w:t>often heard as hundert</w:t>
+            </w:r>
+          </w:p>
+        </w:tc>
+      </w:tr>
+      <w:tr>
+        <w:tc>
+          <w:tcPr>
+            <w:tcW w:type="dxa" w:w="2160"/>
+          </w:tcPr>
+          <w:p>
+            <w:pPr>
+              <w:spacing w:after="40"/>
+            </w:pPr>
+            <w:r/>
+            <w:r>
+              <w:rPr>
+                <w:rFonts w:ascii="Calibri" w:hAnsi="Calibri"/>
+                <w:color w:val="404040"/>
+                <w:sz w:val="19"/>
+              </w:rPr>
+              <w:t>hundreds</w:t>
+            </w:r>
+          </w:p>
+        </w:tc>
+        <w:tc>
+          <w:tcPr>
+            <w:tcW w:type="dxa" w:w="2160"/>
+          </w:tcPr>
+          <w:p>
+            <w:pPr>
+              <w:spacing w:after="40"/>
+            </w:pPr>
+            <w:r/>
+            <w:r>
+              <w:rPr>
+                <w:rFonts w:ascii="Calibri" w:hAnsi="Calibri"/>
+                <w:color w:val="404040"/>
+                <w:sz w:val="19"/>
+              </w:rPr>
+              <w:t>101</w:t>
+            </w:r>
+          </w:p>
+        </w:tc>
+        <w:tc>
+          <w:tcPr>
+            <w:tcW w:type="dxa" w:w="2160"/>
+          </w:tcPr>
+          <w:p>
+            <w:pPr>
+              <w:spacing w:after="40"/>
+            </w:pPr>
+            <w:r/>
+            <w:r>
+              <w:rPr>
+                <w:rFonts w:ascii="Calibri" w:hAnsi="Calibri"/>
+                <w:color w:val="404040"/>
+                <w:sz w:val="19"/>
+              </w:rPr>
+              <w:t>einhunderteins</w:t>
+            </w:r>
+          </w:p>
+        </w:tc>
+        <w:tc>
+          <w:tcPr>
+            <w:tcW w:type="dxa" w:w="2160"/>
+          </w:tcPr>
+          <w:p>
+            <w:pPr>
+              <w:spacing w:after="40"/>
+            </w:pPr>
+            <w:r/>
+            <w:r>
+              <w:rPr>
+                <w:rFonts w:ascii="Calibri" w:hAnsi="Calibri"/>
+                <w:color w:val="404040"/>
+                <w:sz w:val="19"/>
+              </w:rPr>
+              <w:t>hundert + eins</w:t>
+            </w:r>
+          </w:p>
+        </w:tc>
+      </w:tr>
+      <w:tr>
+        <w:tc>
+          <w:tcPr>
+            <w:tcW w:type="dxa" w:w="2160"/>
+          </w:tcPr>
+          <w:p>
+            <w:pPr>
+              <w:spacing w:after="40"/>
+            </w:pPr>
+            <w:r/>
+            <w:r>
+              <w:rPr>
+                <w:rFonts w:ascii="Calibri" w:hAnsi="Calibri"/>
+                <w:color w:val="404040"/>
+                <w:sz w:val="19"/>
+              </w:rPr>
+              <w:t>hundreds</w:t>
+            </w:r>
+          </w:p>
+        </w:tc>
+        <w:tc>
+          <w:tcPr>
+            <w:tcW w:type="dxa" w:w="2160"/>
+          </w:tcPr>
+          <w:p>
+            <w:pPr>
+              <w:spacing w:after="40"/>
+            </w:pPr>
+            <w:r/>
+            <w:r>
+              <w:rPr>
+                <w:rFonts w:ascii="Calibri" w:hAnsi="Calibri"/>
+                <w:color w:val="404040"/>
+                <w:sz w:val="19"/>
+              </w:rPr>
+              <w:t>200</w:t>
+            </w:r>
+          </w:p>
+        </w:tc>
+        <w:tc>
+          <w:tcPr>
+            <w:tcW w:type="dxa" w:w="2160"/>
+          </w:tcPr>
+          <w:p>
+            <w:pPr>
+              <w:spacing w:after="40"/>
+            </w:pPr>
+            <w:r/>
+            <w:r>
+              <w:rPr>
+                <w:rFonts w:ascii="Calibri" w:hAnsi="Calibri"/>
+                <w:color w:val="404040"/>
+                <w:sz w:val="19"/>
+              </w:rPr>
+              <w:t>zweihundert</w:t>
+            </w:r>
+          </w:p>
+        </w:tc>
+        <w:tc>
+          <w:tcPr>
+            <w:tcW w:type="dxa" w:w="2160"/>
+          </w:tcPr>
+          <w:p>
+            <w:pPr>
+              <w:spacing w:after="40"/>
+            </w:pPr>
+            <w:r/>
+            <w:r>
+              <w:rPr>
+                <w:rFonts w:ascii="Calibri" w:hAnsi="Calibri"/>
+                <w:color w:val="404040"/>
+                <w:sz w:val="19"/>
+              </w:rPr>
+              <w:t>zwei + hundert</w:t>
+            </w:r>
+          </w:p>
+        </w:tc>
+      </w:tr>
+      <w:tr>
+        <w:tc>
+          <w:tcPr>
+            <w:tcW w:type="dxa" w:w="2160"/>
+          </w:tcPr>
+          <w:p>
+            <w:pPr>
+              <w:spacing w:after="40"/>
+            </w:pPr>
+            <w:r/>
+            <w:r>
+              <w:rPr>
+                <w:rFonts w:ascii="Calibri" w:hAnsi="Calibri"/>
+                <w:color w:val="404040"/>
+                <w:sz w:val="19"/>
+              </w:rPr>
+              <w:t>thousands</w:t>
+            </w:r>
+          </w:p>
+        </w:tc>
+        <w:tc>
+          <w:tcPr>
+            <w:tcW w:type="dxa" w:w="2160"/>
+          </w:tcPr>
+          <w:p>
+            <w:pPr>
+              <w:spacing w:after="40"/>
+            </w:pPr>
+            <w:r/>
+            <w:r>
+              <w:rPr>
+                <w:rFonts w:ascii="Calibri" w:hAnsi="Calibri"/>
+                <w:color w:val="404040"/>
+                <w:sz w:val="19"/>
+              </w:rPr>
+              <w:t>1.000</w:t>
+            </w:r>
+          </w:p>
+        </w:tc>
+        <w:tc>
+          <w:tcPr>
+            <w:tcW w:type="dxa" w:w="2160"/>
+          </w:tcPr>
+          <w:p>
+            <w:pPr>
+              <w:spacing w:after="40"/>
+            </w:pPr>
+            <w:r/>
+            <w:r>
+              <w:rPr>
+                <w:rFonts w:ascii="Calibri" w:hAnsi="Calibri"/>
+                <w:color w:val="404040"/>
+                <w:sz w:val="19"/>
+              </w:rPr>
+              <w:t>eintausend</w:t>
+            </w:r>
+          </w:p>
+        </w:tc>
+        <w:tc>
+          <w:tcPr>
+            <w:tcW w:type="dxa" w:w="2160"/>
+          </w:tcPr>
+          <w:p>
+            <w:pPr>
+              <w:spacing w:after="40"/>
+            </w:pPr>
+            <w:r/>
+            <w:r>
+              <w:rPr>
+                <w:rFonts w:ascii="Calibri" w:hAnsi="Calibri"/>
+                <w:color w:val="404040"/>
+                <w:sz w:val="19"/>
+              </w:rPr>
+              <w:t>often heard as tausend</w:t>
+            </w:r>
+          </w:p>
+        </w:tc>
+      </w:tr>
+      <w:tr>
+        <w:tc>
+          <w:tcPr>
+            <w:tcW w:type="dxa" w:w="2160"/>
+          </w:tcPr>
+          <w:p>
+            <w:pPr>
+              <w:spacing w:after="40"/>
+            </w:pPr>
+            <w:r/>
+            <w:r>
+              <w:rPr>
+                <w:rFonts w:ascii="Calibri" w:hAnsi="Calibri"/>
+                <w:color w:val="404040"/>
+                <w:sz w:val="19"/>
+              </w:rPr>
+              <w:t>thousands</w:t>
+            </w:r>
+          </w:p>
+        </w:tc>
+        <w:tc>
+          <w:tcPr>
+            <w:tcW w:type="dxa" w:w="2160"/>
+          </w:tcPr>
+          <w:p>
+            <w:pPr>
+              <w:spacing w:after="40"/>
+            </w:pPr>
+            <w:r/>
+            <w:r>
+              <w:rPr>
+                <w:rFonts w:ascii="Calibri" w:hAnsi="Calibri"/>
+                <w:color w:val="404040"/>
+                <w:sz w:val="19"/>
+              </w:rPr>
+              <w:t>10.000</w:t>
+            </w:r>
+          </w:p>
+        </w:tc>
+        <w:tc>
+          <w:tcPr>
+            <w:tcW w:type="dxa" w:w="2160"/>
+          </w:tcPr>
+          <w:p>
+            <w:pPr>
+              <w:spacing w:after="40"/>
+            </w:pPr>
+            <w:r/>
+            <w:r>
+              <w:rPr>
+                <w:rFonts w:ascii="Calibri" w:hAnsi="Calibri"/>
+                <w:color w:val="404040"/>
+                <w:sz w:val="19"/>
+              </w:rPr>
+              <w:t>zehntausend</w:t>
+            </w:r>
+          </w:p>
+        </w:tc>
+        <w:tc>
+          <w:tcPr>
+            <w:tcW w:type="dxa" w:w="2160"/>
+          </w:tcPr>
+          <w:p>
+            <w:pPr>
+              <w:spacing w:after="40"/>
+            </w:pPr>
+            <w:r/>
+            <w:r>
+              <w:rPr>
+                <w:rFonts w:ascii="Calibri" w:hAnsi="Calibri"/>
+                <w:color w:val="404040"/>
+                <w:sz w:val="19"/>
+              </w:rPr>
+              <w:t>zehn + tausend</w:t>
+            </w:r>
+          </w:p>
+        </w:tc>
+      </w:tr>
+      <w:tr>
+        <w:tc>
+          <w:tcPr>
+            <w:tcW w:type="dxa" w:w="2160"/>
+          </w:tcPr>
+          <w:p>
+            <w:pPr>
+              <w:spacing w:after="40"/>
+            </w:pPr>
+            <w:r/>
+            <w:r>
+              <w:rPr>
+                <w:rFonts w:ascii="Calibri" w:hAnsi="Calibri"/>
+                <w:color w:val="404040"/>
+                <w:sz w:val="19"/>
+              </w:rPr>
+              <w:t>thousands</w:t>
+            </w:r>
+          </w:p>
+        </w:tc>
+        <w:tc>
+          <w:tcPr>
+            <w:tcW w:type="dxa" w:w="2160"/>
+          </w:tcPr>
+          <w:p>
+            <w:pPr>
+              <w:spacing w:after="40"/>
+            </w:pPr>
+            <w:r/>
+            <w:r>
+              <w:rPr>
+                <w:rFonts w:ascii="Calibri" w:hAnsi="Calibri"/>
+                <w:color w:val="404040"/>
+                <w:sz w:val="19"/>
+              </w:rPr>
+              <w:t>100.000</w:t>
+            </w:r>
+          </w:p>
+        </w:tc>
+        <w:tc>
+          <w:tcPr>
+            <w:tcW w:type="dxa" w:w="2160"/>
+          </w:tcPr>
+          <w:p>
+            <w:pPr>
+              <w:spacing w:after="40"/>
+            </w:pPr>
+            <w:r/>
+            <w:r>
+              <w:rPr>
+                <w:rFonts w:ascii="Calibri" w:hAnsi="Calibri"/>
+                <w:color w:val="404040"/>
+                <w:sz w:val="19"/>
+              </w:rPr>
+              <w:t>einhunderttausend</w:t>
+            </w:r>
+          </w:p>
+        </w:tc>
+        <w:tc>
+          <w:tcPr>
+            <w:tcW w:type="dxa" w:w="2160"/>
+          </w:tcPr>
+          <w:p>
+            <w:pPr>
+              <w:spacing w:after="40"/>
+            </w:pPr>
+            <w:r/>
+            <w:r>
+              <w:rPr>
+                <w:rFonts w:ascii="Calibri" w:hAnsi="Calibri"/>
+                <w:color w:val="404040"/>
+                <w:sz w:val="19"/>
+              </w:rPr>
+              <w:t>hundert + tausend</w:t>
+            </w:r>
+          </w:p>
+        </w:tc>
+      </w:tr>
+      <w:tr>
+        <w:tc>
+          <w:tcPr>
+            <w:tcW w:type="dxa" w:w="2160"/>
+          </w:tcPr>
+          <w:p>
+            <w:pPr>
+              <w:spacing w:after="40"/>
+            </w:pPr>
+            <w:r/>
+            <w:r>
+              <w:rPr>
+                <w:rFonts w:ascii="Calibri" w:hAnsi="Calibri"/>
+                <w:color w:val="404040"/>
+                <w:sz w:val="19"/>
+              </w:rPr>
+              <w:t>large</w:t>
+            </w:r>
+          </w:p>
+        </w:tc>
+        <w:tc>
+          <w:tcPr>
+            <w:tcW w:type="dxa" w:w="2160"/>
+          </w:tcPr>
+          <w:p>
+            <w:pPr>
+              <w:spacing w:after="40"/>
+            </w:pPr>
+            <w:r/>
+            <w:r>
+              <w:rPr>
+                <w:rFonts w:ascii="Calibri" w:hAnsi="Calibri"/>
+                <w:color w:val="404040"/>
+                <w:sz w:val="19"/>
+              </w:rPr>
+              <w:t>1.000.000</w:t>
+            </w:r>
+          </w:p>
+        </w:tc>
+        <w:tc>
+          <w:tcPr>
+            <w:tcW w:type="dxa" w:w="2160"/>
+          </w:tcPr>
+          <w:p>
+            <w:pPr>
+              <w:spacing w:after="40"/>
+            </w:pPr>
+            <w:r/>
+            <w:r>
+              <w:rPr>
+                <w:rFonts w:ascii="Calibri" w:hAnsi="Calibri"/>
+                <w:color w:val="404040"/>
+                <w:sz w:val="19"/>
+              </w:rPr>
+              <w:t>eine Million</w:t>
+            </w:r>
+          </w:p>
+        </w:tc>
+        <w:tc>
+          <w:tcPr>
+            <w:tcW w:type="dxa" w:w="2160"/>
+          </w:tcPr>
+          <w:p>
+            <w:pPr>
+              <w:spacing w:after="40"/>
+            </w:pPr>
+            <w:r/>
+            <w:r>
+              <w:rPr>
+                <w:rFonts w:ascii="Calibri" w:hAnsi="Calibri"/>
+                <w:color w:val="404040"/>
+                <w:sz w:val="19"/>
+              </w:rPr>
+              <w:t>noun: die Million</w:t>
+            </w:r>
+          </w:p>
+        </w:tc>
+      </w:tr>
+      <w:tr>
+        <w:tc>
+          <w:tcPr>
+            <w:tcW w:type="dxa" w:w="2160"/>
+          </w:tcPr>
+          <w:p>
+            <w:pPr>
+              <w:spacing w:after="40"/>
+            </w:pPr>
+            <w:r/>
+            <w:r>
+              <w:rPr>
+                <w:rFonts w:ascii="Calibri" w:hAnsi="Calibri"/>
+                <w:color w:val="404040"/>
+                <w:sz w:val="19"/>
+              </w:rPr>
+              <w:t>large</w:t>
+            </w:r>
+          </w:p>
+        </w:tc>
+        <w:tc>
+          <w:tcPr>
+            <w:tcW w:type="dxa" w:w="2160"/>
+          </w:tcPr>
+          <w:p>
+            <w:pPr>
+              <w:spacing w:after="40"/>
+            </w:pPr>
+            <w:r/>
+            <w:r>
+              <w:rPr>
+                <w:rFonts w:ascii="Calibri" w:hAnsi="Calibri"/>
+                <w:color w:val="404040"/>
+                <w:sz w:val="19"/>
+              </w:rPr>
+              <w:t>1.000.000.000</w:t>
+            </w:r>
+          </w:p>
+        </w:tc>
+        <w:tc>
+          <w:tcPr>
+            <w:tcW w:type="dxa" w:w="2160"/>
+          </w:tcPr>
+          <w:p>
+            <w:pPr>
+              <w:spacing w:after="40"/>
+            </w:pPr>
+            <w:r/>
+            <w:r>
+              <w:rPr>
+                <w:rFonts w:ascii="Calibri" w:hAnsi="Calibri"/>
+                <w:color w:val="404040"/>
+                <w:sz w:val="19"/>
+              </w:rPr>
+              <w:t>eine Milliarde</w:t>
+            </w:r>
+          </w:p>
+        </w:tc>
+        <w:tc>
+          <w:tcPr>
+            <w:tcW w:type="dxa" w:w="2160"/>
+          </w:tcPr>
+          <w:p>
+            <w:pPr>
+              <w:spacing w:after="40"/>
+            </w:pPr>
+            <w:r/>
+            <w:r>
+              <w:rPr>
+                <w:rFonts w:ascii="Calibri" w:hAnsi="Calibri"/>
+                <w:color w:val="404040"/>
+                <w:sz w:val="19"/>
+              </w:rPr>
+              <w:t>noun: die Milliarde</w:t>
+            </w:r>
+          </w:p>
+        </w:tc>
+      </w:tr>
+    </w:tbl>
+    <w:p>
+      <w:pPr>
+        <w:spacing w:before="40" w:after="120"/>
+      </w:pPr>
+    </w:p>
+    <w:p>
+      <w:pPr>
+        <w:spacing w:before="40" w:after="60"/>
+        <w:ind w:left="576"/>
+      </w:pPr>
+      <w:r>
+        <w:rPr>
+          <w:i/>
+          <w:color w:val="30608C"/>
+          <w:sz w:val="21"/>
+        </w:rPr>
+        <w:t xml:space="preserve">› </w:t>
+      </w:r>
+      <w:r>
+        <w:rPr>
+          <w:i/>
+          <w:color w:val="30608C"/>
+          <w:sz w:val="21"/>
+        </w:rPr>
+        <w:t>Noch mehr Zahlen!</w:t>
+      </w:r>
+      <w:r>
+        <w:rPr>
+          <w:i/>
+          <w:color w:val="404040"/>
+          <w:sz w:val="21"/>
+        </w:rPr>
+        <w:t xml:space="preserve"> (Even more numbers!)</w:t>
+      </w:r>
+    </w:p>
+    <w:p>
+      <w:pPr>
+        <w:spacing w:before="0" w:after="60"/>
+        <w:ind w:left="576"/>
+      </w:pPr>
+      <w:r>
+        <w:rPr>
+          <w:i/>
+          <w:color w:val="30608C"/>
+          <w:sz w:val="21"/>
+        </w:rPr>
+        <w:t xml:space="preserve">› </w:t>
+      </w:r>
+      <w:r>
+        <w:rPr>
+          <w:i/>
+          <w:color w:val="30608C"/>
+          <w:sz w:val="21"/>
+        </w:rPr>
+        <w:t>Hören Sie die Zahlen und sprechen Sie mit.</w:t>
+      </w:r>
+      <w:r>
+        <w:rPr>
+          <w:i/>
+          <w:color w:val="404040"/>
+          <w:sz w:val="21"/>
+        </w:rPr>
+        <w:t xml:space="preserve"> (Listen to the numbers and speak along.)</w:t>
+      </w:r>
+    </w:p>
+    <w:p>
+      <w:pPr>
+        <w:spacing w:before="0" w:after="120"/>
+        <w:ind w:left="576"/>
+      </w:pPr>
+      <w:r>
+        <w:rPr>
+          <w:i/>
+          <w:color w:val="30608C"/>
+          <w:sz w:val="21"/>
+        </w:rPr>
+        <w:t xml:space="preserve">› </w:t>
+      </w:r>
+      <w:r>
+        <w:rPr>
+          <w:i/>
+          <w:color w:val="30608C"/>
+          <w:sz w:val="21"/>
+        </w:rPr>
+        <w:t>Sie hören oft zwo für zwei, hundert für einhundert und tausend für eintausend.</w:t>
+      </w:r>
+      <w:r>
+        <w:rPr>
+          <w:i/>
+          <w:color w:val="404040"/>
+          <w:sz w:val="21"/>
+        </w:rPr>
+        <w:t xml:space="preserve"> (You often hear zwo for zwei, hundert for einhundert, and tausend for eintausend.)</w:t>
+      </w:r>
+    </w:p>
+    <w:p>
+      <w:pPr>
+        <w:spacing w:before="0" w:after="0"/>
+      </w:pPr>
     </w:p>
     <w:p>
       <w:pPr>

</xml_diff>

<commit_message>
Update vocabulary entries for numbers in vocab.docx and vocab.manifest.json
- Added detailed examples for numbers ranging from 127 to 1,000,000, including their German translations and English equivalents.
- Enhanced the vocabulary resource for language learners by providing practical applications and context for numerical expressions.
- Maintained categorization under lesson 1 and level A1, ensuring consistency with previous entries.
</commit_message>
<xml_diff>
--- a/vocab.docx
+++ b/vocab.docx
@@ -2245,7 +2245,7 @@
           <w:color w:val="30608C"/>
           <w:sz w:val="21"/>
         </w:rPr>
-        <w:t>Noch mehr Zahlen!</w:t>
+        <w:t>127 = einhundertsiebenundzwanzig</w:t>
       </w:r>
       <w:r>
         <w:rPr>
@@ -2253,7 +2253,7 @@
           <w:color w:val="404040"/>
           <w:sz w:val="21"/>
         </w:rPr>
-        <w:t xml:space="preserve"> (Even more numbers!)</w:t>
+        <w:t xml:space="preserve"> (127 = one hundred twenty-seven.)</w:t>
       </w:r>
     </w:p>
     <w:p>
@@ -2275,7 +2275,7 @@
           <w:color w:val="30608C"/>
           <w:sz w:val="21"/>
         </w:rPr>
-        <w:t>Hören Sie die Zahlen und sprechen Sie mit.</w:t>
+        <w:t>111 = einhundertelf</w:t>
       </w:r>
       <w:r>
         <w:rPr>
@@ -2283,7 +2283,157 @@
           <w:color w:val="404040"/>
           <w:sz w:val="21"/>
         </w:rPr>
-        <w:t xml:space="preserve"> (Listen to the numbers and speak along.)</w:t>
+        <w:t xml:space="preserve"> (111 = one hundred eleven.)</w:t>
+      </w:r>
+    </w:p>
+    <w:p>
+      <w:pPr>
+        <w:spacing w:before="0" w:after="60"/>
+        <w:ind w:left="576"/>
+      </w:pPr>
+      <w:r>
+        <w:rPr>
+          <w:i/>
+          <w:color w:val="30608C"/>
+          <w:sz w:val="21"/>
+        </w:rPr>
+        <w:t xml:space="preserve">› </w:t>
+      </w:r>
+      <w:r>
+        <w:rPr>
+          <w:i/>
+          <w:color w:val="30608C"/>
+          <w:sz w:val="21"/>
+        </w:rPr>
+        <w:t>1637 = eintausendsechshundertsiebenunddreißig</w:t>
+      </w:r>
+      <w:r>
+        <w:rPr>
+          <w:i/>
+          <w:color w:val="404040"/>
+          <w:sz w:val="21"/>
+        </w:rPr>
+        <w:t xml:space="preserve"> (1637 = one thousand six hundred thirty-seven.)</w:t>
+      </w:r>
+    </w:p>
+    <w:p>
+      <w:pPr>
+        <w:spacing w:before="0" w:after="60"/>
+        <w:ind w:left="576"/>
+      </w:pPr>
+      <w:r>
+        <w:rPr>
+          <w:i/>
+          <w:color w:val="30608C"/>
+          <w:sz w:val="21"/>
+        </w:rPr>
+        <w:t xml:space="preserve">› </w:t>
+      </w:r>
+      <w:r>
+        <w:rPr>
+          <w:i/>
+          <w:color w:val="30608C"/>
+          <w:sz w:val="21"/>
+        </w:rPr>
+        <w:t>8463 = achttausendvierhundertdreiundsechzig</w:t>
+      </w:r>
+      <w:r>
+        <w:rPr>
+          <w:i/>
+          <w:color w:val="404040"/>
+          <w:sz w:val="21"/>
+        </w:rPr>
+        <w:t xml:space="preserve"> (8463 = eight thousand four hundred sixty-three.)</w:t>
+      </w:r>
+    </w:p>
+    <w:p>
+      <w:pPr>
+        <w:spacing w:before="0" w:after="60"/>
+        <w:ind w:left="576"/>
+      </w:pPr>
+      <w:r>
+        <w:rPr>
+          <w:i/>
+          <w:color w:val="30608C"/>
+          <w:sz w:val="21"/>
+        </w:rPr>
+        <w:t xml:space="preserve">› </w:t>
+      </w:r>
+      <w:r>
+        <w:rPr>
+          <w:i/>
+          <w:color w:val="30608C"/>
+          <w:sz w:val="21"/>
+        </w:rPr>
+        <w:t>90901 = neunzigtausendneunhunderteins</w:t>
+      </w:r>
+      <w:r>
+        <w:rPr>
+          <w:i/>
+          <w:color w:val="404040"/>
+          <w:sz w:val="21"/>
+        </w:rPr>
+        <w:t xml:space="preserve"> (90901 = ninety thousand nine hundred one.)</w:t>
+      </w:r>
+    </w:p>
+    <w:p>
+      <w:pPr>
+        <w:spacing w:before="0" w:after="60"/>
+        <w:ind w:left="576"/>
+      </w:pPr>
+      <w:r>
+        <w:rPr>
+          <w:i/>
+          <w:color w:val="30608C"/>
+          <w:sz w:val="21"/>
+        </w:rPr>
+        <w:t xml:space="preserve">› </w:t>
+      </w:r>
+      <w:r>
+        <w:rPr>
+          <w:i/>
+          <w:color w:val="30608C"/>
+          <w:sz w:val="21"/>
+        </w:rPr>
+        <w:t>305 = dreihundertfünf</w:t>
+      </w:r>
+      <w:r>
+        <w:rPr>
+          <w:i/>
+          <w:color w:val="404040"/>
+          <w:sz w:val="21"/>
+        </w:rPr>
+        <w:t xml:space="preserve"> (305 = three hundred five.)</w:t>
+      </w:r>
+    </w:p>
+    <w:p>
+      <w:pPr>
+        <w:spacing w:before="0" w:after="60"/>
+        <w:ind w:left="576"/>
+      </w:pPr>
+      <w:r>
+        <w:rPr>
+          <w:i/>
+          <w:color w:val="30608C"/>
+          <w:sz w:val="21"/>
+        </w:rPr>
+        <w:t xml:space="preserve">› </w:t>
+      </w:r>
+      <w:r>
+        <w:rPr>
+          <w:i/>
+          <w:color w:val="30608C"/>
+          <w:sz w:val="21"/>
+        </w:rPr>
+        <w:t>2014 = zweitausendvierzehn</w:t>
+      </w:r>
+      <w:r>
+        <w:rPr>
+          <w:i/>
+          <w:color w:val="404040"/>
+          <w:sz w:val="21"/>
+        </w:rPr>
+        <w:t xml:space="preserve"> (2014 = two thousand fourteen.)</w:t>
       </w:r>
     </w:p>
     <w:p>
@@ -2305,7 +2455,7 @@
           <w:color w:val="30608C"/>
           <w:sz w:val="21"/>
         </w:rPr>
-        <w:t>Sie hören oft zwo für zwei, hundert für einhundert und tausend für eintausend.</w:t>
+        <w:t>1000000 = eine Million</w:t>
       </w:r>
       <w:r>
         <w:rPr>
@@ -2313,7 +2463,7 @@
           <w:color w:val="404040"/>
           <w:sz w:val="21"/>
         </w:rPr>
-        <w:t xml:space="preserve"> (You often hear zwo for zwei, hundert for einhundert, and tausend for eintausend.)</w:t>
+        <w:t xml:space="preserve"> (1000000 = one million.)</w:t>
       </w:r>
     </w:p>
     <w:p>

</xml_diff>

<commit_message>
Add new vocabulary entry for "die Handynummer" in vocab.docx and vocab.manifest.json
- Introduced a detailed entry for "die Handynummer," including gloss, usage notes, and multiple examples in both German and English.
- The entry is categorized under lesson 1 and level A1, enhancing the vocabulary resource for language learners with practical applications and context.
</commit_message>
<xml_diff>
--- a/vocab.docx
+++ b/vocab.docx
@@ -13,6 +13,164 @@
         </w:rPr>
         <w:t>daf — vocabulary</w:t>
       </w:r>
+    </w:p>
+    <w:p>
+      <w:pPr>
+        <w:spacing w:after="120"/>
+      </w:pPr>
+      <w:r>
+        <w:rPr>
+          <w:b/>
+        </w:rPr>
+        <w:t>die Handynummer</w:t>
+      </w:r>
+      <w:r>
+        <w:t xml:space="preserve"> /ˈhɛndiˌnʊmɐ/</w:t>
+      </w:r>
+    </w:p>
+    <w:p>
+      <w:pPr>
+        <w:spacing w:after="80"/>
+        <w:ind w:left="576"/>
+      </w:pPr>
+      <w:r>
+        <w:rPr>
+          <w:sz w:val="22"/>
+        </w:rPr>
+        <w:t>die Handynummer, -n</w:t>
+      </w:r>
+    </w:p>
+    <w:p>
+      <w:pPr>
+        <w:spacing w:after="80"/>
+        <w:ind w:left="576"/>
+      </w:pPr>
+      <w:r>
+        <w:t>Mobile phone number; cell phone number.</w:t>
+      </w:r>
+    </w:p>
+    <w:p>
+      <w:pPr>
+        <w:spacing w:after="80"/>
+        <w:ind w:left="576"/>
+      </w:pPr>
+      <w:r>
+        <w:rPr>
+          <w:i/>
+          <w:color w:val="404040"/>
+          <w:sz w:val="20"/>
+        </w:rPr>
+        <w:t>• das Handy = mobile phone / cell phone; die Nummer = number as an ID/code.</w:t>
+      </w:r>
+    </w:p>
+    <w:p>
+      <w:pPr>
+        <w:spacing w:after="80"/>
+        <w:ind w:left="576"/>
+      </w:pPr>
+      <w:r>
+        <w:rPr>
+          <w:i/>
+          <w:color w:val="404040"/>
+          <w:sz w:val="20"/>
+        </w:rPr>
+        <w:t>• die Handynummer is specifically a mobile number; die Telefonnummer can be any phone number.</w:t>
+      </w:r>
+    </w:p>
+    <w:p>
+      <w:pPr>
+        <w:spacing w:before="40" w:after="60"/>
+        <w:ind w:left="576"/>
+      </w:pPr>
+      <w:r>
+        <w:rPr>
+          <w:i/>
+          <w:color w:val="30608C"/>
+          <w:sz w:val="21"/>
+        </w:rPr>
+        <w:t xml:space="preserve">› </w:t>
+      </w:r>
+      <w:r>
+        <w:rPr>
+          <w:i/>
+          <w:color w:val="30608C"/>
+          <w:sz w:val="21"/>
+        </w:rPr>
+        <w:t>Wie ist deine Handynummer?</w:t>
+      </w:r>
+      <w:r>
+        <w:rPr>
+          <w:i/>
+          <w:color w:val="404040"/>
+          <w:sz w:val="21"/>
+        </w:rPr>
+        <w:t xml:space="preserve"> (What is your mobile number?)</w:t>
+      </w:r>
+    </w:p>
+    <w:p>
+      <w:pPr>
+        <w:spacing w:before="0" w:after="60"/>
+        <w:ind w:left="576"/>
+      </w:pPr>
+      <w:r>
+        <w:rPr>
+          <w:i/>
+          <w:color w:val="30608C"/>
+          <w:sz w:val="21"/>
+        </w:rPr>
+        <w:t xml:space="preserve">› </w:t>
+      </w:r>
+      <w:r>
+        <w:rPr>
+          <w:i/>
+          <w:color w:val="30608C"/>
+          <w:sz w:val="21"/>
+        </w:rPr>
+        <w:t>Meine Handynummer ist 0176 / 53487.</w:t>
+      </w:r>
+      <w:r>
+        <w:rPr>
+          <w:i/>
+          <w:color w:val="404040"/>
+          <w:sz w:val="21"/>
+        </w:rPr>
+        <w:t xml:space="preserve"> (My mobile number is 0176 / 53487.)</w:t>
+      </w:r>
+    </w:p>
+    <w:p>
+      <w:pPr>
+        <w:spacing w:before="0" w:after="120"/>
+        <w:ind w:left="576"/>
+      </w:pPr>
+      <w:r>
+        <w:rPr>
+          <w:i/>
+          <w:color w:val="30608C"/>
+          <w:sz w:val="21"/>
+        </w:rPr>
+        <w:t xml:space="preserve">› </w:t>
+      </w:r>
+      <w:r>
+        <w:rPr>
+          <w:i/>
+          <w:color w:val="30608C"/>
+          <w:sz w:val="21"/>
+        </w:rPr>
+        <w:t>Hast du Annes Handynummer?</w:t>
+      </w:r>
+      <w:r>
+        <w:rPr>
+          <w:i/>
+          <w:color w:val="404040"/>
+          <w:sz w:val="21"/>
+        </w:rPr>
+        <w:t xml:space="preserve"> (Do you have Anne's mobile number?)</w:t>
+      </w:r>
+    </w:p>
+    <w:p>
+      <w:pPr>
+        <w:spacing w:before="0" w:after="0"/>
+      </w:pPr>
     </w:p>
     <w:p>
       <w:pPr>

</xml_diff>

<commit_message>
Add new vocabulary entries for "tauschen," "fragen," "antworten," and "der Kurs" in vocab.docx and vocab.manifest.json
- Introduced detailed entries for each term, including glosses, usage notes, and multiple examples in both German and English.
- All entries are categorized under lesson 1 and level A1, enhancing the vocabulary resource for language learners with practical applications and context.
</commit_message>
<xml_diff>
--- a/vocab.docx
+++ b/vocab.docx
@@ -13,6 +13,602 @@
         </w:rPr>
         <w:t>daf — vocabulary</w:t>
       </w:r>
+    </w:p>
+    <w:p>
+      <w:pPr>
+        <w:spacing w:after="120"/>
+      </w:pPr>
+      <w:r>
+        <w:rPr>
+          <w:b/>
+        </w:rPr>
+        <w:t>tauschen</w:t>
+      </w:r>
+      <w:r>
+        <w:t xml:space="preserve"> /ˈtaʊ̯ʃən/</w:t>
+      </w:r>
+    </w:p>
+    <w:p>
+      <w:pPr>
+        <w:spacing w:after="80"/>
+        <w:ind w:left="576"/>
+      </w:pPr>
+      <w:r>
+        <w:t>To exchange; swap.</w:t>
+      </w:r>
+    </w:p>
+    <w:p>
+      <w:pPr>
+        <w:spacing w:after="80"/>
+        <w:ind w:left="576"/>
+      </w:pPr>
+      <w:r>
+        <w:rPr>
+          <w:i/>
+          <w:color w:val="404040"/>
+          <w:sz w:val="20"/>
+        </w:rPr>
+        <w:t>• Formal command: Tauschen Sie ... = Exchange ... / Swap ...; verb first, Sie capitalized.</w:t>
+      </w:r>
+    </w:p>
+    <w:p>
+      <w:pPr>
+        <w:spacing w:after="80"/>
+        <w:ind w:left="576"/>
+      </w:pPr>
+      <w:r>
+        <w:rPr>
+          <w:i/>
+          <w:color w:val="404040"/>
+          <w:sz w:val="20"/>
+        </w:rPr>
+        <w:t>• With tauschen, the thing exchanged is accusative. For plural nouns, nominative and accusative look the same: die ... stays die ....</w:t>
+      </w:r>
+    </w:p>
+    <w:p>
+      <w:pPr>
+        <w:spacing w:before="40" w:after="60"/>
+        <w:ind w:left="576"/>
+      </w:pPr>
+      <w:r>
+        <w:rPr>
+          <w:i/>
+          <w:color w:val="30608C"/>
+          <w:sz w:val="21"/>
+        </w:rPr>
+        <w:t xml:space="preserve">› </w:t>
+      </w:r>
+      <w:r>
+        <w:rPr>
+          <w:i/>
+          <w:color w:val="30608C"/>
+          <w:sz w:val="21"/>
+        </w:rPr>
+        <w:t>Tauschen Sie die Notizzettel im Kurs.</w:t>
+      </w:r>
+      <w:r>
+        <w:rPr>
+          <w:i/>
+          <w:color w:val="404040"/>
+          <w:sz w:val="21"/>
+        </w:rPr>
+        <w:t xml:space="preserve"> (Exchange the note sheets in class.)</w:t>
+      </w:r>
+    </w:p>
+    <w:p>
+      <w:pPr>
+        <w:spacing w:before="0" w:after="60"/>
+        <w:ind w:left="576"/>
+      </w:pPr>
+      <w:r>
+        <w:rPr>
+          <w:i/>
+          <w:color w:val="30608C"/>
+          <w:sz w:val="21"/>
+        </w:rPr>
+        <w:t xml:space="preserve">› </w:t>
+      </w:r>
+      <w:r>
+        <w:rPr>
+          <w:i/>
+          <w:color w:val="30608C"/>
+          <w:sz w:val="21"/>
+        </w:rPr>
+        <w:t>Wir tauschen die Telefonnummern.</w:t>
+      </w:r>
+      <w:r>
+        <w:rPr>
+          <w:i/>
+          <w:color w:val="404040"/>
+          <w:sz w:val="21"/>
+        </w:rPr>
+        <w:t xml:space="preserve"> (We exchange phone numbers.)</w:t>
+      </w:r>
+    </w:p>
+    <w:p>
+      <w:pPr>
+        <w:spacing w:before="0" w:after="120"/>
+        <w:ind w:left="576"/>
+      </w:pPr>
+      <w:r>
+        <w:rPr>
+          <w:i/>
+          <w:color w:val="30608C"/>
+          <w:sz w:val="21"/>
+        </w:rPr>
+        <w:t xml:space="preserve">› </w:t>
+      </w:r>
+      <w:r>
+        <w:rPr>
+          <w:i/>
+          <w:color w:val="30608C"/>
+          <w:sz w:val="21"/>
+        </w:rPr>
+        <w:t>Tauschen Sie die Antworten mit einem Partner.</w:t>
+      </w:r>
+      <w:r>
+        <w:rPr>
+          <w:i/>
+          <w:color w:val="404040"/>
+          <w:sz w:val="21"/>
+        </w:rPr>
+        <w:t xml:space="preserve"> (Exchange the answers with a partner. [formal you])</w:t>
+      </w:r>
+    </w:p>
+    <w:p>
+      <w:pPr>
+        <w:spacing w:before="0" w:after="0"/>
+      </w:pPr>
+    </w:p>
+    <w:p>
+      <w:pPr>
+        <w:spacing w:after="120"/>
+      </w:pPr>
+      <w:r>
+        <w:rPr>
+          <w:b/>
+        </w:rPr>
+        <w:t>fragen</w:t>
+      </w:r>
+      <w:r>
+        <w:t xml:space="preserve"> /ˈfʁaːɡən/</w:t>
+      </w:r>
+    </w:p>
+    <w:p>
+      <w:pPr>
+        <w:spacing w:after="80"/>
+        <w:ind w:left="576"/>
+      </w:pPr>
+      <w:r>
+        <w:t>To ask.</w:t>
+      </w:r>
+    </w:p>
+    <w:p>
+      <w:pPr>
+        <w:spacing w:after="80"/>
+        <w:ind w:left="576"/>
+      </w:pPr>
+      <w:r>
+        <w:rPr>
+          <w:i/>
+          <w:color w:val="404040"/>
+          <w:sz w:val="20"/>
+        </w:rPr>
+        <w:t>• Formal command: Fragen Sie ... = Ask ...; verb first, Sie capitalized.</w:t>
+      </w:r>
+    </w:p>
+    <w:p>
+      <w:pPr>
+        <w:spacing w:after="80"/>
+        <w:ind w:left="576"/>
+      </w:pPr>
+      <w:r>
+        <w:rPr>
+          <w:i/>
+          <w:color w:val="404040"/>
+          <w:sz w:val="20"/>
+        </w:rPr>
+        <w:t>• The person you ask is accusative: einen Partner / eine Partnerin.</w:t>
+      </w:r>
+    </w:p>
+    <w:p>
+      <w:pPr>
+        <w:spacing w:before="40" w:after="60"/>
+        <w:ind w:left="576"/>
+      </w:pPr>
+      <w:r>
+        <w:rPr>
+          <w:i/>
+          <w:color w:val="30608C"/>
+          <w:sz w:val="21"/>
+        </w:rPr>
+        <w:t xml:space="preserve">› </w:t>
+      </w:r>
+      <w:r>
+        <w:rPr>
+          <w:i/>
+          <w:color w:val="30608C"/>
+          <w:sz w:val="21"/>
+        </w:rPr>
+        <w:t>Fragen Sie einen Partner / eine Partnerin.</w:t>
+      </w:r>
+      <w:r>
+        <w:rPr>
+          <w:i/>
+          <w:color w:val="404040"/>
+          <w:sz w:val="21"/>
+        </w:rPr>
+        <w:t xml:space="preserve"> (Ask a male partner / a female partner.)</w:t>
+      </w:r>
+    </w:p>
+    <w:p>
+      <w:pPr>
+        <w:spacing w:before="0" w:after="60"/>
+        <w:ind w:left="576"/>
+      </w:pPr>
+      <w:r>
+        <w:rPr>
+          <w:i/>
+          <w:color w:val="30608C"/>
+          <w:sz w:val="21"/>
+        </w:rPr>
+        <w:t xml:space="preserve">› </w:t>
+      </w:r>
+      <w:r>
+        <w:rPr>
+          <w:i/>
+          <w:color w:val="30608C"/>
+          <w:sz w:val="21"/>
+        </w:rPr>
+        <w:t>Wie ist die Telefonnummer von Anne?</w:t>
+      </w:r>
+      <w:r>
+        <w:rPr>
+          <w:i/>
+          <w:color w:val="404040"/>
+          <w:sz w:val="21"/>
+        </w:rPr>
+        <w:t xml:space="preserve"> (What is Anne's phone number?)</w:t>
+      </w:r>
+    </w:p>
+    <w:p>
+      <w:pPr>
+        <w:spacing w:before="0" w:after="120"/>
+        <w:ind w:left="576"/>
+      </w:pPr>
+      <w:r>
+        <w:rPr>
+          <w:i/>
+          <w:color w:val="30608C"/>
+          <w:sz w:val="21"/>
+        </w:rPr>
+        <w:t xml:space="preserve">› </w:t>
+      </w:r>
+      <w:r>
+        <w:rPr>
+          <w:i/>
+          <w:color w:val="30608C"/>
+          <w:sz w:val="21"/>
+        </w:rPr>
+        <w:t>Ich frage Maria.</w:t>
+      </w:r>
+      <w:r>
+        <w:rPr>
+          <w:i/>
+          <w:color w:val="404040"/>
+          <w:sz w:val="21"/>
+        </w:rPr>
+        <w:t xml:space="preserve"> (I ask Maria.)</w:t>
+      </w:r>
+    </w:p>
+    <w:p>
+      <w:pPr>
+        <w:spacing w:before="0" w:after="0"/>
+      </w:pPr>
+    </w:p>
+    <w:p>
+      <w:pPr>
+        <w:spacing w:after="120"/>
+      </w:pPr>
+      <w:r>
+        <w:rPr>
+          <w:b/>
+        </w:rPr>
+        <w:t>antworten</w:t>
+      </w:r>
+      <w:r>
+        <w:t xml:space="preserve"> /ˈantvɔʁtn̩/</w:t>
+      </w:r>
+    </w:p>
+    <w:p>
+      <w:pPr>
+        <w:spacing w:after="80"/>
+        <w:ind w:left="576"/>
+      </w:pPr>
+      <w:r>
+        <w:t>To answer; reply.</w:t>
+      </w:r>
+    </w:p>
+    <w:p>
+      <w:pPr>
+        <w:spacing w:after="80"/>
+        <w:ind w:left="576"/>
+      </w:pPr>
+      <w:r>
+        <w:rPr>
+          <w:i/>
+          <w:color w:val="404040"/>
+          <w:sz w:val="20"/>
+        </w:rPr>
+        <w:t>• Formal command: Antworten Sie ... = Answer ... / Reply ...; verb first, Sie capitalized.</w:t>
+      </w:r>
+    </w:p>
+    <w:p>
+      <w:pPr>
+        <w:spacing w:after="80"/>
+        <w:ind w:left="576"/>
+      </w:pPr>
+      <w:r>
+        <w:rPr>
+          <w:i/>
+          <w:color w:val="404040"/>
+          <w:sz w:val="20"/>
+        </w:rPr>
+        <w:t>• Related noun: die Antwort = the answer.</w:t>
+      </w:r>
+    </w:p>
+    <w:p>
+      <w:pPr>
+        <w:spacing w:before="40" w:after="60"/>
+        <w:ind w:left="576"/>
+      </w:pPr>
+      <w:r>
+        <w:rPr>
+          <w:i/>
+          <w:color w:val="30608C"/>
+          <w:sz w:val="21"/>
+        </w:rPr>
+        <w:t xml:space="preserve">› </w:t>
+      </w:r>
+      <w:r>
+        <w:rPr>
+          <w:i/>
+          <w:color w:val="30608C"/>
+          <w:sz w:val="21"/>
+        </w:rPr>
+        <w:t>Fragen und antworten Sie.</w:t>
+      </w:r>
+      <w:r>
+        <w:rPr>
+          <w:i/>
+          <w:color w:val="404040"/>
+          <w:sz w:val="21"/>
+        </w:rPr>
+        <w:t xml:space="preserve"> (Ask and answer. [formal you])</w:t>
+      </w:r>
+    </w:p>
+    <w:p>
+      <w:pPr>
+        <w:spacing w:before="0" w:after="60"/>
+        <w:ind w:left="576"/>
+      </w:pPr>
+      <w:r>
+        <w:rPr>
+          <w:i/>
+          <w:color w:val="30608C"/>
+          <w:sz w:val="21"/>
+        </w:rPr>
+        <w:t xml:space="preserve">› </w:t>
+      </w:r>
+      <w:r>
+        <w:rPr>
+          <w:i/>
+          <w:color w:val="30608C"/>
+          <w:sz w:val="21"/>
+        </w:rPr>
+        <w:t>Die Telefonnummer von Anne ist 0621 / 53487.</w:t>
+      </w:r>
+      <w:r>
+        <w:rPr>
+          <w:i/>
+          <w:color w:val="404040"/>
+          <w:sz w:val="21"/>
+        </w:rPr>
+        <w:t xml:space="preserve"> (Anne's phone number is 0621 / 53487.)</w:t>
+      </w:r>
+    </w:p>
+    <w:p>
+      <w:pPr>
+        <w:spacing w:before="0" w:after="120"/>
+        <w:ind w:left="576"/>
+      </w:pPr>
+      <w:r>
+        <w:rPr>
+          <w:i/>
+          <w:color w:val="30608C"/>
+          <w:sz w:val="21"/>
+        </w:rPr>
+        <w:t xml:space="preserve">› </w:t>
+      </w:r>
+      <w:r>
+        <w:rPr>
+          <w:i/>
+          <w:color w:val="30608C"/>
+          <w:sz w:val="21"/>
+        </w:rPr>
+        <w:t>Bitte antworten Sie.</w:t>
+      </w:r>
+      <w:r>
+        <w:rPr>
+          <w:i/>
+          <w:color w:val="404040"/>
+          <w:sz w:val="21"/>
+        </w:rPr>
+        <w:t xml:space="preserve"> (Please answer. [formal you])</w:t>
+      </w:r>
+    </w:p>
+    <w:p>
+      <w:pPr>
+        <w:spacing w:before="0" w:after="0"/>
+      </w:pPr>
+    </w:p>
+    <w:p>
+      <w:pPr>
+        <w:spacing w:after="120"/>
+      </w:pPr>
+      <w:r>
+        <w:rPr>
+          <w:b/>
+        </w:rPr>
+        <w:t>der Kurs</w:t>
+      </w:r>
+      <w:r>
+        <w:t xml:space="preserve"> /kʊʁs/</w:t>
+      </w:r>
+    </w:p>
+    <w:p>
+      <w:pPr>
+        <w:spacing w:after="80"/>
+        <w:ind w:left="576"/>
+      </w:pPr>
+      <w:r>
+        <w:rPr>
+          <w:sz w:val="22"/>
+        </w:rPr>
+        <w:t>der Kurs, -e</w:t>
+      </w:r>
+    </w:p>
+    <w:p>
+      <w:pPr>
+        <w:spacing w:after="80"/>
+        <w:ind w:left="576"/>
+      </w:pPr>
+      <w:r>
+        <w:t>Course; class.</w:t>
+      </w:r>
+    </w:p>
+    <w:p>
+      <w:pPr>
+        <w:spacing w:after="80"/>
+        <w:ind w:left="576"/>
+      </w:pPr>
+      <w:r>
+        <w:rPr>
+          <w:i/>
+          <w:color w:val="404040"/>
+          <w:sz w:val="20"/>
+        </w:rPr>
+        <w:t>• im Kurs = in dem Kurs = in class / in the course.</w:t>
+      </w:r>
+    </w:p>
+    <w:p>
+      <w:pPr>
+        <w:spacing w:after="80"/>
+        <w:ind w:left="576"/>
+      </w:pPr>
+      <w:r>
+        <w:rPr>
+          <w:i/>
+          <w:color w:val="404040"/>
+          <w:sz w:val="20"/>
+        </w:rPr>
+        <w:t>• Location with in uses dative: in dem Kurs becomes im Kurs.</w:t>
+      </w:r>
+    </w:p>
+    <w:p>
+      <w:pPr>
+        <w:spacing w:before="40" w:after="60"/>
+        <w:ind w:left="576"/>
+      </w:pPr>
+      <w:r>
+        <w:rPr>
+          <w:i/>
+          <w:color w:val="30608C"/>
+          <w:sz w:val="21"/>
+        </w:rPr>
+        <w:t xml:space="preserve">› </w:t>
+      </w:r>
+      <w:r>
+        <w:rPr>
+          <w:i/>
+          <w:color w:val="30608C"/>
+          <w:sz w:val="21"/>
+        </w:rPr>
+        <w:t>Tauschen Sie die Notizzettel im Kurs.</w:t>
+      </w:r>
+      <w:r>
+        <w:rPr>
+          <w:i/>
+          <w:color w:val="404040"/>
+          <w:sz w:val="21"/>
+        </w:rPr>
+        <w:t xml:space="preserve"> (Exchange the note sheets in class.)</w:t>
+      </w:r>
+    </w:p>
+    <w:p>
+      <w:pPr>
+        <w:spacing w:before="0" w:after="60"/>
+        <w:ind w:left="576"/>
+      </w:pPr>
+      <w:r>
+        <w:rPr>
+          <w:i/>
+          <w:color w:val="30608C"/>
+          <w:sz w:val="21"/>
+        </w:rPr>
+        <w:t xml:space="preserve">› </w:t>
+      </w:r>
+      <w:r>
+        <w:rPr>
+          <w:i/>
+          <w:color w:val="30608C"/>
+          <w:sz w:val="21"/>
+        </w:rPr>
+        <w:t>Wir sprechen im Kurs Deutsch.</w:t>
+      </w:r>
+      <w:r>
+        <w:rPr>
+          <w:i/>
+          <w:color w:val="404040"/>
+          <w:sz w:val="21"/>
+        </w:rPr>
+        <w:t xml:space="preserve"> (We speak German in class.)</w:t>
+      </w:r>
+    </w:p>
+    <w:p>
+      <w:pPr>
+        <w:spacing w:before="0" w:after="120"/>
+        <w:ind w:left="576"/>
+      </w:pPr>
+      <w:r>
+        <w:rPr>
+          <w:i/>
+          <w:color w:val="30608C"/>
+          <w:sz w:val="21"/>
+        </w:rPr>
+        <w:t xml:space="preserve">› </w:t>
+      </w:r>
+      <w:r>
+        <w:rPr>
+          <w:i/>
+          <w:color w:val="30608C"/>
+          <w:sz w:val="21"/>
+        </w:rPr>
+        <w:t>Ich gehe zum Kurs.</w:t>
+      </w:r>
+      <w:r>
+        <w:rPr>
+          <w:i/>
+          <w:color w:val="404040"/>
+          <w:sz w:val="21"/>
+        </w:rPr>
+        <w:t xml:space="preserve"> (I am going to the course.)</w:t>
+      </w:r>
+    </w:p>
+    <w:p>
+      <w:pPr>
+        <w:spacing w:before="0" w:after="0"/>
+      </w:pPr>
     </w:p>
     <w:p>
       <w:pPr>

</xml_diff>

<commit_message>
Add example for "tauschen" in vocab.docx and vocab.manifest.json
- Added a new example sentence for "tauschen," enhancing the context for learners by illustrating its usage in a practical scenario.
- Updated the timestamp in vocab.manifest.json to reflect the latest changes, maintaining consistency with previous entries under lesson 1 and level A1.
</commit_message>
<xml_diff>
--- a/vocab.docx
+++ b/vocab.docx
@@ -123,6 +123,36 @@
           <w:sz w:val="21"/>
         </w:rPr>
         <w:t xml:space="preserve"> (We exchange phone numbers.)</w:t>
+      </w:r>
+    </w:p>
+    <w:p>
+      <w:pPr>
+        <w:spacing w:before="0" w:after="60"/>
+        <w:ind w:left="576"/>
+      </w:pPr>
+      <w:r>
+        <w:rPr>
+          <w:i/>
+          <w:color w:val="30608C"/>
+          <w:sz w:val="21"/>
+        </w:rPr>
+        <w:t xml:space="preserve">› </w:t>
+      </w:r>
+      <w:r>
+        <w:rPr>
+          <w:i/>
+          <w:color w:val="30608C"/>
+          <w:sz w:val="21"/>
+        </w:rPr>
+        <w:t>Tauschen Sie die Notizzettel. Fragen Sie: Wie ist die Telefonnummer von Anne?</w:t>
+      </w:r>
+      <w:r>
+        <w:rPr>
+          <w:i/>
+          <w:color w:val="404040"/>
+          <w:sz w:val="21"/>
+        </w:rPr>
+        <w:t xml:space="preserve"> (Exchange the note sheets. Ask: What is Anne's phone number?)</w:t>
       </w:r>
     </w:p>
     <w:p>

</xml_diff>

<commit_message>
Add new vocabulary entries for "die Bürokratie" and "von A bis Z" in vocab.docx and vocab.manifest.json
- Introduced detailed entries for "die Bürokratie" and "von A bis Z," including glosses, usage notes, and multiple examples in both German and English.
- Both entries are categorized under lesson 1 and level A1, enhancing the vocabulary resource for language learners with practical applications and context.
</commit_message>
<xml_diff>
--- a/vocab.docx
+++ b/vocab.docx
@@ -22,10 +22,10 @@
         <w:rPr>
           <w:b/>
         </w:rPr>
-        <w:t>tauschen</w:t>
-      </w:r>
-      <w:r>
-        <w:t xml:space="preserve"> /ˈtaʊ̯ʃən/</w:t>
+        <w:t>die Bürokratie</w:t>
+      </w:r>
+      <w:r>
+        <w:t xml:space="preserve"> /byʁokʁaˈtiː/</w:t>
       </w:r>
     </w:p>
     <w:p>
@@ -34,7 +34,19 @@
         <w:ind w:left="576"/>
       </w:pPr>
       <w:r>
-        <w:t>To exchange; swap.</w:t>
+        <w:rPr>
+          <w:sz w:val="22"/>
+        </w:rPr>
+        <w:t>die Bürokratie, -n</w:t>
+      </w:r>
+    </w:p>
+    <w:p>
+      <w:pPr>
+        <w:spacing w:after="80"/>
+        <w:ind w:left="576"/>
+      </w:pPr>
+      <w:r>
+        <w:t>Bureaucracy; administration and paperwork.</w:t>
       </w:r>
     </w:p>
     <w:p>
@@ -48,7 +60,125 @@
           <w:color w:val="404040"/>
           <w:sz w:val="20"/>
         </w:rPr>
-        <w:t>• Formal command: Tauschen Sie ... = Exchange ... / Swap ...; verb first, Sie capitalized.</w:t>
+        <w:t>• Correct spelling: Bürokratie, not Burokrative. It has ü and ends in -ie.</w:t>
+      </w:r>
+    </w:p>
+    <w:p>
+      <w:pPr>
+        <w:spacing w:before="40" w:after="60"/>
+        <w:ind w:left="576"/>
+      </w:pPr>
+      <w:r>
+        <w:rPr>
+          <w:i/>
+          <w:color w:val="30608C"/>
+          <w:sz w:val="21"/>
+        </w:rPr>
+        <w:t xml:space="preserve">› </w:t>
+      </w:r>
+      <w:r>
+        <w:rPr>
+          <w:i/>
+          <w:color w:val="30608C"/>
+          <w:sz w:val="21"/>
+        </w:rPr>
+        <w:t>Bürokratie von A bis Z</w:t>
+      </w:r>
+      <w:r>
+        <w:rPr>
+          <w:i/>
+          <w:color w:val="404040"/>
+          <w:sz w:val="21"/>
+        </w:rPr>
+        <w:t xml:space="preserve"> (Bureaucracy from A to Z.)</w:t>
+      </w:r>
+    </w:p>
+    <w:p>
+      <w:pPr>
+        <w:spacing w:before="0" w:after="60"/>
+        <w:ind w:left="576"/>
+      </w:pPr>
+      <w:r>
+        <w:rPr>
+          <w:i/>
+          <w:color w:val="30608C"/>
+          <w:sz w:val="21"/>
+        </w:rPr>
+        <w:t xml:space="preserve">› </w:t>
+      </w:r>
+      <w:r>
+        <w:rPr>
+          <w:i/>
+          <w:color w:val="30608C"/>
+          <w:sz w:val="21"/>
+        </w:rPr>
+        <w:t>Die Bürokratie in Deutschland ist manchmal kompliziert.</w:t>
+      </w:r>
+      <w:r>
+        <w:rPr>
+          <w:i/>
+          <w:color w:val="404040"/>
+          <w:sz w:val="21"/>
+        </w:rPr>
+        <w:t xml:space="preserve"> (The bureaucracy in Germany is sometimes complicated.)</w:t>
+      </w:r>
+    </w:p>
+    <w:p>
+      <w:pPr>
+        <w:spacing w:before="0" w:after="120"/>
+        <w:ind w:left="576"/>
+      </w:pPr>
+      <w:r>
+        <w:rPr>
+          <w:i/>
+          <w:color w:val="30608C"/>
+          <w:sz w:val="21"/>
+        </w:rPr>
+        <w:t xml:space="preserve">› </w:t>
+      </w:r>
+      <w:r>
+        <w:rPr>
+          <w:i/>
+          <w:color w:val="30608C"/>
+          <w:sz w:val="21"/>
+        </w:rPr>
+        <w:t>Wir lernen Wörter zur Bürokratie.</w:t>
+      </w:r>
+      <w:r>
+        <w:rPr>
+          <w:i/>
+          <w:color w:val="404040"/>
+          <w:sz w:val="21"/>
+        </w:rPr>
+        <w:t xml:space="preserve"> (We are learning words about bureaucracy.)</w:t>
+      </w:r>
+    </w:p>
+    <w:p>
+      <w:pPr>
+        <w:spacing w:before="0" w:after="0"/>
+      </w:pPr>
+    </w:p>
+    <w:p>
+      <w:pPr>
+        <w:spacing w:after="120"/>
+      </w:pPr>
+      <w:r>
+        <w:rPr>
+          <w:b/>
+        </w:rPr>
+        <w:t>von A bis Z</w:t>
+      </w:r>
+      <w:r>
+        <w:t xml:space="preserve"> /fɔn aː bɪs tsɛt/</w:t>
+      </w:r>
+    </w:p>
+    <w:p>
+      <w:pPr>
+        <w:spacing w:after="80"/>
+        <w:ind w:left="576"/>
+      </w:pPr>
+      <w:r>
+        <w:t>From A to Z; completely, start to finish.</w:t>
       </w:r>
     </w:p>
     <w:p>
@@ -62,155 +192,7 @@
           <w:color w:val="404040"/>
           <w:sz w:val="20"/>
         </w:rPr>
-        <w:t>• With tauschen, the thing exchanged is accusative. For plural nouns, nominative and accusative look the same: die ... stays die ....</w:t>
-      </w:r>
-    </w:p>
-    <w:p>
-      <w:pPr>
-        <w:spacing w:before="40" w:after="60"/>
-        <w:ind w:left="576"/>
-      </w:pPr>
-      <w:r>
-        <w:rPr>
-          <w:i/>
-          <w:color w:val="30608C"/>
-          <w:sz w:val="21"/>
-        </w:rPr>
-        <w:t xml:space="preserve">› </w:t>
-      </w:r>
-      <w:r>
-        <w:rPr>
-          <w:i/>
-          <w:color w:val="30608C"/>
-          <w:sz w:val="21"/>
-        </w:rPr>
-        <w:t>Tauschen Sie die Notizzettel im Kurs.</w:t>
-      </w:r>
-      <w:r>
-        <w:rPr>
-          <w:i/>
-          <w:color w:val="404040"/>
-          <w:sz w:val="21"/>
-        </w:rPr>
-        <w:t xml:space="preserve"> (Exchange the note sheets in class.)</w:t>
-      </w:r>
-    </w:p>
-    <w:p>
-      <w:pPr>
-        <w:spacing w:before="0" w:after="60"/>
-        <w:ind w:left="576"/>
-      </w:pPr>
-      <w:r>
-        <w:rPr>
-          <w:i/>
-          <w:color w:val="30608C"/>
-          <w:sz w:val="21"/>
-        </w:rPr>
-        <w:t xml:space="preserve">› </w:t>
-      </w:r>
-      <w:r>
-        <w:rPr>
-          <w:i/>
-          <w:color w:val="30608C"/>
-          <w:sz w:val="21"/>
-        </w:rPr>
-        <w:t>Wir tauschen die Telefonnummern.</w:t>
-      </w:r>
-      <w:r>
-        <w:rPr>
-          <w:i/>
-          <w:color w:val="404040"/>
-          <w:sz w:val="21"/>
-        </w:rPr>
-        <w:t xml:space="preserve"> (We exchange phone numbers.)</w:t>
-      </w:r>
-    </w:p>
-    <w:p>
-      <w:pPr>
-        <w:spacing w:before="0" w:after="60"/>
-        <w:ind w:left="576"/>
-      </w:pPr>
-      <w:r>
-        <w:rPr>
-          <w:i/>
-          <w:color w:val="30608C"/>
-          <w:sz w:val="21"/>
-        </w:rPr>
-        <w:t xml:space="preserve">› </w:t>
-      </w:r>
-      <w:r>
-        <w:rPr>
-          <w:i/>
-          <w:color w:val="30608C"/>
-          <w:sz w:val="21"/>
-        </w:rPr>
-        <w:t>Tauschen Sie die Notizzettel. Fragen Sie: Wie ist die Telefonnummer von Anne?</w:t>
-      </w:r>
-      <w:r>
-        <w:rPr>
-          <w:i/>
-          <w:color w:val="404040"/>
-          <w:sz w:val="21"/>
-        </w:rPr>
-        <w:t xml:space="preserve"> (Exchange the note sheets. Ask: What is Anne's phone number?)</w:t>
-      </w:r>
-    </w:p>
-    <w:p>
-      <w:pPr>
-        <w:spacing w:before="0" w:after="120"/>
-        <w:ind w:left="576"/>
-      </w:pPr>
-      <w:r>
-        <w:rPr>
-          <w:i/>
-          <w:color w:val="30608C"/>
-          <w:sz w:val="21"/>
-        </w:rPr>
-        <w:t xml:space="preserve">› </w:t>
-      </w:r>
-      <w:r>
-        <w:rPr>
-          <w:i/>
-          <w:color w:val="30608C"/>
-          <w:sz w:val="21"/>
-        </w:rPr>
-        <w:t>Tauschen Sie die Antworten mit einem Partner.</w:t>
-      </w:r>
-      <w:r>
-        <w:rPr>
-          <w:i/>
-          <w:color w:val="404040"/>
-          <w:sz w:val="21"/>
-        </w:rPr>
-        <w:t xml:space="preserve"> (Exchange the answers with a partner. [formal you])</w:t>
-      </w:r>
-    </w:p>
-    <w:p>
-      <w:pPr>
-        <w:spacing w:before="0" w:after="0"/>
-      </w:pPr>
-    </w:p>
-    <w:p>
-      <w:pPr>
-        <w:spacing w:after="120"/>
-      </w:pPr>
-      <w:r>
-        <w:rPr>
-          <w:b/>
-        </w:rPr>
-        <w:t>fragen</w:t>
-      </w:r>
-      <w:r>
-        <w:t xml:space="preserve"> /ˈfʁaːɡən/</w:t>
-      </w:r>
-    </w:p>
-    <w:p>
-      <w:pPr>
-        <w:spacing w:after="80"/>
-        <w:ind w:left="576"/>
-      </w:pPr>
-      <w:r>
-        <w:t>To ask.</w:t>
+        <w:t>• Fixed phrase: von ... bis ... = from ... to/until ...</w:t>
       </w:r>
     </w:p>
     <w:p>
@@ -224,7 +206,125 @@
           <w:color w:val="404040"/>
           <w:sz w:val="20"/>
         </w:rPr>
-        <w:t>• Formal command: Fragen Sie ... = Ask ...; verb first, Sie capitalized.</w:t>
+        <w:t>• German says Z as zett. Von A bis Z means the whole topic, from beginning to end.</w:t>
+      </w:r>
+    </w:p>
+    <w:p>
+      <w:pPr>
+        <w:spacing w:before="40" w:after="60"/>
+        <w:ind w:left="576"/>
+      </w:pPr>
+      <w:r>
+        <w:rPr>
+          <w:i/>
+          <w:color w:val="30608C"/>
+          <w:sz w:val="21"/>
+        </w:rPr>
+        <w:t xml:space="preserve">› </w:t>
+      </w:r>
+      <w:r>
+        <w:rPr>
+          <w:i/>
+          <w:color w:val="30608C"/>
+          <w:sz w:val="21"/>
+        </w:rPr>
+        <w:t>Bürokratie von A bis Z</w:t>
+      </w:r>
+      <w:r>
+        <w:rPr>
+          <w:i/>
+          <w:color w:val="404040"/>
+          <w:sz w:val="21"/>
+        </w:rPr>
+        <w:t xml:space="preserve"> (Bureaucracy from A to Z.)</w:t>
+      </w:r>
+    </w:p>
+    <w:p>
+      <w:pPr>
+        <w:spacing w:before="0" w:after="60"/>
+        <w:ind w:left="576"/>
+      </w:pPr>
+      <w:r>
+        <w:rPr>
+          <w:i/>
+          <w:color w:val="30608C"/>
+          <w:sz w:val="21"/>
+        </w:rPr>
+        <w:t xml:space="preserve">› </w:t>
+      </w:r>
+      <w:r>
+        <w:rPr>
+          <w:i/>
+          <w:color w:val="30608C"/>
+          <w:sz w:val="21"/>
+        </w:rPr>
+        <w:t>Deutsch von A bis Z</w:t>
+      </w:r>
+      <w:r>
+        <w:rPr>
+          <w:i/>
+          <w:color w:val="404040"/>
+          <w:sz w:val="21"/>
+        </w:rPr>
+        <w:t xml:space="preserve"> (German from A to Z.)</w:t>
+      </w:r>
+    </w:p>
+    <w:p>
+      <w:pPr>
+        <w:spacing w:before="0" w:after="120"/>
+        <w:ind w:left="576"/>
+      </w:pPr>
+      <w:r>
+        <w:rPr>
+          <w:i/>
+          <w:color w:val="30608C"/>
+          <w:sz w:val="21"/>
+        </w:rPr>
+        <w:t xml:space="preserve">› </w:t>
+      </w:r>
+      <w:r>
+        <w:rPr>
+          <w:i/>
+          <w:color w:val="30608C"/>
+          <w:sz w:val="21"/>
+        </w:rPr>
+        <w:t>Wir erklären das Thema von A bis Z.</w:t>
+      </w:r>
+      <w:r>
+        <w:rPr>
+          <w:i/>
+          <w:color w:val="404040"/>
+          <w:sz w:val="21"/>
+        </w:rPr>
+        <w:t xml:space="preserve"> (We explain the topic from start to finish.)</w:t>
+      </w:r>
+    </w:p>
+    <w:p>
+      <w:pPr>
+        <w:spacing w:before="0" w:after="0"/>
+      </w:pPr>
+    </w:p>
+    <w:p>
+      <w:pPr>
+        <w:spacing w:after="120"/>
+      </w:pPr>
+      <w:r>
+        <w:rPr>
+          <w:b/>
+        </w:rPr>
+        <w:t>tauschen</w:t>
+      </w:r>
+      <w:r>
+        <w:t xml:space="preserve"> /ˈtaʊ̯ʃən/</w:t>
+      </w:r>
+    </w:p>
+    <w:p>
+      <w:pPr>
+        <w:spacing w:after="80"/>
+        <w:ind w:left="576"/>
+      </w:pPr>
+      <w:r>
+        <w:t>To exchange; swap.</w:t>
       </w:r>
     </w:p>
     <w:p>
@@ -238,125 +338,7 @@
           <w:color w:val="404040"/>
           <w:sz w:val="20"/>
         </w:rPr>
-        <w:t>• The person you ask is accusative: einen Partner / eine Partnerin.</w:t>
-      </w:r>
-    </w:p>
-    <w:p>
-      <w:pPr>
-        <w:spacing w:before="40" w:after="60"/>
-        <w:ind w:left="576"/>
-      </w:pPr>
-      <w:r>
-        <w:rPr>
-          <w:i/>
-          <w:color w:val="30608C"/>
-          <w:sz w:val="21"/>
-        </w:rPr>
-        <w:t xml:space="preserve">› </w:t>
-      </w:r>
-      <w:r>
-        <w:rPr>
-          <w:i/>
-          <w:color w:val="30608C"/>
-          <w:sz w:val="21"/>
-        </w:rPr>
-        <w:t>Fragen Sie einen Partner / eine Partnerin.</w:t>
-      </w:r>
-      <w:r>
-        <w:rPr>
-          <w:i/>
-          <w:color w:val="404040"/>
-          <w:sz w:val="21"/>
-        </w:rPr>
-        <w:t xml:space="preserve"> (Ask a male partner / a female partner.)</w:t>
-      </w:r>
-    </w:p>
-    <w:p>
-      <w:pPr>
-        <w:spacing w:before="0" w:after="60"/>
-        <w:ind w:left="576"/>
-      </w:pPr>
-      <w:r>
-        <w:rPr>
-          <w:i/>
-          <w:color w:val="30608C"/>
-          <w:sz w:val="21"/>
-        </w:rPr>
-        <w:t xml:space="preserve">› </w:t>
-      </w:r>
-      <w:r>
-        <w:rPr>
-          <w:i/>
-          <w:color w:val="30608C"/>
-          <w:sz w:val="21"/>
-        </w:rPr>
-        <w:t>Wie ist die Telefonnummer von Anne?</w:t>
-      </w:r>
-      <w:r>
-        <w:rPr>
-          <w:i/>
-          <w:color w:val="404040"/>
-          <w:sz w:val="21"/>
-        </w:rPr>
-        <w:t xml:space="preserve"> (What is Anne's phone number?)</w:t>
-      </w:r>
-    </w:p>
-    <w:p>
-      <w:pPr>
-        <w:spacing w:before="0" w:after="120"/>
-        <w:ind w:left="576"/>
-      </w:pPr>
-      <w:r>
-        <w:rPr>
-          <w:i/>
-          <w:color w:val="30608C"/>
-          <w:sz w:val="21"/>
-        </w:rPr>
-        <w:t xml:space="preserve">› </w:t>
-      </w:r>
-      <w:r>
-        <w:rPr>
-          <w:i/>
-          <w:color w:val="30608C"/>
-          <w:sz w:val="21"/>
-        </w:rPr>
-        <w:t>Ich frage Maria.</w:t>
-      </w:r>
-      <w:r>
-        <w:rPr>
-          <w:i/>
-          <w:color w:val="404040"/>
-          <w:sz w:val="21"/>
-        </w:rPr>
-        <w:t xml:space="preserve"> (I ask Maria.)</w:t>
-      </w:r>
-    </w:p>
-    <w:p>
-      <w:pPr>
-        <w:spacing w:before="0" w:after="0"/>
-      </w:pPr>
-    </w:p>
-    <w:p>
-      <w:pPr>
-        <w:spacing w:after="120"/>
-      </w:pPr>
-      <w:r>
-        <w:rPr>
-          <w:b/>
-        </w:rPr>
-        <w:t>antworten</w:t>
-      </w:r>
-      <w:r>
-        <w:t xml:space="preserve"> /ˈantvɔʁtn̩/</w:t>
-      </w:r>
-    </w:p>
-    <w:p>
-      <w:pPr>
-        <w:spacing w:after="80"/>
-        <w:ind w:left="576"/>
-      </w:pPr>
-      <w:r>
-        <w:t>To answer; reply.</w:t>
+        <w:t>• Formal command: Tauschen Sie ... = Exchange ... / Swap ...; verb first, Sie capitalized.</w:t>
       </w:r>
     </w:p>
     <w:p>
@@ -370,26 +352,42 @@
           <w:color w:val="404040"/>
           <w:sz w:val="20"/>
         </w:rPr>
-        <w:t>• Formal command: Antworten Sie ... = Answer ... / Reply ...; verb first, Sie capitalized.</w:t>
-      </w:r>
-    </w:p>
-    <w:p>
-      <w:pPr>
-        <w:spacing w:after="80"/>
-        <w:ind w:left="576"/>
-      </w:pPr>
+        <w:t>• With tauschen, the thing exchanged is accusative. For plural nouns, nominative and accusative look the same: die ... stays die ....</w:t>
+      </w:r>
+    </w:p>
+    <w:p>
+      <w:pPr>
+        <w:spacing w:before="40" w:after="60"/>
+        <w:ind w:left="576"/>
+      </w:pPr>
+      <w:r>
+        <w:rPr>
+          <w:i/>
+          <w:color w:val="30608C"/>
+          <w:sz w:val="21"/>
+        </w:rPr>
+        <w:t xml:space="preserve">› </w:t>
+      </w:r>
+      <w:r>
+        <w:rPr>
+          <w:i/>
+          <w:color w:val="30608C"/>
+          <w:sz w:val="21"/>
+        </w:rPr>
+        <w:t>Tauschen Sie die Notizzettel im Kurs.</w:t>
+      </w:r>
       <w:r>
         <w:rPr>
           <w:i/>
           <w:color w:val="404040"/>
-          <w:sz w:val="20"/>
-        </w:rPr>
-        <w:t>• Related noun: die Antwort = the answer.</w:t>
-      </w:r>
-    </w:p>
-    <w:p>
-      <w:pPr>
-        <w:spacing w:before="40" w:after="60"/>
+          <w:sz w:val="21"/>
+        </w:rPr>
+        <w:t xml:space="preserve"> (Exchange the note sheets in class.)</w:t>
+      </w:r>
+    </w:p>
+    <w:p>
+      <w:pPr>
+        <w:spacing w:before="0" w:after="60"/>
         <w:ind w:left="576"/>
       </w:pPr>
       <w:r>
@@ -406,7 +404,7 @@
           <w:color w:val="30608C"/>
           <w:sz w:val="21"/>
         </w:rPr>
-        <w:t>Fragen und antworten Sie.</w:t>
+        <w:t>Wir tauschen die Telefonnummern.</w:t>
       </w:r>
       <w:r>
         <w:rPr>
@@ -414,7 +412,7 @@
           <w:color w:val="404040"/>
           <w:sz w:val="21"/>
         </w:rPr>
-        <w:t xml:space="preserve"> (Ask and answer. [formal you])</w:t>
+        <w:t xml:space="preserve"> (We exchange phone numbers.)</w:t>
       </w:r>
     </w:p>
     <w:p>
@@ -436,7 +434,7 @@
           <w:color w:val="30608C"/>
           <w:sz w:val="21"/>
         </w:rPr>
-        <w:t>Die Telefonnummer von Anne ist 0621 / 53487.</w:t>
+        <w:t>Tauschen Sie die Notizzettel. Fragen Sie: Wie ist die Telefonnummer von Anne?</w:t>
       </w:r>
       <w:r>
         <w:rPr>
@@ -444,7 +442,7 @@
           <w:color w:val="404040"/>
           <w:sz w:val="21"/>
         </w:rPr>
-        <w:t xml:space="preserve"> (Anne's phone number is 0621 / 53487.)</w:t>
+        <w:t xml:space="preserve"> (Exchange the note sheets. Ask: What is Anne's phone number?)</w:t>
       </w:r>
     </w:p>
     <w:p>
@@ -466,7 +464,7 @@
           <w:color w:val="30608C"/>
           <w:sz w:val="21"/>
         </w:rPr>
-        <w:t>Bitte antworten Sie.</w:t>
+        <w:t>Tauschen Sie die Antworten mit einem Partner.</w:t>
       </w:r>
       <w:r>
         <w:rPr>
@@ -474,7 +472,7 @@
           <w:color w:val="404040"/>
           <w:sz w:val="21"/>
         </w:rPr>
-        <w:t xml:space="preserve"> (Please answer. [formal you])</w:t>
+        <w:t xml:space="preserve"> (Exchange the answers with a partner. [formal you])</w:t>
       </w:r>
     </w:p>
     <w:p>

</xml_diff>

<commit_message>
Add new vocabulary entry for "der Personalbogen" in vocab.docx and vocab.manifest.json
- Introduced a detailed entry for "der Personalbogen," including gloss, usage notes, and multiple examples in both German and English.
- The entry is categorized under lesson 1 and level A1, enhancing the vocabulary resource for language learners with practical applications and context.
</commit_message>
<xml_diff>
--- a/vocab.docx
+++ b/vocab.docx
@@ -13,6 +13,164 @@
         </w:rPr>
         <w:t>daf — vocabulary</w:t>
       </w:r>
+    </w:p>
+    <w:p>
+      <w:pPr>
+        <w:spacing w:after="120"/>
+      </w:pPr>
+      <w:r>
+        <w:rPr>
+          <w:b/>
+        </w:rPr>
+        <w:t>der Personalbogen</w:t>
+      </w:r>
+      <w:r>
+        <w:t xml:space="preserve"> /pɛʁzoˈnaːlˌboːɡn̩/</w:t>
+      </w:r>
+    </w:p>
+    <w:p>
+      <w:pPr>
+        <w:spacing w:after="80"/>
+        <w:ind w:left="576"/>
+      </w:pPr>
+      <w:r>
+        <w:rPr>
+          <w:sz w:val="22"/>
+        </w:rPr>
+        <w:t>der Personalbogen, -bögen</w:t>
+      </w:r>
+    </w:p>
+    <w:p>
+      <w:pPr>
+        <w:spacing w:after="80"/>
+        <w:ind w:left="576"/>
+      </w:pPr>
+      <w:r>
+        <w:t>Personal information form.</w:t>
+      </w:r>
+    </w:p>
+    <w:p>
+      <w:pPr>
+        <w:spacing w:after="80"/>
+        <w:ind w:left="576"/>
+      </w:pPr>
+      <w:r>
+        <w:rPr>
+          <w:i/>
+          <w:color w:val="404040"/>
+          <w:sz w:val="20"/>
+        </w:rPr>
+        <w:t>• Compound noun: Personal = personal/personnel; der Bogen = sheet/form. The last noun decides the gender: der Bogen → der Personalbogen.</w:t>
+      </w:r>
+    </w:p>
+    <w:p>
+      <w:pPr>
+        <w:spacing w:after="80"/>
+        <w:ind w:left="576"/>
+      </w:pPr>
+      <w:r>
+        <w:rPr>
+          <w:i/>
+          <w:color w:val="404040"/>
+          <w:sz w:val="20"/>
+        </w:rPr>
+        <w:t>• Usually a form for name, address, phone number, nationality, and other personal details.</w:t>
+      </w:r>
+    </w:p>
+    <w:p>
+      <w:pPr>
+        <w:spacing w:before="40" w:after="60"/>
+        <w:ind w:left="576"/>
+      </w:pPr>
+      <w:r>
+        <w:rPr>
+          <w:i/>
+          <w:color w:val="30608C"/>
+          <w:sz w:val="21"/>
+        </w:rPr>
+        <w:t xml:space="preserve">› </w:t>
+      </w:r>
+      <w:r>
+        <w:rPr>
+          <w:i/>
+          <w:color w:val="30608C"/>
+          <w:sz w:val="21"/>
+        </w:rPr>
+        <w:t>Füllen Sie den Personalbogen aus.</w:t>
+      </w:r>
+      <w:r>
+        <w:rPr>
+          <w:i/>
+          <w:color w:val="404040"/>
+          <w:sz w:val="21"/>
+        </w:rPr>
+        <w:t xml:space="preserve"> (Fill out the personal information form. [formal you])</w:t>
+      </w:r>
+    </w:p>
+    <w:p>
+      <w:pPr>
+        <w:spacing w:before="0" w:after="60"/>
+        <w:ind w:left="576"/>
+      </w:pPr>
+      <w:r>
+        <w:rPr>
+          <w:i/>
+          <w:color w:val="30608C"/>
+          <w:sz w:val="21"/>
+        </w:rPr>
+        <w:t xml:space="preserve">› </w:t>
+      </w:r>
+      <w:r>
+        <w:rPr>
+          <w:i/>
+          <w:color w:val="30608C"/>
+          <w:sz w:val="21"/>
+        </w:rPr>
+        <w:t>Schreiben Sie Ihre Telefonnummer in den Personalbogen.</w:t>
+      </w:r>
+      <w:r>
+        <w:rPr>
+          <w:i/>
+          <w:color w:val="404040"/>
+          <w:sz w:val="21"/>
+        </w:rPr>
+        <w:t xml:space="preserve"> (Write your phone number in the personal information form. [formal you])</w:t>
+      </w:r>
+    </w:p>
+    <w:p>
+      <w:pPr>
+        <w:spacing w:before="0" w:after="120"/>
+        <w:ind w:left="576"/>
+      </w:pPr>
+      <w:r>
+        <w:rPr>
+          <w:i/>
+          <w:color w:val="30608C"/>
+          <w:sz w:val="21"/>
+        </w:rPr>
+        <w:t xml:space="preserve">› </w:t>
+      </w:r>
+      <w:r>
+        <w:rPr>
+          <w:i/>
+          <w:color w:val="30608C"/>
+          <w:sz w:val="21"/>
+        </w:rPr>
+        <w:t>Der Personalbogen fragt nach Name und Adresse.</w:t>
+      </w:r>
+      <w:r>
+        <w:rPr>
+          <w:i/>
+          <w:color w:val="404040"/>
+          <w:sz w:val="21"/>
+        </w:rPr>
+        <w:t xml:space="preserve"> (The personal information form asks for name and address.)</w:t>
+      </w:r>
+    </w:p>
+    <w:p>
+      <w:pPr>
+        <w:spacing w:before="0" w:after="0"/>
+      </w:pPr>
     </w:p>
     <w:p>
       <w:pPr>

</xml_diff>

<commit_message>
Add new vocabulary entries for "das Telefongespräch" and "korrigieren" in vocab.docx and vocab.manifest.json
- Introduced detailed entries for "das Telefongespräch" and "korrigieren," including glosses, usage notes, and multiple examples in both German and English.
- Both entries are categorized under lesson 1 and level A1, enhancing the vocabulary resource for language learners with practical applications and context.
</commit_message>
<xml_diff>
--- a/vocab.docx
+++ b/vocab.docx
@@ -13,6 +13,296 @@
         </w:rPr>
         <w:t>daf — vocabulary</w:t>
       </w:r>
+    </w:p>
+    <w:p>
+      <w:pPr>
+        <w:spacing w:after="120"/>
+      </w:pPr>
+      <w:r>
+        <w:rPr>
+          <w:b/>
+        </w:rPr>
+        <w:t>das Telefongespräch</w:t>
+      </w:r>
+      <w:r>
+        <w:t xml:space="preserve"> /teˈlefoːnɡəˌʃpʁɛːç/</w:t>
+      </w:r>
+    </w:p>
+    <w:p>
+      <w:pPr>
+        <w:spacing w:after="80"/>
+        <w:ind w:left="576"/>
+      </w:pPr>
+      <w:r>
+        <w:rPr>
+          <w:sz w:val="22"/>
+        </w:rPr>
+        <w:t>das Telefongespräch, -e</w:t>
+      </w:r>
+    </w:p>
+    <w:p>
+      <w:pPr>
+        <w:spacing w:after="80"/>
+        <w:ind w:left="576"/>
+      </w:pPr>
+      <w:r>
+        <w:t>Telephone conversation; phone call.</w:t>
+      </w:r>
+    </w:p>
+    <w:p>
+      <w:pPr>
+        <w:spacing w:after="80"/>
+        <w:ind w:left="576"/>
+      </w:pPr>
+      <w:r>
+        <w:rPr>
+          <w:i/>
+          <w:color w:val="404040"/>
+          <w:sz w:val="20"/>
+        </w:rPr>
+        <w:t>• Compound noun: das Telefon + das Gespräch. The last noun decides the gender: das Gespräch → das Telefongespräch.</w:t>
+      </w:r>
+    </w:p>
+    <w:p>
+      <w:pPr>
+        <w:spacing w:before="40" w:after="60"/>
+        <w:ind w:left="576"/>
+      </w:pPr>
+      <w:r>
+        <w:rPr>
+          <w:i/>
+          <w:color w:val="30608C"/>
+          <w:sz w:val="21"/>
+        </w:rPr>
+        <w:t xml:space="preserve">› </w:t>
+      </w:r>
+      <w:r>
+        <w:rPr>
+          <w:i/>
+          <w:color w:val="30608C"/>
+          <w:sz w:val="21"/>
+        </w:rPr>
+        <w:t>Hören Sie das Telefongespräch.</w:t>
+      </w:r>
+      <w:r>
+        <w:rPr>
+          <w:i/>
+          <w:color w:val="404040"/>
+          <w:sz w:val="21"/>
+        </w:rPr>
+        <w:t xml:space="preserve"> (Listen to the telephone conversation. [formal you])</w:t>
+      </w:r>
+    </w:p>
+    <w:p>
+      <w:pPr>
+        <w:spacing w:before="0" w:after="60"/>
+        <w:ind w:left="576"/>
+      </w:pPr>
+      <w:r>
+        <w:rPr>
+          <w:i/>
+          <w:color w:val="30608C"/>
+          <w:sz w:val="21"/>
+        </w:rPr>
+        <w:t xml:space="preserve">› </w:t>
+      </w:r>
+      <w:r>
+        <w:rPr>
+          <w:i/>
+          <w:color w:val="30608C"/>
+          <w:sz w:val="21"/>
+        </w:rPr>
+        <w:t>Hören Sie das Telefongespräch und ergänzen Sie den Personalbogen.</w:t>
+      </w:r>
+      <w:r>
+        <w:rPr>
+          <w:i/>
+          <w:color w:val="404040"/>
+          <w:sz w:val="21"/>
+        </w:rPr>
+        <w:t xml:space="preserve"> (Listen to the phone call and complete the personal information form.)</w:t>
+      </w:r>
+    </w:p>
+    <w:p>
+      <w:pPr>
+        <w:spacing w:before="0" w:after="120"/>
+        <w:ind w:left="576"/>
+      </w:pPr>
+      <w:r>
+        <w:rPr>
+          <w:i/>
+          <w:color w:val="30608C"/>
+          <w:sz w:val="21"/>
+        </w:rPr>
+        <w:t xml:space="preserve">› </w:t>
+      </w:r>
+      <w:r>
+        <w:rPr>
+          <w:i/>
+          <w:color w:val="30608C"/>
+          <w:sz w:val="21"/>
+        </w:rPr>
+        <w:t>Das Telefongespräch ist kurz.</w:t>
+      </w:r>
+      <w:r>
+        <w:rPr>
+          <w:i/>
+          <w:color w:val="404040"/>
+          <w:sz w:val="21"/>
+        </w:rPr>
+        <w:t xml:space="preserve"> (The phone call is short.)</w:t>
+      </w:r>
+    </w:p>
+    <w:p>
+      <w:pPr>
+        <w:spacing w:before="0" w:after="0"/>
+      </w:pPr>
+    </w:p>
+    <w:p>
+      <w:pPr>
+        <w:spacing w:after="120"/>
+      </w:pPr>
+      <w:r>
+        <w:rPr>
+          <w:b/>
+        </w:rPr>
+        <w:t>korrigieren</w:t>
+      </w:r>
+      <w:r>
+        <w:t xml:space="preserve"> /kɔʁiˈɡiːʁən/</w:t>
+      </w:r>
+    </w:p>
+    <w:p>
+      <w:pPr>
+        <w:spacing w:after="80"/>
+        <w:ind w:left="576"/>
+      </w:pPr>
+      <w:r>
+        <w:t>To correct.</w:t>
+      </w:r>
+    </w:p>
+    <w:p>
+      <w:pPr>
+        <w:spacing w:after="80"/>
+        <w:ind w:left="576"/>
+      </w:pPr>
+      <w:r>
+        <w:rPr>
+          <w:i/>
+          <w:color w:val="404040"/>
+          <w:sz w:val="20"/>
+        </w:rPr>
+        <w:t>• Formal command: Korrigieren Sie ... = Correct ...; verb first, Sie capitalized.</w:t>
+      </w:r>
+    </w:p>
+    <w:p>
+      <w:pPr>
+        <w:spacing w:after="80"/>
+        <w:ind w:left="576"/>
+      </w:pPr>
+      <w:r>
+        <w:rPr>
+          <w:i/>
+          <w:color w:val="404040"/>
+          <w:sz w:val="20"/>
+        </w:rPr>
+        <w:t>• The thing corrected is accusative: den Personalbogen, die Antwort, die Sätze.</w:t>
+      </w:r>
+    </w:p>
+    <w:p>
+      <w:pPr>
+        <w:spacing w:before="40" w:after="60"/>
+        <w:ind w:left="576"/>
+      </w:pPr>
+      <w:r>
+        <w:rPr>
+          <w:i/>
+          <w:color w:val="30608C"/>
+          <w:sz w:val="21"/>
+        </w:rPr>
+        <w:t xml:space="preserve">› </w:t>
+      </w:r>
+      <w:r>
+        <w:rPr>
+          <w:i/>
+          <w:color w:val="30608C"/>
+          <w:sz w:val="21"/>
+        </w:rPr>
+        <w:t>Korrigieren Sie den Personalbogen.</w:t>
+      </w:r>
+      <w:r>
+        <w:rPr>
+          <w:i/>
+          <w:color w:val="404040"/>
+          <w:sz w:val="21"/>
+        </w:rPr>
+        <w:t xml:space="preserve"> (Correct the personal information form. [formal you])</w:t>
+      </w:r>
+    </w:p>
+    <w:p>
+      <w:pPr>
+        <w:spacing w:before="0" w:after="60"/>
+        <w:ind w:left="576"/>
+      </w:pPr>
+      <w:r>
+        <w:rPr>
+          <w:i/>
+          <w:color w:val="30608C"/>
+          <w:sz w:val="21"/>
+        </w:rPr>
+        <w:t xml:space="preserve">› </w:t>
+      </w:r>
+      <w:r>
+        <w:rPr>
+          <w:i/>
+          <w:color w:val="30608C"/>
+          <w:sz w:val="21"/>
+        </w:rPr>
+        <w:t>Hören Sie das Telefongespräch. Korrigieren und ergänzen Sie den Personalbogen.</w:t>
+      </w:r>
+      <w:r>
+        <w:rPr>
+          <w:i/>
+          <w:color w:val="404040"/>
+          <w:sz w:val="21"/>
+        </w:rPr>
+        <w:t xml:space="preserve"> (Listen to the phone call. Correct and complete the personal information form.)</w:t>
+      </w:r>
+    </w:p>
+    <w:p>
+      <w:pPr>
+        <w:spacing w:before="0" w:after="120"/>
+        <w:ind w:left="576"/>
+      </w:pPr>
+      <w:r>
+        <w:rPr>
+          <w:i/>
+          <w:color w:val="30608C"/>
+          <w:sz w:val="21"/>
+        </w:rPr>
+        <w:t xml:space="preserve">› </w:t>
+      </w:r>
+      <w:r>
+        <w:rPr>
+          <w:i/>
+          <w:color w:val="30608C"/>
+          <w:sz w:val="21"/>
+        </w:rPr>
+        <w:t>Korrigieren Sie die Antwort.</w:t>
+      </w:r>
+      <w:r>
+        <w:rPr>
+          <w:i/>
+          <w:color w:val="404040"/>
+          <w:sz w:val="21"/>
+        </w:rPr>
+        <w:t xml:space="preserve"> (Correct the answer. [formal you])</w:t>
+      </w:r>
+    </w:p>
+    <w:p>
+      <w:pPr>
+        <w:spacing w:before="0" w:after="0"/>
+      </w:pPr>
     </w:p>
     <w:p>
       <w:pPr>

</xml_diff>

<commit_message>
Add new vocabulary entry for "die Wohnung" in vocab.docx and vocab.manifest.json
- Introduced a detailed entry for "die Wohnung," including gloss, usage notes, and multiple examples in both German and English.
- The entry is categorized under lesson 2 and level A1, enhancing the vocabulary resource for language learners with practical applications and context.
</commit_message>
<xml_diff>
--- a/vocab.docx
+++ b/vocab.docx
@@ -13,6 +13,106 @@
         </w:rPr>
         <w:t>daf — vocabulary</w:t>
       </w:r>
+    </w:p>
+    <w:p>
+      <w:pPr>
+        <w:spacing w:after="120"/>
+      </w:pPr>
+      <w:r>
+        <w:rPr>
+          <w:b/>
+        </w:rPr>
+        <w:t>die Wohnung</w:t>
+      </w:r>
+      <w:r>
+        <w:t xml:space="preserve"> /ˈvoːnʊŋ/</w:t>
+      </w:r>
+    </w:p>
+    <w:p>
+      <w:pPr>
+        <w:spacing w:after="80"/>
+        <w:ind w:left="576"/>
+      </w:pPr>
+      <w:r>
+        <w:rPr>
+          <w:sz w:val="22"/>
+        </w:rPr>
+        <w:t>die Wohnung, -en</w:t>
+      </w:r>
+    </w:p>
+    <w:p>
+      <w:pPr>
+        <w:spacing w:after="80"/>
+        <w:ind w:left="576"/>
+      </w:pPr>
+      <w:r>
+        <w:t>Apartment; flat.</w:t>
+      </w:r>
+    </w:p>
+    <w:p>
+      <w:pPr>
+        <w:spacing w:before="40" w:after="60"/>
+        <w:ind w:left="576"/>
+      </w:pPr>
+      <w:r>
+        <w:rPr>
+          <w:i/>
+          <w:color w:val="30608C"/>
+          <w:sz w:val="21"/>
+        </w:rPr>
+        <w:t xml:space="preserve">› </w:t>
+      </w:r>
+      <w:r>
+        <w:rPr>
+          <w:i/>
+          <w:color w:val="30608C"/>
+          <w:sz w:val="21"/>
+        </w:rPr>
+        <w:t>Meine Wohnung ist klein.</w:t>
+      </w:r>
+      <w:r>
+        <w:rPr>
+          <w:i/>
+          <w:color w:val="404040"/>
+          <w:sz w:val="21"/>
+        </w:rPr>
+        <w:t xml:space="preserve"> (My apartment is small.)</w:t>
+      </w:r>
+    </w:p>
+    <w:p>
+      <w:pPr>
+        <w:spacing w:before="0" w:after="120"/>
+        <w:ind w:left="576"/>
+      </w:pPr>
+      <w:r>
+        <w:rPr>
+          <w:i/>
+          <w:color w:val="30608C"/>
+          <w:sz w:val="21"/>
+        </w:rPr>
+        <w:t xml:space="preserve">› </w:t>
+      </w:r>
+      <w:r>
+        <w:rPr>
+          <w:i/>
+          <w:color w:val="30608C"/>
+          <w:sz w:val="21"/>
+        </w:rPr>
+        <w:t>Wo ist Ihre Wohnung?</w:t>
+      </w:r>
+      <w:r>
+        <w:rPr>
+          <w:i/>
+          <w:color w:val="404040"/>
+          <w:sz w:val="21"/>
+        </w:rPr>
+        <w:t xml:space="preserve"> (Where is your apartment? [formal you])</w:t>
+      </w:r>
+    </w:p>
+    <w:p>
+      <w:pPr>
+        <w:spacing w:before="0" w:after="0"/>
+      </w:pPr>
     </w:p>
     <w:p>
       <w:pPr>

</xml_diff>

<commit_message>
Add new vocabulary entries for "brauchen" and "der Herr" in vocab.docx and vocab.manifest.json
- Introduced detailed entries for "brauchen" and "der Herr," including glosses, usage notes, and multiple examples in both German and English.
- Both entries are categorized under lesson 1 and level A1, enhancing the vocabulary resource for language learners with practical applications and context.
</commit_message>
<xml_diff>
--- a/vocab.docx
+++ b/vocab.docx
@@ -22,10 +22,10 @@
         <w:rPr>
           <w:b/>
         </w:rPr>
-        <w:t>die Wohnung</w:t>
-      </w:r>
-      <w:r>
-        <w:t xml:space="preserve"> /ˈvoːnʊŋ/</w:t>
+        <w:t>brauchen</w:t>
+      </w:r>
+      <w:r>
+        <w:t xml:space="preserve"> /ˈbʁaʊ̯xən/</w:t>
       </w:r>
     </w:p>
     <w:p>
@@ -34,10 +34,128 @@
         <w:ind w:left="576"/>
       </w:pPr>
       <w:r>
+        <w:t>To need.</w:t>
+      </w:r>
+    </w:p>
+    <w:p>
+      <w:pPr>
+        <w:spacing w:before="40" w:after="60"/>
+        <w:ind w:left="576"/>
+      </w:pPr>
+      <w:r>
+        <w:rPr>
+          <w:i/>
+          <w:color w:val="30608C"/>
+          <w:sz w:val="21"/>
+        </w:rPr>
+        <w:t xml:space="preserve">› </w:t>
+      </w:r>
+      <w:r>
+        <w:rPr>
+          <w:i/>
+          <w:color w:val="30608C"/>
+          <w:sz w:val="21"/>
+        </w:rPr>
+        <w:t>Ich brauche noch Informationen für den Personalbogen.</w:t>
+      </w:r>
+      <w:r>
+        <w:rPr>
+          <w:i/>
+          <w:color w:val="404040"/>
+          <w:sz w:val="21"/>
+        </w:rPr>
+        <w:t xml:space="preserve"> (I still need information for the personal information form.)</w:t>
+      </w:r>
+    </w:p>
+    <w:p>
+      <w:pPr>
+        <w:spacing w:before="0" w:after="60"/>
+        <w:ind w:left="576"/>
+      </w:pPr>
+      <w:r>
+        <w:rPr>
+          <w:i/>
+          <w:color w:val="30608C"/>
+          <w:sz w:val="21"/>
+        </w:rPr>
+        <w:t xml:space="preserve">› </w:t>
+      </w:r>
+      <w:r>
+        <w:rPr>
+          <w:i/>
+          <w:color w:val="30608C"/>
+          <w:sz w:val="21"/>
+        </w:rPr>
+        <w:t>Ich brauche Hilfe.</w:t>
+      </w:r>
+      <w:r>
+        <w:rPr>
+          <w:i/>
+          <w:color w:val="404040"/>
+          <w:sz w:val="21"/>
+        </w:rPr>
+        <w:t xml:space="preserve"> (I need help.)</w:t>
+      </w:r>
+    </w:p>
+    <w:p>
+      <w:pPr>
+        <w:spacing w:before="0" w:after="120"/>
+        <w:ind w:left="576"/>
+      </w:pPr>
+      <w:r>
+        <w:rPr>
+          <w:i/>
+          <w:color w:val="30608C"/>
+          <w:sz w:val="21"/>
+        </w:rPr>
+        <w:t xml:space="preserve">› </w:t>
+      </w:r>
+      <w:r>
+        <w:rPr>
+          <w:i/>
+          <w:color w:val="30608C"/>
+          <w:sz w:val="21"/>
+        </w:rPr>
+        <w:t>Brauchen Sie etwas?</w:t>
+      </w:r>
+      <w:r>
+        <w:rPr>
+          <w:i/>
+          <w:color w:val="404040"/>
+          <w:sz w:val="21"/>
+        </w:rPr>
+        <w:t xml:space="preserve"> (Do you need something? [formal you])</w:t>
+      </w:r>
+    </w:p>
+    <w:p>
+      <w:pPr>
+        <w:spacing w:before="0" w:after="0"/>
+      </w:pPr>
+    </w:p>
+    <w:p>
+      <w:pPr>
+        <w:spacing w:after="120"/>
+      </w:pPr>
+      <w:r>
+        <w:rPr>
+          <w:b/>
+        </w:rPr>
+        <w:t>der Herr</w:t>
+      </w:r>
+      <w:r>
+        <w:t xml:space="preserve"> /hɛʁ/</w:t>
+      </w:r>
+    </w:p>
+    <w:p>
+      <w:pPr>
+        <w:spacing w:after="80"/>
+        <w:ind w:left="576"/>
+      </w:pPr>
+      <w:r>
         <w:rPr>
           <w:sz w:val="22"/>
         </w:rPr>
-        <w:t>die Wohnung, -en</w:t>
+        <w:t>der Herr, -en</w:t>
       </w:r>
     </w:p>
     <w:p>
@@ -46,12 +164,12 @@
         <w:ind w:left="576"/>
       </w:pPr>
       <w:r>
-        <w:t>Apartment; flat.</w:t>
-      </w:r>
-    </w:p>
-    <w:p>
-      <w:pPr>
-        <w:spacing w:before="40" w:after="60"/>
+        <w:t>Mr. before a surname.</w:t>
+      </w:r>
+    </w:p>
+    <w:p>
+      <w:pPr>
+        <w:spacing w:before="40" w:after="120"/>
         <w:ind w:left="576"/>
       </w:pPr>
       <w:r>
@@ -68,45 +186,15 @@
           <w:color w:val="30608C"/>
           <w:sz w:val="21"/>
         </w:rPr>
-        <w:t>Meine Wohnung ist klein.</w:t>
-      </w:r>
-      <w:r>
-        <w:rPr>
-          <w:i/>
-          <w:color w:val="404040"/>
-          <w:sz w:val="21"/>
-        </w:rPr>
-        <w:t xml:space="preserve"> (My apartment is small.)</w:t>
-      </w:r>
-    </w:p>
-    <w:p>
-      <w:pPr>
-        <w:spacing w:before="0" w:after="120"/>
-        <w:ind w:left="576"/>
-      </w:pPr>
-      <w:r>
-        <w:rPr>
-          <w:i/>
-          <w:color w:val="30608C"/>
-          <w:sz w:val="21"/>
-        </w:rPr>
-        <w:t xml:space="preserve">› </w:t>
-      </w:r>
-      <w:r>
-        <w:rPr>
-          <w:i/>
-          <w:color w:val="30608C"/>
-          <w:sz w:val="21"/>
-        </w:rPr>
-        <w:t>Wo ist Ihre Wohnung?</w:t>
-      </w:r>
-      <w:r>
-        <w:rPr>
-          <w:i/>
-          <w:color w:val="404040"/>
-          <w:sz w:val="21"/>
-        </w:rPr>
-        <w:t xml:space="preserve"> (Where is your apartment? [formal you])</w:t>
+        <w:t>Guten Tag Herr Rodriguez. Hier: Jung, Techno Design, Personalbüro.</w:t>
+      </w:r>
+      <w:r>
+        <w:rPr>
+          <w:i/>
+          <w:color w:val="404040"/>
+          <w:sz w:val="21"/>
+        </w:rPr>
+        <w:t xml:space="preserve"> (Good day, Mr. Rodriguez. Here: Jung, Techno Design, personnel office.)</w:t>
       </w:r>
     </w:p>
     <w:p>

</xml_diff>

<commit_message>
Add new vocabulary entries for "die Postleitzahl" and "die Muttersprache" in vocab.docx and vocab.manifest.json
- Introduced detailed entries for "die Postleitzahl" and "die Muttersprache," including glosses, usage notes, and multiple examples in both German and English.
- Both entries are categorized under lesson 1 and level A1, enhancing the vocabulary resource for language learners with practical applications and context.
</commit_message>
<xml_diff>
--- a/vocab.docx
+++ b/vocab.docx
@@ -13,6 +13,190 @@
         </w:rPr>
         <w:t>daf — vocabulary</w:t>
       </w:r>
+    </w:p>
+    <w:p>
+      <w:pPr>
+        <w:spacing w:after="120"/>
+      </w:pPr>
+      <w:r>
+        <w:rPr>
+          <w:b/>
+        </w:rPr>
+        <w:t>die Postleitzahl</w:t>
+      </w:r>
+      <w:r>
+        <w:t xml:space="preserve"> /ˈpɔstlaɪ̯tˌtsaːl/</w:t>
+      </w:r>
+    </w:p>
+    <w:p>
+      <w:pPr>
+        <w:spacing w:after="80"/>
+        <w:ind w:left="576"/>
+      </w:pPr>
+      <w:r>
+        <w:rPr>
+          <w:sz w:val="22"/>
+        </w:rPr>
+        <w:t>die Postleitzahl, -n</w:t>
+      </w:r>
+    </w:p>
+    <w:p>
+      <w:pPr>
+        <w:spacing w:after="80"/>
+        <w:ind w:left="576"/>
+      </w:pPr>
+      <w:r>
+        <w:t>Postal code; ZIP code.</w:t>
+      </w:r>
+    </w:p>
+    <w:p>
+      <w:pPr>
+        <w:spacing w:before="40" w:after="60"/>
+        <w:ind w:left="576"/>
+      </w:pPr>
+      <w:r>
+        <w:rPr>
+          <w:i/>
+          <w:color w:val="30608C"/>
+          <w:sz w:val="21"/>
+        </w:rPr>
+        <w:t xml:space="preserve">› </w:t>
+      </w:r>
+      <w:r>
+        <w:rPr>
+          <w:i/>
+          <w:color w:val="30608C"/>
+          <w:sz w:val="21"/>
+        </w:rPr>
+        <w:t>Wie ist Ihre Postleitzahl?</w:t>
+      </w:r>
+      <w:r>
+        <w:rPr>
+          <w:i/>
+          <w:color w:val="404040"/>
+          <w:sz w:val="21"/>
+        </w:rPr>
+        <w:t xml:space="preserve"> (What is your postal code? [formal you])</w:t>
+      </w:r>
+    </w:p>
+    <w:p>
+      <w:pPr>
+        <w:spacing w:before="0" w:after="120"/>
+        <w:ind w:left="576"/>
+      </w:pPr>
+      <w:r>
+        <w:rPr>
+          <w:i/>
+          <w:color w:val="30608C"/>
+          <w:sz w:val="21"/>
+        </w:rPr>
+        <w:t xml:space="preserve">› </w:t>
+      </w:r>
+      <w:r>
+        <w:rPr>
+          <w:i/>
+          <w:color w:val="30608C"/>
+          <w:sz w:val="21"/>
+        </w:rPr>
+        <w:t>Meine Postleitzahl ist 80331.</w:t>
+      </w:r>
+      <w:r>
+        <w:rPr>
+          <w:i/>
+          <w:color w:val="404040"/>
+          <w:sz w:val="21"/>
+        </w:rPr>
+        <w:t xml:space="preserve"> (My postal code is 80331.)</w:t>
+      </w:r>
+    </w:p>
+    <w:p>
+      <w:pPr>
+        <w:spacing w:before="0" w:after="0"/>
+      </w:pPr>
+    </w:p>
+    <w:p>
+      <w:pPr>
+        <w:spacing w:after="120"/>
+      </w:pPr>
+      <w:r>
+        <w:rPr>
+          <w:b/>
+        </w:rPr>
+        <w:t>die Muttersprache</w:t>
+      </w:r>
+      <w:r>
+        <w:t xml:space="preserve"> /ˈmʊtɐˌʃpʁaːxə/</w:t>
+      </w:r>
+    </w:p>
+    <w:p>
+      <w:pPr>
+        <w:spacing w:after="80"/>
+        <w:ind w:left="576"/>
+      </w:pPr>
+      <w:r>
+        <w:rPr>
+          <w:sz w:val="22"/>
+        </w:rPr>
+        <w:t>die Muttersprache, -n</w:t>
+      </w:r>
+    </w:p>
+    <w:p>
+      <w:pPr>
+        <w:spacing w:after="80"/>
+        <w:ind w:left="576"/>
+      </w:pPr>
+      <w:r>
+        <w:t>Native language; mother tongue.</w:t>
+      </w:r>
+    </w:p>
+    <w:p>
+      <w:pPr>
+        <w:spacing w:after="80"/>
+        <w:ind w:left="576"/>
+      </w:pPr>
+      <w:r>
+        <w:rPr>
+          <w:i/>
+          <w:color w:val="404040"/>
+          <w:sz w:val="20"/>
+        </w:rPr>
+        <w:t>• Compound noun: die Mutter + die Sprache. The last noun decides the gender: die Sprache → die Muttersprache.</w:t>
+      </w:r>
+    </w:p>
+    <w:p>
+      <w:pPr>
+        <w:spacing w:before="40" w:after="120"/>
+        <w:ind w:left="576"/>
+      </w:pPr>
+      <w:r>
+        <w:rPr>
+          <w:i/>
+          <w:color w:val="30608C"/>
+          <w:sz w:val="21"/>
+        </w:rPr>
+        <w:t xml:space="preserve">› </w:t>
+      </w:r>
+      <w:r>
+        <w:rPr>
+          <w:i/>
+          <w:color w:val="30608C"/>
+          <w:sz w:val="21"/>
+        </w:rPr>
+        <w:t>Danke. Und welche Sprachen sprechen Sie? Meine Muttersprache ist Spanisch und dann spreche ich noch Deutsch und Englisch.</w:t>
+      </w:r>
+      <w:r>
+        <w:rPr>
+          <w:i/>
+          <w:color w:val="404040"/>
+          <w:sz w:val="21"/>
+        </w:rPr>
+        <w:t xml:space="preserve"> (Thank you. And which languages do you speak? My native language is Spanish, and I also speak German and English. [formal you])</w:t>
+      </w:r>
+    </w:p>
+    <w:p>
+      <w:pPr>
+        <w:spacing w:before="0" w:after="0"/>
+      </w:pPr>
     </w:p>
     <w:p>
       <w:pPr>

</xml_diff>

<commit_message>
Add new vocabulary entry for "genau" in vocab.docx and vocab.manifest.json
- Introduced a detailed entry for "genau," including gloss, usage notes, and an example in both German and English.
- Updated the entry for "der Herr" to include an additional example, enhancing the vocabulary resource for language learners with practical applications and context.
</commit_message>
<xml_diff>
--- a/vocab.docx
+++ b/vocab.docx
@@ -22,6 +22,64 @@
         <w:rPr>
           <w:b/>
         </w:rPr>
+        <w:t>genau</w:t>
+      </w:r>
+      <w:r>
+        <w:t xml:space="preserve"> /ɡəˈnaʊ̯/</w:t>
+      </w:r>
+    </w:p>
+    <w:p>
+      <w:pPr>
+        <w:spacing w:after="80"/>
+        <w:ind w:left="576"/>
+      </w:pPr>
+      <w:r>
+        <w:t>Exactly; that's right.</w:t>
+      </w:r>
+    </w:p>
+    <w:p>
+      <w:pPr>
+        <w:spacing w:before="40" w:after="120"/>
+        <w:ind w:left="576"/>
+      </w:pPr>
+      <w:r>
+        <w:rPr>
+          <w:i/>
+          <w:color w:val="30608C"/>
+          <w:sz w:val="21"/>
+        </w:rPr>
+        <w:t xml:space="preserve">› </w:t>
+      </w:r>
+      <w:r>
+        <w:rPr>
+          <w:i/>
+          <w:color w:val="30608C"/>
+          <w:sz w:val="21"/>
+        </w:rPr>
+        <w:t>Also Telefon: 0621 / 34421. Ja, genau.</w:t>
+      </w:r>
+      <w:r>
+        <w:rPr>
+          <w:i/>
+          <w:color w:val="404040"/>
+          <w:sz w:val="21"/>
+        </w:rPr>
+        <w:t xml:space="preserve"> (So the phone number is 0621 / 34421. Yes, exactly.)</w:t>
+      </w:r>
+    </w:p>
+    <w:p>
+      <w:pPr>
+        <w:spacing w:before="0" w:after="0"/>
+      </w:pPr>
+    </w:p>
+    <w:p>
+      <w:pPr>
+        <w:spacing w:after="120"/>
+      </w:pPr>
+      <w:r>
+        <w:rPr>
+          <w:b/>
+        </w:rPr>
         <w:t>die Postleitzahl</w:t>
       </w:r>
       <w:r>
@@ -370,15 +428,15 @@
           <w:color w:val="30608C"/>
           <w:sz w:val="21"/>
         </w:rPr>
-        <w:t>Guten Tag Herr Rodriguez. Hier: Jung, Techno Design, Personalbüro.</w:t>
-      </w:r>
-      <w:r>
-        <w:rPr>
-          <w:i/>
-          <w:color w:val="404040"/>
-          <w:sz w:val="21"/>
-        </w:rPr>
-        <w:t xml:space="preserve"> (Good day, Mr. Rodriguez. Here: Jung, Techno Design, personnel office.)</w:t>
+        <w:t>Guten Tag Herr Rodriguez. Hier: Jung, Techno Design, Personalbüro. Wie schreibt man bitte “Rodriguez”?</w:t>
+      </w:r>
+      <w:r>
+        <w:rPr>
+          <w:i/>
+          <w:color w:val="404040"/>
+          <w:sz w:val="21"/>
+        </w:rPr>
+        <w:t xml:space="preserve"> (Good day, Mr. Rodriguez. Here: Jung, Techno Design, personnel office. How do you write “Rodriguez” please?)</w:t>
       </w:r>
     </w:p>
     <w:p>

</xml_diff>

<commit_message>
Add new vocabulary entry for "die E-Mail-Adresse" in vocab.docx and vocab.manifest.json
- Introduced a detailed entry for "die E-Mail-Adresse," including gloss, usage notes, and multiple examples in both German and English.
- The entry is categorized under lesson 1 and level A1, enhancing the vocabulary resource for language learners with practical applications and context.
</commit_message>
<xml_diff>
--- a/vocab.docx
+++ b/vocab.docx
@@ -13,6 +13,178 @@
         </w:rPr>
         <w:t>daf — vocabulary</w:t>
       </w:r>
+    </w:p>
+    <w:p>
+      <w:pPr>
+        <w:spacing w:after="120"/>
+      </w:pPr>
+      <w:r>
+        <w:rPr>
+          <w:b/>
+        </w:rPr>
+        <w:t>die E-Mail-Adresse</w:t>
+      </w:r>
+      <w:r>
+        <w:t xml:space="preserve"> /ˈiːmeːl aˈdʁɛsə/</w:t>
+      </w:r>
+    </w:p>
+    <w:p>
+      <w:pPr>
+        <w:spacing w:after="80"/>
+        <w:ind w:left="576"/>
+      </w:pPr>
+      <w:r>
+        <w:rPr>
+          <w:sz w:val="22"/>
+        </w:rPr>
+        <w:t>die E-Mail-Adresse, -n</w:t>
+      </w:r>
+    </w:p>
+    <w:p>
+      <w:pPr>
+        <w:spacing w:after="80"/>
+        <w:ind w:left="576"/>
+      </w:pPr>
+      <w:r>
+        <w:t>Email address.</w:t>
+      </w:r>
+    </w:p>
+    <w:p>
+      <w:pPr>
+        <w:spacing w:after="80"/>
+        <w:ind w:left="576"/>
+      </w:pPr>
+      <w:r>
+        <w:rPr>
+          <w:i/>
+          <w:color w:val="404040"/>
+          <w:sz w:val="20"/>
+        </w:rPr>
+        <w:t>• Compound: E-Mail + Adresse. Gender from die Adresse → die E-Mail-Adresse.</w:t>
+      </w:r>
+    </w:p>
+    <w:p>
+      <w:pPr>
+        <w:spacing w:after="80"/>
+        <w:ind w:left="576"/>
+      </w:pPr>
+      <w:r>
+        <w:rPr>
+          <w:i/>
+          <w:color w:val="404040"/>
+          <w:sz w:val="20"/>
+        </w:rPr>
+        <w:t>• Hyphens mark the borrowed chunk E-Mail (English import); native pairs like Postadresse are one word.</w:t>
+      </w:r>
+    </w:p>
+    <w:p>
+      <w:pPr>
+        <w:spacing w:after="80"/>
+        <w:ind w:left="576"/>
+      </w:pPr>
+      <w:r>
+        <w:rPr>
+          <w:i/>
+          <w:color w:val="404040"/>
+          <w:sz w:val="20"/>
+        </w:rPr>
+        <w:t>• Informal shorthand: Mail-Adresse; Duden standard for the thing itself is E-Mail.</w:t>
+      </w:r>
+    </w:p>
+    <w:p>
+      <w:pPr>
+        <w:spacing w:before="40" w:after="60"/>
+        <w:ind w:left="576"/>
+      </w:pPr>
+      <w:r>
+        <w:rPr>
+          <w:i/>
+          <w:color w:val="30608C"/>
+          <w:sz w:val="21"/>
+        </w:rPr>
+        <w:t xml:space="preserve">› </w:t>
+      </w:r>
+      <w:r>
+        <w:rPr>
+          <w:i/>
+          <w:color w:val="30608C"/>
+          <w:sz w:val="21"/>
+        </w:rPr>
+        <w:t>Wie ist Ihre E-Mail-Adresse?</w:t>
+      </w:r>
+      <w:r>
+        <w:rPr>
+          <w:i/>
+          <w:color w:val="404040"/>
+          <w:sz w:val="21"/>
+        </w:rPr>
+        <w:t xml:space="preserve"> (What is your email address? [formal you])</w:t>
+      </w:r>
+    </w:p>
+    <w:p>
+      <w:pPr>
+        <w:spacing w:before="0" w:after="60"/>
+        <w:ind w:left="576"/>
+      </w:pPr>
+      <w:r>
+        <w:rPr>
+          <w:i/>
+          <w:color w:val="30608C"/>
+          <w:sz w:val="21"/>
+        </w:rPr>
+        <w:t xml:space="preserve">› </w:t>
+      </w:r>
+      <w:r>
+        <w:rPr>
+          <w:i/>
+          <w:color w:val="30608C"/>
+          <w:sz w:val="21"/>
+        </w:rPr>
+        <w:t>Wie schreibt man „carlos.rodriguez@technodesign.de“?</w:t>
+      </w:r>
+      <w:r>
+        <w:rPr>
+          <w:i/>
+          <w:color w:val="404040"/>
+          <w:sz w:val="21"/>
+        </w:rPr>
+        <w:t xml:space="preserve"> (How do you spell "carlos.rodriguez@technodesign.de"?)</w:t>
+      </w:r>
+    </w:p>
+    <w:p>
+      <w:pPr>
+        <w:spacing w:before="0" w:after="120"/>
+        <w:ind w:left="576"/>
+      </w:pPr>
+      <w:r>
+        <w:rPr>
+          <w:i/>
+          <w:color w:val="30608C"/>
+          <w:sz w:val="21"/>
+        </w:rPr>
+        <w:t xml:space="preserve">› </w:t>
+      </w:r>
+      <w:r>
+        <w:rPr>
+          <w:i/>
+          <w:color w:val="30608C"/>
+          <w:sz w:val="21"/>
+        </w:rPr>
+        <w:t>Meine E-Mail-Adresse steht im Personalbogen.</w:t>
+      </w:r>
+      <w:r>
+        <w:rPr>
+          <w:i/>
+          <w:color w:val="404040"/>
+          <w:sz w:val="21"/>
+        </w:rPr>
+        <w:t xml:space="preserve"> (My email address is on the personal information form.)</w:t>
+      </w:r>
+    </w:p>
+    <w:p>
+      <w:pPr>
+        <w:spacing w:before="0" w:after="0"/>
+      </w:pPr>
     </w:p>
     <w:p>
       <w:pPr>

</xml_diff>

<commit_message>
Add new vocabulary entries for "vielen Dank," "Auf Wiederhören," and "der Wohnort" in vocab.docx and vocab.manifest.json
- Introduced detailed entries for "vielen Dank," "Auf Wiederhören," and "der Wohnort," including glosses, usage notes, and multiple examples in both German and English.
- All entries are categorized under lesson 1 and level A1, enhancing the vocabulary resource for language learners with practical applications and context.
</commit_message>
<xml_diff>
--- a/vocab.docx
+++ b/vocab.docx
@@ -13,6 +13,424 @@
         </w:rPr>
         <w:t>daf — vocabulary</w:t>
       </w:r>
+    </w:p>
+    <w:p>
+      <w:pPr>
+        <w:spacing w:after="120"/>
+      </w:pPr>
+      <w:r>
+        <w:rPr>
+          <w:b/>
+        </w:rPr>
+        <w:t>vielen Dank</w:t>
+      </w:r>
+      <w:r>
+        <w:t xml:space="preserve"> /ˈfiːlən ˈdaŋk/</w:t>
+      </w:r>
+    </w:p>
+    <w:p>
+      <w:pPr>
+        <w:spacing w:after="80"/>
+        <w:ind w:left="576"/>
+      </w:pPr>
+      <w:r>
+        <w:t>Thank you very much.</w:t>
+      </w:r>
+    </w:p>
+    <w:p>
+      <w:pPr>
+        <w:spacing w:after="80"/>
+        <w:ind w:left="576"/>
+      </w:pPr>
+      <w:r>
+        <w:rPr>
+          <w:i/>
+          <w:color w:val="404040"/>
+          <w:sz w:val="20"/>
+        </w:rPr>
+        <w:t>• Danke alone is a fixed thanks-word — like saying thanks with no visible noun. vielen Dank is the full phrase: der Dank (masculine noun) = thanks, gratitude.</w:t>
+      </w:r>
+    </w:p>
+    <w:p>
+      <w:pPr>
+        <w:spacing w:after="80"/>
+        <w:ind w:left="576"/>
+      </w:pPr>
+      <w:r>
+        <w:rPr>
+          <w:i/>
+          <w:color w:val="404040"/>
+          <w:sz w:val="20"/>
+        </w:rPr>
+        <w:t>• vielen is dative of viel (much). With abstract nouns like Dank, Spaß, Glück, viel often takes dative: vielen Dank, viel Spaß, viel Glück.</w:t>
+      </w:r>
+    </w:p>
+    <w:p>
+      <w:pPr>
+        <w:spacing w:after="80"/>
+        <w:ind w:left="576"/>
+      </w:pPr>
+      <w:r>
+        <w:rPr>
+          <w:i/>
+          <w:color w:val="404040"/>
+          <w:sz w:val="20"/>
+        </w:rPr>
+        <w:t>• Same word family as Danke, but fuller and slightly more formal; typical at the end of a phone call.</w:t>
+      </w:r>
+    </w:p>
+    <w:p>
+      <w:pPr>
+        <w:spacing w:before="40" w:after="60"/>
+        <w:ind w:left="576"/>
+      </w:pPr>
+      <w:r>
+        <w:rPr>
+          <w:i/>
+          <w:color w:val="30608C"/>
+          <w:sz w:val="21"/>
+        </w:rPr>
+        <w:t xml:space="preserve">› </w:t>
+      </w:r>
+      <w:r>
+        <w:rPr>
+          <w:i/>
+          <w:color w:val="30608C"/>
+          <w:sz w:val="21"/>
+        </w:rPr>
+        <w:t>Vielen Dank.</w:t>
+      </w:r>
+      <w:r>
+        <w:rPr>
+          <w:i/>
+          <w:color w:val="404040"/>
+          <w:sz w:val="21"/>
+        </w:rPr>
+        <w:t xml:space="preserve"> (Thank you very much.)</w:t>
+      </w:r>
+    </w:p>
+    <w:p>
+      <w:pPr>
+        <w:spacing w:before="0" w:after="120"/>
+        <w:ind w:left="576"/>
+      </w:pPr>
+      <w:r>
+        <w:rPr>
+          <w:i/>
+          <w:color w:val="30608C"/>
+          <w:sz w:val="21"/>
+        </w:rPr>
+        <w:t xml:space="preserve">› </w:t>
+      </w:r>
+      <w:r>
+        <w:rPr>
+          <w:i/>
+          <w:color w:val="30608C"/>
+          <w:sz w:val="21"/>
+        </w:rPr>
+        <w:t>Vielen Dank. Auf Wiederhören.</w:t>
+      </w:r>
+      <w:r>
+        <w:rPr>
+          <w:i/>
+          <w:color w:val="404040"/>
+          <w:sz w:val="21"/>
+        </w:rPr>
+        <w:t xml:space="preserve"> (Thank you very much. Goodbye. [on the phone])</w:t>
+      </w:r>
+    </w:p>
+    <w:p>
+      <w:pPr>
+        <w:spacing w:before="0" w:after="0"/>
+      </w:pPr>
+    </w:p>
+    <w:p>
+      <w:pPr>
+        <w:spacing w:after="120"/>
+      </w:pPr>
+      <w:r>
+        <w:rPr>
+          <w:b/>
+        </w:rPr>
+        <w:t>Auf Wiederhören!</w:t>
+      </w:r>
+      <w:r>
+        <w:t xml:space="preserve"> /aʊf ˈviːdɐˌhøːʁən/</w:t>
+      </w:r>
+    </w:p>
+    <w:p>
+      <w:pPr>
+        <w:spacing w:after="80"/>
+        <w:ind w:left="576"/>
+      </w:pPr>
+      <w:r>
+        <w:t>Goodbye on the phone.</w:t>
+      </w:r>
+    </w:p>
+    <w:p>
+      <w:pPr>
+        <w:spacing w:after="80"/>
+        <w:ind w:left="576"/>
+      </w:pPr>
+      <w:r>
+        <w:rPr>
+          <w:i/>
+          <w:color w:val="404040"/>
+          <w:sz w:val="20"/>
+        </w:rPr>
+        <w:t>• Phone goodbye only; in person use Auf Wiedersehen.</w:t>
+      </w:r>
+    </w:p>
+    <w:p>
+      <w:pPr>
+        <w:spacing w:after="80"/>
+        <w:ind w:left="576"/>
+      </w:pPr>
+      <w:r>
+        <w:rPr>
+          <w:i/>
+          <w:color w:val="404040"/>
+          <w:sz w:val="20"/>
+        </w:rPr>
+        <w:t>• auf + accusative: until the next time; wieder + hören: hear (each other) again.</w:t>
+      </w:r>
+    </w:p>
+    <w:p>
+      <w:pPr>
+        <w:spacing w:before="40" w:after="60"/>
+        <w:ind w:left="576"/>
+      </w:pPr>
+      <w:r>
+        <w:rPr>
+          <w:i/>
+          <w:color w:val="30608C"/>
+          <w:sz w:val="21"/>
+        </w:rPr>
+        <w:t xml:space="preserve">› </w:t>
+      </w:r>
+      <w:r>
+        <w:rPr>
+          <w:i/>
+          <w:color w:val="30608C"/>
+          <w:sz w:val="21"/>
+        </w:rPr>
+        <w:t>Vielen Dank. Auf Wiederhören.</w:t>
+      </w:r>
+      <w:r>
+        <w:rPr>
+          <w:i/>
+          <w:color w:val="404040"/>
+          <w:sz w:val="21"/>
+        </w:rPr>
+        <w:t xml:space="preserve"> (Thank you very much. Goodbye. [on the phone])</w:t>
+      </w:r>
+    </w:p>
+    <w:p>
+      <w:pPr>
+        <w:spacing w:before="0" w:after="120"/>
+        <w:ind w:left="576"/>
+      </w:pPr>
+      <w:r>
+        <w:rPr>
+          <w:i/>
+          <w:color w:val="30608C"/>
+          <w:sz w:val="21"/>
+        </w:rPr>
+        <w:t xml:space="preserve">› </w:t>
+      </w:r>
+      <w:r>
+        <w:rPr>
+          <w:i/>
+          <w:color w:val="30608C"/>
+          <w:sz w:val="21"/>
+        </w:rPr>
+        <w:t>Auf Wiederhören!</w:t>
+      </w:r>
+      <w:r>
+        <w:rPr>
+          <w:i/>
+          <w:color w:val="404040"/>
+          <w:sz w:val="21"/>
+        </w:rPr>
+        <w:t xml:space="preserve"> (Goodbye! [on the phone])</w:t>
+      </w:r>
+    </w:p>
+    <w:p>
+      <w:pPr>
+        <w:spacing w:before="0" w:after="0"/>
+      </w:pPr>
+    </w:p>
+    <w:p>
+      <w:pPr>
+        <w:spacing w:after="120"/>
+      </w:pPr>
+      <w:r>
+        <w:rPr>
+          <w:b/>
+        </w:rPr>
+        <w:t>der Wohnort</w:t>
+      </w:r>
+      <w:r>
+        <w:t xml:space="preserve"> /ˈvoːnˌɔʁt/</w:t>
+      </w:r>
+    </w:p>
+    <w:p>
+      <w:pPr>
+        <w:spacing w:after="80"/>
+        <w:ind w:left="576"/>
+      </w:pPr>
+      <w:r>
+        <w:rPr>
+          <w:sz w:val="22"/>
+        </w:rPr>
+        <w:t>der Wohnort, -e</w:t>
+      </w:r>
+    </w:p>
+    <w:p>
+      <w:pPr>
+        <w:spacing w:after="80"/>
+        <w:ind w:left="576"/>
+      </w:pPr>
+      <w:r>
+        <w:t>Place of residence; city or town where someone lives.</w:t>
+      </w:r>
+    </w:p>
+    <w:p>
+      <w:pPr>
+        <w:spacing w:after="80"/>
+        <w:ind w:left="576"/>
+      </w:pPr>
+      <w:r>
+        <w:rPr>
+          <w:i/>
+          <w:color w:val="404040"/>
+          <w:sz w:val="20"/>
+        </w:rPr>
+        <w:t>• Compound noun: wohnen + der Ort. Gender from der Ort → der Wohnort.</w:t>
+      </w:r>
+    </w:p>
+    <w:p>
+      <w:pPr>
+        <w:spacing w:after="80"/>
+        <w:ind w:left="576"/>
+      </w:pPr>
+      <w:r>
+        <w:rPr>
+          <w:i/>
+          <w:color w:val="404040"/>
+          <w:sz w:val="20"/>
+        </w:rPr>
+        <w:t>• On forms like der Personalbogen, Wohnort is usually the city or town, not the full street address.</w:t>
+      </w:r>
+    </w:p>
+    <w:p>
+      <w:pPr>
+        <w:spacing w:after="80"/>
+        <w:ind w:left="576"/>
+      </w:pPr>
+      <w:r>
+        <w:rPr>
+          <w:i/>
+          <w:color w:val="404040"/>
+          <w:sz w:val="20"/>
+        </w:rPr>
+        <w:t>• Compare Wo wohnen Sie? (where do you live?) with Wie ist Ihr Wohnort? (what is your place of residence?).</w:t>
+      </w:r>
+    </w:p>
+    <w:p>
+      <w:pPr>
+        <w:spacing w:before="40" w:after="60"/>
+        <w:ind w:left="576"/>
+      </w:pPr>
+      <w:r>
+        <w:rPr>
+          <w:i/>
+          <w:color w:val="30608C"/>
+          <w:sz w:val="21"/>
+        </w:rPr>
+        <w:t xml:space="preserve">› </w:t>
+      </w:r>
+      <w:r>
+        <w:rPr>
+          <w:i/>
+          <w:color w:val="30608C"/>
+          <w:sz w:val="21"/>
+        </w:rPr>
+        <w:t>Wie ist Ihr Wohnort?</w:t>
+      </w:r>
+      <w:r>
+        <w:rPr>
+          <w:i/>
+          <w:color w:val="404040"/>
+          <w:sz w:val="21"/>
+        </w:rPr>
+        <w:t xml:space="preserve"> (What is your place of residence? [formal you])</w:t>
+      </w:r>
+    </w:p>
+    <w:p>
+      <w:pPr>
+        <w:spacing w:before="0" w:after="60"/>
+        <w:ind w:left="576"/>
+      </w:pPr>
+      <w:r>
+        <w:rPr>
+          <w:i/>
+          <w:color w:val="30608C"/>
+          <w:sz w:val="21"/>
+        </w:rPr>
+        <w:t xml:space="preserve">› </w:t>
+      </w:r>
+      <w:r>
+        <w:rPr>
+          <w:i/>
+          <w:color w:val="30608C"/>
+          <w:sz w:val="21"/>
+        </w:rPr>
+        <w:t>Mein Wohnort ist Mannheim.</w:t>
+      </w:r>
+      <w:r>
+        <w:rPr>
+          <w:i/>
+          <w:color w:val="404040"/>
+          <w:sz w:val="21"/>
+        </w:rPr>
+        <w:t xml:space="preserve"> (My place of residence is Mannheim.)</w:t>
+      </w:r>
+    </w:p>
+    <w:p>
+      <w:pPr>
+        <w:spacing w:before="0" w:after="120"/>
+        <w:ind w:left="576"/>
+      </w:pPr>
+      <w:r>
+        <w:rPr>
+          <w:i/>
+          <w:color w:val="30608C"/>
+          <w:sz w:val="21"/>
+        </w:rPr>
+        <w:t xml:space="preserve">› </w:t>
+      </w:r>
+      <w:r>
+        <w:rPr>
+          <w:i/>
+          <w:color w:val="30608C"/>
+          <w:sz w:val="21"/>
+        </w:rPr>
+        <w:t>Der Wohnort steht im Personalbogen.</w:t>
+      </w:r>
+      <w:r>
+        <w:rPr>
+          <w:i/>
+          <w:color w:val="404040"/>
+          <w:sz w:val="21"/>
+        </w:rPr>
+        <w:t xml:space="preserve"> (The place of residence is on the personal information form.)</w:t>
+      </w:r>
+    </w:p>
+    <w:p>
+      <w:pPr>
+        <w:spacing w:before="0" w:after="0"/>
+      </w:pPr>
     </w:p>
     <w:p>
       <w:pPr>

</xml_diff>

<commit_message>
Add new vocabulary entries for "Bitte" and "gern geschehen" in vocab.docx and vocab.manifest.json
- Introduced detailed entries for "Bitte" and "gern geschehen," including glosses, usage notes, and multiple examples in both German and English.
- Both entries are categorized under lesson 1 and level A1, enhancing the vocabulary resource for language learners with practical applications and context.
</commit_message>
<xml_diff>
--- a/vocab.docx
+++ b/vocab.docx
@@ -13,6 +13,282 @@
         </w:rPr>
         <w:t>daf — vocabulary</w:t>
       </w:r>
+    </w:p>
+    <w:p>
+      <w:pPr>
+        <w:spacing w:after="120"/>
+      </w:pPr>
+      <w:r>
+        <w:rPr>
+          <w:b/>
+        </w:rPr>
+        <w:t>Bitte</w:t>
+      </w:r>
+      <w:r>
+        <w:t xml:space="preserve"> /ˈbɪtə/</w:t>
+      </w:r>
+    </w:p>
+    <w:p>
+      <w:pPr>
+        <w:spacing w:after="80"/>
+        <w:ind w:left="576"/>
+      </w:pPr>
+      <w:r>
+        <w:t>Please; you're welcome; here you go.</w:t>
+      </w:r>
+    </w:p>
+    <w:p>
+      <w:pPr>
+        <w:spacing w:after="80"/>
+        <w:ind w:left="576"/>
+      </w:pPr>
+      <w:r>
+        <w:rPr>
+          <w:i/>
+          <w:color w:val="404040"/>
+          <w:sz w:val="20"/>
+        </w:rPr>
+        <w:t>• Bitte has several jobs: please in a request (Noch einmal, bitte), you're welcome after thanks, here you go when handing something over, and pardon? in Wie bitte?</w:t>
+      </w:r>
+    </w:p>
+    <w:p>
+      <w:pPr>
+        <w:spacing w:after="80"/>
+        <w:ind w:left="576"/>
+      </w:pPr>
+      <w:r>
+        <w:rPr>
+          <w:i/>
+          <w:color w:val="404040"/>
+          <w:sz w:val="20"/>
+        </w:rPr>
+        <w:t>• In Bitte, gern geschehen, Bitte opens a polite reply to thanks — like don't mention it.</w:t>
+      </w:r>
+    </w:p>
+    <w:p>
+      <w:pPr>
+        <w:spacing w:before="40" w:after="60"/>
+        <w:ind w:left="576"/>
+      </w:pPr>
+      <w:r>
+        <w:rPr>
+          <w:i/>
+          <w:color w:val="30608C"/>
+          <w:sz w:val="21"/>
+        </w:rPr>
+        <w:t xml:space="preserve">› </w:t>
+      </w:r>
+      <w:r>
+        <w:rPr>
+          <w:i/>
+          <w:color w:val="30608C"/>
+          <w:sz w:val="21"/>
+        </w:rPr>
+        <w:t>Bitte, gern geschehen.</w:t>
+      </w:r>
+      <w:r>
+        <w:rPr>
+          <w:i/>
+          <w:color w:val="404040"/>
+          <w:sz w:val="21"/>
+        </w:rPr>
+        <w:t xml:space="preserve"> (You're welcome. / My pleasure.)</w:t>
+      </w:r>
+    </w:p>
+    <w:p>
+      <w:pPr>
+        <w:spacing w:before="0" w:after="60"/>
+        <w:ind w:left="576"/>
+      </w:pPr>
+      <w:r>
+        <w:rPr>
+          <w:i/>
+          <w:color w:val="30608C"/>
+          <w:sz w:val="21"/>
+        </w:rPr>
+        <w:t xml:space="preserve">› </w:t>
+      </w:r>
+      <w:r>
+        <w:rPr>
+          <w:i/>
+          <w:color w:val="30608C"/>
+          <w:sz w:val="21"/>
+        </w:rPr>
+        <w:t>Noch einmal, bitte.</w:t>
+      </w:r>
+      <w:r>
+        <w:rPr>
+          <w:i/>
+          <w:color w:val="404040"/>
+          <w:sz w:val="21"/>
+        </w:rPr>
+        <w:t xml:space="preserve"> (Once more, please.)</w:t>
+      </w:r>
+    </w:p>
+    <w:p>
+      <w:pPr>
+        <w:spacing w:before="0" w:after="120"/>
+        <w:ind w:left="576"/>
+      </w:pPr>
+      <w:r>
+        <w:rPr>
+          <w:i/>
+          <w:color w:val="30608C"/>
+          <w:sz w:val="21"/>
+        </w:rPr>
+        <w:t xml:space="preserve">› </w:t>
+      </w:r>
+      <w:r>
+        <w:rPr>
+          <w:i/>
+          <w:color w:val="30608C"/>
+          <w:sz w:val="21"/>
+        </w:rPr>
+        <w:t>Bitte schön!</w:t>
+      </w:r>
+      <w:r>
+        <w:rPr>
+          <w:i/>
+          <w:color w:val="404040"/>
+          <w:sz w:val="21"/>
+        </w:rPr>
+        <w:t xml:space="preserve"> (Here you are! / You're welcome!)</w:t>
+      </w:r>
+    </w:p>
+    <w:p>
+      <w:pPr>
+        <w:spacing w:before="0" w:after="0"/>
+      </w:pPr>
+    </w:p>
+    <w:p>
+      <w:pPr>
+        <w:spacing w:after="120"/>
+      </w:pPr>
+      <w:r>
+        <w:rPr>
+          <w:b/>
+        </w:rPr>
+        <w:t>gern geschehen</w:t>
+      </w:r>
+      <w:r>
+        <w:t xml:space="preserve"> /ɡɛʁn ɡəˈʃeːən/</w:t>
+      </w:r>
+    </w:p>
+    <w:p>
+      <w:pPr>
+        <w:spacing w:after="80"/>
+        <w:ind w:left="576"/>
+      </w:pPr>
+      <w:r>
+        <w:t>You're welcome; my pleasure.</w:t>
+      </w:r>
+    </w:p>
+    <w:p>
+      <w:pPr>
+        <w:spacing w:after="80"/>
+        <w:ind w:left="576"/>
+      </w:pPr>
+      <w:r>
+        <w:rPr>
+          <w:i/>
+          <w:color w:val="404040"/>
+          <w:sz w:val="20"/>
+        </w:rPr>
+        <w:t>• Fixed reply to Danke or vielen Dank — common in formal speech and on the phone.</w:t>
+      </w:r>
+    </w:p>
+    <w:p>
+      <w:pPr>
+        <w:spacing w:after="80"/>
+        <w:ind w:left="576"/>
+      </w:pPr>
+      <w:r>
+        <w:rPr>
+          <w:i/>
+          <w:color w:val="404040"/>
+          <w:sz w:val="20"/>
+        </w:rPr>
+        <w:t>• gern = gladly; geschehen = to happen — literally it happened gladly, i.e. I was glad to do it.</w:t>
+      </w:r>
+    </w:p>
+    <w:p>
+      <w:pPr>
+        <w:spacing w:after="80"/>
+        <w:ind w:left="576"/>
+      </w:pPr>
+      <w:r>
+        <w:rPr>
+          <w:i/>
+          <w:color w:val="404040"/>
+          <w:sz w:val="20"/>
+        </w:rPr>
+        <w:t>• gern is already in the deck; here it combines with geschehen as one set phrase.</w:t>
+      </w:r>
+    </w:p>
+    <w:p>
+      <w:pPr>
+        <w:spacing w:before="40" w:after="60"/>
+        <w:ind w:left="576"/>
+      </w:pPr>
+      <w:r>
+        <w:rPr>
+          <w:i/>
+          <w:color w:val="30608C"/>
+          <w:sz w:val="21"/>
+        </w:rPr>
+        <w:t xml:space="preserve">› </w:t>
+      </w:r>
+      <w:r>
+        <w:rPr>
+          <w:i/>
+          <w:color w:val="30608C"/>
+          <w:sz w:val="21"/>
+        </w:rPr>
+        <w:t>Bitte, gern geschehen.</w:t>
+      </w:r>
+      <w:r>
+        <w:rPr>
+          <w:i/>
+          <w:color w:val="404040"/>
+          <w:sz w:val="21"/>
+        </w:rPr>
+        <w:t xml:space="preserve"> (You're welcome. / My pleasure.)</w:t>
+      </w:r>
+    </w:p>
+    <w:p>
+      <w:pPr>
+        <w:spacing w:before="0" w:after="120"/>
+        <w:ind w:left="576"/>
+      </w:pPr>
+      <w:r>
+        <w:rPr>
+          <w:i/>
+          <w:color w:val="30608C"/>
+          <w:sz w:val="21"/>
+        </w:rPr>
+        <w:t xml:space="preserve">› </w:t>
+      </w:r>
+      <w:r>
+        <w:rPr>
+          <w:i/>
+          <w:color w:val="30608C"/>
+          <w:sz w:val="21"/>
+        </w:rPr>
+        <w:t>Gern geschehen!</w:t>
+      </w:r>
+      <w:r>
+        <w:rPr>
+          <w:i/>
+          <w:color w:val="404040"/>
+          <w:sz w:val="21"/>
+        </w:rPr>
+        <w:t xml:space="preserve"> (My pleasure!)</w:t>
+      </w:r>
+    </w:p>
+    <w:p>
+      <w:pPr>
+        <w:spacing w:before="0" w:after="0"/>
+      </w:pPr>
     </w:p>
     <w:p>
       <w:pPr>

</xml_diff>

<commit_message>
Add new vocabulary entry for "das Heft" in vocab.docx and vocab.manifest.json
</commit_message>
<xml_diff>
--- a/vocab.docx
+++ b/vocab.docx
@@ -13,6 +13,120 @@
         </w:rPr>
         <w:t>daf — vocabulary</w:t>
       </w:r>
+    </w:p>
+    <w:p>
+      <w:pPr>
+        <w:spacing w:after="120"/>
+      </w:pPr>
+      <w:r>
+        <w:rPr>
+          <w:b/>
+        </w:rPr>
+        <w:t>das Heft</w:t>
+      </w:r>
+      <w:r>
+        <w:t xml:space="preserve"> /hɛft/</w:t>
+      </w:r>
+    </w:p>
+    <w:p>
+      <w:pPr>
+        <w:spacing w:after="80"/>
+        <w:ind w:left="576"/>
+      </w:pPr>
+      <w:r>
+        <w:rPr>
+          <w:sz w:val="22"/>
+        </w:rPr>
+        <w:t>das Heft, -e</w:t>
+      </w:r>
+    </w:p>
+    <w:p>
+      <w:pPr>
+        <w:spacing w:after="80"/>
+        <w:ind w:left="576"/>
+      </w:pPr>
+      <w:r>
+        <w:t>Notebook; exercise book.</w:t>
+      </w:r>
+    </w:p>
+    <w:p>
+      <w:pPr>
+        <w:spacing w:after="80"/>
+        <w:ind w:left="576"/>
+      </w:pPr>
+      <w:r>
+        <w:rPr>
+          <w:i/>
+          <w:color w:val="404040"/>
+          <w:sz w:val="20"/>
+        </w:rPr>
+        <w:t>• In classroom instructions, in Ihr Heft means write it in your notebook (not in the textbook).</w:t>
+      </w:r>
+    </w:p>
+    <w:p>
+      <w:pPr>
+        <w:spacing w:before="40" w:after="60"/>
+        <w:ind w:left="576"/>
+      </w:pPr>
+      <w:r>
+        <w:rPr>
+          <w:i/>
+          <w:color w:val="30608C"/>
+          <w:sz w:val="21"/>
+        </w:rPr>
+        <w:t xml:space="preserve">› </w:t>
+      </w:r>
+      <w:r>
+        <w:rPr>
+          <w:i/>
+          <w:color w:val="30608C"/>
+          <w:sz w:val="21"/>
+        </w:rPr>
+        <w:t>Schreiben Sie das Formular von 3a in Ihr Heft.</w:t>
+      </w:r>
+      <w:r>
+        <w:rPr>
+          <w:i/>
+          <w:color w:val="404040"/>
+          <w:sz w:val="21"/>
+        </w:rPr>
+        <w:t xml:space="preserve"> (Write the form from 3a in your notebook. [formal you])</w:t>
+      </w:r>
+    </w:p>
+    <w:p>
+      <w:pPr>
+        <w:spacing w:before="0" w:after="120"/>
+        <w:ind w:left="576"/>
+      </w:pPr>
+      <w:r>
+        <w:rPr>
+          <w:i/>
+          <w:color w:val="30608C"/>
+          <w:sz w:val="21"/>
+        </w:rPr>
+        <w:t xml:space="preserve">› </w:t>
+      </w:r>
+      <w:r>
+        <w:rPr>
+          <w:i/>
+          <w:color w:val="30608C"/>
+          <w:sz w:val="21"/>
+        </w:rPr>
+        <w:t>Ich schreibe die neuen Wörter in mein Heft.</w:t>
+      </w:r>
+      <w:r>
+        <w:rPr>
+          <w:i/>
+          <w:color w:val="404040"/>
+          <w:sz w:val="21"/>
+        </w:rPr>
+        <w:t xml:space="preserve"> (I write the new words in my notebook.)</w:t>
+      </w:r>
+    </w:p>
+    <w:p>
+      <w:pPr>
+        <w:spacing w:before="0" w:after="0"/>
+      </w:pPr>
     </w:p>
     <w:p>
       <w:pPr>

</xml_diff>

<commit_message>
Add new vocabulary entry for "E-Mail-Adressen sprechen" in vocab.docx and vocab.manifest.json
- Introduced a detailed entry for "E-Mail-Adressen sprechen," including gloss, usage notes, and examples in both German and English.
- The entry is categorized under lesson 1 and level A1, enhancing the vocabulary resource for language learners with practical applications and context.
</commit_message>
<xml_diff>
--- a/vocab.docx
+++ b/vocab.docx
@@ -1857,6 +1857,122 @@
           <w:sz w:val="21"/>
         </w:rPr>
         <w:t xml:space="preserve"> (The place of residence is on the personal information form.)</w:t>
+      </w:r>
+    </w:p>
+    <w:p>
+      <w:pPr>
+        <w:spacing w:before="0" w:after="0"/>
+      </w:pPr>
+    </w:p>
+    <w:p>
+      <w:pPr>
+        <w:spacing w:after="120"/>
+      </w:pPr>
+      <w:r>
+        <w:rPr>
+          <w:b/>
+        </w:rPr>
+        <w:t>E-Mail-Adressen sprechen</w:t>
+      </w:r>
+      <w:r>
+        <w:t xml:space="preserve"> /ˈiːmeːl aˌdʁɛsn̩ ˈʃpʁɛçən/</w:t>
+      </w:r>
+    </w:p>
+    <w:p>
+      <w:pPr>
+        <w:spacing w:after="80"/>
+        <w:ind w:left="576"/>
+      </w:pPr>
+      <w:r>
+        <w:t>How to say email symbols aloud.</w:t>
+      </w:r>
+    </w:p>
+    <w:p>
+      <w:pPr>
+        <w:spacing w:after="80"/>
+        <w:ind w:left="576"/>
+      </w:pPr>
+      <w:r>
+        <w:rPr>
+          <w:i/>
+          <w:color w:val="404040"/>
+          <w:sz w:val="20"/>
+        </w:rPr>
+        <w:t>• In this lesson: - = minus, _ = Unterstrich, . = Punkt, @ = at.</w:t>
+      </w:r>
+    </w:p>
+    <w:p>
+      <w:pPr>
+        <w:spacing w:after="80"/>
+        <w:ind w:left="576"/>
+      </w:pPr>
+      <w:r>
+        <w:rPr>
+          <w:i/>
+          <w:color w:val="404040"/>
+          <w:sz w:val="20"/>
+        </w:rPr>
+        <w:t>• Use this pattern when dictating an address on the phone.</w:t>
+      </w:r>
+    </w:p>
+    <w:p>
+      <w:pPr>
+        <w:spacing w:before="40" w:after="60"/>
+        <w:ind w:left="576"/>
+      </w:pPr>
+      <w:r>
+        <w:rPr>
+          <w:i/>
+          <w:color w:val="30608C"/>
+          <w:sz w:val="21"/>
+        </w:rPr>
+        <w:t xml:space="preserve">› </w:t>
+      </w:r>
+      <w:r>
+        <w:rPr>
+          <w:i/>
+          <w:color w:val="30608C"/>
+          <w:sz w:val="21"/>
+        </w:rPr>
+        <w:t>carlos punkt rodriguez at techno minus design punkt de</w:t>
+      </w:r>
+      <w:r>
+        <w:rPr>
+          <w:i/>
+          <w:color w:val="404040"/>
+          <w:sz w:val="21"/>
+        </w:rPr>
+        <w:t xml:space="preserve"> (carlos.rodriguez@techno-design.de (spoken form))</w:t>
+      </w:r>
+    </w:p>
+    <w:p>
+      <w:pPr>
+        <w:spacing w:before="0" w:after="120"/>
+        <w:ind w:left="576"/>
+      </w:pPr>
+      <w:r>
+        <w:rPr>
+          <w:i/>
+          <w:color w:val="30608C"/>
+          <w:sz w:val="21"/>
+        </w:rPr>
+        <w:t xml:space="preserve">› </w:t>
+      </w:r>
+      <w:r>
+        <w:rPr>
+          <w:i/>
+          <w:color w:val="30608C"/>
+          <w:sz w:val="21"/>
+        </w:rPr>
+        <w:t>anna Unterstrich meier at firma punkt de</w:t>
+      </w:r>
+      <w:r>
+        <w:rPr>
+          <w:i/>
+          <w:color w:val="404040"/>
+          <w:sz w:val="21"/>
+        </w:rPr>
+        <w:t xml:space="preserve"> (anna_meier@firma.de (spoken form))</w:t>
       </w:r>
     </w:p>
     <w:p>

</xml_diff>

<commit_message>
Add new vocabulary entries
</commit_message>
<xml_diff>
--- a/vocab.docx
+++ b/vocab.docx
@@ -13,6 +13,1035 @@
         </w:rPr>
         <w:t>daf — vocabulary</w:t>
       </w:r>
+    </w:p>
+    <w:p>
+      <w:pPr>
+        <w:spacing w:after="120"/>
+      </w:pPr>
+      <w:r>
+        <w:rPr>
+          <w:b/>
+        </w:rPr>
+        <w:t>Kontinente</w:t>
+      </w:r>
+      <w:r>
+        <w:t xml:space="preserve"> /kɔntiˈnɛntə/</w:t>
+      </w:r>
+    </w:p>
+    <w:p>
+      <w:pPr>
+        <w:spacing w:after="80"/>
+        <w:ind w:left="576"/>
+      </w:pPr>
+      <w:r>
+        <w:t>Continents.</w:t>
+      </w:r>
+    </w:p>
+    <w:p>
+      <w:pPr>
+        <w:spacing w:after="80"/>
+        <w:ind w:left="576"/>
+      </w:pPr>
+      <w:r>
+        <w:rPr>
+          <w:i/>
+          <w:color w:val="404040"/>
+          <w:sz w:val="20"/>
+        </w:rPr>
+        <w:t>• Origin with aus + continent (no article): Aus Europa, aus Asien.</w:t>
+      </w:r>
+    </w:p>
+    <w:p>
+      <w:pPr>
+        <w:spacing w:after="80"/>
+        <w:ind w:left="576"/>
+      </w:pPr>
+      <w:r>
+        <w:rPr>
+          <w:i/>
+          <w:color w:val="404040"/>
+          <w:sz w:val="20"/>
+        </w:rPr>
+        <w:t>• Pattern: Aus Europa kommen 137.000 Studenten. / Die Studenten kommen aus Europa.</w:t>
+      </w:r>
+    </w:p>
+    <w:tbl>
+      <w:tblPr>
+        <w:tblStyle w:val="TableGrid"/>
+        <w:tblW w:type="auto" w:w="0"/>
+        <w:tblLook w:firstColumn="1" w:firstRow="1" w:lastColumn="0" w:lastRow="0" w:noHBand="0" w:noVBand="1" w:val="04A0"/>
+        <w:tblInd w:w="576" w:type="dxa"/>
+      </w:tblPr>
+      <w:tblGrid>
+        <w:gridCol w:w="4320"/>
+        <w:gridCol w:w="4320"/>
+      </w:tblGrid>
+      <w:tr>
+        <w:tc>
+          <w:tcPr>
+            <w:tcW w:type="dxa" w:w="4320"/>
+            <w:shd w:val="clear" w:color="auto" w:fill="EFF6FC"/>
+          </w:tcPr>
+          <w:p>
+            <w:pPr>
+              <w:spacing w:after="40"/>
+            </w:pPr>
+            <w:r/>
+            <w:r>
+              <w:rPr>
+                <w:rFonts w:ascii="Calibri" w:hAnsi="Calibri"/>
+                <w:b/>
+                <w:color w:val="333333"/>
+                <w:sz w:val="20"/>
+              </w:rPr>
+              <w:t>Kontinent</w:t>
+            </w:r>
+          </w:p>
+        </w:tc>
+        <w:tc>
+          <w:tcPr>
+            <w:tcW w:type="dxa" w:w="4320"/>
+            <w:shd w:val="clear" w:color="auto" w:fill="EFF6FC"/>
+          </w:tcPr>
+          <w:p>
+            <w:pPr>
+              <w:spacing w:after="40"/>
+            </w:pPr>
+            <w:r/>
+            <w:r>
+              <w:rPr>
+                <w:rFonts w:ascii="Calibri" w:hAnsi="Calibri"/>
+                <w:b/>
+                <w:color w:val="333333"/>
+                <w:sz w:val="20"/>
+              </w:rPr>
+              <w:t>Studenten (in Deutschland)</w:t>
+            </w:r>
+          </w:p>
+        </w:tc>
+      </w:tr>
+      <w:tr>
+        <w:tc>
+          <w:tcPr>
+            <w:tcW w:type="dxa" w:w="4320"/>
+          </w:tcPr>
+          <w:p>
+            <w:pPr>
+              <w:spacing w:after="40"/>
+            </w:pPr>
+            <w:r/>
+            <w:r>
+              <w:rPr>
+                <w:rFonts w:ascii="Calibri" w:hAnsi="Calibri"/>
+                <w:color w:val="404040"/>
+                <w:sz w:val="19"/>
+              </w:rPr>
+              <w:t>Europa</w:t>
+            </w:r>
+          </w:p>
+        </w:tc>
+        <w:tc>
+          <w:tcPr>
+            <w:tcW w:type="dxa" w:w="4320"/>
+          </w:tcPr>
+          <w:p>
+            <w:pPr>
+              <w:spacing w:after="40"/>
+            </w:pPr>
+            <w:r/>
+            <w:r>
+              <w:rPr>
+                <w:rFonts w:ascii="Calibri" w:hAnsi="Calibri"/>
+                <w:color w:val="404040"/>
+                <w:sz w:val="19"/>
+              </w:rPr>
+              <w:t>137.000</w:t>
+            </w:r>
+          </w:p>
+        </w:tc>
+      </w:tr>
+      <w:tr>
+        <w:tc>
+          <w:tcPr>
+            <w:tcW w:type="dxa" w:w="4320"/>
+          </w:tcPr>
+          <w:p>
+            <w:pPr>
+              <w:spacing w:after="40"/>
+            </w:pPr>
+            <w:r/>
+            <w:r>
+              <w:rPr>
+                <w:rFonts w:ascii="Calibri" w:hAnsi="Calibri"/>
+                <w:color w:val="404040"/>
+                <w:sz w:val="19"/>
+              </w:rPr>
+              <w:t>Asien</w:t>
+            </w:r>
+          </w:p>
+        </w:tc>
+        <w:tc>
+          <w:tcPr>
+            <w:tcW w:type="dxa" w:w="4320"/>
+          </w:tcPr>
+          <w:p>
+            <w:pPr>
+              <w:spacing w:after="40"/>
+            </w:pPr>
+            <w:r/>
+            <w:r>
+              <w:rPr>
+                <w:rFonts w:ascii="Calibri" w:hAnsi="Calibri"/>
+                <w:color w:val="404040"/>
+                <w:sz w:val="19"/>
+              </w:rPr>
+              <w:t>70.000</w:t>
+            </w:r>
+          </w:p>
+        </w:tc>
+      </w:tr>
+      <w:tr>
+        <w:tc>
+          <w:tcPr>
+            <w:tcW w:type="dxa" w:w="4320"/>
+          </w:tcPr>
+          <w:p>
+            <w:pPr>
+              <w:spacing w:after="40"/>
+            </w:pPr>
+            <w:r/>
+            <w:r>
+              <w:rPr>
+                <w:rFonts w:ascii="Calibri" w:hAnsi="Calibri"/>
+                <w:color w:val="404040"/>
+                <w:sz w:val="19"/>
+              </w:rPr>
+              <w:t>Afrika</w:t>
+            </w:r>
+          </w:p>
+        </w:tc>
+        <w:tc>
+          <w:tcPr>
+            <w:tcW w:type="dxa" w:w="4320"/>
+          </w:tcPr>
+          <w:p>
+            <w:pPr>
+              <w:spacing w:after="40"/>
+            </w:pPr>
+            <w:r/>
+            <w:r>
+              <w:rPr>
+                <w:rFonts w:ascii="Calibri" w:hAnsi="Calibri"/>
+                <w:color w:val="404040"/>
+                <w:sz w:val="19"/>
+              </w:rPr>
+              <w:t>22.000</w:t>
+            </w:r>
+          </w:p>
+        </w:tc>
+      </w:tr>
+      <w:tr>
+        <w:tc>
+          <w:tcPr>
+            <w:tcW w:type="dxa" w:w="4320"/>
+          </w:tcPr>
+          <w:p>
+            <w:pPr>
+              <w:spacing w:after="40"/>
+            </w:pPr>
+            <w:r/>
+            <w:r>
+              <w:rPr>
+                <w:rFonts w:ascii="Calibri" w:hAnsi="Calibri"/>
+                <w:color w:val="404040"/>
+                <w:sz w:val="19"/>
+              </w:rPr>
+              <w:t>Amerika</w:t>
+            </w:r>
+          </w:p>
+        </w:tc>
+        <w:tc>
+          <w:tcPr>
+            <w:tcW w:type="dxa" w:w="4320"/>
+          </w:tcPr>
+          <w:p>
+            <w:pPr>
+              <w:spacing w:after="40"/>
+            </w:pPr>
+            <w:r/>
+            <w:r>
+              <w:rPr>
+                <w:rFonts w:ascii="Calibri" w:hAnsi="Calibri"/>
+                <w:color w:val="404040"/>
+                <w:sz w:val="19"/>
+              </w:rPr>
+              <w:t>15.000</w:t>
+            </w:r>
+          </w:p>
+        </w:tc>
+      </w:tr>
+      <w:tr>
+        <w:tc>
+          <w:tcPr>
+            <w:tcW w:type="dxa" w:w="4320"/>
+          </w:tcPr>
+          <w:p>
+            <w:pPr>
+              <w:spacing w:after="40"/>
+            </w:pPr>
+            <w:r/>
+            <w:r>
+              <w:rPr>
+                <w:rFonts w:ascii="Calibri" w:hAnsi="Calibri"/>
+                <w:color w:val="404040"/>
+                <w:sz w:val="19"/>
+              </w:rPr>
+              <w:t>Australien</w:t>
+            </w:r>
+          </w:p>
+        </w:tc>
+        <w:tc>
+          <w:tcPr>
+            <w:tcW w:type="dxa" w:w="4320"/>
+          </w:tcPr>
+          <w:p>
+            <w:pPr>
+              <w:spacing w:after="40"/>
+            </w:pPr>
+            <w:r/>
+            <w:r>
+              <w:rPr>
+                <w:rFonts w:ascii="Calibri" w:hAnsi="Calibri"/>
+                <w:color w:val="404040"/>
+                <w:sz w:val="19"/>
+              </w:rPr>
+              <w:t>500</w:t>
+            </w:r>
+          </w:p>
+        </w:tc>
+      </w:tr>
+    </w:tbl>
+    <w:p>
+      <w:pPr>
+        <w:spacing w:before="40" w:after="120"/>
+      </w:pPr>
+    </w:p>
+    <w:p>
+      <w:pPr>
+        <w:spacing w:before="40" w:after="60"/>
+        <w:ind w:left="576"/>
+      </w:pPr>
+      <w:r>
+        <w:rPr>
+          <w:i/>
+          <w:color w:val="30608C"/>
+          <w:sz w:val="21"/>
+        </w:rPr>
+        <w:t xml:space="preserve">› </w:t>
+      </w:r>
+      <w:r>
+        <w:rPr>
+          <w:i/>
+          <w:color w:val="30608C"/>
+          <w:sz w:val="21"/>
+        </w:rPr>
+        <w:t>Woher kommen die Studenten? Sprechen Sie.</w:t>
+      </w:r>
+      <w:r>
+        <w:rPr>
+          <w:i/>
+          <w:color w:val="404040"/>
+          <w:sz w:val="21"/>
+        </w:rPr>
+        <w:t xml:space="preserve"> (Where do the students come from? Speak. [formal you])</w:t>
+      </w:r>
+    </w:p>
+    <w:p>
+      <w:pPr>
+        <w:spacing w:before="0" w:after="60"/>
+        <w:ind w:left="576"/>
+      </w:pPr>
+      <w:r>
+        <w:rPr>
+          <w:i/>
+          <w:color w:val="30608C"/>
+          <w:sz w:val="21"/>
+        </w:rPr>
+        <w:t xml:space="preserve">› </w:t>
+      </w:r>
+      <w:r>
+        <w:rPr>
+          <w:i/>
+          <w:color w:val="30608C"/>
+          <w:sz w:val="21"/>
+        </w:rPr>
+        <w:t>Aus Europa kommen 137.000 Studenten.</w:t>
+      </w:r>
+      <w:r>
+        <w:rPr>
+          <w:i/>
+          <w:color w:val="404040"/>
+          <w:sz w:val="21"/>
+        </w:rPr>
+        <w:t xml:space="preserve"> (137,000 students come from Europe.)</w:t>
+      </w:r>
+    </w:p>
+    <w:p>
+      <w:pPr>
+        <w:spacing w:before="0" w:after="60"/>
+        <w:ind w:left="576"/>
+      </w:pPr>
+      <w:r>
+        <w:rPr>
+          <w:i/>
+          <w:color w:val="30608C"/>
+          <w:sz w:val="21"/>
+        </w:rPr>
+        <w:t xml:space="preserve">› </w:t>
+      </w:r>
+      <w:r>
+        <w:rPr>
+          <w:i/>
+          <w:color w:val="30608C"/>
+          <w:sz w:val="21"/>
+        </w:rPr>
+        <w:t>Aus Asien kommen 70.000 Studenten.</w:t>
+      </w:r>
+      <w:r>
+        <w:rPr>
+          <w:i/>
+          <w:color w:val="404040"/>
+          <w:sz w:val="21"/>
+        </w:rPr>
+        <w:t xml:space="preserve"> (70,000 students come from Asia.)</w:t>
+      </w:r>
+    </w:p>
+    <w:p>
+      <w:pPr>
+        <w:spacing w:before="0" w:after="60"/>
+        <w:ind w:left="576"/>
+      </w:pPr>
+      <w:r>
+        <w:rPr>
+          <w:i/>
+          <w:color w:val="30608C"/>
+          <w:sz w:val="21"/>
+        </w:rPr>
+        <w:t xml:space="preserve">› </w:t>
+      </w:r>
+      <w:r>
+        <w:rPr>
+          <w:i/>
+          <w:color w:val="30608C"/>
+          <w:sz w:val="21"/>
+        </w:rPr>
+        <w:t>Aus Afrika kommen 22.000 Studenten.</w:t>
+      </w:r>
+      <w:r>
+        <w:rPr>
+          <w:i/>
+          <w:color w:val="404040"/>
+          <w:sz w:val="21"/>
+        </w:rPr>
+        <w:t xml:space="preserve"> (22,000 students come from Africa.)</w:t>
+      </w:r>
+    </w:p>
+    <w:p>
+      <w:pPr>
+        <w:spacing w:before="0" w:after="60"/>
+        <w:ind w:left="576"/>
+      </w:pPr>
+      <w:r>
+        <w:rPr>
+          <w:i/>
+          <w:color w:val="30608C"/>
+          <w:sz w:val="21"/>
+        </w:rPr>
+        <w:t xml:space="preserve">› </w:t>
+      </w:r>
+      <w:r>
+        <w:rPr>
+          <w:i/>
+          <w:color w:val="30608C"/>
+          <w:sz w:val="21"/>
+        </w:rPr>
+        <w:t>Aus Amerika kommen 15.000 Studenten.</w:t>
+      </w:r>
+      <w:r>
+        <w:rPr>
+          <w:i/>
+          <w:color w:val="404040"/>
+          <w:sz w:val="21"/>
+        </w:rPr>
+        <w:t xml:space="preserve"> (15,000 students come from the Americas.)</w:t>
+      </w:r>
+    </w:p>
+    <w:p>
+      <w:pPr>
+        <w:spacing w:before="0" w:after="120"/>
+        <w:ind w:left="576"/>
+      </w:pPr>
+      <w:r>
+        <w:rPr>
+          <w:i/>
+          <w:color w:val="30608C"/>
+          <w:sz w:val="21"/>
+        </w:rPr>
+        <w:t xml:space="preserve">› </w:t>
+      </w:r>
+      <w:r>
+        <w:rPr>
+          <w:i/>
+          <w:color w:val="30608C"/>
+          <w:sz w:val="21"/>
+        </w:rPr>
+        <w:t>Aus Australien kommen 500 Studenten.</w:t>
+      </w:r>
+      <w:r>
+        <w:rPr>
+          <w:i/>
+          <w:color w:val="404040"/>
+          <w:sz w:val="21"/>
+        </w:rPr>
+        <w:t xml:space="preserve"> (500 students come from Australia.)</w:t>
+      </w:r>
+    </w:p>
+    <w:p>
+      <w:pPr>
+        <w:spacing w:before="0" w:after="0"/>
+      </w:pPr>
+    </w:p>
+    <w:p>
+      <w:pPr>
+        <w:spacing w:after="120"/>
+      </w:pPr>
+      <w:r>
+        <w:rPr>
+          <w:b/>
+        </w:rPr>
+        <w:t>der Student</w:t>
+      </w:r>
+      <w:r>
+        <w:t xml:space="preserve"> /ʃtuˈdɛnt/</w:t>
+      </w:r>
+    </w:p>
+    <w:p>
+      <w:pPr>
+        <w:spacing w:after="80"/>
+        <w:ind w:left="576"/>
+      </w:pPr>
+      <w:r>
+        <w:rPr>
+          <w:sz w:val="22"/>
+        </w:rPr>
+        <w:t>der Student, -en</w:t>
+      </w:r>
+    </w:p>
+    <w:p>
+      <w:pPr>
+        <w:spacing w:after="80"/>
+        <w:ind w:left="576"/>
+      </w:pPr>
+      <w:r>
+        <w:t>Student (male); student (generic plural Studenten).</w:t>
+      </w:r>
+    </w:p>
+    <w:p>
+      <w:pPr>
+        <w:spacing w:after="80"/>
+        <w:ind w:left="576"/>
+      </w:pPr>
+      <w:r>
+        <w:rPr>
+          <w:i/>
+          <w:color w:val="404040"/>
+          <w:sz w:val="20"/>
+        </w:rPr>
+        <w:t>• die Studentin = female student. Plural die Studenten covers mixed groups.</w:t>
+      </w:r>
+    </w:p>
+    <w:p>
+      <w:pPr>
+        <w:spacing w:before="40" w:after="60"/>
+        <w:ind w:left="576"/>
+      </w:pPr>
+      <w:r>
+        <w:rPr>
+          <w:i/>
+          <w:color w:val="30608C"/>
+          <w:sz w:val="21"/>
+        </w:rPr>
+        <w:t xml:space="preserve">› </w:t>
+      </w:r>
+      <w:r>
+        <w:rPr>
+          <w:i/>
+          <w:color w:val="30608C"/>
+          <w:sz w:val="21"/>
+        </w:rPr>
+        <w:t>Woher kommen die Studenten?</w:t>
+      </w:r>
+      <w:r>
+        <w:rPr>
+          <w:i/>
+          <w:color w:val="404040"/>
+          <w:sz w:val="21"/>
+        </w:rPr>
+        <w:t xml:space="preserve"> (Where do the students come from?)</w:t>
+      </w:r>
+    </w:p>
+    <w:p>
+      <w:pPr>
+        <w:spacing w:before="0" w:after="120"/>
+        <w:ind w:left="576"/>
+      </w:pPr>
+      <w:r>
+        <w:rPr>
+          <w:i/>
+          <w:color w:val="30608C"/>
+          <w:sz w:val="21"/>
+        </w:rPr>
+        <w:t xml:space="preserve">› </w:t>
+      </w:r>
+      <w:r>
+        <w:rPr>
+          <w:i/>
+          <w:color w:val="30608C"/>
+          <w:sz w:val="21"/>
+        </w:rPr>
+        <w:t>Studenten aus der ganzen Welt</w:t>
+      </w:r>
+      <w:r>
+        <w:rPr>
+          <w:i/>
+          <w:color w:val="404040"/>
+          <w:sz w:val="21"/>
+        </w:rPr>
+        <w:t xml:space="preserve"> (students from all over the world)</w:t>
+      </w:r>
+    </w:p>
+    <w:p>
+      <w:pPr>
+        <w:spacing w:before="0" w:after="0"/>
+      </w:pPr>
+    </w:p>
+    <w:p>
+      <w:pPr>
+        <w:spacing w:after="120"/>
+      </w:pPr>
+      <w:r>
+        <w:rPr>
+          <w:b/>
+        </w:rPr>
+        <w:t>vorstellen</w:t>
+      </w:r>
+      <w:r>
+        <w:t xml:space="preserve"> /foːɐ̯ˈʃtɛlən/</w:t>
+      </w:r>
+    </w:p>
+    <w:p>
+      <w:pPr>
+        <w:spacing w:after="80"/>
+        <w:ind w:left="576"/>
+      </w:pPr>
+      <w:r>
+        <w:t>To introduce (someone); to present.</w:t>
+      </w:r>
+    </w:p>
+    <w:p>
+      <w:pPr>
+        <w:spacing w:after="80"/>
+        <w:ind w:left="576"/>
+      </w:pPr>
+      <w:r>
+        <w:rPr>
+          <w:i/>
+          <w:color w:val="404040"/>
+          <w:sz w:val="20"/>
+        </w:rPr>
+        <w:t>• Separable verb: stellen ... vor. In commands with Sie: Stellen Sie ... vor.</w:t>
+      </w:r>
+    </w:p>
+    <w:p>
+      <w:pPr>
+        <w:spacing w:after="80"/>
+        <w:ind w:left="576"/>
+      </w:pPr>
+      <w:r>
+        <w:rPr>
+          <w:i/>
+          <w:color w:val="404040"/>
+          <w:sz w:val="20"/>
+        </w:rPr>
+        <w:t>• Contrast with sich vorstellen: introduce yourself.</w:t>
+      </w:r>
+    </w:p>
+    <w:p>
+      <w:pPr>
+        <w:spacing w:before="40" w:after="60"/>
+        <w:ind w:left="576"/>
+      </w:pPr>
+      <w:r>
+        <w:rPr>
+          <w:i/>
+          <w:color w:val="30608C"/>
+          <w:sz w:val="21"/>
+        </w:rPr>
+        <w:t xml:space="preserve">› </w:t>
+      </w:r>
+      <w:r>
+        <w:rPr>
+          <w:i/>
+          <w:color w:val="30608C"/>
+          <w:sz w:val="21"/>
+        </w:rPr>
+        <w:t>Stellen Sie Ihren Partner dem anderen Team vor.</w:t>
+      </w:r>
+      <w:r>
+        <w:rPr>
+          <w:i/>
+          <w:color w:val="404040"/>
+          <w:sz w:val="21"/>
+        </w:rPr>
+        <w:t xml:space="preserve"> (Introduce your partner to the other team. [formal you])</w:t>
+      </w:r>
+    </w:p>
+    <w:p>
+      <w:pPr>
+        <w:spacing w:before="0" w:after="120"/>
+        <w:ind w:left="576"/>
+      </w:pPr>
+      <w:r>
+        <w:rPr>
+          <w:i/>
+          <w:color w:val="30608C"/>
+          <w:sz w:val="21"/>
+        </w:rPr>
+        <w:t xml:space="preserve">› </w:t>
+      </w:r>
+      <w:r>
+        <w:rPr>
+          <w:i/>
+          <w:color w:val="30608C"/>
+          <w:sz w:val="21"/>
+        </w:rPr>
+        <w:t>Ich stelle meine Partnerin vor.</w:t>
+      </w:r>
+      <w:r>
+        <w:rPr>
+          <w:i/>
+          <w:color w:val="404040"/>
+          <w:sz w:val="21"/>
+        </w:rPr>
+        <w:t xml:space="preserve"> (I introduce my partner.)</w:t>
+      </w:r>
+    </w:p>
+    <w:p>
+      <w:pPr>
+        <w:spacing w:before="0" w:after="0"/>
+      </w:pPr>
+    </w:p>
+    <w:p>
+      <w:pPr>
+        <w:spacing w:after="120"/>
+      </w:pPr>
+      <w:r>
+        <w:rPr>
+          <w:b/>
+        </w:rPr>
+        <w:t>die Gruppe</w:t>
+      </w:r>
+      <w:r>
+        <w:t xml:space="preserve"> /ˈɡʁʊpə/</w:t>
+      </w:r>
+    </w:p>
+    <w:p>
+      <w:pPr>
+        <w:spacing w:after="80"/>
+        <w:ind w:left="576"/>
+      </w:pPr>
+      <w:r>
+        <w:rPr>
+          <w:sz w:val="22"/>
+        </w:rPr>
+        <w:t>die Gruppe, -n</w:t>
+      </w:r>
+    </w:p>
+    <w:p>
+      <w:pPr>
+        <w:spacing w:after="80"/>
+        <w:ind w:left="576"/>
+      </w:pPr>
+      <w:r>
+        <w:t>Group.</w:t>
+      </w:r>
+    </w:p>
+    <w:p>
+      <w:pPr>
+        <w:spacing w:before="40" w:after="60"/>
+        <w:ind w:left="576"/>
+      </w:pPr>
+      <w:r>
+        <w:rPr>
+          <w:i/>
+          <w:color w:val="30608C"/>
+          <w:sz w:val="21"/>
+        </w:rPr>
+        <w:t xml:space="preserve">› </w:t>
+      </w:r>
+      <w:r>
+        <w:rPr>
+          <w:i/>
+          <w:color w:val="30608C"/>
+          <w:sz w:val="21"/>
+        </w:rPr>
+        <w:t>Arbeiten Sie in Gruppen mit vier Personen.</w:t>
+      </w:r>
+      <w:r>
+        <w:rPr>
+          <w:i/>
+          <w:color w:val="404040"/>
+          <w:sz w:val="21"/>
+        </w:rPr>
+        <w:t xml:space="preserve"> (Work in groups of four people. [formal you])</w:t>
+      </w:r>
+    </w:p>
+    <w:p>
+      <w:pPr>
+        <w:spacing w:before="0" w:after="120"/>
+        <w:ind w:left="576"/>
+      </w:pPr>
+      <w:r>
+        <w:rPr>
+          <w:i/>
+          <w:color w:val="30608C"/>
+          <w:sz w:val="21"/>
+        </w:rPr>
+        <w:t xml:space="preserve">› </w:t>
+      </w:r>
+      <w:r>
+        <w:rPr>
+          <w:i/>
+          <w:color w:val="30608C"/>
+          <w:sz w:val="21"/>
+        </w:rPr>
+        <w:t>Wir arbeiten in einer Gruppe.</w:t>
+      </w:r>
+      <w:r>
+        <w:rPr>
+          <w:i/>
+          <w:color w:val="404040"/>
+          <w:sz w:val="21"/>
+        </w:rPr>
+        <w:t xml:space="preserve"> (We work in a group.)</w:t>
+      </w:r>
+    </w:p>
+    <w:p>
+      <w:pPr>
+        <w:spacing w:before="0" w:after="0"/>
+      </w:pPr>
+    </w:p>
+    <w:p>
+      <w:pPr>
+        <w:spacing w:after="120"/>
+      </w:pPr>
+      <w:r>
+        <w:rPr>
+          <w:b/>
+        </w:rPr>
+        <w:t>das Team</w:t>
+      </w:r>
+      <w:r>
+        <w:t xml:space="preserve"> /tiːm/</w:t>
+      </w:r>
+    </w:p>
+    <w:p>
+      <w:pPr>
+        <w:spacing w:after="80"/>
+        <w:ind w:left="576"/>
+      </w:pPr>
+      <w:r>
+        <w:rPr>
+          <w:sz w:val="22"/>
+        </w:rPr>
+        <w:t>das Team, -s</w:t>
+      </w:r>
+    </w:p>
+    <w:p>
+      <w:pPr>
+        <w:spacing w:after="80"/>
+        <w:ind w:left="576"/>
+      </w:pPr>
+      <w:r>
+        <w:t>Team.</w:t>
+      </w:r>
+    </w:p>
+    <w:p>
+      <w:pPr>
+        <w:spacing w:before="40" w:after="60"/>
+        <w:ind w:left="576"/>
+      </w:pPr>
+      <w:r>
+        <w:rPr>
+          <w:i/>
+          <w:color w:val="30608C"/>
+          <w:sz w:val="21"/>
+        </w:rPr>
+        <w:t xml:space="preserve">› </w:t>
+      </w:r>
+      <w:r>
+        <w:rPr>
+          <w:i/>
+          <w:color w:val="30608C"/>
+          <w:sz w:val="21"/>
+        </w:rPr>
+        <w:t>Zwei Personen sind ein Team.</w:t>
+      </w:r>
+      <w:r>
+        <w:rPr>
+          <w:i/>
+          <w:color w:val="404040"/>
+          <w:sz w:val="21"/>
+        </w:rPr>
+        <w:t xml:space="preserve"> (Two people are one team.)</w:t>
+      </w:r>
+    </w:p>
+    <w:p>
+      <w:pPr>
+        <w:spacing w:before="0" w:after="120"/>
+        <w:ind w:left="576"/>
+      </w:pPr>
+      <w:r>
+        <w:rPr>
+          <w:i/>
+          <w:color w:val="30608C"/>
+          <w:sz w:val="21"/>
+        </w:rPr>
+        <w:t xml:space="preserve">› </w:t>
+      </w:r>
+      <w:r>
+        <w:rPr>
+          <w:i/>
+          <w:color w:val="30608C"/>
+          <w:sz w:val="21"/>
+        </w:rPr>
+        <w:t>Das andere Team stellt seinen Partner vor.</w:t>
+      </w:r>
+      <w:r>
+        <w:rPr>
+          <w:i/>
+          <w:color w:val="404040"/>
+          <w:sz w:val="21"/>
+        </w:rPr>
+        <w:t xml:space="preserve"> (The other team introduces its partner.)</w:t>
+      </w:r>
+    </w:p>
+    <w:p>
+      <w:pPr>
+        <w:spacing w:before="0" w:after="0"/>
+      </w:pPr>
+    </w:p>
+    <w:p>
+      <w:pPr>
+        <w:spacing w:after="120"/>
+      </w:pPr>
+      <w:r>
+        <w:rPr>
+          <w:b/>
+        </w:rPr>
+        <w:t>Auf Wiedersehen!</w:t>
+      </w:r>
+      <w:r>
+        <w:t xml:space="preserve"> /aʊf ˈviːdɐˌzeːən/</w:t>
+      </w:r>
+    </w:p>
+    <w:p>
+      <w:pPr>
+        <w:spacing w:after="80"/>
+        <w:ind w:left="576"/>
+      </w:pPr>
+      <w:r>
+        <w:t>Goodbye (in person).</w:t>
+      </w:r>
+    </w:p>
+    <w:p>
+      <w:pPr>
+        <w:spacing w:after="80"/>
+        <w:ind w:left="576"/>
+      </w:pPr>
+      <w:r>
+        <w:rPr>
+          <w:i/>
+          <w:color w:val="404040"/>
+          <w:sz w:val="20"/>
+        </w:rPr>
+        <w:t>• In-person farewell; on the phone use Auf Wiederhören.</w:t>
+      </w:r>
+    </w:p>
+    <w:p>
+      <w:pPr>
+        <w:spacing w:before="40" w:after="60"/>
+        <w:ind w:left="576"/>
+      </w:pPr>
+      <w:r>
+        <w:rPr>
+          <w:i/>
+          <w:color w:val="30608C"/>
+          <w:sz w:val="21"/>
+        </w:rPr>
+        <w:t xml:space="preserve">› </w:t>
+      </w:r>
+      <w:r>
+        <w:rPr>
+          <w:i/>
+          <w:color w:val="30608C"/>
+          <w:sz w:val="21"/>
+        </w:rPr>
+        <w:t>Freut mich. Auf Wiedersehen.</w:t>
+      </w:r>
+      <w:r>
+        <w:rPr>
+          <w:i/>
+          <w:color w:val="404040"/>
+          <w:sz w:val="21"/>
+        </w:rPr>
+        <w:t xml:space="preserve"> (Nice to meet you. Goodbye.)</w:t>
+      </w:r>
+    </w:p>
+    <w:p>
+      <w:pPr>
+        <w:spacing w:before="0" w:after="120"/>
+        <w:ind w:left="576"/>
+      </w:pPr>
+      <w:r>
+        <w:rPr>
+          <w:i/>
+          <w:color w:val="30608C"/>
+          <w:sz w:val="21"/>
+        </w:rPr>
+        <w:t xml:space="preserve">› </w:t>
+      </w:r>
+      <w:r>
+        <w:rPr>
+          <w:i/>
+          <w:color w:val="30608C"/>
+          <w:sz w:val="21"/>
+        </w:rPr>
+        <w:t>Auf Wiedersehen. Tschüss.</w:t>
+      </w:r>
+      <w:r>
+        <w:rPr>
+          <w:i/>
+          <w:color w:val="404040"/>
+          <w:sz w:val="21"/>
+        </w:rPr>
+        <w:t xml:space="preserve"> (Goodbye. Bye.)</w:t>
+      </w:r>
+    </w:p>
+    <w:p>
+      <w:pPr>
+        <w:spacing w:before="0" w:after="0"/>
+      </w:pPr>
     </w:p>
     <w:p>
       <w:pPr>

</xml_diff>

<commit_message>
Add new vocabulary entries for "der Teilnehmer," "teilnehmen," and "zählen" in vocab.docx and vocab.manifest.json
</commit_message>
<xml_diff>
--- a/vocab.docx
+++ b/vocab.docx
@@ -22,6 +22,338 @@
         <w:rPr>
           <w:b/>
         </w:rPr>
+        <w:t>der Teilnehmer</w:t>
+      </w:r>
+      <w:r>
+        <w:t xml:space="preserve"> / die Teilnehmerin /ˈtaɪ̯lˌneːmɐ/ /ˈtaɪ̯lˌneːməʁɪn/</w:t>
+      </w:r>
+    </w:p>
+    <w:p>
+      <w:pPr>
+        <w:spacing w:after="80"/>
+        <w:ind w:left="576"/>
+      </w:pPr>
+      <w:r>
+        <w:rPr>
+          <w:sz w:val="22"/>
+        </w:rPr>
+        <w:t>der Teilnehmer, - / die Teilnehmerin, -nen</w:t>
+      </w:r>
+    </w:p>
+    <w:p>
+      <w:pPr>
+        <w:spacing w:after="80"/>
+        <w:ind w:left="576"/>
+      </w:pPr>
+      <w:r>
+        <w:t>Participant; course member (male/female).</w:t>
+      </w:r>
+    </w:p>
+    <w:p>
+      <w:pPr>
+        <w:spacing w:after="80"/>
+        <w:ind w:left="576"/>
+      </w:pPr>
+      <w:r>
+        <w:rPr>
+          <w:i/>
+          <w:color w:val="404040"/>
+          <w:sz w:val="20"/>
+        </w:rPr>
+        <w:t>• Compound: der Teil + der Nehmer (one who takes a part). Related verb: teilnehmen.</w:t>
+      </w:r>
+    </w:p>
+    <w:p>
+      <w:pPr>
+        <w:spacing w:after="80"/>
+        <w:ind w:left="576"/>
+      </w:pPr>
+      <w:r>
+        <w:rPr>
+          <w:i/>
+          <w:color w:val="404040"/>
+          <w:sz w:val="20"/>
+        </w:rPr>
+        <w:t>• Plural die Teilnehmer often covers mixed groups; Teilnehmerinnen = women only.</w:t>
+      </w:r>
+    </w:p>
+    <w:p>
+      <w:pPr>
+        <w:spacing w:before="40" w:after="60"/>
+        <w:ind w:left="576"/>
+      </w:pPr>
+      <w:r>
+        <w:rPr>
+          <w:i/>
+          <w:color w:val="30608C"/>
+          <w:sz w:val="21"/>
+        </w:rPr>
+        <w:t xml:space="preserve">› </w:t>
+      </w:r>
+      <w:r>
+        <w:rPr>
+          <w:i/>
+          <w:color w:val="30608C"/>
+          <w:sz w:val="21"/>
+        </w:rPr>
+        <w:t>Aus welchen Kontinenten kommen die Teilnehmer und Teilnehmerinnen im Kurs?</w:t>
+      </w:r>
+      <w:r>
+        <w:rPr>
+          <w:i/>
+          <w:color w:val="404040"/>
+          <w:sz w:val="21"/>
+        </w:rPr>
+        <w:t xml:space="preserve"> (From which continents do the participants in the course come?)</w:t>
+      </w:r>
+    </w:p>
+    <w:p>
+      <w:pPr>
+        <w:spacing w:before="0" w:after="120"/>
+        <w:ind w:left="576"/>
+      </w:pPr>
+      <w:r>
+        <w:rPr>
+          <w:i/>
+          <w:color w:val="30608C"/>
+          <w:sz w:val="21"/>
+        </w:rPr>
+        <w:t xml:space="preserve">› </w:t>
+      </w:r>
+      <w:r>
+        <w:rPr>
+          <w:i/>
+          <w:color w:val="30608C"/>
+          <w:sz w:val="21"/>
+        </w:rPr>
+        <w:t>Die Teilnehmer kommen aus Europa.</w:t>
+      </w:r>
+      <w:r>
+        <w:rPr>
+          <w:i/>
+          <w:color w:val="404040"/>
+          <w:sz w:val="21"/>
+        </w:rPr>
+        <w:t xml:space="preserve"> (The participants come from Europe.)</w:t>
+      </w:r>
+    </w:p>
+    <w:p>
+      <w:pPr>
+        <w:spacing w:before="0" w:after="0"/>
+      </w:pPr>
+    </w:p>
+    <w:p>
+      <w:pPr>
+        <w:spacing w:after="120"/>
+      </w:pPr>
+      <w:r>
+        <w:rPr>
+          <w:b/>
+        </w:rPr>
+        <w:t>teilnehmen</w:t>
+      </w:r>
+      <w:r>
+        <w:t xml:space="preserve"> /ˈtaɪ̯lˌneːmən/</w:t>
+      </w:r>
+    </w:p>
+    <w:p>
+      <w:pPr>
+        <w:spacing w:after="80"/>
+        <w:ind w:left="576"/>
+      </w:pPr>
+      <w:r>
+        <w:t>To take part; participate.</w:t>
+      </w:r>
+    </w:p>
+    <w:p>
+      <w:pPr>
+        <w:spacing w:after="80"/>
+        <w:ind w:left="576"/>
+      </w:pPr>
+      <w:r>
+        <w:rPr>
+          <w:i/>
+          <w:color w:val="404040"/>
+          <w:sz w:val="20"/>
+        </w:rPr>
+        <w:t>• Separable verb: Ich nehme an einem Kurs teil. Prefix teil goes to the end.</w:t>
+      </w:r>
+    </w:p>
+    <w:p>
+      <w:pPr>
+        <w:spacing w:after="80"/>
+        <w:ind w:left="576"/>
+      </w:pPr>
+      <w:r>
+        <w:rPr>
+          <w:i/>
+          <w:color w:val="404040"/>
+          <w:sz w:val="20"/>
+        </w:rPr>
+        <w:t>• Often with an + dative: an einem Kurs teilnehmen.</w:t>
+      </w:r>
+    </w:p>
+    <w:p>
+      <w:pPr>
+        <w:spacing w:before="40" w:after="60"/>
+        <w:ind w:left="576"/>
+      </w:pPr>
+      <w:r>
+        <w:rPr>
+          <w:i/>
+          <w:color w:val="30608C"/>
+          <w:sz w:val="21"/>
+        </w:rPr>
+        <w:t xml:space="preserve">› </w:t>
+      </w:r>
+      <w:r>
+        <w:rPr>
+          <w:i/>
+          <w:color w:val="30608C"/>
+          <w:sz w:val="21"/>
+        </w:rPr>
+        <w:t>Diesen Winter nehme ich wieder an einem Kurs teil.</w:t>
+      </w:r>
+      <w:r>
+        <w:rPr>
+          <w:i/>
+          <w:color w:val="404040"/>
+          <w:sz w:val="21"/>
+        </w:rPr>
+        <w:t xml:space="preserve"> (This winter I am taking a course again.)</w:t>
+      </w:r>
+    </w:p>
+    <w:p>
+      <w:pPr>
+        <w:spacing w:before="0" w:after="120"/>
+        <w:ind w:left="576"/>
+      </w:pPr>
+      <w:r>
+        <w:rPr>
+          <w:i/>
+          <w:color w:val="30608C"/>
+          <w:sz w:val="21"/>
+        </w:rPr>
+        <w:t xml:space="preserve">› </w:t>
+      </w:r>
+      <w:r>
+        <w:rPr>
+          <w:i/>
+          <w:color w:val="30608C"/>
+          <w:sz w:val="21"/>
+        </w:rPr>
+        <w:t>Nehmen Sie am Kurs teil?</w:t>
+      </w:r>
+      <w:r>
+        <w:rPr>
+          <w:i/>
+          <w:color w:val="404040"/>
+          <w:sz w:val="21"/>
+        </w:rPr>
+        <w:t xml:space="preserve"> (Are you taking part in the course? [formal you])</w:t>
+      </w:r>
+    </w:p>
+    <w:p>
+      <w:pPr>
+        <w:spacing w:before="0" w:after="0"/>
+      </w:pPr>
+    </w:p>
+    <w:p>
+      <w:pPr>
+        <w:spacing w:after="120"/>
+      </w:pPr>
+      <w:r>
+        <w:rPr>
+          <w:b/>
+        </w:rPr>
+        <w:t>zählen</w:t>
+      </w:r>
+      <w:r>
+        <w:t xml:space="preserve"> /ˈtsɛːlən/</w:t>
+      </w:r>
+    </w:p>
+    <w:p>
+      <w:pPr>
+        <w:spacing w:after="80"/>
+        <w:ind w:left="576"/>
+      </w:pPr>
+      <w:r>
+        <w:t>To count.</w:t>
+      </w:r>
+    </w:p>
+    <w:p>
+      <w:pPr>
+        <w:spacing w:before="40" w:after="60"/>
+        <w:ind w:left="576"/>
+      </w:pPr>
+      <w:r>
+        <w:rPr>
+          <w:i/>
+          <w:color w:val="30608C"/>
+          <w:sz w:val="21"/>
+        </w:rPr>
+        <w:t xml:space="preserve">› </w:t>
+      </w:r>
+      <w:r>
+        <w:rPr>
+          <w:i/>
+          <w:color w:val="30608C"/>
+          <w:sz w:val="21"/>
+        </w:rPr>
+        <w:t>Zählen Sie.</w:t>
+      </w:r>
+      <w:r>
+        <w:rPr>
+          <w:i/>
+          <w:color w:val="404040"/>
+          <w:sz w:val="21"/>
+        </w:rPr>
+        <w:t xml:space="preserve"> (Count. [formal you])</w:t>
+      </w:r>
+    </w:p>
+    <w:p>
+      <w:pPr>
+        <w:spacing w:before="0" w:after="120"/>
+        <w:ind w:left="576"/>
+      </w:pPr>
+      <w:r>
+        <w:rPr>
+          <w:i/>
+          <w:color w:val="30608C"/>
+          <w:sz w:val="21"/>
+        </w:rPr>
+        <w:t xml:space="preserve">› </w:t>
+      </w:r>
+      <w:r>
+        <w:rPr>
+          <w:i/>
+          <w:color w:val="30608C"/>
+          <w:sz w:val="21"/>
+        </w:rPr>
+        <w:t>Aus welchen Kontinenten kommen die Teilnehmer im Kurs? Zählen Sie.</w:t>
+      </w:r>
+      <w:r>
+        <w:rPr>
+          <w:i/>
+          <w:color w:val="404040"/>
+          <w:sz w:val="21"/>
+        </w:rPr>
+        <w:t xml:space="preserve"> (From which continents do the participants in the course come? Count. [formal you])</w:t>
+      </w:r>
+    </w:p>
+    <w:p>
+      <w:pPr>
+        <w:spacing w:before="0" w:after="0"/>
+      </w:pPr>
+    </w:p>
+    <w:p>
+      <w:pPr>
+        <w:spacing w:after="120"/>
+      </w:pPr>
+      <w:r>
+        <w:rPr>
+          <w:b/>
+        </w:rPr>
         <w:t>Kontinente</w:t>
       </w:r>
       <w:r>
@@ -64,267 +396,6 @@
         </w:rPr>
         <w:t>• Pattern: Aus Europa kommen 137.000 Studenten. / Die Studenten kommen aus Europa.</w:t>
       </w:r>
-    </w:p>
-    <w:tbl>
-      <w:tblPr>
-        <w:tblStyle w:val="TableGrid"/>
-        <w:tblW w:type="auto" w:w="0"/>
-        <w:tblLook w:firstColumn="1" w:firstRow="1" w:lastColumn="0" w:lastRow="0" w:noHBand="0" w:noVBand="1" w:val="04A0"/>
-        <w:tblInd w:w="576" w:type="dxa"/>
-      </w:tblPr>
-      <w:tblGrid>
-        <w:gridCol w:w="4320"/>
-        <w:gridCol w:w="4320"/>
-      </w:tblGrid>
-      <w:tr>
-        <w:tc>
-          <w:tcPr>
-            <w:tcW w:type="dxa" w:w="4320"/>
-            <w:shd w:val="clear" w:color="auto" w:fill="EFF6FC"/>
-          </w:tcPr>
-          <w:p>
-            <w:pPr>
-              <w:spacing w:after="40"/>
-            </w:pPr>
-            <w:r/>
-            <w:r>
-              <w:rPr>
-                <w:rFonts w:ascii="Calibri" w:hAnsi="Calibri"/>
-                <w:b/>
-                <w:color w:val="333333"/>
-                <w:sz w:val="20"/>
-              </w:rPr>
-              <w:t>Kontinent</w:t>
-            </w:r>
-          </w:p>
-        </w:tc>
-        <w:tc>
-          <w:tcPr>
-            <w:tcW w:type="dxa" w:w="4320"/>
-            <w:shd w:val="clear" w:color="auto" w:fill="EFF6FC"/>
-          </w:tcPr>
-          <w:p>
-            <w:pPr>
-              <w:spacing w:after="40"/>
-            </w:pPr>
-            <w:r/>
-            <w:r>
-              <w:rPr>
-                <w:rFonts w:ascii="Calibri" w:hAnsi="Calibri"/>
-                <w:b/>
-                <w:color w:val="333333"/>
-                <w:sz w:val="20"/>
-              </w:rPr>
-              <w:t>Studenten (in Deutschland)</w:t>
-            </w:r>
-          </w:p>
-        </w:tc>
-      </w:tr>
-      <w:tr>
-        <w:tc>
-          <w:tcPr>
-            <w:tcW w:type="dxa" w:w="4320"/>
-          </w:tcPr>
-          <w:p>
-            <w:pPr>
-              <w:spacing w:after="40"/>
-            </w:pPr>
-            <w:r/>
-            <w:r>
-              <w:rPr>
-                <w:rFonts w:ascii="Calibri" w:hAnsi="Calibri"/>
-                <w:color w:val="404040"/>
-                <w:sz w:val="19"/>
-              </w:rPr>
-              <w:t>Europa</w:t>
-            </w:r>
-          </w:p>
-        </w:tc>
-        <w:tc>
-          <w:tcPr>
-            <w:tcW w:type="dxa" w:w="4320"/>
-          </w:tcPr>
-          <w:p>
-            <w:pPr>
-              <w:spacing w:after="40"/>
-            </w:pPr>
-            <w:r/>
-            <w:r>
-              <w:rPr>
-                <w:rFonts w:ascii="Calibri" w:hAnsi="Calibri"/>
-                <w:color w:val="404040"/>
-                <w:sz w:val="19"/>
-              </w:rPr>
-              <w:t>137.000</w:t>
-            </w:r>
-          </w:p>
-        </w:tc>
-      </w:tr>
-      <w:tr>
-        <w:tc>
-          <w:tcPr>
-            <w:tcW w:type="dxa" w:w="4320"/>
-          </w:tcPr>
-          <w:p>
-            <w:pPr>
-              <w:spacing w:after="40"/>
-            </w:pPr>
-            <w:r/>
-            <w:r>
-              <w:rPr>
-                <w:rFonts w:ascii="Calibri" w:hAnsi="Calibri"/>
-                <w:color w:val="404040"/>
-                <w:sz w:val="19"/>
-              </w:rPr>
-              <w:t>Asien</w:t>
-            </w:r>
-          </w:p>
-        </w:tc>
-        <w:tc>
-          <w:tcPr>
-            <w:tcW w:type="dxa" w:w="4320"/>
-          </w:tcPr>
-          <w:p>
-            <w:pPr>
-              <w:spacing w:after="40"/>
-            </w:pPr>
-            <w:r/>
-            <w:r>
-              <w:rPr>
-                <w:rFonts w:ascii="Calibri" w:hAnsi="Calibri"/>
-                <w:color w:val="404040"/>
-                <w:sz w:val="19"/>
-              </w:rPr>
-              <w:t>70.000</w:t>
-            </w:r>
-          </w:p>
-        </w:tc>
-      </w:tr>
-      <w:tr>
-        <w:tc>
-          <w:tcPr>
-            <w:tcW w:type="dxa" w:w="4320"/>
-          </w:tcPr>
-          <w:p>
-            <w:pPr>
-              <w:spacing w:after="40"/>
-            </w:pPr>
-            <w:r/>
-            <w:r>
-              <w:rPr>
-                <w:rFonts w:ascii="Calibri" w:hAnsi="Calibri"/>
-                <w:color w:val="404040"/>
-                <w:sz w:val="19"/>
-              </w:rPr>
-              <w:t>Afrika</w:t>
-            </w:r>
-          </w:p>
-        </w:tc>
-        <w:tc>
-          <w:tcPr>
-            <w:tcW w:type="dxa" w:w="4320"/>
-          </w:tcPr>
-          <w:p>
-            <w:pPr>
-              <w:spacing w:after="40"/>
-            </w:pPr>
-            <w:r/>
-            <w:r>
-              <w:rPr>
-                <w:rFonts w:ascii="Calibri" w:hAnsi="Calibri"/>
-                <w:color w:val="404040"/>
-                <w:sz w:val="19"/>
-              </w:rPr>
-              <w:t>22.000</w:t>
-            </w:r>
-          </w:p>
-        </w:tc>
-      </w:tr>
-      <w:tr>
-        <w:tc>
-          <w:tcPr>
-            <w:tcW w:type="dxa" w:w="4320"/>
-          </w:tcPr>
-          <w:p>
-            <w:pPr>
-              <w:spacing w:after="40"/>
-            </w:pPr>
-            <w:r/>
-            <w:r>
-              <w:rPr>
-                <w:rFonts w:ascii="Calibri" w:hAnsi="Calibri"/>
-                <w:color w:val="404040"/>
-                <w:sz w:val="19"/>
-              </w:rPr>
-              <w:t>Amerika</w:t>
-            </w:r>
-          </w:p>
-        </w:tc>
-        <w:tc>
-          <w:tcPr>
-            <w:tcW w:type="dxa" w:w="4320"/>
-          </w:tcPr>
-          <w:p>
-            <w:pPr>
-              <w:spacing w:after="40"/>
-            </w:pPr>
-            <w:r/>
-            <w:r>
-              <w:rPr>
-                <w:rFonts w:ascii="Calibri" w:hAnsi="Calibri"/>
-                <w:color w:val="404040"/>
-                <w:sz w:val="19"/>
-              </w:rPr>
-              <w:t>15.000</w:t>
-            </w:r>
-          </w:p>
-        </w:tc>
-      </w:tr>
-      <w:tr>
-        <w:tc>
-          <w:tcPr>
-            <w:tcW w:type="dxa" w:w="4320"/>
-          </w:tcPr>
-          <w:p>
-            <w:pPr>
-              <w:spacing w:after="40"/>
-            </w:pPr>
-            <w:r/>
-            <w:r>
-              <w:rPr>
-                <w:rFonts w:ascii="Calibri" w:hAnsi="Calibri"/>
-                <w:color w:val="404040"/>
-                <w:sz w:val="19"/>
-              </w:rPr>
-              <w:t>Australien</w:t>
-            </w:r>
-          </w:p>
-        </w:tc>
-        <w:tc>
-          <w:tcPr>
-            <w:tcW w:type="dxa" w:w="4320"/>
-          </w:tcPr>
-          <w:p>
-            <w:pPr>
-              <w:spacing w:after="40"/>
-            </w:pPr>
-            <w:r/>
-            <w:r>
-              <w:rPr>
-                <w:rFonts w:ascii="Calibri" w:hAnsi="Calibri"/>
-                <w:color w:val="404040"/>
-                <w:sz w:val="19"/>
-              </w:rPr>
-              <w:t>500</w:t>
-            </w:r>
-          </w:p>
-        </w:tc>
-      </w:tr>
-    </w:tbl>
-    <w:p>
-      <w:pPr>
-        <w:spacing w:before="40" w:after="120"/>
-      </w:pPr>
     </w:p>
     <w:p>
       <w:pPr>
@@ -21601,6 +21672,20 @@
     </w:p>
     <w:p>
       <w:pPr>
+        <w:spacing w:after="80"/>
+        <w:ind w:left="576"/>
+      </w:pPr>
+      <w:r>
+        <w:rPr>
+          <w:i/>
+          <w:color w:val="404040"/>
+          <w:sz w:val="20"/>
+        </w:rPr>
+        <w:t>• After aus, use dative: welchen Kontinenten (plural).</w:t>
+      </w:r>
+    </w:p>
+    <w:p>
+      <w:pPr>
         <w:spacing w:before="40" w:after="60"/>
         <w:ind w:left="576"/>
       </w:pPr>
@@ -21661,6 +21746,36 @@
     </w:p>
     <w:p>
       <w:pPr>
+        <w:spacing w:before="0" w:after="60"/>
+        <w:ind w:left="576"/>
+      </w:pPr>
+      <w:r>
+        <w:rPr>
+          <w:i/>
+          <w:color w:val="30608C"/>
+          <w:sz w:val="21"/>
+        </w:rPr>
+        <w:t xml:space="preserve">› </w:t>
+      </w:r>
+      <w:r>
+        <w:rPr>
+          <w:i/>
+          <w:color w:val="30608C"/>
+          <w:sz w:val="21"/>
+        </w:rPr>
+        <w:t>Welche Antwort passt?</w:t>
+      </w:r>
+      <w:r>
+        <w:rPr>
+          <w:i/>
+          <w:color w:val="404040"/>
+          <w:sz w:val="21"/>
+        </w:rPr>
+        <w:t xml:space="preserve"> (Which answer fits / is correct?)</w:t>
+      </w:r>
+    </w:p>
+    <w:p>
+      <w:pPr>
         <w:spacing w:before="0" w:after="120"/>
         <w:ind w:left="576"/>
       </w:pPr>
@@ -21678,15 +21793,15 @@
           <w:color w:val="30608C"/>
           <w:sz w:val="21"/>
         </w:rPr>
-        <w:t>Welche Antwort passt?</w:t>
-      </w:r>
-      <w:r>
-        <w:rPr>
-          <w:i/>
-          <w:color w:val="404040"/>
-          <w:sz w:val="21"/>
-        </w:rPr>
-        <w:t xml:space="preserve"> (Which answer fits / is correct?)</w:t>
+        <w:t>Aus welchen Kontinenten kommen die Teilnehmer?</w:t>
+      </w:r>
+      <w:r>
+        <w:rPr>
+          <w:i/>
+          <w:color w:val="404040"/>
+          <w:sz w:val="21"/>
+        </w:rPr>
+        <w:t xml:space="preserve"> (From which continents do the participants come?)</w:t>
       </w:r>
     </w:p>
     <w:p>

</xml_diff>

<commit_message>
Update vocabulary entries in vocab.docx and vocab.manifest.json to enhance clarity and consistency. Added detailed glosses and corrected compound definitions for "der Teilnehmer," "teilnehmen," "zählen," and "der Kontinent." Reformatted gloss entries for improved readability.
</commit_message>
<xml_diff>
--- a/vocab.docx
+++ b/vocab.docx
@@ -60,7 +60,7 @@
           <w:color w:val="404040"/>
           <w:sz w:val="20"/>
         </w:rPr>
-        <w:t>• Compound: der Teil + der Nehmer (one who takes a part). Related verb: teilnehmen.</w:t>
+        <w:t>• Compound: der Teil + der Nehmer (one who takes a part, part-taker). Related verb: teilnehmen.</w:t>
       </w:r>
     </w:p>
     <w:p>
@@ -354,10 +354,10 @@
         <w:rPr>
           <w:b/>
         </w:rPr>
-        <w:t>Kontinente</w:t>
-      </w:r>
-      <w:r>
-        <w:t xml:space="preserve"> /kɔntiˈnɛntə/</w:t>
+        <w:t>der Kontinent</w:t>
+      </w:r>
+      <w:r>
+        <w:t xml:space="preserve"> /kɔntiˈnɛnt/</w:t>
       </w:r>
     </w:p>
     <w:p>
@@ -366,7 +366,19 @@
         <w:ind w:left="576"/>
       </w:pPr>
       <w:r>
-        <w:t>Continents.</w:t>
+        <w:rPr>
+          <w:sz w:val="22"/>
+        </w:rPr>
+        <w:t>der Kontinent, -e</w:t>
+      </w:r>
+    </w:p>
+    <w:p>
+      <w:pPr>
+        <w:spacing w:after="80"/>
+        <w:ind w:left="576"/>
+      </w:pPr>
+      <w:r>
+        <w:t>Continent.</w:t>
       </w:r>
     </w:p>
     <w:p>

</xml_diff>

<commit_message>
Add new vocabulary entries and HTML rendering enhancements.
- Added definitions and examples for "zuordnen," "die Arbeitsanweisungen," and "die Anweisung" in vocab.docx and vocab.manifest.json.
- Implemented a new function to render images in vocabulary cards within the HTML output.
- Updated the HTML rendering logic to include image blocks for vocabulary entries.
</commit_message>
<xml_diff>
--- a/vocab.docx
+++ b/vocab.docx
@@ -13,6 +13,310 @@
         </w:rPr>
         <w:t>daf — vocabulary</w:t>
       </w:r>
+    </w:p>
+    <w:p>
+      <w:pPr>
+        <w:spacing w:after="120"/>
+      </w:pPr>
+      <w:r>
+        <w:rPr>
+          <w:b/>
+        </w:rPr>
+        <w:t>zuordnen</w:t>
+      </w:r>
+      <w:r>
+        <w:t xml:space="preserve"> /tsuˈʔɔʁdnən/</w:t>
+      </w:r>
+    </w:p>
+    <w:p>
+      <w:pPr>
+        <w:spacing w:after="80"/>
+        <w:ind w:left="576"/>
+      </w:pPr>
+      <w:r>
+        <w:t>To match; assign (separable: zuordnen → ordnen … zu).</w:t>
+      </w:r>
+    </w:p>
+    <w:p>
+      <w:pPr>
+        <w:spacing w:after="80"/>
+        <w:ind w:left="576"/>
+      </w:pPr>
+      <w:r>
+        <w:rPr>
+          <w:i/>
+          <w:color w:val="404040"/>
+          <w:sz w:val="20"/>
+        </w:rPr>
+        <w:t>• Imperative: Ordnen Sie zu. Textbook Arbeitsanweisungen 2.</w:t>
+      </w:r>
+    </w:p>
+    <w:p>
+      <w:pPr>
+        <w:spacing w:before="40" w:after="60"/>
+        <w:ind w:left="576"/>
+      </w:pPr>
+      <w:r>
+        <w:rPr>
+          <w:i/>
+          <w:color w:val="30608C"/>
+          <w:sz w:val="21"/>
+        </w:rPr>
+        <w:t xml:space="preserve">› </w:t>
+      </w:r>
+      <w:r>
+        <w:rPr>
+          <w:i/>
+          <w:color w:val="30608C"/>
+          <w:sz w:val="21"/>
+        </w:rPr>
+        <w:t>Arbeitsanweisungen 2: Ordnen Sie zu.</w:t>
+      </w:r>
+      <w:r>
+        <w:rPr>
+          <w:i/>
+          <w:color w:val="404040"/>
+          <w:sz w:val="21"/>
+        </w:rPr>
+        <w:t xml:space="preserve"> (Work instructions 2: Match them. [formal you])</w:t>
+      </w:r>
+    </w:p>
+    <w:p>
+      <w:pPr>
+        <w:spacing w:before="0" w:after="120"/>
+        <w:ind w:left="576"/>
+      </w:pPr>
+      <w:r>
+        <w:rPr>
+          <w:i/>
+          <w:color w:val="30608C"/>
+          <w:sz w:val="21"/>
+        </w:rPr>
+        <w:t xml:space="preserve">› </w:t>
+      </w:r>
+      <w:r>
+        <w:rPr>
+          <w:i/>
+          <w:color w:val="30608C"/>
+          <w:sz w:val="21"/>
+        </w:rPr>
+        <w:t>Ordnen Sie die Nummern den Buchstaben zu.</w:t>
+      </w:r>
+      <w:r>
+        <w:rPr>
+          <w:i/>
+          <w:color w:val="404040"/>
+          <w:sz w:val="21"/>
+        </w:rPr>
+        <w:t xml:space="preserve"> (Match the numbers to the letters. [formal you])</w:t>
+      </w:r>
+    </w:p>
+    <w:p>
+      <w:pPr>
+        <w:spacing w:before="0" w:after="0"/>
+      </w:pPr>
+    </w:p>
+    <w:p>
+      <w:pPr>
+        <w:spacing w:after="120"/>
+      </w:pPr>
+      <w:r>
+        <w:rPr>
+          <w:b/>
+        </w:rPr>
+        <w:t>die Arbeitsanweisungen</w:t>
+      </w:r>
+      <w:r>
+        <w:t xml:space="preserve"> /ˈaʁbaɪ̯tsˌanvaɪ̯zʊŋən/</w:t>
+      </w:r>
+    </w:p>
+    <w:p>
+      <w:pPr>
+        <w:spacing w:after="80"/>
+        <w:ind w:left="576"/>
+      </w:pPr>
+      <w:r>
+        <w:t>Work instructions; exercise directions (in the textbook).</w:t>
+      </w:r>
+    </w:p>
+    <w:p>
+      <w:pPr>
+        <w:spacing w:after="80"/>
+        <w:ind w:left="576"/>
+      </w:pPr>
+      <w:r>
+        <w:rPr>
+          <w:i/>
+          <w:color w:val="404040"/>
+          <w:sz w:val="20"/>
+        </w:rPr>
+        <w:t>• Compound: die Arbeit + die Anweisungen. Singular: die Arbeitsanweisung.</w:t>
+      </w:r>
+    </w:p>
+    <w:p>
+      <w:pPr>
+        <w:spacing w:before="40" w:after="60"/>
+        <w:ind w:left="576"/>
+      </w:pPr>
+      <w:r>
+        <w:rPr>
+          <w:i/>
+          <w:color w:val="30608C"/>
+          <w:sz w:val="21"/>
+        </w:rPr>
+        <w:t xml:space="preserve">› </w:t>
+      </w:r>
+      <w:r>
+        <w:rPr>
+          <w:i/>
+          <w:color w:val="30608C"/>
+          <w:sz w:val="21"/>
+        </w:rPr>
+        <w:t>Arbeitsanweisungen 1: Was passt? Notieren Sie.</w:t>
+      </w:r>
+      <w:r>
+        <w:rPr>
+          <w:i/>
+          <w:color w:val="404040"/>
+          <w:sz w:val="21"/>
+        </w:rPr>
+        <w:t xml:space="preserve"> (Work instructions 1: What matches? Write it down. [formal you])</w:t>
+      </w:r>
+    </w:p>
+    <w:p>
+      <w:pPr>
+        <w:spacing w:before="0" w:after="120"/>
+        <w:ind w:left="576"/>
+      </w:pPr>
+      <w:r>
+        <w:rPr>
+          <w:i/>
+          <w:color w:val="30608C"/>
+          <w:sz w:val="21"/>
+        </w:rPr>
+        <w:t xml:space="preserve">› </w:t>
+      </w:r>
+      <w:r>
+        <w:rPr>
+          <w:i/>
+          <w:color w:val="30608C"/>
+          <w:sz w:val="21"/>
+        </w:rPr>
+        <w:t>Lesen Sie die Arbeitsanweisungen.</w:t>
+      </w:r>
+      <w:r>
+        <w:rPr>
+          <w:i/>
+          <w:color w:val="404040"/>
+          <w:sz w:val="21"/>
+        </w:rPr>
+        <w:t xml:space="preserve"> (Read the work instructions. [formal you])</w:t>
+      </w:r>
+    </w:p>
+    <w:p>
+      <w:pPr>
+        <w:spacing w:before="0" w:after="0"/>
+      </w:pPr>
+    </w:p>
+    <w:p>
+      <w:pPr>
+        <w:spacing w:after="120"/>
+      </w:pPr>
+      <w:r>
+        <w:rPr>
+          <w:b/>
+        </w:rPr>
+        <w:t>die Anweisung</w:t>
+      </w:r>
+      <w:r>
+        <w:t xml:space="preserve"> /anˈvaɪ̯zʊŋ/</w:t>
+      </w:r>
+    </w:p>
+    <w:p>
+      <w:pPr>
+        <w:spacing w:after="80"/>
+        <w:ind w:left="576"/>
+      </w:pPr>
+      <w:r>
+        <w:rPr>
+          <w:sz w:val="22"/>
+        </w:rPr>
+        <w:t>die Anweisung, -en</w:t>
+      </w:r>
+    </w:p>
+    <w:p>
+      <w:pPr>
+        <w:spacing w:after="80"/>
+        <w:ind w:left="576"/>
+      </w:pPr>
+      <w:r>
+        <w:t>Instruction; direction (what you should do).</w:t>
+      </w:r>
+    </w:p>
+    <w:p>
+      <w:pPr>
+        <w:spacing w:before="40" w:after="60"/>
+        <w:ind w:left="576"/>
+      </w:pPr>
+      <w:r>
+        <w:rPr>
+          <w:i/>
+          <w:color w:val="30608C"/>
+          <w:sz w:val="21"/>
+        </w:rPr>
+        <w:t xml:space="preserve">› </w:t>
+      </w:r>
+      <w:r>
+        <w:rPr>
+          <w:i/>
+          <w:color w:val="30608C"/>
+          <w:sz w:val="21"/>
+        </w:rPr>
+        <w:t>Arbeitsanweisungen 1: Was passt?</w:t>
+      </w:r>
+      <w:r>
+        <w:rPr>
+          <w:i/>
+          <w:color w:val="404040"/>
+          <w:sz w:val="21"/>
+        </w:rPr>
+        <w:t xml:space="preserve"> (Work instructions 1: What matches?)</w:t>
+      </w:r>
+    </w:p>
+    <w:p>
+      <w:pPr>
+        <w:spacing w:before="0" w:after="120"/>
+        <w:ind w:left="576"/>
+      </w:pPr>
+      <w:r>
+        <w:rPr>
+          <w:i/>
+          <w:color w:val="30608C"/>
+          <w:sz w:val="21"/>
+        </w:rPr>
+        <w:t xml:space="preserve">› </w:t>
+      </w:r>
+      <w:r>
+        <w:rPr>
+          <w:i/>
+          <w:color w:val="30608C"/>
+          <w:sz w:val="21"/>
+        </w:rPr>
+        <w:t>Folgen Sie der Anweisung.</w:t>
+      </w:r>
+      <w:r>
+        <w:rPr>
+          <w:i/>
+          <w:color w:val="404040"/>
+          <w:sz w:val="21"/>
+        </w:rPr>
+        <w:t xml:space="preserve"> (Follow the instruction. [formal you])</w:t>
+      </w:r>
+    </w:p>
+    <w:p>
+      <w:pPr>
+        <w:spacing w:before="0" w:after="0"/>
+      </w:pPr>
     </w:p>
     <w:p>
       <w:pPr>

</xml_diff>

<commit_message>
Add new vocabulary entries for "die Strategie" and "der Schlüssel" in vocab.docx and vocab.manifest.json.
- Included definitions, examples, and notes for both terms to enhance learning resources.
- Updated the manifest file to reflect the new entries with appropriate metadata and examples.
</commit_message>
<xml_diff>
--- a/vocab.docx
+++ b/vocab.docx
@@ -13,6 +13,220 @@
         </w:rPr>
         <w:t>daf — vocabulary</w:t>
       </w:r>
+    </w:p>
+    <w:p>
+      <w:pPr>
+        <w:spacing w:after="120"/>
+      </w:pPr>
+      <w:r>
+        <w:rPr>
+          <w:b/>
+        </w:rPr>
+        <w:t>die Strategie</w:t>
+      </w:r>
+      <w:r>
+        <w:t xml:space="preserve"> /ʃtʁateˈɡiː/</w:t>
+      </w:r>
+    </w:p>
+    <w:p>
+      <w:pPr>
+        <w:spacing w:after="80"/>
+        <w:ind w:left="576"/>
+      </w:pPr>
+      <w:r>
+        <w:rPr>
+          <w:sz w:val="22"/>
+        </w:rPr>
+        <w:t>die Strategie, -n</w:t>
+      </w:r>
+    </w:p>
+    <w:p>
+      <w:pPr>
+        <w:spacing w:after="80"/>
+        <w:ind w:left="576"/>
+      </w:pPr>
+      <w:r>
+        <w:t>Strategy; planned approach (e.g. for learning).</w:t>
+      </w:r>
+    </w:p>
+    <w:p>
+      <w:pPr>
+        <w:spacing w:before="40" w:after="60"/>
+        <w:ind w:left="576"/>
+      </w:pPr>
+      <w:r>
+        <w:rPr>
+          <w:i/>
+          <w:color w:val="30608C"/>
+          <w:sz w:val="21"/>
+        </w:rPr>
+        <w:t xml:space="preserve">› </w:t>
+      </w:r>
+      <w:r>
+        <w:rPr>
+          <w:i/>
+          <w:color w:val="30608C"/>
+          <w:sz w:val="21"/>
+        </w:rPr>
+        <w:t>Welche Strategie hilft Ihnen beim Lernen?</w:t>
+      </w:r>
+      <w:r>
+        <w:rPr>
+          <w:i/>
+          <w:color w:val="404040"/>
+          <w:sz w:val="21"/>
+        </w:rPr>
+        <w:t xml:space="preserve"> (Which strategy helps you with learning? [formal you])</w:t>
+      </w:r>
+    </w:p>
+    <w:p>
+      <w:pPr>
+        <w:spacing w:before="0" w:after="120"/>
+        <w:ind w:left="576"/>
+      </w:pPr>
+      <w:r>
+        <w:rPr>
+          <w:i/>
+          <w:color w:val="30608C"/>
+          <w:sz w:val="21"/>
+        </w:rPr>
+        <w:t xml:space="preserve">› </w:t>
+      </w:r>
+      <w:r>
+        <w:rPr>
+          <w:i/>
+          <w:color w:val="30608C"/>
+          <w:sz w:val="21"/>
+        </w:rPr>
+        <w:t>Eine gute Strategie spart Zeit.</w:t>
+      </w:r>
+      <w:r>
+        <w:rPr>
+          <w:i/>
+          <w:color w:val="404040"/>
+          <w:sz w:val="21"/>
+        </w:rPr>
+        <w:t xml:space="preserve"> (A good strategy saves time.)</w:t>
+      </w:r>
+    </w:p>
+    <w:p>
+      <w:pPr>
+        <w:spacing w:before="0" w:after="0"/>
+      </w:pPr>
+    </w:p>
+    <w:p>
+      <w:pPr>
+        <w:spacing w:after="120"/>
+      </w:pPr>
+      <w:r>
+        <w:rPr>
+          <w:b/>
+        </w:rPr>
+        <w:t>der Schlüssel</w:t>
+      </w:r>
+      <w:r>
+        <w:t xml:space="preserve"> /ˈʃlʏsəl/</w:t>
+      </w:r>
+    </w:p>
+    <w:p>
+      <w:pPr>
+        <w:spacing w:after="80"/>
+        <w:ind w:left="576"/>
+      </w:pPr>
+      <w:r>
+        <w:rPr>
+          <w:sz w:val="22"/>
+        </w:rPr>
+        <w:t>der Schlüssel, -</w:t>
+      </w:r>
+    </w:p>
+    <w:p>
+      <w:pPr>
+        <w:spacing w:after="80"/>
+        <w:ind w:left="576"/>
+      </w:pPr>
+      <w:r>
+        <w:t>Key (object); also solution key in exercises.</w:t>
+      </w:r>
+    </w:p>
+    <w:p>
+      <w:pPr>
+        <w:spacing w:after="80"/>
+        <w:ind w:left="576"/>
+      </w:pPr>
+      <w:r>
+        <w:rPr>
+          <w:i/>
+          <w:color w:val="404040"/>
+          <w:sz w:val="20"/>
+        </w:rPr>
+        <w:t>• In Symbole: Was passt? the key icon stands for der Schlüssel (Lösung / Hinweis).</w:t>
+      </w:r>
+    </w:p>
+    <w:p>
+      <w:pPr>
+        <w:spacing w:before="40" w:after="60"/>
+        <w:ind w:left="576"/>
+      </w:pPr>
+      <w:r>
+        <w:rPr>
+          <w:i/>
+          <w:color w:val="30608C"/>
+          <w:sz w:val="21"/>
+        </w:rPr>
+        <w:t xml:space="preserve">› </w:t>
+      </w:r>
+      <w:r>
+        <w:rPr>
+          <w:i/>
+          <w:color w:val="30608C"/>
+          <w:sz w:val="21"/>
+        </w:rPr>
+        <w:t>Im Kursbuch steht ein Schlüssel-Symbol bei den Aufgaben.</w:t>
+      </w:r>
+      <w:r>
+        <w:rPr>
+          <w:i/>
+          <w:color w:val="404040"/>
+          <w:sz w:val="21"/>
+        </w:rPr>
+        <w:t xml:space="preserve"> (In the coursebook there is a key symbol next to the exercises.)</w:t>
+      </w:r>
+    </w:p>
+    <w:p>
+      <w:pPr>
+        <w:spacing w:before="0" w:after="120"/>
+        <w:ind w:left="576"/>
+      </w:pPr>
+      <w:r>
+        <w:rPr>
+          <w:i/>
+          <w:color w:val="30608C"/>
+          <w:sz w:val="21"/>
+        </w:rPr>
+        <w:t xml:space="preserve">› </w:t>
+      </w:r>
+      <w:r>
+        <w:rPr>
+          <w:i/>
+          <w:color w:val="30608C"/>
+          <w:sz w:val="21"/>
+        </w:rPr>
+        <w:t>Der Schlüssel liegt auf dem Tisch.</w:t>
+      </w:r>
+      <w:r>
+        <w:rPr>
+          <w:i/>
+          <w:color w:val="404040"/>
+          <w:sz w:val="21"/>
+        </w:rPr>
+        <w:t xml:space="preserve"> (The key is on the table.)</w:t>
+      </w:r>
+    </w:p>
+    <w:p>
+      <w:pPr>
+        <w:spacing w:before="0" w:after="0"/>
+      </w:pPr>
     </w:p>
     <w:p>
       <w:pPr>

</xml_diff>

<commit_message>
Add new vocabulary entries for "der Raum" and "der Gegenstand" in vocab.docx and vocab.manifest.json.
- Included definitions, examples, and notes for both terms to enhance learning resources.
- Updated the manifest file to reflect the new entries with appropriate metadata and examples.
</commit_message>
<xml_diff>
--- a/vocab.docx
+++ b/vocab.docx
@@ -13,6 +13,234 @@
         </w:rPr>
         <w:t>daf — vocabulary</w:t>
       </w:r>
+    </w:p>
+    <w:p>
+      <w:pPr>
+        <w:spacing w:after="120"/>
+      </w:pPr>
+      <w:r>
+        <w:rPr>
+          <w:b/>
+        </w:rPr>
+        <w:t>der Raum</w:t>
+      </w:r>
+      <w:r>
+        <w:t xml:space="preserve"> /ʁaʊm/</w:t>
+      </w:r>
+    </w:p>
+    <w:p>
+      <w:pPr>
+        <w:spacing w:after="80"/>
+        <w:ind w:left="576"/>
+      </w:pPr>
+      <w:r>
+        <w:rPr>
+          <w:sz w:val="22"/>
+        </w:rPr>
+        <w:t>der Raum, -¨e</w:t>
+      </w:r>
+    </w:p>
+    <w:p>
+      <w:pPr>
+        <w:spacing w:after="80"/>
+        <w:ind w:left="576"/>
+      </w:pPr>
+      <w:r>
+        <w:t>Room; space.</w:t>
+      </w:r>
+    </w:p>
+    <w:p>
+      <w:pPr>
+        <w:spacing w:after="80"/>
+        <w:ind w:left="576"/>
+      </w:pPr>
+      <w:r>
+        <w:rPr>
+          <w:i/>
+          <w:color w:val="404040"/>
+          <w:sz w:val="20"/>
+        </w:rPr>
+        <w:t>• Kursraum = der Kurs + der Raum (classroom).</w:t>
+      </w:r>
+    </w:p>
+    <w:p>
+      <w:pPr>
+        <w:spacing w:before="40" w:after="60"/>
+        <w:ind w:left="576"/>
+      </w:pPr>
+      <w:r>
+        <w:rPr>
+          <w:i/>
+          <w:color w:val="30608C"/>
+          <w:sz w:val="21"/>
+        </w:rPr>
+        <w:t xml:space="preserve">› </w:t>
+      </w:r>
+      <w:r>
+        <w:rPr>
+          <w:i/>
+          <w:color w:val="30608C"/>
+          <w:sz w:val="21"/>
+        </w:rPr>
+        <w:t>Gegenstände im Kursraum: Schreiben Sie die Wörter in die Tabelle.</w:t>
+      </w:r>
+      <w:r>
+        <w:rPr>
+          <w:i/>
+          <w:color w:val="404040"/>
+          <w:sz w:val="21"/>
+        </w:rPr>
+        <w:t xml:space="preserve"> (Objects in the classroom: Write the words in the table. [formal you])</w:t>
+      </w:r>
+    </w:p>
+    <w:p>
+      <w:pPr>
+        <w:spacing w:before="0" w:after="120"/>
+        <w:ind w:left="576"/>
+      </w:pPr>
+      <w:r>
+        <w:rPr>
+          <w:i/>
+          <w:color w:val="30608C"/>
+          <w:sz w:val="21"/>
+        </w:rPr>
+        <w:t xml:space="preserve">› </w:t>
+      </w:r>
+      <w:r>
+        <w:rPr>
+          <w:i/>
+          <w:color w:val="30608C"/>
+          <w:sz w:val="21"/>
+        </w:rPr>
+        <w:t>Der Raum ist groß und hell.</w:t>
+      </w:r>
+      <w:r>
+        <w:rPr>
+          <w:i/>
+          <w:color w:val="404040"/>
+          <w:sz w:val="21"/>
+        </w:rPr>
+        <w:t xml:space="preserve"> (The room is big and bright.)</w:t>
+      </w:r>
+    </w:p>
+    <w:p>
+      <w:pPr>
+        <w:spacing w:before="0" w:after="0"/>
+      </w:pPr>
+    </w:p>
+    <w:p>
+      <w:pPr>
+        <w:spacing w:after="120"/>
+      </w:pPr>
+      <w:r>
+        <w:rPr>
+          <w:b/>
+        </w:rPr>
+        <w:t>der Gegenstand</w:t>
+      </w:r>
+      <w:r>
+        <w:t xml:space="preserve"> /ˈɡeːɡənˌʃtant/</w:t>
+      </w:r>
+    </w:p>
+    <w:p>
+      <w:pPr>
+        <w:spacing w:after="80"/>
+        <w:ind w:left="576"/>
+      </w:pPr>
+      <w:r>
+        <w:rPr>
+          <w:sz w:val="22"/>
+        </w:rPr>
+        <w:t>der Gegenstand, -¨e</w:t>
+      </w:r>
+    </w:p>
+    <w:p>
+      <w:pPr>
+        <w:spacing w:after="80"/>
+        <w:ind w:left="576"/>
+      </w:pPr>
+      <w:r>
+        <w:t>Object; item (a physical thing).</w:t>
+      </w:r>
+    </w:p>
+    <w:p>
+      <w:pPr>
+        <w:spacing w:after="80"/>
+        <w:ind w:left="576"/>
+      </w:pPr>
+      <w:r>
+        <w:rPr>
+          <w:i/>
+          <w:color w:val="404040"/>
+          <w:sz w:val="20"/>
+        </w:rPr>
+        <w:t>• Plural die Gegenstände (umlaut). Textbook: objects in the classroom.</w:t>
+      </w:r>
+    </w:p>
+    <w:p>
+      <w:pPr>
+        <w:spacing w:before="40" w:after="60"/>
+        <w:ind w:left="576"/>
+      </w:pPr>
+      <w:r>
+        <w:rPr>
+          <w:i/>
+          <w:color w:val="30608C"/>
+          <w:sz w:val="21"/>
+        </w:rPr>
+        <w:t xml:space="preserve">› </w:t>
+      </w:r>
+      <w:r>
+        <w:rPr>
+          <w:i/>
+          <w:color w:val="30608C"/>
+          <w:sz w:val="21"/>
+        </w:rPr>
+        <w:t>Gegenstände im Kursraum: Schreiben Sie die Wörter in die Tabelle.</w:t>
+      </w:r>
+      <w:r>
+        <w:rPr>
+          <w:i/>
+          <w:color w:val="404040"/>
+          <w:sz w:val="21"/>
+        </w:rPr>
+        <w:t xml:space="preserve"> (Objects in the classroom: Write the words in the table. [formal you])</w:t>
+      </w:r>
+    </w:p>
+    <w:p>
+      <w:pPr>
+        <w:spacing w:before="0" w:after="120"/>
+        <w:ind w:left="576"/>
+      </w:pPr>
+      <w:r>
+        <w:rPr>
+          <w:i/>
+          <w:color w:val="30608C"/>
+          <w:sz w:val="21"/>
+        </w:rPr>
+        <w:t xml:space="preserve">› </w:t>
+      </w:r>
+      <w:r>
+        <w:rPr>
+          <w:i/>
+          <w:color w:val="30608C"/>
+          <w:sz w:val="21"/>
+        </w:rPr>
+        <w:t>Was ist das für ein Gegenstand?</w:t>
+      </w:r>
+      <w:r>
+        <w:rPr>
+          <w:i/>
+          <w:color w:val="404040"/>
+          <w:sz w:val="21"/>
+        </w:rPr>
+        <w:t xml:space="preserve"> (What kind of object is that?)</w:t>
+      </w:r>
+    </w:p>
+    <w:p>
+      <w:pPr>
+        <w:spacing w:before="0" w:after="0"/>
+      </w:pPr>
     </w:p>
     <w:p>
       <w:pPr>

</xml_diff>

<commit_message>
Update vocabulary entries in vocab.docx and vocab.manifest.json with clarifications on compound terms.
- Enhanced definitions and notes for "das Übungsbuch" and "die Übung" to clarify the use of Fugen-s in compounds.
- Updated the manifest file to reflect these changes, improving the educational value of the vocabulary resources.
</commit_message>
<xml_diff>
--- a/vocab.docx
+++ b/vocab.docx
@@ -890,7 +890,21 @@
           <w:color w:val="404040"/>
           <w:sz w:val="20"/>
         </w:rPr>
-        <w:t>• Übung + Buch. Often abbreviated in homework lines.</w:t>
+        <w:t>• Compound: Übung + Buch (singular stem), not Übungenbuch.</w:t>
+      </w:r>
+    </w:p>
+    <w:p>
+      <w:pPr>
+        <w:spacing w:after="80"/>
+        <w:ind w:left="576"/>
+      </w:pPr>
+      <w:r>
+        <w:rPr>
+          <w:i/>
+          <w:color w:val="404040"/>
+          <w:sz w:val="20"/>
+        </w:rPr>
+        <w:t>• The -s- in Übungs- is Fugen-s (linking s): from genitive der Übung → Übungs-; it glues the two nouns. Not plural -en.</w:t>
       </w:r>
     </w:p>
     <w:p>
@@ -1597,6 +1611,20 @@
       </w:pPr>
       <w:r>
         <w:t>Exercise; practice (in class or book).</w:t>
+      </w:r>
+    </w:p>
+    <w:p>
+      <w:pPr>
+        <w:spacing w:after="80"/>
+        <w:ind w:left="576"/>
+      </w:pPr>
+      <w:r>
+        <w:rPr>
+          <w:i/>
+          <w:color w:val="404040"/>
+          <w:sz w:val="20"/>
+        </w:rPr>
+        <w:t>• In compounds: Übungsbuch (Fugen-s from genitive der Übung — see das Übungsbuch card).</w:t>
       </w:r>
     </w:p>
     <w:p>

</xml_diff>

<commit_message>
Update vocab manifest structure and enhance studied state management.
- Modified `vocab.manifest.json` to include a new `studied` field for vocabulary entries, allowing tracking of study progress.
- Updated timestamps in the manifest to reflect the latest changes.
- Refactored `__main__.py` to streamline the serving of vocabulary previews and integrate the studied state into the preview server.
- Enhanced `docx_cards.py` to manage the `studied` flag during card processing and merging.
- Improved `html_preview.py` to reflect studied states in the UI and ensure proper interaction with the studied button functionality.
</commit_message>
<xml_diff>
--- a/vocab.docx
+++ b/vocab.docx
@@ -25,6 +25,11 @@
         <w:t>herumgehen</w:t>
       </w:r>
       <w:r>
+        <w:rPr>
+          <w:b w:val="0"/>
+          <w:color w:val="404040"/>
+          <w:sz w:val="20"/>
+        </w:rPr>
         <w:t xml:space="preserve"> /hɛˈʁʊmˌɡeːən/</w:t>
       </w:r>
     </w:p>
@@ -127,6 +132,11 @@
         <w:t>die Frage</w:t>
       </w:r>
       <w:r>
+        <w:rPr>
+          <w:b w:val="0"/>
+          <w:color w:val="404040"/>
+          <w:sz w:val="20"/>
+        </w:rPr>
         <w:t xml:space="preserve"> /ˈfʁaːɡə/</w:t>
       </w:r>
     </w:p>
@@ -227,6 +237,11 @@
         <w:t>erklären</w:t>
       </w:r>
       <w:r>
+        <w:rPr>
+          <w:b w:val="0"/>
+          <w:color w:val="404040"/>
+          <w:sz w:val="20"/>
+        </w:rPr>
         <w:t xml:space="preserve"> /ɛɐ̯ˈklɛːʁən/</w:t>
       </w:r>
     </w:p>
@@ -315,6 +330,11 @@
         <w:t>verstehen</w:t>
       </w:r>
       <w:r>
+        <w:rPr>
+          <w:b w:val="0"/>
+          <w:color w:val="404040"/>
+          <w:sz w:val="20"/>
+        </w:rPr>
         <w:t xml:space="preserve"> /fɛɐ̯ˈʃteːən/</w:t>
       </w:r>
     </w:p>
@@ -403,6 +423,11 @@
         <w:t>nachschauen</w:t>
       </w:r>
       <w:r>
+        <w:rPr>
+          <w:b w:val="0"/>
+          <w:color w:val="404040"/>
+          <w:sz w:val="20"/>
+        </w:rPr>
         <w:t xml:space="preserve"> /ˈnaːxˌʃaʊ̯ən/</w:t>
       </w:r>
     </w:p>
@@ -491,6 +516,11 @@
         <w:t>aufschlagen</w:t>
       </w:r>
       <w:r>
+        <w:rPr>
+          <w:b w:val="0"/>
+          <w:color w:val="404040"/>
+          <w:sz w:val="20"/>
+        </w:rPr>
         <w:t xml:space="preserve"> /ˈaʊ̯fˌʃlaːɡən/</w:t>
       </w:r>
     </w:p>
@@ -579,6 +609,11 @@
         <w:t>arbeiten</w:t>
       </w:r>
       <w:r>
+        <w:rPr>
+          <w:b w:val="0"/>
+          <w:color w:val="404040"/>
+          <w:sz w:val="20"/>
+        </w:rPr>
         <w:t xml:space="preserve"> /ˈaʁbaɪ̯tən/</w:t>
       </w:r>
     </w:p>
@@ -667,6 +702,11 @@
         <w:t>langsam</w:t>
       </w:r>
       <w:r>
+        <w:rPr>
+          <w:b w:val="0"/>
+          <w:color w:val="404040"/>
+          <w:sz w:val="20"/>
+        </w:rPr>
         <w:t xml:space="preserve"> /ˈlaŋzam/</w:t>
       </w:r>
     </w:p>
@@ -755,6 +795,11 @@
         <w:t>die Tafel</w:t>
       </w:r>
       <w:r>
+        <w:rPr>
+          <w:b w:val="0"/>
+          <w:color w:val="404040"/>
+          <w:sz w:val="20"/>
+        </w:rPr>
         <w:t xml:space="preserve"> /ˈtaːfl̩/</w:t>
       </w:r>
     </w:p>
@@ -855,6 +900,11 @@
         <w:t>das Übungsbuch</w:t>
       </w:r>
       <w:r>
+        <w:rPr>
+          <w:b w:val="0"/>
+          <w:color w:val="404040"/>
+          <w:sz w:val="20"/>
+        </w:rPr>
         <w:t xml:space="preserve"> /ˈyːbʊŋsˌbuːx/</w:t>
       </w:r>
     </w:p>
@@ -983,6 +1033,11 @@
         <w:t>Wie bitte?</w:t>
       </w:r>
       <w:r>
+        <w:rPr>
+          <w:b w:val="0"/>
+          <w:color w:val="404040"/>
+          <w:sz w:val="20"/>
+        </w:rPr>
         <w:t xml:space="preserve"> /viː ˈbɪtə/</w:t>
       </w:r>
     </w:p>
@@ -1085,6 +1140,11 @@
         <w:t>Entschuldigung!</w:t>
       </w:r>
       <w:r>
+        <w:rPr>
+          <w:b w:val="0"/>
+          <w:color w:val="404040"/>
+          <w:sz w:val="20"/>
+        </w:rPr>
         <w:t xml:space="preserve"> /ɛntˈʃʊldɪɡʊŋ/</w:t>
       </w:r>
     </w:p>
@@ -1173,6 +1233,11 @@
         <w:t>die Kurssprache</w:t>
       </w:r>
       <w:r>
+        <w:rPr>
+          <w:b w:val="0"/>
+          <w:color w:val="404040"/>
+          <w:sz w:val="20"/>
+        </w:rPr>
         <w:t xml:space="preserve"> /ˈkʊʁsˌʃpʁaːxə/</w:t>
       </w:r>
     </w:p>
@@ -1261,6 +1326,11 @@
         <w:t>die Pause</w:t>
       </w:r>
       <w:r>
+        <w:rPr>
+          <w:b w:val="0"/>
+          <w:color w:val="404040"/>
+          <w:sz w:val="20"/>
+        </w:rPr>
         <w:t xml:space="preserve"> /ˈpaʊ̯zə/</w:t>
       </w:r>
     </w:p>
@@ -1361,6 +1431,11 @@
         <w:t>der Unterricht</w:t>
       </w:r>
       <w:r>
+        <w:rPr>
+          <w:b w:val="0"/>
+          <w:color w:val="404040"/>
+          <w:sz w:val="20"/>
+        </w:rPr>
         <w:t xml:space="preserve"> /ˈʊntɐˌʁɪçt/</w:t>
       </w:r>
     </w:p>
@@ -1475,6 +1550,11 @@
         <w:t>die Aufgabe</w:t>
       </w:r>
       <w:r>
+        <w:rPr>
+          <w:b w:val="0"/>
+          <w:color w:val="404040"/>
+          <w:sz w:val="20"/>
+        </w:rPr>
         <w:t xml:space="preserve"> /ˈaʊ̯fˌɡaːbə/</w:t>
       </w:r>
     </w:p>
@@ -1589,6 +1669,11 @@
         <w:t>die Übung</w:t>
       </w:r>
       <w:r>
+        <w:rPr>
+          <w:b w:val="0"/>
+          <w:color w:val="404040"/>
+          <w:sz w:val="20"/>
+        </w:rPr>
         <w:t xml:space="preserve"> /ˈyːbʊŋ/</w:t>
       </w:r>
     </w:p>
@@ -1703,6 +1788,11 @@
         <w:t>die Seite</w:t>
       </w:r>
       <w:r>
+        <w:rPr>
+          <w:b w:val="0"/>
+          <w:color w:val="404040"/>
+          <w:sz w:val="20"/>
+        </w:rPr>
         <w:t xml:space="preserve"> /ˈzaɪ̯tə/</w:t>
       </w:r>
     </w:p>
@@ -1803,6 +1893,11 @@
         <w:t>der Dialog</w:t>
       </w:r>
       <w:r>
+        <w:rPr>
+          <w:b w:val="0"/>
+          <w:color w:val="404040"/>
+          <w:sz w:val="20"/>
+        </w:rPr>
         <w:t xml:space="preserve"> /diaˈloːk/</w:t>
       </w:r>
     </w:p>
@@ -1903,6 +1998,11 @@
         <w:t>der Artikel</w:t>
       </w:r>
       <w:r>
+        <w:rPr>
+          <w:b w:val="0"/>
+          <w:color w:val="404040"/>
+          <w:sz w:val="20"/>
+        </w:rPr>
         <w:t xml:space="preserve"> /aʁˈtiːkl̩/</w:t>
       </w:r>
     </w:p>
@@ -2017,6 +2117,11 @@
         <w:t>der Text</w:t>
       </w:r>
       <w:r>
+        <w:rPr>
+          <w:b w:val="0"/>
+          <w:color w:val="404040"/>
+          <w:sz w:val="20"/>
+        </w:rPr>
         <w:t xml:space="preserve"> /tɛkst/</w:t>
       </w:r>
     </w:p>
@@ -2117,6 +2222,11 @@
         <w:t>das Wort</w:t>
       </w:r>
       <w:r>
+        <w:rPr>
+          <w:b w:val="0"/>
+          <w:color w:val="404040"/>
+          <w:sz w:val="20"/>
+        </w:rPr>
         <w:t xml:space="preserve"> /vɔʁt/</w:t>
       </w:r>
     </w:p>
@@ -2217,6 +2327,11 @@
         <w:t>der Kursteilnehmer</w:t>
       </w:r>
       <w:r>
+        <w:rPr>
+          <w:b w:val="0"/>
+          <w:color w:val="404040"/>
+          <w:sz w:val="20"/>
+        </w:rPr>
         <w:t xml:space="preserve"> / die Kursteilnehmerin /ˈkʊʁs.taɪ̯lˌneːmɐ/ /ˈkʊʁs.taɪ̯lˌneːməʁɪn/</w:t>
       </w:r>
     </w:p>
@@ -2331,6 +2446,11 @@
         <w:t>die Hausaufgabe</w:t>
       </w:r>
       <w:r>
+        <w:rPr>
+          <w:b w:val="0"/>
+          <w:color w:val="404040"/>
+          <w:sz w:val="20"/>
+        </w:rPr>
         <w:t xml:space="preserve"> /ˈhaʊ̯sˌʔaʊ̯fˌɡaːbə/</w:t>
       </w:r>
     </w:p>
@@ -2445,6 +2565,11 @@
         <w:t>der Kursleiter</w:t>
       </w:r>
       <w:r>
+        <w:rPr>
+          <w:b w:val="0"/>
+          <w:color w:val="404040"/>
+          <w:sz w:val="20"/>
+        </w:rPr>
         <w:t xml:space="preserve"> / die Kursleiterin /ˈkʊʁsˌlaɪ̯tɐ/</w:t>
       </w:r>
     </w:p>
@@ -2559,6 +2684,11 @@
         <w:t>das Wörterbuch</w:t>
       </w:r>
       <w:r>
+        <w:rPr>
+          <w:b w:val="0"/>
+          <w:color w:val="404040"/>
+          <w:sz w:val="20"/>
+        </w:rPr>
         <w:t xml:space="preserve"> /ˈvœʁtɐˌbuːx/</w:t>
       </w:r>
     </w:p>
@@ -2659,6 +2789,11 @@
         <w:t>das Kursbuch</w:t>
       </w:r>
       <w:r>
+        <w:rPr>
+          <w:b w:val="0"/>
+          <w:color w:val="404040"/>
+          <w:sz w:val="20"/>
+        </w:rPr>
         <w:t xml:space="preserve"> /ˈkʊʁsbuːx/</w:t>
       </w:r>
     </w:p>
@@ -2759,6 +2894,11 @@
         <w:t>das Papier</w:t>
       </w:r>
       <w:r>
+        <w:rPr>
+          <w:b w:val="0"/>
+          <w:color w:val="404040"/>
+          <w:sz w:val="20"/>
+        </w:rPr>
         <w:t xml:space="preserve"> /paˈpiːɐ̯/</w:t>
       </w:r>
     </w:p>
@@ -2847,6 +2987,11 @@
         <w:t>der Textmarker</w:t>
       </w:r>
       <w:r>
+        <w:rPr>
+          <w:b w:val="0"/>
+          <w:color w:val="404040"/>
+          <w:sz w:val="20"/>
+        </w:rPr>
         <w:t xml:space="preserve"> /ˈtɛkstˌmaʁkɐ/</w:t>
       </w:r>
     </w:p>
@@ -2947,6 +3092,11 @@
         <w:t>der Kugelschreiber</w:t>
       </w:r>
       <w:r>
+        <w:rPr>
+          <w:b w:val="0"/>
+          <w:color w:val="404040"/>
+          <w:sz w:val="20"/>
+        </w:rPr>
         <w:t xml:space="preserve"> /ˈkuːɡl̩ˌʃʁaɪ̯bɐ/</w:t>
       </w:r>
     </w:p>
@@ -3061,6 +3211,11 @@
         <w:t>der Bleistift</w:t>
       </w:r>
       <w:r>
+        <w:rPr>
+          <w:b w:val="0"/>
+          <w:color w:val="404040"/>
+          <w:sz w:val="20"/>
+        </w:rPr>
         <w:t xml:space="preserve"> /ˈblaɪ̯ʃtɪft/</w:t>
       </w:r>
     </w:p>
@@ -3161,6 +3316,11 @@
         <w:t>der Overheadprojektor</w:t>
       </w:r>
       <w:r>
+        <w:rPr>
+          <w:b w:val="0"/>
+          <w:color w:val="404040"/>
+          <w:sz w:val="20"/>
+        </w:rPr>
         <w:t xml:space="preserve"> /ˈoːvɐˌhɛptpʁoˌjɛktoːɐ̯/</w:t>
       </w:r>
     </w:p>
@@ -3261,6 +3421,11 @@
         <w:t>der Computer</w:t>
       </w:r>
       <w:r>
+        <w:rPr>
+          <w:b w:val="0"/>
+          <w:color w:val="404040"/>
+          <w:sz w:val="20"/>
+        </w:rPr>
         <w:t xml:space="preserve"> /kɔmˈpuːtɐ/</w:t>
       </w:r>
     </w:p>
@@ -3361,6 +3526,11 @@
         <w:t>der Fernseher</w:t>
       </w:r>
       <w:r>
+        <w:rPr>
+          <w:b w:val="0"/>
+          <w:color w:val="404040"/>
+          <w:sz w:val="20"/>
+        </w:rPr>
         <w:t xml:space="preserve"> /ˈfɛʁnˌzeːɐ̯/</w:t>
       </w:r>
     </w:p>
@@ -3461,6 +3631,11 @@
         <w:t>der DVD-Player</w:t>
       </w:r>
       <w:r>
+        <w:rPr>
+          <w:b w:val="0"/>
+          <w:color w:val="404040"/>
+          <w:sz w:val="20"/>
+        </w:rPr>
         <w:t xml:space="preserve"> /ˈdeːfaʊˌpleːɐ̯/</w:t>
       </w:r>
     </w:p>
@@ -3561,6 +3736,11 @@
         <w:t>die DVD</w:t>
       </w:r>
       <w:r>
+        <w:rPr>
+          <w:b w:val="0"/>
+          <w:color w:val="404040"/>
+          <w:sz w:val="20"/>
+        </w:rPr>
         <w:t xml:space="preserve"> /ˈdeːfaʊ/</w:t>
       </w:r>
     </w:p>
@@ -3661,6 +3841,11 @@
         <w:t>der CD-Player</w:t>
       </w:r>
       <w:r>
+        <w:rPr>
+          <w:b w:val="0"/>
+          <w:color w:val="404040"/>
+          <w:sz w:val="20"/>
+        </w:rPr>
         <w:t xml:space="preserve"> /ˈtseːdeːˌpleːɐ̯/</w:t>
       </w:r>
     </w:p>
@@ -3761,6 +3946,11 @@
         <w:t>die CD</w:t>
       </w:r>
       <w:r>
+        <w:rPr>
+          <w:b w:val="0"/>
+          <w:color w:val="404040"/>
+          <w:sz w:val="20"/>
+        </w:rPr>
         <w:t xml:space="preserve"> /ˈtseːˈdeː/</w:t>
       </w:r>
     </w:p>
@@ -3861,6 +4051,11 @@
         <w:t>der Raum</w:t>
       </w:r>
       <w:r>
+        <w:rPr>
+          <w:b w:val="0"/>
+          <w:color w:val="404040"/>
+          <w:sz w:val="20"/>
+        </w:rPr>
         <w:t xml:space="preserve"> /ʁaʊm/</w:t>
       </w:r>
     </w:p>
@@ -3975,6 +4170,11 @@
         <w:t>der Gegenstand</w:t>
       </w:r>
       <w:r>
+        <w:rPr>
+          <w:b w:val="0"/>
+          <w:color w:val="404040"/>
+          <w:sz w:val="20"/>
+        </w:rPr>
         <w:t xml:space="preserve"> /ˈɡeːɡənˌʃtant/</w:t>
       </w:r>
     </w:p>
@@ -4089,6 +4289,11 @@
         <w:t>die Strategie</w:t>
       </w:r>
       <w:r>
+        <w:rPr>
+          <w:b w:val="0"/>
+          <w:color w:val="404040"/>
+          <w:sz w:val="20"/>
+        </w:rPr>
         <w:t xml:space="preserve"> /ʃtʁateˈɡiː/</w:t>
       </w:r>
     </w:p>
@@ -4189,6 +4394,11 @@
         <w:t>der Schlüssel</w:t>
       </w:r>
       <w:r>
+        <w:rPr>
+          <w:b w:val="0"/>
+          <w:color w:val="404040"/>
+          <w:sz w:val="20"/>
+        </w:rPr>
         <w:t xml:space="preserve"> /ˈʃlʏsəl/</w:t>
       </w:r>
     </w:p>
@@ -4303,6 +4513,11 @@
         <w:t>zuordnen</w:t>
       </w:r>
       <w:r>
+        <w:rPr>
+          <w:b w:val="0"/>
+          <w:color w:val="404040"/>
+          <w:sz w:val="20"/>
+        </w:rPr>
         <w:t xml:space="preserve"> /tsuˈʔɔʁdnən/</w:t>
       </w:r>
     </w:p>
@@ -4405,6 +4620,11 @@
         <w:t>die Arbeitsanweisungen</w:t>
       </w:r>
       <w:r>
+        <w:rPr>
+          <w:b w:val="0"/>
+          <w:color w:val="404040"/>
+          <w:sz w:val="20"/>
+        </w:rPr>
         <w:t xml:space="preserve"> /ˈaʁbaɪ̯tsˌanvaɪ̯zʊŋən/</w:t>
       </w:r>
     </w:p>
@@ -4507,6 +4727,11 @@
         <w:t>die Anweisung</w:t>
       </w:r>
       <w:r>
+        <w:rPr>
+          <w:b w:val="0"/>
+          <w:color w:val="404040"/>
+          <w:sz w:val="20"/>
+        </w:rPr>
         <w:t xml:space="preserve"> /anˈvaɪ̯zʊŋ/</w:t>
       </w:r>
     </w:p>
@@ -4607,6 +4832,11 @@
         <w:t>der Teilnehmer</w:t>
       </w:r>
       <w:r>
+        <w:rPr>
+          <w:b w:val="0"/>
+          <w:color w:val="404040"/>
+          <w:sz w:val="20"/>
+        </w:rPr>
         <w:t xml:space="preserve"> / die Teilnehmerin /ˈtaɪ̯lˌneːmɐ/ /ˈtaɪ̯lˌneːməʁɪn/</w:t>
       </w:r>
     </w:p>
@@ -4735,6 +4965,11 @@
         <w:t>teilnehmen</w:t>
       </w:r>
       <w:r>
+        <w:rPr>
+          <w:b w:val="0"/>
+          <w:color w:val="404040"/>
+          <w:sz w:val="20"/>
+        </w:rPr>
         <w:t xml:space="preserve"> /ˈtaɪ̯lˌneːmən/</w:t>
       </w:r>
     </w:p>
@@ -4851,6 +5086,11 @@
         <w:t>zählen</w:t>
       </w:r>
       <w:r>
+        <w:rPr>
+          <w:b w:val="0"/>
+          <w:color w:val="404040"/>
+          <w:sz w:val="20"/>
+        </w:rPr>
         <w:t xml:space="preserve"> /ˈtsɛːlən/</w:t>
       </w:r>
     </w:p>
@@ -4939,6 +5179,11 @@
         <w:t>der Kontinent</w:t>
       </w:r>
       <w:r>
+        <w:rPr>
+          <w:b w:val="0"/>
+          <w:color w:val="404040"/>
+          <w:sz w:val="20"/>
+        </w:rPr>
         <w:t xml:space="preserve"> /kɔntiˈnɛnt/</w:t>
       </w:r>
     </w:p>
@@ -5187,6 +5432,11 @@
         <w:t>der Student</w:t>
       </w:r>
       <w:r>
+        <w:rPr>
+          <w:b w:val="0"/>
+          <w:color w:val="404040"/>
+          <w:sz w:val="20"/>
+        </w:rPr>
         <w:t xml:space="preserve"> /ʃtuˈdɛnt/</w:t>
       </w:r>
     </w:p>
@@ -5301,6 +5551,11 @@
         <w:t>vorstellen</w:t>
       </w:r>
       <w:r>
+        <w:rPr>
+          <w:b w:val="0"/>
+          <w:color w:val="404040"/>
+          <w:sz w:val="20"/>
+        </w:rPr>
         <w:t xml:space="preserve"> /foːɐ̯ˈʃtɛlən/</w:t>
       </w:r>
     </w:p>
@@ -5417,6 +5672,11 @@
         <w:t>die Gruppe</w:t>
       </w:r>
       <w:r>
+        <w:rPr>
+          <w:b w:val="0"/>
+          <w:color w:val="404040"/>
+          <w:sz w:val="20"/>
+        </w:rPr>
         <w:t xml:space="preserve"> /ˈɡʁʊpə/</w:t>
       </w:r>
     </w:p>
@@ -5517,6 +5777,11 @@
         <w:t>das Team</w:t>
       </w:r>
       <w:r>
+        <w:rPr>
+          <w:b w:val="0"/>
+          <w:color w:val="404040"/>
+          <w:sz w:val="20"/>
+        </w:rPr>
         <w:t xml:space="preserve"> /tiːm/</w:t>
       </w:r>
     </w:p>
@@ -5617,6 +5882,11 @@
         <w:t>Auf Wiedersehen!</w:t>
       </w:r>
       <w:r>
+        <w:rPr>
+          <w:b w:val="0"/>
+          <w:color w:val="404040"/>
+          <w:sz w:val="20"/>
+        </w:rPr>
         <w:t xml:space="preserve"> /aʊf ˈviːdɐˌzeːən/</w:t>
       </w:r>
     </w:p>
@@ -5719,6 +5989,11 @@
         <w:t>das Heft</w:t>
       </w:r>
       <w:r>
+        <w:rPr>
+          <w:b w:val="0"/>
+          <w:color w:val="404040"/>
+          <w:sz w:val="20"/>
+        </w:rPr>
         <w:t xml:space="preserve"> /hɛft/</w:t>
       </w:r>
     </w:p>
@@ -5833,6 +6108,11 @@
         <w:t>wer</w:t>
       </w:r>
       <w:r>
+        <w:rPr>
+          <w:b w:val="0"/>
+          <w:color w:val="404040"/>
+          <w:sz w:val="20"/>
+        </w:rPr>
         <w:t xml:space="preserve"> /veːɐ̯/</w:t>
       </w:r>
     </w:p>
@@ -5935,6 +6215,11 @@
         <w:t>ergänzen</w:t>
       </w:r>
       <w:r>
+        <w:rPr>
+          <w:b w:val="0"/>
+          <w:color w:val="404040"/>
+          <w:sz w:val="20"/>
+        </w:rPr>
         <w:t xml:space="preserve"> /ɛʁˈɡɛntsən/</w:t>
       </w:r>
     </w:p>
@@ -6037,6 +6322,11 @@
         <w:t>das Formular</w:t>
       </w:r>
       <w:r>
+        <w:rPr>
+          <w:b w:val="0"/>
+          <w:color w:val="404040"/>
+          <w:sz w:val="20"/>
+        </w:rPr>
         <w:t xml:space="preserve"> /fɔʁmuˈlaːɐ̯/</w:t>
       </w:r>
     </w:p>
@@ -6137,6 +6427,11 @@
         <w:t>die Information</w:t>
       </w:r>
       <w:r>
+        <w:rPr>
+          <w:b w:val="0"/>
+          <w:color w:val="404040"/>
+          <w:sz w:val="20"/>
+        </w:rPr>
         <w:t xml:space="preserve"> /ɪnfɔʁmaˈtsi̯oːn/</w:t>
       </w:r>
     </w:p>
@@ -6251,6 +6546,11 @@
         <w:t>das Alphabet</w:t>
       </w:r>
       <w:r>
+        <w:rPr>
+          <w:b w:val="0"/>
+          <w:color w:val="404040"/>
+          <w:sz w:val="20"/>
+        </w:rPr>
         <w:t xml:space="preserve"> /alfaˈbeːt/</w:t>
       </w:r>
     </w:p>
@@ -6351,6 +6651,11 @@
         <w:t>der Buchstabe</w:t>
       </w:r>
       <w:r>
+        <w:rPr>
+          <w:b w:val="0"/>
+          <w:color w:val="404040"/>
+          <w:sz w:val="20"/>
+        </w:rPr>
         <w:t xml:space="preserve"> /ˈbuːxʃtaːbə/</w:t>
       </w:r>
     </w:p>
@@ -6451,6 +6756,11 @@
         <w:t>sprechen</w:t>
       </w:r>
       <w:r>
+        <w:rPr>
+          <w:b w:val="0"/>
+          <w:color w:val="404040"/>
+          <w:sz w:val="20"/>
+        </w:rPr>
         <w:t xml:space="preserve"> /ˈʃpʁɛçən/</w:t>
       </w:r>
     </w:p>
@@ -6553,6 +6863,11 @@
         <w:t>mitsprechen</w:t>
       </w:r>
       <w:r>
+        <w:rPr>
+          <w:b w:val="0"/>
+          <w:color w:val="404040"/>
+          <w:sz w:val="20"/>
+        </w:rPr>
         <w:t xml:space="preserve"> /ˈmɪtˌʃpʁɛçən/</w:t>
       </w:r>
     </w:p>
@@ -6655,6 +6970,11 @@
         <w:t>buchstabieren</w:t>
       </w:r>
       <w:r>
+        <w:rPr>
+          <w:b w:val="0"/>
+          <w:color w:val="404040"/>
+          <w:sz w:val="20"/>
+        </w:rPr>
         <w:t xml:space="preserve"> /buχʃtaˈbiːʁən/</w:t>
       </w:r>
     </w:p>
@@ -6743,6 +7063,11 @@
         <w:t>enden</w:t>
       </w:r>
       <w:r>
+        <w:rPr>
+          <w:b w:val="0"/>
+          <w:color w:val="404040"/>
+          <w:sz w:val="20"/>
+        </w:rPr>
         <w:t xml:space="preserve"> /ˈɛndn̩/</w:t>
       </w:r>
     </w:p>
@@ -6845,6 +7170,11 @@
         <w:t>fast</w:t>
       </w:r>
       <w:r>
+        <w:rPr>
+          <w:b w:val="0"/>
+          <w:color w:val="404040"/>
+          <w:sz w:val="20"/>
+        </w:rPr>
         <w:t xml:space="preserve"> /fast/</w:t>
       </w:r>
     </w:p>
@@ -6933,6 +7263,11 @@
         <w:t>immer</w:t>
       </w:r>
       <w:r>
+        <w:rPr>
+          <w:b w:val="0"/>
+          <w:color w:val="404040"/>
+          <w:sz w:val="20"/>
+        </w:rPr>
         <w:t xml:space="preserve"> /ˈɪmɐ/</w:t>
       </w:r>
     </w:p>
@@ -7021,6 +7356,11 @@
         <w:t>gern geschehen</w:t>
       </w:r>
       <w:r>
+        <w:rPr>
+          <w:b w:val="0"/>
+          <w:color w:val="404040"/>
+          <w:sz w:val="20"/>
+        </w:rPr>
         <w:t xml:space="preserve"> /ɡɛʁn ɡəˈʃeːən/</w:t>
       </w:r>
     </w:p>
@@ -7151,6 +7491,11 @@
         <w:t>vielen Dank</w:t>
       </w:r>
       <w:r>
+        <w:rPr>
+          <w:b w:val="0"/>
+          <w:color w:val="404040"/>
+          <w:sz w:val="20"/>
+        </w:rPr>
         <w:t xml:space="preserve"> /ˈfiːlən ˈdaŋk/</w:t>
       </w:r>
     </w:p>
@@ -7281,6 +7626,11 @@
         <w:t>Auf Wiederhören!</w:t>
       </w:r>
       <w:r>
+        <w:rPr>
+          <w:b w:val="0"/>
+          <w:color w:val="404040"/>
+          <w:sz w:val="20"/>
+        </w:rPr>
         <w:t xml:space="preserve"> /aʊf ˈviːdɐˌhøːʁən/</w:t>
       </w:r>
     </w:p>
@@ -7397,6 +7747,11 @@
         <w:t>der Wohnort</w:t>
       </w:r>
       <w:r>
+        <w:rPr>
+          <w:b w:val="0"/>
+          <w:color w:val="404040"/>
+          <w:sz w:val="20"/>
+        </w:rPr>
         <w:t xml:space="preserve"> /ˈvoːnˌɔʁt/</w:t>
       </w:r>
     </w:p>
@@ -7569,6 +7924,11 @@
         <w:t>E-Mail-Adressen sprechen</w:t>
       </w:r>
       <w:r>
+        <w:rPr>
+          <w:b w:val="0"/>
+          <w:color w:val="404040"/>
+          <w:sz w:val="20"/>
+        </w:rPr>
         <w:t xml:space="preserve"> /ˈiːmeːl aˌdʁɛsn̩ ˈʃpʁɛçən/</w:t>
       </w:r>
     </w:p>
@@ -7685,6 +8045,11 @@
         <w:t>die E-Mail-Adresse</w:t>
       </w:r>
       <w:r>
+        <w:rPr>
+          <w:b w:val="0"/>
+          <w:color w:val="404040"/>
+          <w:sz w:val="20"/>
+        </w:rPr>
         <w:t xml:space="preserve"> /ˈiːmeːl aˈdʁɛsə/</w:t>
       </w:r>
     </w:p>
@@ -7857,6 +8222,11 @@
         <w:t>genau</w:t>
       </w:r>
       <w:r>
+        <w:rPr>
+          <w:b w:val="0"/>
+          <w:color w:val="404040"/>
+          <w:sz w:val="20"/>
+        </w:rPr>
         <w:t xml:space="preserve"> /ɡəˈnaʊ̯/</w:t>
       </w:r>
     </w:p>
@@ -7915,6 +8285,11 @@
         <w:t>die Postleitzahl</w:t>
       </w:r>
       <w:r>
+        <w:rPr>
+          <w:b w:val="0"/>
+          <w:color w:val="404040"/>
+          <w:sz w:val="20"/>
+        </w:rPr>
         <w:t xml:space="preserve"> /ˈpɔstlaɪ̯tˌtsaːl/</w:t>
       </w:r>
     </w:p>
@@ -8015,6 +8390,11 @@
         <w:t>die Muttersprache</w:t>
       </w:r>
       <w:r>
+        <w:rPr>
+          <w:b w:val="0"/>
+          <w:color w:val="404040"/>
+          <w:sz w:val="20"/>
+        </w:rPr>
         <w:t xml:space="preserve"> /ˈmʊtɐˌʃpʁaːxə/</w:t>
       </w:r>
     </w:p>
@@ -8099,6 +8479,11 @@
         <w:t>brauchen</w:t>
       </w:r>
       <w:r>
+        <w:rPr>
+          <w:b w:val="0"/>
+          <w:color w:val="404040"/>
+          <w:sz w:val="20"/>
+        </w:rPr>
         <w:t xml:space="preserve"> /ˈbʁaʊ̯xən/</w:t>
       </w:r>
     </w:p>
@@ -8217,6 +8602,11 @@
         <w:t>der Herr</w:t>
       </w:r>
       <w:r>
+        <w:rPr>
+          <w:b w:val="0"/>
+          <w:color w:val="404040"/>
+          <w:sz w:val="20"/>
+        </w:rPr>
         <w:t xml:space="preserve"> /hɛʁ/</w:t>
       </w:r>
     </w:p>
@@ -8287,6 +8677,11 @@
         <w:t>das Telefongespräch</w:t>
       </w:r>
       <w:r>
+        <w:rPr>
+          <w:b w:val="0"/>
+          <w:color w:val="404040"/>
+          <w:sz w:val="20"/>
+        </w:rPr>
         <w:t xml:space="preserve"> /teˈlefoːnɡəˌʃpʁɛːç/</w:t>
       </w:r>
     </w:p>
@@ -8431,6 +8826,11 @@
         <w:t>korrigieren</w:t>
       </w:r>
       <w:r>
+        <w:rPr>
+          <w:b w:val="0"/>
+          <w:color w:val="404040"/>
+          <w:sz w:val="20"/>
+        </w:rPr>
         <w:t xml:space="preserve"> /kɔʁiˈɡiːʁən/</w:t>
       </w:r>
     </w:p>
@@ -8577,6 +8977,11 @@
         <w:t>der Personalbogen</w:t>
       </w:r>
       <w:r>
+        <w:rPr>
+          <w:b w:val="0"/>
+          <w:color w:val="404040"/>
+          <w:sz w:val="20"/>
+        </w:rPr>
         <w:t xml:space="preserve"> /pɛʁzoˈnaːlˌboːɡn̩/</w:t>
       </w:r>
     </w:p>
@@ -8735,6 +9140,11 @@
         <w:t>die Bürokratie</w:t>
       </w:r>
       <w:r>
+        <w:rPr>
+          <w:b w:val="0"/>
+          <w:color w:val="404040"/>
+          <w:sz w:val="20"/>
+        </w:rPr>
         <w:t xml:space="preserve"> /byʁokʁaˈtiː/</w:t>
       </w:r>
     </w:p>
@@ -8879,6 +9289,11 @@
         <w:t>von A bis Z</w:t>
       </w:r>
       <w:r>
+        <w:rPr>
+          <w:b w:val="0"/>
+          <w:color w:val="404040"/>
+          <w:sz w:val="20"/>
+        </w:rPr>
         <w:t xml:space="preserve"> /fɔn aː bɪs tsɛt/</w:t>
       </w:r>
     </w:p>
@@ -9025,6 +9440,11 @@
         <w:t>tauschen</w:t>
       </w:r>
       <w:r>
+        <w:rPr>
+          <w:b w:val="0"/>
+          <w:color w:val="404040"/>
+          <w:sz w:val="20"/>
+        </w:rPr>
         <w:t xml:space="preserve"> /ˈtaʊ̯ʃən/</w:t>
       </w:r>
     </w:p>
@@ -9201,6 +9621,11 @@
         <w:t>der Kurs</w:t>
       </w:r>
       <w:r>
+        <w:rPr>
+          <w:b w:val="0"/>
+          <w:color w:val="404040"/>
+          <w:sz w:val="20"/>
+        </w:rPr>
         <w:t xml:space="preserve"> /kʊʁs/</w:t>
       </w:r>
     </w:p>
@@ -9359,6 +9784,11 @@
         <w:t>die Handynummer</w:t>
       </w:r>
       <w:r>
+        <w:rPr>
+          <w:b w:val="0"/>
+          <w:color w:val="404040"/>
+          <w:sz w:val="20"/>
+        </w:rPr>
         <w:t xml:space="preserve"> /ˈhɛndiˌnʊmɐ/</w:t>
       </w:r>
     </w:p>
@@ -9517,6 +9947,11 @@
         <w:t>die Zahlen ab 11</w:t>
       </w:r>
       <w:r>
+        <w:rPr>
+          <w:b w:val="0"/>
+          <w:color w:val="404040"/>
+          <w:sz w:val="20"/>
+        </w:rPr>
         <w:t xml:space="preserve"> /diː ˈtsaːlən ap ɛlf/</w:t>
       </w:r>
     </w:p>
@@ -11974,6 +12409,11 @@
         <w:t>mehr</w:t>
       </w:r>
       <w:r>
+        <w:rPr>
+          <w:b w:val="0"/>
+          <w:color w:val="404040"/>
+          <w:sz w:val="20"/>
+        </w:rPr>
         <w:t xml:space="preserve"> /meːɐ̯/</w:t>
       </w:r>
     </w:p>
@@ -12120,6 +12560,11 @@
         <w:t>noch einmal</w:t>
       </w:r>
       <w:r>
+        <w:rPr>
+          <w:b w:val="0"/>
+          <w:color w:val="404040"/>
+          <w:sz w:val="20"/>
+        </w:rPr>
         <w:t xml:space="preserve"> /nɔx ˈaɪ̯nmaːl/</w:t>
       </w:r>
     </w:p>
@@ -12296,6 +12741,11 @@
         <w:t>der Notizzettel</w:t>
       </w:r>
       <w:r>
+        <w:rPr>
+          <w:b w:val="0"/>
+          <w:color w:val="404040"/>
+          <w:sz w:val="20"/>
+        </w:rPr>
         <w:t xml:space="preserve"> /noˈtiːtsˌtsɛtl̩/</w:t>
       </w:r>
     </w:p>
@@ -12454,6 +12904,11 @@
         <w:t>Tschüss</w:t>
       </w:r>
       <w:r>
+        <w:rPr>
+          <w:b w:val="0"/>
+          <w:color w:val="404040"/>
+          <w:sz w:val="20"/>
+        </w:rPr>
         <w:t xml:space="preserve"> /tʃʏs/</w:t>
       </w:r>
     </w:p>
@@ -12586,6 +13041,11 @@
         <w:t>Tschau</w:t>
       </w:r>
       <w:r>
+        <w:rPr>
+          <w:b w:val="0"/>
+          <w:color w:val="404040"/>
+          <w:sz w:val="20"/>
+        </w:rPr>
         <w:t xml:space="preserve"> /tʃaʊ/</w:t>
       </w:r>
     </w:p>
@@ -12702,6 +13162,11 @@
         <w:t>später</w:t>
       </w:r>
       <w:r>
+        <w:rPr>
+          <w:b w:val="0"/>
+          <w:color w:val="404040"/>
+          <w:sz w:val="20"/>
+        </w:rPr>
         <w:t xml:space="preserve"> /ˈʃpɛːtɐ/</w:t>
       </w:r>
     </w:p>
@@ -12848,6 +13313,11 @@
         <w:t>bis</w:t>
       </w:r>
       <w:r>
+        <w:rPr>
+          <w:b w:val="0"/>
+          <w:color w:val="404040"/>
+          <w:sz w:val="20"/>
+        </w:rPr>
         <w:t xml:space="preserve"> /bɪs/</w:t>
       </w:r>
     </w:p>
@@ -12980,6 +13450,11 @@
         <w:t>dann</w:t>
       </w:r>
       <w:r>
+        <w:rPr>
+          <w:b w:val="0"/>
+          <w:color w:val="404040"/>
+          <w:sz w:val="20"/>
+        </w:rPr>
         <w:t xml:space="preserve"> /dan/</w:t>
       </w:r>
     </w:p>
@@ -13126,6 +13601,11 @@
         <w:t>die Vorwahl</w:t>
       </w:r>
       <w:r>
+        <w:rPr>
+          <w:b w:val="0"/>
+          <w:color w:val="404040"/>
+          <w:sz w:val="20"/>
+        </w:rPr>
         <w:t xml:space="preserve"> /ˈfoːɐ̯vaːl/</w:t>
       </w:r>
     </w:p>
@@ -13284,6 +13764,11 @@
         <w:t>können</w:t>
       </w:r>
       <w:r>
+        <w:rPr>
+          <w:b w:val="0"/>
+          <w:color w:val="404040"/>
+          <w:sz w:val="20"/>
+        </w:rPr>
         <w:t xml:space="preserve"> /ˈkœnən/</w:t>
       </w:r>
     </w:p>
@@ -14047,6 +14532,11 @@
         <w:t>wiederholen</w:t>
       </w:r>
       <w:r>
+        <w:rPr>
+          <w:b w:val="0"/>
+          <w:color w:val="404040"/>
+          <w:sz w:val="20"/>
+        </w:rPr>
         <w:t xml:space="preserve"> /viːdɐˈhoːlən/</w:t>
       </w:r>
     </w:p>
@@ -14195,6 +14685,11 @@
         <w:t>wieder</w:t>
       </w:r>
       <w:r>
+        <w:rPr>
+          <w:b w:val="0"/>
+          <w:color w:val="404040"/>
+          <w:sz w:val="20"/>
+        </w:rPr>
         <w:t xml:space="preserve"> /ˈviːdɐ/</w:t>
       </w:r>
     </w:p>
@@ -14357,6 +14852,11 @@
         <w:t>die Telefonnummer</w:t>
       </w:r>
       <w:r>
+        <w:rPr>
+          <w:b w:val="0"/>
+          <w:color w:val="404040"/>
+          <w:sz w:val="20"/>
+        </w:rPr>
         <w:t xml:space="preserve"> /teˈlefoːnˌnʊmɐ/</w:t>
       </w:r>
     </w:p>
@@ -14515,6 +15015,11 @@
         <w:t>die Straße</w:t>
       </w:r>
       <w:r>
+        <w:rPr>
+          <w:b w:val="0"/>
+          <w:color w:val="404040"/>
+          <w:sz w:val="20"/>
+        </w:rPr>
         <w:t xml:space="preserve"> /ˈʃtʁaːsə/</w:t>
       </w:r>
     </w:p>
@@ -14673,6 +15178,11 @@
         <w:t>wohnen</w:t>
       </w:r>
       <w:r>
+        <w:rPr>
+          <w:b w:val="0"/>
+          <w:color w:val="404040"/>
+          <w:sz w:val="20"/>
+        </w:rPr>
         <w:t xml:space="preserve"> /ˈvoːnən/</w:t>
       </w:r>
     </w:p>
@@ -14819,6 +15329,11 @@
         <w:t>gern</w:t>
       </w:r>
       <w:r>
+        <w:rPr>
+          <w:b w:val="0"/>
+          <w:color w:val="404040"/>
+          <w:sz w:val="20"/>
+        </w:rPr>
         <w:t xml:space="preserve"> /ɡɛʁn/</w:t>
       </w:r>
     </w:p>
@@ -15025,6 +15540,11 @@
         <w:t>heute</w:t>
       </w:r>
       <w:r>
+        <w:rPr>
+          <w:b w:val="0"/>
+          <w:color w:val="404040"/>
+          <w:sz w:val="20"/>
+        </w:rPr>
         <w:t xml:space="preserve"> /ˈhɔʏtə/</w:t>
       </w:r>
     </w:p>
@@ -15143,6 +15663,11 @@
         <w:t>zum</w:t>
       </w:r>
       <w:r>
+        <w:rPr>
+          <w:b w:val="0"/>
+          <w:color w:val="404040"/>
+          <w:sz w:val="20"/>
+        </w:rPr>
         <w:t xml:space="preserve"> /tsʊm/</w:t>
       </w:r>
     </w:p>
@@ -15289,6 +15814,11 @@
         <w:t>essen</w:t>
       </w:r>
       <w:r>
+        <w:rPr>
+          <w:b w:val="0"/>
+          <w:color w:val="404040"/>
+          <w:sz w:val="20"/>
+        </w:rPr>
         <w:t xml:space="preserve"> /ˈɛsn̩/</w:t>
       </w:r>
     </w:p>
@@ -15435,6 +15965,11 @@
         <w:t>die Zahlen 0-10</w:t>
       </w:r>
       <w:r>
+        <w:rPr>
+          <w:b w:val="0"/>
+          <w:color w:val="404040"/>
+          <w:sz w:val="20"/>
+        </w:rPr>
         <w:t xml:space="preserve"> /diː ˈtsaːlən nʊl bɪs tseːn/</w:t>
       </w:r>
     </w:p>
@@ -16082,6 +16617,11 @@
         <w:t>die Nummer</w:t>
       </w:r>
       <w:r>
+        <w:rPr>
+          <w:b w:val="0"/>
+          <w:color w:val="404040"/>
+          <w:sz w:val="20"/>
+        </w:rPr>
         <w:t xml:space="preserve"> /ˈnʊmɐ/</w:t>
       </w:r>
     </w:p>
@@ -16240,6 +16780,11 @@
         <w:t>die Zahl</w:t>
       </w:r>
       <w:r>
+        <w:rPr>
+          <w:b w:val="0"/>
+          <w:color w:val="404040"/>
+          <w:sz w:val="20"/>
+        </w:rPr>
         <w:t xml:space="preserve"> /tsaːl/</w:t>
       </w:r>
     </w:p>
@@ -16398,6 +16943,11 @@
         <w:t>von</w:t>
       </w:r>
       <w:r>
+        <w:rPr>
+          <w:b w:val="0"/>
+          <w:color w:val="404040"/>
+          <w:sz w:val="20"/>
+        </w:rPr>
         <w:t xml:space="preserve"> /fɔn/</w:t>
       </w:r>
     </w:p>
@@ -16574,6 +17124,11 @@
         <w:t>stehen</w:t>
       </w:r>
       <w:r>
+        <w:rPr>
+          <w:b w:val="0"/>
+          <w:color w:val="404040"/>
+          <w:sz w:val="20"/>
+        </w:rPr>
         <w:t xml:space="preserve"> /ˈʃteːən/</w:t>
       </w:r>
     </w:p>
@@ -16720,6 +17275,11 @@
         <w:t>die Regel</w:t>
       </w:r>
       <w:r>
+        <w:rPr>
+          <w:b w:val="0"/>
+          <w:color w:val="404040"/>
+          <w:sz w:val="20"/>
+        </w:rPr>
         <w:t xml:space="preserve"> /ˈʁeːɡl̩/</w:t>
       </w:r>
     </w:p>
@@ -16864,6 +17424,11 @@
         <w:t>schreiben</w:t>
       </w:r>
       <w:r>
+        <w:rPr>
+          <w:b w:val="0"/>
+          <w:color w:val="404040"/>
+          <w:sz w:val="20"/>
+        </w:rPr>
         <w:t xml:space="preserve"> /ˈʃʁaɪ̯bən/</w:t>
       </w:r>
     </w:p>
@@ -16996,6 +17561,11 @@
         <w:t>der Satz</w:t>
       </w:r>
       <w:r>
+        <w:rPr>
+          <w:b w:val="0"/>
+          <w:color w:val="404040"/>
+          <w:sz w:val="20"/>
+        </w:rPr>
         <w:t xml:space="preserve"> /zats/</w:t>
       </w:r>
     </w:p>
@@ -17154,6 +17724,11 @@
         <w:t>Länder, Sprachen, Nationalitäten</w:t>
       </w:r>
       <w:r>
+        <w:rPr>
+          <w:b w:val="0"/>
+          <w:color w:val="404040"/>
+          <w:sz w:val="20"/>
+        </w:rPr>
         <w:t xml:space="preserve"> /ˈlɛndɐ ˈʃpʁaːxən natsi̯onaliˈtɛːtən/</w:t>
       </w:r>
     </w:p>
@@ -17914,6 +18489,11 @@
         <w:t>Viel Spaß!</w:t>
       </w:r>
       <w:r>
+        <w:rPr>
+          <w:b w:val="0"/>
+          <w:color w:val="404040"/>
+          <w:sz w:val="20"/>
+        </w:rPr>
         <w:t xml:space="preserve"> /fiːl ʃpaːs/</w:t>
       </w:r>
     </w:p>
@@ -18016,6 +18596,11 @@
         <w:t>der Spaß</w:t>
       </w:r>
       <w:r>
+        <w:rPr>
+          <w:b w:val="0"/>
+          <w:color w:val="404040"/>
+          <w:sz w:val="20"/>
+        </w:rPr>
         <w:t xml:space="preserve"> /ʃpaːs/</w:t>
       </w:r>
     </w:p>
@@ -18130,6 +18715,11 @@
         <w:t>viel</w:t>
       </w:r>
       <w:r>
+        <w:rPr>
+          <w:b w:val="0"/>
+          <w:color w:val="404040"/>
+          <w:sz w:val="20"/>
+        </w:rPr>
         <w:t xml:space="preserve"> /fiːl/</w:t>
       </w:r>
     </w:p>
@@ -18232,6 +18822,11 @@
         <w:t>zusammen</w:t>
       </w:r>
       <w:r>
+        <w:rPr>
+          <w:b w:val="0"/>
+          <w:color w:val="404040"/>
+          <w:sz w:val="20"/>
+        </w:rPr>
         <w:t xml:space="preserve"> /tsuˈzamən/</w:t>
       </w:r>
     </w:p>
@@ -18378,6 +18973,11 @@
         <w:t>Hoi</w:t>
       </w:r>
       <w:r>
+        <w:rPr>
+          <w:b w:val="0"/>
+          <w:color w:val="404040"/>
+          <w:sz w:val="20"/>
+        </w:rPr>
         <w:t xml:space="preserve"> /hɔɪ/</w:t>
       </w:r>
     </w:p>
@@ -18524,6 +19124,11 @@
         <w:t>die Argentinierin</w:t>
       </w:r>
       <w:r>
+        <w:rPr>
+          <w:b w:val="0"/>
+          <w:color w:val="404040"/>
+          <w:sz w:val="20"/>
+        </w:rPr>
         <w:t xml:space="preserve"> /aʁɡɛnˈtsiːnəʁɪn/</w:t>
       </w:r>
     </w:p>
@@ -18668,6 +19273,11 @@
         <w:t>Servus</w:t>
       </w:r>
       <w:r>
+        <w:rPr>
+          <w:b w:val="0"/>
+          <w:color w:val="404040"/>
+          <w:sz w:val="20"/>
+        </w:rPr>
         <w:t xml:space="preserve"> /ˈzɛɐ̯vus/</w:t>
       </w:r>
     </w:p>
@@ -18798,6 +19408,11 @@
         <w:t>in</w:t>
       </w:r>
       <w:r>
+        <w:rPr>
+          <w:b w:val="0"/>
+          <w:color w:val="404040"/>
+          <w:sz w:val="20"/>
+        </w:rPr>
         <w:t xml:space="preserve"> /ɪn/</w:t>
       </w:r>
     </w:p>
@@ -18930,6 +19545,11 @@
         <w:t>der neue Praktikant</w:t>
       </w:r>
       <w:r>
+        <w:rPr>
+          <w:b w:val="0"/>
+          <w:color w:val="404040"/>
+          <w:sz w:val="20"/>
+        </w:rPr>
         <w:t xml:space="preserve"> /deːɐ̯ ˈnɔʏə pʁaktiˈkant/</w:t>
       </w:r>
     </w:p>
@@ -19990,6 +20610,11 @@
         <w:t>auch</w:t>
       </w:r>
       <w:r>
+        <w:rPr>
+          <w:b w:val="0"/>
+          <w:color w:val="404040"/>
+          <w:sz w:val="20"/>
+        </w:rPr>
         <w:t xml:space="preserve"> /aʊ̯x/</w:t>
       </w:r>
     </w:p>
@@ -20122,6 +20747,11 @@
         <w:t>Wie geht’s?</w:t>
       </w:r>
       <w:r>
+        <w:rPr>
+          <w:b w:val="0"/>
+          <w:color w:val="404040"/>
+          <w:sz w:val="20"/>
+        </w:rPr>
         <w:t xml:space="preserve"> /viː ɡeːts/</w:t>
       </w:r>
     </w:p>
@@ -20416,6 +21046,11 @@
         <w:t>Freut mich</w:t>
       </w:r>
       <w:r>
+        <w:rPr>
+          <w:b w:val="0"/>
+          <w:color w:val="404040"/>
+          <w:sz w:val="20"/>
+        </w:rPr>
         <w:t xml:space="preserve"> /fʁɔʏ̯t mɪç/</w:t>
       </w:r>
     </w:p>
@@ -20576,6 +21211,11 @@
         <w:t>Reflexivpronomen</w:t>
       </w:r>
       <w:r>
+        <w:rPr>
+          <w:b w:val="0"/>
+          <w:color w:val="404040"/>
+          <w:sz w:val="20"/>
+        </w:rPr>
         <w:t xml:space="preserve"> /ʁeflɛˈksiːfˌpʁoːnoːmən/</w:t>
       </w:r>
     </w:p>
@@ -21214,6 +21854,11 @@
         <w:t>Personalpronomen</w:t>
       </w:r>
       <w:r>
+        <w:rPr>
+          <w:b w:val="0"/>
+          <w:color w:val="404040"/>
+          <w:sz w:val="20"/>
+        </w:rPr>
         <w:t xml:space="preserve"> /pɛʁzoˈnaːlˌpʁoːnoːmən/</w:t>
       </w:r>
     </w:p>
@@ -22032,6 +22677,11 @@
         <w:t>sich vorstellen</w:t>
       </w:r>
       <w:r>
+        <w:rPr>
+          <w:b w:val="0"/>
+          <w:color w:val="404040"/>
+          <w:sz w:val="20"/>
+        </w:rPr>
         <w:t xml:space="preserve"> /zɪç ˈfoːɐ̯ˌʃtɛlən/</w:t>
       </w:r>
     </w:p>
@@ -22252,6 +22902,11 @@
         <w:t>begrüßen</w:t>
       </w:r>
       <w:r>
+        <w:rPr>
+          <w:b w:val="0"/>
+          <w:color w:val="404040"/>
+          <w:sz w:val="20"/>
+        </w:rPr>
         <w:t xml:space="preserve"> /bəˈɡʁyːsn̩/</w:t>
       </w:r>
     </w:p>
@@ -22354,6 +23009,11 @@
         <w:t>der Partner</w:t>
       </w:r>
       <w:r>
+        <w:rPr>
+          <w:b w:val="0"/>
+          <w:color w:val="404040"/>
+          <w:sz w:val="20"/>
+        </w:rPr>
         <w:t xml:space="preserve"> / die Partnerin /ˈpaʁtnɐ/ /ˈpaʁtnəʁɪn/</w:t>
       </w:r>
     </w:p>
@@ -22484,6 +23144,11 @@
         <w:t>Wie heißt ...?</w:t>
       </w:r>
       <w:r>
+        <w:rPr>
+          <w:b w:val="0"/>
+          <w:color w:val="404040"/>
+          <w:sz w:val="20"/>
+        </w:rPr>
         <w:t xml:space="preserve"> /viː haɪ̯st/</w:t>
       </w:r>
     </w:p>
@@ -22586,6 +23251,11 @@
         <w:t>das Land</w:t>
       </w:r>
       <w:r>
+        <w:rPr>
+          <w:b w:val="0"/>
+          <w:color w:val="404040"/>
+          <w:sz w:val="20"/>
+        </w:rPr>
         <w:t xml:space="preserve"> /lant/</w:t>
       </w:r>
     </w:p>
@@ -22686,6 +23356,11 @@
         <w:t>die Sprache</w:t>
       </w:r>
       <w:r>
+        <w:rPr>
+          <w:b w:val="0"/>
+          <w:color w:val="404040"/>
+          <w:sz w:val="20"/>
+        </w:rPr>
         <w:t xml:space="preserve"> /ˈʃpʁaːxə/</w:t>
       </w:r>
     </w:p>
@@ -22800,6 +23475,11 @@
         <w:t>Ihr-</w:t>
       </w:r>
       <w:r>
+        <w:rPr>
+          <w:b w:val="0"/>
+          <w:color w:val="404040"/>
+          <w:sz w:val="20"/>
+        </w:rPr>
         <w:t xml:space="preserve"> /iːɐ̯/</w:t>
       </w:r>
     </w:p>
@@ -22932,6 +23612,11 @@
         <w:t>fliegen</w:t>
       </w:r>
       <w:r>
+        <w:rPr>
+          <w:b w:val="0"/>
+          <w:color w:val="404040"/>
+          <w:sz w:val="20"/>
+        </w:rPr>
         <w:t xml:space="preserve"> /ˈfliːɡən/</w:t>
       </w:r>
     </w:p>
@@ -23020,6 +23705,11 @@
         <w:t>reisen</w:t>
       </w:r>
       <w:r>
+        <w:rPr>
+          <w:b w:val="0"/>
+          <w:color w:val="404040"/>
+          <w:sz w:val="20"/>
+        </w:rPr>
         <w:t xml:space="preserve"> /ˈʁaɪ̯zn̩/</w:t>
       </w:r>
     </w:p>
@@ -23108,6 +23798,11 @@
         <w:t>fahren</w:t>
       </w:r>
       <w:r>
+        <w:rPr>
+          <w:b w:val="0"/>
+          <w:color w:val="404040"/>
+          <w:sz w:val="20"/>
+        </w:rPr>
         <w:t xml:space="preserve"> /ˈfaːʁən/</w:t>
       </w:r>
     </w:p>
@@ -23210,6 +23905,11 @@
         <w:t>gehen</w:t>
       </w:r>
       <w:r>
+        <w:rPr>
+          <w:b w:val="0"/>
+          <w:color w:val="404040"/>
+          <w:sz w:val="20"/>
+        </w:rPr>
         <w:t xml:space="preserve"> /ˈɡeːən/</w:t>
       </w:r>
     </w:p>
@@ -23312,6 +24012,11 @@
         <w:t>aber</w:t>
       </w:r>
       <w:r>
+        <w:rPr>
+          <w:b w:val="0"/>
+          <w:color w:val="404040"/>
+          <w:sz w:val="20"/>
+        </w:rPr>
         <w:t xml:space="preserve"> /ˈaːbɐ/</w:t>
       </w:r>
     </w:p>
@@ -23414,6 +24119,11 @@
         <w:t>auffallen</w:t>
       </w:r>
       <w:r>
+        <w:rPr>
+          <w:b w:val="0"/>
+          <w:color w:val="404040"/>
+          <w:sz w:val="20"/>
+        </w:rPr>
         <w:t xml:space="preserve"> /ˈaʊ̯fˌfalən/</w:t>
       </w:r>
     </w:p>
@@ -23516,6 +24226,11 @@
         <w:t>markieren</w:t>
       </w:r>
       <w:r>
+        <w:rPr>
+          <w:b w:val="0"/>
+          <w:color w:val="404040"/>
+          <w:sz w:val="20"/>
+        </w:rPr>
         <w:t xml:space="preserve"> /maʁˈkiːʁən/</w:t>
       </w:r>
     </w:p>
@@ -23604,6 +24319,11 @@
         <w:t>heißen</w:t>
       </w:r>
       <w:r>
+        <w:rPr>
+          <w:b w:val="0"/>
+          <w:color w:val="404040"/>
+          <w:sz w:val="20"/>
+        </w:rPr>
         <w:t xml:space="preserve"> /ˈhaɪ̯sn̩/</w:t>
       </w:r>
     </w:p>
@@ -23736,6 +24456,11 @@
         <w:t>die W-Frage</w:t>
       </w:r>
       <w:r>
+        <w:rPr>
+          <w:b w:val="0"/>
+          <w:color w:val="404040"/>
+          <w:sz w:val="20"/>
+        </w:rPr>
         <w:t xml:space="preserve"> /ˈveːˌfraːɡə/</w:t>
       </w:r>
     </w:p>
@@ -23850,6 +24575,11 @@
         <w:t>die Antwort</w:t>
       </w:r>
       <w:r>
+        <w:rPr>
+          <w:b w:val="0"/>
+          <w:color w:val="404040"/>
+          <w:sz w:val="20"/>
+        </w:rPr>
         <w:t xml:space="preserve"> /ˈantˌvɔʁt/</w:t>
       </w:r>
     </w:p>
@@ -23950,6 +24680,11 @@
         <w:t>sammeln</w:t>
       </w:r>
       <w:r>
+        <w:rPr>
+          <w:b w:val="0"/>
+          <w:color w:val="404040"/>
+          <w:sz w:val="20"/>
+        </w:rPr>
         <w:t xml:space="preserve"> /ˈzaməln/</w:t>
       </w:r>
     </w:p>
@@ -24038,6 +24773,11 @@
         <w:t>die Tabelle</w:t>
       </w:r>
       <w:r>
+        <w:rPr>
+          <w:b w:val="0"/>
+          <w:color w:val="404040"/>
+          <w:sz w:val="20"/>
+        </w:rPr>
         <w:t xml:space="preserve"> /taˈbɛlə/</w:t>
       </w:r>
     </w:p>
@@ -24138,6 +24878,11 @@
         <w:t>die Verbform</w:t>
       </w:r>
       <w:r>
+        <w:rPr>
+          <w:b w:val="0"/>
+          <w:color w:val="404040"/>
+          <w:sz w:val="20"/>
+        </w:rPr>
         <w:t xml:space="preserve"> /ˈfɔʁm/</w:t>
       </w:r>
     </w:p>
@@ -24252,6 +24997,11 @@
         <w:t>die Grammatik</w:t>
       </w:r>
       <w:r>
+        <w:rPr>
+          <w:b w:val="0"/>
+          <w:color w:val="404040"/>
+          <w:sz w:val="20"/>
+        </w:rPr>
         <w:t xml:space="preserve"> /ɡʁaˈmaːtɪk/</w:t>
       </w:r>
     </w:p>
@@ -24352,6 +25102,11 @@
         <w:t>auf einen Blick</w:t>
       </w:r>
       <w:r>
+        <w:rPr>
+          <w:b w:val="0"/>
+          <w:color w:val="404040"/>
+          <w:sz w:val="20"/>
+        </w:rPr>
         <w:t xml:space="preserve"> /aʊ̯f ˈaɪ̯nən ˈblɪk/</w:t>
       </w:r>
     </w:p>
@@ -24440,6 +25195,11 @@
         <w:t>der Blick</w:t>
       </w:r>
       <w:r>
+        <w:rPr>
+          <w:b w:val="0"/>
+          <w:color w:val="404040"/>
+          <w:sz w:val="20"/>
+        </w:rPr>
         <w:t xml:space="preserve"> /blɪk/</w:t>
       </w:r>
     </w:p>
@@ -24570,6 +25330,11 @@
         <w:t>das Verb</w:t>
       </w:r>
       <w:r>
+        <w:rPr>
+          <w:b w:val="0"/>
+          <w:color w:val="404040"/>
+          <w:sz w:val="20"/>
+        </w:rPr>
         <w:t xml:space="preserve"> /vɛʁp/</w:t>
       </w:r>
     </w:p>
@@ -24700,6 +25465,11 @@
         <w:t>alles</w:t>
       </w:r>
       <w:r>
+        <w:rPr>
+          <w:b w:val="0"/>
+          <w:color w:val="404040"/>
+          <w:sz w:val="20"/>
+        </w:rPr>
         <w:t xml:space="preserve"> /ˈaləs/</w:t>
       </w:r>
     </w:p>
@@ -24818,6 +25588,11 @@
         <w:t>richtig</w:t>
       </w:r>
       <w:r>
+        <w:rPr>
+          <w:b w:val="0"/>
+          <w:color w:val="404040"/>
+          <w:sz w:val="20"/>
+        </w:rPr>
         <w:t xml:space="preserve"> /ˈʁɪçtɪç/</w:t>
       </w:r>
     </w:p>
@@ -24936,6 +25711,11 @@
         <w:t>die Sekretärin</w:t>
       </w:r>
       <w:r>
+        <w:rPr>
+          <w:b w:val="0"/>
+          <w:color w:val="404040"/>
+          <w:sz w:val="20"/>
+        </w:rPr>
         <w:t xml:space="preserve"> /zekʁeˈtɛːʁɪn/</w:t>
       </w:r>
     </w:p>
@@ -25066,6 +25846,11 @@
         <w:t>die Frau</w:t>
       </w:r>
       <w:r>
+        <w:rPr>
+          <w:b w:val="0"/>
+          <w:color w:val="404040"/>
+          <w:sz w:val="20"/>
+        </w:rPr>
         <w:t xml:space="preserve"> /fraʊ̯/</w:t>
       </w:r>
     </w:p>
@@ -25196,6 +25981,11 @@
         <w:t>aus</w:t>
       </w:r>
       <w:r>
+        <w:rPr>
+          <w:b w:val="0"/>
+          <w:color w:val="404040"/>
+          <w:sz w:val="20"/>
+        </w:rPr>
         <w:t xml:space="preserve"> /aʊ̯s/</w:t>
       </w:r>
     </w:p>
@@ -25314,6 +26104,11 @@
         <w:t>Argentinien</w:t>
       </w:r>
       <w:r>
+        <w:rPr>
+          <w:b w:val="0"/>
+          <w:color w:val="404040"/>
+          <w:sz w:val="20"/>
+        </w:rPr>
         <w:t xml:space="preserve"> /aʁɡɛnˈtiːni̯ən/</w:t>
       </w:r>
     </w:p>
@@ -25402,6 +26197,11 @@
         <w:t>woher</w:t>
       </w:r>
       <w:r>
+        <w:rPr>
+          <w:b w:val="0"/>
+          <w:color w:val="404040"/>
+          <w:sz w:val="20"/>
+        </w:rPr>
         <w:t xml:space="preserve"> /ˈvoheːɐ̯/</w:t>
       </w:r>
     </w:p>
@@ -25520,6 +26320,11 @@
         <w:t>kommen</w:t>
       </w:r>
       <w:r>
+        <w:rPr>
+          <w:b w:val="0"/>
+          <w:color w:val="404040"/>
+          <w:sz w:val="20"/>
+        </w:rPr>
         <w:t xml:space="preserve"> /ˈkɔmən/</w:t>
       </w:r>
     </w:p>
@@ -25668,6 +26473,11 @@
         <w:t>Grüß Gott!</w:t>
       </w:r>
       <w:r>
+        <w:rPr>
+          <w:b w:val="0"/>
+          <w:color w:val="404040"/>
+          <w:sz w:val="20"/>
+        </w:rPr>
         <w:t xml:space="preserve"> /ˈɡʁʏs ˈɡɔt/</w:t>
       </w:r>
     </w:p>
@@ -25770,6 +26580,11 @@
         <w:t>lesen</w:t>
       </w:r>
       <w:r>
+        <w:rPr>
+          <w:b w:val="0"/>
+          <w:color w:val="404040"/>
+          <w:sz w:val="20"/>
+        </w:rPr>
         <w:t xml:space="preserve"> /ˈleːzən/</w:t>
       </w:r>
     </w:p>
@@ -25858,6 +26673,11 @@
         <w:t>sagen</w:t>
       </w:r>
       <w:r>
+        <w:rPr>
+          <w:b w:val="0"/>
+          <w:color w:val="404040"/>
+          <w:sz w:val="20"/>
+        </w:rPr>
         <w:t xml:space="preserve"> /ˈzaːɡən/</w:t>
       </w:r>
     </w:p>
@@ -25946,6 +26766,11 @@
         <w:t>die Person</w:t>
       </w:r>
       <w:r>
+        <w:rPr>
+          <w:b w:val="0"/>
+          <w:color w:val="404040"/>
+          <w:sz w:val="20"/>
+        </w:rPr>
         <w:t xml:space="preserve"> /pɛʁˈzoːn/</w:t>
       </w:r>
     </w:p>
@@ -26046,6 +26871,11 @@
         <w:t>was</w:t>
       </w:r>
       <w:r>
+        <w:rPr>
+          <w:b w:val="0"/>
+          <w:color w:val="404040"/>
+          <w:sz w:val="20"/>
+        </w:rPr>
         <w:t xml:space="preserve"> /vas/</w:t>
       </w:r>
     </w:p>
@@ -26134,6 +26964,11 @@
         <w:t>passen</w:t>
       </w:r>
       <w:r>
+        <w:rPr>
+          <w:b w:val="0"/>
+          <w:color w:val="404040"/>
+          <w:sz w:val="20"/>
+        </w:rPr>
         <w:t xml:space="preserve"> /ˈpasən/</w:t>
       </w:r>
     </w:p>
@@ -26252,6 +27087,11 @@
         <w:t>welcher · welche · welches</w:t>
       </w:r>
       <w:r>
+        <w:rPr>
+          <w:b w:val="0"/>
+          <w:color w:val="404040"/>
+          <w:sz w:val="20"/>
+        </w:rPr>
         <w:t xml:space="preserve"> /ˈvɛlçɐ | ˈvɛlçə | ˈvɛlçəs/</w:t>
       </w:r>
     </w:p>
@@ -26414,6 +27254,11 @@
         <w:t>das Foto</w:t>
       </w:r>
       <w:r>
+        <w:rPr>
+          <w:b w:val="0"/>
+          <w:color w:val="404040"/>
+          <w:sz w:val="20"/>
+        </w:rPr>
         <w:t xml:space="preserve"> /ˈfoːto/</w:t>
       </w:r>
     </w:p>
@@ -26544,6 +27389,11 @@
         <w:t>ankreuzen</w:t>
       </w:r>
       <w:r>
+        <w:rPr>
+          <w:b w:val="0"/>
+          <w:color w:val="404040"/>
+          <w:sz w:val="20"/>
+        </w:rPr>
         <w:t xml:space="preserve"> /ˈankʁɔʏtsən/</w:t>
       </w:r>
     </w:p>
@@ -26660,6 +27510,11 @@
         <w:t>hören</w:t>
       </w:r>
       <w:r>
+        <w:rPr>
+          <w:b w:val="0"/>
+          <w:color w:val="404040"/>
+          <w:sz w:val="20"/>
+        </w:rPr>
         <w:t xml:space="preserve"> /ˈhøːʁən/</w:t>
       </w:r>
     </w:p>
@@ -26748,6 +27603,11 @@
         <w:t>das Gespräch</w:t>
       </w:r>
       <w:r>
+        <w:rPr>
+          <w:b w:val="0"/>
+          <w:color w:val="404040"/>
+          <w:sz w:val="20"/>
+        </w:rPr>
         <w:t xml:space="preserve"> /ɡəˈʃpʁɛːç/</w:t>
       </w:r>
     </w:p>
@@ -26848,6 +27708,11 @@
         <w:t>neu</w:t>
       </w:r>
       <w:r>
+        <w:rPr>
+          <w:b w:val="0"/>
+          <w:color w:val="404040"/>
+          <w:sz w:val="20"/>
+        </w:rPr>
         <w:t xml:space="preserve"> /nɔʏ/</w:t>
       </w:r>
     </w:p>
@@ -26936,6 +27801,11 @@
         <w:t>sein</w:t>
       </w:r>
       <w:r>
+        <w:rPr>
+          <w:b w:val="0"/>
+          <w:color w:val="404040"/>
+          <w:sz w:val="20"/>
+        </w:rPr>
         <w:t xml:space="preserve"> /zaɪn/</w:t>
       </w:r>
     </w:p>
@@ -27158,6 +28028,11 @@
         <w:t>der Praktikant</w:t>
       </w:r>
       <w:r>
+        <w:rPr>
+          <w:b w:val="0"/>
+          <w:color w:val="404040"/>
+          <w:sz w:val="20"/>
+        </w:rPr>
         <w:t xml:space="preserve"> /pʁaktiˈkant/</w:t>
       </w:r>
     </w:p>
@@ -27318,6 +28193,11 @@
         <w:t>Guten Tag!</w:t>
       </w:r>
       <w:r>
+        <w:rPr>
+          <w:b w:val="0"/>
+          <w:color w:val="404040"/>
+          <w:sz w:val="20"/>
+        </w:rPr>
         <w:t xml:space="preserve"> /ˈɡuːtən ˈtaːk/</w:t>
       </w:r>
     </w:p>

</xml_diff>

<commit_message>
Refactor plural handling in vocabulary cards for improved consistency and clarity.
- Updated the vocab manifest structure to separate plural rules and forms, enhancing clarity in pluralization.
- Refactored `docx_cards.py` to accommodate the new plural structure, ensuring accurate processing of plural fields.
- Enhanced HTML rendering in `html_preview.py` to display plural forms alongside vocabulary entries, improving user experience.
- Updated utility functions in `card-utils.ts` and `types.ts` to support the new plural handling, ensuring consistency across the application.
</commit_message>
<xml_diff>
--- a/vocab.docx
+++ b/vocab.docx
@@ -149,7 +149,7 @@
         <w:rPr>
           <w:sz w:val="22"/>
         </w:rPr>
-        <w:t>die Frage, -n</w:t>
+        <w:t>-n · die Fragen</w:t>
       </w:r>
     </w:p>
     <w:p>
@@ -812,7 +812,7 @@
         <w:rPr>
           <w:sz w:val="22"/>
         </w:rPr>
-        <w:t>die Tafel, -n</w:t>
+        <w:t>-n · die Tafeln</w:t>
       </w:r>
     </w:p>
     <w:p>
@@ -917,7 +917,7 @@
         <w:rPr>
           <w:sz w:val="22"/>
         </w:rPr>
-        <w:t>das Übungsbuch, -¨er</w:t>
+        <w:t>-¨er · die Übungsbücher</w:t>
       </w:r>
     </w:p>
     <w:p>
@@ -1343,7 +1343,7 @@
         <w:rPr>
           <w:sz w:val="22"/>
         </w:rPr>
-        <w:t>die Pause, -n</w:t>
+        <w:t>-n · die Pausen</w:t>
       </w:r>
     </w:p>
     <w:p>
@@ -1448,7 +1448,7 @@
         <w:rPr>
           <w:sz w:val="22"/>
         </w:rPr>
-        <w:t>der Unterricht, -e</w:t>
+        <w:t>-e · die Unterrichte</w:t>
       </w:r>
     </w:p>
     <w:p>
@@ -1567,7 +1567,7 @@
         <w:rPr>
           <w:sz w:val="22"/>
         </w:rPr>
-        <w:t>die Aufgabe, -n</w:t>
+        <w:t>-n · die Aufgaben</w:t>
       </w:r>
     </w:p>
     <w:p>
@@ -1686,7 +1686,7 @@
         <w:rPr>
           <w:sz w:val="22"/>
         </w:rPr>
-        <w:t>die Übung, -en</w:t>
+        <w:t>-en · die Übungen</w:t>
       </w:r>
     </w:p>
     <w:p>
@@ -1805,7 +1805,7 @@
         <w:rPr>
           <w:sz w:val="22"/>
         </w:rPr>
-        <w:t>die Seite, -n</w:t>
+        <w:t>-n · die Seiten</w:t>
       </w:r>
     </w:p>
     <w:p>
@@ -1910,7 +1910,7 @@
         <w:rPr>
           <w:sz w:val="22"/>
         </w:rPr>
-        <w:t>der Dialog, -e</w:t>
+        <w:t>-e · die Dialoge</w:t>
       </w:r>
     </w:p>
     <w:p>
@@ -2015,7 +2015,7 @@
         <w:rPr>
           <w:sz w:val="22"/>
         </w:rPr>
-        <w:t>der Artikel, -</w:t>
+        <w:t>- · die Artikel</w:t>
       </w:r>
     </w:p>
     <w:p>
@@ -2134,7 +2134,7 @@
         <w:rPr>
           <w:sz w:val="22"/>
         </w:rPr>
-        <w:t>der Text, -e</w:t>
+        <w:t>-e · die Texte</w:t>
       </w:r>
     </w:p>
     <w:p>
@@ -2239,7 +2239,7 @@
         <w:rPr>
           <w:sz w:val="22"/>
         </w:rPr>
-        <w:t>das Wort, -¨er</w:t>
+        <w:t>-¨er · die Wörter</w:t>
       </w:r>
     </w:p>
     <w:p>
@@ -2344,7 +2344,7 @@
         <w:rPr>
           <w:sz w:val="22"/>
         </w:rPr>
-        <w:t>der Kursteilnehmer / die Kursteilnehmerin, - / die Kursteilnehmerin, -nen</w:t>
+        <w:t>- / -nen · die Kursteilnehmer, die Kursteilnehmerinnen</w:t>
       </w:r>
     </w:p>
     <w:p>
@@ -2463,7 +2463,7 @@
         <w:rPr>
           <w:sz w:val="22"/>
         </w:rPr>
-        <w:t>die Hausaufgabe, -n</w:t>
+        <w:t>-n · die Hausaufgaben</w:t>
       </w:r>
     </w:p>
     <w:p>
@@ -2582,7 +2582,7 @@
         <w:rPr>
           <w:sz w:val="22"/>
         </w:rPr>
-        <w:t>der Kursleiter / die Kursleiterin, - / die Kursleiterin, -nen</w:t>
+        <w:t>- / -nen · die Kursleiter, die Kursleiterinnen</w:t>
       </w:r>
     </w:p>
     <w:p>
@@ -2701,7 +2701,7 @@
         <w:rPr>
           <w:sz w:val="22"/>
         </w:rPr>
-        <w:t>das Wörterbuch, -¨er</w:t>
+        <w:t>-¨er · die Wörterbücher</w:t>
       </w:r>
     </w:p>
     <w:p>
@@ -2806,7 +2806,7 @@
         <w:rPr>
           <w:sz w:val="22"/>
         </w:rPr>
-        <w:t>das Kursbuch, -¨er</w:t>
+        <w:t>-¨er · die Kursbücher</w:t>
       </w:r>
     </w:p>
     <w:p>
@@ -3004,7 +3004,7 @@
         <w:rPr>
           <w:sz w:val="22"/>
         </w:rPr>
-        <w:t>der Textmarker, -</w:t>
+        <w:t>- · die Textmarker</w:t>
       </w:r>
     </w:p>
     <w:p>
@@ -3109,7 +3109,7 @@
         <w:rPr>
           <w:sz w:val="22"/>
         </w:rPr>
-        <w:t>der Kugelschreiber, -</w:t>
+        <w:t>- · die Kugelschreiber</w:t>
       </w:r>
     </w:p>
     <w:p>
@@ -3228,7 +3228,7 @@
         <w:rPr>
           <w:sz w:val="22"/>
         </w:rPr>
-        <w:t>der Bleistift, -e</w:t>
+        <w:t>-e · die Bleistifte</w:t>
       </w:r>
     </w:p>
     <w:p>
@@ -3333,7 +3333,7 @@
         <w:rPr>
           <w:sz w:val="22"/>
         </w:rPr>
-        <w:t>der Overheadprojektor, -en</w:t>
+        <w:t>-en · die Overheadprojektoren</w:t>
       </w:r>
     </w:p>
     <w:p>
@@ -3438,7 +3438,7 @@
         <w:rPr>
           <w:sz w:val="22"/>
         </w:rPr>
-        <w:t>der Computer, -</w:t>
+        <w:t>- · die Computer</w:t>
       </w:r>
     </w:p>
     <w:p>
@@ -3543,7 +3543,7 @@
         <w:rPr>
           <w:sz w:val="22"/>
         </w:rPr>
-        <w:t>der Fernseher, -</w:t>
+        <w:t>- · die Fernseher</w:t>
       </w:r>
     </w:p>
     <w:p>
@@ -3648,7 +3648,7 @@
         <w:rPr>
           <w:sz w:val="22"/>
         </w:rPr>
-        <w:t>der DVD-Player, -</w:t>
+        <w:t>- · die DVD-Player</w:t>
       </w:r>
     </w:p>
     <w:p>
@@ -3753,7 +3753,7 @@
         <w:rPr>
           <w:sz w:val="22"/>
         </w:rPr>
-        <w:t>die DVD, -s</w:t>
+        <w:t>-s · die DVDs</w:t>
       </w:r>
     </w:p>
     <w:p>
@@ -3858,7 +3858,7 @@
         <w:rPr>
           <w:sz w:val="22"/>
         </w:rPr>
-        <w:t>der CD-Player, -</w:t>
+        <w:t>- · die CD-Player</w:t>
       </w:r>
     </w:p>
     <w:p>
@@ -3963,7 +3963,7 @@
         <w:rPr>
           <w:sz w:val="22"/>
         </w:rPr>
-        <w:t>die CD, -s</w:t>
+        <w:t>-s · die CDs</w:t>
       </w:r>
     </w:p>
     <w:p>
@@ -4068,7 +4068,7 @@
         <w:rPr>
           <w:sz w:val="22"/>
         </w:rPr>
-        <w:t>der Raum, -¨e</w:t>
+        <w:t>-¨e · die Räume</w:t>
       </w:r>
     </w:p>
     <w:p>
@@ -4187,7 +4187,7 @@
         <w:rPr>
           <w:sz w:val="22"/>
         </w:rPr>
-        <w:t>der Gegenstand, -¨e</w:t>
+        <w:t>-¨e · die Gegenstände</w:t>
       </w:r>
     </w:p>
     <w:p>
@@ -4306,7 +4306,7 @@
         <w:rPr>
           <w:sz w:val="22"/>
         </w:rPr>
-        <w:t>die Strategie, -n</w:t>
+        <w:t>-n · die Strategien</w:t>
       </w:r>
     </w:p>
     <w:p>
@@ -4411,7 +4411,7 @@
         <w:rPr>
           <w:sz w:val="22"/>
         </w:rPr>
-        <w:t>der Schlüssel, -</w:t>
+        <w:t>- · die Schlüssel</w:t>
       </w:r>
     </w:p>
     <w:p>
@@ -4744,7 +4744,7 @@
         <w:rPr>
           <w:sz w:val="22"/>
         </w:rPr>
-        <w:t>die Anweisung, -en</w:t>
+        <w:t>-en · die Anweisungen</w:t>
       </w:r>
     </w:p>
     <w:p>
@@ -4849,7 +4849,7 @@
         <w:rPr>
           <w:sz w:val="22"/>
         </w:rPr>
-        <w:t>der Teilnehmer / die Teilnehmerin, - / die Teilnehmerin, -nen</w:t>
+        <w:t>- / -nen · die Teilnehmer, die Teilnehmerinnen</w:t>
       </w:r>
     </w:p>
     <w:p>
@@ -5196,7 +5196,7 @@
         <w:rPr>
           <w:sz w:val="22"/>
         </w:rPr>
-        <w:t>der Kontinent, -e</w:t>
+        <w:t>-e · die Kontinente</w:t>
       </w:r>
     </w:p>
     <w:p>
@@ -5449,7 +5449,7 @@
         <w:rPr>
           <w:sz w:val="22"/>
         </w:rPr>
-        <w:t>der Student, -en</w:t>
+        <w:t>-en · die Studenten</w:t>
       </w:r>
     </w:p>
     <w:p>
@@ -5689,7 +5689,7 @@
         <w:rPr>
           <w:sz w:val="22"/>
         </w:rPr>
-        <w:t>die Gruppe, -n</w:t>
+        <w:t>-n · die Gruppen</w:t>
       </w:r>
     </w:p>
     <w:p>
@@ -5794,7 +5794,7 @@
         <w:rPr>
           <w:sz w:val="22"/>
         </w:rPr>
-        <w:t>das Team, -s</w:t>
+        <w:t>-s · die Teams</w:t>
       </w:r>
     </w:p>
     <w:p>
@@ -6006,7 +6006,7 @@
         <w:rPr>
           <w:sz w:val="22"/>
         </w:rPr>
-        <w:t>das Heft, -e</w:t>
+        <w:t>-e · die Hefte</w:t>
       </w:r>
     </w:p>
     <w:p>
@@ -6339,7 +6339,7 @@
         <w:rPr>
           <w:sz w:val="22"/>
         </w:rPr>
-        <w:t>das Formular, -e</w:t>
+        <w:t>-e · die Formulare</w:t>
       </w:r>
     </w:p>
     <w:p>
@@ -6444,7 +6444,7 @@
         <w:rPr>
           <w:sz w:val="22"/>
         </w:rPr>
-        <w:t>die Information, -en</w:t>
+        <w:t>-en · die Informationen</w:t>
       </w:r>
     </w:p>
     <w:p>
@@ -6563,7 +6563,7 @@
         <w:rPr>
           <w:sz w:val="22"/>
         </w:rPr>
-        <w:t>das Alphabet, -e</w:t>
+        <w:t>-e · die Alphabete</w:t>
       </w:r>
     </w:p>
     <w:p>
@@ -6668,7 +6668,7 @@
         <w:rPr>
           <w:sz w:val="22"/>
         </w:rPr>
-        <w:t>der Buchstabe, -n</w:t>
+        <w:t>-n · die Buchstaben</w:t>
       </w:r>
     </w:p>
     <w:p>
@@ -7756,7 +7756,7 @@
         <w:rPr>
           <w:sz w:val="22"/>
         </w:rPr>
-        <w:t>der Wohnort, -e</w:t>
+        <w:t>-e · die Wohnorte</w:t>
       </w:r>
     </w:p>
     <w:p>
@@ -8054,7 +8054,7 @@
         <w:rPr>
           <w:sz w:val="22"/>
         </w:rPr>
-        <w:t>die E-Mail-Adresse, -n</w:t>
+        <w:t>-n · die E-Mail-Adressen</w:t>
       </w:r>
     </w:p>
     <w:p>
@@ -8294,7 +8294,7 @@
         <w:rPr>
           <w:sz w:val="22"/>
         </w:rPr>
-        <w:t>die Postleitzahl, -n</w:t>
+        <w:t>-en · die Postleitzahlen</w:t>
       </w:r>
     </w:p>
     <w:p>
@@ -8399,7 +8399,7 @@
         <w:rPr>
           <w:sz w:val="22"/>
         </w:rPr>
-        <w:t>die Muttersprache, -n</w:t>
+        <w:t>-n · die Muttersprachen</w:t>
       </w:r>
     </w:p>
     <w:p>
@@ -8611,7 +8611,7 @@
         <w:rPr>
           <w:sz w:val="22"/>
         </w:rPr>
-        <w:t>der Herr, -en</w:t>
+        <w:t>-en · die Herren</w:t>
       </w:r>
     </w:p>
     <w:p>
@@ -8686,7 +8686,7 @@
         <w:rPr>
           <w:sz w:val="22"/>
         </w:rPr>
-        <w:t>das Telefongespräch, -e</w:t>
+        <w:t>-e · die Telefongespräche</w:t>
       </w:r>
     </w:p>
     <w:p>
@@ -8986,7 +8986,7 @@
         <w:rPr>
           <w:sz w:val="22"/>
         </w:rPr>
-        <w:t>der Personalbogen, -bögen</w:t>
+        <w:t>-bögen · die Personalbögen</w:t>
       </w:r>
     </w:p>
     <w:p>
@@ -9149,7 +9149,7 @@
         <w:rPr>
           <w:sz w:val="22"/>
         </w:rPr>
-        <w:t>die Bürokratie, -n</w:t>
+        <w:t>-n · die Bürokratien</w:t>
       </w:r>
     </w:p>
     <w:p>
@@ -9630,7 +9630,7 @@
         <w:rPr>
           <w:sz w:val="22"/>
         </w:rPr>
-        <w:t>der Kurs, -e</w:t>
+        <w:t>-e · die Kurse</w:t>
       </w:r>
     </w:p>
     <w:p>
@@ -9793,7 +9793,7 @@
         <w:rPr>
           <w:sz w:val="22"/>
         </w:rPr>
-        <w:t>die Handynummer, -n</w:t>
+        <w:t>-n · die Handynummern</w:t>
       </w:r>
     </w:p>
     <w:p>
@@ -12750,7 +12750,7 @@
         <w:rPr>
           <w:sz w:val="22"/>
         </w:rPr>
-        <w:t>der Notizzettel, -</w:t>
+        <w:t>- · die Notizzettel</w:t>
       </w:r>
     </w:p>
     <w:p>
@@ -13602,7 +13602,7 @@
         <w:rPr>
           <w:sz w:val="22"/>
         </w:rPr>
-        <w:t>die Vorwahl, -en</w:t>
+        <w:t>-en · die Vorwahlen</w:t>
       </w:r>
     </w:p>
     <w:p>
@@ -14853,7 +14853,7 @@
         <w:rPr>
           <w:sz w:val="22"/>
         </w:rPr>
-        <w:t>die Telefonnummer, -n</w:t>
+        <w:t>-n · die Telefonnummern</w:t>
       </w:r>
     </w:p>
     <w:p>
@@ -15016,7 +15016,7 @@
         <w:rPr>
           <w:sz w:val="22"/>
         </w:rPr>
-        <w:t>die Straße, -n</w:t>
+        <w:t>-n · die Straßen</w:t>
       </w:r>
     </w:p>
     <w:p>
@@ -16618,7 +16618,7 @@
         <w:rPr>
           <w:sz w:val="22"/>
         </w:rPr>
-        <w:t>die Nummer, -en</w:t>
+        <w:t>-n · die Nummern</w:t>
       </w:r>
     </w:p>
     <w:p>
@@ -16781,7 +16781,7 @@
         <w:rPr>
           <w:sz w:val="22"/>
         </w:rPr>
-        <w:t>die Zahl, -en</w:t>
+        <w:t>-en · die Zahlen</w:t>
       </w:r>
     </w:p>
     <w:p>
@@ -17276,7 +17276,7 @@
         <w:rPr>
           <w:sz w:val="22"/>
         </w:rPr>
-        <w:t>die Regel, -n</w:t>
+        <w:t>-n · die Regeln</w:t>
       </w:r>
     </w:p>
     <w:p>
@@ -17542,7 +17542,7 @@
         <w:rPr>
           <w:b/>
         </w:rPr>
-        <w:t>der Satz /zats/</w:t>
+        <w:t>der Satz</w:t>
       </w:r>
     </w:p>
     <w:p>
@@ -17554,7 +17554,7 @@
         <w:rPr>
           <w:sz w:val="22"/>
         </w:rPr>
-        <w:t>der Satz /zats/, -ätze</w:t>
+        <w:t>-ätze · die Sätze</w:t>
       </w:r>
     </w:p>
     <w:p>
@@ -18589,7 +18589,7 @@
         <w:rPr>
           <w:sz w:val="22"/>
         </w:rPr>
-        <w:t>der Spaß, -äße</w:t>
+        <w:t>-äße · die Spaße</w:t>
       </w:r>
     </w:p>
     <w:p>
@@ -19117,7 +19117,7 @@
         <w:rPr>
           <w:sz w:val="22"/>
         </w:rPr>
-        <w:t>die Argentinierin, -nen / der Argentinier, -</w:t>
+        <w:t>-nen / - · die Argentinierinnen, die Argentinier</w:t>
       </w:r>
     </w:p>
     <w:p>
@@ -23002,7 +23002,7 @@
         <w:rPr>
           <w:sz w:val="22"/>
         </w:rPr>
-        <w:t>der Partner / die Partnerin, - / die Partnerin, -nen</w:t>
+        <w:t>- / -nen · die Partner, die Partnerinnen</w:t>
       </w:r>
     </w:p>
     <w:p>
@@ -23224,7 +23224,7 @@
         <w:rPr>
           <w:b/>
         </w:rPr>
-        <w:t>das Land /lant/</w:t>
+        <w:t>das Land</w:t>
       </w:r>
     </w:p>
     <w:p>
@@ -23236,7 +23236,7 @@
         <w:rPr>
           <w:sz w:val="22"/>
         </w:rPr>
-        <w:t>das Land /lant/, Länder</w:t>
+        <w:t>-¨er · die Länder</w:t>
       </w:r>
     </w:p>
     <w:p>
@@ -23341,7 +23341,7 @@
         <w:rPr>
           <w:sz w:val="22"/>
         </w:rPr>
-        <w:t>die Sprache, -n</w:t>
+        <w:t>-n · die Sprachen</w:t>
       </w:r>
     </w:p>
     <w:p>
@@ -24441,7 +24441,7 @@
         <w:rPr>
           <w:sz w:val="22"/>
         </w:rPr>
-        <w:t>die W-Frage, -n</w:t>
+        <w:t>-n · die W-Fragen</w:t>
       </w:r>
     </w:p>
     <w:p>
@@ -24560,7 +24560,7 @@
         <w:rPr>
           <w:sz w:val="22"/>
         </w:rPr>
-        <w:t>die Antwort, -en</w:t>
+        <w:t>-en · die Antworten</w:t>
       </w:r>
     </w:p>
     <w:p>
@@ -24758,7 +24758,7 @@
         <w:rPr>
           <w:sz w:val="22"/>
         </w:rPr>
-        <w:t>die Tabelle, -n</w:t>
+        <w:t>-n · die Tabellen</w:t>
       </w:r>
     </w:p>
     <w:p>
@@ -24863,7 +24863,7 @@
         <w:rPr>
           <w:sz w:val="22"/>
         </w:rPr>
-        <w:t>die Verbform, -en</w:t>
+        <w:t>-en · die Verbformen</w:t>
       </w:r>
     </w:p>
     <w:p>
@@ -24982,7 +24982,7 @@
         <w:rPr>
           <w:sz w:val="22"/>
         </w:rPr>
-        <w:t>die Grammatik, -en</w:t>
+        <w:t>-en · die Grammatiken</w:t>
       </w:r>
     </w:p>
     <w:p>
@@ -25180,7 +25180,7 @@
         <w:rPr>
           <w:sz w:val="22"/>
         </w:rPr>
-        <w:t>der Blick, -e</w:t>
+        <w:t>-e · die Blicke</w:t>
       </w:r>
     </w:p>
     <w:p>
@@ -25315,7 +25315,7 @@
         <w:rPr>
           <w:sz w:val="22"/>
         </w:rPr>
-        <w:t>das Verb, -en</w:t>
+        <w:t>-en · die Verben</w:t>
       </w:r>
     </w:p>
     <w:p>
@@ -25696,7 +25696,7 @@
         <w:rPr>
           <w:sz w:val="22"/>
         </w:rPr>
-        <w:t>die Sekretärin, -nen</w:t>
+        <w:t>-nen · die Sekretärinnen</w:t>
       </w:r>
     </w:p>
     <w:p>
@@ -25831,7 +25831,7 @@
         <w:rPr>
           <w:sz w:val="22"/>
         </w:rPr>
-        <w:t>die Frau, -en</w:t>
+        <w:t>-en · die Frauen</w:t>
       </w:r>
     </w:p>
     <w:p>
@@ -26751,7 +26751,7 @@
         <w:rPr>
           <w:sz w:val="22"/>
         </w:rPr>
-        <w:t>die Person, -en</w:t>
+        <w:t>-en · die Personen</w:t>
       </w:r>
     </w:p>
     <w:p>
@@ -27231,7 +27231,7 @@
         <w:rPr>
           <w:sz w:val="22"/>
         </w:rPr>
-        <w:t>das Foto, -s</w:t>
+        <w:t>-s · die Fotos</w:t>
       </w:r>
     </w:p>
     <w:p>
@@ -27580,7 +27580,7 @@
         <w:rPr>
           <w:sz w:val="22"/>
         </w:rPr>
-        <w:t>das Gespräch, -e</w:t>
+        <w:t>-e · die Gespräche</w:t>
       </w:r>
     </w:p>
     <w:p>
@@ -28005,7 +28005,7 @@
         <w:rPr>
           <w:sz w:val="22"/>
         </w:rPr>
-        <w:t>der Praktikant, -en / die Praktikantin, -nen</w:t>
+        <w:t>-en / -nen · die Praktikanten</w:t>
       </w:r>
     </w:p>
     <w:p>

</xml_diff>

<commit_message>
Update vocabulary entries and grammar table structure
- Added a new vocabulary entry for "der Termin" with examples and audio.
- Enhanced the grammar table by reordering gender columns to a canonical format (m · n · f · pl).
- Updated existing vocabulary entries to ensure consistent formatting and added tags for better organization.
- Improved the handling of gender paradigms in the codebase for better data management.
</commit_message>
<xml_diff>
--- a/vocab.docx
+++ b/vocab.docx
@@ -13,6 +13,141 @@
         </w:rPr>
         <w:t>daf — vocabulary</w:t>
       </w:r>
+    </w:p>
+    <w:p>
+      <w:pPr>
+        <w:spacing w:after="120"/>
+      </w:pPr>
+      <w:r>
+        <w:rPr>
+          <w:b/>
+        </w:rPr>
+        <w:t>der Termin</w:t>
+      </w:r>
+      <w:r>
+        <w:rPr>
+          <w:b w:val="0"/>
+          <w:color w:val="404040"/>
+          <w:sz w:val="20"/>
+        </w:rPr>
+        <w:t xml:space="preserve"> /ˈtɛʁmiːn/</w:t>
+      </w:r>
+    </w:p>
+    <w:p>
+      <w:pPr>
+        <w:spacing w:after="80"/>
+        <w:ind w:left="576"/>
+      </w:pPr>
+      <w:r>
+        <w:rPr>
+          <w:sz w:val="22"/>
+        </w:rPr>
+        <w:t>-e · die Termine</w:t>
+      </w:r>
+    </w:p>
+    <w:p>
+      <w:pPr>
+        <w:spacing w:after="80"/>
+        <w:ind w:left="576"/>
+      </w:pPr>
+      <w:r>
+        <w:t>Appointment; scheduled time.</w:t>
+      </w:r>
+    </w:p>
+    <w:p>
+      <w:pPr>
+        <w:spacing w:before="40" w:after="60"/>
+        <w:ind w:left="576"/>
+      </w:pPr>
+      <w:r>
+        <w:rPr>
+          <w:i/>
+          <w:color w:val="30608C"/>
+          <w:sz w:val="21"/>
+        </w:rPr>
+        <w:t xml:space="preserve">› </w:t>
+      </w:r>
+      <w:r>
+        <w:rPr>
+          <w:i/>
+          <w:color w:val="30608C"/>
+          <w:sz w:val="21"/>
+        </w:rPr>
+        <w:t>Ich habe einen Termin um zehn Uhr.</w:t>
+      </w:r>
+      <w:r>
+        <w:rPr>
+          <w:i/>
+          <w:color w:val="404040"/>
+          <w:sz w:val="21"/>
+        </w:rPr>
+        <w:t xml:space="preserve"> (I have an appointment at ten o'clock.)</w:t>
+      </w:r>
+    </w:p>
+    <w:p>
+      <w:pPr>
+        <w:spacing w:before="0" w:after="60"/>
+        <w:ind w:left="576"/>
+      </w:pPr>
+      <w:r>
+        <w:rPr>
+          <w:i/>
+          <w:color w:val="30608C"/>
+          <w:sz w:val="21"/>
+        </w:rPr>
+        <w:t xml:space="preserve">› </w:t>
+      </w:r>
+      <w:r>
+        <w:rPr>
+          <w:i/>
+          <w:color w:val="30608C"/>
+          <w:sz w:val="21"/>
+        </w:rPr>
+        <w:t>Lektion 2: Termine</w:t>
+      </w:r>
+      <w:r>
+        <w:rPr>
+          <w:i/>
+          <w:color w:val="404040"/>
+          <w:sz w:val="21"/>
+        </w:rPr>
+        <w:t xml:space="preserve"> (Lesson 2: Appointments.)</w:t>
+      </w:r>
+    </w:p>
+    <w:p>
+      <w:pPr>
+        <w:spacing w:before="0" w:after="120"/>
+        <w:ind w:left="576"/>
+      </w:pPr>
+      <w:r>
+        <w:rPr>
+          <w:i/>
+          <w:color w:val="30608C"/>
+          <w:sz w:val="21"/>
+        </w:rPr>
+        <w:t xml:space="preserve">› </w:t>
+      </w:r>
+      <w:r>
+        <w:rPr>
+          <w:i/>
+          <w:color w:val="30608C"/>
+          <w:sz w:val="21"/>
+        </w:rPr>
+        <w:t>Heute beginnen wir mit Terminen.</w:t>
+      </w:r>
+      <w:r>
+        <w:rPr>
+          <w:i/>
+          <w:color w:val="404040"/>
+          <w:sz w:val="21"/>
+        </w:rPr>
+        <w:t xml:space="preserve"> (Today we start with appointments.)</w:t>
+      </w:r>
+    </w:p>
+    <w:p>
+      <w:pPr>
+        <w:spacing w:before="0" w:after="0"/>
+      </w:pPr>
     </w:p>
     <w:p>
       <w:pPr>
@@ -19639,7 +19774,7 @@
                 <w:color w:val="333333"/>
                 <w:sz w:val="20"/>
               </w:rPr>
-              <w:t>f.</w:t>
+              <w:t>n.</w:t>
             </w:r>
           </w:p>
         </w:tc>
@@ -19660,7 +19795,7 @@
                 <w:color w:val="333333"/>
                 <w:sz w:val="20"/>
               </w:rPr>
-              <w:t>n.</w:t>
+              <w:t>f.</w:t>
             </w:r>
           </w:p>
         </w:tc>
@@ -19765,6 +19900,50 @@
                 <w:color w:val="404040"/>
                 <w:sz w:val="19"/>
               </w:rPr>
+              <w:t xml:space="preserve">das </w:t>
+            </w:r>
+            <w:r>
+              <w:rPr>
+                <w:rFonts w:ascii="Calibri" w:hAnsi="Calibri"/>
+                <w:color w:val="404040"/>
+                <w:sz w:val="19"/>
+              </w:rPr>
+              <w:t>neu</w:t>
+            </w:r>
+            <w:r>
+              <w:rPr>
+                <w:rFonts w:ascii="Calibri" w:hAnsi="Calibri"/>
+                <w:b/>
+                <w:color w:val="1F4F8C"/>
+                <w:sz w:val="19"/>
+              </w:rPr>
+              <w:t>e</w:t>
+            </w:r>
+            <w:r>
+              <w:rPr>
+                <w:rFonts w:ascii="Calibri" w:hAnsi="Calibri"/>
+                <w:color w:val="404040"/>
+                <w:sz w:val="19"/>
+              </w:rPr>
+              <w:t xml:space="preserve"> Team</w:t>
+            </w:r>
+          </w:p>
+        </w:tc>
+        <w:tc>
+          <w:tcPr>
+            <w:tcW w:type="dxa" w:w="1728"/>
+          </w:tcPr>
+          <w:p>
+            <w:pPr>
+              <w:spacing w:after="40"/>
+            </w:pPr>
+            <w:r/>
+            <w:r>
+              <w:rPr>
+                <w:rFonts w:ascii="Calibri" w:hAnsi="Calibri"/>
+                <w:color w:val="404040"/>
+                <w:sz w:val="19"/>
+              </w:rPr>
               <w:t xml:space="preserve">die </w:t>
             </w:r>
             <w:r>
@@ -19791,50 +19970,6 @@
                 <w:sz w:val="19"/>
               </w:rPr>
               <w:t xml:space="preserve"> Sekretärin</w:t>
-            </w:r>
-          </w:p>
-        </w:tc>
-        <w:tc>
-          <w:tcPr>
-            <w:tcW w:type="dxa" w:w="1728"/>
-          </w:tcPr>
-          <w:p>
-            <w:pPr>
-              <w:spacing w:after="40"/>
-            </w:pPr>
-            <w:r/>
-            <w:r>
-              <w:rPr>
-                <w:rFonts w:ascii="Calibri" w:hAnsi="Calibri"/>
-                <w:color w:val="404040"/>
-                <w:sz w:val="19"/>
-              </w:rPr>
-              <w:t xml:space="preserve">das </w:t>
-            </w:r>
-            <w:r>
-              <w:rPr>
-                <w:rFonts w:ascii="Calibri" w:hAnsi="Calibri"/>
-                <w:color w:val="404040"/>
-                <w:sz w:val="19"/>
-              </w:rPr>
-              <w:t>neu</w:t>
-            </w:r>
-            <w:r>
-              <w:rPr>
-                <w:rFonts w:ascii="Calibri" w:hAnsi="Calibri"/>
-                <w:b/>
-                <w:color w:val="1F4F8C"/>
-                <w:sz w:val="19"/>
-              </w:rPr>
-              <w:t>e</w:t>
-            </w:r>
-            <w:r>
-              <w:rPr>
-                <w:rFonts w:ascii="Calibri" w:hAnsi="Calibri"/>
-                <w:color w:val="404040"/>
-                <w:sz w:val="19"/>
-              </w:rPr>
-              <w:t xml:space="preserve"> Team</w:t>
             </w:r>
           </w:p>
         </w:tc>
@@ -19962,6 +20097,50 @@
                 <w:color w:val="404040"/>
                 <w:sz w:val="19"/>
               </w:rPr>
+              <w:t xml:space="preserve">das </w:t>
+            </w:r>
+            <w:r>
+              <w:rPr>
+                <w:rFonts w:ascii="Calibri" w:hAnsi="Calibri"/>
+                <w:color w:val="404040"/>
+                <w:sz w:val="19"/>
+              </w:rPr>
+              <w:t>neu</w:t>
+            </w:r>
+            <w:r>
+              <w:rPr>
+                <w:rFonts w:ascii="Calibri" w:hAnsi="Calibri"/>
+                <w:b/>
+                <w:color w:val="1F4F8C"/>
+                <w:sz w:val="19"/>
+              </w:rPr>
+              <w:t>e</w:t>
+            </w:r>
+            <w:r>
+              <w:rPr>
+                <w:rFonts w:ascii="Calibri" w:hAnsi="Calibri"/>
+                <w:color w:val="404040"/>
+                <w:sz w:val="19"/>
+              </w:rPr>
+              <w:t xml:space="preserve"> Team</w:t>
+            </w:r>
+          </w:p>
+        </w:tc>
+        <w:tc>
+          <w:tcPr>
+            <w:tcW w:type="dxa" w:w="1728"/>
+          </w:tcPr>
+          <w:p>
+            <w:pPr>
+              <w:spacing w:after="40"/>
+            </w:pPr>
+            <w:r/>
+            <w:r>
+              <w:rPr>
+                <w:rFonts w:ascii="Calibri" w:hAnsi="Calibri"/>
+                <w:color w:val="404040"/>
+                <w:sz w:val="19"/>
+              </w:rPr>
               <w:t xml:space="preserve">die </w:t>
             </w:r>
             <w:r>
@@ -19988,50 +20167,6 @@
                 <w:sz w:val="19"/>
               </w:rPr>
               <w:t xml:space="preserve"> Sekretärin</w:t>
-            </w:r>
-          </w:p>
-        </w:tc>
-        <w:tc>
-          <w:tcPr>
-            <w:tcW w:type="dxa" w:w="1728"/>
-          </w:tcPr>
-          <w:p>
-            <w:pPr>
-              <w:spacing w:after="40"/>
-            </w:pPr>
-            <w:r/>
-            <w:r>
-              <w:rPr>
-                <w:rFonts w:ascii="Calibri" w:hAnsi="Calibri"/>
-                <w:color w:val="404040"/>
-                <w:sz w:val="19"/>
-              </w:rPr>
-              <w:t xml:space="preserve">das </w:t>
-            </w:r>
-            <w:r>
-              <w:rPr>
-                <w:rFonts w:ascii="Calibri" w:hAnsi="Calibri"/>
-                <w:color w:val="404040"/>
-                <w:sz w:val="19"/>
-              </w:rPr>
-              <w:t>neu</w:t>
-            </w:r>
-            <w:r>
-              <w:rPr>
-                <w:rFonts w:ascii="Calibri" w:hAnsi="Calibri"/>
-                <w:b/>
-                <w:color w:val="1F4F8C"/>
-                <w:sz w:val="19"/>
-              </w:rPr>
-              <w:t>e</w:t>
-            </w:r>
-            <w:r>
-              <w:rPr>
-                <w:rFonts w:ascii="Calibri" w:hAnsi="Calibri"/>
-                <w:color w:val="404040"/>
-                <w:sz w:val="19"/>
-              </w:rPr>
-              <w:t xml:space="preserve"> Team</w:t>
             </w:r>
           </w:p>
         </w:tc>
@@ -20159,6 +20294,50 @@
                 <w:color w:val="404040"/>
                 <w:sz w:val="19"/>
               </w:rPr>
+              <w:t xml:space="preserve">dem </w:t>
+            </w:r>
+            <w:r>
+              <w:rPr>
+                <w:rFonts w:ascii="Calibri" w:hAnsi="Calibri"/>
+                <w:color w:val="404040"/>
+                <w:sz w:val="19"/>
+              </w:rPr>
+              <w:t>neu</w:t>
+            </w:r>
+            <w:r>
+              <w:rPr>
+                <w:rFonts w:ascii="Calibri" w:hAnsi="Calibri"/>
+                <w:b/>
+                <w:color w:val="1F4F8C"/>
+                <w:sz w:val="19"/>
+              </w:rPr>
+              <w:t>en</w:t>
+            </w:r>
+            <w:r>
+              <w:rPr>
+                <w:rFonts w:ascii="Calibri" w:hAnsi="Calibri"/>
+                <w:color w:val="404040"/>
+                <w:sz w:val="19"/>
+              </w:rPr>
+              <w:t xml:space="preserve"> Team</w:t>
+            </w:r>
+          </w:p>
+        </w:tc>
+        <w:tc>
+          <w:tcPr>
+            <w:tcW w:type="dxa" w:w="1728"/>
+          </w:tcPr>
+          <w:p>
+            <w:pPr>
+              <w:spacing w:after="40"/>
+            </w:pPr>
+            <w:r/>
+            <w:r>
+              <w:rPr>
+                <w:rFonts w:ascii="Calibri" w:hAnsi="Calibri"/>
+                <w:color w:val="404040"/>
+                <w:sz w:val="19"/>
+              </w:rPr>
               <w:t xml:space="preserve">der </w:t>
             </w:r>
             <w:r>
@@ -20185,50 +20364,6 @@
                 <w:sz w:val="19"/>
               </w:rPr>
               <w:t xml:space="preserve"> Sekretärin</w:t>
-            </w:r>
-          </w:p>
-        </w:tc>
-        <w:tc>
-          <w:tcPr>
-            <w:tcW w:type="dxa" w:w="1728"/>
-          </w:tcPr>
-          <w:p>
-            <w:pPr>
-              <w:spacing w:after="40"/>
-            </w:pPr>
-            <w:r/>
-            <w:r>
-              <w:rPr>
-                <w:rFonts w:ascii="Calibri" w:hAnsi="Calibri"/>
-                <w:color w:val="404040"/>
-                <w:sz w:val="19"/>
-              </w:rPr>
-              <w:t xml:space="preserve">dem </w:t>
-            </w:r>
-            <w:r>
-              <w:rPr>
-                <w:rFonts w:ascii="Calibri" w:hAnsi="Calibri"/>
-                <w:color w:val="404040"/>
-                <w:sz w:val="19"/>
-              </w:rPr>
-              <w:t>neu</w:t>
-            </w:r>
-            <w:r>
-              <w:rPr>
-                <w:rFonts w:ascii="Calibri" w:hAnsi="Calibri"/>
-                <w:b/>
-                <w:color w:val="1F4F8C"/>
-                <w:sz w:val="19"/>
-              </w:rPr>
-              <w:t>en</w:t>
-            </w:r>
-            <w:r>
-              <w:rPr>
-                <w:rFonts w:ascii="Calibri" w:hAnsi="Calibri"/>
-                <w:color w:val="404040"/>
-                <w:sz w:val="19"/>
-              </w:rPr>
-              <w:t xml:space="preserve"> Team</w:t>
             </w:r>
           </w:p>
         </w:tc>
@@ -20356,6 +20491,50 @@
                 <w:color w:val="404040"/>
                 <w:sz w:val="19"/>
               </w:rPr>
+              <w:t xml:space="preserve">des </w:t>
+            </w:r>
+            <w:r>
+              <w:rPr>
+                <w:rFonts w:ascii="Calibri" w:hAnsi="Calibri"/>
+                <w:color w:val="404040"/>
+                <w:sz w:val="19"/>
+              </w:rPr>
+              <w:t>neu</w:t>
+            </w:r>
+            <w:r>
+              <w:rPr>
+                <w:rFonts w:ascii="Calibri" w:hAnsi="Calibri"/>
+                <w:b/>
+                <w:color w:val="1F4F8C"/>
+                <w:sz w:val="19"/>
+              </w:rPr>
+              <w:t>en</w:t>
+            </w:r>
+            <w:r>
+              <w:rPr>
+                <w:rFonts w:ascii="Calibri" w:hAnsi="Calibri"/>
+                <w:color w:val="404040"/>
+                <w:sz w:val="19"/>
+              </w:rPr>
+              <w:t xml:space="preserve"> Teams</w:t>
+            </w:r>
+          </w:p>
+        </w:tc>
+        <w:tc>
+          <w:tcPr>
+            <w:tcW w:type="dxa" w:w="1728"/>
+          </w:tcPr>
+          <w:p>
+            <w:pPr>
+              <w:spacing w:after="40"/>
+            </w:pPr>
+            <w:r/>
+            <w:r>
+              <w:rPr>
+                <w:rFonts w:ascii="Calibri" w:hAnsi="Calibri"/>
+                <w:color w:val="404040"/>
+                <w:sz w:val="19"/>
+              </w:rPr>
               <w:t xml:space="preserve">der </w:t>
             </w:r>
             <w:r>
@@ -20382,50 +20561,6 @@
                 <w:sz w:val="19"/>
               </w:rPr>
               <w:t xml:space="preserve"> Sekretärin</w:t>
-            </w:r>
-          </w:p>
-        </w:tc>
-        <w:tc>
-          <w:tcPr>
-            <w:tcW w:type="dxa" w:w="1728"/>
-          </w:tcPr>
-          <w:p>
-            <w:pPr>
-              <w:spacing w:after="40"/>
-            </w:pPr>
-            <w:r/>
-            <w:r>
-              <w:rPr>
-                <w:rFonts w:ascii="Calibri" w:hAnsi="Calibri"/>
-                <w:color w:val="404040"/>
-                <w:sz w:val="19"/>
-              </w:rPr>
-              <w:t xml:space="preserve">des </w:t>
-            </w:r>
-            <w:r>
-              <w:rPr>
-                <w:rFonts w:ascii="Calibri" w:hAnsi="Calibri"/>
-                <w:color w:val="404040"/>
-                <w:sz w:val="19"/>
-              </w:rPr>
-              <w:t>neu</w:t>
-            </w:r>
-            <w:r>
-              <w:rPr>
-                <w:rFonts w:ascii="Calibri" w:hAnsi="Calibri"/>
-                <w:b/>
-                <w:color w:val="1F4F8C"/>
-                <w:sz w:val="19"/>
-              </w:rPr>
-              <w:t>en</w:t>
-            </w:r>
-            <w:r>
-              <w:rPr>
-                <w:rFonts w:ascii="Calibri" w:hAnsi="Calibri"/>
-                <w:color w:val="404040"/>
-                <w:sz w:val="19"/>
-              </w:rPr>
-              <w:t xml:space="preserve"> Teams</w:t>
             </w:r>
           </w:p>
         </w:tc>

</xml_diff>